<commit_message>
I did some work on my project, archived it in a zip file and finished the introduction of my thesis.
</commit_message>
<xml_diff>
--- a/Project Thesis.docx
+++ b/Project Thesis.docx
@@ -4,33 +4,1809 @@
   <w:body>
     <w:p>
       <w:pPr>
+        <w:spacing w:line="360" w:lineRule="auto"/>
         <w:jc w:val="center"/>
         <w:rPr>
+          <w:rFonts w:ascii="Arial" w:hAnsi="Arial" w:cs="Arial"/>
+          <w:b/>
+          <w:bCs/>
+          <w:sz w:val="28"/>
+          <w:szCs w:val="28"/>
+          <w:u w:val="single"/>
           <w:lang w:val="en-US"/>
         </w:rPr>
       </w:pPr>
       <w:r>
         <w:rPr>
-          <w:lang w:val="en-US"/>
-        </w:rPr>
-        <w:t>Project Thesis</w:t>
+          <w:rFonts w:ascii="Arial" w:hAnsi="Arial" w:cs="Arial"/>
+          <w:b/>
+          <w:bCs/>
+          <w:sz w:val="28"/>
+          <w:szCs w:val="28"/>
+          <w:u w:val="single"/>
+          <w:lang w:val="en-US"/>
+        </w:rPr>
+        <w:t>Introduction</w:t>
       </w:r>
     </w:p>
     <w:p>
       <w:pPr>
-        <w:rPr>
+        <w:spacing w:line="360" w:lineRule="auto"/>
+        <w:rPr>
+          <w:rFonts w:ascii="Arial" w:hAnsi="Arial" w:cs="Arial"/>
+          <w:b/>
+          <w:bCs/>
+          <w:sz w:val="28"/>
+          <w:szCs w:val="28"/>
+          <w:u w:val="single"/>
           <w:lang w:val="en-US"/>
         </w:rPr>
       </w:pPr>
     </w:p>
+    <w:p>
+      <w:pPr>
+        <w:spacing w:line="360" w:lineRule="auto"/>
+        <w:jc w:val="both"/>
+        <w:rPr>
+          <w:rFonts w:ascii="Arial" w:hAnsi="Arial" w:cs="Arial"/>
+          <w:sz w:val="24"/>
+          <w:szCs w:val="24"/>
+          <w:lang w:val="en-US"/>
+        </w:rPr>
+      </w:pPr>
+      <w:r>
+        <w:rPr>
+          <w:rFonts w:ascii="Arial" w:hAnsi="Arial" w:cs="Arial"/>
+          <w:sz w:val="24"/>
+          <w:szCs w:val="24"/>
+          <w:lang w:val="en-US"/>
+        </w:rPr>
+        <w:t>During our education at AUBG the number of</w:t>
+      </w:r>
+      <w:r>
+        <w:rPr>
+          <w:rFonts w:ascii="Arial" w:hAnsi="Arial" w:cs="Arial"/>
+          <w:sz w:val="24"/>
+          <w:szCs w:val="24"/>
+          <w:lang w:val="en-US"/>
+        </w:rPr>
+        <w:t xml:space="preserve"> courses we take increases with </w:t>
+      </w:r>
+      <w:r>
+        <w:rPr>
+          <w:rFonts w:ascii="Arial" w:hAnsi="Arial" w:cs="Arial"/>
+          <w:sz w:val="24"/>
+          <w:szCs w:val="24"/>
+          <w:lang w:val="en-US"/>
+        </w:rPr>
+        <w:t>time,</w:t>
+      </w:r>
+      <w:r>
+        <w:rPr>
+          <w:rFonts w:ascii="Arial" w:hAnsi="Arial" w:cs="Arial"/>
+          <w:sz w:val="24"/>
+          <w:szCs w:val="24"/>
+          <w:lang w:val="en-US"/>
+        </w:rPr>
+        <w:t xml:space="preserve"> and they are even left in the different semesters in Empower (five per semester).</w:t>
+      </w:r>
+      <w:r>
+        <w:rPr>
+          <w:rFonts w:ascii="Arial" w:hAnsi="Arial" w:cs="Arial"/>
+          <w:sz w:val="24"/>
+          <w:szCs w:val="24"/>
+          <w:lang w:val="en-US"/>
+        </w:rPr>
+        <w:t xml:space="preserve"> Therefore</w:t>
+      </w:r>
+      <w:r>
+        <w:rPr>
+          <w:rFonts w:ascii="Arial" w:hAnsi="Arial" w:cs="Arial"/>
+          <w:sz w:val="24"/>
+          <w:szCs w:val="24"/>
+          <w:lang w:val="en-US"/>
+        </w:rPr>
+        <w:t xml:space="preserve">, calculating our altogether GPA from </w:t>
+      </w:r>
+      <w:r>
+        <w:rPr>
+          <w:rFonts w:ascii="Arial" w:hAnsi="Arial" w:cs="Arial"/>
+          <w:sz w:val="24"/>
+          <w:szCs w:val="24"/>
+          <w:lang w:val="en-US"/>
+        </w:rPr>
+        <w:t>all</w:t>
+      </w:r>
+      <w:r>
+        <w:rPr>
+          <w:rFonts w:ascii="Arial" w:hAnsi="Arial" w:cs="Arial"/>
+          <w:sz w:val="24"/>
+          <w:szCs w:val="24"/>
+          <w:lang w:val="en-US"/>
+        </w:rPr>
+        <w:t xml:space="preserve"> our semesters until a specific point is hard and can lead to mistakes</w:t>
+      </w:r>
+      <w:r>
+        <w:rPr>
+          <w:rFonts w:ascii="Arial" w:hAnsi="Arial" w:cs="Arial"/>
+          <w:sz w:val="24"/>
+          <w:szCs w:val="24"/>
+          <w:lang w:val="en-US"/>
+        </w:rPr>
+        <w:t>.</w:t>
+      </w:r>
+      <w:r>
+        <w:rPr>
+          <w:rFonts w:ascii="Arial" w:hAnsi="Arial" w:cs="Arial"/>
+          <w:sz w:val="24"/>
+          <w:szCs w:val="24"/>
+          <w:lang w:val="en-US"/>
+        </w:rPr>
+        <w:t xml:space="preserve"> Not to mention</w:t>
+      </w:r>
+      <w:r>
+        <w:rPr>
+          <w:rFonts w:ascii="Arial" w:hAnsi="Arial" w:cs="Arial"/>
+          <w:sz w:val="24"/>
+          <w:szCs w:val="24"/>
+          <w:lang w:val="en-US"/>
+        </w:rPr>
+        <w:t xml:space="preserve"> if we </w:t>
+      </w:r>
+      <w:r>
+        <w:rPr>
+          <w:rFonts w:ascii="Arial" w:hAnsi="Arial" w:cs="Arial"/>
+          <w:sz w:val="24"/>
+          <w:szCs w:val="24"/>
+          <w:lang w:val="en-US"/>
+        </w:rPr>
+        <w:t xml:space="preserve">want to calculate not only our current GPA, but </w:t>
+      </w:r>
+      <w:r>
+        <w:rPr>
+          <w:rFonts w:ascii="Arial" w:hAnsi="Arial" w:cs="Arial"/>
+          <w:sz w:val="24"/>
+          <w:szCs w:val="24"/>
+          <w:lang w:val="en-US"/>
+        </w:rPr>
+        <w:t xml:space="preserve">also </w:t>
+      </w:r>
+      <w:r>
+        <w:rPr>
+          <w:rFonts w:ascii="Arial" w:hAnsi="Arial" w:cs="Arial"/>
+          <w:sz w:val="24"/>
+          <w:szCs w:val="24"/>
+          <w:lang w:val="en-US"/>
+        </w:rPr>
+        <w:t>possible future outcomes.</w:t>
+      </w:r>
+    </w:p>
+    <w:p>
+      <w:pPr>
+        <w:spacing w:line="360" w:lineRule="auto"/>
+        <w:jc w:val="both"/>
+        <w:rPr>
+          <w:rFonts w:ascii="Arial" w:hAnsi="Arial" w:cs="Arial"/>
+          <w:sz w:val="24"/>
+          <w:szCs w:val="24"/>
+          <w:lang w:val="en-US"/>
+        </w:rPr>
+      </w:pPr>
+    </w:p>
+    <w:p>
+      <w:pPr>
+        <w:spacing w:line="360" w:lineRule="auto"/>
+        <w:jc w:val="both"/>
+        <w:rPr>
+          <w:rFonts w:ascii="Arial" w:hAnsi="Arial" w:cs="Arial"/>
+          <w:sz w:val="24"/>
+          <w:szCs w:val="24"/>
+          <w:lang w:val="en-US"/>
+        </w:rPr>
+      </w:pPr>
+      <w:r>
+        <w:rPr>
+          <w:rFonts w:ascii="Arial" w:hAnsi="Arial" w:cs="Arial"/>
+          <w:sz w:val="24"/>
+          <w:szCs w:val="24"/>
+          <w:lang w:val="en-US"/>
+        </w:rPr>
+        <w:t>The purpose of this Senior Project is to develop</w:t>
+      </w:r>
+      <w:r>
+        <w:rPr>
+          <w:rFonts w:ascii="Arial" w:hAnsi="Arial" w:cs="Arial"/>
+          <w:sz w:val="24"/>
+          <w:szCs w:val="24"/>
+          <w:lang w:val="en-US"/>
+        </w:rPr>
+        <w:t xml:space="preserve"> an application called</w:t>
+      </w:r>
+      <w:r>
+        <w:rPr>
+          <w:rFonts w:ascii="Arial" w:hAnsi="Arial" w:cs="Arial"/>
+          <w:sz w:val="24"/>
+          <w:szCs w:val="24"/>
+          <w:lang w:val="en-US"/>
+        </w:rPr>
+        <w:t xml:space="preserve"> AUBG Academic Progress Tracker.</w:t>
+      </w:r>
+      <w:r>
+        <w:rPr>
+          <w:rFonts w:ascii="Arial" w:hAnsi="Arial" w:cs="Arial"/>
+          <w:sz w:val="24"/>
+          <w:szCs w:val="24"/>
+          <w:lang w:val="en-US"/>
+        </w:rPr>
+        <w:t xml:space="preserve"> Its goal is to help students organize </w:t>
+      </w:r>
+      <w:r>
+        <w:rPr>
+          <w:rFonts w:ascii="Arial" w:hAnsi="Arial" w:cs="Arial"/>
+          <w:sz w:val="24"/>
+          <w:szCs w:val="24"/>
+          <w:lang w:val="en-US"/>
+        </w:rPr>
+        <w:t xml:space="preserve">and monitor </w:t>
+      </w:r>
+      <w:r>
+        <w:rPr>
+          <w:rFonts w:ascii="Arial" w:hAnsi="Arial" w:cs="Arial"/>
+          <w:sz w:val="24"/>
+          <w:szCs w:val="24"/>
+          <w:lang w:val="en-US"/>
+        </w:rPr>
+        <w:t>all their courses and semesters in</w:t>
+      </w:r>
+      <w:r>
+        <w:rPr>
+          <w:rFonts w:ascii="Arial" w:hAnsi="Arial" w:cs="Arial"/>
+          <w:sz w:val="24"/>
+          <w:szCs w:val="24"/>
+          <w:lang w:val="en-US"/>
+        </w:rPr>
+        <w:t xml:space="preserve"> a </w:t>
+      </w:r>
+      <w:r>
+        <w:rPr>
+          <w:rFonts w:ascii="Arial" w:hAnsi="Arial" w:cs="Arial"/>
+          <w:sz w:val="24"/>
+          <w:szCs w:val="24"/>
+          <w:lang w:val="en-US"/>
+        </w:rPr>
+        <w:t>simple</w:t>
+      </w:r>
+      <w:r>
+        <w:rPr>
+          <w:rFonts w:ascii="Arial" w:hAnsi="Arial" w:cs="Arial"/>
+          <w:sz w:val="24"/>
+          <w:szCs w:val="24"/>
+          <w:lang w:val="en-US"/>
+        </w:rPr>
+        <w:t xml:space="preserve"> and</w:t>
+      </w:r>
+      <w:r>
+        <w:rPr>
+          <w:rFonts w:ascii="Arial" w:hAnsi="Arial" w:cs="Arial"/>
+          <w:sz w:val="24"/>
+          <w:szCs w:val="24"/>
+          <w:lang w:val="en-US"/>
+        </w:rPr>
+        <w:t xml:space="preserve"> structured way</w:t>
+      </w:r>
+      <w:r>
+        <w:rPr>
+          <w:rFonts w:ascii="Arial" w:hAnsi="Arial" w:cs="Arial"/>
+          <w:sz w:val="24"/>
+          <w:szCs w:val="24"/>
+          <w:lang w:val="en-US"/>
+        </w:rPr>
+        <w:t>.</w:t>
+      </w:r>
+      <w:r>
+        <w:rPr>
+          <w:rFonts w:ascii="Arial" w:hAnsi="Arial" w:cs="Arial"/>
+          <w:sz w:val="24"/>
+          <w:szCs w:val="24"/>
+          <w:lang w:val="en-US"/>
+        </w:rPr>
+        <w:t xml:space="preserve"> The program allows the user to enter</w:t>
+      </w:r>
+      <w:r>
+        <w:rPr>
+          <w:rFonts w:ascii="Arial" w:hAnsi="Arial" w:cs="Arial"/>
+          <w:sz w:val="24"/>
+          <w:szCs w:val="24"/>
+          <w:lang w:val="en-US"/>
+        </w:rPr>
+        <w:t xml:space="preserve"> completed courses together</w:t>
+      </w:r>
+      <w:r>
+        <w:rPr>
+          <w:rFonts w:ascii="Arial" w:hAnsi="Arial" w:cs="Arial"/>
+          <w:sz w:val="24"/>
+          <w:szCs w:val="24"/>
+          <w:lang w:val="en-US"/>
+        </w:rPr>
+        <w:t xml:space="preserve"> with their credit value, grade</w:t>
+      </w:r>
+      <w:r>
+        <w:rPr>
+          <w:rFonts w:ascii="Arial" w:hAnsi="Arial" w:cs="Arial"/>
+          <w:sz w:val="24"/>
+          <w:szCs w:val="24"/>
+          <w:lang w:val="en-US"/>
+        </w:rPr>
+        <w:t>,</w:t>
+      </w:r>
+      <w:r>
+        <w:rPr>
+          <w:rFonts w:ascii="Arial" w:hAnsi="Arial" w:cs="Arial"/>
+          <w:sz w:val="24"/>
+          <w:szCs w:val="24"/>
+          <w:lang w:val="en-US"/>
+        </w:rPr>
+        <w:t xml:space="preserve"> and semester</w:t>
+      </w:r>
+      <w:r>
+        <w:rPr>
+          <w:rFonts w:ascii="Arial" w:hAnsi="Arial" w:cs="Arial"/>
+          <w:sz w:val="24"/>
+          <w:szCs w:val="24"/>
+          <w:lang w:val="en-US"/>
+        </w:rPr>
+        <w:t>.</w:t>
+      </w:r>
+      <w:r>
+        <w:rPr>
+          <w:rFonts w:ascii="Arial" w:hAnsi="Arial" w:cs="Arial"/>
+          <w:sz w:val="24"/>
+          <w:szCs w:val="24"/>
+          <w:lang w:val="en-US"/>
+        </w:rPr>
+        <w:t xml:space="preserve"> Based on this information, the application calculates</w:t>
+      </w:r>
+      <w:r>
+        <w:rPr>
+          <w:rFonts w:ascii="Arial" w:hAnsi="Arial" w:cs="Arial"/>
+          <w:sz w:val="24"/>
+          <w:szCs w:val="24"/>
+          <w:lang w:val="en-US"/>
+        </w:rPr>
+        <w:t xml:space="preserve"> the student's cumulative GPA</w:t>
+      </w:r>
+      <w:r>
+        <w:rPr>
+          <w:rFonts w:ascii="Arial" w:hAnsi="Arial" w:cs="Arial"/>
+          <w:sz w:val="24"/>
+          <w:szCs w:val="24"/>
+          <w:lang w:val="en-US"/>
+        </w:rPr>
+        <w:t>, semester GPA</w:t>
+      </w:r>
+      <w:r>
+        <w:rPr>
+          <w:rFonts w:ascii="Arial" w:hAnsi="Arial" w:cs="Arial"/>
+          <w:sz w:val="24"/>
+          <w:szCs w:val="24"/>
+          <w:lang w:val="en-US"/>
+        </w:rPr>
+        <w:t>, earned credits, attempted credits</w:t>
+      </w:r>
+      <w:r>
+        <w:rPr>
+          <w:rFonts w:ascii="Arial" w:hAnsi="Arial" w:cs="Arial"/>
+          <w:sz w:val="24"/>
+          <w:szCs w:val="24"/>
+          <w:lang w:val="en-US"/>
+        </w:rPr>
+        <w:t>, number of completed courses</w:t>
+      </w:r>
+      <w:r>
+        <w:rPr>
+          <w:rFonts w:ascii="Arial" w:hAnsi="Arial" w:cs="Arial"/>
+          <w:sz w:val="24"/>
+          <w:szCs w:val="24"/>
+          <w:lang w:val="en-US"/>
+        </w:rPr>
+        <w:t>, and overall</w:t>
+      </w:r>
+      <w:r>
+        <w:rPr>
+          <w:rFonts w:ascii="Arial" w:hAnsi="Arial" w:cs="Arial"/>
+          <w:sz w:val="24"/>
+          <w:szCs w:val="24"/>
+          <w:lang w:val="en-US"/>
+        </w:rPr>
+        <w:t xml:space="preserve"> progress toward graduation.</w:t>
+      </w:r>
+    </w:p>
+    <w:p>
+      <w:pPr>
+        <w:spacing w:line="360" w:lineRule="auto"/>
+        <w:jc w:val="both"/>
+        <w:rPr>
+          <w:rFonts w:ascii="Arial" w:hAnsi="Arial" w:cs="Arial"/>
+          <w:sz w:val="24"/>
+          <w:szCs w:val="24"/>
+          <w:lang w:val="en-US"/>
+        </w:rPr>
+      </w:pPr>
+    </w:p>
+    <w:p>
+      <w:pPr>
+        <w:spacing w:line="360" w:lineRule="auto"/>
+        <w:jc w:val="both"/>
+        <w:rPr>
+          <w:rFonts w:ascii="Arial" w:hAnsi="Arial" w:cs="Arial"/>
+          <w:sz w:val="24"/>
+          <w:szCs w:val="24"/>
+        </w:rPr>
+      </w:pPr>
+      <w:r>
+        <w:rPr>
+          <w:rFonts w:ascii="Arial" w:hAnsi="Arial" w:cs="Arial"/>
+          <w:sz w:val="24"/>
+          <w:szCs w:val="24"/>
+          <w:lang w:val="en-US"/>
+        </w:rPr>
+        <w:t>My main idea is to transform a simple GPA calculation into</w:t>
+      </w:r>
+      <w:r>
+        <w:rPr>
+          <w:rFonts w:ascii="Arial" w:hAnsi="Arial" w:cs="Arial"/>
+          <w:sz w:val="24"/>
+          <w:szCs w:val="24"/>
+          <w:lang w:val="en-US"/>
+        </w:rPr>
+        <w:t xml:space="preserve"> a complete program</w:t>
+      </w:r>
+      <w:r>
+        <w:rPr>
+          <w:rFonts w:ascii="Arial" w:hAnsi="Arial" w:cs="Arial"/>
+          <w:sz w:val="24"/>
+          <w:szCs w:val="24"/>
+          <w:lang w:val="en-US"/>
+        </w:rPr>
+        <w:t>.</w:t>
+      </w:r>
+      <w:r>
+        <w:rPr>
+          <w:rFonts w:ascii="Arial" w:hAnsi="Arial" w:cs="Arial"/>
+          <w:sz w:val="24"/>
+          <w:szCs w:val="24"/>
+          <w:lang w:val="en-US"/>
+        </w:rPr>
+        <w:t xml:space="preserve"> At </w:t>
+      </w:r>
+      <w:r>
+        <w:rPr>
+          <w:rFonts w:ascii="Arial" w:hAnsi="Arial" w:cs="Arial"/>
+          <w:sz w:val="24"/>
+          <w:szCs w:val="24"/>
+          <w:lang w:val="en-US"/>
+        </w:rPr>
+        <w:t>first,</w:t>
+      </w:r>
+      <w:r>
+        <w:rPr>
+          <w:rFonts w:ascii="Arial" w:hAnsi="Arial" w:cs="Arial"/>
+          <w:sz w:val="24"/>
+          <w:szCs w:val="24"/>
+          <w:lang w:val="en-US"/>
+        </w:rPr>
+        <w:t xml:space="preserve"> I had just written a simple C# code for GPA calculation</w:t>
+      </w:r>
+      <w:r>
+        <w:rPr>
+          <w:rFonts w:ascii="Arial" w:hAnsi="Arial" w:cs="Arial"/>
+          <w:sz w:val="24"/>
+          <w:szCs w:val="24"/>
+          <w:lang w:val="en-US"/>
+        </w:rPr>
+        <w:t xml:space="preserve"> which accepted information from the user about the courses taken, their credit counts and final grades and calculated the </w:t>
+      </w:r>
+      <w:r>
+        <w:rPr>
+          <w:rFonts w:ascii="Arial" w:hAnsi="Arial" w:cs="Arial"/>
+          <w:sz w:val="24"/>
+          <w:szCs w:val="24"/>
+          <w:lang w:val="en-US"/>
+        </w:rPr>
+        <w:t xml:space="preserve">total number of credits and the </w:t>
+      </w:r>
+      <w:r>
+        <w:rPr>
+          <w:rFonts w:ascii="Arial" w:hAnsi="Arial" w:cs="Arial"/>
+          <w:sz w:val="24"/>
+          <w:szCs w:val="24"/>
+          <w:lang w:val="en-US"/>
+        </w:rPr>
+        <w:t>GPA</w:t>
+      </w:r>
+      <w:r>
+        <w:rPr>
+          <w:rFonts w:ascii="Arial" w:hAnsi="Arial" w:cs="Arial"/>
+          <w:sz w:val="24"/>
+          <w:szCs w:val="24"/>
+          <w:lang w:val="en-US"/>
+        </w:rPr>
+        <w:t>.</w:t>
+      </w:r>
+      <w:r>
+        <w:rPr>
+          <w:rFonts w:ascii="Arial" w:hAnsi="Arial" w:cs="Arial"/>
+          <w:sz w:val="24"/>
+          <w:szCs w:val="24"/>
+          <w:lang w:val="en-US"/>
+        </w:rPr>
+        <w:t xml:space="preserve"> However, the functionality of this program was limited</w:t>
+      </w:r>
+      <w:r>
+        <w:rPr>
+          <w:rFonts w:ascii="Arial" w:hAnsi="Arial" w:cs="Arial"/>
+          <w:sz w:val="24"/>
+          <w:szCs w:val="24"/>
+          <w:lang w:val="en-US"/>
+        </w:rPr>
+        <w:t>.</w:t>
+      </w:r>
+      <w:r>
+        <w:rPr>
+          <w:rFonts w:ascii="Arial" w:hAnsi="Arial" w:cs="Arial"/>
+          <w:sz w:val="24"/>
+          <w:szCs w:val="24"/>
+          <w:lang w:val="en-US"/>
+        </w:rPr>
+        <w:t xml:space="preserve"> All information existed only while the program was running</w:t>
+      </w:r>
+      <w:r>
+        <w:rPr>
+          <w:rFonts w:ascii="Arial" w:hAnsi="Arial" w:cs="Arial"/>
+          <w:sz w:val="24"/>
+          <w:szCs w:val="24"/>
+          <w:lang w:val="en-US"/>
+        </w:rPr>
+        <w:t>, the user was interacting with the program only through the console</w:t>
+      </w:r>
+      <w:r>
+        <w:rPr>
+          <w:rFonts w:ascii="Arial" w:hAnsi="Arial" w:cs="Arial"/>
+          <w:sz w:val="24"/>
+          <w:szCs w:val="24"/>
+          <w:lang w:val="en-US"/>
+        </w:rPr>
+        <w:t>, there was no possibility to organize</w:t>
+      </w:r>
+      <w:r>
+        <w:rPr>
+          <w:rFonts w:ascii="Arial" w:hAnsi="Arial" w:cs="Arial"/>
+          <w:sz w:val="24"/>
+          <w:szCs w:val="24"/>
+          <w:lang w:val="en-US"/>
+        </w:rPr>
+        <w:t xml:space="preserve"> it by semester</w:t>
+      </w:r>
+      <w:r>
+        <w:rPr>
+          <w:rFonts w:ascii="Arial" w:hAnsi="Arial" w:cs="Arial"/>
+          <w:sz w:val="24"/>
+          <w:szCs w:val="24"/>
+          <w:lang w:val="en-US"/>
+        </w:rPr>
+        <w:t xml:space="preserve"> or save it anywhere</w:t>
+      </w:r>
+      <w:r>
+        <w:rPr>
+          <w:rFonts w:ascii="Arial" w:hAnsi="Arial" w:cs="Arial"/>
+          <w:sz w:val="24"/>
+          <w:szCs w:val="24"/>
+          <w:lang w:val="en-US"/>
+        </w:rPr>
+        <w:t xml:space="preserve">, or to </w:t>
+      </w:r>
+      <w:r>
+        <w:rPr>
+          <w:rFonts w:ascii="Arial" w:hAnsi="Arial" w:cs="Arial"/>
+          <w:sz w:val="24"/>
+          <w:szCs w:val="24"/>
+          <w:lang w:val="en-US"/>
+        </w:rPr>
+        <w:t>edit previous information or</w:t>
+      </w:r>
+      <w:r>
+        <w:rPr>
+          <w:rFonts w:ascii="Arial" w:hAnsi="Arial" w:cs="Arial"/>
+          <w:sz w:val="24"/>
+          <w:szCs w:val="24"/>
+          <w:lang w:val="en-US"/>
+        </w:rPr>
+        <w:t xml:space="preserve"> </w:t>
+      </w:r>
+      <w:r>
+        <w:rPr>
+          <w:rFonts w:ascii="Arial" w:hAnsi="Arial" w:cs="Arial"/>
+          <w:sz w:val="24"/>
+          <w:szCs w:val="24"/>
+          <w:lang w:val="en-US"/>
+        </w:rPr>
+        <w:t>perform</w:t>
+      </w:r>
+      <w:r>
+        <w:rPr>
+          <w:rFonts w:ascii="Arial" w:hAnsi="Arial" w:cs="Arial"/>
+          <w:sz w:val="24"/>
+          <w:szCs w:val="24"/>
+          <w:lang w:val="en-US"/>
+        </w:rPr>
+        <w:t xml:space="preserve"> any advanced</w:t>
+      </w:r>
+      <w:r>
+        <w:rPr>
+          <w:rFonts w:ascii="Arial" w:hAnsi="Arial" w:cs="Arial"/>
+          <w:sz w:val="24"/>
+          <w:szCs w:val="24"/>
+          <w:lang w:val="en-US"/>
+        </w:rPr>
+        <w:t xml:space="preserve"> academic planning.</w:t>
+      </w:r>
+    </w:p>
+    <w:p>
+      <w:pPr>
+        <w:spacing w:line="360" w:lineRule="auto"/>
+        <w:jc w:val="both"/>
+        <w:rPr>
+          <w:rFonts w:ascii="Arial" w:hAnsi="Arial" w:cs="Arial"/>
+          <w:sz w:val="24"/>
+          <w:szCs w:val="24"/>
+          <w:lang w:val="en-US"/>
+        </w:rPr>
+      </w:pPr>
+    </w:p>
+    <w:p>
+      <w:pPr>
+        <w:spacing w:line="360" w:lineRule="auto"/>
+        <w:jc w:val="both"/>
+        <w:rPr>
+          <w:rFonts w:ascii="Arial" w:hAnsi="Arial" w:cs="Arial"/>
+          <w:sz w:val="24"/>
+          <w:szCs w:val="24"/>
+          <w:lang w:val="en-US"/>
+        </w:rPr>
+      </w:pPr>
+      <w:r>
+        <w:rPr>
+          <w:rFonts w:ascii="Arial" w:hAnsi="Arial" w:cs="Arial"/>
+          <w:sz w:val="24"/>
+          <w:szCs w:val="24"/>
+          <w:lang w:val="en-US"/>
+        </w:rPr>
+        <w:t xml:space="preserve">Thus, this project expands the original idea into a </w:t>
+      </w:r>
+      <w:r>
+        <w:rPr>
+          <w:rFonts w:ascii="Arial" w:hAnsi="Arial" w:cs="Arial"/>
+          <w:sz w:val="24"/>
+          <w:szCs w:val="24"/>
+          <w:lang w:val="en-US"/>
+        </w:rPr>
+        <w:t xml:space="preserve">more </w:t>
+      </w:r>
+      <w:r>
+        <w:rPr>
+          <w:rFonts w:ascii="Arial" w:hAnsi="Arial" w:cs="Arial"/>
+          <w:sz w:val="24"/>
+          <w:szCs w:val="24"/>
+          <w:lang w:val="en-US"/>
+        </w:rPr>
+        <w:t>complete program.</w:t>
+      </w:r>
+      <w:r>
+        <w:rPr>
+          <w:rFonts w:ascii="Arial" w:hAnsi="Arial" w:cs="Arial"/>
+          <w:sz w:val="24"/>
+          <w:szCs w:val="24"/>
+          <w:lang w:val="en-US"/>
+        </w:rPr>
+        <w:t xml:space="preserve"> Moreover, my project includes</w:t>
+      </w:r>
+      <w:r>
+        <w:rPr>
+          <w:rFonts w:ascii="Arial" w:hAnsi="Arial" w:cs="Arial"/>
+          <w:sz w:val="24"/>
+          <w:szCs w:val="24"/>
+          <w:lang w:val="en-US"/>
+        </w:rPr>
+        <w:t xml:space="preserve"> a graphical user interface (GUI)</w:t>
+      </w:r>
+      <w:r>
+        <w:rPr>
+          <w:rFonts w:ascii="Arial" w:hAnsi="Arial" w:cs="Arial"/>
+          <w:sz w:val="24"/>
+          <w:szCs w:val="24"/>
+          <w:lang w:val="en-US"/>
+        </w:rPr>
+        <w:t>, persistent data storage</w:t>
+      </w:r>
+      <w:r>
+        <w:rPr>
+          <w:rFonts w:ascii="Arial" w:hAnsi="Arial" w:cs="Arial"/>
+          <w:sz w:val="24"/>
+          <w:szCs w:val="24"/>
+          <w:lang w:val="en-US"/>
+        </w:rPr>
+        <w:t>, course and semester management</w:t>
+      </w:r>
+      <w:r>
+        <w:rPr>
+          <w:rFonts w:ascii="Arial" w:hAnsi="Arial" w:cs="Arial"/>
+          <w:sz w:val="24"/>
+          <w:szCs w:val="24"/>
+          <w:lang w:val="en-US"/>
+        </w:rPr>
+        <w:t>, automatic GPA calculations</w:t>
+      </w:r>
+      <w:r>
+        <w:rPr>
+          <w:rFonts w:ascii="Arial" w:hAnsi="Arial" w:cs="Arial"/>
+          <w:sz w:val="24"/>
+          <w:szCs w:val="24"/>
+          <w:lang w:val="en-US"/>
+        </w:rPr>
+        <w:t>, degree progress tracking</w:t>
+      </w:r>
+      <w:r>
+        <w:rPr>
+          <w:rFonts w:ascii="Arial" w:hAnsi="Arial" w:cs="Arial"/>
+          <w:sz w:val="24"/>
+          <w:szCs w:val="24"/>
+          <w:lang w:val="en-US"/>
+        </w:rPr>
+        <w:t>, and a GPA prediction tool</w:t>
+      </w:r>
+      <w:r>
+        <w:rPr>
+          <w:rFonts w:ascii="Arial" w:hAnsi="Arial" w:cs="Arial"/>
+          <w:sz w:val="24"/>
+          <w:szCs w:val="24"/>
+          <w:lang w:val="en-US"/>
+        </w:rPr>
+        <w:t>.</w:t>
+      </w:r>
+      <w:r>
+        <w:rPr>
+          <w:rFonts w:ascii="Arial" w:hAnsi="Arial" w:cs="Arial"/>
+          <w:sz w:val="24"/>
+          <w:szCs w:val="24"/>
+          <w:lang w:val="en-US"/>
+        </w:rPr>
+        <w:t xml:space="preserve"> The user will be able to add, edit</w:t>
+      </w:r>
+      <w:r>
+        <w:rPr>
+          <w:rFonts w:ascii="Arial" w:hAnsi="Arial" w:cs="Arial"/>
+          <w:sz w:val="24"/>
+          <w:szCs w:val="24"/>
+          <w:lang w:val="en-US"/>
+        </w:rPr>
+        <w:t>, and remove courses</w:t>
+      </w:r>
+      <w:r>
+        <w:rPr>
+          <w:rFonts w:ascii="Arial" w:hAnsi="Arial" w:cs="Arial"/>
+          <w:sz w:val="24"/>
+          <w:szCs w:val="24"/>
+          <w:lang w:val="en-US"/>
+        </w:rPr>
+        <w:t xml:space="preserve"> instead of entering all information each time they start the program.</w:t>
+      </w:r>
+    </w:p>
+    <w:p>
+      <w:pPr>
+        <w:spacing w:line="360" w:lineRule="auto"/>
+        <w:jc w:val="both"/>
+        <w:rPr>
+          <w:rFonts w:ascii="Arial" w:hAnsi="Arial" w:cs="Arial"/>
+          <w:sz w:val="24"/>
+          <w:szCs w:val="24"/>
+          <w:lang w:val="en-US"/>
+        </w:rPr>
+      </w:pPr>
+    </w:p>
+    <w:p>
+      <w:pPr>
+        <w:spacing w:line="360" w:lineRule="auto"/>
+        <w:jc w:val="both"/>
+        <w:rPr>
+          <w:rFonts w:ascii="Arial" w:hAnsi="Arial" w:cs="Arial"/>
+          <w:sz w:val="24"/>
+          <w:szCs w:val="24"/>
+          <w:lang w:val="en-US"/>
+        </w:rPr>
+      </w:pPr>
+      <w:r>
+        <w:rPr>
+          <w:rFonts w:ascii="Arial" w:hAnsi="Arial" w:cs="Arial"/>
+          <w:sz w:val="24"/>
+          <w:szCs w:val="24"/>
+          <w:lang w:val="en-US"/>
+        </w:rPr>
+        <w:t>A</w:t>
+      </w:r>
+      <w:r>
+        <w:rPr>
+          <w:rFonts w:ascii="Arial" w:hAnsi="Arial" w:cs="Arial"/>
+          <w:sz w:val="24"/>
+          <w:szCs w:val="24"/>
+          <w:lang w:val="en-US"/>
+        </w:rPr>
+        <w:t>n important feature of</w:t>
+      </w:r>
+      <w:r>
+        <w:rPr>
+          <w:rFonts w:ascii="Arial" w:hAnsi="Arial" w:cs="Arial"/>
+          <w:sz w:val="24"/>
+          <w:szCs w:val="24"/>
+          <w:lang w:val="en-US"/>
+        </w:rPr>
+        <w:t xml:space="preserve"> the project is the distinction between different types of </w:t>
+      </w:r>
+      <w:r>
+        <w:rPr>
+          <w:rFonts w:ascii="Arial" w:hAnsi="Arial" w:cs="Arial"/>
+          <w:sz w:val="24"/>
+          <w:szCs w:val="24"/>
+          <w:lang w:val="en-US"/>
+        </w:rPr>
+        <w:t xml:space="preserve">academic </w:t>
+      </w:r>
+      <w:r>
+        <w:rPr>
+          <w:rFonts w:ascii="Arial" w:hAnsi="Arial" w:cs="Arial"/>
+          <w:sz w:val="24"/>
+          <w:szCs w:val="24"/>
+          <w:lang w:val="en-US"/>
+        </w:rPr>
+        <w:t>information</w:t>
+      </w:r>
+      <w:r>
+        <w:rPr>
+          <w:rFonts w:ascii="Arial" w:hAnsi="Arial" w:cs="Arial"/>
+          <w:sz w:val="24"/>
+          <w:szCs w:val="24"/>
+          <w:lang w:val="en-US"/>
+        </w:rPr>
+        <w:t>.</w:t>
+      </w:r>
+      <w:r>
+        <w:rPr>
+          <w:rFonts w:ascii="Arial" w:hAnsi="Arial" w:cs="Arial"/>
+          <w:sz w:val="24"/>
+          <w:szCs w:val="24"/>
+          <w:lang w:val="en-US"/>
+        </w:rPr>
+        <w:t xml:space="preserve"> For example, earned credits and attempted credits are not the same thing.</w:t>
+      </w:r>
+      <w:r>
+        <w:rPr>
+          <w:rFonts w:ascii="Arial" w:hAnsi="Arial" w:cs="Arial"/>
+          <w:sz w:val="24"/>
+          <w:szCs w:val="24"/>
+          <w:lang w:val="en-US"/>
+        </w:rPr>
+        <w:t xml:space="preserve"> A course with a failing grade</w:t>
+      </w:r>
+      <w:r>
+        <w:rPr>
+          <w:rFonts w:ascii="Arial" w:hAnsi="Arial" w:cs="Arial"/>
+          <w:sz w:val="24"/>
+          <w:szCs w:val="24"/>
+          <w:lang w:val="en-US"/>
+        </w:rPr>
+        <w:t>, for example,</w:t>
+      </w:r>
+      <w:r>
+        <w:rPr>
+          <w:rFonts w:ascii="Arial" w:hAnsi="Arial" w:cs="Arial"/>
+          <w:sz w:val="24"/>
+          <w:szCs w:val="24"/>
+          <w:lang w:val="en-US"/>
+        </w:rPr>
+        <w:t xml:space="preserve"> counts toward the attempted credits but not to the number of earned credits.</w:t>
+      </w:r>
+      <w:r>
+        <w:rPr>
+          <w:rFonts w:ascii="Arial" w:hAnsi="Arial" w:cs="Arial"/>
+          <w:sz w:val="24"/>
+          <w:szCs w:val="24"/>
+          <w:lang w:val="en-US"/>
+        </w:rPr>
+        <w:t xml:space="preserve"> Hence, this program should not only perform mathematical calculation of the </w:t>
+      </w:r>
+      <w:r>
+        <w:rPr>
+          <w:rFonts w:ascii="Arial" w:hAnsi="Arial" w:cs="Arial"/>
+          <w:sz w:val="24"/>
+          <w:szCs w:val="24"/>
+          <w:lang w:val="en-US"/>
+        </w:rPr>
+        <w:t>GPA but</w:t>
+      </w:r>
+      <w:r>
+        <w:rPr>
+          <w:rFonts w:ascii="Arial" w:hAnsi="Arial" w:cs="Arial"/>
+          <w:sz w:val="24"/>
+          <w:szCs w:val="24"/>
+          <w:lang w:val="en-US"/>
+        </w:rPr>
+        <w:t xml:space="preserve"> also model </w:t>
+      </w:r>
+      <w:r>
+        <w:rPr>
+          <w:rFonts w:ascii="Arial" w:hAnsi="Arial" w:cs="Arial"/>
+          <w:sz w:val="24"/>
+          <w:szCs w:val="24"/>
+          <w:lang w:val="en-US"/>
+        </w:rPr>
+        <w:t>academic information in a</w:t>
+      </w:r>
+      <w:r>
+        <w:rPr>
+          <w:rFonts w:ascii="Arial" w:hAnsi="Arial" w:cs="Arial"/>
+          <w:sz w:val="24"/>
+          <w:szCs w:val="24"/>
+          <w:lang w:val="en-US"/>
+        </w:rPr>
+        <w:t xml:space="preserve"> structured and accurate way.</w:t>
+      </w:r>
+    </w:p>
+    <w:p>
+      <w:pPr>
+        <w:spacing w:line="360" w:lineRule="auto"/>
+        <w:jc w:val="both"/>
+        <w:rPr>
+          <w:rFonts w:ascii="Arial" w:hAnsi="Arial" w:cs="Arial"/>
+          <w:sz w:val="24"/>
+          <w:szCs w:val="24"/>
+          <w:lang w:val="en-US"/>
+        </w:rPr>
+      </w:pPr>
+    </w:p>
+    <w:p>
+      <w:pPr>
+        <w:spacing w:line="360" w:lineRule="auto"/>
+        <w:jc w:val="both"/>
+        <w:rPr>
+          <w:rFonts w:ascii="Arial" w:hAnsi="Arial" w:cs="Arial"/>
+          <w:sz w:val="24"/>
+          <w:szCs w:val="24"/>
+          <w:lang w:val="en-US"/>
+        </w:rPr>
+      </w:pPr>
+      <w:r>
+        <w:rPr>
+          <w:rFonts w:ascii="Arial" w:hAnsi="Arial" w:cs="Arial"/>
+          <w:sz w:val="24"/>
+          <w:szCs w:val="24"/>
+          <w:lang w:val="en-US"/>
+        </w:rPr>
+        <w:t xml:space="preserve">Another planned feature is a </w:t>
+      </w:r>
+      <w:r>
+        <w:rPr>
+          <w:rFonts w:ascii="Arial" w:hAnsi="Arial" w:cs="Arial"/>
+          <w:sz w:val="24"/>
+          <w:szCs w:val="24"/>
+          <w:lang w:val="en-US"/>
+        </w:rPr>
+        <w:t>W</w:t>
+      </w:r>
+      <w:r>
+        <w:rPr>
+          <w:rFonts w:ascii="Arial" w:hAnsi="Arial" w:cs="Arial"/>
+          <w:sz w:val="24"/>
+          <w:szCs w:val="24"/>
+          <w:lang w:val="en-US"/>
+        </w:rPr>
+        <w:t>hat-if</w:t>
+      </w:r>
+      <w:r>
+        <w:rPr>
+          <w:rFonts w:ascii="Arial" w:hAnsi="Arial" w:cs="Arial"/>
+          <w:sz w:val="24"/>
+          <w:szCs w:val="24"/>
+          <w:lang w:val="en-US"/>
+        </w:rPr>
+        <w:t xml:space="preserve"> GPA </w:t>
+      </w:r>
+      <w:r>
+        <w:rPr>
+          <w:rFonts w:ascii="Arial" w:hAnsi="Arial" w:cs="Arial"/>
+          <w:sz w:val="24"/>
+          <w:szCs w:val="24"/>
+          <w:lang w:val="en-US"/>
+        </w:rPr>
+        <w:t>Calculator.</w:t>
+      </w:r>
+      <w:r>
+        <w:rPr>
+          <w:rFonts w:ascii="Arial" w:hAnsi="Arial" w:cs="Arial"/>
+          <w:sz w:val="24"/>
+          <w:szCs w:val="24"/>
+          <w:lang w:val="en-US"/>
+        </w:rPr>
+        <w:t xml:space="preserve"> This part of the program will allow students to</w:t>
+      </w:r>
+      <w:r>
+        <w:rPr>
+          <w:rFonts w:ascii="Arial" w:hAnsi="Arial" w:cs="Arial"/>
+          <w:sz w:val="24"/>
+          <w:szCs w:val="24"/>
+          <w:lang w:val="en-US"/>
+        </w:rPr>
+        <w:t xml:space="preserve"> enter possible future courses</w:t>
+      </w:r>
+      <w:r>
+        <w:rPr>
+          <w:rFonts w:ascii="Arial" w:hAnsi="Arial" w:cs="Arial"/>
+          <w:sz w:val="24"/>
+          <w:szCs w:val="24"/>
+          <w:lang w:val="en-US"/>
+        </w:rPr>
+        <w:t xml:space="preserve"> and expected grades</w:t>
+      </w:r>
+      <w:r>
+        <w:rPr>
+          <w:rFonts w:ascii="Arial" w:hAnsi="Arial" w:cs="Arial"/>
+          <w:sz w:val="24"/>
+          <w:szCs w:val="24"/>
+          <w:lang w:val="en-US"/>
+        </w:rPr>
+        <w:t xml:space="preserve"> without permanently adding them to</w:t>
+      </w:r>
+      <w:r>
+        <w:rPr>
+          <w:rFonts w:ascii="Arial" w:hAnsi="Arial" w:cs="Arial"/>
+          <w:sz w:val="24"/>
+          <w:szCs w:val="24"/>
+          <w:lang w:val="en-US"/>
+        </w:rPr>
+        <w:t xml:space="preserve"> the academic record.</w:t>
+      </w:r>
+      <w:r>
+        <w:rPr>
+          <w:rFonts w:ascii="Arial" w:hAnsi="Arial" w:cs="Arial"/>
+          <w:sz w:val="24"/>
+          <w:szCs w:val="24"/>
+          <w:lang w:val="en-US"/>
+        </w:rPr>
+        <w:t xml:space="preserve"> Then a projected GPA will be calculated.</w:t>
+      </w:r>
+      <w:r>
+        <w:rPr>
+          <w:rFonts w:ascii="Arial" w:hAnsi="Arial" w:cs="Arial"/>
+          <w:sz w:val="24"/>
+          <w:szCs w:val="24"/>
+          <w:lang w:val="en-US"/>
+        </w:rPr>
+        <w:t xml:space="preserve"> That way students can see</w:t>
+      </w:r>
+      <w:r>
+        <w:rPr>
+          <w:rFonts w:ascii="Arial" w:hAnsi="Arial" w:cs="Arial"/>
+          <w:sz w:val="24"/>
+          <w:szCs w:val="24"/>
+          <w:lang w:val="en-US"/>
+        </w:rPr>
+        <w:t xml:space="preserve"> how</w:t>
+      </w:r>
+      <w:r>
+        <w:rPr>
+          <w:rFonts w:ascii="Arial" w:hAnsi="Arial" w:cs="Arial"/>
+          <w:sz w:val="24"/>
+          <w:szCs w:val="24"/>
+          <w:lang w:val="en-US"/>
+        </w:rPr>
+        <w:t xml:space="preserve"> </w:t>
+      </w:r>
+      <w:r>
+        <w:rPr>
+          <w:rFonts w:ascii="Arial" w:hAnsi="Arial" w:cs="Arial"/>
+          <w:sz w:val="24"/>
+          <w:szCs w:val="24"/>
+          <w:lang w:val="en-US"/>
+        </w:rPr>
+        <w:t>future academic performance may influence their GPAs</w:t>
+      </w:r>
+      <w:r>
+        <w:rPr>
+          <w:rFonts w:ascii="Arial" w:hAnsi="Arial" w:cs="Arial"/>
+          <w:sz w:val="24"/>
+          <w:szCs w:val="24"/>
+          <w:lang w:val="en-US"/>
+        </w:rPr>
+        <w:t xml:space="preserve"> and instead of only seeing their past results also planning their future semesters</w:t>
+      </w:r>
+      <w:r>
+        <w:rPr>
+          <w:rFonts w:ascii="Arial" w:hAnsi="Arial" w:cs="Arial"/>
+          <w:sz w:val="24"/>
+          <w:szCs w:val="24"/>
+          <w:lang w:val="en-US"/>
+        </w:rPr>
+        <w:t>.</w:t>
+      </w:r>
+    </w:p>
+    <w:p>
+      <w:pPr>
+        <w:spacing w:line="360" w:lineRule="auto"/>
+        <w:jc w:val="both"/>
+        <w:rPr>
+          <w:rFonts w:ascii="Arial" w:hAnsi="Arial" w:cs="Arial"/>
+          <w:sz w:val="24"/>
+          <w:szCs w:val="24"/>
+          <w:lang w:val="en-US"/>
+        </w:rPr>
+      </w:pPr>
+    </w:p>
+    <w:p>
+      <w:pPr>
+        <w:spacing w:line="360" w:lineRule="auto"/>
+        <w:jc w:val="both"/>
+        <w:rPr>
+          <w:rFonts w:ascii="Arial" w:hAnsi="Arial" w:cs="Arial"/>
+          <w:sz w:val="24"/>
+          <w:szCs w:val="24"/>
+          <w:lang w:val="en-US"/>
+        </w:rPr>
+      </w:pPr>
+      <w:r>
+        <w:rPr>
+          <w:rFonts w:ascii="Arial" w:hAnsi="Arial" w:cs="Arial"/>
+          <w:sz w:val="24"/>
+          <w:szCs w:val="24"/>
+          <w:lang w:val="en-US"/>
+        </w:rPr>
+        <w:t>I chose this topic because</w:t>
+      </w:r>
+      <w:r>
+        <w:rPr>
+          <w:rFonts w:ascii="Arial" w:hAnsi="Arial" w:cs="Arial"/>
+          <w:sz w:val="24"/>
+          <w:szCs w:val="24"/>
+          <w:lang w:val="en-US"/>
+        </w:rPr>
+        <w:t xml:space="preserve"> it is related to me, as I am an AUBG student myself.</w:t>
+      </w:r>
+      <w:r>
+        <w:rPr>
+          <w:rFonts w:ascii="Arial" w:hAnsi="Arial" w:cs="Arial"/>
+          <w:sz w:val="24"/>
+          <w:szCs w:val="24"/>
+          <w:lang w:val="en-US"/>
+        </w:rPr>
+        <w:t xml:space="preserve"> In my years at AUBG I had</w:t>
+      </w:r>
+      <w:r>
+        <w:rPr>
+          <w:rFonts w:ascii="Arial" w:hAnsi="Arial" w:cs="Arial"/>
+          <w:sz w:val="24"/>
+          <w:szCs w:val="24"/>
+          <w:lang w:val="en-US"/>
+        </w:rPr>
+        <w:t xml:space="preserve"> to keep track of my GPA all on my own</w:t>
+      </w:r>
+      <w:r>
+        <w:rPr>
+          <w:rFonts w:ascii="Arial" w:hAnsi="Arial" w:cs="Arial"/>
+          <w:sz w:val="24"/>
+          <w:szCs w:val="24"/>
+          <w:lang w:val="en-US"/>
+        </w:rPr>
+        <w:t xml:space="preserve"> and it has been hard</w:t>
+      </w:r>
+      <w:r>
+        <w:rPr>
+          <w:rFonts w:ascii="Arial" w:hAnsi="Arial" w:cs="Arial"/>
+          <w:sz w:val="24"/>
+          <w:szCs w:val="24"/>
+          <w:lang w:val="en-US"/>
+        </w:rPr>
+        <w:t>.</w:t>
+      </w:r>
+      <w:r>
+        <w:rPr>
+          <w:rFonts w:ascii="Arial" w:hAnsi="Arial" w:cs="Arial"/>
+          <w:sz w:val="24"/>
+          <w:szCs w:val="24"/>
+          <w:lang w:val="en-US"/>
+        </w:rPr>
+        <w:t xml:space="preserve"> That is why I wanted to create a</w:t>
+      </w:r>
+      <w:r>
+        <w:rPr>
+          <w:rFonts w:ascii="Arial" w:hAnsi="Arial" w:cs="Arial"/>
+          <w:sz w:val="24"/>
+          <w:szCs w:val="24"/>
+          <w:lang w:val="en-US"/>
+        </w:rPr>
+        <w:t>n interesting</w:t>
+      </w:r>
+      <w:r>
+        <w:rPr>
+          <w:rFonts w:ascii="Arial" w:hAnsi="Arial" w:cs="Arial"/>
+          <w:sz w:val="24"/>
+          <w:szCs w:val="24"/>
+          <w:lang w:val="en-US"/>
+        </w:rPr>
+        <w:t xml:space="preserve"> project that solves </w:t>
+      </w:r>
+      <w:r>
+        <w:rPr>
+          <w:rFonts w:ascii="Arial" w:hAnsi="Arial" w:cs="Arial"/>
+          <w:sz w:val="24"/>
+          <w:szCs w:val="24"/>
+          <w:lang w:val="en-US"/>
+        </w:rPr>
+        <w:t xml:space="preserve">a </w:t>
+      </w:r>
+      <w:r>
+        <w:rPr>
+          <w:rFonts w:ascii="Arial" w:hAnsi="Arial" w:cs="Arial"/>
+          <w:sz w:val="24"/>
+          <w:szCs w:val="24"/>
+          <w:lang w:val="en-US"/>
+        </w:rPr>
+        <w:t>real problem</w:t>
+      </w:r>
+      <w:r>
+        <w:rPr>
+          <w:rFonts w:ascii="Arial" w:hAnsi="Arial" w:cs="Arial"/>
+          <w:sz w:val="24"/>
+          <w:szCs w:val="24"/>
+          <w:lang w:val="en-US"/>
+        </w:rPr>
+        <w:t>.</w:t>
+      </w:r>
+      <w:r>
+        <w:rPr>
+          <w:rFonts w:ascii="Arial" w:hAnsi="Arial" w:cs="Arial"/>
+          <w:sz w:val="24"/>
+          <w:szCs w:val="24"/>
+          <w:lang w:val="en-US"/>
+        </w:rPr>
+        <w:t xml:space="preserve"> The fact that this problem is so interesting to me and could be of practical use</w:t>
+      </w:r>
+      <w:r>
+        <w:rPr>
+          <w:rFonts w:ascii="Arial" w:hAnsi="Arial" w:cs="Arial"/>
+          <w:sz w:val="24"/>
+          <w:szCs w:val="24"/>
+          <w:lang w:val="en-US"/>
+        </w:rPr>
+        <w:t xml:space="preserve"> makes the development process more interesting </w:t>
+      </w:r>
+      <w:r>
+        <w:rPr>
+          <w:rFonts w:ascii="Arial" w:hAnsi="Arial" w:cs="Arial"/>
+          <w:sz w:val="24"/>
+          <w:szCs w:val="24"/>
+          <w:lang w:val="en-US"/>
+        </w:rPr>
+        <w:t>to</w:t>
+      </w:r>
+      <w:r>
+        <w:rPr>
+          <w:rFonts w:ascii="Arial" w:hAnsi="Arial" w:cs="Arial"/>
+          <w:sz w:val="24"/>
+          <w:szCs w:val="24"/>
+          <w:lang w:val="en-US"/>
+        </w:rPr>
+        <w:t xml:space="preserve"> me.</w:t>
+      </w:r>
+    </w:p>
+    <w:p>
+      <w:pPr>
+        <w:spacing w:line="360" w:lineRule="auto"/>
+        <w:jc w:val="both"/>
+        <w:rPr>
+          <w:rFonts w:ascii="Arial" w:hAnsi="Arial" w:cs="Arial"/>
+          <w:sz w:val="24"/>
+          <w:szCs w:val="24"/>
+          <w:lang w:val="en-US"/>
+        </w:rPr>
+      </w:pPr>
+    </w:p>
+    <w:p>
+      <w:pPr>
+        <w:spacing w:line="360" w:lineRule="auto"/>
+        <w:jc w:val="both"/>
+        <w:rPr>
+          <w:rFonts w:ascii="Arial" w:hAnsi="Arial" w:cs="Arial"/>
+          <w:sz w:val="24"/>
+          <w:szCs w:val="24"/>
+          <w:lang w:val="en-US"/>
+        </w:rPr>
+      </w:pPr>
+      <w:r>
+        <w:rPr>
+          <w:rFonts w:ascii="Arial" w:hAnsi="Arial" w:cs="Arial"/>
+          <w:sz w:val="24"/>
+          <w:szCs w:val="24"/>
+          <w:lang w:val="en-US"/>
+        </w:rPr>
+        <w:t xml:space="preserve">This project will be mainly in </w:t>
+      </w:r>
+      <w:r>
+        <w:rPr>
+          <w:rFonts w:ascii="Arial" w:hAnsi="Arial" w:cs="Arial"/>
+          <w:sz w:val="24"/>
+          <w:szCs w:val="24"/>
+          <w:lang w:val="en-US"/>
+        </w:rPr>
+        <w:t>C#,</w:t>
+      </w:r>
+      <w:r>
+        <w:rPr>
+          <w:rFonts w:ascii="Arial" w:hAnsi="Arial" w:cs="Arial"/>
+          <w:sz w:val="24"/>
+          <w:szCs w:val="24"/>
+          <w:lang w:val="en-US"/>
+        </w:rPr>
+        <w:t xml:space="preserve"> but I will also use</w:t>
+      </w:r>
+      <w:r>
+        <w:rPr>
+          <w:rFonts w:ascii="Arial" w:hAnsi="Arial" w:cs="Arial"/>
+          <w:sz w:val="24"/>
+          <w:szCs w:val="24"/>
+          <w:lang w:val="en-US"/>
+        </w:rPr>
+        <w:t xml:space="preserve"> object-oriented programming principles</w:t>
+      </w:r>
+      <w:r>
+        <w:rPr>
+          <w:rFonts w:ascii="Arial" w:hAnsi="Arial" w:cs="Arial"/>
+          <w:sz w:val="24"/>
+          <w:szCs w:val="24"/>
+          <w:lang w:val="en-US"/>
+        </w:rPr>
+        <w:t>, graphical user interface</w:t>
+      </w:r>
+      <w:r>
+        <w:rPr>
+          <w:rFonts w:ascii="Arial" w:hAnsi="Arial" w:cs="Arial"/>
+          <w:sz w:val="24"/>
+          <w:szCs w:val="24"/>
+          <w:lang w:val="en-US"/>
+        </w:rPr>
+        <w:t>, database management</w:t>
+      </w:r>
+      <w:r>
+        <w:rPr>
+          <w:rFonts w:ascii="Arial" w:hAnsi="Arial" w:cs="Arial"/>
+          <w:sz w:val="24"/>
+          <w:szCs w:val="24"/>
+          <w:lang w:val="en-US"/>
+        </w:rPr>
+        <w:t>, validation of user input</w:t>
+      </w:r>
+      <w:r>
+        <w:rPr>
+          <w:rFonts w:ascii="Arial" w:hAnsi="Arial" w:cs="Arial"/>
+          <w:sz w:val="24"/>
+          <w:szCs w:val="24"/>
+          <w:lang w:val="en-US"/>
+        </w:rPr>
+        <w:t>, separation of</w:t>
+      </w:r>
+      <w:r>
+        <w:rPr>
+          <w:rFonts w:ascii="Arial" w:hAnsi="Arial" w:cs="Arial"/>
+          <w:sz w:val="24"/>
+          <w:szCs w:val="24"/>
+          <w:lang w:val="en-US"/>
+        </w:rPr>
+        <w:t xml:space="preserve"> application logic</w:t>
+      </w:r>
+      <w:r>
+        <w:rPr>
+          <w:rFonts w:ascii="Arial" w:hAnsi="Arial" w:cs="Arial"/>
+          <w:sz w:val="24"/>
+          <w:szCs w:val="24"/>
+          <w:lang w:val="en-US"/>
+        </w:rPr>
+        <w:t xml:space="preserve"> into different components</w:t>
+      </w:r>
+      <w:r>
+        <w:rPr>
+          <w:rFonts w:ascii="Arial" w:hAnsi="Arial" w:cs="Arial"/>
+          <w:sz w:val="24"/>
+          <w:szCs w:val="24"/>
+          <w:lang w:val="en-US"/>
+        </w:rPr>
+        <w:t>, and software testing</w:t>
+      </w:r>
+      <w:r>
+        <w:rPr>
+          <w:rFonts w:ascii="Arial" w:hAnsi="Arial" w:cs="Arial"/>
+          <w:sz w:val="24"/>
+          <w:szCs w:val="24"/>
+          <w:lang w:val="en-US"/>
+        </w:rPr>
+        <w:t>.</w:t>
+      </w:r>
+      <w:r>
+        <w:rPr>
+          <w:rFonts w:ascii="Arial" w:hAnsi="Arial" w:cs="Arial"/>
+          <w:sz w:val="24"/>
+          <w:szCs w:val="24"/>
+          <w:lang w:val="en-US"/>
+        </w:rPr>
+        <w:t xml:space="preserve"> Inst</w:t>
+      </w:r>
+      <w:r>
+        <w:rPr>
+          <w:rFonts w:ascii="Arial" w:hAnsi="Arial" w:cs="Arial"/>
+          <w:sz w:val="24"/>
+          <w:szCs w:val="24"/>
+          <w:lang w:val="en-US"/>
+        </w:rPr>
+        <w:t>ead of</w:t>
+      </w:r>
+      <w:r>
+        <w:rPr>
+          <w:rFonts w:ascii="Arial" w:hAnsi="Arial" w:cs="Arial"/>
+          <w:sz w:val="24"/>
+          <w:szCs w:val="24"/>
+          <w:lang w:val="en-US"/>
+        </w:rPr>
+        <w:t xml:space="preserve"> placing the entire functionality in </w:t>
+      </w:r>
+      <w:r>
+        <w:rPr>
+          <w:rFonts w:ascii="Arial" w:hAnsi="Arial" w:cs="Arial"/>
+          <w:sz w:val="24"/>
+          <w:szCs w:val="24"/>
+          <w:lang w:val="en-US"/>
+        </w:rPr>
+        <w:t>a single file</w:t>
+      </w:r>
+      <w:r>
+        <w:rPr>
+          <w:rFonts w:ascii="Arial" w:hAnsi="Arial" w:cs="Arial"/>
+          <w:sz w:val="24"/>
+          <w:szCs w:val="24"/>
+          <w:lang w:val="en-US"/>
+        </w:rPr>
+        <w:t>, the system will be divided into</w:t>
+      </w:r>
+      <w:r>
+        <w:rPr>
+          <w:rFonts w:ascii="Arial" w:hAnsi="Arial" w:cs="Arial"/>
+          <w:sz w:val="24"/>
+          <w:szCs w:val="24"/>
+          <w:lang w:val="en-US"/>
+        </w:rPr>
+        <w:t xml:space="preserve"> models,</w:t>
+      </w:r>
+      <w:r>
+        <w:rPr>
+          <w:rFonts w:ascii="Arial" w:hAnsi="Arial" w:cs="Arial"/>
+          <w:sz w:val="24"/>
+          <w:szCs w:val="24"/>
+          <w:lang w:val="en-US"/>
+        </w:rPr>
+        <w:t xml:space="preserve"> services</w:t>
+      </w:r>
+      <w:r>
+        <w:rPr>
+          <w:rFonts w:ascii="Arial" w:hAnsi="Arial" w:cs="Arial"/>
+          <w:sz w:val="24"/>
+          <w:szCs w:val="24"/>
+          <w:lang w:val="en-US"/>
+        </w:rPr>
+        <w:t>, user interface components</w:t>
+      </w:r>
+      <w:r>
+        <w:rPr>
+          <w:rFonts w:ascii="Arial" w:hAnsi="Arial" w:cs="Arial"/>
+          <w:sz w:val="24"/>
+          <w:szCs w:val="24"/>
+          <w:lang w:val="en-US"/>
+        </w:rPr>
+        <w:t>, and data-access components.</w:t>
+      </w:r>
+      <w:r>
+        <w:rPr>
+          <w:rFonts w:ascii="Arial" w:hAnsi="Arial" w:cs="Arial"/>
+          <w:sz w:val="24"/>
+          <w:szCs w:val="24"/>
+          <w:lang w:val="en-US"/>
+        </w:rPr>
+        <w:t xml:space="preserve"> This structure will make the application easier to </w:t>
+      </w:r>
+      <w:r>
+        <w:rPr>
+          <w:rFonts w:ascii="Arial" w:hAnsi="Arial" w:cs="Arial"/>
+          <w:sz w:val="24"/>
+          <w:szCs w:val="24"/>
+          <w:lang w:val="en-US"/>
+        </w:rPr>
+        <w:t>understand, maintain, test, and extend.</w:t>
+      </w:r>
+    </w:p>
+    <w:p>
+      <w:pPr>
+        <w:spacing w:line="360" w:lineRule="auto"/>
+        <w:jc w:val="both"/>
+        <w:rPr>
+          <w:rFonts w:ascii="Arial" w:hAnsi="Arial" w:cs="Arial"/>
+          <w:sz w:val="24"/>
+          <w:szCs w:val="24"/>
+          <w:lang w:val="en-US"/>
+        </w:rPr>
+      </w:pPr>
+    </w:p>
+    <w:p>
+      <w:pPr>
+        <w:spacing w:line="360" w:lineRule="auto"/>
+        <w:jc w:val="both"/>
+        <w:rPr>
+          <w:rFonts w:ascii="Arial" w:hAnsi="Arial" w:cs="Arial"/>
+          <w:sz w:val="24"/>
+          <w:szCs w:val="24"/>
+          <w:lang w:val="en-US"/>
+        </w:rPr>
+      </w:pPr>
+      <w:r>
+        <w:rPr>
+          <w:rFonts w:ascii="Arial" w:hAnsi="Arial" w:cs="Arial"/>
+          <w:sz w:val="24"/>
+          <w:szCs w:val="24"/>
+          <w:lang w:val="en-US"/>
+        </w:rPr>
+        <w:t xml:space="preserve">Altogether, my project </w:t>
+      </w:r>
+      <w:r>
+        <w:rPr>
+          <w:rFonts w:ascii="Arial" w:hAnsi="Arial" w:cs="Arial"/>
+          <w:sz w:val="24"/>
+          <w:szCs w:val="24"/>
+          <w:lang w:val="en-US"/>
+        </w:rPr>
+        <w:t>should</w:t>
+      </w:r>
+      <w:r>
+        <w:rPr>
+          <w:rFonts w:ascii="Arial" w:hAnsi="Arial" w:cs="Arial"/>
+          <w:sz w:val="24"/>
+          <w:szCs w:val="24"/>
+          <w:lang w:val="en-US"/>
+        </w:rPr>
+        <w:t xml:space="preserve"> </w:t>
+      </w:r>
+      <w:r>
+        <w:rPr>
+          <w:rFonts w:ascii="Arial" w:hAnsi="Arial" w:cs="Arial"/>
+          <w:sz w:val="24"/>
+          <w:szCs w:val="24"/>
+          <w:lang w:val="en-US"/>
+        </w:rPr>
+        <w:t>allow</w:t>
+      </w:r>
+      <w:r>
+        <w:rPr>
+          <w:rFonts w:ascii="Arial" w:hAnsi="Arial" w:cs="Arial"/>
+          <w:sz w:val="24"/>
+          <w:szCs w:val="24"/>
+          <w:lang w:val="en-US"/>
+        </w:rPr>
+        <w:t xml:space="preserve"> </w:t>
+      </w:r>
+      <w:r>
+        <w:rPr>
+          <w:rFonts w:ascii="Arial" w:hAnsi="Arial" w:cs="Arial"/>
+          <w:sz w:val="24"/>
+          <w:szCs w:val="24"/>
+          <w:lang w:val="en-US"/>
+        </w:rPr>
+        <w:t>users</w:t>
+      </w:r>
+      <w:r>
+        <w:rPr>
+          <w:rFonts w:ascii="Arial" w:hAnsi="Arial" w:cs="Arial"/>
+          <w:sz w:val="24"/>
+          <w:szCs w:val="24"/>
+          <w:lang w:val="en-US"/>
+        </w:rPr>
+        <w:t xml:space="preserve"> to</w:t>
+      </w:r>
+      <w:r>
+        <w:rPr>
+          <w:rFonts w:ascii="Arial" w:hAnsi="Arial" w:cs="Arial"/>
+          <w:sz w:val="24"/>
+          <w:szCs w:val="24"/>
+          <w:lang w:val="en-US"/>
+        </w:rPr>
+        <w:t xml:space="preserve"> manage</w:t>
+      </w:r>
+      <w:r>
+        <w:rPr>
+          <w:rFonts w:ascii="Arial" w:hAnsi="Arial" w:cs="Arial"/>
+          <w:sz w:val="24"/>
+          <w:szCs w:val="24"/>
+          <w:lang w:val="en-US"/>
+        </w:rPr>
+        <w:t xml:space="preserve"> courses and semesters</w:t>
+      </w:r>
+      <w:r>
+        <w:rPr>
+          <w:rFonts w:ascii="Arial" w:hAnsi="Arial" w:cs="Arial"/>
+          <w:sz w:val="24"/>
+          <w:szCs w:val="24"/>
+          <w:lang w:val="en-US"/>
+        </w:rPr>
+        <w:t>, calculate GPA</w:t>
+      </w:r>
+      <w:r>
+        <w:rPr>
+          <w:rFonts w:ascii="Arial" w:hAnsi="Arial" w:cs="Arial"/>
+          <w:sz w:val="24"/>
+          <w:szCs w:val="24"/>
+          <w:lang w:val="en-US"/>
+        </w:rPr>
+        <w:t xml:space="preserve"> credits automatically</w:t>
+      </w:r>
+      <w:r>
+        <w:rPr>
+          <w:rFonts w:ascii="Arial" w:hAnsi="Arial" w:cs="Arial"/>
+          <w:sz w:val="24"/>
+          <w:szCs w:val="24"/>
+          <w:lang w:val="en-US"/>
+        </w:rPr>
+        <w:t>, store academic information permanently</w:t>
+      </w:r>
+      <w:r>
+        <w:rPr>
+          <w:rFonts w:ascii="Arial" w:hAnsi="Arial" w:cs="Arial"/>
+          <w:sz w:val="24"/>
+          <w:szCs w:val="24"/>
+          <w:lang w:val="en-US"/>
+        </w:rPr>
+        <w:t>, simulate future academic results, and</w:t>
+      </w:r>
+      <w:r>
+        <w:rPr>
+          <w:rFonts w:ascii="Arial" w:hAnsi="Arial" w:cs="Arial"/>
+          <w:sz w:val="24"/>
+          <w:szCs w:val="24"/>
+          <w:lang w:val="en-US"/>
+        </w:rPr>
+        <w:t xml:space="preserve"> display progress toward graduation</w:t>
+      </w:r>
+      <w:r>
+        <w:rPr>
+          <w:rFonts w:ascii="Arial" w:hAnsi="Arial" w:cs="Arial"/>
+          <w:sz w:val="24"/>
+          <w:szCs w:val="24"/>
+          <w:lang w:val="en-US"/>
+        </w:rPr>
+        <w:t xml:space="preserve"> in a clear form.</w:t>
+      </w:r>
+    </w:p>
     <w:sectPr>
-      <w:pgSz w:w="11906" w:h="16838"/>
+      <w:footerReference w:type="default" r:id="rId6"/>
+      <w:pgSz w:w="11906" w:h="16838" w:code="9"/>
       <w:pgMar w:top="1417" w:right="1417" w:bottom="1417" w:left="1417" w:header="708" w:footer="708" w:gutter="0"/>
       <w:cols w:space="708"/>
       <w:docGrid w:linePitch="360"/>
     </w:sectPr>
   </w:body>
 </w:document>
+</file>
+
+<file path=word/endnotes.xml><?xml version="1.0" encoding="utf-8"?>
+<w:endnotes xmlns:wpc="http://schemas.microsoft.com/office/word/2010/wordprocessingCanvas" xmlns:cx="http://schemas.microsoft.com/office/drawing/2014/chartex" xmlns:cx1="http://schemas.microsoft.com/office/drawing/2015/9/8/chartex" xmlns:cx2="http://schemas.microsoft.com/office/drawing/2015/10/21/chartex" xmlns:cx3="http://schemas.microsoft.com/office/drawing/2016/5/9/chartex" xmlns:cx4="http://schemas.microsoft.com/office/drawing/2016/5/10/chartex" xmlns:cx5="http://schemas.microsoft.com/office/drawing/2016/5/11/chartex" xmlns:cx6="http://schemas.microsoft.com/office/drawing/2016/5/12/chartex" xmlns:cx7="http://schemas.microsoft.com/office/drawing/2016/5/13/chartex" xmlns:cx8="http://schemas.microsoft.com/office/drawing/2016/5/14/chartex" xmlns:mc="http://schemas.openxmlformats.org/markup-compatibility/2006" xmlns:aink="http://schemas.microsoft.com/office/drawing/2016/ink" xmlns:am3d="http://schemas.microsoft.com/office/drawing/2017/model3d" xmlns:o="urn:schemas-microsoft-com:office:office" xmlns:oel="http://schemas.microsoft.com/office/2019/extlst" xmlns:r="http://schemas.openxmlformats.org/officeDocument/2006/relationships" xmlns:m="http://schemas.openxmlformats.org/officeDocument/2006/math" xmlns:v="urn:schemas-microsoft-com:vml" xmlns:wp14="http://schemas.microsoft.com/office/word/2010/wordprocessingDrawing" xmlns:wp="http://schemas.openxmlformats.org/drawingml/2006/wordprocessingDrawing" xmlns:w10="urn:schemas-microsoft-com:office:word" xmlns:w="http://schemas.openxmlformats.org/wordprocessingml/2006/main" xmlns:w14="http://schemas.microsoft.com/office/word/2010/wordml" xmlns:w15="http://schemas.microsoft.com/office/word/2012/wordml" xmlns:w16cex="http://schemas.microsoft.com/office/word/2018/wordml/cex" xmlns:w16cid="http://schemas.microsoft.com/office/word/2016/wordml/cid" xmlns:w16="http://schemas.microsoft.com/office/word/2018/wordml" xmlns:w16du="http://schemas.microsoft.com/office/word/2023/wordml/word16du" xmlns:w16sdtdh="http://schemas.microsoft.com/office/word/2020/wordml/sdtdatahash" xmlns:w16sdtfl="http://schemas.microsoft.com/office/word/2024/wordml/sdtformatlock" xmlns:w16se="http://schemas.microsoft.com/office/word/2015/wordml/symex" xmlns:wpg="http://schemas.microsoft.com/office/word/2010/wordprocessingGroup" xmlns:wpi="http://schemas.microsoft.com/office/word/2010/wordprocessingInk" xmlns:wne="http://schemas.microsoft.com/office/word/2006/wordml" xmlns:wps="http://schemas.microsoft.com/office/word/2010/wordprocessingShape" mc:Ignorable="w14 w15 w16se w16cid w16 w16cex w16sdtdh w16sdtfl w16du wp14">
+  <w:endnote w:type="separator" w:id="-1">
+    <w:p>
+      <w:pPr>
+        <w:spacing w:after="0" w:line="240" w:lineRule="auto"/>
+      </w:pPr>
+      <w:r>
+        <w:separator/>
+      </w:r>
+    </w:p>
+  </w:endnote>
+  <w:endnote w:type="continuationSeparator" w:id="0">
+    <w:p>
+      <w:pPr>
+        <w:spacing w:after="0" w:line="240" w:lineRule="auto"/>
+      </w:pPr>
+      <w:r>
+        <w:continuationSeparator/>
+      </w:r>
+    </w:p>
+  </w:endnote>
+</w:endnotes>
+</file>
+
+<file path=word/footer1.xml><?xml version="1.0" encoding="utf-8"?>
+<w:ftr xmlns:wpc="http://schemas.microsoft.com/office/word/2010/wordprocessingCanvas" xmlns:cx="http://schemas.microsoft.com/office/drawing/2014/chartex" xmlns:cx1="http://schemas.microsoft.com/office/drawing/2015/9/8/chartex" xmlns:cx2="http://schemas.microsoft.com/office/drawing/2015/10/21/chartex" xmlns:cx3="http://schemas.microsoft.com/office/drawing/2016/5/9/chartex" xmlns:cx4="http://schemas.microsoft.com/office/drawing/2016/5/10/chartex" xmlns:cx5="http://schemas.microsoft.com/office/drawing/2016/5/11/chartex" xmlns:cx6="http://schemas.microsoft.com/office/drawing/2016/5/12/chartex" xmlns:cx7="http://schemas.microsoft.com/office/drawing/2016/5/13/chartex" xmlns:cx8="http://schemas.microsoft.com/office/drawing/2016/5/14/chartex" xmlns:mc="http://schemas.openxmlformats.org/markup-compatibility/2006" xmlns:aink="http://schemas.microsoft.com/office/drawing/2016/ink" xmlns:am3d="http://schemas.microsoft.com/office/drawing/2017/model3d" xmlns:o="urn:schemas-microsoft-com:office:office" xmlns:oel="http://schemas.microsoft.com/office/2019/extlst" xmlns:r="http://schemas.openxmlformats.org/officeDocument/2006/relationships" xmlns:m="http://schemas.openxmlformats.org/officeDocument/2006/math" xmlns:v="urn:schemas-microsoft-com:vml" xmlns:wp14="http://schemas.microsoft.com/office/word/2010/wordprocessingDrawing" xmlns:wp="http://schemas.openxmlformats.org/drawingml/2006/wordprocessingDrawing" xmlns:w10="urn:schemas-microsoft-com:office:word" xmlns:w="http://schemas.openxmlformats.org/wordprocessingml/2006/main" xmlns:w14="http://schemas.microsoft.com/office/word/2010/wordml" xmlns:w15="http://schemas.microsoft.com/office/word/2012/wordml" xmlns:w16cex="http://schemas.microsoft.com/office/word/2018/wordml/cex" xmlns:w16cid="http://schemas.microsoft.com/office/word/2016/wordml/cid" xmlns:w16="http://schemas.microsoft.com/office/word/2018/wordml" xmlns:w16du="http://schemas.microsoft.com/office/word/2023/wordml/word16du" xmlns:w16sdtdh="http://schemas.microsoft.com/office/word/2020/wordml/sdtdatahash" xmlns:w16sdtfl="http://schemas.microsoft.com/office/word/2024/wordml/sdtformatlock" xmlns:w16se="http://schemas.microsoft.com/office/word/2015/wordml/symex" xmlns:wpg="http://schemas.microsoft.com/office/word/2010/wordprocessingGroup" xmlns:wpi="http://schemas.microsoft.com/office/word/2010/wordprocessingInk" xmlns:wne="http://schemas.microsoft.com/office/word/2006/wordml" xmlns:wps="http://schemas.microsoft.com/office/word/2010/wordprocessingShape" mc:Ignorable="w14 w15 w16se w16cid w16 w16cex w16sdtdh w16sdtfl w16du wp14">
+  <w:sdt>
+    <w:sdtPr>
+      <w:id w:val="1770203914"/>
+      <w:docPartObj>
+        <w:docPartGallery w:val="Page Numbers (Bottom of Page)"/>
+        <w:docPartUnique/>
+      </w:docPartObj>
+    </w:sdtPr>
+    <w:sdtEndPr>
+      <w:rPr>
+        <w:noProof/>
+      </w:rPr>
+    </w:sdtEndPr>
+    <w:sdtContent>
+      <w:p>
+        <w:pPr>
+          <w:pStyle w:val="Footer"/>
+          <w:jc w:val="center"/>
+        </w:pPr>
+        <w:r>
+          <w:fldChar w:fldCharType="begin"/>
+        </w:r>
+        <w:r>
+          <w:instrText xml:space="preserve"> PAGE   \* MERGEFORMAT </w:instrText>
+        </w:r>
+        <w:r>
+          <w:fldChar w:fldCharType="separate"/>
+        </w:r>
+        <w:r>
+          <w:rPr>
+            <w:noProof/>
+          </w:rPr>
+          <w:t>2</w:t>
+        </w:r>
+        <w:r>
+          <w:rPr>
+            <w:noProof/>
+          </w:rPr>
+          <w:fldChar w:fldCharType="end"/>
+        </w:r>
+      </w:p>
+    </w:sdtContent>
+  </w:sdt>
+  <w:p>
+    <w:pPr>
+      <w:pStyle w:val="Footer"/>
+    </w:pPr>
+  </w:p>
+</w:ftr>
+</file>
+
+<file path=word/footnotes.xml><?xml version="1.0" encoding="utf-8"?>
+<w:footnotes xmlns:wpc="http://schemas.microsoft.com/office/word/2010/wordprocessingCanvas" xmlns:cx="http://schemas.microsoft.com/office/drawing/2014/chartex" xmlns:cx1="http://schemas.microsoft.com/office/drawing/2015/9/8/chartex" xmlns:cx2="http://schemas.microsoft.com/office/drawing/2015/10/21/chartex" xmlns:cx3="http://schemas.microsoft.com/office/drawing/2016/5/9/chartex" xmlns:cx4="http://schemas.microsoft.com/office/drawing/2016/5/10/chartex" xmlns:cx5="http://schemas.microsoft.com/office/drawing/2016/5/11/chartex" xmlns:cx6="http://schemas.microsoft.com/office/drawing/2016/5/12/chartex" xmlns:cx7="http://schemas.microsoft.com/office/drawing/2016/5/13/chartex" xmlns:cx8="http://schemas.microsoft.com/office/drawing/2016/5/14/chartex" xmlns:mc="http://schemas.openxmlformats.org/markup-compatibility/2006" xmlns:aink="http://schemas.microsoft.com/office/drawing/2016/ink" xmlns:am3d="http://schemas.microsoft.com/office/drawing/2017/model3d" xmlns:o="urn:schemas-microsoft-com:office:office" xmlns:oel="http://schemas.microsoft.com/office/2019/extlst" xmlns:r="http://schemas.openxmlformats.org/officeDocument/2006/relationships" xmlns:m="http://schemas.openxmlformats.org/officeDocument/2006/math" xmlns:v="urn:schemas-microsoft-com:vml" xmlns:wp14="http://schemas.microsoft.com/office/word/2010/wordprocessingDrawing" xmlns:wp="http://schemas.openxmlformats.org/drawingml/2006/wordprocessingDrawing" xmlns:w10="urn:schemas-microsoft-com:office:word" xmlns:w="http://schemas.openxmlformats.org/wordprocessingml/2006/main" xmlns:w14="http://schemas.microsoft.com/office/word/2010/wordml" xmlns:w15="http://schemas.microsoft.com/office/word/2012/wordml" xmlns:w16cex="http://schemas.microsoft.com/office/word/2018/wordml/cex" xmlns:w16cid="http://schemas.microsoft.com/office/word/2016/wordml/cid" xmlns:w16="http://schemas.microsoft.com/office/word/2018/wordml" xmlns:w16du="http://schemas.microsoft.com/office/word/2023/wordml/word16du" xmlns:w16sdtdh="http://schemas.microsoft.com/office/word/2020/wordml/sdtdatahash" xmlns:w16sdtfl="http://schemas.microsoft.com/office/word/2024/wordml/sdtformatlock" xmlns:w16se="http://schemas.microsoft.com/office/word/2015/wordml/symex" xmlns:wpg="http://schemas.microsoft.com/office/word/2010/wordprocessingGroup" xmlns:wpi="http://schemas.microsoft.com/office/word/2010/wordprocessingInk" xmlns:wne="http://schemas.microsoft.com/office/word/2006/wordml" xmlns:wps="http://schemas.microsoft.com/office/word/2010/wordprocessingShape" mc:Ignorable="w14 w15 w16se w16cid w16 w16cex w16sdtdh w16sdtfl w16du wp14">
+  <w:footnote w:type="separator" w:id="-1">
+    <w:p>
+      <w:pPr>
+        <w:spacing w:after="0" w:line="240" w:lineRule="auto"/>
+      </w:pPr>
+      <w:r>
+        <w:separator/>
+      </w:r>
+    </w:p>
+  </w:footnote>
+  <w:footnote w:type="continuationSeparator" w:id="0">
+    <w:p>
+      <w:pPr>
+        <w:spacing w:after="0" w:line="240" w:lineRule="auto"/>
+      </w:pPr>
+      <w:r>
+        <w:continuationSeparator/>
+      </w:r>
+    </w:p>
+  </w:footnote>
+</w:footnotes>
 </file>
 
 <file path=word/styles.xml><?xml version="1.0" encoding="utf-8"?>
@@ -433,6 +2209,7 @@
   <w:style w:type="paragraph" w:default="1" w:styleId="Normal">
     <w:name w:val="Normal"/>
     <w:qFormat/>
+    <w:rsid w:val="005D43BD"/>
   </w:style>
   <w:style w:type="paragraph" w:styleId="Heading1">
     <w:name w:val="heading 1"/>
@@ -948,6 +2725,70 @@
       <w:smallCaps/>
       <w:color w:val="2E74B5" w:themeColor="accent1" w:themeShade="BF"/>
       <w:spacing w:val="5"/>
+    </w:rPr>
+  </w:style>
+  <w:style w:type="paragraph" w:styleId="Header">
+    <w:name w:val="header"/>
+    <w:basedOn w:val="Normal"/>
+    <w:link w:val="HeaderChar"/>
+    <w:uiPriority w:val="99"/>
+    <w:unhideWhenUsed/>
+    <w:rsid w:val="00C46D7C"/>
+    <w:pPr>
+      <w:tabs>
+        <w:tab w:val="center" w:pos="4536"/>
+        <w:tab w:val="right" w:pos="9072"/>
+      </w:tabs>
+      <w:spacing w:after="0" w:line="240" w:lineRule="auto"/>
+    </w:pPr>
+  </w:style>
+  <w:style w:type="character" w:customStyle="1" w:styleId="HeaderChar">
+    <w:name w:val="Header Char"/>
+    <w:basedOn w:val="DefaultParagraphFont"/>
+    <w:link w:val="Header"/>
+    <w:uiPriority w:val="99"/>
+    <w:rsid w:val="00C46D7C"/>
+  </w:style>
+  <w:style w:type="paragraph" w:styleId="Footer">
+    <w:name w:val="footer"/>
+    <w:basedOn w:val="Normal"/>
+    <w:link w:val="FooterChar"/>
+    <w:uiPriority w:val="99"/>
+    <w:unhideWhenUsed/>
+    <w:rsid w:val="00C46D7C"/>
+    <w:pPr>
+      <w:tabs>
+        <w:tab w:val="center" w:pos="4536"/>
+        <w:tab w:val="right" w:pos="9072"/>
+      </w:tabs>
+      <w:spacing w:after="0" w:line="240" w:lineRule="auto"/>
+    </w:pPr>
+  </w:style>
+  <w:style w:type="character" w:customStyle="1" w:styleId="FooterChar">
+    <w:name w:val="Footer Char"/>
+    <w:basedOn w:val="DefaultParagraphFont"/>
+    <w:link w:val="Footer"/>
+    <w:uiPriority w:val="99"/>
+    <w:rsid w:val="00C46D7C"/>
+  </w:style>
+  <w:style w:type="paragraph" w:styleId="Caption">
+    <w:name w:val="caption"/>
+    <w:basedOn w:val="Normal"/>
+    <w:next w:val="Normal"/>
+    <w:uiPriority w:val="35"/>
+    <w:semiHidden/>
+    <w:unhideWhenUsed/>
+    <w:qFormat/>
+    <w:rsid w:val="005D43BD"/>
+    <w:pPr>
+      <w:spacing w:after="200" w:line="240" w:lineRule="auto"/>
+    </w:pPr>
+    <w:rPr>
+      <w:rFonts w:ascii="Arial" w:hAnsi="Arial"/>
+      <w:iCs/>
+      <w:color w:val="44546A" w:themeColor="text2"/>
+      <w:sz w:val="24"/>
+      <w:szCs w:val="18"/>
     </w:rPr>
   </w:style>
 </w:styles>

</xml_diff>

<commit_message>
Continuing my thesis with its second part.
</commit_message>
<xml_diff>
--- a/Project Thesis.docx
+++ b/Project Thesis.docx
@@ -4,6 +4,11 @@
   <w:body>
     <w:p>
       <w:pPr>
+        <w:pStyle w:val="ListParagraph"/>
+        <w:numPr>
+          <w:ilvl w:val="0"/>
+          <w:numId w:val="1"/>
+        </w:numPr>
         <w:spacing w:line="360" w:lineRule="auto"/>
         <w:jc w:val="center"/>
         <w:rPr>
@@ -1695,8 +1700,1898 @@
         <w:t xml:space="preserve"> in a clear form.</w:t>
       </w:r>
     </w:p>
+    <w:p>
+      <w:pPr>
+        <w:spacing w:line="360" w:lineRule="auto"/>
+        <w:jc w:val="both"/>
+        <w:rPr>
+          <w:rFonts w:ascii="Arial" w:hAnsi="Arial" w:cs="Arial"/>
+          <w:sz w:val="24"/>
+          <w:szCs w:val="24"/>
+          <w:lang w:val="en-US"/>
+        </w:rPr>
+      </w:pPr>
+    </w:p>
+    <w:p>
+      <w:pPr>
+        <w:pStyle w:val="ListParagraph"/>
+        <w:numPr>
+          <w:ilvl w:val="0"/>
+          <w:numId w:val="1"/>
+        </w:numPr>
+        <w:spacing w:line="360" w:lineRule="auto"/>
+        <w:jc w:val="center"/>
+        <w:rPr>
+          <w:rFonts w:ascii="Arial" w:hAnsi="Arial" w:cs="Arial"/>
+          <w:sz w:val="24"/>
+          <w:szCs w:val="24"/>
+          <w:lang w:val="en-US"/>
+        </w:rPr>
+      </w:pPr>
+      <w:r>
+        <w:rPr>
+          <w:rFonts w:ascii="Arial" w:hAnsi="Arial" w:cs="Arial"/>
+          <w:sz w:val="24"/>
+          <w:szCs w:val="24"/>
+          <w:lang w:val="en-US"/>
+        </w:rPr>
+        <w:t>Specification of the Software Requirements</w:t>
+      </w:r>
+      <w:r>
+        <w:rPr>
+          <w:rFonts w:ascii="Arial" w:hAnsi="Arial" w:cs="Arial"/>
+          <w:sz w:val="24"/>
+          <w:szCs w:val="24"/>
+          <w:lang w:val="en-US"/>
+        </w:rPr>
+        <w:t xml:space="preserve"> and Their Analysis</w:t>
+      </w:r>
+    </w:p>
+    <w:p>
+      <w:pPr>
+        <w:spacing w:line="360" w:lineRule="auto"/>
+        <w:rPr>
+          <w:rFonts w:ascii="Arial" w:hAnsi="Arial" w:cs="Arial"/>
+          <w:sz w:val="24"/>
+          <w:szCs w:val="24"/>
+          <w:lang w:val="en-US"/>
+        </w:rPr>
+      </w:pPr>
+    </w:p>
+    <w:p>
+      <w:pPr>
+        <w:pStyle w:val="ListParagraph"/>
+        <w:numPr>
+          <w:ilvl w:val="1"/>
+          <w:numId w:val="1"/>
+        </w:numPr>
+        <w:spacing w:line="360" w:lineRule="auto"/>
+        <w:rPr>
+          <w:rFonts w:ascii="Arial" w:hAnsi="Arial" w:cs="Arial"/>
+          <w:sz w:val="24"/>
+          <w:szCs w:val="24"/>
+          <w:lang w:val="en-US"/>
+        </w:rPr>
+      </w:pPr>
+      <w:r>
+        <w:rPr>
+          <w:rFonts w:ascii="Arial" w:hAnsi="Arial" w:cs="Arial"/>
+          <w:sz w:val="24"/>
+          <w:szCs w:val="24"/>
+          <w:lang w:val="en-US"/>
+        </w:rPr>
+        <w:t>Purpose and Scope</w:t>
+      </w:r>
+    </w:p>
+    <w:p>
+      <w:pPr>
+        <w:spacing w:line="360" w:lineRule="auto"/>
+        <w:rPr>
+          <w:rFonts w:ascii="Arial" w:hAnsi="Arial" w:cs="Arial"/>
+          <w:sz w:val="24"/>
+          <w:szCs w:val="24"/>
+          <w:lang w:val="en-US"/>
+        </w:rPr>
+      </w:pPr>
+    </w:p>
+    <w:p>
+      <w:pPr>
+        <w:spacing w:line="360" w:lineRule="auto"/>
+        <w:rPr>
+          <w:rFonts w:ascii="Arial" w:hAnsi="Arial" w:cs="Arial"/>
+          <w:sz w:val="24"/>
+          <w:szCs w:val="24"/>
+          <w:lang w:val="en-US"/>
+        </w:rPr>
+      </w:pPr>
+      <w:r>
+        <w:rPr>
+          <w:rFonts w:ascii="Arial" w:hAnsi="Arial" w:cs="Arial"/>
+          <w:sz w:val="24"/>
+          <w:szCs w:val="24"/>
+          <w:lang w:val="en-US"/>
+        </w:rPr>
+        <w:t>The AUBG Academic Progress Tracker</w:t>
+      </w:r>
+      <w:r>
+        <w:rPr>
+          <w:rFonts w:ascii="Arial" w:hAnsi="Arial" w:cs="Arial"/>
+          <w:sz w:val="24"/>
+          <w:szCs w:val="24"/>
+          <w:lang w:val="en-US"/>
+        </w:rPr>
+        <w:t xml:space="preserve"> is designed to</w:t>
+      </w:r>
+      <w:r>
+        <w:rPr>
+          <w:rFonts w:ascii="Arial" w:hAnsi="Arial" w:cs="Arial"/>
+          <w:sz w:val="24"/>
+          <w:szCs w:val="24"/>
+          <w:lang w:val="en-US"/>
+        </w:rPr>
+        <w:t xml:space="preserve"> help AUBG students</w:t>
+      </w:r>
+      <w:r>
+        <w:rPr>
+          <w:rFonts w:ascii="Arial" w:hAnsi="Arial" w:cs="Arial"/>
+          <w:sz w:val="24"/>
+          <w:szCs w:val="24"/>
+          <w:lang w:val="en-US"/>
+        </w:rPr>
+        <w:t xml:space="preserve"> organize, store</w:t>
+      </w:r>
+      <w:r>
+        <w:rPr>
+          <w:rFonts w:ascii="Arial" w:hAnsi="Arial" w:cs="Arial"/>
+          <w:sz w:val="24"/>
+          <w:szCs w:val="24"/>
+          <w:lang w:val="en-US"/>
+        </w:rPr>
+        <w:t>, and analyze information</w:t>
+      </w:r>
+      <w:r>
+        <w:rPr>
+          <w:rFonts w:ascii="Arial" w:hAnsi="Arial" w:cs="Arial"/>
+          <w:sz w:val="24"/>
+          <w:szCs w:val="24"/>
+          <w:lang w:val="en-US"/>
+        </w:rPr>
+        <w:t xml:space="preserve"> about</w:t>
+      </w:r>
+      <w:r>
+        <w:rPr>
+          <w:rFonts w:ascii="Arial" w:hAnsi="Arial" w:cs="Arial"/>
+          <w:sz w:val="24"/>
+          <w:szCs w:val="24"/>
+          <w:lang w:val="en-US"/>
+        </w:rPr>
+        <w:t xml:space="preserve"> their academic progress.</w:t>
+      </w:r>
+      <w:r>
+        <w:rPr>
+          <w:rFonts w:ascii="Arial" w:hAnsi="Arial" w:cs="Arial"/>
+          <w:sz w:val="24"/>
+          <w:szCs w:val="24"/>
+          <w:lang w:val="en-US"/>
+        </w:rPr>
+        <w:t xml:space="preserve"> The program manages</w:t>
+      </w:r>
+      <w:r>
+        <w:rPr>
+          <w:rFonts w:ascii="Arial" w:hAnsi="Arial" w:cs="Arial"/>
+          <w:sz w:val="24"/>
+          <w:szCs w:val="24"/>
+          <w:lang w:val="en-US"/>
+        </w:rPr>
+        <w:t xml:space="preserve"> courses and semesters</w:t>
+      </w:r>
+      <w:r>
+        <w:rPr>
+          <w:rFonts w:ascii="Arial" w:hAnsi="Arial" w:cs="Arial"/>
+          <w:sz w:val="24"/>
+          <w:szCs w:val="24"/>
+          <w:lang w:val="en-US"/>
+        </w:rPr>
+        <w:t>, calculates semester and cumulative GPA</w:t>
+      </w:r>
+      <w:r>
+        <w:rPr>
+          <w:rFonts w:ascii="Arial" w:hAnsi="Arial" w:cs="Arial"/>
+          <w:sz w:val="24"/>
+          <w:szCs w:val="24"/>
+          <w:lang w:val="en-US"/>
+        </w:rPr>
+        <w:t>, distinguishes between attempted and earned credits</w:t>
+      </w:r>
+      <w:r>
+        <w:rPr>
+          <w:rFonts w:ascii="Arial" w:hAnsi="Arial" w:cs="Arial"/>
+          <w:sz w:val="24"/>
+          <w:szCs w:val="24"/>
+          <w:lang w:val="en-US"/>
+        </w:rPr>
+        <w:t>, allows users to evaluate</w:t>
+      </w:r>
+      <w:r>
+        <w:rPr>
+          <w:rFonts w:ascii="Arial" w:hAnsi="Arial" w:cs="Arial"/>
+          <w:sz w:val="24"/>
+          <w:szCs w:val="24"/>
+          <w:lang w:val="en-US"/>
+        </w:rPr>
+        <w:t xml:space="preserve"> possible future academic results</w:t>
+      </w:r>
+      <w:r>
+        <w:rPr>
+          <w:rFonts w:ascii="Arial" w:hAnsi="Arial" w:cs="Arial"/>
+          <w:sz w:val="24"/>
+          <w:szCs w:val="24"/>
+          <w:lang w:val="en-US"/>
+        </w:rPr>
+        <w:t>, and displays progress toward</w:t>
+      </w:r>
+      <w:r>
+        <w:rPr>
+          <w:rFonts w:ascii="Arial" w:hAnsi="Arial" w:cs="Arial"/>
+          <w:sz w:val="24"/>
+          <w:szCs w:val="24"/>
+          <w:lang w:val="en-US"/>
+        </w:rPr>
+        <w:t xml:space="preserve"> graduation.</w:t>
+      </w:r>
+    </w:p>
+    <w:p>
+      <w:pPr>
+        <w:spacing w:line="360" w:lineRule="auto"/>
+        <w:rPr>
+          <w:rFonts w:ascii="Arial" w:hAnsi="Arial" w:cs="Arial"/>
+          <w:sz w:val="24"/>
+          <w:szCs w:val="24"/>
+          <w:lang w:val="en-US"/>
+        </w:rPr>
+      </w:pPr>
+    </w:p>
+    <w:p>
+      <w:pPr>
+        <w:spacing w:line="360" w:lineRule="auto"/>
+        <w:rPr>
+          <w:rFonts w:ascii="Arial" w:hAnsi="Arial" w:cs="Arial"/>
+          <w:sz w:val="24"/>
+          <w:szCs w:val="24"/>
+          <w:lang w:val="en-US"/>
+        </w:rPr>
+      </w:pPr>
+      <w:r>
+        <w:rPr>
+          <w:rFonts w:ascii="Arial" w:hAnsi="Arial" w:cs="Arial"/>
+          <w:sz w:val="24"/>
+          <w:szCs w:val="24"/>
+          <w:lang w:val="en-US"/>
+        </w:rPr>
+        <w:t>It is intended</w:t>
+      </w:r>
+      <w:r>
+        <w:rPr>
+          <w:rFonts w:ascii="Arial" w:hAnsi="Arial" w:cs="Arial"/>
+          <w:sz w:val="24"/>
+          <w:szCs w:val="24"/>
+          <w:lang w:val="en-US"/>
+        </w:rPr>
+        <w:t xml:space="preserve"> to provide a more structured alternative</w:t>
+      </w:r>
+      <w:r>
+        <w:rPr>
+          <w:rFonts w:ascii="Arial" w:hAnsi="Arial" w:cs="Arial"/>
+          <w:sz w:val="24"/>
+          <w:szCs w:val="24"/>
+          <w:lang w:val="en-US"/>
+        </w:rPr>
+        <w:t xml:space="preserve"> to</w:t>
+      </w:r>
+      <w:r>
+        <w:rPr>
+          <w:rFonts w:ascii="Arial" w:hAnsi="Arial" w:cs="Arial"/>
+          <w:sz w:val="24"/>
+          <w:szCs w:val="24"/>
+          <w:lang w:val="en-US"/>
+        </w:rPr>
+        <w:t xml:space="preserve"> manually calculating GPA</w:t>
+      </w:r>
+      <w:r>
+        <w:rPr>
+          <w:rFonts w:ascii="Arial" w:hAnsi="Arial" w:cs="Arial"/>
+          <w:sz w:val="24"/>
+          <w:szCs w:val="24"/>
+          <w:lang w:val="en-US"/>
+        </w:rPr>
+        <w:t xml:space="preserve"> or storing academic information</w:t>
+      </w:r>
+      <w:r>
+        <w:rPr>
+          <w:rFonts w:ascii="Arial" w:hAnsi="Arial" w:cs="Arial"/>
+          <w:sz w:val="24"/>
+          <w:szCs w:val="24"/>
+          <w:lang w:val="en-US"/>
+        </w:rPr>
+        <w:t xml:space="preserve"> in separate notes or spreadsheets</w:t>
+      </w:r>
+      <w:r>
+        <w:rPr>
+          <w:rFonts w:ascii="Arial" w:hAnsi="Arial" w:cs="Arial"/>
+          <w:sz w:val="24"/>
+          <w:szCs w:val="24"/>
+          <w:lang w:val="en-US"/>
+        </w:rPr>
+        <w:t>.</w:t>
+      </w:r>
+      <w:r>
+        <w:rPr>
+          <w:rFonts w:ascii="Arial" w:hAnsi="Arial" w:cs="Arial"/>
+          <w:sz w:val="24"/>
+          <w:szCs w:val="24"/>
+          <w:lang w:val="en-US"/>
+        </w:rPr>
+        <w:t xml:space="preserve"> The project combines permanent data storage</w:t>
+      </w:r>
+      <w:r>
+        <w:rPr>
+          <w:rFonts w:ascii="Arial" w:hAnsi="Arial" w:cs="Arial"/>
+          <w:sz w:val="24"/>
+          <w:szCs w:val="24"/>
+          <w:lang w:val="en-US"/>
+        </w:rPr>
+        <w:t>, automatic calculations</w:t>
+      </w:r>
+      <w:r>
+        <w:rPr>
+          <w:rFonts w:ascii="Arial" w:hAnsi="Arial" w:cs="Arial"/>
+          <w:sz w:val="24"/>
+          <w:szCs w:val="24"/>
+          <w:lang w:val="en-US"/>
+        </w:rPr>
+        <w:t>, validation</w:t>
+      </w:r>
+      <w:r>
+        <w:rPr>
+          <w:rFonts w:ascii="Arial" w:hAnsi="Arial" w:cs="Arial"/>
+          <w:sz w:val="24"/>
+          <w:szCs w:val="24"/>
+          <w:lang w:val="en-US"/>
+        </w:rPr>
+        <w:t>, and a graphical user interface</w:t>
+      </w:r>
+      <w:r>
+        <w:rPr>
+          <w:rFonts w:ascii="Arial" w:hAnsi="Arial" w:cs="Arial"/>
+          <w:sz w:val="24"/>
+          <w:szCs w:val="24"/>
+          <w:lang w:val="en-US"/>
+        </w:rPr>
+        <w:t xml:space="preserve"> in a single application.</w:t>
+      </w:r>
+    </w:p>
+    <w:p>
+      <w:pPr>
+        <w:spacing w:line="360" w:lineRule="auto"/>
+        <w:rPr>
+          <w:rFonts w:ascii="Arial" w:hAnsi="Arial" w:cs="Arial"/>
+          <w:sz w:val="24"/>
+          <w:szCs w:val="24"/>
+          <w:lang w:val="en-US"/>
+        </w:rPr>
+      </w:pPr>
+    </w:p>
+    <w:p>
+      <w:pPr>
+        <w:spacing w:line="360" w:lineRule="auto"/>
+        <w:rPr>
+          <w:rFonts w:ascii="Arial" w:hAnsi="Arial" w:cs="Arial"/>
+          <w:sz w:val="24"/>
+          <w:szCs w:val="24"/>
+          <w:lang w:val="en-US"/>
+        </w:rPr>
+      </w:pPr>
+      <w:r>
+        <w:rPr>
+          <w:rFonts w:ascii="Arial" w:hAnsi="Arial" w:cs="Arial"/>
+          <w:sz w:val="24"/>
+          <w:szCs w:val="24"/>
+          <w:lang w:val="en-US"/>
+        </w:rPr>
+        <w:t>The primary user of the application is an AUBG student</w:t>
+      </w:r>
+      <w:r>
+        <w:rPr>
+          <w:rFonts w:ascii="Arial" w:hAnsi="Arial" w:cs="Arial"/>
+          <w:sz w:val="24"/>
+          <w:szCs w:val="24"/>
+          <w:lang w:val="en-US"/>
+        </w:rPr>
+        <w:t xml:space="preserve"> who wants to maintain</w:t>
+      </w:r>
+      <w:r>
+        <w:rPr>
+          <w:rFonts w:ascii="Arial" w:hAnsi="Arial" w:cs="Arial"/>
+          <w:sz w:val="24"/>
+          <w:szCs w:val="24"/>
+          <w:lang w:val="en-US"/>
+        </w:rPr>
+        <w:t xml:space="preserve"> an organized academic re</w:t>
+      </w:r>
+      <w:r>
+        <w:rPr>
+          <w:rFonts w:ascii="Arial" w:hAnsi="Arial" w:cs="Arial"/>
+          <w:sz w:val="24"/>
+          <w:szCs w:val="24"/>
+          <w:lang w:val="en-US"/>
+        </w:rPr>
+        <w:t>cord</w:t>
+      </w:r>
+      <w:r>
+        <w:rPr>
+          <w:rFonts w:ascii="Arial" w:hAnsi="Arial" w:cs="Arial"/>
+          <w:sz w:val="24"/>
+          <w:szCs w:val="24"/>
+          <w:lang w:val="en-US"/>
+        </w:rPr>
+        <w:t xml:space="preserve"> and monitor progress throughout their university</w:t>
+      </w:r>
+      <w:r>
+        <w:rPr>
+          <w:rFonts w:ascii="Arial" w:hAnsi="Arial" w:cs="Arial"/>
+          <w:sz w:val="24"/>
+          <w:szCs w:val="24"/>
+          <w:lang w:val="en-US"/>
+        </w:rPr>
+        <w:t xml:space="preserve"> education.</w:t>
+      </w:r>
+    </w:p>
+    <w:p>
+      <w:pPr>
+        <w:spacing w:line="360" w:lineRule="auto"/>
+        <w:rPr>
+          <w:rFonts w:ascii="Arial" w:hAnsi="Arial" w:cs="Arial"/>
+          <w:sz w:val="24"/>
+          <w:szCs w:val="24"/>
+          <w:lang w:val="en-US"/>
+        </w:rPr>
+      </w:pPr>
+    </w:p>
+    <w:p>
+      <w:pPr>
+        <w:spacing w:line="360" w:lineRule="auto"/>
+        <w:rPr>
+          <w:rFonts w:ascii="Arial" w:hAnsi="Arial" w:cs="Arial"/>
+          <w:sz w:val="24"/>
+          <w:szCs w:val="24"/>
+          <w:lang w:val="en-US"/>
+        </w:rPr>
+      </w:pPr>
+      <w:r>
+        <w:rPr>
+          <w:rFonts w:ascii="Arial" w:hAnsi="Arial" w:cs="Arial"/>
+          <w:sz w:val="24"/>
+          <w:szCs w:val="24"/>
+          <w:lang w:val="en-US"/>
+        </w:rPr>
+        <w:t>It is not intended to replace</w:t>
+      </w:r>
+      <w:r>
+        <w:rPr>
+          <w:rFonts w:ascii="Arial" w:hAnsi="Arial" w:cs="Arial"/>
+          <w:sz w:val="24"/>
+          <w:szCs w:val="24"/>
+          <w:lang w:val="en-US"/>
+        </w:rPr>
+        <w:t xml:space="preserve"> the official university information system</w:t>
+      </w:r>
+      <w:r>
+        <w:rPr>
+          <w:rFonts w:ascii="Arial" w:hAnsi="Arial" w:cs="Arial"/>
+          <w:sz w:val="24"/>
+          <w:szCs w:val="24"/>
+          <w:lang w:val="en-US"/>
+        </w:rPr>
+        <w:t>. It is a personal</w:t>
+      </w:r>
+      <w:r>
+        <w:rPr>
+          <w:rFonts w:ascii="Arial" w:hAnsi="Arial" w:cs="Arial"/>
+          <w:sz w:val="24"/>
+          <w:szCs w:val="24"/>
+          <w:lang w:val="en-US"/>
+        </w:rPr>
+        <w:t xml:space="preserve"> academic planning and tracking tool</w:t>
+      </w:r>
+      <w:r>
+        <w:rPr>
+          <w:rFonts w:ascii="Arial" w:hAnsi="Arial" w:cs="Arial"/>
+          <w:sz w:val="24"/>
+          <w:szCs w:val="24"/>
+          <w:lang w:val="en-US"/>
+        </w:rPr>
+        <w:t>, and the accuracy of its results depend</w:t>
+      </w:r>
+      <w:r>
+        <w:rPr>
+          <w:rFonts w:ascii="Arial" w:hAnsi="Arial" w:cs="Arial"/>
+          <w:sz w:val="24"/>
+          <w:szCs w:val="24"/>
+          <w:lang w:val="en-US"/>
+        </w:rPr>
+        <w:t>s</w:t>
+      </w:r>
+      <w:r>
+        <w:rPr>
+          <w:rFonts w:ascii="Arial" w:hAnsi="Arial" w:cs="Arial"/>
+          <w:sz w:val="24"/>
+          <w:szCs w:val="24"/>
+          <w:lang w:val="en-US"/>
+        </w:rPr>
+        <w:t xml:space="preserve"> on</w:t>
+      </w:r>
+      <w:r>
+        <w:rPr>
+          <w:rFonts w:ascii="Arial" w:hAnsi="Arial" w:cs="Arial"/>
+          <w:sz w:val="24"/>
+          <w:szCs w:val="24"/>
+          <w:lang w:val="en-US"/>
+        </w:rPr>
+        <w:t xml:space="preserve"> the information entered by the user.</w:t>
+      </w:r>
+    </w:p>
+    <w:p>
+      <w:pPr>
+        <w:spacing w:line="360" w:lineRule="auto"/>
+        <w:rPr>
+          <w:rFonts w:ascii="Arial" w:hAnsi="Arial" w:cs="Arial"/>
+          <w:sz w:val="24"/>
+          <w:szCs w:val="24"/>
+          <w:lang w:val="en-US"/>
+        </w:rPr>
+      </w:pPr>
+    </w:p>
+    <w:p>
+      <w:pPr>
+        <w:pStyle w:val="ListParagraph"/>
+        <w:numPr>
+          <w:ilvl w:val="1"/>
+          <w:numId w:val="1"/>
+        </w:numPr>
+        <w:spacing w:line="360" w:lineRule="auto"/>
+        <w:rPr>
+          <w:rFonts w:ascii="Arial" w:hAnsi="Arial" w:cs="Arial"/>
+          <w:sz w:val="24"/>
+          <w:szCs w:val="24"/>
+          <w:lang w:val="en-US"/>
+        </w:rPr>
+      </w:pPr>
+      <w:r>
+        <w:rPr>
+          <w:rFonts w:ascii="Arial" w:hAnsi="Arial" w:cs="Arial"/>
+          <w:sz w:val="24"/>
+          <w:szCs w:val="24"/>
+          <w:lang w:val="en-US"/>
+        </w:rPr>
+        <w:t>Functional Requirements</w:t>
+      </w:r>
+    </w:p>
+    <w:p>
+      <w:pPr>
+        <w:spacing w:line="360" w:lineRule="auto"/>
+        <w:rPr>
+          <w:rFonts w:ascii="Arial" w:hAnsi="Arial" w:cs="Arial"/>
+          <w:sz w:val="24"/>
+          <w:szCs w:val="24"/>
+          <w:lang w:val="en-US"/>
+        </w:rPr>
+      </w:pPr>
+    </w:p>
+    <w:p>
+      <w:pPr>
+        <w:spacing w:line="360" w:lineRule="auto"/>
+        <w:rPr>
+          <w:rFonts w:ascii="Arial" w:hAnsi="Arial" w:cs="Arial"/>
+          <w:sz w:val="24"/>
+          <w:szCs w:val="24"/>
+          <w:lang w:val="en-US"/>
+        </w:rPr>
+      </w:pPr>
+      <w:r>
+        <w:rPr>
+          <w:rFonts w:ascii="Arial" w:hAnsi="Arial" w:cs="Arial"/>
+          <w:sz w:val="24"/>
+          <w:szCs w:val="24"/>
+          <w:lang w:val="en-US"/>
+        </w:rPr>
+        <w:t>FR-01</w:t>
+      </w:r>
+      <w:r>
+        <w:rPr>
+          <w:rFonts w:ascii="Arial" w:hAnsi="Arial" w:cs="Arial"/>
+          <w:sz w:val="24"/>
+          <w:szCs w:val="24"/>
+          <w:lang w:val="en-US"/>
+        </w:rPr>
+        <w:t xml:space="preserve"> – Add a course</w:t>
+      </w:r>
+    </w:p>
+    <w:p>
+      <w:pPr>
+        <w:spacing w:line="360" w:lineRule="auto"/>
+        <w:rPr>
+          <w:rFonts w:ascii="Arial" w:hAnsi="Arial" w:cs="Arial"/>
+          <w:sz w:val="24"/>
+          <w:szCs w:val="24"/>
+          <w:lang w:val="en-US"/>
+        </w:rPr>
+      </w:pPr>
+    </w:p>
+    <w:p>
+      <w:pPr>
+        <w:spacing w:line="360" w:lineRule="auto"/>
+        <w:rPr>
+          <w:rFonts w:ascii="Arial" w:hAnsi="Arial" w:cs="Arial"/>
+          <w:sz w:val="24"/>
+          <w:szCs w:val="24"/>
+          <w:lang w:val="en-US"/>
+        </w:rPr>
+      </w:pPr>
+      <w:r>
+        <w:rPr>
+          <w:rFonts w:ascii="Arial" w:hAnsi="Arial" w:cs="Arial"/>
+          <w:sz w:val="24"/>
+          <w:szCs w:val="24"/>
+          <w:lang w:val="en-US"/>
+        </w:rPr>
+        <w:t xml:space="preserve">FR-01: </w:t>
+      </w:r>
+      <w:r>
+        <w:rPr>
+          <w:rFonts w:ascii="Arial" w:hAnsi="Arial" w:cs="Arial"/>
+          <w:sz w:val="24"/>
+          <w:szCs w:val="24"/>
+          <w:lang w:val="en-US"/>
+        </w:rPr>
+        <w:t>The program will allow the user to add a new course</w:t>
+      </w:r>
+      <w:r>
+        <w:rPr>
+          <w:rFonts w:ascii="Arial" w:hAnsi="Arial" w:cs="Arial"/>
+          <w:sz w:val="24"/>
+          <w:szCs w:val="24"/>
+          <w:lang w:val="en-US"/>
+        </w:rPr>
+        <w:t>.</w:t>
+      </w:r>
+    </w:p>
+    <w:p>
+      <w:pPr>
+        <w:spacing w:line="360" w:lineRule="auto"/>
+        <w:rPr>
+          <w:rFonts w:ascii="Arial" w:hAnsi="Arial" w:cs="Arial"/>
+          <w:sz w:val="24"/>
+          <w:szCs w:val="24"/>
+          <w:lang w:val="en-US"/>
+        </w:rPr>
+      </w:pPr>
+    </w:p>
+    <w:p>
+      <w:pPr>
+        <w:spacing w:line="360" w:lineRule="auto"/>
+        <w:rPr>
+          <w:rFonts w:ascii="Arial" w:hAnsi="Arial" w:cs="Arial"/>
+          <w:sz w:val="24"/>
+          <w:szCs w:val="24"/>
+          <w:lang w:val="en-US"/>
+        </w:rPr>
+      </w:pPr>
+      <w:r>
+        <w:rPr>
+          <w:rFonts w:ascii="Arial" w:hAnsi="Arial" w:cs="Arial"/>
+          <w:sz w:val="24"/>
+          <w:szCs w:val="24"/>
+          <w:lang w:val="en-US"/>
+        </w:rPr>
+        <w:t>The user will be able to</w:t>
+      </w:r>
+      <w:r>
+        <w:rPr>
+          <w:rFonts w:ascii="Arial" w:hAnsi="Arial" w:cs="Arial"/>
+          <w:sz w:val="24"/>
+          <w:szCs w:val="24"/>
+          <w:lang w:val="en-US"/>
+        </w:rPr>
+        <w:t xml:space="preserve"> enter a course code</w:t>
+      </w:r>
+      <w:r>
+        <w:rPr>
+          <w:rFonts w:ascii="Arial" w:hAnsi="Arial" w:cs="Arial"/>
+          <w:sz w:val="24"/>
+          <w:szCs w:val="24"/>
+          <w:lang w:val="en-US"/>
+        </w:rPr>
+        <w:t>, course name, number of credits,</w:t>
+      </w:r>
+      <w:r>
+        <w:rPr>
+          <w:rFonts w:ascii="Arial" w:hAnsi="Arial" w:cs="Arial"/>
+          <w:sz w:val="24"/>
+          <w:szCs w:val="24"/>
+          <w:lang w:val="en-US"/>
+        </w:rPr>
+        <w:t xml:space="preserve"> grade, and semester.</w:t>
+      </w:r>
+      <w:r>
+        <w:rPr>
+          <w:rFonts w:ascii="Arial" w:hAnsi="Arial" w:cs="Arial"/>
+          <w:sz w:val="24"/>
+          <w:szCs w:val="24"/>
+          <w:lang w:val="en-US"/>
+        </w:rPr>
+        <w:t xml:space="preserve"> Before the course is accepted</w:t>
+      </w:r>
+      <w:r>
+        <w:rPr>
+          <w:rFonts w:ascii="Arial" w:hAnsi="Arial" w:cs="Arial"/>
+          <w:sz w:val="24"/>
+          <w:szCs w:val="24"/>
+          <w:lang w:val="en-US"/>
+        </w:rPr>
+        <w:t>, the program will validate all</w:t>
+      </w:r>
+      <w:r>
+        <w:rPr>
+          <w:rFonts w:ascii="Arial" w:hAnsi="Arial" w:cs="Arial"/>
+          <w:sz w:val="24"/>
+          <w:szCs w:val="24"/>
+          <w:lang w:val="en-US"/>
+        </w:rPr>
+        <w:t xml:space="preserve"> required information.</w:t>
+      </w:r>
+    </w:p>
+    <w:p>
+      <w:pPr>
+        <w:spacing w:line="360" w:lineRule="auto"/>
+        <w:rPr>
+          <w:rFonts w:ascii="Arial" w:hAnsi="Arial" w:cs="Arial"/>
+          <w:sz w:val="24"/>
+          <w:szCs w:val="24"/>
+          <w:lang w:val="en-US"/>
+        </w:rPr>
+      </w:pPr>
+    </w:p>
+    <w:p>
+      <w:pPr>
+        <w:spacing w:line="360" w:lineRule="auto"/>
+        <w:rPr>
+          <w:rFonts w:ascii="Arial" w:hAnsi="Arial" w:cs="Arial"/>
+          <w:sz w:val="24"/>
+          <w:szCs w:val="24"/>
+          <w:lang w:val="en-US"/>
+        </w:rPr>
+      </w:pPr>
+      <w:r>
+        <w:rPr>
+          <w:rFonts w:ascii="Arial" w:hAnsi="Arial" w:cs="Arial"/>
+          <w:sz w:val="24"/>
+          <w:szCs w:val="24"/>
+          <w:lang w:val="en-US"/>
+        </w:rPr>
+        <w:t>FR-02</w:t>
+      </w:r>
+      <w:r>
+        <w:rPr>
+          <w:rFonts w:ascii="Arial" w:hAnsi="Arial" w:cs="Arial"/>
+          <w:sz w:val="24"/>
+          <w:szCs w:val="24"/>
+          <w:lang w:val="en-US"/>
+        </w:rPr>
+        <w:t xml:space="preserve"> – </w:t>
+      </w:r>
+      <w:r>
+        <w:rPr>
+          <w:rFonts w:ascii="Arial" w:hAnsi="Arial" w:cs="Arial"/>
+          <w:sz w:val="24"/>
+          <w:szCs w:val="24"/>
+          <w:lang w:val="en-US"/>
+        </w:rPr>
+        <w:t xml:space="preserve">View </w:t>
+      </w:r>
+      <w:r>
+        <w:rPr>
+          <w:rFonts w:ascii="Arial" w:hAnsi="Arial" w:cs="Arial"/>
+          <w:sz w:val="24"/>
+          <w:szCs w:val="24"/>
+          <w:lang w:val="en-US"/>
+        </w:rPr>
+        <w:t>c</w:t>
+      </w:r>
+      <w:r>
+        <w:rPr>
+          <w:rFonts w:ascii="Arial" w:hAnsi="Arial" w:cs="Arial"/>
+          <w:sz w:val="24"/>
+          <w:szCs w:val="24"/>
+          <w:lang w:val="en-US"/>
+        </w:rPr>
+        <w:t>ourses</w:t>
+      </w:r>
+    </w:p>
+    <w:p>
+      <w:pPr>
+        <w:spacing w:line="360" w:lineRule="auto"/>
+        <w:rPr>
+          <w:rFonts w:ascii="Arial" w:hAnsi="Arial" w:cs="Arial"/>
+          <w:sz w:val="24"/>
+          <w:szCs w:val="24"/>
+          <w:lang w:val="en-US"/>
+        </w:rPr>
+      </w:pPr>
+    </w:p>
+    <w:p>
+      <w:pPr>
+        <w:spacing w:line="360" w:lineRule="auto"/>
+        <w:rPr>
+          <w:rFonts w:ascii="Arial" w:hAnsi="Arial" w:cs="Arial"/>
+          <w:sz w:val="24"/>
+          <w:szCs w:val="24"/>
+          <w:lang w:val="en-US"/>
+        </w:rPr>
+      </w:pPr>
+      <w:r>
+        <w:rPr>
+          <w:rFonts w:ascii="Arial" w:hAnsi="Arial" w:cs="Arial"/>
+          <w:sz w:val="24"/>
+          <w:szCs w:val="24"/>
+          <w:lang w:val="en-US"/>
+        </w:rPr>
+        <w:t xml:space="preserve">FR-02: </w:t>
+      </w:r>
+      <w:r>
+        <w:rPr>
+          <w:rFonts w:ascii="Arial" w:hAnsi="Arial" w:cs="Arial"/>
+          <w:sz w:val="24"/>
+          <w:szCs w:val="24"/>
+          <w:lang w:val="en-US"/>
+        </w:rPr>
+        <w:t>The program will display all courses</w:t>
+      </w:r>
+      <w:r>
+        <w:rPr>
+          <w:rFonts w:ascii="Arial" w:hAnsi="Arial" w:cs="Arial"/>
+          <w:sz w:val="24"/>
+          <w:szCs w:val="24"/>
+          <w:lang w:val="en-US"/>
+        </w:rPr>
+        <w:t xml:space="preserve"> stored by the user</w:t>
+      </w:r>
+      <w:r>
+        <w:rPr>
+          <w:rFonts w:ascii="Arial" w:hAnsi="Arial" w:cs="Arial"/>
+          <w:sz w:val="24"/>
+          <w:szCs w:val="24"/>
+          <w:lang w:val="en-US"/>
+        </w:rPr>
+        <w:t>.</w:t>
+      </w:r>
+    </w:p>
+    <w:p>
+      <w:pPr>
+        <w:spacing w:line="360" w:lineRule="auto"/>
+        <w:rPr>
+          <w:rFonts w:ascii="Arial" w:hAnsi="Arial" w:cs="Arial"/>
+          <w:sz w:val="24"/>
+          <w:szCs w:val="24"/>
+          <w:lang w:val="en-US"/>
+        </w:rPr>
+      </w:pPr>
+    </w:p>
+    <w:p>
+      <w:pPr>
+        <w:spacing w:line="360" w:lineRule="auto"/>
+        <w:rPr>
+          <w:rFonts w:ascii="Arial" w:hAnsi="Arial" w:cs="Arial"/>
+          <w:sz w:val="24"/>
+          <w:szCs w:val="24"/>
+          <w:lang w:val="en-US"/>
+        </w:rPr>
+      </w:pPr>
+      <w:r>
+        <w:rPr>
+          <w:rFonts w:ascii="Arial" w:hAnsi="Arial" w:cs="Arial"/>
+          <w:sz w:val="24"/>
+          <w:szCs w:val="24"/>
+          <w:lang w:val="en-US"/>
+        </w:rPr>
+        <w:t>Each course will display its course code</w:t>
+      </w:r>
+      <w:r>
+        <w:rPr>
+          <w:rFonts w:ascii="Arial" w:hAnsi="Arial" w:cs="Arial"/>
+          <w:sz w:val="24"/>
+          <w:szCs w:val="24"/>
+          <w:lang w:val="en-US"/>
+        </w:rPr>
+        <w:t>, name, credit value</w:t>
+      </w:r>
+      <w:r>
+        <w:rPr>
+          <w:rFonts w:ascii="Arial" w:hAnsi="Arial" w:cs="Arial"/>
+          <w:sz w:val="24"/>
+          <w:szCs w:val="24"/>
+          <w:lang w:val="en-US"/>
+        </w:rPr>
+        <w:t>, grade, and semester</w:t>
+      </w:r>
+      <w:r>
+        <w:rPr>
+          <w:rFonts w:ascii="Arial" w:hAnsi="Arial" w:cs="Arial"/>
+          <w:sz w:val="24"/>
+          <w:szCs w:val="24"/>
+          <w:lang w:val="en-US"/>
+        </w:rPr>
+        <w:t>.</w:t>
+      </w:r>
+    </w:p>
+    <w:p>
+      <w:pPr>
+        <w:spacing w:line="360" w:lineRule="auto"/>
+        <w:rPr>
+          <w:rFonts w:ascii="Arial" w:hAnsi="Arial" w:cs="Arial"/>
+          <w:sz w:val="24"/>
+          <w:szCs w:val="24"/>
+          <w:lang w:val="en-US"/>
+        </w:rPr>
+      </w:pPr>
+    </w:p>
+    <w:p>
+      <w:pPr>
+        <w:spacing w:line="360" w:lineRule="auto"/>
+        <w:rPr>
+          <w:rFonts w:ascii="Arial" w:hAnsi="Arial" w:cs="Arial"/>
+          <w:sz w:val="24"/>
+          <w:szCs w:val="24"/>
+          <w:lang w:val="en-US"/>
+        </w:rPr>
+      </w:pPr>
+      <w:r>
+        <w:rPr>
+          <w:rFonts w:ascii="Arial" w:hAnsi="Arial" w:cs="Arial"/>
+          <w:sz w:val="24"/>
+          <w:szCs w:val="24"/>
+          <w:lang w:val="en-US"/>
+        </w:rPr>
+        <w:t>FR-03</w:t>
+      </w:r>
+      <w:r>
+        <w:rPr>
+          <w:rFonts w:ascii="Arial" w:hAnsi="Arial" w:cs="Arial"/>
+          <w:sz w:val="24"/>
+          <w:szCs w:val="24"/>
+          <w:lang w:val="en-US"/>
+        </w:rPr>
+        <w:t xml:space="preserve"> – </w:t>
+      </w:r>
+      <w:r>
+        <w:rPr>
+          <w:rFonts w:ascii="Arial" w:hAnsi="Arial" w:cs="Arial"/>
+          <w:sz w:val="24"/>
+          <w:szCs w:val="24"/>
+          <w:lang w:val="en-US"/>
+        </w:rPr>
+        <w:t>Edit a course</w:t>
+      </w:r>
+    </w:p>
+    <w:p>
+      <w:pPr>
+        <w:spacing w:line="360" w:lineRule="auto"/>
+        <w:rPr>
+          <w:rFonts w:ascii="Arial" w:hAnsi="Arial" w:cs="Arial"/>
+          <w:sz w:val="24"/>
+          <w:szCs w:val="24"/>
+          <w:lang w:val="en-US"/>
+        </w:rPr>
+      </w:pPr>
+    </w:p>
+    <w:p>
+      <w:pPr>
+        <w:spacing w:line="360" w:lineRule="auto"/>
+        <w:rPr>
+          <w:rFonts w:ascii="Arial" w:hAnsi="Arial" w:cs="Arial"/>
+          <w:sz w:val="24"/>
+          <w:szCs w:val="24"/>
+          <w:lang w:val="en-US"/>
+        </w:rPr>
+      </w:pPr>
+      <w:r>
+        <w:rPr>
+          <w:rFonts w:ascii="Arial" w:hAnsi="Arial" w:cs="Arial"/>
+          <w:sz w:val="24"/>
+          <w:szCs w:val="24"/>
+          <w:lang w:val="en-US"/>
+        </w:rPr>
+        <w:t>FR-03</w:t>
+      </w:r>
+      <w:r>
+        <w:rPr>
+          <w:rFonts w:ascii="Arial" w:hAnsi="Arial" w:cs="Arial"/>
+          <w:sz w:val="24"/>
+          <w:szCs w:val="24"/>
+          <w:lang w:val="en-US"/>
+        </w:rPr>
+        <w:t>:</w:t>
+      </w:r>
+      <w:r>
+        <w:rPr>
+          <w:rFonts w:ascii="Arial" w:hAnsi="Arial" w:cs="Arial"/>
+          <w:sz w:val="24"/>
+          <w:szCs w:val="24"/>
+          <w:lang w:val="en-US"/>
+        </w:rPr>
+        <w:t xml:space="preserve"> The program will allow the user to modify an existing course</w:t>
+      </w:r>
+      <w:r>
+        <w:rPr>
+          <w:rFonts w:ascii="Arial" w:hAnsi="Arial" w:cs="Arial"/>
+          <w:sz w:val="24"/>
+          <w:szCs w:val="24"/>
+          <w:lang w:val="en-US"/>
+        </w:rPr>
+        <w:t>.</w:t>
+      </w:r>
+    </w:p>
+    <w:p>
+      <w:pPr>
+        <w:spacing w:line="360" w:lineRule="auto"/>
+        <w:rPr>
+          <w:rFonts w:ascii="Arial" w:hAnsi="Arial" w:cs="Arial"/>
+          <w:sz w:val="24"/>
+          <w:szCs w:val="24"/>
+          <w:lang w:val="en-US"/>
+        </w:rPr>
+      </w:pPr>
+    </w:p>
+    <w:p>
+      <w:pPr>
+        <w:spacing w:line="360" w:lineRule="auto"/>
+        <w:rPr>
+          <w:rFonts w:ascii="Arial" w:hAnsi="Arial" w:cs="Arial"/>
+          <w:sz w:val="24"/>
+          <w:szCs w:val="24"/>
+          <w:lang w:val="en-US"/>
+        </w:rPr>
+      </w:pPr>
+      <w:r>
+        <w:rPr>
+          <w:rFonts w:ascii="Arial" w:hAnsi="Arial" w:cs="Arial"/>
+          <w:sz w:val="24"/>
+          <w:szCs w:val="24"/>
+          <w:lang w:val="en-US"/>
+        </w:rPr>
+        <w:t>The user will be able to change the course</w:t>
+      </w:r>
+      <w:r>
+        <w:rPr>
+          <w:rFonts w:ascii="Arial" w:hAnsi="Arial" w:cs="Arial"/>
+          <w:sz w:val="24"/>
+          <w:szCs w:val="24"/>
+          <w:lang w:val="en-US"/>
+        </w:rPr>
+        <w:t xml:space="preserve"> code, name, credits</w:t>
+      </w:r>
+      <w:r>
+        <w:rPr>
+          <w:rFonts w:ascii="Arial" w:hAnsi="Arial" w:cs="Arial"/>
+          <w:sz w:val="24"/>
+          <w:szCs w:val="24"/>
+          <w:lang w:val="en-US"/>
+        </w:rPr>
+        <w:t>, grade or semester</w:t>
+      </w:r>
+      <w:r>
+        <w:rPr>
+          <w:rFonts w:ascii="Arial" w:hAnsi="Arial" w:cs="Arial"/>
+          <w:sz w:val="24"/>
+          <w:szCs w:val="24"/>
+          <w:lang w:val="en-US"/>
+        </w:rPr>
+        <w:t>.</w:t>
+      </w:r>
+      <w:r>
+        <w:rPr>
+          <w:rFonts w:ascii="Arial" w:hAnsi="Arial" w:cs="Arial"/>
+          <w:sz w:val="24"/>
+          <w:szCs w:val="24"/>
+          <w:lang w:val="en-US"/>
+        </w:rPr>
+        <w:t xml:space="preserve"> Updated information will replace</w:t>
+      </w:r>
+      <w:r>
+        <w:rPr>
+          <w:rFonts w:ascii="Arial" w:hAnsi="Arial" w:cs="Arial"/>
+          <w:sz w:val="24"/>
+          <w:szCs w:val="24"/>
+          <w:lang w:val="en-US"/>
+        </w:rPr>
+        <w:t xml:space="preserve"> the previously stored</w:t>
+      </w:r>
+      <w:r>
+        <w:rPr>
+          <w:rFonts w:ascii="Arial" w:hAnsi="Arial" w:cs="Arial"/>
+          <w:sz w:val="24"/>
+          <w:szCs w:val="24"/>
+          <w:lang w:val="en-US"/>
+        </w:rPr>
+        <w:t xml:space="preserve"> information</w:t>
+      </w:r>
+      <w:r>
+        <w:rPr>
+          <w:rFonts w:ascii="Arial" w:hAnsi="Arial" w:cs="Arial"/>
+          <w:sz w:val="24"/>
+          <w:szCs w:val="24"/>
+          <w:lang w:val="en-US"/>
+        </w:rPr>
+        <w:t xml:space="preserve"> after successful</w:t>
+      </w:r>
+      <w:r>
+        <w:rPr>
+          <w:rFonts w:ascii="Arial" w:hAnsi="Arial" w:cs="Arial"/>
+          <w:sz w:val="24"/>
+          <w:szCs w:val="24"/>
+          <w:lang w:val="en-US"/>
+        </w:rPr>
+        <w:t xml:space="preserve"> validation.</w:t>
+      </w:r>
+    </w:p>
+    <w:p>
+      <w:pPr>
+        <w:spacing w:line="360" w:lineRule="auto"/>
+        <w:rPr>
+          <w:rFonts w:ascii="Arial" w:hAnsi="Arial" w:cs="Arial"/>
+          <w:sz w:val="24"/>
+          <w:szCs w:val="24"/>
+          <w:lang w:val="en-US"/>
+        </w:rPr>
+      </w:pPr>
+    </w:p>
+    <w:p>
+      <w:pPr>
+        <w:spacing w:line="360" w:lineRule="auto"/>
+        <w:rPr>
+          <w:rFonts w:ascii="Arial" w:hAnsi="Arial" w:cs="Arial"/>
+          <w:sz w:val="24"/>
+          <w:szCs w:val="24"/>
+          <w:lang w:val="en-US"/>
+        </w:rPr>
+      </w:pPr>
+      <w:r>
+        <w:rPr>
+          <w:rFonts w:ascii="Arial" w:hAnsi="Arial" w:cs="Arial"/>
+          <w:sz w:val="24"/>
+          <w:szCs w:val="24"/>
+          <w:lang w:val="en-US"/>
+        </w:rPr>
+        <w:t xml:space="preserve">FR-04 – </w:t>
+      </w:r>
+      <w:r>
+        <w:rPr>
+          <w:rFonts w:ascii="Arial" w:hAnsi="Arial" w:cs="Arial"/>
+          <w:sz w:val="24"/>
+          <w:szCs w:val="24"/>
+          <w:lang w:val="en-US"/>
+        </w:rPr>
+        <w:t>Delete a course</w:t>
+      </w:r>
+    </w:p>
+    <w:p>
+      <w:pPr>
+        <w:spacing w:line="360" w:lineRule="auto"/>
+        <w:rPr>
+          <w:rFonts w:ascii="Arial" w:hAnsi="Arial" w:cs="Arial"/>
+          <w:sz w:val="24"/>
+          <w:szCs w:val="24"/>
+          <w:lang w:val="en-US"/>
+        </w:rPr>
+      </w:pPr>
+    </w:p>
+    <w:p>
+      <w:pPr>
+        <w:spacing w:line="360" w:lineRule="auto"/>
+        <w:rPr>
+          <w:rFonts w:ascii="Arial" w:hAnsi="Arial" w:cs="Arial"/>
+          <w:sz w:val="24"/>
+          <w:szCs w:val="24"/>
+          <w:lang w:val="en-US"/>
+        </w:rPr>
+      </w:pPr>
+      <w:r>
+        <w:rPr>
+          <w:rFonts w:ascii="Arial" w:hAnsi="Arial" w:cs="Arial"/>
+          <w:sz w:val="24"/>
+          <w:szCs w:val="24"/>
+          <w:lang w:val="en-US"/>
+        </w:rPr>
+        <w:t xml:space="preserve">FR-04: </w:t>
+      </w:r>
+      <w:r>
+        <w:rPr>
+          <w:rFonts w:ascii="Arial" w:hAnsi="Arial" w:cs="Arial"/>
+          <w:sz w:val="24"/>
+          <w:szCs w:val="24"/>
+          <w:lang w:val="en-US"/>
+        </w:rPr>
+        <w:t>The program will allow the user to delete a course</w:t>
+      </w:r>
+      <w:r>
+        <w:rPr>
+          <w:rFonts w:ascii="Arial" w:hAnsi="Arial" w:cs="Arial"/>
+          <w:sz w:val="24"/>
+          <w:szCs w:val="24"/>
+          <w:lang w:val="en-US"/>
+        </w:rPr>
+        <w:t>.</w:t>
+      </w:r>
+    </w:p>
+    <w:p>
+      <w:pPr>
+        <w:spacing w:line="360" w:lineRule="auto"/>
+        <w:rPr>
+          <w:rFonts w:ascii="Arial" w:hAnsi="Arial" w:cs="Arial"/>
+          <w:sz w:val="24"/>
+          <w:szCs w:val="24"/>
+          <w:lang w:val="en-US"/>
+        </w:rPr>
+      </w:pPr>
+    </w:p>
+    <w:p>
+      <w:pPr>
+        <w:spacing w:line="360" w:lineRule="auto"/>
+        <w:rPr>
+          <w:rFonts w:ascii="Arial" w:hAnsi="Arial" w:cs="Arial"/>
+          <w:sz w:val="24"/>
+          <w:szCs w:val="24"/>
+          <w:lang w:val="en-US"/>
+        </w:rPr>
+      </w:pPr>
+      <w:r>
+        <w:rPr>
+          <w:rFonts w:ascii="Arial" w:hAnsi="Arial" w:cs="Arial"/>
+          <w:sz w:val="24"/>
+          <w:szCs w:val="24"/>
+          <w:lang w:val="en-US"/>
+        </w:rPr>
+        <w:lastRenderedPageBreak/>
+        <w:t>The course will be removed from the</w:t>
+      </w:r>
+      <w:r>
+        <w:rPr>
+          <w:rFonts w:ascii="Arial" w:hAnsi="Arial" w:cs="Arial"/>
+          <w:sz w:val="24"/>
+          <w:szCs w:val="24"/>
+          <w:lang w:val="en-US"/>
+        </w:rPr>
+        <w:t xml:space="preserve"> academic record</w:t>
+      </w:r>
+      <w:r>
+        <w:rPr>
+          <w:rFonts w:ascii="Arial" w:hAnsi="Arial" w:cs="Arial"/>
+          <w:sz w:val="24"/>
+          <w:szCs w:val="24"/>
+          <w:lang w:val="en-US"/>
+        </w:rPr>
+        <w:t xml:space="preserve"> after the user confirms</w:t>
+      </w:r>
+      <w:r>
+        <w:rPr>
+          <w:rFonts w:ascii="Arial" w:hAnsi="Arial" w:cs="Arial"/>
+          <w:sz w:val="24"/>
+          <w:szCs w:val="24"/>
+          <w:lang w:val="en-US"/>
+        </w:rPr>
+        <w:t xml:space="preserve"> the operation.</w:t>
+      </w:r>
+    </w:p>
+    <w:p>
+      <w:pPr>
+        <w:spacing w:line="360" w:lineRule="auto"/>
+        <w:rPr>
+          <w:rFonts w:ascii="Arial" w:hAnsi="Arial" w:cs="Arial"/>
+          <w:sz w:val="24"/>
+          <w:szCs w:val="24"/>
+          <w:lang w:val="en-US"/>
+        </w:rPr>
+      </w:pPr>
+    </w:p>
+    <w:p>
+      <w:pPr>
+        <w:spacing w:line="360" w:lineRule="auto"/>
+        <w:rPr>
+          <w:rFonts w:ascii="Arial" w:hAnsi="Arial" w:cs="Arial"/>
+          <w:sz w:val="24"/>
+          <w:szCs w:val="24"/>
+          <w:lang w:val="en-US"/>
+        </w:rPr>
+      </w:pPr>
+      <w:r>
+        <w:rPr>
+          <w:rFonts w:ascii="Arial" w:hAnsi="Arial" w:cs="Arial"/>
+          <w:sz w:val="24"/>
+          <w:szCs w:val="24"/>
+          <w:lang w:val="en-US"/>
+        </w:rPr>
+        <w:t xml:space="preserve">FR-05 – Manage </w:t>
+      </w:r>
+      <w:r>
+        <w:rPr>
+          <w:rFonts w:ascii="Arial" w:hAnsi="Arial" w:cs="Arial"/>
+          <w:sz w:val="24"/>
+          <w:szCs w:val="24"/>
+          <w:lang w:val="en-US"/>
+        </w:rPr>
+        <w:t>s</w:t>
+      </w:r>
+      <w:r>
+        <w:rPr>
+          <w:rFonts w:ascii="Arial" w:hAnsi="Arial" w:cs="Arial"/>
+          <w:sz w:val="24"/>
+          <w:szCs w:val="24"/>
+          <w:lang w:val="en-US"/>
+        </w:rPr>
+        <w:t>emesters</w:t>
+      </w:r>
+    </w:p>
+    <w:p>
+      <w:pPr>
+        <w:spacing w:line="360" w:lineRule="auto"/>
+        <w:rPr>
+          <w:rFonts w:ascii="Arial" w:hAnsi="Arial" w:cs="Arial"/>
+          <w:sz w:val="24"/>
+          <w:szCs w:val="24"/>
+          <w:lang w:val="en-US"/>
+        </w:rPr>
+      </w:pPr>
+    </w:p>
+    <w:p>
+      <w:pPr>
+        <w:spacing w:line="360" w:lineRule="auto"/>
+        <w:rPr>
+          <w:rFonts w:ascii="Arial" w:hAnsi="Arial" w:cs="Arial"/>
+          <w:sz w:val="24"/>
+          <w:szCs w:val="24"/>
+          <w:lang w:val="en-US"/>
+        </w:rPr>
+      </w:pPr>
+      <w:r>
+        <w:rPr>
+          <w:rFonts w:ascii="Arial" w:hAnsi="Arial" w:cs="Arial"/>
+          <w:sz w:val="24"/>
+          <w:szCs w:val="24"/>
+          <w:lang w:val="en-US"/>
+        </w:rPr>
+        <w:t xml:space="preserve">FR-05: </w:t>
+      </w:r>
+      <w:r>
+        <w:rPr>
+          <w:rFonts w:ascii="Arial" w:hAnsi="Arial" w:cs="Arial"/>
+          <w:sz w:val="24"/>
+          <w:szCs w:val="24"/>
+          <w:lang w:val="en-US"/>
+        </w:rPr>
+        <w:t xml:space="preserve">The program shall </w:t>
+      </w:r>
+      <w:r>
+        <w:rPr>
+          <w:rFonts w:ascii="Arial" w:hAnsi="Arial" w:cs="Arial"/>
+          <w:sz w:val="24"/>
+          <w:szCs w:val="24"/>
+          <w:lang w:val="en-US"/>
+        </w:rPr>
+        <w:t>allow courses</w:t>
+      </w:r>
+      <w:r>
+        <w:rPr>
+          <w:rFonts w:ascii="Arial" w:hAnsi="Arial" w:cs="Arial"/>
+          <w:sz w:val="24"/>
+          <w:szCs w:val="24"/>
+          <w:lang w:val="en-US"/>
+        </w:rPr>
+        <w:t xml:space="preserve"> to be</w:t>
+      </w:r>
+      <w:r>
+        <w:rPr>
+          <w:rFonts w:ascii="Arial" w:hAnsi="Arial" w:cs="Arial"/>
+          <w:sz w:val="24"/>
+          <w:szCs w:val="24"/>
+          <w:lang w:val="en-US"/>
+        </w:rPr>
+        <w:t xml:space="preserve"> organized into academic semesters</w:t>
+      </w:r>
+      <w:r>
+        <w:rPr>
+          <w:rFonts w:ascii="Arial" w:hAnsi="Arial" w:cs="Arial"/>
+          <w:sz w:val="24"/>
+          <w:szCs w:val="24"/>
+          <w:lang w:val="en-US"/>
+        </w:rPr>
+        <w:t>.</w:t>
+      </w:r>
+    </w:p>
+    <w:p>
+      <w:pPr>
+        <w:spacing w:line="360" w:lineRule="auto"/>
+        <w:rPr>
+          <w:rFonts w:ascii="Arial" w:hAnsi="Arial" w:cs="Arial"/>
+          <w:sz w:val="24"/>
+          <w:szCs w:val="24"/>
+          <w:lang w:val="en-US"/>
+        </w:rPr>
+      </w:pPr>
+    </w:p>
+    <w:p>
+      <w:pPr>
+        <w:spacing w:line="360" w:lineRule="auto"/>
+        <w:rPr>
+          <w:rFonts w:ascii="Arial" w:hAnsi="Arial" w:cs="Arial"/>
+          <w:sz w:val="24"/>
+          <w:szCs w:val="24"/>
+          <w:lang w:val="en-US"/>
+        </w:rPr>
+      </w:pPr>
+      <w:r>
+        <w:rPr>
+          <w:rFonts w:ascii="Arial" w:hAnsi="Arial" w:cs="Arial"/>
+          <w:sz w:val="24"/>
+          <w:szCs w:val="24"/>
+          <w:lang w:val="en-US"/>
+        </w:rPr>
+        <w:t>The user will be able to</w:t>
+      </w:r>
+      <w:r>
+        <w:rPr>
+          <w:rFonts w:ascii="Arial" w:hAnsi="Arial" w:cs="Arial"/>
+          <w:sz w:val="24"/>
+          <w:szCs w:val="24"/>
+          <w:lang w:val="en-US"/>
+        </w:rPr>
+        <w:t xml:space="preserve"> create semesters</w:t>
+      </w:r>
+      <w:r>
+        <w:rPr>
+          <w:rFonts w:ascii="Arial" w:hAnsi="Arial" w:cs="Arial"/>
+          <w:sz w:val="24"/>
+          <w:szCs w:val="24"/>
+          <w:lang w:val="en-US"/>
+        </w:rPr>
+        <w:t xml:space="preserve"> and </w:t>
+      </w:r>
+      <w:r>
+        <w:rPr>
+          <w:rFonts w:ascii="Arial" w:hAnsi="Arial" w:cs="Arial"/>
+          <w:sz w:val="24"/>
+          <w:szCs w:val="24"/>
+          <w:lang w:val="en-US"/>
+        </w:rPr>
+        <w:t>associate individual</w:t>
+      </w:r>
+      <w:r>
+        <w:rPr>
+          <w:rFonts w:ascii="Arial" w:hAnsi="Arial" w:cs="Arial"/>
+          <w:sz w:val="24"/>
+          <w:szCs w:val="24"/>
+          <w:lang w:val="en-US"/>
+        </w:rPr>
+        <w:t xml:space="preserve"> courses with them</w:t>
+      </w:r>
+      <w:r>
+        <w:rPr>
+          <w:rFonts w:ascii="Arial" w:hAnsi="Arial" w:cs="Arial"/>
+          <w:sz w:val="24"/>
+          <w:szCs w:val="24"/>
+          <w:lang w:val="en-US"/>
+        </w:rPr>
+        <w:t>.</w:t>
+      </w:r>
+      <w:r>
+        <w:rPr>
+          <w:rFonts w:ascii="Arial" w:hAnsi="Arial" w:cs="Arial"/>
+          <w:sz w:val="24"/>
+          <w:szCs w:val="24"/>
+          <w:lang w:val="en-US"/>
+        </w:rPr>
+        <w:t xml:space="preserve"> The program will display the courses belonging to each semester.</w:t>
+      </w:r>
+    </w:p>
+    <w:p>
+      <w:pPr>
+        <w:spacing w:line="360" w:lineRule="auto"/>
+        <w:rPr>
+          <w:rFonts w:ascii="Arial" w:hAnsi="Arial" w:cs="Arial"/>
+          <w:sz w:val="24"/>
+          <w:szCs w:val="24"/>
+          <w:lang w:val="en-US"/>
+        </w:rPr>
+      </w:pPr>
+    </w:p>
+    <w:p>
+      <w:pPr>
+        <w:spacing w:line="360" w:lineRule="auto"/>
+        <w:rPr>
+          <w:rFonts w:ascii="Arial" w:hAnsi="Arial" w:cs="Arial"/>
+          <w:sz w:val="24"/>
+          <w:szCs w:val="24"/>
+          <w:lang w:val="en-US"/>
+        </w:rPr>
+      </w:pPr>
+      <w:r>
+        <w:rPr>
+          <w:rFonts w:ascii="Arial" w:hAnsi="Arial" w:cs="Arial"/>
+          <w:sz w:val="24"/>
+          <w:szCs w:val="24"/>
+          <w:lang w:val="en-US"/>
+        </w:rPr>
+        <w:t xml:space="preserve">FR-06 – </w:t>
+      </w:r>
+      <w:r>
+        <w:rPr>
+          <w:rFonts w:ascii="Arial" w:hAnsi="Arial" w:cs="Arial"/>
+          <w:sz w:val="24"/>
+          <w:szCs w:val="24"/>
+          <w:lang w:val="en-US"/>
+        </w:rPr>
+        <w:t>Calculate semester GPA</w:t>
+      </w:r>
+    </w:p>
+    <w:p>
+      <w:pPr>
+        <w:spacing w:line="360" w:lineRule="auto"/>
+        <w:rPr>
+          <w:rFonts w:ascii="Arial" w:hAnsi="Arial" w:cs="Arial"/>
+          <w:sz w:val="24"/>
+          <w:szCs w:val="24"/>
+          <w:lang w:val="en-US"/>
+        </w:rPr>
+      </w:pPr>
+    </w:p>
+    <w:p>
+      <w:pPr>
+        <w:spacing w:line="360" w:lineRule="auto"/>
+        <w:rPr>
+          <w:rFonts w:ascii="Arial" w:hAnsi="Arial" w:cs="Arial"/>
+          <w:sz w:val="24"/>
+          <w:szCs w:val="24"/>
+          <w:lang w:val="en-US"/>
+        </w:rPr>
+      </w:pPr>
+      <w:r>
+        <w:rPr>
+          <w:rFonts w:ascii="Arial" w:hAnsi="Arial" w:cs="Arial"/>
+          <w:sz w:val="24"/>
+          <w:szCs w:val="24"/>
+          <w:lang w:val="en-US"/>
+        </w:rPr>
+        <w:t xml:space="preserve">FR-06: </w:t>
+      </w:r>
+      <w:r>
+        <w:rPr>
+          <w:rFonts w:ascii="Arial" w:hAnsi="Arial" w:cs="Arial"/>
+          <w:sz w:val="24"/>
+          <w:szCs w:val="24"/>
+          <w:lang w:val="en-US"/>
+        </w:rPr>
+        <w:t>The program will automatically</w:t>
+      </w:r>
+      <w:r>
+        <w:rPr>
+          <w:rFonts w:ascii="Arial" w:hAnsi="Arial" w:cs="Arial"/>
+          <w:sz w:val="24"/>
+          <w:szCs w:val="24"/>
+          <w:lang w:val="en-US"/>
+        </w:rPr>
+        <w:t xml:space="preserve"> calculate the GPA</w:t>
+      </w:r>
+      <w:r>
+        <w:rPr>
+          <w:rFonts w:ascii="Arial" w:hAnsi="Arial" w:cs="Arial"/>
+          <w:sz w:val="24"/>
+          <w:szCs w:val="24"/>
+          <w:lang w:val="en-US"/>
+        </w:rPr>
+        <w:t xml:space="preserve"> for an individual semester.</w:t>
+      </w:r>
+    </w:p>
+    <w:p>
+      <w:pPr>
+        <w:spacing w:line="360" w:lineRule="auto"/>
+        <w:rPr>
+          <w:rFonts w:ascii="Arial" w:hAnsi="Arial" w:cs="Arial"/>
+          <w:sz w:val="24"/>
+          <w:szCs w:val="24"/>
+          <w:lang w:val="en-US"/>
+        </w:rPr>
+      </w:pPr>
+    </w:p>
+    <w:p>
+      <w:pPr>
+        <w:spacing w:line="360" w:lineRule="auto"/>
+        <w:rPr>
+          <w:rFonts w:ascii="Arial" w:hAnsi="Arial" w:cs="Arial"/>
+          <w:sz w:val="24"/>
+          <w:szCs w:val="24"/>
+          <w:lang w:val="en-US"/>
+        </w:rPr>
+      </w:pPr>
+      <w:r>
+        <w:rPr>
+          <w:rFonts w:ascii="Arial" w:hAnsi="Arial" w:cs="Arial"/>
+          <w:sz w:val="24"/>
+          <w:szCs w:val="24"/>
+          <w:lang w:val="en-US"/>
+        </w:rPr>
+        <w:t>The calculation shall use the grade-point value</w:t>
+      </w:r>
+      <w:r>
+        <w:rPr>
+          <w:rFonts w:ascii="Arial" w:hAnsi="Arial" w:cs="Arial"/>
+          <w:sz w:val="24"/>
+          <w:szCs w:val="24"/>
+          <w:lang w:val="en-US"/>
+        </w:rPr>
+        <w:t xml:space="preserve"> and credit value</w:t>
+      </w:r>
+      <w:r>
+        <w:rPr>
+          <w:rFonts w:ascii="Arial" w:hAnsi="Arial" w:cs="Arial"/>
+          <w:sz w:val="24"/>
+          <w:szCs w:val="24"/>
+          <w:lang w:val="en-US"/>
+        </w:rPr>
+        <w:t xml:space="preserve"> of each course</w:t>
+      </w:r>
+      <w:r>
+        <w:rPr>
+          <w:rFonts w:ascii="Arial" w:hAnsi="Arial" w:cs="Arial"/>
+          <w:sz w:val="24"/>
+          <w:szCs w:val="24"/>
+          <w:lang w:val="en-US"/>
+        </w:rPr>
+        <w:t xml:space="preserve"> assigned to the semester</w:t>
+      </w:r>
+      <w:r>
+        <w:rPr>
+          <w:rFonts w:ascii="Arial" w:hAnsi="Arial" w:cs="Arial"/>
+          <w:sz w:val="24"/>
+          <w:szCs w:val="24"/>
+          <w:lang w:val="en-US"/>
+        </w:rPr>
+        <w:t>.</w:t>
+      </w:r>
+    </w:p>
+    <w:p>
+      <w:pPr>
+        <w:spacing w:line="360" w:lineRule="auto"/>
+        <w:rPr>
+          <w:rFonts w:ascii="Arial" w:hAnsi="Arial" w:cs="Arial"/>
+          <w:sz w:val="24"/>
+          <w:szCs w:val="24"/>
+          <w:lang w:val="en-US"/>
+        </w:rPr>
+      </w:pPr>
+    </w:p>
+    <w:p>
+      <w:pPr>
+        <w:spacing w:line="360" w:lineRule="auto"/>
+        <w:rPr>
+          <w:rFonts w:ascii="Arial" w:hAnsi="Arial" w:cs="Arial"/>
+          <w:sz w:val="24"/>
+          <w:szCs w:val="24"/>
+          <w:lang w:val="en-US"/>
+        </w:rPr>
+      </w:pPr>
+      <w:r>
+        <w:rPr>
+          <w:rFonts w:ascii="Arial" w:hAnsi="Arial" w:cs="Arial"/>
+          <w:sz w:val="24"/>
+          <w:szCs w:val="24"/>
+          <w:lang w:val="en-US"/>
+        </w:rPr>
+        <w:t>FR-07 – Calculate cumulative GPA</w:t>
+      </w:r>
+    </w:p>
+    <w:p>
+      <w:pPr>
+        <w:spacing w:line="360" w:lineRule="auto"/>
+        <w:rPr>
+          <w:rFonts w:ascii="Arial" w:hAnsi="Arial" w:cs="Arial"/>
+          <w:sz w:val="24"/>
+          <w:szCs w:val="24"/>
+          <w:lang w:val="en-US"/>
+        </w:rPr>
+      </w:pPr>
+    </w:p>
+    <w:p>
+      <w:pPr>
+        <w:spacing w:line="360" w:lineRule="auto"/>
+        <w:rPr>
+          <w:rFonts w:ascii="Arial" w:hAnsi="Arial" w:cs="Arial"/>
+          <w:sz w:val="24"/>
+          <w:szCs w:val="24"/>
+          <w:lang w:val="en-US"/>
+        </w:rPr>
+      </w:pPr>
+      <w:r>
+        <w:rPr>
+          <w:rFonts w:ascii="Arial" w:hAnsi="Arial" w:cs="Arial"/>
+          <w:sz w:val="24"/>
+          <w:szCs w:val="24"/>
+          <w:lang w:val="en-US"/>
+        </w:rPr>
+        <w:t xml:space="preserve">FR-07: </w:t>
+      </w:r>
+      <w:r>
+        <w:rPr>
+          <w:rFonts w:ascii="Arial" w:hAnsi="Arial" w:cs="Arial"/>
+          <w:sz w:val="24"/>
+          <w:szCs w:val="24"/>
+          <w:lang w:val="en-US"/>
+        </w:rPr>
+        <w:t>The system will calculate</w:t>
+      </w:r>
+      <w:r>
+        <w:rPr>
+          <w:rFonts w:ascii="Arial" w:hAnsi="Arial" w:cs="Arial"/>
+          <w:sz w:val="24"/>
+          <w:szCs w:val="24"/>
+          <w:lang w:val="en-US"/>
+        </w:rPr>
+        <w:t xml:space="preserve"> the cumulative GPA</w:t>
+      </w:r>
+      <w:r>
+        <w:rPr>
+          <w:rFonts w:ascii="Arial" w:hAnsi="Arial" w:cs="Arial"/>
+          <w:sz w:val="24"/>
+          <w:szCs w:val="24"/>
+          <w:lang w:val="en-US"/>
+        </w:rPr>
+        <w:t xml:space="preserve"> based on</w:t>
+      </w:r>
+      <w:r>
+        <w:rPr>
+          <w:rFonts w:ascii="Arial" w:hAnsi="Arial" w:cs="Arial"/>
+          <w:sz w:val="24"/>
+          <w:szCs w:val="24"/>
+          <w:lang w:val="en-US"/>
+        </w:rPr>
+        <w:t xml:space="preserve"> all GPA-applicable</w:t>
+      </w:r>
+      <w:r>
+        <w:rPr>
+          <w:rFonts w:ascii="Arial" w:hAnsi="Arial" w:cs="Arial"/>
+          <w:sz w:val="24"/>
+          <w:szCs w:val="24"/>
+          <w:lang w:val="en-US"/>
+        </w:rPr>
+        <w:t xml:space="preserve"> courses stored in the system</w:t>
+      </w:r>
+      <w:r>
+        <w:rPr>
+          <w:rFonts w:ascii="Arial" w:hAnsi="Arial" w:cs="Arial"/>
+          <w:sz w:val="24"/>
+          <w:szCs w:val="24"/>
+          <w:lang w:val="en-US"/>
+        </w:rPr>
+        <w:t>.</w:t>
+      </w:r>
+    </w:p>
+    <w:p>
+      <w:pPr>
+        <w:spacing w:line="360" w:lineRule="auto"/>
+        <w:rPr>
+          <w:rFonts w:ascii="Arial" w:hAnsi="Arial" w:cs="Arial"/>
+          <w:sz w:val="24"/>
+          <w:szCs w:val="24"/>
+          <w:lang w:val="en-US"/>
+        </w:rPr>
+      </w:pPr>
+    </w:p>
+    <w:p>
+      <w:pPr>
+        <w:spacing w:line="360" w:lineRule="auto"/>
+        <w:rPr>
+          <w:rFonts w:ascii="Arial" w:hAnsi="Arial" w:cs="Arial"/>
+          <w:sz w:val="24"/>
+          <w:szCs w:val="24"/>
+          <w:lang w:val="en-US"/>
+        </w:rPr>
+      </w:pPr>
+      <w:r>
+        <w:rPr>
+          <w:rFonts w:ascii="Arial" w:hAnsi="Arial" w:cs="Arial"/>
+          <w:sz w:val="24"/>
+          <w:szCs w:val="24"/>
+          <w:lang w:val="en-US"/>
+        </w:rPr>
+        <w:t>The cumulative GPA will be calculated by the formula of</w:t>
+      </w:r>
+      <w:r>
+        <w:rPr>
+          <w:rFonts w:ascii="Arial" w:hAnsi="Arial" w:cs="Arial"/>
+          <w:sz w:val="24"/>
+          <w:szCs w:val="24"/>
+          <w:lang w:val="en-US"/>
+        </w:rPr>
+        <w:t xml:space="preserve"> the sum of</w:t>
+      </w:r>
+      <w:r>
+        <w:rPr>
+          <w:rFonts w:ascii="Arial" w:hAnsi="Arial" w:cs="Arial"/>
+          <w:sz w:val="24"/>
+          <w:szCs w:val="24"/>
+          <w:lang w:val="en-US"/>
+        </w:rPr>
+        <w:t xml:space="preserve"> the grade points of each course multiplied by their course credits</w:t>
+      </w:r>
+      <w:r>
+        <w:rPr>
+          <w:rFonts w:ascii="Arial" w:hAnsi="Arial" w:cs="Arial"/>
+          <w:sz w:val="24"/>
+          <w:szCs w:val="24"/>
+          <w:lang w:val="en-US"/>
+        </w:rPr>
+        <w:t>, and that sum divided by the</w:t>
+      </w:r>
+      <w:r>
+        <w:rPr>
+          <w:rFonts w:ascii="Arial" w:hAnsi="Arial" w:cs="Arial"/>
+          <w:sz w:val="24"/>
+          <w:szCs w:val="24"/>
+          <w:lang w:val="en-US"/>
+        </w:rPr>
+        <w:t xml:space="preserve"> total attempted GPA credits.</w:t>
+      </w:r>
+    </w:p>
+    <w:p>
+      <w:pPr>
+        <w:spacing w:line="360" w:lineRule="auto"/>
+        <w:rPr>
+          <w:rFonts w:ascii="Arial" w:hAnsi="Arial" w:cs="Arial"/>
+          <w:sz w:val="24"/>
+          <w:szCs w:val="24"/>
+          <w:lang w:val="en-US"/>
+        </w:rPr>
+      </w:pPr>
+    </w:p>
+    <w:p>
+      <w:pPr>
+        <w:spacing w:line="360" w:lineRule="auto"/>
+        <w:rPr>
+          <w:rFonts w:ascii="Arial" w:hAnsi="Arial" w:cs="Arial"/>
+          <w:sz w:val="24"/>
+          <w:szCs w:val="24"/>
+          <w:lang w:val="en-US"/>
+        </w:rPr>
+      </w:pPr>
+      <w:r>
+        <w:rPr>
+          <w:rFonts w:ascii="Arial" w:hAnsi="Arial" w:cs="Arial"/>
+          <w:sz w:val="24"/>
+          <w:szCs w:val="24"/>
+          <w:lang w:val="en-US"/>
+        </w:rPr>
+        <w:lastRenderedPageBreak/>
+        <w:t xml:space="preserve">FR-08 – </w:t>
+      </w:r>
+      <w:r>
+        <w:rPr>
+          <w:rFonts w:ascii="Arial" w:hAnsi="Arial" w:cs="Arial"/>
+          <w:sz w:val="24"/>
+          <w:szCs w:val="24"/>
+          <w:lang w:val="en-US"/>
+        </w:rPr>
+        <w:t>Calculate earned and attempted credits</w:t>
+      </w:r>
+    </w:p>
     <w:sectPr>
-      <w:footerReference w:type="default" r:id="rId6"/>
+      <w:footerReference w:type="default" r:id="rId7"/>
       <w:pgSz w:w="11906" w:h="16838" w:code="9"/>
       <w:pgMar w:top="1417" w:right="1417" w:bottom="1417" w:left="1417" w:header="708" w:footer="708" w:gutter="0"/>
       <w:cols w:space="708"/>
@@ -1807,6 +3702,135 @@
     </w:p>
   </w:footnote>
 </w:footnotes>
+</file>
+
+<file path=word/numbering.xml><?xml version="1.0" encoding="utf-8"?>
+<w:numbering xmlns:wpc="http://schemas.microsoft.com/office/word/2010/wordprocessingCanvas" xmlns:cx="http://schemas.microsoft.com/office/drawing/2014/chartex" xmlns:cx1="http://schemas.microsoft.com/office/drawing/2015/9/8/chartex" xmlns:cx2="http://schemas.microsoft.com/office/drawing/2015/10/21/chartex" xmlns:cx3="http://schemas.microsoft.com/office/drawing/2016/5/9/chartex" xmlns:cx4="http://schemas.microsoft.com/office/drawing/2016/5/10/chartex" xmlns:cx5="http://schemas.microsoft.com/office/drawing/2016/5/11/chartex" xmlns:cx6="http://schemas.microsoft.com/office/drawing/2016/5/12/chartex" xmlns:cx7="http://schemas.microsoft.com/office/drawing/2016/5/13/chartex" xmlns:cx8="http://schemas.microsoft.com/office/drawing/2016/5/14/chartex" xmlns:mc="http://schemas.openxmlformats.org/markup-compatibility/2006" xmlns:aink="http://schemas.microsoft.com/office/drawing/2016/ink" xmlns:am3d="http://schemas.microsoft.com/office/drawing/2017/model3d" xmlns:o="urn:schemas-microsoft-com:office:office" xmlns:oel="http://schemas.microsoft.com/office/2019/extlst" xmlns:r="http://schemas.openxmlformats.org/officeDocument/2006/relationships" xmlns:m="http://schemas.openxmlformats.org/officeDocument/2006/math" xmlns:v="urn:schemas-microsoft-com:vml" xmlns:wp14="http://schemas.microsoft.com/office/word/2010/wordprocessingDrawing" xmlns:wp="http://schemas.openxmlformats.org/drawingml/2006/wordprocessingDrawing" xmlns:w10="urn:schemas-microsoft-com:office:word" xmlns:w="http://schemas.openxmlformats.org/wordprocessingml/2006/main" xmlns:w14="http://schemas.microsoft.com/office/word/2010/wordml" xmlns:w15="http://schemas.microsoft.com/office/word/2012/wordml" xmlns:w16cex="http://schemas.microsoft.com/office/word/2018/wordml/cex" xmlns:w16cid="http://schemas.microsoft.com/office/word/2016/wordml/cid" xmlns:w16="http://schemas.microsoft.com/office/word/2018/wordml" xmlns:w16du="http://schemas.microsoft.com/office/word/2023/wordml/word16du" xmlns:w16sdtdh="http://schemas.microsoft.com/office/word/2020/wordml/sdtdatahash" xmlns:w16sdtfl="http://schemas.microsoft.com/office/word/2024/wordml/sdtformatlock" xmlns:w16se="http://schemas.microsoft.com/office/word/2015/wordml/symex" xmlns:wpg="http://schemas.microsoft.com/office/word/2010/wordprocessingGroup" xmlns:wpi="http://schemas.microsoft.com/office/word/2010/wordprocessingInk" xmlns:wne="http://schemas.microsoft.com/office/word/2006/wordml" xmlns:wps="http://schemas.microsoft.com/office/word/2010/wordprocessingShape" mc:Ignorable="w14 w15 w16se w16cid w16 w16cex w16sdtdh w16sdtfl w16du wp14">
+  <w:abstractNum w:abstractNumId="0" w15:restartNumberingAfterBreak="0">
+    <w:nsid w:val="489C4C45"/>
+    <w:multiLevelType w:val="multilevel"/>
+    <w:tmpl w:val="ABD8F194"/>
+    <w:lvl w:ilvl="0">
+      <w:start w:val="1"/>
+      <w:numFmt w:val="decimal"/>
+      <w:lvlText w:val="%1."/>
+      <w:lvlJc w:val="left"/>
+      <w:pPr>
+        <w:ind w:left="720" w:hanging="360"/>
+      </w:pPr>
+      <w:rPr>
+        <w:rFonts w:hint="default"/>
+      </w:rPr>
+    </w:lvl>
+    <w:lvl w:ilvl="1">
+      <w:start w:val="1"/>
+      <w:numFmt w:val="decimal"/>
+      <w:isLgl/>
+      <w:lvlText w:val="%1.%2."/>
+      <w:lvlJc w:val="left"/>
+      <w:pPr>
+        <w:ind w:left="1080" w:hanging="720"/>
+      </w:pPr>
+      <w:rPr>
+        <w:rFonts w:hint="default"/>
+      </w:rPr>
+    </w:lvl>
+    <w:lvl w:ilvl="2">
+      <w:start w:val="1"/>
+      <w:numFmt w:val="decimal"/>
+      <w:isLgl/>
+      <w:lvlText w:val="%1.%2.%3."/>
+      <w:lvlJc w:val="left"/>
+      <w:pPr>
+        <w:ind w:left="1080" w:hanging="720"/>
+      </w:pPr>
+      <w:rPr>
+        <w:rFonts w:hint="default"/>
+      </w:rPr>
+    </w:lvl>
+    <w:lvl w:ilvl="3">
+      <w:start w:val="1"/>
+      <w:numFmt w:val="decimal"/>
+      <w:isLgl/>
+      <w:lvlText w:val="%1.%2.%3.%4."/>
+      <w:lvlJc w:val="left"/>
+      <w:pPr>
+        <w:ind w:left="1440" w:hanging="1080"/>
+      </w:pPr>
+      <w:rPr>
+        <w:rFonts w:hint="default"/>
+      </w:rPr>
+    </w:lvl>
+    <w:lvl w:ilvl="4">
+      <w:start w:val="1"/>
+      <w:numFmt w:val="decimal"/>
+      <w:isLgl/>
+      <w:lvlText w:val="%1.%2.%3.%4.%5."/>
+      <w:lvlJc w:val="left"/>
+      <w:pPr>
+        <w:ind w:left="1440" w:hanging="1080"/>
+      </w:pPr>
+      <w:rPr>
+        <w:rFonts w:hint="default"/>
+      </w:rPr>
+    </w:lvl>
+    <w:lvl w:ilvl="5">
+      <w:start w:val="1"/>
+      <w:numFmt w:val="decimal"/>
+      <w:isLgl/>
+      <w:lvlText w:val="%1.%2.%3.%4.%5.%6."/>
+      <w:lvlJc w:val="left"/>
+      <w:pPr>
+        <w:ind w:left="1800" w:hanging="1440"/>
+      </w:pPr>
+      <w:rPr>
+        <w:rFonts w:hint="default"/>
+      </w:rPr>
+    </w:lvl>
+    <w:lvl w:ilvl="6">
+      <w:start w:val="1"/>
+      <w:numFmt w:val="decimal"/>
+      <w:isLgl/>
+      <w:lvlText w:val="%1.%2.%3.%4.%5.%6.%7."/>
+      <w:lvlJc w:val="left"/>
+      <w:pPr>
+        <w:ind w:left="1800" w:hanging="1440"/>
+      </w:pPr>
+      <w:rPr>
+        <w:rFonts w:hint="default"/>
+      </w:rPr>
+    </w:lvl>
+    <w:lvl w:ilvl="7">
+      <w:start w:val="1"/>
+      <w:numFmt w:val="decimal"/>
+      <w:isLgl/>
+      <w:lvlText w:val="%1.%2.%3.%4.%5.%6.%7.%8."/>
+      <w:lvlJc w:val="left"/>
+      <w:pPr>
+        <w:ind w:left="2160" w:hanging="1800"/>
+      </w:pPr>
+      <w:rPr>
+        <w:rFonts w:hint="default"/>
+      </w:rPr>
+    </w:lvl>
+    <w:lvl w:ilvl="8">
+      <w:start w:val="1"/>
+      <w:numFmt w:val="decimal"/>
+      <w:isLgl/>
+      <w:lvlText w:val="%1.%2.%3.%4.%5.%6.%7.%8.%9."/>
+      <w:lvlJc w:val="left"/>
+      <w:pPr>
+        <w:ind w:left="2520" w:hanging="2160"/>
+      </w:pPr>
+      <w:rPr>
+        <w:rFonts w:hint="default"/>
+      </w:rPr>
+    </w:lvl>
+  </w:abstractNum>
+  <w:num w:numId="1" w16cid:durableId="1229809032">
+    <w:abstractNumId w:val="0"/>
+  </w:num>
+</w:numbering>
 </file>
 
 <file path=word/styles.xml><?xml version="1.0" encoding="utf-8"?>

</xml_diff>

<commit_message>
Working further on my thesis.
</commit_message>
<xml_diff>
--- a/Project Thesis.docx
+++ b/Project Thesis.docx
@@ -3588,6 +3588,1020 @@
           <w:lang w:val="en-US"/>
         </w:rPr>
         <w:t>Calculate earned and attempted credits</w:t>
+      </w:r>
+    </w:p>
+    <w:p>
+      <w:pPr>
+        <w:spacing w:line="360" w:lineRule="auto"/>
+        <w:rPr>
+          <w:rFonts w:ascii="Arial" w:hAnsi="Arial" w:cs="Arial"/>
+          <w:sz w:val="24"/>
+          <w:szCs w:val="24"/>
+          <w:lang w:val="en-US"/>
+        </w:rPr>
+      </w:pPr>
+    </w:p>
+    <w:p>
+      <w:pPr>
+        <w:spacing w:line="360" w:lineRule="auto"/>
+        <w:rPr>
+          <w:rFonts w:ascii="Arial" w:hAnsi="Arial" w:cs="Arial"/>
+          <w:sz w:val="24"/>
+          <w:szCs w:val="24"/>
+          <w:lang w:val="en-US"/>
+        </w:rPr>
+      </w:pPr>
+      <w:r>
+        <w:rPr>
+          <w:rFonts w:ascii="Arial" w:hAnsi="Arial" w:cs="Arial"/>
+          <w:sz w:val="24"/>
+          <w:szCs w:val="24"/>
+          <w:lang w:val="en-US"/>
+        </w:rPr>
+        <w:t xml:space="preserve">FR-08: </w:t>
+      </w:r>
+      <w:r>
+        <w:rPr>
+          <w:rFonts w:ascii="Arial" w:hAnsi="Arial" w:cs="Arial"/>
+          <w:sz w:val="24"/>
+          <w:szCs w:val="24"/>
+          <w:lang w:val="en-US"/>
+        </w:rPr>
+        <w:t xml:space="preserve">The program will separately </w:t>
+      </w:r>
+      <w:r>
+        <w:rPr>
+          <w:rFonts w:ascii="Arial" w:hAnsi="Arial" w:cs="Arial"/>
+          <w:sz w:val="24"/>
+          <w:szCs w:val="24"/>
+          <w:lang w:val="en-US"/>
+        </w:rPr>
+        <w:t>calculate attempted credits</w:t>
+      </w:r>
+      <w:r>
+        <w:rPr>
+          <w:rFonts w:ascii="Arial" w:hAnsi="Arial" w:cs="Arial"/>
+          <w:sz w:val="24"/>
+          <w:szCs w:val="24"/>
+          <w:lang w:val="en-US"/>
+        </w:rPr>
+        <w:t xml:space="preserve"> and successfully earned credits.</w:t>
+      </w:r>
+    </w:p>
+    <w:p>
+      <w:pPr>
+        <w:spacing w:line="360" w:lineRule="auto"/>
+        <w:rPr>
+          <w:rFonts w:ascii="Arial" w:hAnsi="Arial" w:cs="Arial"/>
+          <w:sz w:val="24"/>
+          <w:szCs w:val="24"/>
+          <w:lang w:val="en-US"/>
+        </w:rPr>
+      </w:pPr>
+    </w:p>
+    <w:p>
+      <w:pPr>
+        <w:spacing w:line="360" w:lineRule="auto"/>
+        <w:rPr>
+          <w:rFonts w:ascii="Arial" w:hAnsi="Arial" w:cs="Arial"/>
+          <w:sz w:val="24"/>
+          <w:szCs w:val="24"/>
+          <w:lang w:val="en-US"/>
+        </w:rPr>
+      </w:pPr>
+      <w:r>
+        <w:rPr>
+          <w:rFonts w:ascii="Arial" w:hAnsi="Arial" w:cs="Arial"/>
+          <w:sz w:val="24"/>
+          <w:szCs w:val="24"/>
+          <w:lang w:val="en-US"/>
+        </w:rPr>
+        <w:t>Credits associated with failed courses</w:t>
+      </w:r>
+      <w:r>
+        <w:rPr>
+          <w:rFonts w:ascii="Arial" w:hAnsi="Arial" w:cs="Arial"/>
+          <w:sz w:val="24"/>
+          <w:szCs w:val="24"/>
+          <w:lang w:val="en-US"/>
+        </w:rPr>
+        <w:t xml:space="preserve"> may contribute to attempted credits</w:t>
+      </w:r>
+      <w:r>
+        <w:rPr>
+          <w:rFonts w:ascii="Arial" w:hAnsi="Arial" w:cs="Arial"/>
+          <w:sz w:val="24"/>
+          <w:szCs w:val="24"/>
+          <w:lang w:val="en-US"/>
+        </w:rPr>
+        <w:t xml:space="preserve"> while not contributing to earned credits.</w:t>
+      </w:r>
+    </w:p>
+    <w:p>
+      <w:pPr>
+        <w:spacing w:line="360" w:lineRule="auto"/>
+        <w:rPr>
+          <w:rFonts w:ascii="Arial" w:hAnsi="Arial" w:cs="Arial"/>
+          <w:sz w:val="24"/>
+          <w:szCs w:val="24"/>
+          <w:lang w:val="en-US"/>
+        </w:rPr>
+      </w:pPr>
+    </w:p>
+    <w:p>
+      <w:pPr>
+        <w:spacing w:line="360" w:lineRule="auto"/>
+        <w:rPr>
+          <w:rFonts w:ascii="Arial" w:hAnsi="Arial" w:cs="Arial"/>
+          <w:sz w:val="24"/>
+          <w:szCs w:val="24"/>
+          <w:lang w:val="en-US"/>
+        </w:rPr>
+      </w:pPr>
+      <w:r>
+        <w:rPr>
+          <w:rFonts w:ascii="Arial" w:hAnsi="Arial" w:cs="Arial"/>
+          <w:sz w:val="24"/>
+          <w:szCs w:val="24"/>
+          <w:lang w:val="en-US"/>
+        </w:rPr>
+        <w:t>FR-09 – Dashboard</w:t>
+      </w:r>
+    </w:p>
+    <w:p>
+      <w:pPr>
+        <w:spacing w:line="360" w:lineRule="auto"/>
+        <w:rPr>
+          <w:rFonts w:ascii="Arial" w:hAnsi="Arial" w:cs="Arial"/>
+          <w:sz w:val="24"/>
+          <w:szCs w:val="24"/>
+          <w:lang w:val="en-US"/>
+        </w:rPr>
+      </w:pPr>
+    </w:p>
+    <w:p>
+      <w:pPr>
+        <w:spacing w:line="360" w:lineRule="auto"/>
+        <w:rPr>
+          <w:rFonts w:ascii="Arial" w:hAnsi="Arial" w:cs="Arial"/>
+          <w:sz w:val="24"/>
+          <w:szCs w:val="24"/>
+          <w:lang w:val="en-US"/>
+        </w:rPr>
+      </w:pPr>
+      <w:r>
+        <w:rPr>
+          <w:rFonts w:ascii="Arial" w:hAnsi="Arial" w:cs="Arial"/>
+          <w:sz w:val="24"/>
+          <w:szCs w:val="24"/>
+          <w:lang w:val="en-US"/>
+        </w:rPr>
+        <w:t xml:space="preserve">FR-09: </w:t>
+      </w:r>
+      <w:r>
+        <w:rPr>
+          <w:rFonts w:ascii="Arial" w:hAnsi="Arial" w:cs="Arial"/>
+          <w:sz w:val="24"/>
+          <w:szCs w:val="24"/>
+          <w:lang w:val="en-US"/>
+        </w:rPr>
+        <w:t xml:space="preserve">The </w:t>
+      </w:r>
+      <w:r>
+        <w:rPr>
+          <w:rFonts w:ascii="Arial" w:hAnsi="Arial" w:cs="Arial"/>
+          <w:sz w:val="24"/>
+          <w:szCs w:val="24"/>
+          <w:lang w:val="en-US"/>
+        </w:rPr>
+        <w:t>program</w:t>
+      </w:r>
+      <w:r>
+        <w:rPr>
+          <w:rFonts w:ascii="Arial" w:hAnsi="Arial" w:cs="Arial"/>
+          <w:sz w:val="24"/>
+          <w:szCs w:val="24"/>
+          <w:lang w:val="en-US"/>
+        </w:rPr>
+        <w:t xml:space="preserve"> </w:t>
+      </w:r>
+      <w:r>
+        <w:rPr>
+          <w:rFonts w:ascii="Arial" w:hAnsi="Arial" w:cs="Arial"/>
+          <w:sz w:val="24"/>
+          <w:szCs w:val="24"/>
+          <w:lang w:val="en-US"/>
+        </w:rPr>
+        <w:t>will</w:t>
+      </w:r>
+      <w:r>
+        <w:rPr>
+          <w:rFonts w:ascii="Arial" w:hAnsi="Arial" w:cs="Arial"/>
+          <w:sz w:val="24"/>
+          <w:szCs w:val="24"/>
+          <w:lang w:val="en-US"/>
+        </w:rPr>
+        <w:t xml:space="preserve"> provide a dashboard</w:t>
+      </w:r>
+      <w:r>
+        <w:rPr>
+          <w:rFonts w:ascii="Arial" w:hAnsi="Arial" w:cs="Arial"/>
+          <w:sz w:val="24"/>
+          <w:szCs w:val="24"/>
+          <w:lang w:val="en-US"/>
+        </w:rPr>
+        <w:t xml:space="preserve"> summarizing the user’s academic progress.</w:t>
+      </w:r>
+    </w:p>
+    <w:p>
+      <w:pPr>
+        <w:spacing w:line="360" w:lineRule="auto"/>
+        <w:rPr>
+          <w:rFonts w:ascii="Arial" w:hAnsi="Arial" w:cs="Arial"/>
+          <w:sz w:val="24"/>
+          <w:szCs w:val="24"/>
+          <w:lang w:val="en-US"/>
+        </w:rPr>
+      </w:pPr>
+    </w:p>
+    <w:p>
+      <w:pPr>
+        <w:spacing w:line="360" w:lineRule="auto"/>
+        <w:rPr>
+          <w:rFonts w:ascii="Arial" w:hAnsi="Arial" w:cs="Arial"/>
+          <w:sz w:val="24"/>
+          <w:szCs w:val="24"/>
+          <w:lang w:val="en-US"/>
+        </w:rPr>
+      </w:pPr>
+      <w:r>
+        <w:rPr>
+          <w:rFonts w:ascii="Arial" w:hAnsi="Arial" w:cs="Arial"/>
+          <w:sz w:val="24"/>
+          <w:szCs w:val="24"/>
+          <w:lang w:val="en-US"/>
+        </w:rPr>
+        <w:t>The dashboard will display</w:t>
+      </w:r>
+      <w:r>
+        <w:rPr>
+          <w:rFonts w:ascii="Arial" w:hAnsi="Arial" w:cs="Arial"/>
+          <w:sz w:val="24"/>
+          <w:szCs w:val="24"/>
+          <w:lang w:val="en-US"/>
+        </w:rPr>
+        <w:t xml:space="preserve"> cumulative GPA</w:t>
+      </w:r>
+      <w:r>
+        <w:rPr>
+          <w:rFonts w:ascii="Arial" w:hAnsi="Arial" w:cs="Arial"/>
+          <w:sz w:val="24"/>
+          <w:szCs w:val="24"/>
+          <w:lang w:val="en-US"/>
+        </w:rPr>
+        <w:t>, earned credits</w:t>
+      </w:r>
+      <w:r>
+        <w:rPr>
+          <w:rFonts w:ascii="Arial" w:hAnsi="Arial" w:cs="Arial"/>
+          <w:sz w:val="24"/>
+          <w:szCs w:val="24"/>
+          <w:lang w:val="en-US"/>
+        </w:rPr>
+        <w:t>, attempted credits</w:t>
+      </w:r>
+      <w:r>
+        <w:rPr>
+          <w:rFonts w:ascii="Arial" w:hAnsi="Arial" w:cs="Arial"/>
+          <w:sz w:val="24"/>
+          <w:szCs w:val="24"/>
+          <w:lang w:val="en-US"/>
+        </w:rPr>
+        <w:t>, and the number of completed courses.</w:t>
+      </w:r>
+    </w:p>
+    <w:p>
+      <w:pPr>
+        <w:spacing w:line="360" w:lineRule="auto"/>
+        <w:rPr>
+          <w:rFonts w:ascii="Arial" w:hAnsi="Arial" w:cs="Arial"/>
+          <w:sz w:val="24"/>
+          <w:szCs w:val="24"/>
+          <w:lang w:val="en-US"/>
+        </w:rPr>
+      </w:pPr>
+    </w:p>
+    <w:p>
+      <w:pPr>
+        <w:spacing w:line="360" w:lineRule="auto"/>
+        <w:rPr>
+          <w:rFonts w:ascii="Arial" w:hAnsi="Arial" w:cs="Arial"/>
+          <w:sz w:val="24"/>
+          <w:szCs w:val="24"/>
+          <w:lang w:val="en-US"/>
+        </w:rPr>
+      </w:pPr>
+      <w:r>
+        <w:rPr>
+          <w:rFonts w:ascii="Arial" w:hAnsi="Arial" w:cs="Arial"/>
+          <w:sz w:val="24"/>
+          <w:szCs w:val="24"/>
+          <w:lang w:val="en-US"/>
+        </w:rPr>
+        <w:t xml:space="preserve">FR-10 – </w:t>
+      </w:r>
+      <w:r>
+        <w:rPr>
+          <w:rFonts w:ascii="Arial" w:hAnsi="Arial" w:cs="Arial"/>
+          <w:sz w:val="24"/>
+          <w:szCs w:val="24"/>
+          <w:lang w:val="en-US"/>
+        </w:rPr>
+        <w:t>What-if GPA calculator</w:t>
+      </w:r>
+    </w:p>
+    <w:p>
+      <w:pPr>
+        <w:spacing w:line="360" w:lineRule="auto"/>
+        <w:rPr>
+          <w:rFonts w:ascii="Arial" w:hAnsi="Arial" w:cs="Arial"/>
+          <w:sz w:val="24"/>
+          <w:szCs w:val="24"/>
+          <w:lang w:val="en-US"/>
+        </w:rPr>
+      </w:pPr>
+    </w:p>
+    <w:p>
+      <w:pPr>
+        <w:spacing w:line="360" w:lineRule="auto"/>
+        <w:rPr>
+          <w:rFonts w:ascii="Arial" w:hAnsi="Arial" w:cs="Arial"/>
+          <w:sz w:val="24"/>
+          <w:szCs w:val="24"/>
+          <w:lang w:val="en-US"/>
+        </w:rPr>
+      </w:pPr>
+      <w:r>
+        <w:rPr>
+          <w:rFonts w:ascii="Arial" w:hAnsi="Arial" w:cs="Arial"/>
+          <w:sz w:val="24"/>
+          <w:szCs w:val="24"/>
+          <w:lang w:val="en-US"/>
+        </w:rPr>
+        <w:t xml:space="preserve">FR-10: </w:t>
+      </w:r>
+      <w:r>
+        <w:rPr>
+          <w:rFonts w:ascii="Arial" w:hAnsi="Arial" w:cs="Arial"/>
+          <w:sz w:val="24"/>
+          <w:szCs w:val="24"/>
+          <w:lang w:val="en-US"/>
+        </w:rPr>
+        <w:t>The program will allow the user</w:t>
+      </w:r>
+      <w:r>
+        <w:rPr>
+          <w:rFonts w:ascii="Arial" w:hAnsi="Arial" w:cs="Arial"/>
+          <w:sz w:val="24"/>
+          <w:szCs w:val="24"/>
+          <w:lang w:val="en-US"/>
+        </w:rPr>
+        <w:t xml:space="preserve"> to calculate a projected</w:t>
+      </w:r>
+      <w:r>
+        <w:rPr>
+          <w:rFonts w:ascii="Arial" w:hAnsi="Arial" w:cs="Arial"/>
+          <w:sz w:val="24"/>
+          <w:szCs w:val="24"/>
+          <w:lang w:val="en-US"/>
+        </w:rPr>
+        <w:t xml:space="preserve"> GPA</w:t>
+      </w:r>
+      <w:r>
+        <w:rPr>
+          <w:rFonts w:ascii="Arial" w:hAnsi="Arial" w:cs="Arial"/>
+          <w:sz w:val="24"/>
+          <w:szCs w:val="24"/>
+          <w:lang w:val="en-US"/>
+        </w:rPr>
+        <w:t xml:space="preserve"> using hypothetical future grades</w:t>
+      </w:r>
+      <w:r>
+        <w:rPr>
+          <w:rFonts w:ascii="Arial" w:hAnsi="Arial" w:cs="Arial"/>
+          <w:sz w:val="24"/>
+          <w:szCs w:val="24"/>
+          <w:lang w:val="en-US"/>
+        </w:rPr>
+        <w:t>.</w:t>
+      </w:r>
+    </w:p>
+    <w:p>
+      <w:pPr>
+        <w:spacing w:line="360" w:lineRule="auto"/>
+        <w:rPr>
+          <w:rFonts w:ascii="Arial" w:hAnsi="Arial" w:cs="Arial"/>
+          <w:sz w:val="24"/>
+          <w:szCs w:val="24"/>
+          <w:lang w:val="en-US"/>
+        </w:rPr>
+      </w:pPr>
+    </w:p>
+    <w:p>
+      <w:pPr>
+        <w:spacing w:line="360" w:lineRule="auto"/>
+        <w:rPr>
+          <w:rFonts w:ascii="Arial" w:hAnsi="Arial" w:cs="Arial"/>
+          <w:sz w:val="24"/>
+          <w:szCs w:val="24"/>
+          <w:lang w:val="en-US"/>
+        </w:rPr>
+      </w:pPr>
+      <w:r>
+        <w:rPr>
+          <w:rFonts w:ascii="Arial" w:hAnsi="Arial" w:cs="Arial"/>
+          <w:sz w:val="24"/>
+          <w:szCs w:val="24"/>
+          <w:lang w:val="en-US"/>
+        </w:rPr>
+        <w:t>Hypothetical courses used for this calculation</w:t>
+      </w:r>
+      <w:r>
+        <w:rPr>
+          <w:rFonts w:ascii="Arial" w:hAnsi="Arial" w:cs="Arial"/>
+          <w:sz w:val="24"/>
+          <w:szCs w:val="24"/>
+          <w:lang w:val="en-US"/>
+        </w:rPr>
+        <w:t xml:space="preserve"> will not be permanently added</w:t>
+      </w:r>
+      <w:r>
+        <w:rPr>
+          <w:rFonts w:ascii="Arial" w:hAnsi="Arial" w:cs="Arial"/>
+          <w:sz w:val="24"/>
+          <w:szCs w:val="24"/>
+          <w:lang w:val="en-US"/>
+        </w:rPr>
+        <w:t xml:space="preserve"> to the academic re</w:t>
+      </w:r>
+      <w:r>
+        <w:rPr>
+          <w:rFonts w:ascii="Arial" w:hAnsi="Arial" w:cs="Arial"/>
+          <w:sz w:val="24"/>
+          <w:szCs w:val="24"/>
+          <w:lang w:val="en-US"/>
+        </w:rPr>
+        <w:t>cord</w:t>
+      </w:r>
+      <w:r>
+        <w:rPr>
+          <w:rFonts w:ascii="Arial" w:hAnsi="Arial" w:cs="Arial"/>
+          <w:sz w:val="24"/>
+          <w:szCs w:val="24"/>
+          <w:lang w:val="en-US"/>
+        </w:rPr>
+        <w:t>.</w:t>
+      </w:r>
+    </w:p>
+    <w:p>
+      <w:pPr>
+        <w:spacing w:line="360" w:lineRule="auto"/>
+        <w:rPr>
+          <w:rFonts w:ascii="Arial" w:hAnsi="Arial" w:cs="Arial"/>
+          <w:sz w:val="24"/>
+          <w:szCs w:val="24"/>
+          <w:lang w:val="en-US"/>
+        </w:rPr>
+      </w:pPr>
+    </w:p>
+    <w:p>
+      <w:pPr>
+        <w:spacing w:line="360" w:lineRule="auto"/>
+        <w:rPr>
+          <w:rFonts w:ascii="Arial" w:hAnsi="Arial" w:cs="Arial"/>
+          <w:sz w:val="24"/>
+          <w:szCs w:val="24"/>
+          <w:lang w:val="en-US"/>
+        </w:rPr>
+      </w:pPr>
+      <w:r>
+        <w:rPr>
+          <w:rFonts w:ascii="Arial" w:hAnsi="Arial" w:cs="Arial"/>
+          <w:sz w:val="24"/>
+          <w:szCs w:val="24"/>
+          <w:lang w:val="en-US"/>
+        </w:rPr>
+        <w:t xml:space="preserve">FR-11 – </w:t>
+      </w:r>
+      <w:r>
+        <w:rPr>
+          <w:rFonts w:ascii="Arial" w:hAnsi="Arial" w:cs="Arial"/>
+          <w:sz w:val="24"/>
+          <w:szCs w:val="24"/>
+          <w:lang w:val="en-US"/>
+        </w:rPr>
+        <w:t>Degree progress</w:t>
+      </w:r>
+    </w:p>
+    <w:p>
+      <w:pPr>
+        <w:spacing w:line="360" w:lineRule="auto"/>
+        <w:rPr>
+          <w:rFonts w:ascii="Arial" w:hAnsi="Arial" w:cs="Arial"/>
+          <w:sz w:val="24"/>
+          <w:szCs w:val="24"/>
+          <w:lang w:val="en-US"/>
+        </w:rPr>
+      </w:pPr>
+    </w:p>
+    <w:p>
+      <w:pPr>
+        <w:spacing w:line="360" w:lineRule="auto"/>
+        <w:rPr>
+          <w:rFonts w:ascii="Arial" w:hAnsi="Arial" w:cs="Arial"/>
+          <w:sz w:val="24"/>
+          <w:szCs w:val="24"/>
+          <w:lang w:val="en-US"/>
+        </w:rPr>
+      </w:pPr>
+      <w:r>
+        <w:rPr>
+          <w:rFonts w:ascii="Arial" w:hAnsi="Arial" w:cs="Arial"/>
+          <w:sz w:val="24"/>
+          <w:szCs w:val="24"/>
+          <w:lang w:val="en-US"/>
+        </w:rPr>
+        <w:lastRenderedPageBreak/>
+        <w:t xml:space="preserve">FR-11: </w:t>
+      </w:r>
+      <w:r>
+        <w:rPr>
+          <w:rFonts w:ascii="Arial" w:hAnsi="Arial" w:cs="Arial"/>
+          <w:sz w:val="24"/>
+          <w:szCs w:val="24"/>
+          <w:lang w:val="en-US"/>
+        </w:rPr>
+        <w:t>The program will calculate the student’s progress</w:t>
+      </w:r>
+      <w:r>
+        <w:rPr>
+          <w:rFonts w:ascii="Arial" w:hAnsi="Arial" w:cs="Arial"/>
+          <w:sz w:val="24"/>
+          <w:szCs w:val="24"/>
+          <w:lang w:val="en-US"/>
+        </w:rPr>
+        <w:t xml:space="preserve"> toward the required number of</w:t>
+      </w:r>
+      <w:r>
+        <w:rPr>
+          <w:rFonts w:ascii="Arial" w:hAnsi="Arial" w:cs="Arial"/>
+          <w:sz w:val="24"/>
+          <w:szCs w:val="24"/>
+          <w:lang w:val="en-US"/>
+        </w:rPr>
+        <w:t xml:space="preserve"> graduation credits.</w:t>
+      </w:r>
+    </w:p>
+    <w:p>
+      <w:pPr>
+        <w:spacing w:line="360" w:lineRule="auto"/>
+        <w:rPr>
+          <w:rFonts w:ascii="Arial" w:hAnsi="Arial" w:cs="Arial"/>
+          <w:sz w:val="24"/>
+          <w:szCs w:val="24"/>
+          <w:lang w:val="en-US"/>
+        </w:rPr>
+      </w:pPr>
+    </w:p>
+    <w:p>
+      <w:pPr>
+        <w:spacing w:line="360" w:lineRule="auto"/>
+        <w:rPr>
+          <w:rFonts w:ascii="Arial" w:hAnsi="Arial" w:cs="Arial"/>
+          <w:sz w:val="24"/>
+          <w:szCs w:val="24"/>
+          <w:lang w:val="en-US"/>
+        </w:rPr>
+      </w:pPr>
+      <w:r>
+        <w:rPr>
+          <w:rFonts w:ascii="Arial" w:hAnsi="Arial" w:cs="Arial"/>
+          <w:sz w:val="24"/>
+          <w:szCs w:val="24"/>
+          <w:lang w:val="en-US"/>
+        </w:rPr>
+        <w:t>It will display</w:t>
+      </w:r>
+      <w:r>
+        <w:rPr>
+          <w:rFonts w:ascii="Arial" w:hAnsi="Arial" w:cs="Arial"/>
+          <w:sz w:val="24"/>
+          <w:szCs w:val="24"/>
+          <w:lang w:val="en-US"/>
+        </w:rPr>
+        <w:t xml:space="preserve"> completed credits</w:t>
+      </w:r>
+      <w:r>
+        <w:rPr>
+          <w:rFonts w:ascii="Arial" w:hAnsi="Arial" w:cs="Arial"/>
+          <w:sz w:val="24"/>
+          <w:szCs w:val="24"/>
+          <w:lang w:val="en-US"/>
+        </w:rPr>
+        <w:t>, remaining credits</w:t>
+      </w:r>
+      <w:r>
+        <w:rPr>
+          <w:rFonts w:ascii="Arial" w:hAnsi="Arial" w:cs="Arial"/>
+          <w:sz w:val="24"/>
+          <w:szCs w:val="24"/>
+          <w:lang w:val="en-US"/>
+        </w:rPr>
+        <w:t>, and the percentage of</w:t>
+      </w:r>
+      <w:r>
+        <w:rPr>
+          <w:rFonts w:ascii="Arial" w:hAnsi="Arial" w:cs="Arial"/>
+          <w:sz w:val="24"/>
+          <w:szCs w:val="24"/>
+          <w:lang w:val="en-US"/>
+        </w:rPr>
+        <w:t xml:space="preserve"> the overall credit</w:t>
+      </w:r>
+      <w:r>
+        <w:rPr>
+          <w:rFonts w:ascii="Arial" w:hAnsi="Arial" w:cs="Arial"/>
+          <w:sz w:val="24"/>
+          <w:szCs w:val="24"/>
+          <w:lang w:val="en-US"/>
+        </w:rPr>
+        <w:t xml:space="preserve"> requirement</w:t>
+      </w:r>
+      <w:r>
+        <w:rPr>
+          <w:rFonts w:ascii="Arial" w:hAnsi="Arial" w:cs="Arial"/>
+          <w:sz w:val="24"/>
+          <w:szCs w:val="24"/>
+          <w:lang w:val="en-US"/>
+        </w:rPr>
+        <w:t xml:space="preserve"> that has been completed.</w:t>
+      </w:r>
+    </w:p>
+    <w:p>
+      <w:pPr>
+        <w:spacing w:line="360" w:lineRule="auto"/>
+        <w:rPr>
+          <w:rFonts w:ascii="Arial" w:hAnsi="Arial" w:cs="Arial"/>
+          <w:sz w:val="24"/>
+          <w:szCs w:val="24"/>
+          <w:lang w:val="en-US"/>
+        </w:rPr>
+      </w:pPr>
+    </w:p>
+    <w:p>
+      <w:pPr>
+        <w:spacing w:line="360" w:lineRule="auto"/>
+        <w:rPr>
+          <w:rFonts w:ascii="Arial" w:hAnsi="Arial" w:cs="Arial"/>
+          <w:sz w:val="24"/>
+          <w:szCs w:val="24"/>
+          <w:lang w:val="en-US"/>
+        </w:rPr>
+      </w:pPr>
+      <w:r>
+        <w:rPr>
+          <w:rFonts w:ascii="Arial" w:hAnsi="Arial" w:cs="Arial"/>
+          <w:sz w:val="24"/>
+          <w:szCs w:val="24"/>
+          <w:lang w:val="en-US"/>
+        </w:rPr>
+        <w:t xml:space="preserve">FR-12 – </w:t>
+      </w:r>
+      <w:r>
+        <w:rPr>
+          <w:rFonts w:ascii="Arial" w:hAnsi="Arial" w:cs="Arial"/>
+          <w:sz w:val="24"/>
+          <w:szCs w:val="24"/>
+          <w:lang w:val="en-US"/>
+        </w:rPr>
+        <w:t>Persistent data storage</w:t>
+      </w:r>
+    </w:p>
+    <w:p>
+      <w:pPr>
+        <w:spacing w:line="360" w:lineRule="auto"/>
+        <w:rPr>
+          <w:rFonts w:ascii="Arial" w:hAnsi="Arial" w:cs="Arial"/>
+          <w:sz w:val="24"/>
+          <w:szCs w:val="24"/>
+          <w:lang w:val="en-US"/>
+        </w:rPr>
+      </w:pPr>
+    </w:p>
+    <w:p>
+      <w:pPr>
+        <w:spacing w:line="360" w:lineRule="auto"/>
+        <w:rPr>
+          <w:rFonts w:ascii="Arial" w:hAnsi="Arial" w:cs="Arial"/>
+          <w:sz w:val="24"/>
+          <w:szCs w:val="24"/>
+          <w:lang w:val="en-US"/>
+        </w:rPr>
+      </w:pPr>
+      <w:r>
+        <w:rPr>
+          <w:rFonts w:ascii="Arial" w:hAnsi="Arial" w:cs="Arial"/>
+          <w:sz w:val="24"/>
+          <w:szCs w:val="24"/>
+          <w:lang w:val="en-US"/>
+        </w:rPr>
+        <w:t xml:space="preserve">FR-12: </w:t>
+      </w:r>
+      <w:r>
+        <w:rPr>
+          <w:rFonts w:ascii="Arial" w:hAnsi="Arial" w:cs="Arial"/>
+          <w:sz w:val="24"/>
+          <w:szCs w:val="24"/>
+          <w:lang w:val="en-US"/>
+        </w:rPr>
+        <w:t>The program will preserve</w:t>
+      </w:r>
+      <w:r>
+        <w:rPr>
+          <w:rFonts w:ascii="Arial" w:hAnsi="Arial" w:cs="Arial"/>
+          <w:sz w:val="24"/>
+          <w:szCs w:val="24"/>
+          <w:lang w:val="en-US"/>
+        </w:rPr>
+        <w:t xml:space="preserve"> academic information between</w:t>
+      </w:r>
+      <w:r>
+        <w:rPr>
+          <w:rFonts w:ascii="Arial" w:hAnsi="Arial" w:cs="Arial"/>
+          <w:sz w:val="24"/>
+          <w:szCs w:val="24"/>
+          <w:lang w:val="en-US"/>
+        </w:rPr>
+        <w:t xml:space="preserve"> application sessions.</w:t>
+      </w:r>
+    </w:p>
+    <w:p>
+      <w:pPr>
+        <w:spacing w:line="360" w:lineRule="auto"/>
+        <w:rPr>
+          <w:rFonts w:ascii="Arial" w:hAnsi="Arial" w:cs="Arial"/>
+          <w:sz w:val="24"/>
+          <w:szCs w:val="24"/>
+          <w:lang w:val="en-US"/>
+        </w:rPr>
+      </w:pPr>
+    </w:p>
+    <w:p>
+      <w:pPr>
+        <w:spacing w:line="360" w:lineRule="auto"/>
+        <w:rPr>
+          <w:rFonts w:ascii="Arial" w:hAnsi="Arial" w:cs="Arial"/>
+          <w:sz w:val="24"/>
+          <w:szCs w:val="24"/>
+          <w:lang w:val="en-US"/>
+        </w:rPr>
+      </w:pPr>
+      <w:r>
+        <w:rPr>
+          <w:rFonts w:ascii="Arial" w:hAnsi="Arial" w:cs="Arial"/>
+          <w:sz w:val="24"/>
+          <w:szCs w:val="24"/>
+          <w:lang w:val="en-US"/>
+        </w:rPr>
+        <w:t>Courses</w:t>
+      </w:r>
+      <w:r>
+        <w:rPr>
+          <w:rFonts w:ascii="Arial" w:hAnsi="Arial" w:cs="Arial"/>
+          <w:sz w:val="24"/>
+          <w:szCs w:val="24"/>
+          <w:lang w:val="en-US"/>
+        </w:rPr>
+        <w:t xml:space="preserve"> and semesters shall </w:t>
+      </w:r>
+      <w:r>
+        <w:rPr>
+          <w:rFonts w:ascii="Arial" w:hAnsi="Arial" w:cs="Arial"/>
+          <w:sz w:val="24"/>
+          <w:szCs w:val="24"/>
+          <w:lang w:val="en-US"/>
+        </w:rPr>
+        <w:t xml:space="preserve">be stored </w:t>
+      </w:r>
+      <w:r>
+        <w:rPr>
+          <w:rFonts w:ascii="Arial" w:hAnsi="Arial" w:cs="Arial"/>
+          <w:sz w:val="24"/>
+          <w:szCs w:val="24"/>
+          <w:lang w:val="en-US"/>
+        </w:rPr>
+        <w:t>in a local database</w:t>
+      </w:r>
+      <w:r>
+        <w:rPr>
+          <w:rFonts w:ascii="Arial" w:hAnsi="Arial" w:cs="Arial"/>
+          <w:sz w:val="24"/>
+          <w:szCs w:val="24"/>
+          <w:lang w:val="en-US"/>
+        </w:rPr>
+        <w:t xml:space="preserve"> and restored when the application</w:t>
+      </w:r>
+      <w:r>
+        <w:rPr>
+          <w:rFonts w:ascii="Arial" w:hAnsi="Arial" w:cs="Arial"/>
+          <w:sz w:val="24"/>
+          <w:szCs w:val="24"/>
+          <w:lang w:val="en-US"/>
+        </w:rPr>
+        <w:t xml:space="preserve"> is started again.</w:t>
+      </w:r>
+    </w:p>
+    <w:p>
+      <w:pPr>
+        <w:spacing w:line="360" w:lineRule="auto"/>
+        <w:rPr>
+          <w:rFonts w:ascii="Arial" w:hAnsi="Arial" w:cs="Arial"/>
+          <w:sz w:val="24"/>
+          <w:szCs w:val="24"/>
+          <w:lang w:val="en-US"/>
+        </w:rPr>
+      </w:pPr>
+    </w:p>
+    <w:p>
+      <w:pPr>
+        <w:spacing w:line="360" w:lineRule="auto"/>
+        <w:rPr>
+          <w:rFonts w:ascii="Arial" w:hAnsi="Arial" w:cs="Arial"/>
+          <w:sz w:val="24"/>
+          <w:szCs w:val="24"/>
+          <w:lang w:val="en-US"/>
+        </w:rPr>
+      </w:pPr>
+      <w:r>
+        <w:rPr>
+          <w:rFonts w:ascii="Arial" w:hAnsi="Arial" w:cs="Arial"/>
+          <w:sz w:val="24"/>
+          <w:szCs w:val="24"/>
+          <w:lang w:val="en-US"/>
+        </w:rPr>
+        <w:t xml:space="preserve">FR-13 – </w:t>
+      </w:r>
+      <w:r>
+        <w:rPr>
+          <w:rFonts w:ascii="Arial" w:hAnsi="Arial" w:cs="Arial"/>
+          <w:sz w:val="24"/>
+          <w:szCs w:val="24"/>
+          <w:lang w:val="en-US"/>
+        </w:rPr>
+        <w:t>Validate input</w:t>
+      </w:r>
+    </w:p>
+    <w:p>
+      <w:pPr>
+        <w:spacing w:line="360" w:lineRule="auto"/>
+        <w:rPr>
+          <w:rFonts w:ascii="Arial" w:hAnsi="Arial" w:cs="Arial"/>
+          <w:sz w:val="24"/>
+          <w:szCs w:val="24"/>
+          <w:lang w:val="en-US"/>
+        </w:rPr>
+      </w:pPr>
+    </w:p>
+    <w:p>
+      <w:pPr>
+        <w:spacing w:line="360" w:lineRule="auto"/>
+        <w:rPr>
+          <w:rFonts w:ascii="Arial" w:hAnsi="Arial" w:cs="Arial"/>
+          <w:sz w:val="24"/>
+          <w:szCs w:val="24"/>
+          <w:lang w:val="en-US"/>
+        </w:rPr>
+      </w:pPr>
+      <w:r>
+        <w:rPr>
+          <w:rFonts w:ascii="Arial" w:hAnsi="Arial" w:cs="Arial"/>
+          <w:sz w:val="24"/>
+          <w:szCs w:val="24"/>
+          <w:lang w:val="en-US"/>
+        </w:rPr>
+        <w:t xml:space="preserve">FR-13: </w:t>
+      </w:r>
+      <w:r>
+        <w:rPr>
+          <w:rFonts w:ascii="Arial" w:hAnsi="Arial" w:cs="Arial"/>
+          <w:sz w:val="24"/>
+          <w:szCs w:val="24"/>
+          <w:lang w:val="en-US"/>
+        </w:rPr>
+        <w:t>The program will validate user input</w:t>
+      </w:r>
+      <w:r>
+        <w:rPr>
+          <w:rFonts w:ascii="Arial" w:hAnsi="Arial" w:cs="Arial"/>
+          <w:sz w:val="24"/>
+          <w:szCs w:val="24"/>
+          <w:lang w:val="en-US"/>
+        </w:rPr>
+        <w:t xml:space="preserve"> before storing academic information.</w:t>
+      </w:r>
+    </w:p>
+    <w:p>
+      <w:pPr>
+        <w:spacing w:line="360" w:lineRule="auto"/>
+        <w:rPr>
+          <w:rFonts w:ascii="Arial" w:hAnsi="Arial" w:cs="Arial"/>
+          <w:sz w:val="24"/>
+          <w:szCs w:val="24"/>
+          <w:lang w:val="en-US"/>
+        </w:rPr>
+      </w:pPr>
+    </w:p>
+    <w:p>
+      <w:pPr>
+        <w:spacing w:line="360" w:lineRule="auto"/>
+        <w:rPr>
+          <w:rFonts w:ascii="Arial" w:hAnsi="Arial" w:cs="Arial"/>
+          <w:sz w:val="24"/>
+          <w:szCs w:val="24"/>
+          <w:lang w:val="en-US"/>
+        </w:rPr>
+      </w:pPr>
+      <w:r>
+        <w:rPr>
+          <w:rFonts w:ascii="Arial" w:hAnsi="Arial" w:cs="Arial"/>
+          <w:sz w:val="24"/>
+          <w:szCs w:val="24"/>
+          <w:lang w:val="en-US"/>
+        </w:rPr>
+        <w:t>Required fields will</w:t>
+      </w:r>
+      <w:r>
+        <w:rPr>
+          <w:rFonts w:ascii="Arial" w:hAnsi="Arial" w:cs="Arial"/>
+          <w:sz w:val="24"/>
+          <w:szCs w:val="24"/>
+          <w:lang w:val="en-US"/>
+        </w:rPr>
+        <w:t xml:space="preserve"> not be empty</w:t>
+      </w:r>
+      <w:r>
+        <w:rPr>
+          <w:rFonts w:ascii="Arial" w:hAnsi="Arial" w:cs="Arial"/>
+          <w:sz w:val="24"/>
+          <w:szCs w:val="24"/>
+          <w:lang w:val="en-US"/>
+        </w:rPr>
+        <w:t>, credit values will</w:t>
+      </w:r>
+      <w:r>
+        <w:rPr>
+          <w:rFonts w:ascii="Arial" w:hAnsi="Arial" w:cs="Arial"/>
+          <w:sz w:val="24"/>
+          <w:szCs w:val="24"/>
+          <w:lang w:val="en-US"/>
+        </w:rPr>
+        <w:t xml:space="preserve"> fall within an acceptable range</w:t>
+      </w:r>
+      <w:r>
+        <w:rPr>
+          <w:rFonts w:ascii="Arial" w:hAnsi="Arial" w:cs="Arial"/>
+          <w:sz w:val="24"/>
+          <w:szCs w:val="24"/>
+          <w:lang w:val="en-US"/>
+        </w:rPr>
+        <w:t>, and gra</w:t>
+      </w:r>
+      <w:r>
+        <w:rPr>
+          <w:rFonts w:ascii="Arial" w:hAnsi="Arial" w:cs="Arial"/>
+          <w:sz w:val="24"/>
+          <w:szCs w:val="24"/>
+          <w:lang w:val="en-US"/>
+        </w:rPr>
+        <w:t>des</w:t>
+      </w:r>
+      <w:r>
+        <w:rPr>
+          <w:rFonts w:ascii="Arial" w:hAnsi="Arial" w:cs="Arial"/>
+          <w:sz w:val="24"/>
+          <w:szCs w:val="24"/>
+          <w:lang w:val="en-US"/>
+        </w:rPr>
+        <w:t xml:space="preserve"> will be selected only from the</w:t>
+      </w:r>
+      <w:r>
+        <w:rPr>
+          <w:rFonts w:ascii="Arial" w:hAnsi="Arial" w:cs="Arial"/>
+          <w:sz w:val="24"/>
+          <w:szCs w:val="24"/>
+          <w:lang w:val="en-US"/>
+        </w:rPr>
+        <w:t xml:space="preserve"> supported grading scale.</w:t>
       </w:r>
     </w:p>
     <w:sectPr>

</xml_diff>

<commit_message>
Getting to the fourth point of the second chapter of my thesis.
</commit_message>
<xml_diff>
--- a/Project Thesis.docx
+++ b/Project Thesis.docx
@@ -4602,6 +4602,682 @@
           <w:lang w:val="en-US"/>
         </w:rPr>
         <w:t xml:space="preserve"> supported grading scale.</w:t>
+      </w:r>
+    </w:p>
+    <w:p>
+      <w:pPr>
+        <w:spacing w:line="360" w:lineRule="auto"/>
+        <w:rPr>
+          <w:rFonts w:ascii="Arial" w:hAnsi="Arial" w:cs="Arial"/>
+          <w:sz w:val="24"/>
+          <w:szCs w:val="24"/>
+          <w:lang w:val="en-US"/>
+        </w:rPr>
+      </w:pPr>
+    </w:p>
+    <w:p>
+      <w:pPr>
+        <w:pStyle w:val="ListParagraph"/>
+        <w:numPr>
+          <w:ilvl w:val="1"/>
+          <w:numId w:val="1"/>
+        </w:numPr>
+        <w:spacing w:line="360" w:lineRule="auto"/>
+        <w:rPr>
+          <w:rFonts w:ascii="Arial" w:hAnsi="Arial" w:cs="Arial"/>
+          <w:sz w:val="24"/>
+          <w:szCs w:val="24"/>
+          <w:lang w:val="en-US"/>
+        </w:rPr>
+      </w:pPr>
+      <w:r>
+        <w:rPr>
+          <w:rFonts w:ascii="Arial" w:hAnsi="Arial" w:cs="Arial"/>
+          <w:sz w:val="24"/>
+          <w:szCs w:val="24"/>
+          <w:lang w:val="en-US"/>
+        </w:rPr>
+        <w:t>Non-functional requirements</w:t>
+      </w:r>
+    </w:p>
+    <w:p>
+      <w:pPr>
+        <w:spacing w:line="360" w:lineRule="auto"/>
+        <w:rPr>
+          <w:rFonts w:ascii="Arial" w:hAnsi="Arial" w:cs="Arial"/>
+          <w:sz w:val="24"/>
+          <w:szCs w:val="24"/>
+          <w:lang w:val="en-US"/>
+        </w:rPr>
+      </w:pPr>
+    </w:p>
+    <w:p>
+      <w:pPr>
+        <w:spacing w:line="360" w:lineRule="auto"/>
+        <w:rPr>
+          <w:rFonts w:ascii="Arial" w:hAnsi="Arial" w:cs="Arial"/>
+          <w:sz w:val="24"/>
+          <w:szCs w:val="24"/>
+          <w:lang w:val="en-US"/>
+        </w:rPr>
+      </w:pPr>
+      <w:r>
+        <w:rPr>
+          <w:rFonts w:ascii="Arial" w:hAnsi="Arial" w:cs="Arial"/>
+          <w:sz w:val="24"/>
+          <w:szCs w:val="24"/>
+          <w:lang w:val="en-US"/>
+        </w:rPr>
+        <w:t xml:space="preserve">NFR-01 – </w:t>
+      </w:r>
+      <w:r>
+        <w:rPr>
+          <w:rFonts w:ascii="Arial" w:hAnsi="Arial" w:cs="Arial"/>
+          <w:sz w:val="24"/>
+          <w:szCs w:val="24"/>
+          <w:lang w:val="en-US"/>
+        </w:rPr>
+        <w:t>Usability</w:t>
+      </w:r>
+    </w:p>
+    <w:p>
+      <w:pPr>
+        <w:spacing w:line="360" w:lineRule="auto"/>
+        <w:rPr>
+          <w:rFonts w:ascii="Arial" w:hAnsi="Arial" w:cs="Arial"/>
+          <w:sz w:val="24"/>
+          <w:szCs w:val="24"/>
+          <w:lang w:val="en-US"/>
+        </w:rPr>
+      </w:pPr>
+    </w:p>
+    <w:p>
+      <w:pPr>
+        <w:spacing w:line="360" w:lineRule="auto"/>
+        <w:rPr>
+          <w:rFonts w:ascii="Arial" w:hAnsi="Arial" w:cs="Arial"/>
+          <w:sz w:val="24"/>
+          <w:szCs w:val="24"/>
+          <w:lang w:val="en-US"/>
+        </w:rPr>
+      </w:pPr>
+      <w:r>
+        <w:rPr>
+          <w:rFonts w:ascii="Arial" w:hAnsi="Arial" w:cs="Arial"/>
+          <w:sz w:val="24"/>
+          <w:szCs w:val="24"/>
+          <w:lang w:val="en-US"/>
+        </w:rPr>
+        <w:lastRenderedPageBreak/>
+        <w:t xml:space="preserve">NFR-01: </w:t>
+      </w:r>
+      <w:r>
+        <w:rPr>
+          <w:rFonts w:ascii="Arial" w:hAnsi="Arial" w:cs="Arial"/>
+          <w:sz w:val="24"/>
+          <w:szCs w:val="24"/>
+          <w:lang w:val="en-US"/>
+        </w:rPr>
+        <w:t>The program will provide a simple</w:t>
+      </w:r>
+      <w:r>
+        <w:rPr>
+          <w:rFonts w:ascii="Arial" w:hAnsi="Arial" w:cs="Arial"/>
+          <w:sz w:val="24"/>
+          <w:szCs w:val="24"/>
+          <w:lang w:val="en-US"/>
+        </w:rPr>
+        <w:t xml:space="preserve"> and understandable graphical user interface</w:t>
+      </w:r>
+      <w:r>
+        <w:rPr>
+          <w:rFonts w:ascii="Arial" w:hAnsi="Arial" w:cs="Arial"/>
+          <w:sz w:val="24"/>
+          <w:szCs w:val="24"/>
+          <w:lang w:val="en-US"/>
+        </w:rPr>
+        <w:t>.</w:t>
+      </w:r>
+    </w:p>
+    <w:p>
+      <w:pPr>
+        <w:spacing w:line="360" w:lineRule="auto"/>
+        <w:rPr>
+          <w:rFonts w:ascii="Arial" w:hAnsi="Arial" w:cs="Arial"/>
+          <w:sz w:val="24"/>
+          <w:szCs w:val="24"/>
+          <w:lang w:val="en-US"/>
+        </w:rPr>
+      </w:pPr>
+    </w:p>
+    <w:p>
+      <w:pPr>
+        <w:spacing w:line="360" w:lineRule="auto"/>
+        <w:rPr>
+          <w:rFonts w:ascii="Arial" w:hAnsi="Arial" w:cs="Arial"/>
+          <w:sz w:val="24"/>
+          <w:szCs w:val="24"/>
+          <w:lang w:val="en-US"/>
+        </w:rPr>
+      </w:pPr>
+      <w:r>
+        <w:rPr>
+          <w:rFonts w:ascii="Arial" w:hAnsi="Arial" w:cs="Arial"/>
+          <w:sz w:val="24"/>
+          <w:szCs w:val="24"/>
+          <w:lang w:val="en-US"/>
+        </w:rPr>
+        <w:t>Major functions will be</w:t>
+      </w:r>
+      <w:r>
+        <w:rPr>
+          <w:rFonts w:ascii="Arial" w:hAnsi="Arial" w:cs="Arial"/>
+          <w:sz w:val="24"/>
+          <w:szCs w:val="24"/>
+          <w:lang w:val="en-US"/>
+        </w:rPr>
+        <w:t xml:space="preserve"> accessible through</w:t>
+      </w:r>
+      <w:r>
+        <w:rPr>
+          <w:rFonts w:ascii="Arial" w:hAnsi="Arial" w:cs="Arial"/>
+          <w:sz w:val="24"/>
+          <w:szCs w:val="24"/>
+          <w:lang w:val="en-US"/>
+        </w:rPr>
+        <w:t xml:space="preserve"> clearly labeled</w:t>
+      </w:r>
+      <w:r>
+        <w:rPr>
+          <w:rFonts w:ascii="Arial" w:hAnsi="Arial" w:cs="Arial"/>
+          <w:sz w:val="24"/>
+          <w:szCs w:val="24"/>
+          <w:lang w:val="en-US"/>
+        </w:rPr>
+        <w:t xml:space="preserve"> navigation</w:t>
+      </w:r>
+      <w:r>
+        <w:rPr>
+          <w:rFonts w:ascii="Arial" w:hAnsi="Arial" w:cs="Arial"/>
+          <w:sz w:val="24"/>
+          <w:szCs w:val="24"/>
+          <w:lang w:val="en-US"/>
+        </w:rPr>
+        <w:t xml:space="preserve"> elements</w:t>
+      </w:r>
+      <w:r>
+        <w:rPr>
+          <w:rFonts w:ascii="Arial" w:hAnsi="Arial" w:cs="Arial"/>
+          <w:sz w:val="24"/>
+          <w:szCs w:val="24"/>
+          <w:lang w:val="en-US"/>
+        </w:rPr>
+        <w:t>, forms</w:t>
+      </w:r>
+      <w:r>
+        <w:rPr>
+          <w:rFonts w:ascii="Arial" w:hAnsi="Arial" w:cs="Arial"/>
+          <w:sz w:val="24"/>
+          <w:szCs w:val="24"/>
+          <w:lang w:val="en-US"/>
+        </w:rPr>
+        <w:t>, buttons</w:t>
+      </w:r>
+      <w:r>
+        <w:rPr>
+          <w:rFonts w:ascii="Arial" w:hAnsi="Arial" w:cs="Arial"/>
+          <w:sz w:val="24"/>
+          <w:szCs w:val="24"/>
+          <w:lang w:val="en-US"/>
+        </w:rPr>
+        <w:t>, and tables.</w:t>
+      </w:r>
+      <w:r>
+        <w:rPr>
+          <w:rFonts w:ascii="Arial" w:hAnsi="Arial" w:cs="Arial"/>
+          <w:sz w:val="24"/>
+          <w:szCs w:val="24"/>
+          <w:lang w:val="en-US"/>
+        </w:rPr>
+        <w:t xml:space="preserve"> Validation errors</w:t>
+      </w:r>
+      <w:r>
+        <w:rPr>
+          <w:rFonts w:ascii="Arial" w:hAnsi="Arial" w:cs="Arial"/>
+          <w:sz w:val="24"/>
+          <w:szCs w:val="24"/>
+          <w:lang w:val="en-US"/>
+        </w:rPr>
+        <w:t xml:space="preserve"> will be displayed</w:t>
+      </w:r>
+      <w:r>
+        <w:rPr>
+          <w:rFonts w:ascii="Arial" w:hAnsi="Arial" w:cs="Arial"/>
+          <w:sz w:val="24"/>
+          <w:szCs w:val="24"/>
+          <w:lang w:val="en-US"/>
+        </w:rPr>
+        <w:t xml:space="preserve"> in a form</w:t>
+      </w:r>
+      <w:r>
+        <w:rPr>
+          <w:rFonts w:ascii="Arial" w:hAnsi="Arial" w:cs="Arial"/>
+          <w:sz w:val="24"/>
+          <w:szCs w:val="24"/>
+          <w:lang w:val="en-US"/>
+        </w:rPr>
+        <w:t xml:space="preserve"> understandable to the user.</w:t>
+      </w:r>
+    </w:p>
+    <w:p>
+      <w:pPr>
+        <w:spacing w:line="360" w:lineRule="auto"/>
+        <w:rPr>
+          <w:rFonts w:ascii="Arial" w:hAnsi="Arial" w:cs="Arial"/>
+          <w:sz w:val="24"/>
+          <w:szCs w:val="24"/>
+          <w:lang w:val="en-US"/>
+        </w:rPr>
+      </w:pPr>
+    </w:p>
+    <w:p>
+      <w:pPr>
+        <w:spacing w:line="360" w:lineRule="auto"/>
+        <w:rPr>
+          <w:rFonts w:ascii="Arial" w:hAnsi="Arial" w:cs="Arial"/>
+          <w:sz w:val="24"/>
+          <w:szCs w:val="24"/>
+          <w:lang w:val="en-US"/>
+        </w:rPr>
+      </w:pPr>
+      <w:r>
+        <w:rPr>
+          <w:rFonts w:ascii="Arial" w:hAnsi="Arial" w:cs="Arial"/>
+          <w:sz w:val="24"/>
+          <w:szCs w:val="24"/>
+          <w:lang w:val="en-US"/>
+        </w:rPr>
+        <w:t xml:space="preserve">NFR-02 – </w:t>
+      </w:r>
+      <w:r>
+        <w:rPr>
+          <w:rFonts w:ascii="Arial" w:hAnsi="Arial" w:cs="Arial"/>
+          <w:sz w:val="24"/>
+          <w:szCs w:val="24"/>
+          <w:lang w:val="en-US"/>
+        </w:rPr>
+        <w:t>Reliability</w:t>
+      </w:r>
+    </w:p>
+    <w:p>
+      <w:pPr>
+        <w:spacing w:line="360" w:lineRule="auto"/>
+        <w:rPr>
+          <w:rFonts w:ascii="Arial" w:hAnsi="Arial" w:cs="Arial"/>
+          <w:sz w:val="24"/>
+          <w:szCs w:val="24"/>
+          <w:lang w:val="en-US"/>
+        </w:rPr>
+      </w:pPr>
+    </w:p>
+    <w:p>
+      <w:pPr>
+        <w:spacing w:line="360" w:lineRule="auto"/>
+        <w:rPr>
+          <w:rFonts w:ascii="Arial" w:hAnsi="Arial" w:cs="Arial"/>
+          <w:sz w:val="24"/>
+          <w:szCs w:val="24"/>
+          <w:lang w:val="en-US"/>
+        </w:rPr>
+      </w:pPr>
+      <w:r>
+        <w:rPr>
+          <w:rFonts w:ascii="Arial" w:hAnsi="Arial" w:cs="Arial"/>
+          <w:sz w:val="24"/>
+          <w:szCs w:val="24"/>
+          <w:lang w:val="en-US"/>
+        </w:rPr>
+        <w:t xml:space="preserve">NFR-02: </w:t>
+      </w:r>
+      <w:r>
+        <w:rPr>
+          <w:rFonts w:ascii="Arial" w:hAnsi="Arial" w:cs="Arial"/>
+          <w:sz w:val="24"/>
+          <w:szCs w:val="24"/>
+          <w:lang w:val="en-US"/>
+        </w:rPr>
+        <w:t>The program will perform GPA</w:t>
+      </w:r>
+      <w:r>
+        <w:rPr>
+          <w:rFonts w:ascii="Arial" w:hAnsi="Arial" w:cs="Arial"/>
+          <w:sz w:val="24"/>
+          <w:szCs w:val="24"/>
+          <w:lang w:val="en-US"/>
+        </w:rPr>
+        <w:t xml:space="preserve"> and credit calculations</w:t>
+      </w:r>
+      <w:r>
+        <w:rPr>
+          <w:rFonts w:ascii="Arial" w:hAnsi="Arial" w:cs="Arial"/>
+          <w:sz w:val="24"/>
+          <w:szCs w:val="24"/>
+          <w:lang w:val="en-US"/>
+        </w:rPr>
+        <w:t xml:space="preserve"> consistently and correctly</w:t>
+      </w:r>
+      <w:r>
+        <w:rPr>
+          <w:rFonts w:ascii="Arial" w:hAnsi="Arial" w:cs="Arial"/>
+          <w:sz w:val="24"/>
+          <w:szCs w:val="24"/>
+          <w:lang w:val="en-US"/>
+        </w:rPr>
+        <w:t xml:space="preserve"> for valid academic</w:t>
+      </w:r>
+      <w:r>
+        <w:rPr>
+          <w:rFonts w:ascii="Arial" w:hAnsi="Arial" w:cs="Arial"/>
+          <w:sz w:val="24"/>
+          <w:szCs w:val="24"/>
+          <w:lang w:val="en-US"/>
+        </w:rPr>
+        <w:t xml:space="preserve"> data.</w:t>
+      </w:r>
+    </w:p>
+    <w:p>
+      <w:pPr>
+        <w:spacing w:line="360" w:lineRule="auto"/>
+        <w:rPr>
+          <w:rFonts w:ascii="Arial" w:hAnsi="Arial" w:cs="Arial"/>
+          <w:sz w:val="24"/>
+          <w:szCs w:val="24"/>
+          <w:lang w:val="en-US"/>
+        </w:rPr>
+      </w:pPr>
+    </w:p>
+    <w:p>
+      <w:pPr>
+        <w:spacing w:line="360" w:lineRule="auto"/>
+        <w:rPr>
+          <w:rFonts w:ascii="Arial" w:hAnsi="Arial" w:cs="Arial"/>
+          <w:sz w:val="24"/>
+          <w:szCs w:val="24"/>
+          <w:lang w:val="en-US"/>
+        </w:rPr>
+      </w:pPr>
+      <w:r>
+        <w:rPr>
+          <w:rFonts w:ascii="Arial" w:hAnsi="Arial" w:cs="Arial"/>
+          <w:sz w:val="24"/>
+          <w:szCs w:val="24"/>
+          <w:lang w:val="en-US"/>
+        </w:rPr>
+        <w:t>Calculation logic will be separated</w:t>
+      </w:r>
+      <w:r>
+        <w:rPr>
+          <w:rFonts w:ascii="Arial" w:hAnsi="Arial" w:cs="Arial"/>
+          <w:sz w:val="24"/>
+          <w:szCs w:val="24"/>
+          <w:lang w:val="en-US"/>
+        </w:rPr>
+        <w:t xml:space="preserve"> from the user interface</w:t>
+      </w:r>
+      <w:r>
+        <w:rPr>
+          <w:rFonts w:ascii="Arial" w:hAnsi="Arial" w:cs="Arial"/>
+          <w:sz w:val="24"/>
+          <w:szCs w:val="24"/>
+          <w:lang w:val="en-US"/>
+        </w:rPr>
+        <w:t xml:space="preserve"> and verified using</w:t>
+      </w:r>
+      <w:r>
+        <w:rPr>
+          <w:rFonts w:ascii="Arial" w:hAnsi="Arial" w:cs="Arial"/>
+          <w:sz w:val="24"/>
+          <w:szCs w:val="24"/>
+          <w:lang w:val="en-US"/>
+        </w:rPr>
+        <w:t xml:space="preserve"> automated tests.</w:t>
+      </w:r>
+    </w:p>
+    <w:p>
+      <w:pPr>
+        <w:spacing w:line="360" w:lineRule="auto"/>
+        <w:rPr>
+          <w:rFonts w:ascii="Arial" w:hAnsi="Arial" w:cs="Arial"/>
+          <w:sz w:val="24"/>
+          <w:szCs w:val="24"/>
+          <w:lang w:val="en-US"/>
+        </w:rPr>
+      </w:pPr>
+    </w:p>
+    <w:p>
+      <w:pPr>
+        <w:spacing w:line="360" w:lineRule="auto"/>
+        <w:rPr>
+          <w:rFonts w:ascii="Arial" w:hAnsi="Arial" w:cs="Arial"/>
+          <w:sz w:val="24"/>
+          <w:szCs w:val="24"/>
+          <w:lang w:val="en-US"/>
+        </w:rPr>
+      </w:pPr>
+      <w:r>
+        <w:rPr>
+          <w:rFonts w:ascii="Arial" w:hAnsi="Arial" w:cs="Arial"/>
+          <w:sz w:val="24"/>
+          <w:szCs w:val="24"/>
+          <w:lang w:val="en-US"/>
+        </w:rPr>
+        <w:t xml:space="preserve">NFR-03 – </w:t>
+      </w:r>
+      <w:r>
+        <w:rPr>
+          <w:rFonts w:ascii="Arial" w:hAnsi="Arial" w:cs="Arial"/>
+          <w:sz w:val="24"/>
+          <w:szCs w:val="24"/>
+          <w:lang w:val="en-US"/>
+        </w:rPr>
+        <w:t>Maintainability</w:t>
+      </w:r>
+    </w:p>
+    <w:p>
+      <w:pPr>
+        <w:spacing w:line="360" w:lineRule="auto"/>
+        <w:rPr>
+          <w:rFonts w:ascii="Arial" w:hAnsi="Arial" w:cs="Arial"/>
+          <w:sz w:val="24"/>
+          <w:szCs w:val="24"/>
+          <w:lang w:val="en-US"/>
+        </w:rPr>
+      </w:pPr>
+    </w:p>
+    <w:p>
+      <w:pPr>
+        <w:spacing w:line="360" w:lineRule="auto"/>
+        <w:rPr>
+          <w:rFonts w:ascii="Arial" w:hAnsi="Arial" w:cs="Arial"/>
+          <w:sz w:val="24"/>
+          <w:szCs w:val="24"/>
+          <w:lang w:val="en-US"/>
+        </w:rPr>
+      </w:pPr>
+      <w:r>
+        <w:rPr>
+          <w:rFonts w:ascii="Arial" w:hAnsi="Arial" w:cs="Arial"/>
+          <w:sz w:val="24"/>
+          <w:szCs w:val="24"/>
+          <w:lang w:val="en-US"/>
+        </w:rPr>
+        <w:t xml:space="preserve">NFR-03: </w:t>
+      </w:r>
+      <w:r>
+        <w:rPr>
+          <w:rFonts w:ascii="Arial" w:hAnsi="Arial" w:cs="Arial"/>
+          <w:sz w:val="24"/>
+          <w:szCs w:val="24"/>
+          <w:lang w:val="en-US"/>
+        </w:rPr>
+        <w:t>The program shall be organized</w:t>
+      </w:r>
+      <w:r>
+        <w:rPr>
+          <w:rFonts w:ascii="Arial" w:hAnsi="Arial" w:cs="Arial"/>
+          <w:sz w:val="24"/>
+          <w:szCs w:val="24"/>
+          <w:lang w:val="en-US"/>
+        </w:rPr>
+        <w:t xml:space="preserve"> into separate components</w:t>
+      </w:r>
+      <w:r>
+        <w:rPr>
+          <w:rFonts w:ascii="Arial" w:hAnsi="Arial" w:cs="Arial"/>
+          <w:sz w:val="24"/>
+          <w:szCs w:val="24"/>
+          <w:lang w:val="en-US"/>
+        </w:rPr>
+        <w:t xml:space="preserve"> for data models</w:t>
+      </w:r>
+      <w:r>
+        <w:rPr>
+          <w:rFonts w:ascii="Arial" w:hAnsi="Arial" w:cs="Arial"/>
+          <w:sz w:val="24"/>
+          <w:szCs w:val="24"/>
+          <w:lang w:val="en-US"/>
+        </w:rPr>
+        <w:t>, business logic</w:t>
+      </w:r>
+      <w:r>
+        <w:rPr>
+          <w:rFonts w:ascii="Arial" w:hAnsi="Arial" w:cs="Arial"/>
+          <w:sz w:val="24"/>
+          <w:szCs w:val="24"/>
+          <w:lang w:val="en-US"/>
+        </w:rPr>
+        <w:t>, data access</w:t>
+      </w:r>
+      <w:r>
+        <w:rPr>
+          <w:rFonts w:ascii="Arial" w:hAnsi="Arial" w:cs="Arial"/>
+          <w:sz w:val="24"/>
+          <w:szCs w:val="24"/>
+          <w:lang w:val="en-US"/>
+        </w:rPr>
+        <w:t>, and the user interface</w:t>
+      </w:r>
+      <w:r>
+        <w:rPr>
+          <w:rFonts w:ascii="Arial" w:hAnsi="Arial" w:cs="Arial"/>
+          <w:sz w:val="24"/>
+          <w:szCs w:val="24"/>
+          <w:lang w:val="en-US"/>
+        </w:rPr>
+        <w:t>.</w:t>
+      </w:r>
+    </w:p>
+    <w:p>
+      <w:pPr>
+        <w:spacing w:line="360" w:lineRule="auto"/>
+        <w:rPr>
+          <w:rFonts w:ascii="Arial" w:hAnsi="Arial" w:cs="Arial"/>
+          <w:sz w:val="24"/>
+          <w:szCs w:val="24"/>
+          <w:lang w:val="en-US"/>
+        </w:rPr>
+      </w:pPr>
+    </w:p>
+    <w:p>
+      <w:pPr>
+        <w:spacing w:line="360" w:lineRule="auto"/>
+        <w:rPr>
+          <w:rFonts w:ascii="Arial" w:hAnsi="Arial" w:cs="Arial"/>
+          <w:sz w:val="24"/>
+          <w:szCs w:val="24"/>
+          <w:lang w:val="en-US"/>
+        </w:rPr>
+      </w:pPr>
+      <w:r>
+        <w:rPr>
+          <w:rFonts w:ascii="Arial" w:hAnsi="Arial" w:cs="Arial"/>
+          <w:sz w:val="24"/>
+          <w:szCs w:val="24"/>
+          <w:lang w:val="en-US"/>
+        </w:rPr>
+        <w:t>This separation will make</w:t>
+      </w:r>
+      <w:r>
+        <w:rPr>
+          <w:rFonts w:ascii="Arial" w:hAnsi="Arial" w:cs="Arial"/>
+          <w:sz w:val="24"/>
+          <w:szCs w:val="24"/>
+          <w:lang w:val="en-US"/>
+        </w:rPr>
+        <w:t xml:space="preserve"> the source code</w:t>
+      </w:r>
+      <w:r>
+        <w:rPr>
+          <w:rFonts w:ascii="Arial" w:hAnsi="Arial" w:cs="Arial"/>
+          <w:sz w:val="24"/>
+          <w:szCs w:val="24"/>
+          <w:lang w:val="en-US"/>
+        </w:rPr>
+        <w:t xml:space="preserve"> easier to understand, test</w:t>
+      </w:r>
+      <w:r>
+        <w:rPr>
+          <w:rFonts w:ascii="Arial" w:hAnsi="Arial" w:cs="Arial"/>
+          <w:sz w:val="24"/>
+          <w:szCs w:val="24"/>
+          <w:lang w:val="en-US"/>
+        </w:rPr>
+        <w:t>, modify, and extend</w:t>
+      </w:r>
+      <w:r>
+        <w:rPr>
+          <w:rFonts w:ascii="Arial" w:hAnsi="Arial" w:cs="Arial"/>
+          <w:sz w:val="24"/>
+          <w:szCs w:val="24"/>
+          <w:lang w:val="en-US"/>
+        </w:rPr>
+        <w:t>.</w:t>
+      </w:r>
+    </w:p>
+    <w:p>
+      <w:pPr>
+        <w:spacing w:line="360" w:lineRule="auto"/>
+        <w:rPr>
+          <w:rFonts w:ascii="Arial" w:hAnsi="Arial" w:cs="Arial"/>
+          <w:sz w:val="24"/>
+          <w:szCs w:val="24"/>
+          <w:lang w:val="en-US"/>
+        </w:rPr>
+      </w:pPr>
+    </w:p>
+    <w:p>
+      <w:pPr>
+        <w:pStyle w:val="ListParagraph"/>
+        <w:numPr>
+          <w:ilvl w:val="1"/>
+          <w:numId w:val="1"/>
+        </w:numPr>
+        <w:spacing w:line="360" w:lineRule="auto"/>
+        <w:rPr>
+          <w:rFonts w:ascii="Arial" w:hAnsi="Arial" w:cs="Arial"/>
+          <w:sz w:val="24"/>
+          <w:szCs w:val="24"/>
+          <w:lang w:val="en-US"/>
+        </w:rPr>
+      </w:pPr>
+      <w:r>
+        <w:rPr>
+          <w:rFonts w:ascii="Arial" w:hAnsi="Arial" w:cs="Arial"/>
+          <w:sz w:val="24"/>
+          <w:szCs w:val="24"/>
+          <w:lang w:val="en-US"/>
+        </w:rPr>
+        <w:t>Constraints</w:t>
       </w:r>
     </w:p>
     <w:sectPr>

</xml_diff>

<commit_message>
Part 4 of the second chapter of my thesis finished.
</commit_message>
<xml_diff>
--- a/Project Thesis.docx
+++ b/Project Thesis.docx
@@ -5278,6 +5278,363 @@
           <w:lang w:val="en-US"/>
         </w:rPr>
         <w:t>Constraints</w:t>
+      </w:r>
+    </w:p>
+    <w:p>
+      <w:pPr>
+        <w:spacing w:line="360" w:lineRule="auto"/>
+        <w:rPr>
+          <w:rFonts w:ascii="Arial" w:hAnsi="Arial" w:cs="Arial"/>
+          <w:sz w:val="24"/>
+          <w:szCs w:val="24"/>
+          <w:lang w:val="en-US"/>
+        </w:rPr>
+      </w:pPr>
+    </w:p>
+    <w:p>
+      <w:pPr>
+        <w:spacing w:line="360" w:lineRule="auto"/>
+        <w:rPr>
+          <w:rFonts w:ascii="Arial" w:hAnsi="Arial" w:cs="Arial"/>
+          <w:sz w:val="24"/>
+          <w:szCs w:val="24"/>
+          <w:lang w:val="en-US"/>
+        </w:rPr>
+      </w:pPr>
+      <w:r>
+        <w:rPr>
+          <w:rFonts w:ascii="Arial" w:hAnsi="Arial" w:cs="Arial"/>
+          <w:sz w:val="24"/>
+          <w:szCs w:val="24"/>
+          <w:lang w:val="en-US"/>
+        </w:rPr>
+        <w:t>The program will be developed primarily in C#.</w:t>
+      </w:r>
+    </w:p>
+    <w:p>
+      <w:pPr>
+        <w:spacing w:line="360" w:lineRule="auto"/>
+        <w:rPr>
+          <w:rFonts w:ascii="Arial" w:hAnsi="Arial" w:cs="Arial"/>
+          <w:sz w:val="24"/>
+          <w:szCs w:val="24"/>
+          <w:lang w:val="en-US"/>
+        </w:rPr>
+      </w:pPr>
+    </w:p>
+    <w:p>
+      <w:pPr>
+        <w:spacing w:line="360" w:lineRule="auto"/>
+        <w:rPr>
+          <w:rFonts w:ascii="Arial" w:hAnsi="Arial" w:cs="Arial"/>
+          <w:sz w:val="24"/>
+          <w:szCs w:val="24"/>
+          <w:lang w:val="en-US"/>
+        </w:rPr>
+      </w:pPr>
+      <w:r>
+        <w:rPr>
+          <w:rFonts w:ascii="Arial" w:hAnsi="Arial" w:cs="Arial"/>
+          <w:sz w:val="24"/>
+          <w:szCs w:val="24"/>
+          <w:lang w:val="en-US"/>
+        </w:rPr>
+        <w:t>The program will use Blazor for</w:t>
+      </w:r>
+      <w:r>
+        <w:rPr>
+          <w:rFonts w:ascii="Arial" w:hAnsi="Arial" w:cs="Arial"/>
+          <w:sz w:val="24"/>
+          <w:szCs w:val="24"/>
+          <w:lang w:val="en-US"/>
+        </w:rPr>
+        <w:t xml:space="preserve"> the graphical user interface.</w:t>
+      </w:r>
+    </w:p>
+    <w:p>
+      <w:pPr>
+        <w:spacing w:line="360" w:lineRule="auto"/>
+        <w:rPr>
+          <w:rFonts w:ascii="Arial" w:hAnsi="Arial" w:cs="Arial"/>
+          <w:sz w:val="24"/>
+          <w:szCs w:val="24"/>
+          <w:lang w:val="en-US"/>
+        </w:rPr>
+      </w:pPr>
+    </w:p>
+    <w:p>
+      <w:pPr>
+        <w:spacing w:line="360" w:lineRule="auto"/>
+        <w:rPr>
+          <w:rFonts w:ascii="Arial" w:hAnsi="Arial" w:cs="Arial"/>
+          <w:sz w:val="24"/>
+          <w:szCs w:val="24"/>
+          <w:lang w:val="en-US"/>
+        </w:rPr>
+      </w:pPr>
+      <w:r>
+        <w:rPr>
+          <w:rFonts w:ascii="Arial" w:hAnsi="Arial" w:cs="Arial"/>
+          <w:sz w:val="24"/>
+          <w:szCs w:val="24"/>
+          <w:lang w:val="en-US"/>
+        </w:rPr>
+        <w:t>Academic data will be stored locally</w:t>
+      </w:r>
+      <w:r>
+        <w:rPr>
+          <w:rFonts w:ascii="Arial" w:hAnsi="Arial" w:cs="Arial"/>
+          <w:sz w:val="24"/>
+          <w:szCs w:val="24"/>
+          <w:lang w:val="en-US"/>
+        </w:rPr>
+        <w:t xml:space="preserve"> using SQLite.</w:t>
+      </w:r>
+    </w:p>
+    <w:p>
+      <w:pPr>
+        <w:spacing w:line="360" w:lineRule="auto"/>
+        <w:rPr>
+          <w:rFonts w:ascii="Arial" w:hAnsi="Arial" w:cs="Arial"/>
+          <w:sz w:val="24"/>
+          <w:szCs w:val="24"/>
+          <w:lang w:val="en-US"/>
+        </w:rPr>
+      </w:pPr>
+    </w:p>
+    <w:p>
+      <w:pPr>
+        <w:spacing w:line="360" w:lineRule="auto"/>
+        <w:rPr>
+          <w:rFonts w:ascii="Arial" w:hAnsi="Arial" w:cs="Arial"/>
+          <w:sz w:val="24"/>
+          <w:szCs w:val="24"/>
+          <w:lang w:val="en-US"/>
+        </w:rPr>
+      </w:pPr>
+      <w:r>
+        <w:rPr>
+          <w:rFonts w:ascii="Arial" w:hAnsi="Arial" w:cs="Arial"/>
+          <w:sz w:val="24"/>
+          <w:szCs w:val="24"/>
+          <w:lang w:val="en-US"/>
+        </w:rPr>
+        <w:t>Database access</w:t>
+      </w:r>
+      <w:r>
+        <w:rPr>
+          <w:rFonts w:ascii="Arial" w:hAnsi="Arial" w:cs="Arial"/>
+          <w:sz w:val="24"/>
+          <w:szCs w:val="24"/>
+          <w:lang w:val="en-US"/>
+        </w:rPr>
+        <w:t xml:space="preserve"> will be implemented</w:t>
+      </w:r>
+      <w:r>
+        <w:rPr>
+          <w:rFonts w:ascii="Arial" w:hAnsi="Arial" w:cs="Arial"/>
+          <w:sz w:val="24"/>
+          <w:szCs w:val="24"/>
+          <w:lang w:val="en-US"/>
+        </w:rPr>
+        <w:t xml:space="preserve"> through </w:t>
+      </w:r>
+      <w:r>
+        <w:rPr>
+          <w:rFonts w:ascii="Arial" w:hAnsi="Arial" w:cs="Arial"/>
+          <w:sz w:val="24"/>
+          <w:szCs w:val="24"/>
+          <w:lang w:val="en-US"/>
+        </w:rPr>
+        <w:t>E</w:t>
+      </w:r>
+      <w:r>
+        <w:rPr>
+          <w:rFonts w:ascii="Arial" w:hAnsi="Arial" w:cs="Arial"/>
+          <w:sz w:val="24"/>
+          <w:szCs w:val="24"/>
+          <w:lang w:val="en-US"/>
+        </w:rPr>
+        <w:t>ntity</w:t>
+      </w:r>
+      <w:r>
+        <w:rPr>
+          <w:rFonts w:ascii="Arial" w:hAnsi="Arial" w:cs="Arial"/>
+          <w:sz w:val="24"/>
+          <w:szCs w:val="24"/>
+          <w:lang w:val="en-US"/>
+        </w:rPr>
+        <w:t xml:space="preserve"> Framework Core.</w:t>
+      </w:r>
+    </w:p>
+    <w:p>
+      <w:pPr>
+        <w:spacing w:line="360" w:lineRule="auto"/>
+        <w:rPr>
+          <w:rFonts w:ascii="Arial" w:hAnsi="Arial" w:cs="Arial"/>
+          <w:sz w:val="24"/>
+          <w:szCs w:val="24"/>
+          <w:lang w:val="en-US"/>
+        </w:rPr>
+      </w:pPr>
+    </w:p>
+    <w:p>
+      <w:pPr>
+        <w:spacing w:line="360" w:lineRule="auto"/>
+        <w:rPr>
+          <w:rFonts w:ascii="Arial" w:hAnsi="Arial" w:cs="Arial"/>
+          <w:sz w:val="24"/>
+          <w:szCs w:val="24"/>
+          <w:lang w:val="en-US"/>
+        </w:rPr>
+      </w:pPr>
+      <w:r>
+        <w:rPr>
+          <w:rFonts w:ascii="Arial" w:hAnsi="Arial" w:cs="Arial"/>
+          <w:sz w:val="24"/>
+          <w:szCs w:val="24"/>
+          <w:lang w:val="en-US"/>
+        </w:rPr>
+        <w:t>The program will use</w:t>
+      </w:r>
+      <w:r>
+        <w:rPr>
+          <w:rFonts w:ascii="Arial" w:hAnsi="Arial" w:cs="Arial"/>
+          <w:sz w:val="24"/>
+          <w:szCs w:val="24"/>
+          <w:lang w:val="en-US"/>
+        </w:rPr>
+        <w:t xml:space="preserve"> the AUBG</w:t>
+      </w:r>
+      <w:r>
+        <w:rPr>
+          <w:rFonts w:ascii="Arial" w:hAnsi="Arial" w:cs="Arial"/>
+          <w:sz w:val="24"/>
+          <w:szCs w:val="24"/>
+          <w:lang w:val="en-US"/>
+        </w:rPr>
+        <w:t>-</w:t>
+      </w:r>
+      <w:r>
+        <w:rPr>
+          <w:rFonts w:ascii="Arial" w:hAnsi="Arial" w:cs="Arial"/>
+          <w:sz w:val="24"/>
+          <w:szCs w:val="24"/>
+          <w:lang w:val="en-US"/>
+        </w:rPr>
+        <w:t>compatible</w:t>
+      </w:r>
+      <w:r>
+        <w:rPr>
+          <w:rFonts w:ascii="Arial" w:hAnsi="Arial" w:cs="Arial"/>
+          <w:sz w:val="24"/>
+          <w:szCs w:val="24"/>
+          <w:lang w:val="en-US"/>
+        </w:rPr>
+        <w:t xml:space="preserve"> letter-grade</w:t>
+      </w:r>
+      <w:r>
+        <w:rPr>
+          <w:rFonts w:ascii="Arial" w:hAnsi="Arial" w:cs="Arial"/>
+          <w:sz w:val="24"/>
+          <w:szCs w:val="24"/>
+          <w:lang w:val="en-US"/>
+        </w:rPr>
+        <w:t xml:space="preserve"> scale</w:t>
+      </w:r>
+      <w:r>
+        <w:rPr>
+          <w:rFonts w:ascii="Arial" w:hAnsi="Arial" w:cs="Arial"/>
+          <w:sz w:val="24"/>
+          <w:szCs w:val="24"/>
+          <w:lang w:val="en-US"/>
+        </w:rPr>
+        <w:t xml:space="preserve"> supported by the project.</w:t>
+      </w:r>
+    </w:p>
+    <w:p>
+      <w:pPr>
+        <w:spacing w:line="360" w:lineRule="auto"/>
+        <w:rPr>
+          <w:rFonts w:ascii="Arial" w:hAnsi="Arial" w:cs="Arial"/>
+          <w:sz w:val="24"/>
+          <w:szCs w:val="24"/>
+          <w:lang w:val="en-US"/>
+        </w:rPr>
+      </w:pPr>
+    </w:p>
+    <w:p>
+      <w:pPr>
+        <w:spacing w:line="360" w:lineRule="auto"/>
+        <w:rPr>
+          <w:rFonts w:ascii="Arial" w:hAnsi="Arial" w:cs="Arial"/>
+          <w:sz w:val="24"/>
+          <w:szCs w:val="24"/>
+          <w:lang w:val="en-US"/>
+        </w:rPr>
+      </w:pPr>
+      <w:r>
+        <w:rPr>
+          <w:rFonts w:ascii="Arial" w:hAnsi="Arial" w:cs="Arial"/>
+          <w:sz w:val="24"/>
+          <w:szCs w:val="24"/>
+          <w:lang w:val="en-US"/>
+        </w:rPr>
+        <w:t xml:space="preserve">The initial version will be </w:t>
+      </w:r>
+      <w:r>
+        <w:rPr>
+          <w:rFonts w:ascii="Arial" w:hAnsi="Arial" w:cs="Arial"/>
+          <w:sz w:val="24"/>
+          <w:szCs w:val="24"/>
+          <w:lang w:val="en-US"/>
+        </w:rPr>
+        <w:t>designed primarily</w:t>
+      </w:r>
+      <w:r>
+        <w:rPr>
+          <w:rFonts w:ascii="Arial" w:hAnsi="Arial" w:cs="Arial"/>
+          <w:sz w:val="24"/>
+          <w:szCs w:val="24"/>
+          <w:lang w:val="en-US"/>
+        </w:rPr>
+        <w:t xml:space="preserve"> for a single student</w:t>
+      </w:r>
+      <w:r>
+        <w:rPr>
+          <w:rFonts w:ascii="Arial" w:hAnsi="Arial" w:cs="Arial"/>
+          <w:sz w:val="24"/>
+          <w:szCs w:val="24"/>
+          <w:lang w:val="en-US"/>
+        </w:rPr>
+        <w:t xml:space="preserve"> rather than</w:t>
+      </w:r>
+      <w:r>
+        <w:rPr>
+          <w:rFonts w:ascii="Arial" w:hAnsi="Arial" w:cs="Arial"/>
+          <w:sz w:val="24"/>
+          <w:szCs w:val="24"/>
+          <w:lang w:val="en-US"/>
+        </w:rPr>
+        <w:t xml:space="preserve"> as a multi-user</w:t>
+      </w:r>
+      <w:r>
+        <w:rPr>
+          <w:rFonts w:ascii="Arial" w:hAnsi="Arial" w:cs="Arial"/>
+          <w:sz w:val="24"/>
+          <w:szCs w:val="24"/>
+          <w:lang w:val="en-US"/>
+        </w:rPr>
+        <w:t xml:space="preserve"> university</w:t>
+      </w:r>
+      <w:r>
+        <w:rPr>
+          <w:rFonts w:ascii="Arial" w:hAnsi="Arial" w:cs="Arial"/>
+          <w:sz w:val="24"/>
+          <w:szCs w:val="24"/>
+          <w:lang w:val="en-US"/>
+        </w:rPr>
+        <w:t xml:space="preserve"> information system.</w:t>
       </w:r>
     </w:p>
     <w:sectPr>

</xml_diff>

<commit_message>
After I did a little work on the fifth chapter of my thesis, I packed up everything of the program in an archive for today, as I'll continue with everything later in time.
</commit_message>
<xml_diff>
--- a/Project Thesis.docx
+++ b/Project Thesis.docx
@@ -5635,6 +5635,127 @@
           <w:lang w:val="en-US"/>
         </w:rPr>
         <w:t xml:space="preserve"> information system.</w:t>
+      </w:r>
+    </w:p>
+    <w:p>
+      <w:pPr>
+        <w:spacing w:line="360" w:lineRule="auto"/>
+        <w:rPr>
+          <w:rFonts w:ascii="Arial" w:hAnsi="Arial" w:cs="Arial"/>
+          <w:sz w:val="24"/>
+          <w:szCs w:val="24"/>
+          <w:lang w:val="en-US"/>
+        </w:rPr>
+      </w:pPr>
+    </w:p>
+    <w:p>
+      <w:pPr>
+        <w:pStyle w:val="ListParagraph"/>
+        <w:numPr>
+          <w:ilvl w:val="1"/>
+          <w:numId w:val="1"/>
+        </w:numPr>
+        <w:spacing w:line="360" w:lineRule="auto"/>
+        <w:rPr>
+          <w:rFonts w:ascii="Arial" w:hAnsi="Arial" w:cs="Arial"/>
+          <w:sz w:val="24"/>
+          <w:szCs w:val="24"/>
+          <w:lang w:val="en-US"/>
+        </w:rPr>
+      </w:pPr>
+      <w:r>
+        <w:rPr>
+          <w:rFonts w:ascii="Arial" w:hAnsi="Arial" w:cs="Arial"/>
+          <w:sz w:val="24"/>
+          <w:szCs w:val="24"/>
+          <w:lang w:val="en-US"/>
+        </w:rPr>
+        <w:t>Functional Requirements Analysis</w:t>
+      </w:r>
+    </w:p>
+    <w:p>
+      <w:pPr>
+        <w:spacing w:line="360" w:lineRule="auto"/>
+        <w:rPr>
+          <w:rFonts w:ascii="Arial" w:hAnsi="Arial" w:cs="Arial"/>
+          <w:sz w:val="24"/>
+          <w:szCs w:val="24"/>
+          <w:lang w:val="en-US"/>
+        </w:rPr>
+      </w:pPr>
+    </w:p>
+    <w:p>
+      <w:pPr>
+        <w:pStyle w:val="ListParagraph"/>
+        <w:numPr>
+          <w:ilvl w:val="2"/>
+          <w:numId w:val="1"/>
+        </w:numPr>
+        <w:spacing w:line="360" w:lineRule="auto"/>
+        <w:rPr>
+          <w:rFonts w:ascii="Arial" w:hAnsi="Arial" w:cs="Arial"/>
+          <w:sz w:val="24"/>
+          <w:szCs w:val="24"/>
+          <w:lang w:val="en-US"/>
+        </w:rPr>
+      </w:pPr>
+      <w:r>
+        <w:rPr>
+          <w:rFonts w:ascii="Arial" w:hAnsi="Arial" w:cs="Arial"/>
+          <w:sz w:val="24"/>
+          <w:szCs w:val="24"/>
+          <w:lang w:val="en-US"/>
+        </w:rPr>
+        <w:t>Analysis of FR-01</w:t>
+      </w:r>
+      <w:r>
+        <w:rPr>
+          <w:rFonts w:ascii="Arial" w:hAnsi="Arial" w:cs="Arial"/>
+          <w:sz w:val="24"/>
+          <w:szCs w:val="24"/>
+          <w:lang w:val="en-US"/>
+        </w:rPr>
+        <w:t xml:space="preserve"> – Add Course</w:t>
+      </w:r>
+    </w:p>
+    <w:p>
+      <w:pPr>
+        <w:spacing w:line="360" w:lineRule="auto"/>
+        <w:rPr>
+          <w:rFonts w:ascii="Arial" w:hAnsi="Arial" w:cs="Arial"/>
+          <w:sz w:val="24"/>
+          <w:szCs w:val="24"/>
+          <w:lang w:val="en-US"/>
+        </w:rPr>
+      </w:pPr>
+    </w:p>
+    <w:p>
+      <w:pPr>
+        <w:spacing w:line="360" w:lineRule="auto"/>
+        <w:rPr>
+          <w:rFonts w:ascii="Arial" w:hAnsi="Arial" w:cs="Arial"/>
+          <w:sz w:val="24"/>
+          <w:szCs w:val="24"/>
+          <w:lang w:val="en-US"/>
+        </w:rPr>
+      </w:pPr>
+      <w:r>
+        <w:rPr>
+          <w:rFonts w:ascii="Arial" w:hAnsi="Arial" w:cs="Arial"/>
+          <w:sz w:val="24"/>
+          <w:szCs w:val="24"/>
+          <w:lang w:val="en-US"/>
+        </w:rPr>
+        <w:t>When the user selects</w:t>
+      </w:r>
+      <w:r>
+        <w:rPr>
+          <w:rFonts w:ascii="Arial" w:hAnsi="Arial" w:cs="Arial"/>
+          <w:sz w:val="24"/>
+          <w:szCs w:val="24"/>
+          <w:lang w:val="en-US"/>
+        </w:rPr>
+        <w:t xml:space="preserve"> the</w:t>
       </w:r>
     </w:p>
     <w:sectPr>

</xml_diff>

<commit_message>
Fixed some things in my files and continued the second part of my thesis.
</commit_message>
<xml_diff>
--- a/Project Thesis.docx
+++ b/Project Thesis.docx
@@ -5756,6 +5756,871 @@
           <w:lang w:val="en-US"/>
         </w:rPr>
         <w:t xml:space="preserve"> the</w:t>
+      </w:r>
+      <w:r>
+        <w:rPr>
+          <w:rFonts w:ascii="Arial" w:hAnsi="Arial" w:cs="Arial"/>
+          <w:sz w:val="24"/>
+          <w:szCs w:val="24"/>
+          <w:lang w:val="en-US"/>
+        </w:rPr>
+        <w:t xml:space="preserve"> Add Course function</w:t>
+      </w:r>
+      <w:r>
+        <w:rPr>
+          <w:rFonts w:ascii="Arial" w:hAnsi="Arial" w:cs="Arial"/>
+          <w:sz w:val="24"/>
+          <w:szCs w:val="24"/>
+          <w:lang w:val="en-US"/>
+        </w:rPr>
+        <w:t xml:space="preserve">, the system displays </w:t>
+      </w:r>
+      <w:r>
+        <w:rPr>
+          <w:rFonts w:ascii="Arial" w:hAnsi="Arial" w:cs="Arial"/>
+          <w:sz w:val="24"/>
+          <w:szCs w:val="24"/>
+          <w:lang w:val="en-US"/>
+        </w:rPr>
+        <w:t>a form containing</w:t>
+      </w:r>
+      <w:r>
+        <w:rPr>
+          <w:rFonts w:ascii="Arial" w:hAnsi="Arial" w:cs="Arial"/>
+          <w:sz w:val="24"/>
+          <w:szCs w:val="24"/>
+          <w:lang w:val="en-US"/>
+        </w:rPr>
+        <w:t xml:space="preserve"> fields for the</w:t>
+      </w:r>
+      <w:r>
+        <w:rPr>
+          <w:rFonts w:ascii="Arial" w:hAnsi="Arial" w:cs="Arial"/>
+          <w:sz w:val="24"/>
+          <w:szCs w:val="24"/>
+          <w:lang w:val="en-US"/>
+        </w:rPr>
+        <w:t xml:space="preserve"> course code</w:t>
+      </w:r>
+      <w:r>
+        <w:rPr>
+          <w:rFonts w:ascii="Arial" w:hAnsi="Arial" w:cs="Arial"/>
+          <w:sz w:val="24"/>
+          <w:szCs w:val="24"/>
+          <w:lang w:val="en-US"/>
+        </w:rPr>
+        <w:t>, course name</w:t>
+      </w:r>
+      <w:r>
+        <w:rPr>
+          <w:rFonts w:ascii="Arial" w:hAnsi="Arial" w:cs="Arial"/>
+          <w:sz w:val="24"/>
+          <w:szCs w:val="24"/>
+          <w:lang w:val="en-US"/>
+        </w:rPr>
+        <w:t>, credits, grade</w:t>
+      </w:r>
+      <w:r>
+        <w:rPr>
+          <w:rFonts w:ascii="Arial" w:hAnsi="Arial" w:cs="Arial"/>
+          <w:sz w:val="24"/>
+          <w:szCs w:val="24"/>
+          <w:lang w:val="en-US"/>
+        </w:rPr>
+        <w:t>, and semester</w:t>
+      </w:r>
+      <w:r>
+        <w:rPr>
+          <w:rFonts w:ascii="Arial" w:hAnsi="Arial" w:cs="Arial"/>
+          <w:sz w:val="24"/>
+          <w:szCs w:val="24"/>
+          <w:lang w:val="en-US"/>
+        </w:rPr>
+        <w:t>.</w:t>
+      </w:r>
+      <w:r>
+        <w:rPr>
+          <w:rFonts w:ascii="Arial" w:hAnsi="Arial" w:cs="Arial"/>
+          <w:sz w:val="24"/>
+          <w:szCs w:val="24"/>
+          <w:lang w:val="en-US"/>
+        </w:rPr>
+        <w:t xml:space="preserve"> The user enters or selects</w:t>
+      </w:r>
+      <w:r>
+        <w:rPr>
+          <w:rFonts w:ascii="Arial" w:hAnsi="Arial" w:cs="Arial"/>
+          <w:sz w:val="24"/>
+          <w:szCs w:val="24"/>
+          <w:lang w:val="en-US"/>
+        </w:rPr>
+        <w:t xml:space="preserve"> the necessary information</w:t>
+      </w:r>
+      <w:r>
+        <w:rPr>
+          <w:rFonts w:ascii="Arial" w:hAnsi="Arial" w:cs="Arial"/>
+          <w:sz w:val="24"/>
+          <w:szCs w:val="24"/>
+          <w:lang w:val="en-US"/>
+        </w:rPr>
+        <w:t xml:space="preserve"> and submits the form</w:t>
+      </w:r>
+      <w:r>
+        <w:rPr>
+          <w:rFonts w:ascii="Arial" w:hAnsi="Arial" w:cs="Arial"/>
+          <w:sz w:val="24"/>
+          <w:szCs w:val="24"/>
+          <w:lang w:val="en-US"/>
+        </w:rPr>
+        <w:t>.</w:t>
+      </w:r>
+    </w:p>
+    <w:p>
+      <w:pPr>
+        <w:spacing w:line="360" w:lineRule="auto"/>
+        <w:rPr>
+          <w:rFonts w:ascii="Arial" w:hAnsi="Arial" w:cs="Arial"/>
+          <w:sz w:val="24"/>
+          <w:szCs w:val="24"/>
+          <w:lang w:val="en-US"/>
+        </w:rPr>
+      </w:pPr>
+    </w:p>
+    <w:p>
+      <w:pPr>
+        <w:spacing w:line="360" w:lineRule="auto"/>
+        <w:rPr>
+          <w:rFonts w:ascii="Arial" w:hAnsi="Arial" w:cs="Arial"/>
+          <w:sz w:val="24"/>
+          <w:szCs w:val="24"/>
+          <w:lang w:val="en-US"/>
+        </w:rPr>
+      </w:pPr>
+      <w:r>
+        <w:rPr>
+          <w:rFonts w:ascii="Arial" w:hAnsi="Arial" w:cs="Arial"/>
+          <w:sz w:val="24"/>
+          <w:szCs w:val="24"/>
+          <w:lang w:val="en-US"/>
+        </w:rPr>
+        <w:t>Before the course is stored,</w:t>
+      </w:r>
+      <w:r>
+        <w:rPr>
+          <w:rFonts w:ascii="Arial" w:hAnsi="Arial" w:cs="Arial"/>
+          <w:sz w:val="24"/>
+          <w:szCs w:val="24"/>
+          <w:lang w:val="en-US"/>
+        </w:rPr>
+        <w:t xml:space="preserve"> the program validates</w:t>
+      </w:r>
+      <w:r>
+        <w:rPr>
+          <w:rFonts w:ascii="Arial" w:hAnsi="Arial" w:cs="Arial"/>
+          <w:sz w:val="24"/>
+          <w:szCs w:val="24"/>
+          <w:lang w:val="en-US"/>
+        </w:rPr>
+        <w:t xml:space="preserve"> the submitted data</w:t>
+      </w:r>
+      <w:r>
+        <w:rPr>
+          <w:rFonts w:ascii="Arial" w:hAnsi="Arial" w:cs="Arial"/>
+          <w:sz w:val="24"/>
+          <w:szCs w:val="24"/>
+          <w:lang w:val="en-US"/>
+        </w:rPr>
+        <w:t>. If validation fails</w:t>
+      </w:r>
+      <w:r>
+        <w:rPr>
+          <w:rFonts w:ascii="Arial" w:hAnsi="Arial" w:cs="Arial"/>
+          <w:sz w:val="24"/>
+          <w:szCs w:val="24"/>
+          <w:lang w:val="en-US"/>
+        </w:rPr>
+        <w:t>, the course is</w:t>
+      </w:r>
+      <w:r>
+        <w:rPr>
+          <w:rFonts w:ascii="Arial" w:hAnsi="Arial" w:cs="Arial"/>
+          <w:sz w:val="24"/>
+          <w:szCs w:val="24"/>
+          <w:lang w:val="en-US"/>
+        </w:rPr>
+        <w:t xml:space="preserve"> not </w:t>
+      </w:r>
+      <w:r>
+        <w:rPr>
+          <w:rFonts w:ascii="Arial" w:hAnsi="Arial" w:cs="Arial"/>
+          <w:sz w:val="24"/>
+          <w:szCs w:val="24"/>
+          <w:lang w:val="en-US"/>
+        </w:rPr>
+        <w:t>added,</w:t>
+      </w:r>
+      <w:r>
+        <w:rPr>
+          <w:rFonts w:ascii="Arial" w:hAnsi="Arial" w:cs="Arial"/>
+          <w:sz w:val="24"/>
+          <w:szCs w:val="24"/>
+          <w:lang w:val="en-US"/>
+        </w:rPr>
+        <w:t xml:space="preserve"> and the program displays</w:t>
+      </w:r>
+      <w:r>
+        <w:rPr>
+          <w:rFonts w:ascii="Arial" w:hAnsi="Arial" w:cs="Arial"/>
+          <w:sz w:val="24"/>
+          <w:szCs w:val="24"/>
+          <w:lang w:val="en-US"/>
+        </w:rPr>
+        <w:t xml:space="preserve"> an appropriate validation message.</w:t>
+      </w:r>
+      <w:r>
+        <w:rPr>
+          <w:rFonts w:ascii="Arial" w:hAnsi="Arial" w:cs="Arial"/>
+          <w:sz w:val="24"/>
+          <w:szCs w:val="24"/>
+          <w:lang w:val="en-US"/>
+        </w:rPr>
+        <w:t xml:space="preserve"> If all</w:t>
+      </w:r>
+      <w:r>
+        <w:rPr>
+          <w:rFonts w:ascii="Arial" w:hAnsi="Arial" w:cs="Arial"/>
+          <w:sz w:val="24"/>
+          <w:szCs w:val="24"/>
+          <w:lang w:val="en-US"/>
+        </w:rPr>
+        <w:t xml:space="preserve"> information is valid</w:t>
+      </w:r>
+      <w:r>
+        <w:rPr>
+          <w:rFonts w:ascii="Arial" w:hAnsi="Arial" w:cs="Arial"/>
+          <w:sz w:val="24"/>
+          <w:szCs w:val="24"/>
+          <w:lang w:val="en-US"/>
+        </w:rPr>
+        <w:t>, a new Course</w:t>
+      </w:r>
+      <w:r>
+        <w:rPr>
+          <w:rFonts w:ascii="Arial" w:hAnsi="Arial" w:cs="Arial"/>
+          <w:sz w:val="24"/>
+          <w:szCs w:val="24"/>
+          <w:lang w:val="en-US"/>
+        </w:rPr>
+        <w:t xml:space="preserve"> object is created</w:t>
+      </w:r>
+      <w:r>
+        <w:rPr>
+          <w:rFonts w:ascii="Arial" w:hAnsi="Arial" w:cs="Arial"/>
+          <w:sz w:val="24"/>
+          <w:szCs w:val="24"/>
+          <w:lang w:val="en-US"/>
+        </w:rPr>
+        <w:t>, stored by the program</w:t>
+      </w:r>
+      <w:r>
+        <w:rPr>
+          <w:rFonts w:ascii="Arial" w:hAnsi="Arial" w:cs="Arial"/>
+          <w:sz w:val="24"/>
+          <w:szCs w:val="24"/>
+          <w:lang w:val="en-US"/>
+        </w:rPr>
+        <w:t>, and displayed in the course list.</w:t>
+      </w:r>
+    </w:p>
+    <w:p>
+      <w:pPr>
+        <w:spacing w:line="360" w:lineRule="auto"/>
+        <w:rPr>
+          <w:rFonts w:ascii="Arial" w:hAnsi="Arial" w:cs="Arial"/>
+          <w:sz w:val="24"/>
+          <w:szCs w:val="24"/>
+          <w:lang w:val="en-US"/>
+        </w:rPr>
+      </w:pPr>
+    </w:p>
+    <w:p>
+      <w:pPr>
+        <w:spacing w:line="360" w:lineRule="auto"/>
+        <w:rPr>
+          <w:rFonts w:ascii="Arial" w:hAnsi="Arial" w:cs="Arial"/>
+          <w:sz w:val="24"/>
+          <w:szCs w:val="24"/>
+          <w:lang w:val="en-US"/>
+        </w:rPr>
+      </w:pPr>
+      <w:r>
+        <w:rPr>
+          <w:rFonts w:ascii="Arial" w:hAnsi="Arial" w:cs="Arial"/>
+          <w:sz w:val="24"/>
+          <w:szCs w:val="24"/>
+          <w:lang w:val="en-US"/>
+        </w:rPr>
+        <w:lastRenderedPageBreak/>
+        <w:t>FUNCTION AddCourse</w:t>
+      </w:r>
+    </w:p>
+    <w:p>
+      <w:pPr>
+        <w:spacing w:line="360" w:lineRule="auto"/>
+        <w:rPr>
+          <w:rFonts w:ascii="Arial" w:hAnsi="Arial" w:cs="Arial"/>
+          <w:sz w:val="24"/>
+          <w:szCs w:val="24"/>
+          <w:lang w:val="en-US"/>
+        </w:rPr>
+      </w:pPr>
+    </w:p>
+    <w:p>
+      <w:pPr>
+        <w:spacing w:line="360" w:lineRule="auto"/>
+        <w:rPr>
+          <w:rFonts w:ascii="Arial" w:hAnsi="Arial" w:cs="Arial"/>
+          <w:sz w:val="24"/>
+          <w:szCs w:val="24"/>
+          <w:lang w:val="en-US"/>
+        </w:rPr>
+      </w:pPr>
+      <w:r>
+        <w:rPr>
+          <w:rFonts w:ascii="Arial" w:hAnsi="Arial" w:cs="Arial"/>
+          <w:sz w:val="24"/>
+          <w:szCs w:val="24"/>
+          <w:lang w:val="en-US"/>
+        </w:rPr>
+        <w:t>DISPLAY Add Course form</w:t>
+      </w:r>
+    </w:p>
+    <w:p>
+      <w:pPr>
+        <w:spacing w:line="360" w:lineRule="auto"/>
+        <w:rPr>
+          <w:rFonts w:ascii="Arial" w:hAnsi="Arial" w:cs="Arial"/>
+          <w:sz w:val="24"/>
+          <w:szCs w:val="24"/>
+          <w:lang w:val="en-US"/>
+        </w:rPr>
+      </w:pPr>
+    </w:p>
+    <w:p>
+      <w:pPr>
+        <w:spacing w:line="360" w:lineRule="auto"/>
+        <w:rPr>
+          <w:rFonts w:ascii="Arial" w:hAnsi="Arial" w:cs="Arial"/>
+          <w:sz w:val="24"/>
+          <w:szCs w:val="24"/>
+          <w:lang w:val="en-US"/>
+        </w:rPr>
+      </w:pPr>
+      <w:r>
+        <w:rPr>
+          <w:rFonts w:ascii="Arial" w:hAnsi="Arial" w:cs="Arial"/>
+          <w:sz w:val="24"/>
+          <w:szCs w:val="24"/>
+          <w:lang w:val="en-US"/>
+        </w:rPr>
+        <w:t>READ course code</w:t>
+      </w:r>
+    </w:p>
+    <w:p>
+      <w:pPr>
+        <w:spacing w:line="360" w:lineRule="auto"/>
+        <w:rPr>
+          <w:rFonts w:ascii="Arial" w:hAnsi="Arial" w:cs="Arial"/>
+          <w:sz w:val="24"/>
+          <w:szCs w:val="24"/>
+          <w:lang w:val="en-US"/>
+        </w:rPr>
+      </w:pPr>
+    </w:p>
+    <w:p>
+      <w:pPr>
+        <w:spacing w:line="360" w:lineRule="auto"/>
+        <w:rPr>
+          <w:rFonts w:ascii="Arial" w:hAnsi="Arial" w:cs="Arial"/>
+          <w:sz w:val="24"/>
+          <w:szCs w:val="24"/>
+          <w:lang w:val="en-US"/>
+        </w:rPr>
+      </w:pPr>
+      <w:r>
+        <w:rPr>
+          <w:rFonts w:ascii="Arial" w:hAnsi="Arial" w:cs="Arial"/>
+          <w:sz w:val="24"/>
+          <w:szCs w:val="24"/>
+          <w:lang w:val="en-US"/>
+        </w:rPr>
+        <w:t>READ course name</w:t>
+      </w:r>
+    </w:p>
+    <w:p>
+      <w:pPr>
+        <w:spacing w:line="360" w:lineRule="auto"/>
+        <w:rPr>
+          <w:rFonts w:ascii="Arial" w:hAnsi="Arial" w:cs="Arial"/>
+          <w:sz w:val="24"/>
+          <w:szCs w:val="24"/>
+          <w:lang w:val="en-US"/>
+        </w:rPr>
+      </w:pPr>
+    </w:p>
+    <w:p>
+      <w:pPr>
+        <w:spacing w:line="360" w:lineRule="auto"/>
+        <w:rPr>
+          <w:rFonts w:ascii="Arial" w:hAnsi="Arial" w:cs="Arial"/>
+          <w:sz w:val="24"/>
+          <w:szCs w:val="24"/>
+          <w:lang w:val="en-US"/>
+        </w:rPr>
+      </w:pPr>
+      <w:r>
+        <w:rPr>
+          <w:rFonts w:ascii="Arial" w:hAnsi="Arial" w:cs="Arial"/>
+          <w:sz w:val="24"/>
+          <w:szCs w:val="24"/>
+          <w:lang w:val="en-US"/>
+        </w:rPr>
+        <w:t>READ credits</w:t>
+      </w:r>
+    </w:p>
+    <w:p>
+      <w:pPr>
+        <w:spacing w:line="360" w:lineRule="auto"/>
+        <w:rPr>
+          <w:rFonts w:ascii="Arial" w:hAnsi="Arial" w:cs="Arial"/>
+          <w:sz w:val="24"/>
+          <w:szCs w:val="24"/>
+          <w:lang w:val="en-US"/>
+        </w:rPr>
+      </w:pPr>
+    </w:p>
+    <w:p>
+      <w:pPr>
+        <w:spacing w:line="360" w:lineRule="auto"/>
+        <w:rPr>
+          <w:rFonts w:ascii="Arial" w:hAnsi="Arial" w:cs="Arial"/>
+          <w:sz w:val="24"/>
+          <w:szCs w:val="24"/>
+          <w:lang w:val="en-US"/>
+        </w:rPr>
+      </w:pPr>
+      <w:r>
+        <w:rPr>
+          <w:rFonts w:ascii="Arial" w:hAnsi="Arial" w:cs="Arial"/>
+          <w:sz w:val="24"/>
+          <w:szCs w:val="24"/>
+          <w:lang w:val="en-US"/>
+        </w:rPr>
+        <w:t>READ grade</w:t>
+      </w:r>
+    </w:p>
+    <w:p>
+      <w:pPr>
+        <w:spacing w:line="360" w:lineRule="auto"/>
+        <w:rPr>
+          <w:rFonts w:ascii="Arial" w:hAnsi="Arial" w:cs="Arial"/>
+          <w:sz w:val="24"/>
+          <w:szCs w:val="24"/>
+          <w:lang w:val="en-US"/>
+        </w:rPr>
+      </w:pPr>
+    </w:p>
+    <w:p>
+      <w:pPr>
+        <w:spacing w:line="360" w:lineRule="auto"/>
+        <w:rPr>
+          <w:rFonts w:ascii="Arial" w:hAnsi="Arial" w:cs="Arial"/>
+          <w:sz w:val="24"/>
+          <w:szCs w:val="24"/>
+          <w:lang w:val="en-US"/>
+        </w:rPr>
+      </w:pPr>
+      <w:r>
+        <w:rPr>
+          <w:rFonts w:ascii="Arial" w:hAnsi="Arial" w:cs="Arial"/>
+          <w:sz w:val="24"/>
+          <w:szCs w:val="24"/>
+          <w:lang w:val="en-US"/>
+        </w:rPr>
+        <w:t>READ semester</w:t>
+      </w:r>
+    </w:p>
+    <w:p>
+      <w:pPr>
+        <w:spacing w:line="360" w:lineRule="auto"/>
+        <w:rPr>
+          <w:rFonts w:ascii="Arial" w:hAnsi="Arial" w:cs="Arial"/>
+          <w:sz w:val="24"/>
+          <w:szCs w:val="24"/>
+          <w:lang w:val="en-US"/>
+        </w:rPr>
+      </w:pPr>
+    </w:p>
+    <w:p>
+      <w:pPr>
+        <w:spacing w:line="360" w:lineRule="auto"/>
+        <w:rPr>
+          <w:rFonts w:ascii="Arial" w:hAnsi="Arial" w:cs="Arial"/>
+          <w:sz w:val="24"/>
+          <w:szCs w:val="24"/>
+          <w:lang w:val="en-US"/>
+        </w:rPr>
+      </w:pPr>
+      <w:r>
+        <w:rPr>
+          <w:rFonts w:ascii="Arial" w:hAnsi="Arial" w:cs="Arial"/>
+          <w:sz w:val="24"/>
+          <w:szCs w:val="24"/>
+          <w:lang w:val="en-US"/>
+        </w:rPr>
+        <w:t>IF course code is empty</w:t>
+      </w:r>
+    </w:p>
+    <w:p>
+      <w:pPr>
+        <w:spacing w:line="360" w:lineRule="auto"/>
+        <w:rPr>
+          <w:rFonts w:ascii="Arial" w:hAnsi="Arial" w:cs="Arial"/>
+          <w:sz w:val="24"/>
+          <w:szCs w:val="24"/>
+          <w:lang w:val="en-US"/>
+        </w:rPr>
+      </w:pPr>
+    </w:p>
+    <w:p>
+      <w:pPr>
+        <w:spacing w:line="360" w:lineRule="auto"/>
+        <w:rPr>
+          <w:rFonts w:ascii="Arial" w:hAnsi="Arial" w:cs="Arial"/>
+          <w:sz w:val="24"/>
+          <w:szCs w:val="24"/>
+          <w:lang w:val="en-US"/>
+        </w:rPr>
+      </w:pPr>
+      <w:r>
+        <w:rPr>
+          <w:rFonts w:ascii="Arial" w:hAnsi="Arial" w:cs="Arial"/>
+          <w:sz w:val="24"/>
+          <w:szCs w:val="24"/>
+          <w:lang w:val="en-US"/>
+        </w:rPr>
+        <w:t>DISPLAY validation error</w:t>
+      </w:r>
+    </w:p>
+    <w:p>
+      <w:pPr>
+        <w:spacing w:line="360" w:lineRule="auto"/>
+        <w:rPr>
+          <w:rFonts w:ascii="Arial" w:hAnsi="Arial" w:cs="Arial"/>
+          <w:sz w:val="24"/>
+          <w:szCs w:val="24"/>
+          <w:lang w:val="en-US"/>
+        </w:rPr>
+      </w:pPr>
+    </w:p>
+    <w:p>
+      <w:pPr>
+        <w:spacing w:line="360" w:lineRule="auto"/>
+        <w:rPr>
+          <w:rFonts w:ascii="Arial" w:hAnsi="Arial" w:cs="Arial"/>
+          <w:sz w:val="24"/>
+          <w:szCs w:val="24"/>
+          <w:lang w:val="en-US"/>
+        </w:rPr>
+      </w:pPr>
+      <w:r>
+        <w:rPr>
+          <w:rFonts w:ascii="Arial" w:hAnsi="Arial" w:cs="Arial"/>
+          <w:sz w:val="24"/>
+          <w:szCs w:val="24"/>
+          <w:lang w:val="en-US"/>
+        </w:rPr>
+        <w:t>STOP</w:t>
+      </w:r>
+    </w:p>
+    <w:p>
+      <w:pPr>
+        <w:spacing w:line="360" w:lineRule="auto"/>
+        <w:rPr>
+          <w:rFonts w:ascii="Arial" w:hAnsi="Arial" w:cs="Arial"/>
+          <w:sz w:val="24"/>
+          <w:szCs w:val="24"/>
+          <w:lang w:val="en-US"/>
+        </w:rPr>
+      </w:pPr>
+    </w:p>
+    <w:p>
+      <w:pPr>
+        <w:spacing w:line="360" w:lineRule="auto"/>
+        <w:rPr>
+          <w:rFonts w:ascii="Arial" w:hAnsi="Arial" w:cs="Arial"/>
+          <w:sz w:val="24"/>
+          <w:szCs w:val="24"/>
+          <w:lang w:val="en-US"/>
+        </w:rPr>
+      </w:pPr>
+      <w:r>
+        <w:rPr>
+          <w:rFonts w:ascii="Arial" w:hAnsi="Arial" w:cs="Arial"/>
+          <w:sz w:val="24"/>
+          <w:szCs w:val="24"/>
+          <w:lang w:val="en-US"/>
+        </w:rPr>
+        <w:t>END IF</w:t>
+      </w:r>
+    </w:p>
+    <w:p>
+      <w:pPr>
+        <w:spacing w:line="360" w:lineRule="auto"/>
+        <w:rPr>
+          <w:rFonts w:ascii="Arial" w:hAnsi="Arial" w:cs="Arial"/>
+          <w:sz w:val="24"/>
+          <w:szCs w:val="24"/>
+          <w:lang w:val="en-US"/>
+        </w:rPr>
+      </w:pPr>
+    </w:p>
+    <w:p>
+      <w:pPr>
+        <w:spacing w:line="360" w:lineRule="auto"/>
+        <w:rPr>
+          <w:rFonts w:ascii="Arial" w:hAnsi="Arial" w:cs="Arial"/>
+          <w:sz w:val="24"/>
+          <w:szCs w:val="24"/>
+          <w:lang w:val="en-US"/>
+        </w:rPr>
+      </w:pPr>
+      <w:r>
+        <w:rPr>
+          <w:rFonts w:ascii="Arial" w:hAnsi="Arial" w:cs="Arial"/>
+          <w:sz w:val="24"/>
+          <w:szCs w:val="24"/>
+          <w:lang w:val="en-US"/>
+        </w:rPr>
+        <w:t>IF course name is empty</w:t>
+      </w:r>
+    </w:p>
+    <w:p>
+      <w:pPr>
+        <w:spacing w:line="360" w:lineRule="auto"/>
+        <w:rPr>
+          <w:rFonts w:ascii="Arial" w:hAnsi="Arial" w:cs="Arial"/>
+          <w:sz w:val="24"/>
+          <w:szCs w:val="24"/>
+          <w:lang w:val="en-US"/>
+        </w:rPr>
+      </w:pPr>
+    </w:p>
+    <w:p>
+      <w:pPr>
+        <w:spacing w:line="360" w:lineRule="auto"/>
+        <w:rPr>
+          <w:rFonts w:ascii="Arial" w:hAnsi="Arial" w:cs="Arial"/>
+          <w:sz w:val="24"/>
+          <w:szCs w:val="24"/>
+          <w:lang w:val="en-US"/>
+        </w:rPr>
+      </w:pPr>
+      <w:r>
+        <w:rPr>
+          <w:rFonts w:ascii="Arial" w:hAnsi="Arial" w:cs="Arial"/>
+          <w:sz w:val="24"/>
+          <w:szCs w:val="24"/>
+          <w:lang w:val="en-US"/>
+        </w:rPr>
+        <w:lastRenderedPageBreak/>
+        <w:t>DISPLAY validation error</w:t>
+      </w:r>
+    </w:p>
+    <w:p>
+      <w:pPr>
+        <w:spacing w:line="360" w:lineRule="auto"/>
+        <w:rPr>
+          <w:rFonts w:ascii="Arial" w:hAnsi="Arial" w:cs="Arial"/>
+          <w:sz w:val="24"/>
+          <w:szCs w:val="24"/>
+          <w:lang w:val="en-US"/>
+        </w:rPr>
+      </w:pPr>
+    </w:p>
+    <w:p>
+      <w:pPr>
+        <w:spacing w:line="360" w:lineRule="auto"/>
+        <w:rPr>
+          <w:rFonts w:ascii="Arial" w:hAnsi="Arial" w:cs="Arial"/>
+          <w:sz w:val="24"/>
+          <w:szCs w:val="24"/>
+          <w:lang w:val="en-US"/>
+        </w:rPr>
+      </w:pPr>
+      <w:r>
+        <w:rPr>
+          <w:rFonts w:ascii="Arial" w:hAnsi="Arial" w:cs="Arial"/>
+          <w:sz w:val="24"/>
+          <w:szCs w:val="24"/>
+          <w:lang w:val="en-US"/>
+        </w:rPr>
+        <w:t>STOP</w:t>
+      </w:r>
+    </w:p>
+    <w:p>
+      <w:pPr>
+        <w:spacing w:line="360" w:lineRule="auto"/>
+        <w:rPr>
+          <w:rFonts w:ascii="Arial" w:hAnsi="Arial" w:cs="Arial"/>
+          <w:sz w:val="24"/>
+          <w:szCs w:val="24"/>
+          <w:lang w:val="en-US"/>
+        </w:rPr>
+      </w:pPr>
+    </w:p>
+    <w:p>
+      <w:pPr>
+        <w:spacing w:line="360" w:lineRule="auto"/>
+        <w:rPr>
+          <w:rFonts w:ascii="Arial" w:hAnsi="Arial" w:cs="Arial"/>
+          <w:sz w:val="24"/>
+          <w:szCs w:val="24"/>
+          <w:lang w:val="en-US"/>
+        </w:rPr>
+      </w:pPr>
+      <w:r>
+        <w:rPr>
+          <w:rFonts w:ascii="Arial" w:hAnsi="Arial" w:cs="Arial"/>
+          <w:sz w:val="24"/>
+          <w:szCs w:val="24"/>
+          <w:lang w:val="en-US"/>
+        </w:rPr>
+        <w:t>END IF</w:t>
+      </w:r>
+    </w:p>
+    <w:p>
+      <w:pPr>
+        <w:spacing w:line="360" w:lineRule="auto"/>
+        <w:rPr>
+          <w:rFonts w:ascii="Arial" w:hAnsi="Arial" w:cs="Arial"/>
+          <w:sz w:val="24"/>
+          <w:szCs w:val="24"/>
+          <w:lang w:val="en-US"/>
+        </w:rPr>
+      </w:pPr>
+    </w:p>
+    <w:p>
+      <w:pPr>
+        <w:spacing w:line="360" w:lineRule="auto"/>
+        <w:rPr>
+          <w:rFonts w:ascii="Arial" w:hAnsi="Arial" w:cs="Arial"/>
+          <w:sz w:val="24"/>
+          <w:szCs w:val="24"/>
+          <w:lang w:val="en-US"/>
+        </w:rPr>
+      </w:pPr>
+      <w:r>
+        <w:rPr>
+          <w:rFonts w:ascii="Arial" w:hAnsi="Arial" w:cs="Arial"/>
+          <w:sz w:val="24"/>
+          <w:szCs w:val="24"/>
+          <w:lang w:val="en-US"/>
+        </w:rPr>
+        <w:t>IF credits are outside the valid range</w:t>
+      </w:r>
+    </w:p>
+    <w:p>
+      <w:pPr>
+        <w:spacing w:line="360" w:lineRule="auto"/>
+        <w:rPr>
+          <w:rFonts w:ascii="Arial" w:hAnsi="Arial" w:cs="Arial"/>
+          <w:sz w:val="24"/>
+          <w:szCs w:val="24"/>
+          <w:lang w:val="en-US"/>
+        </w:rPr>
+      </w:pPr>
+    </w:p>
+    <w:p>
+      <w:pPr>
+        <w:spacing w:line="360" w:lineRule="auto"/>
+        <w:rPr>
+          <w:rFonts w:ascii="Arial" w:hAnsi="Arial" w:cs="Arial"/>
+          <w:sz w:val="24"/>
+          <w:szCs w:val="24"/>
+          <w:lang w:val="en-US"/>
+        </w:rPr>
+      </w:pPr>
+      <w:r>
+        <w:rPr>
+          <w:rFonts w:ascii="Arial" w:hAnsi="Arial" w:cs="Arial"/>
+          <w:sz w:val="24"/>
+          <w:szCs w:val="24"/>
+          <w:lang w:val="en-US"/>
+        </w:rPr>
+        <w:t>DISPLAY validation error</w:t>
+      </w:r>
+    </w:p>
+    <w:p>
+      <w:pPr>
+        <w:spacing w:line="360" w:lineRule="auto"/>
+        <w:rPr>
+          <w:rFonts w:ascii="Arial" w:hAnsi="Arial" w:cs="Arial"/>
+          <w:sz w:val="24"/>
+          <w:szCs w:val="24"/>
+          <w:lang w:val="en-US"/>
+        </w:rPr>
+      </w:pPr>
+    </w:p>
+    <w:p>
+      <w:pPr>
+        <w:spacing w:line="360" w:lineRule="auto"/>
+        <w:rPr>
+          <w:rFonts w:ascii="Arial" w:hAnsi="Arial" w:cs="Arial"/>
+          <w:sz w:val="24"/>
+          <w:szCs w:val="24"/>
+          <w:lang w:val="en-US"/>
+        </w:rPr>
+      </w:pPr>
+      <w:r>
+        <w:rPr>
+          <w:rFonts w:ascii="Arial" w:hAnsi="Arial" w:cs="Arial"/>
+          <w:sz w:val="24"/>
+          <w:szCs w:val="24"/>
+          <w:lang w:val="en-US"/>
+        </w:rPr>
+        <w:t>STOP</w:t>
+      </w:r>
+    </w:p>
+    <w:p>
+      <w:pPr>
+        <w:spacing w:line="360" w:lineRule="auto"/>
+        <w:rPr>
+          <w:rFonts w:ascii="Arial" w:hAnsi="Arial" w:cs="Arial"/>
+          <w:sz w:val="24"/>
+          <w:szCs w:val="24"/>
+          <w:lang w:val="en-US"/>
+        </w:rPr>
+      </w:pPr>
+    </w:p>
+    <w:p>
+      <w:pPr>
+        <w:spacing w:line="360" w:lineRule="auto"/>
+        <w:rPr>
+          <w:rFonts w:ascii="Arial" w:hAnsi="Arial" w:cs="Arial"/>
+          <w:sz w:val="24"/>
+          <w:szCs w:val="24"/>
+          <w:lang w:val="en-US"/>
+        </w:rPr>
+      </w:pPr>
+      <w:r>
+        <w:rPr>
+          <w:rFonts w:ascii="Arial" w:hAnsi="Arial" w:cs="Arial"/>
+          <w:sz w:val="24"/>
+          <w:szCs w:val="24"/>
+          <w:lang w:val="en-US"/>
+        </w:rPr>
+        <w:t>END IF</w:t>
       </w:r>
     </w:p>
     <w:sectPr>

</xml_diff>

<commit_message>
Keep on working on the second part of my thesis.
</commit_message>
<xml_diff>
--- a/Project Thesis.docx
+++ b/Project Thesis.docx
@@ -6092,6 +6092,15 @@
           <w:szCs w:val="24"/>
           <w:lang w:val="en-US"/>
         </w:rPr>
+        <w:t xml:space="preserve">   </w:t>
+      </w:r>
+      <w:r>
+        <w:rPr>
+          <w:rFonts w:ascii="Arial" w:hAnsi="Arial" w:cs="Arial"/>
+          <w:sz w:val="24"/>
+          <w:szCs w:val="24"/>
+          <w:lang w:val="en-US"/>
+        </w:rPr>
         <w:t>DISPLAY Add Course form</w:t>
       </w:r>
     </w:p>
@@ -6123,6 +6132,15 @@
           <w:szCs w:val="24"/>
           <w:lang w:val="en-US"/>
         </w:rPr>
+        <w:t xml:space="preserve">   </w:t>
+      </w:r>
+      <w:r>
+        <w:rPr>
+          <w:rFonts w:ascii="Arial" w:hAnsi="Arial" w:cs="Arial"/>
+          <w:sz w:val="24"/>
+          <w:szCs w:val="24"/>
+          <w:lang w:val="en-US"/>
+        </w:rPr>
         <w:t>READ course code</w:t>
       </w:r>
     </w:p>
@@ -6136,17 +6154,15 @@
           <w:lang w:val="en-US"/>
         </w:rPr>
       </w:pPr>
-    </w:p>
-    <w:p>
-      <w:pPr>
-        <w:spacing w:line="360" w:lineRule="auto"/>
-        <w:rPr>
-          <w:rFonts w:ascii="Arial" w:hAnsi="Arial" w:cs="Arial"/>
-          <w:sz w:val="24"/>
-          <w:szCs w:val="24"/>
-          <w:lang w:val="en-US"/>
-        </w:rPr>
-      </w:pPr>
+      <w:r>
+        <w:rPr>
+          <w:rFonts w:ascii="Arial" w:hAnsi="Arial" w:cs="Arial"/>
+          <w:sz w:val="24"/>
+          <w:szCs w:val="24"/>
+          <w:lang w:val="en-US"/>
+        </w:rPr>
+        <w:t xml:space="preserve">   </w:t>
+      </w:r>
       <w:r>
         <w:rPr>
           <w:rFonts w:ascii="Arial" w:hAnsi="Arial" w:cs="Arial"/>
@@ -6167,17 +6183,15 @@
           <w:lang w:val="en-US"/>
         </w:rPr>
       </w:pPr>
-    </w:p>
-    <w:p>
-      <w:pPr>
-        <w:spacing w:line="360" w:lineRule="auto"/>
-        <w:rPr>
-          <w:rFonts w:ascii="Arial" w:hAnsi="Arial" w:cs="Arial"/>
-          <w:sz w:val="24"/>
-          <w:szCs w:val="24"/>
-          <w:lang w:val="en-US"/>
-        </w:rPr>
-      </w:pPr>
+      <w:r>
+        <w:rPr>
+          <w:rFonts w:ascii="Arial" w:hAnsi="Arial" w:cs="Arial"/>
+          <w:sz w:val="24"/>
+          <w:szCs w:val="24"/>
+          <w:lang w:val="en-US"/>
+        </w:rPr>
+        <w:t xml:space="preserve">   </w:t>
+      </w:r>
       <w:r>
         <w:rPr>
           <w:rFonts w:ascii="Arial" w:hAnsi="Arial" w:cs="Arial"/>
@@ -6198,17 +6212,15 @@
           <w:lang w:val="en-US"/>
         </w:rPr>
       </w:pPr>
-    </w:p>
-    <w:p>
-      <w:pPr>
-        <w:spacing w:line="360" w:lineRule="auto"/>
-        <w:rPr>
-          <w:rFonts w:ascii="Arial" w:hAnsi="Arial" w:cs="Arial"/>
-          <w:sz w:val="24"/>
-          <w:szCs w:val="24"/>
-          <w:lang w:val="en-US"/>
-        </w:rPr>
-      </w:pPr>
+      <w:r>
+        <w:rPr>
+          <w:rFonts w:ascii="Arial" w:hAnsi="Arial" w:cs="Arial"/>
+          <w:sz w:val="24"/>
+          <w:szCs w:val="24"/>
+          <w:lang w:val="en-US"/>
+        </w:rPr>
+        <w:t xml:space="preserve">   </w:t>
+      </w:r>
       <w:r>
         <w:rPr>
           <w:rFonts w:ascii="Arial" w:hAnsi="Arial" w:cs="Arial"/>
@@ -6229,17 +6241,15 @@
           <w:lang w:val="en-US"/>
         </w:rPr>
       </w:pPr>
-    </w:p>
-    <w:p>
-      <w:pPr>
-        <w:spacing w:line="360" w:lineRule="auto"/>
-        <w:rPr>
-          <w:rFonts w:ascii="Arial" w:hAnsi="Arial" w:cs="Arial"/>
-          <w:sz w:val="24"/>
-          <w:szCs w:val="24"/>
-          <w:lang w:val="en-US"/>
-        </w:rPr>
-      </w:pPr>
+      <w:r>
+        <w:rPr>
+          <w:rFonts w:ascii="Arial" w:hAnsi="Arial" w:cs="Arial"/>
+          <w:sz w:val="24"/>
+          <w:szCs w:val="24"/>
+          <w:lang w:val="en-US"/>
+        </w:rPr>
+        <w:t xml:space="preserve">   </w:t>
+      </w:r>
       <w:r>
         <w:rPr>
           <w:rFonts w:ascii="Arial" w:hAnsi="Arial" w:cs="Arial"/>
@@ -6278,6 +6288,15 @@
           <w:szCs w:val="24"/>
           <w:lang w:val="en-US"/>
         </w:rPr>
+        <w:t xml:space="preserve">   </w:t>
+      </w:r>
+      <w:r>
+        <w:rPr>
+          <w:rFonts w:ascii="Arial" w:hAnsi="Arial" w:cs="Arial"/>
+          <w:sz w:val="24"/>
+          <w:szCs w:val="24"/>
+          <w:lang w:val="en-US"/>
+        </w:rPr>
         <w:t>IF course code is empty</w:t>
       </w:r>
     </w:p>
@@ -6291,17 +6310,15 @@
           <w:lang w:val="en-US"/>
         </w:rPr>
       </w:pPr>
-    </w:p>
-    <w:p>
-      <w:pPr>
-        <w:spacing w:line="360" w:lineRule="auto"/>
-        <w:rPr>
-          <w:rFonts w:ascii="Arial" w:hAnsi="Arial" w:cs="Arial"/>
-          <w:sz w:val="24"/>
-          <w:szCs w:val="24"/>
-          <w:lang w:val="en-US"/>
-        </w:rPr>
-      </w:pPr>
+      <w:r>
+        <w:rPr>
+          <w:rFonts w:ascii="Arial" w:hAnsi="Arial" w:cs="Arial"/>
+          <w:sz w:val="24"/>
+          <w:szCs w:val="24"/>
+          <w:lang w:val="en-US"/>
+        </w:rPr>
+        <w:t xml:space="preserve">      </w:t>
+      </w:r>
       <w:r>
         <w:rPr>
           <w:rFonts w:ascii="Arial" w:hAnsi="Arial" w:cs="Arial"/>
@@ -6322,17 +6339,15 @@
           <w:lang w:val="en-US"/>
         </w:rPr>
       </w:pPr>
-    </w:p>
-    <w:p>
-      <w:pPr>
-        <w:spacing w:line="360" w:lineRule="auto"/>
-        <w:rPr>
-          <w:rFonts w:ascii="Arial" w:hAnsi="Arial" w:cs="Arial"/>
-          <w:sz w:val="24"/>
-          <w:szCs w:val="24"/>
-          <w:lang w:val="en-US"/>
-        </w:rPr>
-      </w:pPr>
+      <w:r>
+        <w:rPr>
+          <w:rFonts w:ascii="Arial" w:hAnsi="Arial" w:cs="Arial"/>
+          <w:sz w:val="24"/>
+          <w:szCs w:val="24"/>
+          <w:lang w:val="en-US"/>
+        </w:rPr>
+        <w:t xml:space="preserve">      </w:t>
+      </w:r>
       <w:r>
         <w:rPr>
           <w:rFonts w:ascii="Arial" w:hAnsi="Arial" w:cs="Arial"/>
@@ -6353,17 +6368,15 @@
           <w:lang w:val="en-US"/>
         </w:rPr>
       </w:pPr>
-    </w:p>
-    <w:p>
-      <w:pPr>
-        <w:spacing w:line="360" w:lineRule="auto"/>
-        <w:rPr>
-          <w:rFonts w:ascii="Arial" w:hAnsi="Arial" w:cs="Arial"/>
-          <w:sz w:val="24"/>
-          <w:szCs w:val="24"/>
-          <w:lang w:val="en-US"/>
-        </w:rPr>
-      </w:pPr>
+      <w:r>
+        <w:rPr>
+          <w:rFonts w:ascii="Arial" w:hAnsi="Arial" w:cs="Arial"/>
+          <w:sz w:val="24"/>
+          <w:szCs w:val="24"/>
+          <w:lang w:val="en-US"/>
+        </w:rPr>
+        <w:t xml:space="preserve">   </w:t>
+      </w:r>
       <w:r>
         <w:rPr>
           <w:rFonts w:ascii="Arial" w:hAnsi="Arial" w:cs="Arial"/>
@@ -6402,6 +6415,15 @@
           <w:szCs w:val="24"/>
           <w:lang w:val="en-US"/>
         </w:rPr>
+        <w:t xml:space="preserve">   </w:t>
+      </w:r>
+      <w:r>
+        <w:rPr>
+          <w:rFonts w:ascii="Arial" w:hAnsi="Arial" w:cs="Arial"/>
+          <w:sz w:val="24"/>
+          <w:szCs w:val="24"/>
+          <w:lang w:val="en-US"/>
+        </w:rPr>
         <w:t>IF course name is empty</w:t>
       </w:r>
     </w:p>
@@ -6415,6 +6437,752 @@
           <w:lang w:val="en-US"/>
         </w:rPr>
       </w:pPr>
+      <w:r>
+        <w:rPr>
+          <w:rFonts w:ascii="Arial" w:hAnsi="Arial" w:cs="Arial"/>
+          <w:sz w:val="24"/>
+          <w:szCs w:val="24"/>
+          <w:lang w:val="en-US"/>
+        </w:rPr>
+        <w:t xml:space="preserve">      </w:t>
+      </w:r>
+      <w:r>
+        <w:rPr>
+          <w:rFonts w:ascii="Arial" w:hAnsi="Arial" w:cs="Arial"/>
+          <w:sz w:val="24"/>
+          <w:szCs w:val="24"/>
+          <w:lang w:val="en-US"/>
+        </w:rPr>
+        <w:t>DISPLAY validation error</w:t>
+      </w:r>
+    </w:p>
+    <w:p>
+      <w:pPr>
+        <w:spacing w:line="360" w:lineRule="auto"/>
+        <w:rPr>
+          <w:rFonts w:ascii="Arial" w:hAnsi="Arial" w:cs="Arial"/>
+          <w:sz w:val="24"/>
+          <w:szCs w:val="24"/>
+          <w:lang w:val="en-US"/>
+        </w:rPr>
+      </w:pPr>
+      <w:r>
+        <w:rPr>
+          <w:rFonts w:ascii="Arial" w:hAnsi="Arial" w:cs="Arial"/>
+          <w:sz w:val="24"/>
+          <w:szCs w:val="24"/>
+          <w:lang w:val="en-US"/>
+        </w:rPr>
+        <w:t xml:space="preserve">      </w:t>
+      </w:r>
+      <w:r>
+        <w:rPr>
+          <w:rFonts w:ascii="Arial" w:hAnsi="Arial" w:cs="Arial"/>
+          <w:sz w:val="24"/>
+          <w:szCs w:val="24"/>
+          <w:lang w:val="en-US"/>
+        </w:rPr>
+        <w:t>STOP</w:t>
+      </w:r>
+    </w:p>
+    <w:p>
+      <w:pPr>
+        <w:spacing w:line="360" w:lineRule="auto"/>
+        <w:rPr>
+          <w:rFonts w:ascii="Arial" w:hAnsi="Arial" w:cs="Arial"/>
+          <w:sz w:val="24"/>
+          <w:szCs w:val="24"/>
+          <w:lang w:val="en-US"/>
+        </w:rPr>
+      </w:pPr>
+      <w:r>
+        <w:rPr>
+          <w:rFonts w:ascii="Arial" w:hAnsi="Arial" w:cs="Arial"/>
+          <w:sz w:val="24"/>
+          <w:szCs w:val="24"/>
+          <w:lang w:val="en-US"/>
+        </w:rPr>
+        <w:t xml:space="preserve">   </w:t>
+      </w:r>
+      <w:r>
+        <w:rPr>
+          <w:rFonts w:ascii="Arial" w:hAnsi="Arial" w:cs="Arial"/>
+          <w:sz w:val="24"/>
+          <w:szCs w:val="24"/>
+          <w:lang w:val="en-US"/>
+        </w:rPr>
+        <w:t>END IF</w:t>
+      </w:r>
+    </w:p>
+    <w:p>
+      <w:pPr>
+        <w:spacing w:line="360" w:lineRule="auto"/>
+        <w:rPr>
+          <w:rFonts w:ascii="Arial" w:hAnsi="Arial" w:cs="Arial"/>
+          <w:sz w:val="24"/>
+          <w:szCs w:val="24"/>
+          <w:lang w:val="en-US"/>
+        </w:rPr>
+      </w:pPr>
+    </w:p>
+    <w:p>
+      <w:pPr>
+        <w:spacing w:line="360" w:lineRule="auto"/>
+        <w:rPr>
+          <w:rFonts w:ascii="Arial" w:hAnsi="Arial" w:cs="Arial"/>
+          <w:sz w:val="24"/>
+          <w:szCs w:val="24"/>
+          <w:lang w:val="en-US"/>
+        </w:rPr>
+      </w:pPr>
+      <w:r>
+        <w:rPr>
+          <w:rFonts w:ascii="Arial" w:hAnsi="Arial" w:cs="Arial"/>
+          <w:sz w:val="24"/>
+          <w:szCs w:val="24"/>
+          <w:lang w:val="en-US"/>
+        </w:rPr>
+        <w:t xml:space="preserve">   </w:t>
+      </w:r>
+      <w:r>
+        <w:rPr>
+          <w:rFonts w:ascii="Arial" w:hAnsi="Arial" w:cs="Arial"/>
+          <w:sz w:val="24"/>
+          <w:szCs w:val="24"/>
+          <w:lang w:val="en-US"/>
+        </w:rPr>
+        <w:t>IF credits are outside the valid range</w:t>
+      </w:r>
+    </w:p>
+    <w:p>
+      <w:pPr>
+        <w:spacing w:line="360" w:lineRule="auto"/>
+        <w:rPr>
+          <w:rFonts w:ascii="Arial" w:hAnsi="Arial" w:cs="Arial"/>
+          <w:sz w:val="24"/>
+          <w:szCs w:val="24"/>
+          <w:lang w:val="en-US"/>
+        </w:rPr>
+      </w:pPr>
+      <w:r>
+        <w:rPr>
+          <w:rFonts w:ascii="Arial" w:hAnsi="Arial" w:cs="Arial"/>
+          <w:sz w:val="24"/>
+          <w:szCs w:val="24"/>
+          <w:lang w:val="en-US"/>
+        </w:rPr>
+        <w:t xml:space="preserve">      </w:t>
+      </w:r>
+      <w:r>
+        <w:rPr>
+          <w:rFonts w:ascii="Arial" w:hAnsi="Arial" w:cs="Arial"/>
+          <w:sz w:val="24"/>
+          <w:szCs w:val="24"/>
+          <w:lang w:val="en-US"/>
+        </w:rPr>
+        <w:t>DISPLAY validation error</w:t>
+      </w:r>
+    </w:p>
+    <w:p>
+      <w:pPr>
+        <w:spacing w:line="360" w:lineRule="auto"/>
+        <w:rPr>
+          <w:rFonts w:ascii="Arial" w:hAnsi="Arial" w:cs="Arial"/>
+          <w:sz w:val="24"/>
+          <w:szCs w:val="24"/>
+          <w:lang w:val="en-US"/>
+        </w:rPr>
+      </w:pPr>
+      <w:r>
+        <w:rPr>
+          <w:rFonts w:ascii="Arial" w:hAnsi="Arial" w:cs="Arial"/>
+          <w:sz w:val="24"/>
+          <w:szCs w:val="24"/>
+          <w:lang w:val="en-US"/>
+        </w:rPr>
+        <w:t xml:space="preserve">      </w:t>
+      </w:r>
+      <w:r>
+        <w:rPr>
+          <w:rFonts w:ascii="Arial" w:hAnsi="Arial" w:cs="Arial"/>
+          <w:sz w:val="24"/>
+          <w:szCs w:val="24"/>
+          <w:lang w:val="en-US"/>
+        </w:rPr>
+        <w:t>STOP</w:t>
+      </w:r>
+    </w:p>
+    <w:p>
+      <w:pPr>
+        <w:spacing w:line="360" w:lineRule="auto"/>
+        <w:rPr>
+          <w:rFonts w:ascii="Arial" w:hAnsi="Arial" w:cs="Arial"/>
+          <w:sz w:val="24"/>
+          <w:szCs w:val="24"/>
+          <w:lang w:val="en-US"/>
+        </w:rPr>
+      </w:pPr>
+      <w:r>
+        <w:rPr>
+          <w:rFonts w:ascii="Arial" w:hAnsi="Arial" w:cs="Arial"/>
+          <w:sz w:val="24"/>
+          <w:szCs w:val="24"/>
+          <w:lang w:val="en-US"/>
+        </w:rPr>
+        <w:t xml:space="preserve">   </w:t>
+      </w:r>
+      <w:r>
+        <w:rPr>
+          <w:rFonts w:ascii="Arial" w:hAnsi="Arial" w:cs="Arial"/>
+          <w:sz w:val="24"/>
+          <w:szCs w:val="24"/>
+          <w:lang w:val="en-US"/>
+        </w:rPr>
+        <w:t>END IF</w:t>
+      </w:r>
+    </w:p>
+    <w:p>
+      <w:pPr>
+        <w:spacing w:line="360" w:lineRule="auto"/>
+        <w:rPr>
+          <w:rFonts w:ascii="Arial" w:hAnsi="Arial" w:cs="Arial"/>
+          <w:sz w:val="24"/>
+          <w:szCs w:val="24"/>
+          <w:lang w:val="en-US"/>
+        </w:rPr>
+      </w:pPr>
+    </w:p>
+    <w:p>
+      <w:pPr>
+        <w:spacing w:line="360" w:lineRule="auto"/>
+        <w:rPr>
+          <w:rFonts w:ascii="Arial" w:hAnsi="Arial" w:cs="Arial"/>
+          <w:sz w:val="24"/>
+          <w:szCs w:val="24"/>
+          <w:lang w:val="en-US"/>
+        </w:rPr>
+      </w:pPr>
+      <w:r>
+        <w:rPr>
+          <w:rFonts w:ascii="Arial" w:hAnsi="Arial" w:cs="Arial"/>
+          <w:sz w:val="24"/>
+          <w:szCs w:val="24"/>
+          <w:lang w:val="en-US"/>
+        </w:rPr>
+        <w:t xml:space="preserve">   </w:t>
+      </w:r>
+      <w:r>
+        <w:rPr>
+          <w:rFonts w:ascii="Arial" w:hAnsi="Arial" w:cs="Arial"/>
+          <w:sz w:val="24"/>
+          <w:szCs w:val="24"/>
+          <w:lang w:val="en-US"/>
+        </w:rPr>
+        <w:t>IF grade is not valid</w:t>
+      </w:r>
+    </w:p>
+    <w:p>
+      <w:pPr>
+        <w:spacing w:line="360" w:lineRule="auto"/>
+        <w:rPr>
+          <w:rFonts w:ascii="Arial" w:hAnsi="Arial" w:cs="Arial"/>
+          <w:sz w:val="24"/>
+          <w:szCs w:val="24"/>
+          <w:lang w:val="en-US"/>
+        </w:rPr>
+      </w:pPr>
+      <w:r>
+        <w:rPr>
+          <w:rFonts w:ascii="Arial" w:hAnsi="Arial" w:cs="Arial"/>
+          <w:sz w:val="24"/>
+          <w:szCs w:val="24"/>
+          <w:lang w:val="en-US"/>
+        </w:rPr>
+        <w:t xml:space="preserve">      </w:t>
+      </w:r>
+      <w:r>
+        <w:rPr>
+          <w:rFonts w:ascii="Arial" w:hAnsi="Arial" w:cs="Arial"/>
+          <w:sz w:val="24"/>
+          <w:szCs w:val="24"/>
+          <w:lang w:val="en-US"/>
+        </w:rPr>
+        <w:t>DISPLAY validation error</w:t>
+      </w:r>
+    </w:p>
+    <w:p>
+      <w:pPr>
+        <w:spacing w:line="360" w:lineRule="auto"/>
+        <w:rPr>
+          <w:rFonts w:ascii="Arial" w:hAnsi="Arial" w:cs="Arial"/>
+          <w:sz w:val="24"/>
+          <w:szCs w:val="24"/>
+          <w:lang w:val="en-US"/>
+        </w:rPr>
+      </w:pPr>
+      <w:r>
+        <w:rPr>
+          <w:rFonts w:ascii="Arial" w:hAnsi="Arial" w:cs="Arial"/>
+          <w:sz w:val="24"/>
+          <w:szCs w:val="24"/>
+          <w:lang w:val="en-US"/>
+        </w:rPr>
+        <w:t xml:space="preserve">      </w:t>
+      </w:r>
+      <w:r>
+        <w:rPr>
+          <w:rFonts w:ascii="Arial" w:hAnsi="Arial" w:cs="Arial"/>
+          <w:sz w:val="24"/>
+          <w:szCs w:val="24"/>
+          <w:lang w:val="en-US"/>
+        </w:rPr>
+        <w:t>STOP</w:t>
+      </w:r>
+    </w:p>
+    <w:p>
+      <w:pPr>
+        <w:spacing w:line="360" w:lineRule="auto"/>
+        <w:rPr>
+          <w:rFonts w:ascii="Arial" w:hAnsi="Arial" w:cs="Arial"/>
+          <w:sz w:val="24"/>
+          <w:szCs w:val="24"/>
+          <w:lang w:val="en-US"/>
+        </w:rPr>
+      </w:pPr>
+      <w:r>
+        <w:rPr>
+          <w:rFonts w:ascii="Arial" w:hAnsi="Arial" w:cs="Arial"/>
+          <w:sz w:val="24"/>
+          <w:szCs w:val="24"/>
+          <w:lang w:val="en-US"/>
+        </w:rPr>
+        <w:t xml:space="preserve">   </w:t>
+      </w:r>
+      <w:r>
+        <w:rPr>
+          <w:rFonts w:ascii="Arial" w:hAnsi="Arial" w:cs="Arial"/>
+          <w:sz w:val="24"/>
+          <w:szCs w:val="24"/>
+          <w:lang w:val="en-US"/>
+        </w:rPr>
+        <w:t>END IF</w:t>
+      </w:r>
+    </w:p>
+    <w:p>
+      <w:pPr>
+        <w:spacing w:line="360" w:lineRule="auto"/>
+        <w:rPr>
+          <w:rFonts w:ascii="Arial" w:hAnsi="Arial" w:cs="Arial"/>
+          <w:sz w:val="24"/>
+          <w:szCs w:val="24"/>
+          <w:lang w:val="en-US"/>
+        </w:rPr>
+      </w:pPr>
+    </w:p>
+    <w:p>
+      <w:pPr>
+        <w:spacing w:line="360" w:lineRule="auto"/>
+        <w:rPr>
+          <w:rFonts w:ascii="Arial" w:hAnsi="Arial" w:cs="Arial"/>
+          <w:sz w:val="24"/>
+          <w:szCs w:val="24"/>
+          <w:lang w:val="en-US"/>
+        </w:rPr>
+      </w:pPr>
+      <w:r>
+        <w:rPr>
+          <w:rFonts w:ascii="Arial" w:hAnsi="Arial" w:cs="Arial"/>
+          <w:sz w:val="24"/>
+          <w:szCs w:val="24"/>
+          <w:lang w:val="en-US"/>
+        </w:rPr>
+        <w:t xml:space="preserve">   </w:t>
+      </w:r>
+      <w:r>
+        <w:rPr>
+          <w:rFonts w:ascii="Arial" w:hAnsi="Arial" w:cs="Arial"/>
+          <w:sz w:val="24"/>
+          <w:szCs w:val="24"/>
+          <w:lang w:val="en-US"/>
+        </w:rPr>
+        <w:t>IF semester is empty</w:t>
+      </w:r>
+    </w:p>
+    <w:p>
+      <w:pPr>
+        <w:spacing w:line="360" w:lineRule="auto"/>
+        <w:rPr>
+          <w:rFonts w:ascii="Arial" w:hAnsi="Arial" w:cs="Arial"/>
+          <w:sz w:val="24"/>
+          <w:szCs w:val="24"/>
+          <w:lang w:val="en-US"/>
+        </w:rPr>
+      </w:pPr>
+      <w:r>
+        <w:rPr>
+          <w:rFonts w:ascii="Arial" w:hAnsi="Arial" w:cs="Arial"/>
+          <w:sz w:val="24"/>
+          <w:szCs w:val="24"/>
+          <w:lang w:val="en-US"/>
+        </w:rPr>
+        <w:t xml:space="preserve">      </w:t>
+      </w:r>
+      <w:r>
+        <w:rPr>
+          <w:rFonts w:ascii="Arial" w:hAnsi="Arial" w:cs="Arial"/>
+          <w:sz w:val="24"/>
+          <w:szCs w:val="24"/>
+          <w:lang w:val="en-US"/>
+        </w:rPr>
+        <w:t>DISPLAY validation error</w:t>
+      </w:r>
+    </w:p>
+    <w:p>
+      <w:pPr>
+        <w:spacing w:line="360" w:lineRule="auto"/>
+        <w:rPr>
+          <w:rFonts w:ascii="Arial" w:hAnsi="Arial" w:cs="Arial"/>
+          <w:sz w:val="24"/>
+          <w:szCs w:val="24"/>
+          <w:lang w:val="en-US"/>
+        </w:rPr>
+      </w:pPr>
+      <w:r>
+        <w:rPr>
+          <w:rFonts w:ascii="Arial" w:hAnsi="Arial" w:cs="Arial"/>
+          <w:sz w:val="24"/>
+          <w:szCs w:val="24"/>
+          <w:lang w:val="en-US"/>
+        </w:rPr>
+        <w:t xml:space="preserve">      </w:t>
+      </w:r>
+      <w:r>
+        <w:rPr>
+          <w:rFonts w:ascii="Arial" w:hAnsi="Arial" w:cs="Arial"/>
+          <w:sz w:val="24"/>
+          <w:szCs w:val="24"/>
+          <w:lang w:val="en-US"/>
+        </w:rPr>
+        <w:t>STOP</w:t>
+      </w:r>
+    </w:p>
+    <w:p>
+      <w:pPr>
+        <w:spacing w:line="360" w:lineRule="auto"/>
+        <w:rPr>
+          <w:rFonts w:ascii="Arial" w:hAnsi="Arial" w:cs="Arial"/>
+          <w:sz w:val="24"/>
+          <w:szCs w:val="24"/>
+          <w:lang w:val="en-US"/>
+        </w:rPr>
+      </w:pPr>
+      <w:r>
+        <w:rPr>
+          <w:rFonts w:ascii="Arial" w:hAnsi="Arial" w:cs="Arial"/>
+          <w:sz w:val="24"/>
+          <w:szCs w:val="24"/>
+          <w:lang w:val="en-US"/>
+        </w:rPr>
+        <w:t xml:space="preserve">   </w:t>
+      </w:r>
+      <w:r>
+        <w:rPr>
+          <w:rFonts w:ascii="Arial" w:hAnsi="Arial" w:cs="Arial"/>
+          <w:sz w:val="24"/>
+          <w:szCs w:val="24"/>
+          <w:lang w:val="en-US"/>
+        </w:rPr>
+        <w:t>END IF</w:t>
+      </w:r>
+    </w:p>
+    <w:p>
+      <w:pPr>
+        <w:spacing w:line="360" w:lineRule="auto"/>
+        <w:rPr>
+          <w:rFonts w:ascii="Arial" w:hAnsi="Arial" w:cs="Arial"/>
+          <w:sz w:val="24"/>
+          <w:szCs w:val="24"/>
+          <w:lang w:val="en-US"/>
+        </w:rPr>
+      </w:pPr>
+    </w:p>
+    <w:p>
+      <w:pPr>
+        <w:spacing w:line="360" w:lineRule="auto"/>
+        <w:rPr>
+          <w:rFonts w:ascii="Arial" w:hAnsi="Arial" w:cs="Arial"/>
+          <w:sz w:val="24"/>
+          <w:szCs w:val="24"/>
+          <w:lang w:val="en-US"/>
+        </w:rPr>
+      </w:pPr>
+      <w:r>
+        <w:rPr>
+          <w:rFonts w:ascii="Arial" w:hAnsi="Arial" w:cs="Arial"/>
+          <w:sz w:val="24"/>
+          <w:szCs w:val="24"/>
+          <w:lang w:val="en-US"/>
+        </w:rPr>
+        <w:t xml:space="preserve">   </w:t>
+      </w:r>
+      <w:r>
+        <w:rPr>
+          <w:rFonts w:ascii="Arial" w:hAnsi="Arial" w:cs="Arial"/>
+          <w:sz w:val="24"/>
+          <w:szCs w:val="24"/>
+          <w:lang w:val="en-US"/>
+        </w:rPr>
+        <w:t xml:space="preserve">CREATE new </w:t>
+      </w:r>
+      <w:r>
+        <w:rPr>
+          <w:rFonts w:ascii="Arial" w:hAnsi="Arial" w:cs="Arial"/>
+          <w:sz w:val="24"/>
+          <w:szCs w:val="24"/>
+          <w:lang w:val="en-US"/>
+        </w:rPr>
+        <w:t>C</w:t>
+      </w:r>
+      <w:r>
+        <w:rPr>
+          <w:rFonts w:ascii="Arial" w:hAnsi="Arial" w:cs="Arial"/>
+          <w:sz w:val="24"/>
+          <w:szCs w:val="24"/>
+          <w:lang w:val="en-US"/>
+        </w:rPr>
+        <w:t>ourse</w:t>
+      </w:r>
+    </w:p>
+    <w:p>
+      <w:pPr>
+        <w:spacing w:line="360" w:lineRule="auto"/>
+        <w:rPr>
+          <w:rFonts w:ascii="Arial" w:hAnsi="Arial" w:cs="Arial"/>
+          <w:sz w:val="24"/>
+          <w:szCs w:val="24"/>
+          <w:lang w:val="en-US"/>
+        </w:rPr>
+      </w:pPr>
+    </w:p>
+    <w:p>
+      <w:pPr>
+        <w:spacing w:line="360" w:lineRule="auto"/>
+        <w:rPr>
+          <w:rFonts w:ascii="Arial" w:hAnsi="Arial" w:cs="Arial"/>
+          <w:sz w:val="24"/>
+          <w:szCs w:val="24"/>
+          <w:lang w:val="en-US"/>
+        </w:rPr>
+      </w:pPr>
+      <w:r>
+        <w:rPr>
+          <w:rFonts w:ascii="Arial" w:hAnsi="Arial" w:cs="Arial"/>
+          <w:sz w:val="24"/>
+          <w:szCs w:val="24"/>
+          <w:lang w:val="en-US"/>
+        </w:rPr>
+        <w:t xml:space="preserve">   </w:t>
+      </w:r>
+      <w:r>
+        <w:rPr>
+          <w:rFonts w:ascii="Arial" w:hAnsi="Arial" w:cs="Arial"/>
+          <w:sz w:val="24"/>
+          <w:szCs w:val="24"/>
+          <w:lang w:val="en-US"/>
+        </w:rPr>
+        <w:t>STORE Course</w:t>
+      </w:r>
+    </w:p>
+    <w:p>
+      <w:pPr>
+        <w:spacing w:line="360" w:lineRule="auto"/>
+        <w:rPr>
+          <w:rFonts w:ascii="Arial" w:hAnsi="Arial" w:cs="Arial"/>
+          <w:sz w:val="24"/>
+          <w:szCs w:val="24"/>
+          <w:lang w:val="en-US"/>
+        </w:rPr>
+      </w:pPr>
+    </w:p>
+    <w:p>
+      <w:pPr>
+        <w:spacing w:line="360" w:lineRule="auto"/>
+        <w:rPr>
+          <w:rFonts w:ascii="Arial" w:hAnsi="Arial" w:cs="Arial"/>
+          <w:sz w:val="24"/>
+          <w:szCs w:val="24"/>
+          <w:lang w:val="en-US"/>
+        </w:rPr>
+      </w:pPr>
+      <w:r>
+        <w:rPr>
+          <w:rFonts w:ascii="Arial" w:hAnsi="Arial" w:cs="Arial"/>
+          <w:sz w:val="24"/>
+          <w:szCs w:val="24"/>
+          <w:lang w:val="en-US"/>
+        </w:rPr>
+        <w:t xml:space="preserve">   </w:t>
+      </w:r>
+      <w:r>
+        <w:rPr>
+          <w:rFonts w:ascii="Arial" w:hAnsi="Arial" w:cs="Arial"/>
+          <w:sz w:val="24"/>
+          <w:szCs w:val="24"/>
+          <w:lang w:val="en-US"/>
+        </w:rPr>
+        <w:t>REDIRECT user to Courses page</w:t>
+      </w:r>
+    </w:p>
+    <w:p>
+      <w:pPr>
+        <w:spacing w:line="360" w:lineRule="auto"/>
+        <w:rPr>
+          <w:rFonts w:ascii="Arial" w:hAnsi="Arial" w:cs="Arial"/>
+          <w:sz w:val="24"/>
+          <w:szCs w:val="24"/>
+          <w:lang w:val="en-US"/>
+        </w:rPr>
+      </w:pPr>
+    </w:p>
+    <w:p>
+      <w:pPr>
+        <w:spacing w:line="360" w:lineRule="auto"/>
+        <w:rPr>
+          <w:rFonts w:ascii="Arial" w:hAnsi="Arial" w:cs="Arial"/>
+          <w:sz w:val="24"/>
+          <w:szCs w:val="24"/>
+          <w:lang w:val="en-US"/>
+        </w:rPr>
+      </w:pPr>
+      <w:r>
+        <w:rPr>
+          <w:rFonts w:ascii="Arial" w:hAnsi="Arial" w:cs="Arial"/>
+          <w:sz w:val="24"/>
+          <w:szCs w:val="24"/>
+          <w:lang w:val="en-US"/>
+        </w:rPr>
+        <w:t>END FUNCTION</w:t>
+      </w:r>
+    </w:p>
+    <w:p>
+      <w:pPr>
+        <w:spacing w:line="360" w:lineRule="auto"/>
+        <w:rPr>
+          <w:rFonts w:ascii="Arial" w:hAnsi="Arial" w:cs="Arial"/>
+          <w:sz w:val="24"/>
+          <w:szCs w:val="24"/>
+          <w:lang w:val="en-US"/>
+        </w:rPr>
+      </w:pPr>
+    </w:p>
+    <w:p>
+      <w:pPr>
+        <w:spacing w:line="360" w:lineRule="auto"/>
+        <w:rPr>
+          <w:rFonts w:ascii="Arial" w:hAnsi="Arial" w:cs="Arial"/>
+          <w:sz w:val="24"/>
+          <w:szCs w:val="24"/>
+          <w:lang w:val="en-US"/>
+        </w:rPr>
+      </w:pPr>
+      <w:r>
+        <w:rPr>
+          <w:rFonts w:ascii="Arial" w:hAnsi="Arial" w:cs="Arial"/>
+          <w:sz w:val="24"/>
+          <w:szCs w:val="24"/>
+          <w:lang w:val="en-US"/>
+        </w:rPr>
+        <w:t xml:space="preserve">FUNCTION </w:t>
+      </w:r>
+      <w:r>
+        <w:rPr>
+          <w:rFonts w:ascii="Arial" w:hAnsi="Arial" w:cs="Arial"/>
+          <w:sz w:val="24"/>
+          <w:szCs w:val="24"/>
+          <w:lang w:val="en-US"/>
+        </w:rPr>
+        <w:t>CalculateGPA(courses)</w:t>
+      </w:r>
+    </w:p>
+    <w:p>
+      <w:pPr>
+        <w:spacing w:line="360" w:lineRule="auto"/>
+        <w:rPr>
+          <w:rFonts w:ascii="Arial" w:hAnsi="Arial" w:cs="Arial"/>
+          <w:sz w:val="24"/>
+          <w:szCs w:val="24"/>
+          <w:lang w:val="en-US"/>
+        </w:rPr>
+      </w:pPr>
+    </w:p>
+    <w:p>
+      <w:pPr>
+        <w:spacing w:line="360" w:lineRule="auto"/>
+        <w:rPr>
+          <w:rFonts w:ascii="Arial" w:hAnsi="Arial" w:cs="Arial"/>
+          <w:sz w:val="24"/>
+          <w:szCs w:val="24"/>
+          <w:lang w:val="en-US"/>
+        </w:rPr>
+      </w:pPr>
+      <w:r>
+        <w:rPr>
+          <w:rFonts w:ascii="Arial" w:hAnsi="Arial" w:cs="Arial"/>
+          <w:sz w:val="24"/>
+          <w:szCs w:val="24"/>
+          <w:lang w:val="en-US"/>
+        </w:rPr>
+        <w:t xml:space="preserve">   </w:t>
+      </w:r>
+      <w:r>
+        <w:rPr>
+          <w:rFonts w:ascii="Arial" w:hAnsi="Arial" w:cs="Arial"/>
+          <w:sz w:val="24"/>
+          <w:szCs w:val="24"/>
+          <w:lang w:val="en-US"/>
+        </w:rPr>
+        <w:t>totalQualityPoints = 0</w:t>
+      </w:r>
+    </w:p>
+    <w:p>
+      <w:pPr>
+        <w:spacing w:line="360" w:lineRule="auto"/>
+        <w:rPr>
+          <w:rFonts w:ascii="Arial" w:hAnsi="Arial" w:cs="Arial"/>
+          <w:sz w:val="24"/>
+          <w:szCs w:val="24"/>
+          <w:lang w:val="en-US"/>
+        </w:rPr>
+      </w:pPr>
+      <w:r>
+        <w:rPr>
+          <w:rFonts w:ascii="Arial" w:hAnsi="Arial" w:cs="Arial"/>
+          <w:sz w:val="24"/>
+          <w:szCs w:val="24"/>
+          <w:lang w:val="en-US"/>
+        </w:rPr>
+        <w:t xml:space="preserve">   </w:t>
+      </w:r>
+      <w:r>
+        <w:rPr>
+          <w:rFonts w:ascii="Arial" w:hAnsi="Arial" w:cs="Arial"/>
+          <w:sz w:val="24"/>
+          <w:szCs w:val="24"/>
+          <w:lang w:val="en-US"/>
+        </w:rPr>
+        <w:t>attemptedCredits = 0</w:t>
+      </w:r>
+    </w:p>
+    <w:p>
+      <w:pPr>
+        <w:spacing w:line="360" w:lineRule="auto"/>
+        <w:rPr>
+          <w:rFonts w:ascii="Arial" w:hAnsi="Arial" w:cs="Arial"/>
+          <w:sz w:val="24"/>
+          <w:szCs w:val="24"/>
+          <w:lang w:val="en-US"/>
+        </w:rPr>
+      </w:pPr>
     </w:p>
     <w:p>
       <w:pPr>
@@ -6434,193 +7202,1536 @@
           <w:lang w:val="en-US"/>
         </w:rPr>
         <w:lastRenderedPageBreak/>
-        <w:t>DISPLAY validation error</w:t>
-      </w:r>
-    </w:p>
-    <w:p>
-      <w:pPr>
-        <w:spacing w:line="360" w:lineRule="auto"/>
-        <w:rPr>
-          <w:rFonts w:ascii="Arial" w:hAnsi="Arial" w:cs="Arial"/>
-          <w:sz w:val="24"/>
-          <w:szCs w:val="24"/>
-          <w:lang w:val="en-US"/>
-        </w:rPr>
-      </w:pPr>
-    </w:p>
-    <w:p>
-      <w:pPr>
-        <w:spacing w:line="360" w:lineRule="auto"/>
-        <w:rPr>
-          <w:rFonts w:ascii="Arial" w:hAnsi="Arial" w:cs="Arial"/>
-          <w:sz w:val="24"/>
-          <w:szCs w:val="24"/>
-          <w:lang w:val="en-US"/>
-        </w:rPr>
-      </w:pPr>
-      <w:r>
-        <w:rPr>
-          <w:rFonts w:ascii="Arial" w:hAnsi="Arial" w:cs="Arial"/>
-          <w:sz w:val="24"/>
-          <w:szCs w:val="24"/>
-          <w:lang w:val="en-US"/>
-        </w:rPr>
-        <w:t>STOP</w:t>
-      </w:r>
-    </w:p>
-    <w:p>
-      <w:pPr>
-        <w:spacing w:line="360" w:lineRule="auto"/>
-        <w:rPr>
-          <w:rFonts w:ascii="Arial" w:hAnsi="Arial" w:cs="Arial"/>
-          <w:sz w:val="24"/>
-          <w:szCs w:val="24"/>
-          <w:lang w:val="en-US"/>
-        </w:rPr>
-      </w:pPr>
-    </w:p>
-    <w:p>
-      <w:pPr>
-        <w:spacing w:line="360" w:lineRule="auto"/>
-        <w:rPr>
-          <w:rFonts w:ascii="Arial" w:hAnsi="Arial" w:cs="Arial"/>
-          <w:sz w:val="24"/>
-          <w:szCs w:val="24"/>
-          <w:lang w:val="en-US"/>
-        </w:rPr>
-      </w:pPr>
-      <w:r>
-        <w:rPr>
-          <w:rFonts w:ascii="Arial" w:hAnsi="Arial" w:cs="Arial"/>
-          <w:sz w:val="24"/>
-          <w:szCs w:val="24"/>
-          <w:lang w:val="en-US"/>
-        </w:rPr>
-        <w:t>END IF</w:t>
-      </w:r>
-    </w:p>
-    <w:p>
-      <w:pPr>
-        <w:spacing w:line="360" w:lineRule="auto"/>
-        <w:rPr>
-          <w:rFonts w:ascii="Arial" w:hAnsi="Arial" w:cs="Arial"/>
-          <w:sz w:val="24"/>
-          <w:szCs w:val="24"/>
-          <w:lang w:val="en-US"/>
-        </w:rPr>
-      </w:pPr>
-    </w:p>
-    <w:p>
-      <w:pPr>
-        <w:spacing w:line="360" w:lineRule="auto"/>
-        <w:rPr>
-          <w:rFonts w:ascii="Arial" w:hAnsi="Arial" w:cs="Arial"/>
-          <w:sz w:val="24"/>
-          <w:szCs w:val="24"/>
-          <w:lang w:val="en-US"/>
-        </w:rPr>
-      </w:pPr>
-      <w:r>
-        <w:rPr>
-          <w:rFonts w:ascii="Arial" w:hAnsi="Arial" w:cs="Arial"/>
-          <w:sz w:val="24"/>
-          <w:szCs w:val="24"/>
-          <w:lang w:val="en-US"/>
-        </w:rPr>
-        <w:t>IF credits are outside the valid range</w:t>
-      </w:r>
-    </w:p>
-    <w:p>
-      <w:pPr>
-        <w:spacing w:line="360" w:lineRule="auto"/>
-        <w:rPr>
-          <w:rFonts w:ascii="Arial" w:hAnsi="Arial" w:cs="Arial"/>
-          <w:sz w:val="24"/>
-          <w:szCs w:val="24"/>
-          <w:lang w:val="en-US"/>
-        </w:rPr>
-      </w:pPr>
-    </w:p>
-    <w:p>
-      <w:pPr>
-        <w:spacing w:line="360" w:lineRule="auto"/>
-        <w:rPr>
-          <w:rFonts w:ascii="Arial" w:hAnsi="Arial" w:cs="Arial"/>
-          <w:sz w:val="24"/>
-          <w:szCs w:val="24"/>
-          <w:lang w:val="en-US"/>
-        </w:rPr>
-      </w:pPr>
-      <w:r>
-        <w:rPr>
-          <w:rFonts w:ascii="Arial" w:hAnsi="Arial" w:cs="Arial"/>
-          <w:sz w:val="24"/>
-          <w:szCs w:val="24"/>
-          <w:lang w:val="en-US"/>
-        </w:rPr>
-        <w:t>DISPLAY validation error</w:t>
-      </w:r>
-    </w:p>
-    <w:p>
-      <w:pPr>
-        <w:spacing w:line="360" w:lineRule="auto"/>
-        <w:rPr>
-          <w:rFonts w:ascii="Arial" w:hAnsi="Arial" w:cs="Arial"/>
-          <w:sz w:val="24"/>
-          <w:szCs w:val="24"/>
-          <w:lang w:val="en-US"/>
-        </w:rPr>
-      </w:pPr>
-    </w:p>
-    <w:p>
-      <w:pPr>
-        <w:spacing w:line="360" w:lineRule="auto"/>
-        <w:rPr>
-          <w:rFonts w:ascii="Arial" w:hAnsi="Arial" w:cs="Arial"/>
-          <w:sz w:val="24"/>
-          <w:szCs w:val="24"/>
-          <w:lang w:val="en-US"/>
-        </w:rPr>
-      </w:pPr>
-      <w:r>
-        <w:rPr>
-          <w:rFonts w:ascii="Arial" w:hAnsi="Arial" w:cs="Arial"/>
-          <w:sz w:val="24"/>
-          <w:szCs w:val="24"/>
-          <w:lang w:val="en-US"/>
-        </w:rPr>
-        <w:t>STOP</w:t>
-      </w:r>
-    </w:p>
-    <w:p>
-      <w:pPr>
-        <w:spacing w:line="360" w:lineRule="auto"/>
-        <w:rPr>
-          <w:rFonts w:ascii="Arial" w:hAnsi="Arial" w:cs="Arial"/>
-          <w:sz w:val="24"/>
-          <w:szCs w:val="24"/>
-          <w:lang w:val="en-US"/>
-        </w:rPr>
-      </w:pPr>
-    </w:p>
-    <w:p>
-      <w:pPr>
-        <w:spacing w:line="360" w:lineRule="auto"/>
-        <w:rPr>
-          <w:rFonts w:ascii="Arial" w:hAnsi="Arial" w:cs="Arial"/>
-          <w:sz w:val="24"/>
-          <w:szCs w:val="24"/>
-          <w:lang w:val="en-US"/>
-        </w:rPr>
-      </w:pPr>
-      <w:r>
-        <w:rPr>
-          <w:rFonts w:ascii="Arial" w:hAnsi="Arial" w:cs="Arial"/>
-          <w:sz w:val="24"/>
-          <w:szCs w:val="24"/>
-          <w:lang w:val="en-US"/>
-        </w:rPr>
-        <w:t>END IF</w:t>
+        <w:t xml:space="preserve">   </w:t>
+      </w:r>
+      <w:r>
+        <w:rPr>
+          <w:rFonts w:ascii="Arial" w:hAnsi="Arial" w:cs="Arial"/>
+          <w:sz w:val="24"/>
+          <w:szCs w:val="24"/>
+          <w:lang w:val="en-US"/>
+        </w:rPr>
+        <w:t>FOR EACH</w:t>
+      </w:r>
+      <w:r>
+        <w:rPr>
+          <w:rFonts w:ascii="Arial" w:hAnsi="Arial" w:cs="Arial"/>
+          <w:sz w:val="24"/>
+          <w:szCs w:val="24"/>
+          <w:lang w:val="en-US"/>
+        </w:rPr>
+        <w:t xml:space="preserve"> </w:t>
+      </w:r>
+      <w:r>
+        <w:rPr>
+          <w:rFonts w:ascii="Arial" w:hAnsi="Arial" w:cs="Arial"/>
+          <w:sz w:val="24"/>
+          <w:szCs w:val="24"/>
+          <w:lang w:val="en-US"/>
+        </w:rPr>
+        <w:t>course IN courses</w:t>
+      </w:r>
+    </w:p>
+    <w:p>
+      <w:pPr>
+        <w:spacing w:line="360" w:lineRule="auto"/>
+        <w:rPr>
+          <w:rFonts w:ascii="Arial" w:hAnsi="Arial" w:cs="Arial"/>
+          <w:sz w:val="24"/>
+          <w:szCs w:val="24"/>
+          <w:lang w:val="en-US"/>
+        </w:rPr>
+      </w:pPr>
+    </w:p>
+    <w:p>
+      <w:pPr>
+        <w:spacing w:line="360" w:lineRule="auto"/>
+        <w:rPr>
+          <w:rFonts w:ascii="Arial" w:hAnsi="Arial" w:cs="Arial"/>
+          <w:sz w:val="24"/>
+          <w:szCs w:val="24"/>
+          <w:lang w:val="en-US"/>
+        </w:rPr>
+      </w:pPr>
+      <w:r>
+        <w:rPr>
+          <w:rFonts w:ascii="Arial" w:hAnsi="Arial" w:cs="Arial"/>
+          <w:sz w:val="24"/>
+          <w:szCs w:val="24"/>
+          <w:lang w:val="en-US"/>
+        </w:rPr>
+        <w:t xml:space="preserve">      </w:t>
+      </w:r>
+      <w:r>
+        <w:rPr>
+          <w:rFonts w:ascii="Arial" w:hAnsi="Arial" w:cs="Arial"/>
+          <w:sz w:val="24"/>
+          <w:szCs w:val="24"/>
+          <w:lang w:val="en-US"/>
+        </w:rPr>
+        <w:t>gradePoints</w:t>
+      </w:r>
+      <w:r>
+        <w:rPr>
+          <w:rFonts w:ascii="Arial" w:hAnsi="Arial" w:cs="Arial"/>
+          <w:sz w:val="24"/>
+          <w:szCs w:val="24"/>
+          <w:lang w:val="en-US"/>
+        </w:rPr>
+        <w:t xml:space="preserve"> = ConvertGradeToPoints(</w:t>
+      </w:r>
+      <w:r>
+        <w:rPr>
+          <w:rFonts w:ascii="Arial" w:hAnsi="Arial" w:cs="Arial"/>
+          <w:sz w:val="24"/>
+          <w:szCs w:val="24"/>
+          <w:lang w:val="en-US"/>
+        </w:rPr>
+        <w:t>course.grade</w:t>
+      </w:r>
+      <w:r>
+        <w:rPr>
+          <w:rFonts w:ascii="Arial" w:hAnsi="Arial" w:cs="Arial"/>
+          <w:sz w:val="24"/>
+          <w:szCs w:val="24"/>
+          <w:lang w:val="en-US"/>
+        </w:rPr>
+        <w:t>)</w:t>
+      </w:r>
+    </w:p>
+    <w:p>
+      <w:pPr>
+        <w:spacing w:line="360" w:lineRule="auto"/>
+        <w:rPr>
+          <w:rFonts w:ascii="Arial" w:hAnsi="Arial" w:cs="Arial"/>
+          <w:sz w:val="24"/>
+          <w:szCs w:val="24"/>
+          <w:lang w:val="en-US"/>
+        </w:rPr>
+      </w:pPr>
+    </w:p>
+    <w:p>
+      <w:pPr>
+        <w:spacing w:line="360" w:lineRule="auto"/>
+        <w:rPr>
+          <w:rFonts w:ascii="Arial" w:hAnsi="Arial" w:cs="Arial"/>
+          <w:sz w:val="24"/>
+          <w:szCs w:val="24"/>
+          <w:lang w:val="en-US"/>
+        </w:rPr>
+      </w:pPr>
+      <w:r>
+        <w:rPr>
+          <w:rFonts w:ascii="Arial" w:hAnsi="Arial" w:cs="Arial"/>
+          <w:sz w:val="24"/>
+          <w:szCs w:val="24"/>
+          <w:lang w:val="en-US"/>
+        </w:rPr>
+        <w:t xml:space="preserve">      totalQualityPoints</w:t>
+      </w:r>
+      <w:r>
+        <w:rPr>
+          <w:rFonts w:ascii="Arial" w:hAnsi="Arial" w:cs="Arial"/>
+          <w:sz w:val="24"/>
+          <w:szCs w:val="24"/>
+          <w:lang w:val="en-US"/>
+        </w:rPr>
+        <w:t xml:space="preserve"> = totalQualityPoints</w:t>
+      </w:r>
+      <w:r>
+        <w:rPr>
+          <w:rFonts w:ascii="Arial" w:hAnsi="Arial" w:cs="Arial"/>
+          <w:sz w:val="24"/>
+          <w:szCs w:val="24"/>
+          <w:lang w:val="en-US"/>
+        </w:rPr>
+        <w:t xml:space="preserve"> + gradePoints</w:t>
+      </w:r>
+      <w:r>
+        <w:rPr>
+          <w:rFonts w:ascii="Arial" w:hAnsi="Arial" w:cs="Arial"/>
+          <w:sz w:val="24"/>
+          <w:szCs w:val="24"/>
+          <w:lang w:val="en-US"/>
+        </w:rPr>
+        <w:t xml:space="preserve"> * </w:t>
+      </w:r>
+      <w:r>
+        <w:rPr>
+          <w:rFonts w:ascii="Arial" w:hAnsi="Arial" w:cs="Arial"/>
+          <w:sz w:val="24"/>
+          <w:szCs w:val="24"/>
+          <w:lang w:val="en-US"/>
+        </w:rPr>
+        <w:t>course.credits</w:t>
+      </w:r>
+    </w:p>
+    <w:p>
+      <w:pPr>
+        <w:spacing w:line="360" w:lineRule="auto"/>
+        <w:rPr>
+          <w:rFonts w:ascii="Arial" w:hAnsi="Arial" w:cs="Arial"/>
+          <w:sz w:val="24"/>
+          <w:szCs w:val="24"/>
+          <w:lang w:val="en-US"/>
+        </w:rPr>
+      </w:pPr>
+    </w:p>
+    <w:p>
+      <w:pPr>
+        <w:spacing w:line="360" w:lineRule="auto"/>
+        <w:rPr>
+          <w:rFonts w:ascii="Arial" w:hAnsi="Arial" w:cs="Arial"/>
+          <w:sz w:val="24"/>
+          <w:szCs w:val="24"/>
+          <w:lang w:val="en-US"/>
+        </w:rPr>
+      </w:pPr>
+      <w:r>
+        <w:rPr>
+          <w:rFonts w:ascii="Arial" w:hAnsi="Arial" w:cs="Arial"/>
+          <w:sz w:val="24"/>
+          <w:szCs w:val="24"/>
+          <w:lang w:val="en-US"/>
+        </w:rPr>
+        <w:t xml:space="preserve">      attemptedCredits</w:t>
+      </w:r>
+      <w:r>
+        <w:rPr>
+          <w:rFonts w:ascii="Arial" w:hAnsi="Arial" w:cs="Arial"/>
+          <w:sz w:val="24"/>
+          <w:szCs w:val="24"/>
+          <w:lang w:val="en-US"/>
+        </w:rPr>
+        <w:t xml:space="preserve"> = attemptedCredits</w:t>
+      </w:r>
+      <w:r>
+        <w:rPr>
+          <w:rFonts w:ascii="Arial" w:hAnsi="Arial" w:cs="Arial"/>
+          <w:sz w:val="24"/>
+          <w:szCs w:val="24"/>
+          <w:lang w:val="en-US"/>
+        </w:rPr>
+        <w:t xml:space="preserve"> + course.credits</w:t>
+      </w:r>
+    </w:p>
+    <w:p>
+      <w:pPr>
+        <w:spacing w:line="360" w:lineRule="auto"/>
+        <w:rPr>
+          <w:rFonts w:ascii="Arial" w:hAnsi="Arial" w:cs="Arial"/>
+          <w:sz w:val="24"/>
+          <w:szCs w:val="24"/>
+          <w:lang w:val="en-US"/>
+        </w:rPr>
+      </w:pPr>
+    </w:p>
+    <w:p>
+      <w:pPr>
+        <w:spacing w:line="360" w:lineRule="auto"/>
+        <w:rPr>
+          <w:rFonts w:ascii="Arial" w:hAnsi="Arial" w:cs="Arial"/>
+          <w:sz w:val="24"/>
+          <w:szCs w:val="24"/>
+          <w:lang w:val="en-US"/>
+        </w:rPr>
+      </w:pPr>
+      <w:r>
+        <w:rPr>
+          <w:rFonts w:ascii="Arial" w:hAnsi="Arial" w:cs="Arial"/>
+          <w:sz w:val="24"/>
+          <w:szCs w:val="24"/>
+          <w:lang w:val="en-US"/>
+        </w:rPr>
+        <w:t xml:space="preserve">   </w:t>
+      </w:r>
+      <w:r>
+        <w:rPr>
+          <w:rFonts w:ascii="Arial" w:hAnsi="Arial" w:cs="Arial"/>
+          <w:sz w:val="24"/>
+          <w:szCs w:val="24"/>
+          <w:lang w:val="en-US"/>
+        </w:rPr>
+        <w:t>END FOR</w:t>
+      </w:r>
+    </w:p>
+    <w:p>
+      <w:pPr>
+        <w:spacing w:line="360" w:lineRule="auto"/>
+        <w:rPr>
+          <w:rFonts w:ascii="Arial" w:hAnsi="Arial" w:cs="Arial"/>
+          <w:sz w:val="24"/>
+          <w:szCs w:val="24"/>
+          <w:lang w:val="en-US"/>
+        </w:rPr>
+      </w:pPr>
+    </w:p>
+    <w:p>
+      <w:pPr>
+        <w:spacing w:line="360" w:lineRule="auto"/>
+        <w:rPr>
+          <w:rFonts w:ascii="Arial" w:hAnsi="Arial" w:cs="Arial"/>
+          <w:sz w:val="24"/>
+          <w:szCs w:val="24"/>
+          <w:lang w:val="en-US"/>
+        </w:rPr>
+      </w:pPr>
+      <w:r>
+        <w:rPr>
+          <w:rFonts w:ascii="Arial" w:hAnsi="Arial" w:cs="Arial"/>
+          <w:sz w:val="24"/>
+          <w:szCs w:val="24"/>
+          <w:lang w:val="en-US"/>
+        </w:rPr>
+        <w:t xml:space="preserve">   </w:t>
+      </w:r>
+      <w:r>
+        <w:rPr>
+          <w:rFonts w:ascii="Arial" w:hAnsi="Arial" w:cs="Arial"/>
+          <w:sz w:val="24"/>
+          <w:szCs w:val="24"/>
+          <w:lang w:val="en-US"/>
+        </w:rPr>
+        <w:t>IF attemptedCredits</w:t>
+      </w:r>
+      <w:r>
+        <w:rPr>
+          <w:rFonts w:ascii="Arial" w:hAnsi="Arial" w:cs="Arial"/>
+          <w:sz w:val="24"/>
+          <w:szCs w:val="24"/>
+          <w:lang w:val="en-US"/>
+        </w:rPr>
+        <w:t xml:space="preserve"> = 0</w:t>
+      </w:r>
+    </w:p>
+    <w:p>
+      <w:pPr>
+        <w:spacing w:line="360" w:lineRule="auto"/>
+        <w:rPr>
+          <w:rFonts w:ascii="Arial" w:hAnsi="Arial" w:cs="Arial"/>
+          <w:sz w:val="24"/>
+          <w:szCs w:val="24"/>
+          <w:lang w:val="en-US"/>
+        </w:rPr>
+      </w:pPr>
+      <w:r>
+        <w:rPr>
+          <w:rFonts w:ascii="Arial" w:hAnsi="Arial" w:cs="Arial"/>
+          <w:sz w:val="24"/>
+          <w:szCs w:val="24"/>
+          <w:lang w:val="en-US"/>
+        </w:rPr>
+        <w:t xml:space="preserve">      RETURN 0</w:t>
+      </w:r>
+    </w:p>
+    <w:p>
+      <w:pPr>
+        <w:spacing w:line="360" w:lineRule="auto"/>
+        <w:rPr>
+          <w:rFonts w:ascii="Arial" w:hAnsi="Arial" w:cs="Arial"/>
+          <w:sz w:val="24"/>
+          <w:szCs w:val="24"/>
+          <w:lang w:val="en-US"/>
+        </w:rPr>
+      </w:pPr>
+      <w:r>
+        <w:rPr>
+          <w:rFonts w:ascii="Arial" w:hAnsi="Arial" w:cs="Arial"/>
+          <w:sz w:val="24"/>
+          <w:szCs w:val="24"/>
+          <w:lang w:val="en-US"/>
+        </w:rPr>
+        <w:t xml:space="preserve">   END IF</w:t>
+      </w:r>
+    </w:p>
+    <w:p>
+      <w:pPr>
+        <w:spacing w:line="360" w:lineRule="auto"/>
+        <w:rPr>
+          <w:rFonts w:ascii="Arial" w:hAnsi="Arial" w:cs="Arial"/>
+          <w:sz w:val="24"/>
+          <w:szCs w:val="24"/>
+          <w:lang w:val="en-US"/>
+        </w:rPr>
+      </w:pPr>
+    </w:p>
+    <w:p>
+      <w:pPr>
+        <w:spacing w:line="360" w:lineRule="auto"/>
+        <w:rPr>
+          <w:rFonts w:ascii="Arial" w:hAnsi="Arial" w:cs="Arial"/>
+          <w:sz w:val="24"/>
+          <w:szCs w:val="24"/>
+          <w:lang w:val="en-US"/>
+        </w:rPr>
+      </w:pPr>
+      <w:r>
+        <w:rPr>
+          <w:rFonts w:ascii="Arial" w:hAnsi="Arial" w:cs="Arial"/>
+          <w:sz w:val="24"/>
+          <w:szCs w:val="24"/>
+          <w:lang w:val="en-US"/>
+        </w:rPr>
+        <w:t xml:space="preserve">   </w:t>
+      </w:r>
+      <w:r>
+        <w:rPr>
+          <w:rFonts w:ascii="Arial" w:hAnsi="Arial" w:cs="Arial"/>
+          <w:sz w:val="24"/>
+          <w:szCs w:val="24"/>
+          <w:lang w:val="en-US"/>
+        </w:rPr>
+        <w:t>RETURN</w:t>
+      </w:r>
+      <w:r>
+        <w:rPr>
+          <w:rFonts w:ascii="Arial" w:hAnsi="Arial" w:cs="Arial"/>
+          <w:sz w:val="24"/>
+          <w:szCs w:val="24"/>
+          <w:lang w:val="en-US"/>
+        </w:rPr>
+        <w:t xml:space="preserve"> </w:t>
+      </w:r>
+      <w:r>
+        <w:rPr>
+          <w:rFonts w:ascii="Arial" w:hAnsi="Arial" w:cs="Arial"/>
+          <w:sz w:val="24"/>
+          <w:szCs w:val="24"/>
+          <w:lang w:val="en-US"/>
+        </w:rPr>
+        <w:t>totalQualityPoints / attemptedCredits</w:t>
+      </w:r>
+    </w:p>
+    <w:p>
+      <w:pPr>
+        <w:spacing w:line="360" w:lineRule="auto"/>
+        <w:rPr>
+          <w:rFonts w:ascii="Arial" w:hAnsi="Arial" w:cs="Arial"/>
+          <w:sz w:val="24"/>
+          <w:szCs w:val="24"/>
+          <w:lang w:val="en-US"/>
+        </w:rPr>
+      </w:pPr>
+    </w:p>
+    <w:p>
+      <w:pPr>
+        <w:spacing w:line="360" w:lineRule="auto"/>
+        <w:rPr>
+          <w:rFonts w:ascii="Arial" w:hAnsi="Arial" w:cs="Arial"/>
+          <w:sz w:val="24"/>
+          <w:szCs w:val="24"/>
+          <w:lang w:val="en-US"/>
+        </w:rPr>
+      </w:pPr>
+      <w:r>
+        <w:rPr>
+          <w:rFonts w:ascii="Arial" w:hAnsi="Arial" w:cs="Arial"/>
+          <w:sz w:val="24"/>
+          <w:szCs w:val="24"/>
+          <w:lang w:val="en-US"/>
+        </w:rPr>
+        <w:t>END FUNCTION</w:t>
+      </w:r>
+    </w:p>
+    <w:p>
+      <w:pPr>
+        <w:spacing w:line="360" w:lineRule="auto"/>
+        <w:rPr>
+          <w:rFonts w:ascii="Arial" w:hAnsi="Arial" w:cs="Arial"/>
+          <w:sz w:val="24"/>
+          <w:szCs w:val="24"/>
+          <w:lang w:val="en-US"/>
+        </w:rPr>
+      </w:pPr>
+    </w:p>
+    <w:p>
+      <w:pPr>
+        <w:spacing w:line="360" w:lineRule="auto"/>
+        <w:rPr>
+          <w:rFonts w:ascii="Arial" w:hAnsi="Arial" w:cs="Arial"/>
+          <w:sz w:val="24"/>
+          <w:szCs w:val="24"/>
+          <w:lang w:val="en-US"/>
+        </w:rPr>
+      </w:pPr>
+      <w:r>
+        <w:rPr>
+          <w:rFonts w:ascii="Arial" w:hAnsi="Arial" w:cs="Arial"/>
+          <w:sz w:val="24"/>
+          <w:szCs w:val="24"/>
+          <w:lang w:val="en-US"/>
+        </w:rPr>
+        <w:t>FUNCTION ConvertGradeToPoints(grade)</w:t>
+      </w:r>
+    </w:p>
+    <w:p>
+      <w:pPr>
+        <w:spacing w:line="360" w:lineRule="auto"/>
+        <w:rPr>
+          <w:rFonts w:ascii="Arial" w:hAnsi="Arial" w:cs="Arial"/>
+          <w:sz w:val="24"/>
+          <w:szCs w:val="24"/>
+          <w:lang w:val="en-US"/>
+        </w:rPr>
+      </w:pPr>
+    </w:p>
+    <w:p>
+      <w:pPr>
+        <w:spacing w:line="360" w:lineRule="auto"/>
+        <w:rPr>
+          <w:rFonts w:ascii="Arial" w:hAnsi="Arial" w:cs="Arial"/>
+          <w:sz w:val="24"/>
+          <w:szCs w:val="24"/>
+          <w:lang w:val="en-US"/>
+        </w:rPr>
+      </w:pPr>
+      <w:r>
+        <w:rPr>
+          <w:rFonts w:ascii="Arial" w:hAnsi="Arial" w:cs="Arial"/>
+          <w:sz w:val="24"/>
+          <w:szCs w:val="24"/>
+          <w:lang w:val="en-US"/>
+        </w:rPr>
+        <w:t xml:space="preserve">   </w:t>
+      </w:r>
+      <w:r>
+        <w:rPr>
+          <w:rFonts w:ascii="Arial" w:hAnsi="Arial" w:cs="Arial"/>
+          <w:sz w:val="24"/>
+          <w:szCs w:val="24"/>
+          <w:lang w:val="en-US"/>
+        </w:rPr>
+        <w:t xml:space="preserve">IF grade = </w:t>
+      </w:r>
+      <w:r>
+        <w:rPr>
+          <w:rFonts w:ascii="Arial" w:hAnsi="Arial" w:cs="Arial"/>
+          <w:sz w:val="24"/>
+          <w:szCs w:val="24"/>
+          <w:lang w:val="en-US"/>
+        </w:rPr>
+        <w:t>“</w:t>
+      </w:r>
+      <w:r>
+        <w:rPr>
+          <w:rFonts w:ascii="Arial" w:hAnsi="Arial" w:cs="Arial"/>
+          <w:sz w:val="24"/>
+          <w:szCs w:val="24"/>
+          <w:lang w:val="en-US"/>
+        </w:rPr>
+        <w:t>A</w:t>
+      </w:r>
+      <w:r>
+        <w:rPr>
+          <w:rFonts w:ascii="Arial" w:hAnsi="Arial" w:cs="Arial"/>
+          <w:sz w:val="24"/>
+          <w:szCs w:val="24"/>
+          <w:lang w:val="en-US"/>
+        </w:rPr>
+        <w:t>”</w:t>
+      </w:r>
+    </w:p>
+    <w:p>
+      <w:pPr>
+        <w:spacing w:line="360" w:lineRule="auto"/>
+        <w:rPr>
+          <w:rFonts w:ascii="Arial" w:hAnsi="Arial" w:cs="Arial"/>
+          <w:sz w:val="24"/>
+          <w:szCs w:val="24"/>
+          <w:lang w:val="en-US"/>
+        </w:rPr>
+      </w:pPr>
+      <w:r>
+        <w:rPr>
+          <w:rFonts w:ascii="Arial" w:hAnsi="Arial" w:cs="Arial"/>
+          <w:sz w:val="24"/>
+          <w:szCs w:val="24"/>
+          <w:lang w:val="en-US"/>
+        </w:rPr>
+        <w:t xml:space="preserve">      RETURN 4.0</w:t>
+      </w:r>
+    </w:p>
+    <w:p>
+      <w:pPr>
+        <w:spacing w:line="360" w:lineRule="auto"/>
+        <w:rPr>
+          <w:rFonts w:ascii="Arial" w:hAnsi="Arial" w:cs="Arial"/>
+          <w:sz w:val="24"/>
+          <w:szCs w:val="24"/>
+          <w:lang w:val="en-US"/>
+        </w:rPr>
+      </w:pPr>
+      <w:r>
+        <w:rPr>
+          <w:rFonts w:ascii="Arial" w:hAnsi="Arial" w:cs="Arial"/>
+          <w:sz w:val="24"/>
+          <w:szCs w:val="24"/>
+          <w:lang w:val="en-US"/>
+        </w:rPr>
+        <w:t xml:space="preserve">   ELSE IF grade = ”</w:t>
+      </w:r>
+      <w:r>
+        <w:rPr>
+          <w:rFonts w:ascii="Arial" w:hAnsi="Arial" w:cs="Arial"/>
+          <w:sz w:val="24"/>
+          <w:szCs w:val="24"/>
+          <w:lang w:val="en-US"/>
+        </w:rPr>
+        <w:t>A-</w:t>
+      </w:r>
+      <w:r>
+        <w:rPr>
+          <w:rFonts w:ascii="Arial" w:hAnsi="Arial" w:cs="Arial"/>
+          <w:sz w:val="24"/>
+          <w:szCs w:val="24"/>
+          <w:lang w:val="en-US"/>
+        </w:rPr>
+        <w:t>”</w:t>
+      </w:r>
+    </w:p>
+    <w:p>
+      <w:pPr>
+        <w:spacing w:line="360" w:lineRule="auto"/>
+        <w:rPr>
+          <w:rFonts w:ascii="Arial" w:hAnsi="Arial" w:cs="Arial"/>
+          <w:sz w:val="24"/>
+          <w:szCs w:val="24"/>
+          <w:lang w:val="en-US"/>
+        </w:rPr>
+      </w:pPr>
+      <w:r>
+        <w:rPr>
+          <w:rFonts w:ascii="Arial" w:hAnsi="Arial" w:cs="Arial"/>
+          <w:sz w:val="24"/>
+          <w:szCs w:val="24"/>
+          <w:lang w:val="en-US"/>
+        </w:rPr>
+        <w:t xml:space="preserve">      RETURN 3.7</w:t>
+      </w:r>
+    </w:p>
+    <w:p>
+      <w:pPr>
+        <w:spacing w:line="360" w:lineRule="auto"/>
+        <w:rPr>
+          <w:rFonts w:ascii="Arial" w:hAnsi="Arial" w:cs="Arial"/>
+          <w:sz w:val="24"/>
+          <w:szCs w:val="24"/>
+          <w:lang w:val="en-US"/>
+        </w:rPr>
+      </w:pPr>
+      <w:r>
+        <w:rPr>
+          <w:rFonts w:ascii="Arial" w:hAnsi="Arial" w:cs="Arial"/>
+          <w:sz w:val="24"/>
+          <w:szCs w:val="24"/>
+          <w:lang w:val="en-US"/>
+        </w:rPr>
+        <w:lastRenderedPageBreak/>
+        <w:t xml:space="preserve">   ELSE IF</w:t>
+      </w:r>
+      <w:r>
+        <w:rPr>
+          <w:rFonts w:ascii="Arial" w:hAnsi="Arial" w:cs="Arial"/>
+          <w:sz w:val="24"/>
+          <w:szCs w:val="24"/>
+          <w:lang w:val="en-US"/>
+        </w:rPr>
+        <w:t xml:space="preserve"> grade = “B+”</w:t>
+      </w:r>
+    </w:p>
+    <w:p>
+      <w:pPr>
+        <w:spacing w:line="360" w:lineRule="auto"/>
+        <w:rPr>
+          <w:rFonts w:ascii="Arial" w:hAnsi="Arial" w:cs="Arial"/>
+          <w:sz w:val="24"/>
+          <w:szCs w:val="24"/>
+          <w:lang w:val="en-US"/>
+        </w:rPr>
+      </w:pPr>
+      <w:r>
+        <w:rPr>
+          <w:rFonts w:ascii="Arial" w:hAnsi="Arial" w:cs="Arial"/>
+          <w:sz w:val="24"/>
+          <w:szCs w:val="24"/>
+          <w:lang w:val="en-US"/>
+        </w:rPr>
+        <w:t xml:space="preserve">      RETURN</w:t>
+      </w:r>
+      <w:r>
+        <w:rPr>
+          <w:rFonts w:ascii="Arial" w:hAnsi="Arial" w:cs="Arial"/>
+          <w:sz w:val="24"/>
+          <w:szCs w:val="24"/>
+          <w:lang w:val="en-US"/>
+        </w:rPr>
+        <w:t xml:space="preserve"> </w:t>
+      </w:r>
+      <w:r>
+        <w:rPr>
+          <w:rFonts w:ascii="Arial" w:hAnsi="Arial" w:cs="Arial"/>
+          <w:sz w:val="24"/>
+          <w:szCs w:val="24"/>
+          <w:lang w:val="en-US"/>
+        </w:rPr>
+        <w:t>3.3</w:t>
+      </w:r>
+    </w:p>
+    <w:p>
+      <w:pPr>
+        <w:spacing w:line="360" w:lineRule="auto"/>
+        <w:rPr>
+          <w:rFonts w:ascii="Arial" w:hAnsi="Arial" w:cs="Arial"/>
+          <w:sz w:val="24"/>
+          <w:szCs w:val="24"/>
+          <w:lang w:val="en-US"/>
+        </w:rPr>
+      </w:pPr>
+      <w:r>
+        <w:rPr>
+          <w:rFonts w:ascii="Arial" w:hAnsi="Arial" w:cs="Arial"/>
+          <w:sz w:val="24"/>
+          <w:szCs w:val="24"/>
+          <w:lang w:val="en-US"/>
+        </w:rPr>
+        <w:t xml:space="preserve">   ELSE IF grade = “B”</w:t>
+      </w:r>
+    </w:p>
+    <w:p>
+      <w:pPr>
+        <w:spacing w:line="360" w:lineRule="auto"/>
+        <w:rPr>
+          <w:rFonts w:ascii="Arial" w:hAnsi="Arial" w:cs="Arial"/>
+          <w:sz w:val="24"/>
+          <w:szCs w:val="24"/>
+          <w:lang w:val="en-US"/>
+        </w:rPr>
+      </w:pPr>
+      <w:r>
+        <w:rPr>
+          <w:rFonts w:ascii="Arial" w:hAnsi="Arial" w:cs="Arial"/>
+          <w:sz w:val="24"/>
+          <w:szCs w:val="24"/>
+          <w:lang w:val="en-US"/>
+        </w:rPr>
+        <w:t xml:space="preserve">      RETURN 3.0</w:t>
+      </w:r>
+    </w:p>
+    <w:p>
+      <w:pPr>
+        <w:spacing w:line="360" w:lineRule="auto"/>
+        <w:rPr>
+          <w:rFonts w:ascii="Arial" w:hAnsi="Arial" w:cs="Arial"/>
+          <w:sz w:val="24"/>
+          <w:szCs w:val="24"/>
+          <w:lang w:val="en-US"/>
+        </w:rPr>
+      </w:pPr>
+      <w:r>
+        <w:rPr>
+          <w:rFonts w:ascii="Arial" w:hAnsi="Arial" w:cs="Arial"/>
+          <w:sz w:val="24"/>
+          <w:szCs w:val="24"/>
+          <w:lang w:val="en-US"/>
+        </w:rPr>
+        <w:t xml:space="preserve">   ELSE IF grade = “B-”</w:t>
+      </w:r>
+    </w:p>
+    <w:p>
+      <w:pPr>
+        <w:spacing w:line="360" w:lineRule="auto"/>
+        <w:rPr>
+          <w:rFonts w:ascii="Arial" w:hAnsi="Arial" w:cs="Arial"/>
+          <w:sz w:val="24"/>
+          <w:szCs w:val="24"/>
+          <w:lang w:val="en-US"/>
+        </w:rPr>
+      </w:pPr>
+      <w:r>
+        <w:rPr>
+          <w:rFonts w:ascii="Arial" w:hAnsi="Arial" w:cs="Arial"/>
+          <w:sz w:val="24"/>
+          <w:szCs w:val="24"/>
+          <w:lang w:val="en-US"/>
+        </w:rPr>
+        <w:t xml:space="preserve">      RETURN 2.7</w:t>
+      </w:r>
+    </w:p>
+    <w:p>
+      <w:pPr>
+        <w:spacing w:line="360" w:lineRule="auto"/>
+        <w:rPr>
+          <w:rFonts w:ascii="Arial" w:hAnsi="Arial" w:cs="Arial"/>
+          <w:sz w:val="24"/>
+          <w:szCs w:val="24"/>
+          <w:lang w:val="en-US"/>
+        </w:rPr>
+      </w:pPr>
+      <w:r>
+        <w:rPr>
+          <w:rFonts w:ascii="Arial" w:hAnsi="Arial" w:cs="Arial"/>
+          <w:sz w:val="24"/>
+          <w:szCs w:val="24"/>
+          <w:lang w:val="en-US"/>
+        </w:rPr>
+        <w:t xml:space="preserve">   ELSE IF grade = “C+”</w:t>
+      </w:r>
+    </w:p>
+    <w:p>
+      <w:pPr>
+        <w:spacing w:line="360" w:lineRule="auto"/>
+        <w:rPr>
+          <w:rFonts w:ascii="Arial" w:hAnsi="Arial" w:cs="Arial"/>
+          <w:sz w:val="24"/>
+          <w:szCs w:val="24"/>
+          <w:lang w:val="en-US"/>
+        </w:rPr>
+      </w:pPr>
+      <w:r>
+        <w:rPr>
+          <w:rFonts w:ascii="Arial" w:hAnsi="Arial" w:cs="Arial"/>
+          <w:sz w:val="24"/>
+          <w:szCs w:val="24"/>
+          <w:lang w:val="en-US"/>
+        </w:rPr>
+        <w:t xml:space="preserve">      RETURN </w:t>
+      </w:r>
+      <w:r>
+        <w:rPr>
+          <w:rFonts w:ascii="Arial" w:hAnsi="Arial" w:cs="Arial"/>
+          <w:sz w:val="24"/>
+          <w:szCs w:val="24"/>
+          <w:lang w:val="en-US"/>
+        </w:rPr>
+        <w:t>2.3</w:t>
+      </w:r>
+    </w:p>
+    <w:p>
+      <w:pPr>
+        <w:spacing w:line="360" w:lineRule="auto"/>
+        <w:rPr>
+          <w:rFonts w:ascii="Arial" w:hAnsi="Arial" w:cs="Arial"/>
+          <w:sz w:val="24"/>
+          <w:szCs w:val="24"/>
+          <w:lang w:val="en-US"/>
+        </w:rPr>
+      </w:pPr>
+      <w:r>
+        <w:rPr>
+          <w:rFonts w:ascii="Arial" w:hAnsi="Arial" w:cs="Arial"/>
+          <w:sz w:val="24"/>
+          <w:szCs w:val="24"/>
+          <w:lang w:val="en-US"/>
+        </w:rPr>
+        <w:t xml:space="preserve">   ELSE IF grade = “C”</w:t>
+      </w:r>
+    </w:p>
+    <w:p>
+      <w:pPr>
+        <w:spacing w:line="360" w:lineRule="auto"/>
+        <w:rPr>
+          <w:rFonts w:ascii="Arial" w:hAnsi="Arial" w:cs="Arial"/>
+          <w:sz w:val="24"/>
+          <w:szCs w:val="24"/>
+          <w:lang w:val="en-US"/>
+        </w:rPr>
+      </w:pPr>
+      <w:r>
+        <w:rPr>
+          <w:rFonts w:ascii="Arial" w:hAnsi="Arial" w:cs="Arial"/>
+          <w:sz w:val="24"/>
+          <w:szCs w:val="24"/>
+          <w:lang w:val="en-US"/>
+        </w:rPr>
+        <w:t xml:space="preserve">      RETURN 2.0</w:t>
+      </w:r>
+    </w:p>
+    <w:p>
+      <w:pPr>
+        <w:spacing w:line="360" w:lineRule="auto"/>
+        <w:rPr>
+          <w:rFonts w:ascii="Arial" w:hAnsi="Arial" w:cs="Arial"/>
+          <w:sz w:val="24"/>
+          <w:szCs w:val="24"/>
+          <w:lang w:val="en-US"/>
+        </w:rPr>
+      </w:pPr>
+      <w:r>
+        <w:rPr>
+          <w:rFonts w:ascii="Arial" w:hAnsi="Arial" w:cs="Arial"/>
+          <w:sz w:val="24"/>
+          <w:szCs w:val="24"/>
+          <w:lang w:val="en-US"/>
+        </w:rPr>
+        <w:t xml:space="preserve">   ELSE IF grade = “C-”</w:t>
+      </w:r>
+    </w:p>
+    <w:p>
+      <w:pPr>
+        <w:spacing w:line="360" w:lineRule="auto"/>
+        <w:rPr>
+          <w:rFonts w:ascii="Arial" w:hAnsi="Arial" w:cs="Arial"/>
+          <w:sz w:val="24"/>
+          <w:szCs w:val="24"/>
+          <w:lang w:val="en-US"/>
+        </w:rPr>
+      </w:pPr>
+      <w:r>
+        <w:rPr>
+          <w:rFonts w:ascii="Arial" w:hAnsi="Arial" w:cs="Arial"/>
+          <w:sz w:val="24"/>
+          <w:szCs w:val="24"/>
+          <w:lang w:val="en-US"/>
+        </w:rPr>
+        <w:t xml:space="preserve">      RETURN 1.7</w:t>
+      </w:r>
+    </w:p>
+    <w:p>
+      <w:pPr>
+        <w:spacing w:line="360" w:lineRule="auto"/>
+        <w:rPr>
+          <w:rFonts w:ascii="Arial" w:hAnsi="Arial" w:cs="Arial"/>
+          <w:sz w:val="24"/>
+          <w:szCs w:val="24"/>
+          <w:lang w:val="en-US"/>
+        </w:rPr>
+      </w:pPr>
+      <w:r>
+        <w:rPr>
+          <w:rFonts w:ascii="Arial" w:hAnsi="Arial" w:cs="Arial"/>
+          <w:sz w:val="24"/>
+          <w:szCs w:val="24"/>
+          <w:lang w:val="en-US"/>
+        </w:rPr>
+        <w:t xml:space="preserve">   ELSE IF grade = “</w:t>
+      </w:r>
+      <w:r>
+        <w:rPr>
+          <w:rFonts w:ascii="Arial" w:hAnsi="Arial" w:cs="Arial"/>
+          <w:sz w:val="24"/>
+          <w:szCs w:val="24"/>
+          <w:lang w:val="en-US"/>
+        </w:rPr>
+        <w:t>D+</w:t>
+      </w:r>
+      <w:r>
+        <w:rPr>
+          <w:rFonts w:ascii="Arial" w:hAnsi="Arial" w:cs="Arial"/>
+          <w:sz w:val="24"/>
+          <w:szCs w:val="24"/>
+          <w:lang w:val="en-US"/>
+        </w:rPr>
+        <w:t>”</w:t>
+      </w:r>
+    </w:p>
+    <w:p>
+      <w:pPr>
+        <w:spacing w:line="360" w:lineRule="auto"/>
+        <w:rPr>
+          <w:rFonts w:ascii="Arial" w:hAnsi="Arial" w:cs="Arial"/>
+          <w:sz w:val="24"/>
+          <w:szCs w:val="24"/>
+          <w:lang w:val="en-US"/>
+        </w:rPr>
+      </w:pPr>
+      <w:r>
+        <w:rPr>
+          <w:rFonts w:ascii="Arial" w:hAnsi="Arial" w:cs="Arial"/>
+          <w:sz w:val="24"/>
+          <w:szCs w:val="24"/>
+          <w:lang w:val="en-US"/>
+        </w:rPr>
+        <w:t xml:space="preserve">      RETURN 1.3</w:t>
+      </w:r>
+    </w:p>
+    <w:p>
+      <w:pPr>
+        <w:spacing w:line="360" w:lineRule="auto"/>
+        <w:rPr>
+          <w:rFonts w:ascii="Arial" w:hAnsi="Arial" w:cs="Arial"/>
+          <w:sz w:val="24"/>
+          <w:szCs w:val="24"/>
+          <w:lang w:val="en-US"/>
+        </w:rPr>
+      </w:pPr>
+      <w:r>
+        <w:rPr>
+          <w:rFonts w:ascii="Arial" w:hAnsi="Arial" w:cs="Arial"/>
+          <w:sz w:val="24"/>
+          <w:szCs w:val="24"/>
+          <w:lang w:val="en-US"/>
+        </w:rPr>
+        <w:t xml:space="preserve">   ELSE IF grade = “D”</w:t>
+      </w:r>
+    </w:p>
+    <w:p>
+      <w:pPr>
+        <w:spacing w:line="360" w:lineRule="auto"/>
+        <w:rPr>
+          <w:rFonts w:ascii="Arial" w:hAnsi="Arial" w:cs="Arial"/>
+          <w:sz w:val="24"/>
+          <w:szCs w:val="24"/>
+          <w:lang w:val="en-US"/>
+        </w:rPr>
+      </w:pPr>
+      <w:r>
+        <w:rPr>
+          <w:rFonts w:ascii="Arial" w:hAnsi="Arial" w:cs="Arial"/>
+          <w:sz w:val="24"/>
+          <w:szCs w:val="24"/>
+          <w:lang w:val="en-US"/>
+        </w:rPr>
+        <w:t xml:space="preserve">      RETURN 1.0</w:t>
+      </w:r>
+    </w:p>
+    <w:p>
+      <w:pPr>
+        <w:spacing w:line="360" w:lineRule="auto"/>
+        <w:rPr>
+          <w:rFonts w:ascii="Arial" w:hAnsi="Arial" w:cs="Arial"/>
+          <w:sz w:val="24"/>
+          <w:szCs w:val="24"/>
+          <w:lang w:val="en-US"/>
+        </w:rPr>
+      </w:pPr>
+      <w:r>
+        <w:rPr>
+          <w:rFonts w:ascii="Arial" w:hAnsi="Arial" w:cs="Arial"/>
+          <w:sz w:val="24"/>
+          <w:szCs w:val="24"/>
+          <w:lang w:val="en-US"/>
+        </w:rPr>
+        <w:t xml:space="preserve">   ELSE IF grade = “F”</w:t>
+      </w:r>
+    </w:p>
+    <w:p>
+      <w:pPr>
+        <w:spacing w:line="360" w:lineRule="auto"/>
+        <w:rPr>
+          <w:rFonts w:ascii="Arial" w:hAnsi="Arial" w:cs="Arial"/>
+          <w:sz w:val="24"/>
+          <w:szCs w:val="24"/>
+          <w:lang w:val="en-US"/>
+        </w:rPr>
+      </w:pPr>
+      <w:r>
+        <w:rPr>
+          <w:rFonts w:ascii="Arial" w:hAnsi="Arial" w:cs="Arial"/>
+          <w:sz w:val="24"/>
+          <w:szCs w:val="24"/>
+          <w:lang w:val="en-US"/>
+        </w:rPr>
+        <w:t xml:space="preserve">      RETURN 0.0</w:t>
+      </w:r>
+    </w:p>
+    <w:p>
+      <w:pPr>
+        <w:spacing w:line="360" w:lineRule="auto"/>
+        <w:rPr>
+          <w:rFonts w:ascii="Arial" w:hAnsi="Arial" w:cs="Arial"/>
+          <w:sz w:val="24"/>
+          <w:szCs w:val="24"/>
+          <w:lang w:val="en-US"/>
+        </w:rPr>
+      </w:pPr>
+      <w:r>
+        <w:rPr>
+          <w:rFonts w:ascii="Arial" w:hAnsi="Arial" w:cs="Arial"/>
+          <w:sz w:val="24"/>
+          <w:szCs w:val="24"/>
+          <w:lang w:val="en-US"/>
+        </w:rPr>
+        <w:t xml:space="preserve">   END IF</w:t>
+      </w:r>
+    </w:p>
+    <w:p>
+      <w:pPr>
+        <w:spacing w:line="360" w:lineRule="auto"/>
+        <w:rPr>
+          <w:rFonts w:ascii="Arial" w:hAnsi="Arial" w:cs="Arial"/>
+          <w:sz w:val="24"/>
+          <w:szCs w:val="24"/>
+          <w:lang w:val="en-US"/>
+        </w:rPr>
+      </w:pPr>
+    </w:p>
+    <w:p>
+      <w:pPr>
+        <w:spacing w:line="360" w:lineRule="auto"/>
+        <w:rPr>
+          <w:rFonts w:ascii="Arial" w:hAnsi="Arial" w:cs="Arial"/>
+          <w:sz w:val="24"/>
+          <w:szCs w:val="24"/>
+          <w:lang w:val="en-US"/>
+        </w:rPr>
+      </w:pPr>
+      <w:r>
+        <w:rPr>
+          <w:rFonts w:ascii="Arial" w:hAnsi="Arial" w:cs="Arial"/>
+          <w:sz w:val="24"/>
+          <w:szCs w:val="24"/>
+          <w:lang w:val="en-US"/>
+        </w:rPr>
+        <w:t>END FUNCTION</w:t>
+      </w:r>
+    </w:p>
+    <w:p>
+      <w:pPr>
+        <w:spacing w:line="360" w:lineRule="auto"/>
+        <w:rPr>
+          <w:rFonts w:ascii="Arial" w:hAnsi="Arial" w:cs="Arial"/>
+          <w:sz w:val="24"/>
+          <w:szCs w:val="24"/>
+          <w:lang w:val="en-US"/>
+        </w:rPr>
+      </w:pPr>
+    </w:p>
+    <w:p>
+      <w:pPr>
+        <w:spacing w:line="360" w:lineRule="auto"/>
+        <w:rPr>
+          <w:rFonts w:ascii="Arial" w:hAnsi="Arial" w:cs="Arial"/>
+          <w:sz w:val="24"/>
+          <w:szCs w:val="24"/>
+          <w:lang w:val="en-US"/>
+        </w:rPr>
+      </w:pPr>
+      <w:r>
+        <w:rPr>
+          <w:rFonts w:ascii="Arial" w:hAnsi="Arial" w:cs="Arial"/>
+          <w:sz w:val="24"/>
+          <w:szCs w:val="24"/>
+          <w:lang w:val="en-US"/>
+        </w:rPr>
+        <w:t>FUNCTION</w:t>
+      </w:r>
+      <w:r>
+        <w:rPr>
+          <w:rFonts w:ascii="Arial" w:hAnsi="Arial" w:cs="Arial"/>
+          <w:sz w:val="24"/>
+          <w:szCs w:val="24"/>
+          <w:lang w:val="en-US"/>
+        </w:rPr>
+        <w:t xml:space="preserve"> CalculateProjectedGPA(</w:t>
+      </w:r>
+      <w:r>
+        <w:rPr>
+          <w:rFonts w:ascii="Arial" w:hAnsi="Arial" w:cs="Arial"/>
+          <w:sz w:val="24"/>
+          <w:szCs w:val="24"/>
+          <w:lang w:val="en-US"/>
+        </w:rPr>
+        <w:t>currentCourses,</w:t>
+      </w:r>
+      <w:r>
+        <w:rPr>
+          <w:rFonts w:ascii="Arial" w:hAnsi="Arial" w:cs="Arial"/>
+          <w:sz w:val="24"/>
+          <w:szCs w:val="24"/>
+          <w:lang w:val="en-US"/>
+        </w:rPr>
+        <w:t xml:space="preserve"> hypothetical</w:t>
+      </w:r>
+      <w:r>
+        <w:rPr>
+          <w:rFonts w:ascii="Arial" w:hAnsi="Arial" w:cs="Arial"/>
+          <w:sz w:val="24"/>
+          <w:szCs w:val="24"/>
+          <w:lang w:val="en-US"/>
+        </w:rPr>
+        <w:t>Courses</w:t>
+      </w:r>
+      <w:r>
+        <w:rPr>
+          <w:rFonts w:ascii="Arial" w:hAnsi="Arial" w:cs="Arial"/>
+          <w:sz w:val="24"/>
+          <w:szCs w:val="24"/>
+          <w:lang w:val="en-US"/>
+        </w:rPr>
+        <w:t>)</w:t>
+      </w:r>
+    </w:p>
+    <w:p>
+      <w:pPr>
+        <w:spacing w:line="360" w:lineRule="auto"/>
+        <w:rPr>
+          <w:rFonts w:ascii="Arial" w:hAnsi="Arial" w:cs="Arial"/>
+          <w:sz w:val="24"/>
+          <w:szCs w:val="24"/>
+          <w:lang w:val="en-US"/>
+        </w:rPr>
+      </w:pPr>
+    </w:p>
+    <w:p>
+      <w:pPr>
+        <w:spacing w:line="360" w:lineRule="auto"/>
+        <w:rPr>
+          <w:rFonts w:ascii="Arial" w:hAnsi="Arial" w:cs="Arial"/>
+          <w:sz w:val="24"/>
+          <w:szCs w:val="24"/>
+          <w:lang w:val="en-US"/>
+        </w:rPr>
+      </w:pPr>
+      <w:r>
+        <w:rPr>
+          <w:rFonts w:ascii="Arial" w:hAnsi="Arial" w:cs="Arial"/>
+          <w:sz w:val="24"/>
+          <w:szCs w:val="24"/>
+          <w:lang w:val="en-US"/>
+        </w:rPr>
+        <w:lastRenderedPageBreak/>
+        <w:t xml:space="preserve">   currentQualityPoints = </w:t>
+      </w:r>
+      <w:r>
+        <w:rPr>
+          <w:rFonts w:ascii="Arial" w:hAnsi="Arial" w:cs="Arial"/>
+          <w:sz w:val="24"/>
+          <w:szCs w:val="24"/>
+          <w:lang w:val="en-US"/>
+        </w:rPr>
+        <w:t>CalculateQualityPoints</w:t>
+      </w:r>
+      <w:r>
+        <w:rPr>
+          <w:rFonts w:ascii="Arial" w:hAnsi="Arial" w:cs="Arial"/>
+          <w:sz w:val="24"/>
+          <w:szCs w:val="24"/>
+          <w:lang w:val="en-US"/>
+        </w:rPr>
+        <w:t>(</w:t>
+      </w:r>
+      <w:r>
+        <w:rPr>
+          <w:rFonts w:ascii="Arial" w:hAnsi="Arial" w:cs="Arial"/>
+          <w:sz w:val="24"/>
+          <w:szCs w:val="24"/>
+          <w:lang w:val="en-US"/>
+        </w:rPr>
+        <w:t>currentCourses</w:t>
+      </w:r>
+      <w:r>
+        <w:rPr>
+          <w:rFonts w:ascii="Arial" w:hAnsi="Arial" w:cs="Arial"/>
+          <w:sz w:val="24"/>
+          <w:szCs w:val="24"/>
+          <w:lang w:val="en-US"/>
+        </w:rPr>
+        <w:t>)</w:t>
+      </w:r>
+    </w:p>
+    <w:p>
+      <w:pPr>
+        <w:spacing w:line="360" w:lineRule="auto"/>
+        <w:rPr>
+          <w:rFonts w:ascii="Arial" w:hAnsi="Arial" w:cs="Arial"/>
+          <w:sz w:val="24"/>
+          <w:szCs w:val="24"/>
+          <w:lang w:val="en-US"/>
+        </w:rPr>
+      </w:pPr>
+    </w:p>
+    <w:p>
+      <w:pPr>
+        <w:spacing w:line="360" w:lineRule="auto"/>
+        <w:rPr>
+          <w:rFonts w:ascii="Arial" w:hAnsi="Arial" w:cs="Arial"/>
+          <w:sz w:val="24"/>
+          <w:szCs w:val="24"/>
+          <w:lang w:val="en-US"/>
+        </w:rPr>
+      </w:pPr>
+      <w:r>
+        <w:rPr>
+          <w:rFonts w:ascii="Arial" w:hAnsi="Arial" w:cs="Arial"/>
+          <w:sz w:val="24"/>
+          <w:szCs w:val="24"/>
+          <w:lang w:val="en-US"/>
+        </w:rPr>
+        <w:t xml:space="preserve">   futureQualityPoints = CalculateQualityPoints(hypotheticalCourses)</w:t>
+      </w:r>
+    </w:p>
+    <w:p>
+      <w:pPr>
+        <w:spacing w:line="360" w:lineRule="auto"/>
+        <w:rPr>
+          <w:rFonts w:ascii="Arial" w:hAnsi="Arial" w:cs="Arial"/>
+          <w:sz w:val="24"/>
+          <w:szCs w:val="24"/>
+          <w:lang w:val="en-US"/>
+        </w:rPr>
+      </w:pPr>
+    </w:p>
+    <w:p>
+      <w:pPr>
+        <w:spacing w:line="360" w:lineRule="auto"/>
+        <w:rPr>
+          <w:rFonts w:ascii="Arial" w:hAnsi="Arial" w:cs="Arial"/>
+          <w:sz w:val="24"/>
+          <w:szCs w:val="24"/>
+          <w:lang w:val="en-US"/>
+        </w:rPr>
+      </w:pPr>
+      <w:r>
+        <w:rPr>
+          <w:rFonts w:ascii="Arial" w:hAnsi="Arial" w:cs="Arial"/>
+          <w:sz w:val="24"/>
+          <w:szCs w:val="24"/>
+          <w:lang w:val="en-US"/>
+        </w:rPr>
+        <w:t xml:space="preserve">   </w:t>
+      </w:r>
+      <w:r>
+        <w:rPr>
+          <w:rFonts w:ascii="Arial" w:hAnsi="Arial" w:cs="Arial"/>
+          <w:sz w:val="24"/>
+          <w:szCs w:val="24"/>
+          <w:lang w:val="en-US"/>
+        </w:rPr>
+        <w:t>currentCredits</w:t>
+      </w:r>
+      <w:r>
+        <w:rPr>
+          <w:rFonts w:ascii="Arial" w:hAnsi="Arial" w:cs="Arial"/>
+          <w:sz w:val="24"/>
+          <w:szCs w:val="24"/>
+          <w:lang w:val="en-US"/>
+        </w:rPr>
+        <w:t xml:space="preserve"> = CalculateAttemptedCredits</w:t>
+      </w:r>
+      <w:r>
+        <w:rPr>
+          <w:rFonts w:ascii="Arial" w:hAnsi="Arial" w:cs="Arial"/>
+          <w:sz w:val="24"/>
+          <w:szCs w:val="24"/>
+          <w:lang w:val="en-US"/>
+        </w:rPr>
+        <w:t>(</w:t>
+      </w:r>
+      <w:r>
+        <w:rPr>
+          <w:rFonts w:ascii="Arial" w:hAnsi="Arial" w:cs="Arial"/>
+          <w:sz w:val="24"/>
+          <w:szCs w:val="24"/>
+          <w:lang w:val="en-US"/>
+        </w:rPr>
+        <w:t>currentCourses</w:t>
+      </w:r>
+      <w:r>
+        <w:rPr>
+          <w:rFonts w:ascii="Arial" w:hAnsi="Arial" w:cs="Arial"/>
+          <w:sz w:val="24"/>
+          <w:szCs w:val="24"/>
+          <w:lang w:val="en-US"/>
+        </w:rPr>
+        <w:t>)</w:t>
+      </w:r>
+    </w:p>
+    <w:p>
+      <w:pPr>
+        <w:spacing w:line="360" w:lineRule="auto"/>
+        <w:rPr>
+          <w:rFonts w:ascii="Arial" w:hAnsi="Arial" w:cs="Arial"/>
+          <w:sz w:val="24"/>
+          <w:szCs w:val="24"/>
+          <w:lang w:val="en-US"/>
+        </w:rPr>
+      </w:pPr>
+    </w:p>
+    <w:p>
+      <w:pPr>
+        <w:spacing w:line="360" w:lineRule="auto"/>
+        <w:rPr>
+          <w:rFonts w:ascii="Arial" w:hAnsi="Arial" w:cs="Arial"/>
+          <w:sz w:val="24"/>
+          <w:szCs w:val="24"/>
+          <w:lang w:val="en-US"/>
+        </w:rPr>
+      </w:pPr>
+      <w:r>
+        <w:rPr>
+          <w:rFonts w:ascii="Arial" w:hAnsi="Arial" w:cs="Arial"/>
+          <w:sz w:val="24"/>
+          <w:szCs w:val="24"/>
+          <w:lang w:val="en-US"/>
+        </w:rPr>
+        <w:t xml:space="preserve">   futureCredits</w:t>
+      </w:r>
+      <w:r>
+        <w:rPr>
+          <w:rFonts w:ascii="Arial" w:hAnsi="Arial" w:cs="Arial"/>
+          <w:sz w:val="24"/>
+          <w:szCs w:val="24"/>
+          <w:lang w:val="en-US"/>
+        </w:rPr>
+        <w:t xml:space="preserve"> = CalculateAttemptedCredits(hypotheticalCourses)</w:t>
+      </w:r>
+    </w:p>
+    <w:p>
+      <w:pPr>
+        <w:spacing w:line="360" w:lineRule="auto"/>
+        <w:rPr>
+          <w:rFonts w:ascii="Arial" w:hAnsi="Arial" w:cs="Arial"/>
+          <w:sz w:val="24"/>
+          <w:szCs w:val="24"/>
+          <w:lang w:val="en-US"/>
+        </w:rPr>
+      </w:pPr>
+    </w:p>
+    <w:p>
+      <w:pPr>
+        <w:spacing w:line="360" w:lineRule="auto"/>
+        <w:ind w:left="204"/>
+        <w:rPr>
+          <w:rFonts w:ascii="Arial" w:hAnsi="Arial" w:cs="Arial"/>
+          <w:sz w:val="24"/>
+          <w:szCs w:val="24"/>
+          <w:lang w:val="en-US"/>
+        </w:rPr>
+      </w:pPr>
+      <w:r>
+        <w:rPr>
+          <w:rFonts w:ascii="Arial" w:hAnsi="Arial" w:cs="Arial"/>
+          <w:sz w:val="24"/>
+          <w:szCs w:val="24"/>
+          <w:lang w:val="en-US"/>
+        </w:rPr>
+        <w:t>projectedGPA</w:t>
+      </w:r>
+      <w:r>
+        <w:rPr>
+          <w:rFonts w:ascii="Arial" w:hAnsi="Arial" w:cs="Arial"/>
+          <w:sz w:val="24"/>
+          <w:szCs w:val="24"/>
+          <w:lang w:val="en-US"/>
+        </w:rPr>
+        <w:t xml:space="preserve"> = (</w:t>
+      </w:r>
+      <w:r>
+        <w:rPr>
+          <w:rFonts w:ascii="Arial" w:hAnsi="Arial" w:cs="Arial"/>
+          <w:sz w:val="24"/>
+          <w:szCs w:val="24"/>
+          <w:lang w:val="en-US"/>
+        </w:rPr>
+        <w:t>currentQualityPoints</w:t>
+      </w:r>
+      <w:r>
+        <w:rPr>
+          <w:rFonts w:ascii="Arial" w:hAnsi="Arial" w:cs="Arial"/>
+          <w:sz w:val="24"/>
+          <w:szCs w:val="24"/>
+          <w:lang w:val="en-US"/>
+        </w:rPr>
+        <w:t xml:space="preserve"> + futureQualityPoints</w:t>
+      </w:r>
+      <w:r>
+        <w:rPr>
+          <w:rFonts w:ascii="Arial" w:hAnsi="Arial" w:cs="Arial"/>
+          <w:sz w:val="24"/>
+          <w:szCs w:val="24"/>
+          <w:lang w:val="en-US"/>
+        </w:rPr>
+        <w:t>) / (</w:t>
+      </w:r>
+      <w:r>
+        <w:rPr>
+          <w:rFonts w:ascii="Arial" w:hAnsi="Arial" w:cs="Arial"/>
+          <w:sz w:val="24"/>
+          <w:szCs w:val="24"/>
+          <w:lang w:val="en-US"/>
+        </w:rPr>
+        <w:t>currentCredits +</w:t>
+      </w:r>
+      <w:r>
+        <w:rPr>
+          <w:rFonts w:ascii="Arial" w:hAnsi="Arial" w:cs="Arial"/>
+          <w:sz w:val="24"/>
+          <w:szCs w:val="24"/>
+          <w:lang w:val="en-US"/>
+        </w:rPr>
+        <w:t xml:space="preserve"> </w:t>
+      </w:r>
+      <w:r>
+        <w:rPr>
+          <w:rFonts w:ascii="Arial" w:hAnsi="Arial" w:cs="Arial"/>
+          <w:sz w:val="24"/>
+          <w:szCs w:val="24"/>
+          <w:lang w:val="en-US"/>
+        </w:rPr>
+        <w:t>futureCredits</w:t>
+      </w:r>
+      <w:r>
+        <w:rPr>
+          <w:rFonts w:ascii="Arial" w:hAnsi="Arial" w:cs="Arial"/>
+          <w:sz w:val="24"/>
+          <w:szCs w:val="24"/>
+          <w:lang w:val="en-US"/>
+        </w:rPr>
+        <w:t>)</w:t>
+      </w:r>
+    </w:p>
+    <w:p>
+      <w:pPr>
+        <w:spacing w:line="360" w:lineRule="auto"/>
+        <w:ind w:left="204"/>
+        <w:rPr>
+          <w:rFonts w:ascii="Arial" w:hAnsi="Arial" w:cs="Arial"/>
+          <w:sz w:val="24"/>
+          <w:szCs w:val="24"/>
+          <w:lang w:val="en-US"/>
+        </w:rPr>
+      </w:pPr>
+    </w:p>
+    <w:p>
+      <w:pPr>
+        <w:spacing w:line="360" w:lineRule="auto"/>
+        <w:ind w:left="204"/>
+        <w:rPr>
+          <w:rFonts w:ascii="Arial" w:hAnsi="Arial" w:cs="Arial"/>
+          <w:sz w:val="24"/>
+          <w:szCs w:val="24"/>
+          <w:lang w:val="en-US"/>
+        </w:rPr>
+      </w:pPr>
+      <w:r>
+        <w:rPr>
+          <w:rFonts w:ascii="Arial" w:hAnsi="Arial" w:cs="Arial"/>
+          <w:sz w:val="24"/>
+          <w:szCs w:val="24"/>
+          <w:lang w:val="en-US"/>
+        </w:rPr>
+        <w:t>RETURN projectedGPA</w:t>
+      </w:r>
+    </w:p>
+    <w:p>
+      <w:pPr>
+        <w:spacing w:line="360" w:lineRule="auto"/>
+        <w:rPr>
+          <w:rFonts w:ascii="Arial" w:hAnsi="Arial" w:cs="Arial"/>
+          <w:sz w:val="24"/>
+          <w:szCs w:val="24"/>
+          <w:lang w:val="en-US"/>
+        </w:rPr>
+      </w:pPr>
+    </w:p>
+    <w:p>
+      <w:pPr>
+        <w:spacing w:line="360" w:lineRule="auto"/>
+        <w:rPr>
+          <w:rFonts w:ascii="Arial" w:hAnsi="Arial" w:cs="Arial"/>
+          <w:sz w:val="24"/>
+          <w:szCs w:val="24"/>
+          <w:lang w:val="en-US"/>
+        </w:rPr>
+      </w:pPr>
+      <w:r>
+        <w:rPr>
+          <w:rFonts w:ascii="Arial" w:hAnsi="Arial" w:cs="Arial"/>
+          <w:sz w:val="24"/>
+          <w:szCs w:val="24"/>
+          <w:lang w:val="en-US"/>
+        </w:rPr>
+        <w:t>END FUNCTION</w:t>
       </w:r>
     </w:p>
     <w:sectPr>

</xml_diff>

<commit_message>
Finished the second part of my thesis.
</commit_message>
<xml_diff>
--- a/Project Thesis.docx
+++ b/Project Thesis.docx
@@ -6061,8 +6061,19 @@
           <w:lang w:val="en-US"/>
         </w:rPr>
         <w:lastRenderedPageBreak/>
-        <w:t>FUNCTION AddCourse</w:t>
-      </w:r>
+        <w:t xml:space="preserve">FUNCTION </w:t>
+      </w:r>
+      <w:proofErr w:type="spellStart"/>
+      <w:r>
+        <w:rPr>
+          <w:rFonts w:ascii="Arial" w:hAnsi="Arial" w:cs="Arial"/>
+          <w:sz w:val="24"/>
+          <w:szCs w:val="24"/>
+          <w:lang w:val="en-US"/>
+        </w:rPr>
+        <w:t>AddCourse</w:t>
+      </w:r>
+      <w:proofErr w:type="spellEnd"/>
     </w:p>
     <w:p>
       <w:pPr>
@@ -7085,6 +7096,28 @@
           <w:lang w:val="en-US"/>
         </w:rPr>
       </w:pPr>
+    </w:p>
+    <w:p>
+      <w:pPr>
+        <w:spacing w:line="360" w:lineRule="auto"/>
+        <w:rPr>
+          <w:rFonts w:ascii="Arial" w:hAnsi="Arial" w:cs="Arial"/>
+          <w:sz w:val="24"/>
+          <w:szCs w:val="24"/>
+          <w:lang w:val="en-US"/>
+        </w:rPr>
+      </w:pPr>
+    </w:p>
+    <w:p>
+      <w:pPr>
+        <w:spacing w:line="360" w:lineRule="auto"/>
+        <w:rPr>
+          <w:rFonts w:ascii="Arial" w:hAnsi="Arial" w:cs="Arial"/>
+          <w:sz w:val="24"/>
+          <w:szCs w:val="24"/>
+          <w:lang w:val="en-US"/>
+        </w:rPr>
+      </w:pPr>
       <w:r>
         <w:rPr>
           <w:rFonts w:ascii="Arial" w:hAnsi="Arial" w:cs="Arial"/>
@@ -7094,14 +7127,25 @@
         </w:rPr>
         <w:t xml:space="preserve">FUNCTION </w:t>
       </w:r>
-      <w:r>
-        <w:rPr>
-          <w:rFonts w:ascii="Arial" w:hAnsi="Arial" w:cs="Arial"/>
-          <w:sz w:val="24"/>
-          <w:szCs w:val="24"/>
-          <w:lang w:val="en-US"/>
-        </w:rPr>
-        <w:t>CalculateGPA(courses)</w:t>
+      <w:proofErr w:type="spellStart"/>
+      <w:r>
+        <w:rPr>
+          <w:rFonts w:ascii="Arial" w:hAnsi="Arial" w:cs="Arial"/>
+          <w:sz w:val="24"/>
+          <w:szCs w:val="24"/>
+          <w:lang w:val="en-US"/>
+        </w:rPr>
+        <w:t>CalculateGPA</w:t>
+      </w:r>
+      <w:proofErr w:type="spellEnd"/>
+      <w:r>
+        <w:rPr>
+          <w:rFonts w:ascii="Arial" w:hAnsi="Arial" w:cs="Arial"/>
+          <w:sz w:val="24"/>
+          <w:szCs w:val="24"/>
+          <w:lang w:val="en-US"/>
+        </w:rPr>
+        <w:t>(courses)</w:t>
       </w:r>
     </w:p>
     <w:p>
@@ -7134,55 +7178,26 @@
         </w:rPr>
         <w:t xml:space="preserve">   </w:t>
       </w:r>
-      <w:r>
-        <w:rPr>
-          <w:rFonts w:ascii="Arial" w:hAnsi="Arial" w:cs="Arial"/>
-          <w:sz w:val="24"/>
-          <w:szCs w:val="24"/>
-          <w:lang w:val="en-US"/>
-        </w:rPr>
-        <w:t>totalQualityPoints = 0</w:t>
-      </w:r>
-    </w:p>
-    <w:p>
-      <w:pPr>
-        <w:spacing w:line="360" w:lineRule="auto"/>
-        <w:rPr>
-          <w:rFonts w:ascii="Arial" w:hAnsi="Arial" w:cs="Arial"/>
-          <w:sz w:val="24"/>
-          <w:szCs w:val="24"/>
-          <w:lang w:val="en-US"/>
-        </w:rPr>
-      </w:pPr>
-      <w:r>
-        <w:rPr>
-          <w:rFonts w:ascii="Arial" w:hAnsi="Arial" w:cs="Arial"/>
-          <w:sz w:val="24"/>
-          <w:szCs w:val="24"/>
-          <w:lang w:val="en-US"/>
-        </w:rPr>
-        <w:t xml:space="preserve">   </w:t>
-      </w:r>
-      <w:r>
-        <w:rPr>
-          <w:rFonts w:ascii="Arial" w:hAnsi="Arial" w:cs="Arial"/>
-          <w:sz w:val="24"/>
-          <w:szCs w:val="24"/>
-          <w:lang w:val="en-US"/>
-        </w:rPr>
-        <w:t>attemptedCredits = 0</w:t>
-      </w:r>
-    </w:p>
-    <w:p>
-      <w:pPr>
-        <w:spacing w:line="360" w:lineRule="auto"/>
-        <w:rPr>
-          <w:rFonts w:ascii="Arial" w:hAnsi="Arial" w:cs="Arial"/>
-          <w:sz w:val="24"/>
-          <w:szCs w:val="24"/>
-          <w:lang w:val="en-US"/>
-        </w:rPr>
-      </w:pPr>
+      <w:proofErr w:type="spellStart"/>
+      <w:r>
+        <w:rPr>
+          <w:rFonts w:ascii="Arial" w:hAnsi="Arial" w:cs="Arial"/>
+          <w:sz w:val="24"/>
+          <w:szCs w:val="24"/>
+          <w:lang w:val="en-US"/>
+        </w:rPr>
+        <w:t>totalQualityPoints</w:t>
+      </w:r>
+      <w:proofErr w:type="spellEnd"/>
+      <w:r>
+        <w:rPr>
+          <w:rFonts w:ascii="Arial" w:hAnsi="Arial" w:cs="Arial"/>
+          <w:sz w:val="24"/>
+          <w:szCs w:val="24"/>
+          <w:lang w:val="en-US"/>
+        </w:rPr>
+        <w:t xml:space="preserve"> = 0</w:t>
+      </w:r>
     </w:p>
     <w:p>
       <w:pPr>
@@ -7204,6 +7219,57 @@
         <w:lastRenderedPageBreak/>
         <w:t xml:space="preserve">   </w:t>
       </w:r>
+      <w:proofErr w:type="spellStart"/>
+      <w:r>
+        <w:rPr>
+          <w:rFonts w:ascii="Arial" w:hAnsi="Arial" w:cs="Arial"/>
+          <w:sz w:val="24"/>
+          <w:szCs w:val="24"/>
+          <w:lang w:val="en-US"/>
+        </w:rPr>
+        <w:t>attemptedCredits</w:t>
+      </w:r>
+      <w:proofErr w:type="spellEnd"/>
+      <w:r>
+        <w:rPr>
+          <w:rFonts w:ascii="Arial" w:hAnsi="Arial" w:cs="Arial"/>
+          <w:sz w:val="24"/>
+          <w:szCs w:val="24"/>
+          <w:lang w:val="en-US"/>
+        </w:rPr>
+        <w:t xml:space="preserve"> = 0</w:t>
+      </w:r>
+    </w:p>
+    <w:p>
+      <w:pPr>
+        <w:spacing w:line="360" w:lineRule="auto"/>
+        <w:rPr>
+          <w:rFonts w:ascii="Arial" w:hAnsi="Arial" w:cs="Arial"/>
+          <w:sz w:val="24"/>
+          <w:szCs w:val="24"/>
+          <w:lang w:val="en-US"/>
+        </w:rPr>
+      </w:pPr>
+    </w:p>
+    <w:p>
+      <w:pPr>
+        <w:spacing w:line="360" w:lineRule="auto"/>
+        <w:rPr>
+          <w:rFonts w:ascii="Arial" w:hAnsi="Arial" w:cs="Arial"/>
+          <w:sz w:val="24"/>
+          <w:szCs w:val="24"/>
+          <w:lang w:val="en-US"/>
+        </w:rPr>
+      </w:pPr>
+      <w:r>
+        <w:rPr>
+          <w:rFonts w:ascii="Arial" w:hAnsi="Arial" w:cs="Arial"/>
+          <w:sz w:val="24"/>
+          <w:szCs w:val="24"/>
+          <w:lang w:val="en-US"/>
+        </w:rPr>
+        <w:t xml:space="preserve">   </w:t>
+      </w:r>
       <w:r>
         <w:rPr>
           <w:rFonts w:ascii="Arial" w:hAnsi="Arial" w:cs="Arial"/>
@@ -7262,6 +7328,7 @@
         </w:rPr>
         <w:t xml:space="preserve">      </w:t>
       </w:r>
+      <w:proofErr w:type="spellStart"/>
       <w:r>
         <w:rPr>
           <w:rFonts w:ascii="Arial" w:hAnsi="Arial" w:cs="Arial"/>
@@ -7271,15 +7338,38 @@
         </w:rPr>
         <w:t>gradePoints</w:t>
       </w:r>
-      <w:r>
-        <w:rPr>
-          <w:rFonts w:ascii="Arial" w:hAnsi="Arial" w:cs="Arial"/>
-          <w:sz w:val="24"/>
-          <w:szCs w:val="24"/>
-          <w:lang w:val="en-US"/>
-        </w:rPr>
-        <w:t xml:space="preserve"> = ConvertGradeToPoints(</w:t>
-      </w:r>
+      <w:proofErr w:type="spellEnd"/>
+      <w:r>
+        <w:rPr>
+          <w:rFonts w:ascii="Arial" w:hAnsi="Arial" w:cs="Arial"/>
+          <w:sz w:val="24"/>
+          <w:szCs w:val="24"/>
+          <w:lang w:val="en-US"/>
+        </w:rPr>
+        <w:t xml:space="preserve"> = </w:t>
+      </w:r>
+      <w:proofErr w:type="spellStart"/>
+      <w:r>
+        <w:rPr>
+          <w:rFonts w:ascii="Arial" w:hAnsi="Arial" w:cs="Arial"/>
+          <w:sz w:val="24"/>
+          <w:szCs w:val="24"/>
+          <w:lang w:val="en-US"/>
+        </w:rPr>
+        <w:t>ConvertGradeToPoints</w:t>
+      </w:r>
+      <w:proofErr w:type="spellEnd"/>
+      <w:r>
+        <w:rPr>
+          <w:rFonts w:ascii="Arial" w:hAnsi="Arial" w:cs="Arial"/>
+          <w:sz w:val="24"/>
+          <w:szCs w:val="24"/>
+          <w:lang w:val="en-US"/>
+        </w:rPr>
+        <w:t>(</w:t>
+      </w:r>
+      <w:proofErr w:type="spellStart"/>
+      <w:proofErr w:type="gramStart"/>
       <w:r>
         <w:rPr>
           <w:rFonts w:ascii="Arial" w:hAnsi="Arial" w:cs="Arial"/>
@@ -7289,6 +7379,8 @@
         </w:rPr>
         <w:t>course.grade</w:t>
       </w:r>
+      <w:proofErr w:type="spellEnd"/>
+      <w:proofErr w:type="gramEnd"/>
       <w:r>
         <w:rPr>
           <w:rFonts w:ascii="Arial" w:hAnsi="Arial" w:cs="Arial"/>
@@ -7327,26 +7419,59 @@
           <w:szCs w:val="24"/>
           <w:lang w:val="en-US"/>
         </w:rPr>
-        <w:t xml:space="preserve">      totalQualityPoints</w:t>
-      </w:r>
-      <w:r>
-        <w:rPr>
-          <w:rFonts w:ascii="Arial" w:hAnsi="Arial" w:cs="Arial"/>
-          <w:sz w:val="24"/>
-          <w:szCs w:val="24"/>
-          <w:lang w:val="en-US"/>
-        </w:rPr>
-        <w:t xml:space="preserve"> = totalQualityPoints</w:t>
-      </w:r>
-      <w:r>
-        <w:rPr>
-          <w:rFonts w:ascii="Arial" w:hAnsi="Arial" w:cs="Arial"/>
-          <w:sz w:val="24"/>
-          <w:szCs w:val="24"/>
-          <w:lang w:val="en-US"/>
-        </w:rPr>
-        <w:t xml:space="preserve"> + gradePoints</w:t>
-      </w:r>
+        <w:t xml:space="preserve">      </w:t>
+      </w:r>
+      <w:proofErr w:type="spellStart"/>
+      <w:r>
+        <w:rPr>
+          <w:rFonts w:ascii="Arial" w:hAnsi="Arial" w:cs="Arial"/>
+          <w:sz w:val="24"/>
+          <w:szCs w:val="24"/>
+          <w:lang w:val="en-US"/>
+        </w:rPr>
+        <w:t>totalQualityPoints</w:t>
+      </w:r>
+      <w:proofErr w:type="spellEnd"/>
+      <w:r>
+        <w:rPr>
+          <w:rFonts w:ascii="Arial" w:hAnsi="Arial" w:cs="Arial"/>
+          <w:sz w:val="24"/>
+          <w:szCs w:val="24"/>
+          <w:lang w:val="en-US"/>
+        </w:rPr>
+        <w:t xml:space="preserve"> = </w:t>
+      </w:r>
+      <w:proofErr w:type="spellStart"/>
+      <w:r>
+        <w:rPr>
+          <w:rFonts w:ascii="Arial" w:hAnsi="Arial" w:cs="Arial"/>
+          <w:sz w:val="24"/>
+          <w:szCs w:val="24"/>
+          <w:lang w:val="en-US"/>
+        </w:rPr>
+        <w:t>totalQualityPoints</w:t>
+      </w:r>
+      <w:proofErr w:type="spellEnd"/>
+      <w:r>
+        <w:rPr>
+          <w:rFonts w:ascii="Arial" w:hAnsi="Arial" w:cs="Arial"/>
+          <w:sz w:val="24"/>
+          <w:szCs w:val="24"/>
+          <w:lang w:val="en-US"/>
+        </w:rPr>
+        <w:t xml:space="preserve"> + </w:t>
+      </w:r>
+      <w:proofErr w:type="spellStart"/>
+      <w:r>
+        <w:rPr>
+          <w:rFonts w:ascii="Arial" w:hAnsi="Arial" w:cs="Arial"/>
+          <w:sz w:val="24"/>
+          <w:szCs w:val="24"/>
+          <w:lang w:val="en-US"/>
+        </w:rPr>
+        <w:t>gradePoints</w:t>
+      </w:r>
+      <w:proofErr w:type="spellEnd"/>
       <w:r>
         <w:rPr>
           <w:rFonts w:ascii="Arial" w:hAnsi="Arial" w:cs="Arial"/>
@@ -7356,6 +7481,8 @@
         </w:rPr>
         <w:t xml:space="preserve"> * </w:t>
       </w:r>
+      <w:proofErr w:type="spellStart"/>
+      <w:proofErr w:type="gramStart"/>
       <w:r>
         <w:rPr>
           <w:rFonts w:ascii="Arial" w:hAnsi="Arial" w:cs="Arial"/>
@@ -7365,55 +7492,92 @@
         </w:rPr>
         <w:t>course.credits</w:t>
       </w:r>
-    </w:p>
-    <w:p>
-      <w:pPr>
-        <w:spacing w:line="360" w:lineRule="auto"/>
-        <w:rPr>
-          <w:rFonts w:ascii="Arial" w:hAnsi="Arial" w:cs="Arial"/>
-          <w:sz w:val="24"/>
-          <w:szCs w:val="24"/>
-          <w:lang w:val="en-US"/>
-        </w:rPr>
-      </w:pPr>
-    </w:p>
-    <w:p>
-      <w:pPr>
-        <w:spacing w:line="360" w:lineRule="auto"/>
-        <w:rPr>
-          <w:rFonts w:ascii="Arial" w:hAnsi="Arial" w:cs="Arial"/>
-          <w:sz w:val="24"/>
-          <w:szCs w:val="24"/>
-          <w:lang w:val="en-US"/>
-        </w:rPr>
-      </w:pPr>
-      <w:r>
-        <w:rPr>
-          <w:rFonts w:ascii="Arial" w:hAnsi="Arial" w:cs="Arial"/>
-          <w:sz w:val="24"/>
-          <w:szCs w:val="24"/>
-          <w:lang w:val="en-US"/>
-        </w:rPr>
-        <w:t xml:space="preserve">      attemptedCredits</w:t>
-      </w:r>
-      <w:r>
-        <w:rPr>
-          <w:rFonts w:ascii="Arial" w:hAnsi="Arial" w:cs="Arial"/>
-          <w:sz w:val="24"/>
-          <w:szCs w:val="24"/>
-          <w:lang w:val="en-US"/>
-        </w:rPr>
-        <w:t xml:space="preserve"> = attemptedCredits</w:t>
-      </w:r>
-      <w:r>
-        <w:rPr>
-          <w:rFonts w:ascii="Arial" w:hAnsi="Arial" w:cs="Arial"/>
-          <w:sz w:val="24"/>
-          <w:szCs w:val="24"/>
-          <w:lang w:val="en-US"/>
-        </w:rPr>
-        <w:t xml:space="preserve"> + course.credits</w:t>
-      </w:r>
+      <w:proofErr w:type="spellEnd"/>
+      <w:proofErr w:type="gramEnd"/>
+    </w:p>
+    <w:p>
+      <w:pPr>
+        <w:spacing w:line="360" w:lineRule="auto"/>
+        <w:rPr>
+          <w:rFonts w:ascii="Arial" w:hAnsi="Arial" w:cs="Arial"/>
+          <w:sz w:val="24"/>
+          <w:szCs w:val="24"/>
+          <w:lang w:val="en-US"/>
+        </w:rPr>
+      </w:pPr>
+    </w:p>
+    <w:p>
+      <w:pPr>
+        <w:spacing w:line="360" w:lineRule="auto"/>
+        <w:rPr>
+          <w:rFonts w:ascii="Arial" w:hAnsi="Arial" w:cs="Arial"/>
+          <w:sz w:val="24"/>
+          <w:szCs w:val="24"/>
+          <w:lang w:val="en-US"/>
+        </w:rPr>
+      </w:pPr>
+      <w:r>
+        <w:rPr>
+          <w:rFonts w:ascii="Arial" w:hAnsi="Arial" w:cs="Arial"/>
+          <w:sz w:val="24"/>
+          <w:szCs w:val="24"/>
+          <w:lang w:val="en-US"/>
+        </w:rPr>
+        <w:t xml:space="preserve">      </w:t>
+      </w:r>
+      <w:proofErr w:type="spellStart"/>
+      <w:r>
+        <w:rPr>
+          <w:rFonts w:ascii="Arial" w:hAnsi="Arial" w:cs="Arial"/>
+          <w:sz w:val="24"/>
+          <w:szCs w:val="24"/>
+          <w:lang w:val="en-US"/>
+        </w:rPr>
+        <w:t>attemptedCredits</w:t>
+      </w:r>
+      <w:proofErr w:type="spellEnd"/>
+      <w:r>
+        <w:rPr>
+          <w:rFonts w:ascii="Arial" w:hAnsi="Arial" w:cs="Arial"/>
+          <w:sz w:val="24"/>
+          <w:szCs w:val="24"/>
+          <w:lang w:val="en-US"/>
+        </w:rPr>
+        <w:t xml:space="preserve"> = </w:t>
+      </w:r>
+      <w:proofErr w:type="spellStart"/>
+      <w:r>
+        <w:rPr>
+          <w:rFonts w:ascii="Arial" w:hAnsi="Arial" w:cs="Arial"/>
+          <w:sz w:val="24"/>
+          <w:szCs w:val="24"/>
+          <w:lang w:val="en-US"/>
+        </w:rPr>
+        <w:t>attemptedCredits</w:t>
+      </w:r>
+      <w:proofErr w:type="spellEnd"/>
+      <w:r>
+        <w:rPr>
+          <w:rFonts w:ascii="Arial" w:hAnsi="Arial" w:cs="Arial"/>
+          <w:sz w:val="24"/>
+          <w:szCs w:val="24"/>
+          <w:lang w:val="en-US"/>
+        </w:rPr>
+        <w:t xml:space="preserve"> + </w:t>
+      </w:r>
+      <w:proofErr w:type="spellStart"/>
+      <w:proofErr w:type="gramStart"/>
+      <w:r>
+        <w:rPr>
+          <w:rFonts w:ascii="Arial" w:hAnsi="Arial" w:cs="Arial"/>
+          <w:sz w:val="24"/>
+          <w:szCs w:val="24"/>
+          <w:lang w:val="en-US"/>
+        </w:rPr>
+        <w:t>course.credits</w:t>
+      </w:r>
+      <w:proofErr w:type="spellEnd"/>
+      <w:proofErr w:type="gramEnd"/>
     </w:p>
     <w:p>
       <w:pPr>
@@ -7492,8 +7656,19 @@
           <w:szCs w:val="24"/>
           <w:lang w:val="en-US"/>
         </w:rPr>
-        <w:t>IF attemptedCredits</w:t>
-      </w:r>
+        <w:t xml:space="preserve">IF </w:t>
+      </w:r>
+      <w:proofErr w:type="spellStart"/>
+      <w:r>
+        <w:rPr>
+          <w:rFonts w:ascii="Arial" w:hAnsi="Arial" w:cs="Arial"/>
+          <w:sz w:val="24"/>
+          <w:szCs w:val="24"/>
+          <w:lang w:val="en-US"/>
+        </w:rPr>
+        <w:t>attemptedCredits</w:t>
+      </w:r>
+      <w:proofErr w:type="spellEnd"/>
       <w:r>
         <w:rPr>
           <w:rFonts w:ascii="Arial" w:hAnsi="Arial" w:cs="Arial"/>
@@ -7592,15 +7767,37 @@
         </w:rPr>
         <w:t xml:space="preserve"> </w:t>
       </w:r>
-      <w:r>
-        <w:rPr>
-          <w:rFonts w:ascii="Arial" w:hAnsi="Arial" w:cs="Arial"/>
-          <w:sz w:val="24"/>
-          <w:szCs w:val="24"/>
-          <w:lang w:val="en-US"/>
-        </w:rPr>
-        <w:t>totalQualityPoints / attemptedCredits</w:t>
-      </w:r>
+      <w:proofErr w:type="spellStart"/>
+      <w:r>
+        <w:rPr>
+          <w:rFonts w:ascii="Arial" w:hAnsi="Arial" w:cs="Arial"/>
+          <w:sz w:val="24"/>
+          <w:szCs w:val="24"/>
+          <w:lang w:val="en-US"/>
+        </w:rPr>
+        <w:t>totalQualityPoints</w:t>
+      </w:r>
+      <w:proofErr w:type="spellEnd"/>
+      <w:r>
+        <w:rPr>
+          <w:rFonts w:ascii="Arial" w:hAnsi="Arial" w:cs="Arial"/>
+          <w:sz w:val="24"/>
+          <w:szCs w:val="24"/>
+          <w:lang w:val="en-US"/>
+        </w:rPr>
+        <w:t xml:space="preserve"> / </w:t>
+      </w:r>
+      <w:proofErr w:type="spellStart"/>
+      <w:r>
+        <w:rPr>
+          <w:rFonts w:ascii="Arial" w:hAnsi="Arial" w:cs="Arial"/>
+          <w:sz w:val="24"/>
+          <w:szCs w:val="24"/>
+          <w:lang w:val="en-US"/>
+        </w:rPr>
+        <w:t>attemptedCredits</w:t>
+      </w:r>
+      <w:proofErr w:type="spellEnd"/>
     </w:p>
     <w:p>
       <w:pPr>
@@ -7654,44 +7851,87 @@
           <w:lang w:val="en-US"/>
         </w:rPr>
       </w:pPr>
-      <w:r>
-        <w:rPr>
-          <w:rFonts w:ascii="Arial" w:hAnsi="Arial" w:cs="Arial"/>
-          <w:sz w:val="24"/>
-          <w:szCs w:val="24"/>
-          <w:lang w:val="en-US"/>
-        </w:rPr>
-        <w:t>FUNCTION ConvertGradeToPoints(grade)</w:t>
-      </w:r>
-    </w:p>
-    <w:p>
-      <w:pPr>
-        <w:spacing w:line="360" w:lineRule="auto"/>
-        <w:rPr>
-          <w:rFonts w:ascii="Arial" w:hAnsi="Arial" w:cs="Arial"/>
-          <w:sz w:val="24"/>
-          <w:szCs w:val="24"/>
-          <w:lang w:val="en-US"/>
-        </w:rPr>
-      </w:pPr>
-    </w:p>
-    <w:p>
-      <w:pPr>
-        <w:spacing w:line="360" w:lineRule="auto"/>
-        <w:rPr>
-          <w:rFonts w:ascii="Arial" w:hAnsi="Arial" w:cs="Arial"/>
-          <w:sz w:val="24"/>
-          <w:szCs w:val="24"/>
-          <w:lang w:val="en-US"/>
-        </w:rPr>
-      </w:pPr>
-      <w:r>
-        <w:rPr>
-          <w:rFonts w:ascii="Arial" w:hAnsi="Arial" w:cs="Arial"/>
-          <w:sz w:val="24"/>
-          <w:szCs w:val="24"/>
-          <w:lang w:val="en-US"/>
-        </w:rPr>
+    </w:p>
+    <w:p>
+      <w:pPr>
+        <w:spacing w:line="360" w:lineRule="auto"/>
+        <w:rPr>
+          <w:rFonts w:ascii="Arial" w:hAnsi="Arial" w:cs="Arial"/>
+          <w:sz w:val="24"/>
+          <w:szCs w:val="24"/>
+          <w:lang w:val="en-US"/>
+        </w:rPr>
+      </w:pPr>
+    </w:p>
+    <w:p>
+      <w:pPr>
+        <w:spacing w:line="360" w:lineRule="auto"/>
+        <w:rPr>
+          <w:rFonts w:ascii="Arial" w:hAnsi="Arial" w:cs="Arial"/>
+          <w:sz w:val="24"/>
+          <w:szCs w:val="24"/>
+          <w:lang w:val="en-US"/>
+        </w:rPr>
+      </w:pPr>
+      <w:r>
+        <w:rPr>
+          <w:rFonts w:ascii="Arial" w:hAnsi="Arial" w:cs="Arial"/>
+          <w:sz w:val="24"/>
+          <w:szCs w:val="24"/>
+          <w:lang w:val="en-US"/>
+        </w:rPr>
+        <w:t xml:space="preserve">FUNCTION </w:t>
+      </w:r>
+      <w:proofErr w:type="spellStart"/>
+      <w:r>
+        <w:rPr>
+          <w:rFonts w:ascii="Arial" w:hAnsi="Arial" w:cs="Arial"/>
+          <w:sz w:val="24"/>
+          <w:szCs w:val="24"/>
+          <w:lang w:val="en-US"/>
+        </w:rPr>
+        <w:t>ConvertGradeToPoints</w:t>
+      </w:r>
+      <w:proofErr w:type="spellEnd"/>
+      <w:r>
+        <w:rPr>
+          <w:rFonts w:ascii="Arial" w:hAnsi="Arial" w:cs="Arial"/>
+          <w:sz w:val="24"/>
+          <w:szCs w:val="24"/>
+          <w:lang w:val="en-US"/>
+        </w:rPr>
+        <w:t>(grade)</w:t>
+      </w:r>
+    </w:p>
+    <w:p>
+      <w:pPr>
+        <w:spacing w:line="360" w:lineRule="auto"/>
+        <w:rPr>
+          <w:rFonts w:ascii="Arial" w:hAnsi="Arial" w:cs="Arial"/>
+          <w:sz w:val="24"/>
+          <w:szCs w:val="24"/>
+          <w:lang w:val="en-US"/>
+        </w:rPr>
+      </w:pPr>
+    </w:p>
+    <w:p>
+      <w:pPr>
+        <w:spacing w:line="360" w:lineRule="auto"/>
+        <w:rPr>
+          <w:rFonts w:ascii="Arial" w:hAnsi="Arial" w:cs="Arial"/>
+          <w:sz w:val="24"/>
+          <w:szCs w:val="24"/>
+          <w:lang w:val="en-US"/>
+        </w:rPr>
+      </w:pPr>
+      <w:r>
+        <w:rPr>
+          <w:rFonts w:ascii="Arial" w:hAnsi="Arial" w:cs="Arial"/>
+          <w:sz w:val="24"/>
+          <w:szCs w:val="24"/>
+          <w:lang w:val="en-US"/>
+        </w:rPr>
+        <w:lastRenderedPageBreak/>
         <w:t xml:space="preserve">   </w:t>
       </w:r>
       <w:r>
@@ -7710,7 +7950,57 @@
           <w:szCs w:val="24"/>
           <w:lang w:val="en-US"/>
         </w:rPr>
-        <w:t>“</w:t>
+        <w:t>“A”</w:t>
+      </w:r>
+    </w:p>
+    <w:p>
+      <w:pPr>
+        <w:spacing w:line="360" w:lineRule="auto"/>
+        <w:rPr>
+          <w:rFonts w:ascii="Arial" w:hAnsi="Arial" w:cs="Arial"/>
+          <w:sz w:val="24"/>
+          <w:szCs w:val="24"/>
+          <w:lang w:val="en-US"/>
+        </w:rPr>
+      </w:pPr>
+      <w:r>
+        <w:rPr>
+          <w:rFonts w:ascii="Arial" w:hAnsi="Arial" w:cs="Arial"/>
+          <w:sz w:val="24"/>
+          <w:szCs w:val="24"/>
+          <w:lang w:val="en-US"/>
+        </w:rPr>
+        <w:t xml:space="preserve">      RETURN 4.0</w:t>
+      </w:r>
+    </w:p>
+    <w:p>
+      <w:pPr>
+        <w:spacing w:line="360" w:lineRule="auto"/>
+        <w:rPr>
+          <w:rFonts w:ascii="Arial" w:hAnsi="Arial" w:cs="Arial"/>
+          <w:sz w:val="24"/>
+          <w:szCs w:val="24"/>
+          <w:lang w:val="en-US"/>
+        </w:rPr>
+      </w:pPr>
+      <w:r>
+        <w:rPr>
+          <w:rFonts w:ascii="Arial" w:hAnsi="Arial" w:cs="Arial"/>
+          <w:sz w:val="24"/>
+          <w:szCs w:val="24"/>
+          <w:lang w:val="en-US"/>
+        </w:rPr>
+        <w:t xml:space="preserve">   ELSE IF grade </w:t>
+      </w:r>
+      <w:proofErr w:type="gramStart"/>
+      <w:r>
+        <w:rPr>
+          <w:rFonts w:ascii="Arial" w:hAnsi="Arial" w:cs="Arial"/>
+          <w:sz w:val="24"/>
+          <w:szCs w:val="24"/>
+          <w:lang w:val="en-US"/>
+        </w:rPr>
+        <w:t>= ”</w:t>
       </w:r>
       <w:r>
         <w:rPr>
@@ -7721,6 +8011,16 @@
         </w:rPr>
         <w:t>A</w:t>
       </w:r>
+      <w:proofErr w:type="gramEnd"/>
+      <w:r>
+        <w:rPr>
+          <w:rFonts w:ascii="Arial" w:hAnsi="Arial" w:cs="Arial"/>
+          <w:sz w:val="24"/>
+          <w:szCs w:val="24"/>
+          <w:lang w:val="en-US"/>
+        </w:rPr>
+        <w:t>-</w:t>
+      </w:r>
       <w:r>
         <w:rPr>
           <w:rFonts w:ascii="Arial" w:hAnsi="Arial" w:cs="Arial"/>
@@ -7748,36 +8048,312 @@
           <w:szCs w:val="24"/>
           <w:lang w:val="en-US"/>
         </w:rPr>
-        <w:t xml:space="preserve">      RETURN 4.0</w:t>
-      </w:r>
-    </w:p>
-    <w:p>
-      <w:pPr>
-        <w:spacing w:line="360" w:lineRule="auto"/>
-        <w:rPr>
-          <w:rFonts w:ascii="Arial" w:hAnsi="Arial" w:cs="Arial"/>
-          <w:sz w:val="24"/>
-          <w:szCs w:val="24"/>
-          <w:lang w:val="en-US"/>
-        </w:rPr>
-      </w:pPr>
-      <w:r>
-        <w:rPr>
-          <w:rFonts w:ascii="Arial" w:hAnsi="Arial" w:cs="Arial"/>
-          <w:sz w:val="24"/>
-          <w:szCs w:val="24"/>
-          <w:lang w:val="en-US"/>
-        </w:rPr>
-        <w:t xml:space="preserve">   ELSE IF grade = ”</w:t>
-      </w:r>
-      <w:r>
-        <w:rPr>
-          <w:rFonts w:ascii="Arial" w:hAnsi="Arial" w:cs="Arial"/>
-          <w:sz w:val="24"/>
-          <w:szCs w:val="24"/>
-          <w:lang w:val="en-US"/>
-        </w:rPr>
-        <w:t>A-</w:t>
+        <w:t xml:space="preserve">      RETURN 3.7</w:t>
+      </w:r>
+    </w:p>
+    <w:p>
+      <w:pPr>
+        <w:spacing w:line="360" w:lineRule="auto"/>
+        <w:rPr>
+          <w:rFonts w:ascii="Arial" w:hAnsi="Arial" w:cs="Arial"/>
+          <w:sz w:val="24"/>
+          <w:szCs w:val="24"/>
+          <w:lang w:val="en-US"/>
+        </w:rPr>
+      </w:pPr>
+      <w:r>
+        <w:rPr>
+          <w:rFonts w:ascii="Arial" w:hAnsi="Arial" w:cs="Arial"/>
+          <w:sz w:val="24"/>
+          <w:szCs w:val="24"/>
+          <w:lang w:val="en-US"/>
+        </w:rPr>
+        <w:t xml:space="preserve">   ELSE IF</w:t>
+      </w:r>
+      <w:r>
+        <w:rPr>
+          <w:rFonts w:ascii="Arial" w:hAnsi="Arial" w:cs="Arial"/>
+          <w:sz w:val="24"/>
+          <w:szCs w:val="24"/>
+          <w:lang w:val="en-US"/>
+        </w:rPr>
+        <w:t xml:space="preserve"> grade = “B+”</w:t>
+      </w:r>
+    </w:p>
+    <w:p>
+      <w:pPr>
+        <w:spacing w:line="360" w:lineRule="auto"/>
+        <w:rPr>
+          <w:rFonts w:ascii="Arial" w:hAnsi="Arial" w:cs="Arial"/>
+          <w:sz w:val="24"/>
+          <w:szCs w:val="24"/>
+          <w:lang w:val="en-US"/>
+        </w:rPr>
+      </w:pPr>
+      <w:r>
+        <w:rPr>
+          <w:rFonts w:ascii="Arial" w:hAnsi="Arial" w:cs="Arial"/>
+          <w:sz w:val="24"/>
+          <w:szCs w:val="24"/>
+          <w:lang w:val="en-US"/>
+        </w:rPr>
+        <w:t xml:space="preserve">      RETURN</w:t>
+      </w:r>
+      <w:r>
+        <w:rPr>
+          <w:rFonts w:ascii="Arial" w:hAnsi="Arial" w:cs="Arial"/>
+          <w:sz w:val="24"/>
+          <w:szCs w:val="24"/>
+          <w:lang w:val="en-US"/>
+        </w:rPr>
+        <w:t xml:space="preserve"> </w:t>
+      </w:r>
+      <w:r>
+        <w:rPr>
+          <w:rFonts w:ascii="Arial" w:hAnsi="Arial" w:cs="Arial"/>
+          <w:sz w:val="24"/>
+          <w:szCs w:val="24"/>
+          <w:lang w:val="en-US"/>
+        </w:rPr>
+        <w:t>3.3</w:t>
+      </w:r>
+    </w:p>
+    <w:p>
+      <w:pPr>
+        <w:spacing w:line="360" w:lineRule="auto"/>
+        <w:rPr>
+          <w:rFonts w:ascii="Arial" w:hAnsi="Arial" w:cs="Arial"/>
+          <w:sz w:val="24"/>
+          <w:szCs w:val="24"/>
+          <w:lang w:val="en-US"/>
+        </w:rPr>
+      </w:pPr>
+      <w:r>
+        <w:rPr>
+          <w:rFonts w:ascii="Arial" w:hAnsi="Arial" w:cs="Arial"/>
+          <w:sz w:val="24"/>
+          <w:szCs w:val="24"/>
+          <w:lang w:val="en-US"/>
+        </w:rPr>
+        <w:t xml:space="preserve">   ELSE IF grade = “B”</w:t>
+      </w:r>
+    </w:p>
+    <w:p>
+      <w:pPr>
+        <w:spacing w:line="360" w:lineRule="auto"/>
+        <w:rPr>
+          <w:rFonts w:ascii="Arial" w:hAnsi="Arial" w:cs="Arial"/>
+          <w:sz w:val="24"/>
+          <w:szCs w:val="24"/>
+          <w:lang w:val="en-US"/>
+        </w:rPr>
+      </w:pPr>
+      <w:r>
+        <w:rPr>
+          <w:rFonts w:ascii="Arial" w:hAnsi="Arial" w:cs="Arial"/>
+          <w:sz w:val="24"/>
+          <w:szCs w:val="24"/>
+          <w:lang w:val="en-US"/>
+        </w:rPr>
+        <w:t xml:space="preserve">      RETURN 3.0</w:t>
+      </w:r>
+    </w:p>
+    <w:p>
+      <w:pPr>
+        <w:spacing w:line="360" w:lineRule="auto"/>
+        <w:rPr>
+          <w:rFonts w:ascii="Arial" w:hAnsi="Arial" w:cs="Arial"/>
+          <w:sz w:val="24"/>
+          <w:szCs w:val="24"/>
+          <w:lang w:val="en-US"/>
+        </w:rPr>
+      </w:pPr>
+      <w:r>
+        <w:rPr>
+          <w:rFonts w:ascii="Arial" w:hAnsi="Arial" w:cs="Arial"/>
+          <w:sz w:val="24"/>
+          <w:szCs w:val="24"/>
+          <w:lang w:val="en-US"/>
+        </w:rPr>
+        <w:t xml:space="preserve">   ELSE IF grade = “B-”</w:t>
+      </w:r>
+    </w:p>
+    <w:p>
+      <w:pPr>
+        <w:spacing w:line="360" w:lineRule="auto"/>
+        <w:rPr>
+          <w:rFonts w:ascii="Arial" w:hAnsi="Arial" w:cs="Arial"/>
+          <w:sz w:val="24"/>
+          <w:szCs w:val="24"/>
+          <w:lang w:val="en-US"/>
+        </w:rPr>
+      </w:pPr>
+      <w:r>
+        <w:rPr>
+          <w:rFonts w:ascii="Arial" w:hAnsi="Arial" w:cs="Arial"/>
+          <w:sz w:val="24"/>
+          <w:szCs w:val="24"/>
+          <w:lang w:val="en-US"/>
+        </w:rPr>
+        <w:t xml:space="preserve">      RETURN 2.7</w:t>
+      </w:r>
+    </w:p>
+    <w:p>
+      <w:pPr>
+        <w:spacing w:line="360" w:lineRule="auto"/>
+        <w:rPr>
+          <w:rFonts w:ascii="Arial" w:hAnsi="Arial" w:cs="Arial"/>
+          <w:sz w:val="24"/>
+          <w:szCs w:val="24"/>
+          <w:lang w:val="en-US"/>
+        </w:rPr>
+      </w:pPr>
+      <w:r>
+        <w:rPr>
+          <w:rFonts w:ascii="Arial" w:hAnsi="Arial" w:cs="Arial"/>
+          <w:sz w:val="24"/>
+          <w:szCs w:val="24"/>
+          <w:lang w:val="en-US"/>
+        </w:rPr>
+        <w:t xml:space="preserve">   ELSE IF grade = “C+”</w:t>
+      </w:r>
+    </w:p>
+    <w:p>
+      <w:pPr>
+        <w:spacing w:line="360" w:lineRule="auto"/>
+        <w:rPr>
+          <w:rFonts w:ascii="Arial" w:hAnsi="Arial" w:cs="Arial"/>
+          <w:sz w:val="24"/>
+          <w:szCs w:val="24"/>
+          <w:lang w:val="en-US"/>
+        </w:rPr>
+      </w:pPr>
+      <w:r>
+        <w:rPr>
+          <w:rFonts w:ascii="Arial" w:hAnsi="Arial" w:cs="Arial"/>
+          <w:sz w:val="24"/>
+          <w:szCs w:val="24"/>
+          <w:lang w:val="en-US"/>
+        </w:rPr>
+        <w:t xml:space="preserve">      RETURN </w:t>
+      </w:r>
+      <w:r>
+        <w:rPr>
+          <w:rFonts w:ascii="Arial" w:hAnsi="Arial" w:cs="Arial"/>
+          <w:sz w:val="24"/>
+          <w:szCs w:val="24"/>
+          <w:lang w:val="en-US"/>
+        </w:rPr>
+        <w:t>2.3</w:t>
+      </w:r>
+    </w:p>
+    <w:p>
+      <w:pPr>
+        <w:spacing w:line="360" w:lineRule="auto"/>
+        <w:rPr>
+          <w:rFonts w:ascii="Arial" w:hAnsi="Arial" w:cs="Arial"/>
+          <w:sz w:val="24"/>
+          <w:szCs w:val="24"/>
+          <w:lang w:val="en-US"/>
+        </w:rPr>
+      </w:pPr>
+      <w:r>
+        <w:rPr>
+          <w:rFonts w:ascii="Arial" w:hAnsi="Arial" w:cs="Arial"/>
+          <w:sz w:val="24"/>
+          <w:szCs w:val="24"/>
+          <w:lang w:val="en-US"/>
+        </w:rPr>
+        <w:t xml:space="preserve">   ELSE IF grade = “C”</w:t>
+      </w:r>
+    </w:p>
+    <w:p>
+      <w:pPr>
+        <w:spacing w:line="360" w:lineRule="auto"/>
+        <w:rPr>
+          <w:rFonts w:ascii="Arial" w:hAnsi="Arial" w:cs="Arial"/>
+          <w:sz w:val="24"/>
+          <w:szCs w:val="24"/>
+          <w:lang w:val="en-US"/>
+        </w:rPr>
+      </w:pPr>
+      <w:r>
+        <w:rPr>
+          <w:rFonts w:ascii="Arial" w:hAnsi="Arial" w:cs="Arial"/>
+          <w:sz w:val="24"/>
+          <w:szCs w:val="24"/>
+          <w:lang w:val="en-US"/>
+        </w:rPr>
+        <w:t xml:space="preserve">      RETURN 2.0</w:t>
+      </w:r>
+    </w:p>
+    <w:p>
+      <w:pPr>
+        <w:spacing w:line="360" w:lineRule="auto"/>
+        <w:rPr>
+          <w:rFonts w:ascii="Arial" w:hAnsi="Arial" w:cs="Arial"/>
+          <w:sz w:val="24"/>
+          <w:szCs w:val="24"/>
+          <w:lang w:val="en-US"/>
+        </w:rPr>
+      </w:pPr>
+      <w:r>
+        <w:rPr>
+          <w:rFonts w:ascii="Arial" w:hAnsi="Arial" w:cs="Arial"/>
+          <w:sz w:val="24"/>
+          <w:szCs w:val="24"/>
+          <w:lang w:val="en-US"/>
+        </w:rPr>
+        <w:t xml:space="preserve">   ELSE IF grade = “C-”</w:t>
+      </w:r>
+    </w:p>
+    <w:p>
+      <w:pPr>
+        <w:spacing w:line="360" w:lineRule="auto"/>
+        <w:rPr>
+          <w:rFonts w:ascii="Arial" w:hAnsi="Arial" w:cs="Arial"/>
+          <w:sz w:val="24"/>
+          <w:szCs w:val="24"/>
+          <w:lang w:val="en-US"/>
+        </w:rPr>
+      </w:pPr>
+      <w:r>
+        <w:rPr>
+          <w:rFonts w:ascii="Arial" w:hAnsi="Arial" w:cs="Arial"/>
+          <w:sz w:val="24"/>
+          <w:szCs w:val="24"/>
+          <w:lang w:val="en-US"/>
+        </w:rPr>
+        <w:t xml:space="preserve">      RETURN 1.7</w:t>
+      </w:r>
+    </w:p>
+    <w:p>
+      <w:pPr>
+        <w:spacing w:line="360" w:lineRule="auto"/>
+        <w:rPr>
+          <w:rFonts w:ascii="Arial" w:hAnsi="Arial" w:cs="Arial"/>
+          <w:sz w:val="24"/>
+          <w:szCs w:val="24"/>
+          <w:lang w:val="en-US"/>
+        </w:rPr>
+      </w:pPr>
+      <w:r>
+        <w:rPr>
+          <w:rFonts w:ascii="Arial" w:hAnsi="Arial" w:cs="Arial"/>
+          <w:sz w:val="24"/>
+          <w:szCs w:val="24"/>
+          <w:lang w:val="en-US"/>
+        </w:rPr>
+        <w:t xml:space="preserve">   ELSE IF grade = “</w:t>
+      </w:r>
+      <w:r>
+        <w:rPr>
+          <w:rFonts w:ascii="Arial" w:hAnsi="Arial" w:cs="Arial"/>
+          <w:sz w:val="24"/>
+          <w:szCs w:val="24"/>
+          <w:lang w:val="en-US"/>
+        </w:rPr>
+        <w:t>D+</w:t>
       </w:r>
       <w:r>
         <w:rPr>
@@ -7806,8 +8382,119 @@
           <w:szCs w:val="24"/>
           <w:lang w:val="en-US"/>
         </w:rPr>
-        <w:t xml:space="preserve">      RETURN 3.7</w:t>
-      </w:r>
+        <w:t xml:space="preserve">      RETURN 1.3</w:t>
+      </w:r>
+    </w:p>
+    <w:p>
+      <w:pPr>
+        <w:spacing w:line="360" w:lineRule="auto"/>
+        <w:rPr>
+          <w:rFonts w:ascii="Arial" w:hAnsi="Arial" w:cs="Arial"/>
+          <w:sz w:val="24"/>
+          <w:szCs w:val="24"/>
+          <w:lang w:val="en-US"/>
+        </w:rPr>
+      </w:pPr>
+      <w:r>
+        <w:rPr>
+          <w:rFonts w:ascii="Arial" w:hAnsi="Arial" w:cs="Arial"/>
+          <w:sz w:val="24"/>
+          <w:szCs w:val="24"/>
+          <w:lang w:val="en-US"/>
+        </w:rPr>
+        <w:t xml:space="preserve">   ELSE IF grade = “D”</w:t>
+      </w:r>
+    </w:p>
+    <w:p>
+      <w:pPr>
+        <w:spacing w:line="360" w:lineRule="auto"/>
+        <w:rPr>
+          <w:rFonts w:ascii="Arial" w:hAnsi="Arial" w:cs="Arial"/>
+          <w:sz w:val="24"/>
+          <w:szCs w:val="24"/>
+          <w:lang w:val="en-US"/>
+        </w:rPr>
+      </w:pPr>
+      <w:r>
+        <w:rPr>
+          <w:rFonts w:ascii="Arial" w:hAnsi="Arial" w:cs="Arial"/>
+          <w:sz w:val="24"/>
+          <w:szCs w:val="24"/>
+          <w:lang w:val="en-US"/>
+        </w:rPr>
+        <w:t xml:space="preserve">      RETURN 1.0</w:t>
+      </w:r>
+    </w:p>
+    <w:p>
+      <w:pPr>
+        <w:spacing w:line="360" w:lineRule="auto"/>
+        <w:rPr>
+          <w:rFonts w:ascii="Arial" w:hAnsi="Arial" w:cs="Arial"/>
+          <w:sz w:val="24"/>
+          <w:szCs w:val="24"/>
+          <w:lang w:val="en-US"/>
+        </w:rPr>
+      </w:pPr>
+      <w:r>
+        <w:rPr>
+          <w:rFonts w:ascii="Arial" w:hAnsi="Arial" w:cs="Arial"/>
+          <w:sz w:val="24"/>
+          <w:szCs w:val="24"/>
+          <w:lang w:val="en-US"/>
+        </w:rPr>
+        <w:t xml:space="preserve">   ELSE IF grade = “F”</w:t>
+      </w:r>
+    </w:p>
+    <w:p>
+      <w:pPr>
+        <w:spacing w:line="360" w:lineRule="auto"/>
+        <w:rPr>
+          <w:rFonts w:ascii="Arial" w:hAnsi="Arial" w:cs="Arial"/>
+          <w:sz w:val="24"/>
+          <w:szCs w:val="24"/>
+          <w:lang w:val="en-US"/>
+        </w:rPr>
+      </w:pPr>
+      <w:r>
+        <w:rPr>
+          <w:rFonts w:ascii="Arial" w:hAnsi="Arial" w:cs="Arial"/>
+          <w:sz w:val="24"/>
+          <w:szCs w:val="24"/>
+          <w:lang w:val="en-US"/>
+        </w:rPr>
+        <w:t xml:space="preserve">      RETURN 0.0</w:t>
+      </w:r>
+    </w:p>
+    <w:p>
+      <w:pPr>
+        <w:spacing w:line="360" w:lineRule="auto"/>
+        <w:rPr>
+          <w:rFonts w:ascii="Arial" w:hAnsi="Arial" w:cs="Arial"/>
+          <w:sz w:val="24"/>
+          <w:szCs w:val="24"/>
+          <w:lang w:val="en-US"/>
+        </w:rPr>
+      </w:pPr>
+      <w:r>
+        <w:rPr>
+          <w:rFonts w:ascii="Arial" w:hAnsi="Arial" w:cs="Arial"/>
+          <w:sz w:val="24"/>
+          <w:szCs w:val="24"/>
+          <w:lang w:val="en-US"/>
+        </w:rPr>
+        <w:t xml:space="preserve">   END IF</w:t>
+      </w:r>
+    </w:p>
+    <w:p>
+      <w:pPr>
+        <w:spacing w:line="360" w:lineRule="auto"/>
+        <w:rPr>
+          <w:rFonts w:ascii="Arial" w:hAnsi="Arial" w:cs="Arial"/>
+          <w:sz w:val="24"/>
+          <w:szCs w:val="24"/>
+          <w:lang w:val="en-US"/>
+        </w:rPr>
+      </w:pPr>
     </w:p>
     <w:p>
       <w:pPr>
@@ -7827,36 +8514,60 @@
           <w:lang w:val="en-US"/>
         </w:rPr>
         <w:lastRenderedPageBreak/>
-        <w:t xml:space="preserve">   ELSE IF</w:t>
-      </w:r>
-      <w:r>
-        <w:rPr>
-          <w:rFonts w:ascii="Arial" w:hAnsi="Arial" w:cs="Arial"/>
-          <w:sz w:val="24"/>
-          <w:szCs w:val="24"/>
-          <w:lang w:val="en-US"/>
-        </w:rPr>
-        <w:t xml:space="preserve"> grade = “B+”</w:t>
-      </w:r>
-    </w:p>
-    <w:p>
-      <w:pPr>
-        <w:spacing w:line="360" w:lineRule="auto"/>
-        <w:rPr>
-          <w:rFonts w:ascii="Arial" w:hAnsi="Arial" w:cs="Arial"/>
-          <w:sz w:val="24"/>
-          <w:szCs w:val="24"/>
-          <w:lang w:val="en-US"/>
-        </w:rPr>
-      </w:pPr>
-      <w:r>
-        <w:rPr>
-          <w:rFonts w:ascii="Arial" w:hAnsi="Arial" w:cs="Arial"/>
-          <w:sz w:val="24"/>
-          <w:szCs w:val="24"/>
-          <w:lang w:val="en-US"/>
-        </w:rPr>
-        <w:t xml:space="preserve">      RETURN</w:t>
+        <w:t>END FUNCTION</w:t>
+      </w:r>
+    </w:p>
+    <w:p>
+      <w:pPr>
+        <w:spacing w:line="360" w:lineRule="auto"/>
+        <w:rPr>
+          <w:rFonts w:ascii="Arial" w:hAnsi="Arial" w:cs="Arial"/>
+          <w:sz w:val="24"/>
+          <w:szCs w:val="24"/>
+          <w:lang w:val="en-US"/>
+        </w:rPr>
+      </w:pPr>
+    </w:p>
+    <w:p>
+      <w:pPr>
+        <w:spacing w:line="360" w:lineRule="auto"/>
+        <w:rPr>
+          <w:rFonts w:ascii="Arial" w:hAnsi="Arial" w:cs="Arial"/>
+          <w:sz w:val="24"/>
+          <w:szCs w:val="24"/>
+          <w:lang w:val="en-US"/>
+        </w:rPr>
+      </w:pPr>
+    </w:p>
+    <w:p>
+      <w:pPr>
+        <w:spacing w:line="360" w:lineRule="auto"/>
+        <w:rPr>
+          <w:rFonts w:ascii="Arial" w:hAnsi="Arial" w:cs="Arial"/>
+          <w:sz w:val="24"/>
+          <w:szCs w:val="24"/>
+          <w:lang w:val="en-US"/>
+        </w:rPr>
+      </w:pPr>
+    </w:p>
+    <w:p>
+      <w:pPr>
+        <w:spacing w:line="360" w:lineRule="auto"/>
+        <w:rPr>
+          <w:rFonts w:ascii="Arial" w:hAnsi="Arial" w:cs="Arial"/>
+          <w:sz w:val="24"/>
+          <w:szCs w:val="24"/>
+          <w:lang w:val="en-US"/>
+        </w:rPr>
+      </w:pPr>
+      <w:r>
+        <w:rPr>
+          <w:rFonts w:ascii="Arial" w:hAnsi="Arial" w:cs="Arial"/>
+          <w:sz w:val="24"/>
+          <w:szCs w:val="24"/>
+          <w:lang w:val="en-US"/>
+        </w:rPr>
+        <w:t>FUNCTION</w:t>
       </w:r>
       <w:r>
         <w:rPr>
@@ -7867,361 +8578,870 @@
         </w:rPr>
         <w:t xml:space="preserve"> </w:t>
       </w:r>
-      <w:r>
-        <w:rPr>
-          <w:rFonts w:ascii="Arial" w:hAnsi="Arial" w:cs="Arial"/>
-          <w:sz w:val="24"/>
-          <w:szCs w:val="24"/>
-          <w:lang w:val="en-US"/>
-        </w:rPr>
-        <w:t>3.3</w:t>
-      </w:r>
-    </w:p>
-    <w:p>
-      <w:pPr>
-        <w:spacing w:line="360" w:lineRule="auto"/>
-        <w:rPr>
-          <w:rFonts w:ascii="Arial" w:hAnsi="Arial" w:cs="Arial"/>
-          <w:sz w:val="24"/>
-          <w:szCs w:val="24"/>
-          <w:lang w:val="en-US"/>
-        </w:rPr>
-      </w:pPr>
-      <w:r>
-        <w:rPr>
-          <w:rFonts w:ascii="Arial" w:hAnsi="Arial" w:cs="Arial"/>
-          <w:sz w:val="24"/>
-          <w:szCs w:val="24"/>
-          <w:lang w:val="en-US"/>
-        </w:rPr>
-        <w:t xml:space="preserve">   ELSE IF grade = “B”</w:t>
-      </w:r>
-    </w:p>
-    <w:p>
-      <w:pPr>
-        <w:spacing w:line="360" w:lineRule="auto"/>
-        <w:rPr>
-          <w:rFonts w:ascii="Arial" w:hAnsi="Arial" w:cs="Arial"/>
-          <w:sz w:val="24"/>
-          <w:szCs w:val="24"/>
-          <w:lang w:val="en-US"/>
-        </w:rPr>
-      </w:pPr>
-      <w:r>
-        <w:rPr>
-          <w:rFonts w:ascii="Arial" w:hAnsi="Arial" w:cs="Arial"/>
-          <w:sz w:val="24"/>
-          <w:szCs w:val="24"/>
-          <w:lang w:val="en-US"/>
-        </w:rPr>
-        <w:t xml:space="preserve">      RETURN 3.0</w:t>
-      </w:r>
-    </w:p>
-    <w:p>
-      <w:pPr>
-        <w:spacing w:line="360" w:lineRule="auto"/>
-        <w:rPr>
-          <w:rFonts w:ascii="Arial" w:hAnsi="Arial" w:cs="Arial"/>
-          <w:sz w:val="24"/>
-          <w:szCs w:val="24"/>
-          <w:lang w:val="en-US"/>
-        </w:rPr>
-      </w:pPr>
-      <w:r>
-        <w:rPr>
-          <w:rFonts w:ascii="Arial" w:hAnsi="Arial" w:cs="Arial"/>
-          <w:sz w:val="24"/>
-          <w:szCs w:val="24"/>
-          <w:lang w:val="en-US"/>
-        </w:rPr>
-        <w:t xml:space="preserve">   ELSE IF grade = “B-”</w:t>
-      </w:r>
-    </w:p>
-    <w:p>
-      <w:pPr>
-        <w:spacing w:line="360" w:lineRule="auto"/>
-        <w:rPr>
-          <w:rFonts w:ascii="Arial" w:hAnsi="Arial" w:cs="Arial"/>
-          <w:sz w:val="24"/>
-          <w:szCs w:val="24"/>
-          <w:lang w:val="en-US"/>
-        </w:rPr>
-      </w:pPr>
-      <w:r>
-        <w:rPr>
-          <w:rFonts w:ascii="Arial" w:hAnsi="Arial" w:cs="Arial"/>
-          <w:sz w:val="24"/>
-          <w:szCs w:val="24"/>
-          <w:lang w:val="en-US"/>
-        </w:rPr>
-        <w:t xml:space="preserve">      RETURN 2.7</w:t>
-      </w:r>
-    </w:p>
-    <w:p>
-      <w:pPr>
-        <w:spacing w:line="360" w:lineRule="auto"/>
-        <w:rPr>
-          <w:rFonts w:ascii="Arial" w:hAnsi="Arial" w:cs="Arial"/>
-          <w:sz w:val="24"/>
-          <w:szCs w:val="24"/>
-          <w:lang w:val="en-US"/>
-        </w:rPr>
-      </w:pPr>
-      <w:r>
-        <w:rPr>
-          <w:rFonts w:ascii="Arial" w:hAnsi="Arial" w:cs="Arial"/>
-          <w:sz w:val="24"/>
-          <w:szCs w:val="24"/>
-          <w:lang w:val="en-US"/>
-        </w:rPr>
-        <w:t xml:space="preserve">   ELSE IF grade = “C+”</w:t>
-      </w:r>
-    </w:p>
-    <w:p>
-      <w:pPr>
-        <w:spacing w:line="360" w:lineRule="auto"/>
-        <w:rPr>
-          <w:rFonts w:ascii="Arial" w:hAnsi="Arial" w:cs="Arial"/>
-          <w:sz w:val="24"/>
-          <w:szCs w:val="24"/>
-          <w:lang w:val="en-US"/>
-        </w:rPr>
-      </w:pPr>
-      <w:r>
-        <w:rPr>
-          <w:rFonts w:ascii="Arial" w:hAnsi="Arial" w:cs="Arial"/>
-          <w:sz w:val="24"/>
-          <w:szCs w:val="24"/>
-          <w:lang w:val="en-US"/>
-        </w:rPr>
-        <w:t xml:space="preserve">      RETURN </w:t>
-      </w:r>
-      <w:r>
-        <w:rPr>
-          <w:rFonts w:ascii="Arial" w:hAnsi="Arial" w:cs="Arial"/>
-          <w:sz w:val="24"/>
-          <w:szCs w:val="24"/>
-          <w:lang w:val="en-US"/>
-        </w:rPr>
-        <w:t>2.3</w:t>
-      </w:r>
-    </w:p>
-    <w:p>
-      <w:pPr>
-        <w:spacing w:line="360" w:lineRule="auto"/>
-        <w:rPr>
-          <w:rFonts w:ascii="Arial" w:hAnsi="Arial" w:cs="Arial"/>
-          <w:sz w:val="24"/>
-          <w:szCs w:val="24"/>
-          <w:lang w:val="en-US"/>
-        </w:rPr>
-      </w:pPr>
-      <w:r>
-        <w:rPr>
-          <w:rFonts w:ascii="Arial" w:hAnsi="Arial" w:cs="Arial"/>
-          <w:sz w:val="24"/>
-          <w:szCs w:val="24"/>
-          <w:lang w:val="en-US"/>
-        </w:rPr>
-        <w:t xml:space="preserve">   ELSE IF grade = “C”</w:t>
-      </w:r>
-    </w:p>
-    <w:p>
-      <w:pPr>
-        <w:spacing w:line="360" w:lineRule="auto"/>
-        <w:rPr>
-          <w:rFonts w:ascii="Arial" w:hAnsi="Arial" w:cs="Arial"/>
-          <w:sz w:val="24"/>
-          <w:szCs w:val="24"/>
-          <w:lang w:val="en-US"/>
-        </w:rPr>
-      </w:pPr>
-      <w:r>
-        <w:rPr>
-          <w:rFonts w:ascii="Arial" w:hAnsi="Arial" w:cs="Arial"/>
-          <w:sz w:val="24"/>
-          <w:szCs w:val="24"/>
-          <w:lang w:val="en-US"/>
-        </w:rPr>
-        <w:t xml:space="preserve">      RETURN 2.0</w:t>
-      </w:r>
-    </w:p>
-    <w:p>
-      <w:pPr>
-        <w:spacing w:line="360" w:lineRule="auto"/>
-        <w:rPr>
-          <w:rFonts w:ascii="Arial" w:hAnsi="Arial" w:cs="Arial"/>
-          <w:sz w:val="24"/>
-          <w:szCs w:val="24"/>
-          <w:lang w:val="en-US"/>
-        </w:rPr>
-      </w:pPr>
-      <w:r>
-        <w:rPr>
-          <w:rFonts w:ascii="Arial" w:hAnsi="Arial" w:cs="Arial"/>
-          <w:sz w:val="24"/>
-          <w:szCs w:val="24"/>
-          <w:lang w:val="en-US"/>
-        </w:rPr>
-        <w:t xml:space="preserve">   ELSE IF grade = “C-”</w:t>
-      </w:r>
-    </w:p>
-    <w:p>
-      <w:pPr>
-        <w:spacing w:line="360" w:lineRule="auto"/>
-        <w:rPr>
-          <w:rFonts w:ascii="Arial" w:hAnsi="Arial" w:cs="Arial"/>
-          <w:sz w:val="24"/>
-          <w:szCs w:val="24"/>
-          <w:lang w:val="en-US"/>
-        </w:rPr>
-      </w:pPr>
-      <w:r>
-        <w:rPr>
-          <w:rFonts w:ascii="Arial" w:hAnsi="Arial" w:cs="Arial"/>
-          <w:sz w:val="24"/>
-          <w:szCs w:val="24"/>
-          <w:lang w:val="en-US"/>
-        </w:rPr>
-        <w:t xml:space="preserve">      RETURN 1.7</w:t>
-      </w:r>
-    </w:p>
-    <w:p>
-      <w:pPr>
-        <w:spacing w:line="360" w:lineRule="auto"/>
-        <w:rPr>
-          <w:rFonts w:ascii="Arial" w:hAnsi="Arial" w:cs="Arial"/>
-          <w:sz w:val="24"/>
-          <w:szCs w:val="24"/>
-          <w:lang w:val="en-US"/>
-        </w:rPr>
-      </w:pPr>
-      <w:r>
-        <w:rPr>
-          <w:rFonts w:ascii="Arial" w:hAnsi="Arial" w:cs="Arial"/>
-          <w:sz w:val="24"/>
-          <w:szCs w:val="24"/>
-          <w:lang w:val="en-US"/>
-        </w:rPr>
-        <w:t xml:space="preserve">   ELSE IF grade = “</w:t>
-      </w:r>
-      <w:r>
-        <w:rPr>
-          <w:rFonts w:ascii="Arial" w:hAnsi="Arial" w:cs="Arial"/>
-          <w:sz w:val="24"/>
-          <w:szCs w:val="24"/>
-          <w:lang w:val="en-US"/>
-        </w:rPr>
-        <w:t>D+</w:t>
-      </w:r>
-      <w:r>
-        <w:rPr>
-          <w:rFonts w:ascii="Arial" w:hAnsi="Arial" w:cs="Arial"/>
-          <w:sz w:val="24"/>
-          <w:szCs w:val="24"/>
-          <w:lang w:val="en-US"/>
-        </w:rPr>
-        <w:t>”</w:t>
-      </w:r>
-    </w:p>
-    <w:p>
-      <w:pPr>
-        <w:spacing w:line="360" w:lineRule="auto"/>
-        <w:rPr>
-          <w:rFonts w:ascii="Arial" w:hAnsi="Arial" w:cs="Arial"/>
-          <w:sz w:val="24"/>
-          <w:szCs w:val="24"/>
-          <w:lang w:val="en-US"/>
-        </w:rPr>
-      </w:pPr>
-      <w:r>
-        <w:rPr>
-          <w:rFonts w:ascii="Arial" w:hAnsi="Arial" w:cs="Arial"/>
-          <w:sz w:val="24"/>
-          <w:szCs w:val="24"/>
-          <w:lang w:val="en-US"/>
-        </w:rPr>
-        <w:t xml:space="preserve">      RETURN 1.3</w:t>
-      </w:r>
-    </w:p>
-    <w:p>
-      <w:pPr>
-        <w:spacing w:line="360" w:lineRule="auto"/>
-        <w:rPr>
-          <w:rFonts w:ascii="Arial" w:hAnsi="Arial" w:cs="Arial"/>
-          <w:sz w:val="24"/>
-          <w:szCs w:val="24"/>
-          <w:lang w:val="en-US"/>
-        </w:rPr>
-      </w:pPr>
-      <w:r>
-        <w:rPr>
-          <w:rFonts w:ascii="Arial" w:hAnsi="Arial" w:cs="Arial"/>
-          <w:sz w:val="24"/>
-          <w:szCs w:val="24"/>
-          <w:lang w:val="en-US"/>
-        </w:rPr>
-        <w:t xml:space="preserve">   ELSE IF grade = “D”</w:t>
-      </w:r>
-    </w:p>
-    <w:p>
-      <w:pPr>
-        <w:spacing w:line="360" w:lineRule="auto"/>
-        <w:rPr>
-          <w:rFonts w:ascii="Arial" w:hAnsi="Arial" w:cs="Arial"/>
-          <w:sz w:val="24"/>
-          <w:szCs w:val="24"/>
-          <w:lang w:val="en-US"/>
-        </w:rPr>
-      </w:pPr>
-      <w:r>
-        <w:rPr>
-          <w:rFonts w:ascii="Arial" w:hAnsi="Arial" w:cs="Arial"/>
-          <w:sz w:val="24"/>
-          <w:szCs w:val="24"/>
-          <w:lang w:val="en-US"/>
-        </w:rPr>
-        <w:t xml:space="preserve">      RETURN 1.0</w:t>
-      </w:r>
-    </w:p>
-    <w:p>
-      <w:pPr>
-        <w:spacing w:line="360" w:lineRule="auto"/>
-        <w:rPr>
-          <w:rFonts w:ascii="Arial" w:hAnsi="Arial" w:cs="Arial"/>
-          <w:sz w:val="24"/>
-          <w:szCs w:val="24"/>
-          <w:lang w:val="en-US"/>
-        </w:rPr>
-      </w:pPr>
-      <w:r>
-        <w:rPr>
-          <w:rFonts w:ascii="Arial" w:hAnsi="Arial" w:cs="Arial"/>
-          <w:sz w:val="24"/>
-          <w:szCs w:val="24"/>
-          <w:lang w:val="en-US"/>
-        </w:rPr>
-        <w:t xml:space="preserve">   ELSE IF grade = “F”</w:t>
-      </w:r>
-    </w:p>
-    <w:p>
-      <w:pPr>
-        <w:spacing w:line="360" w:lineRule="auto"/>
-        <w:rPr>
-          <w:rFonts w:ascii="Arial" w:hAnsi="Arial" w:cs="Arial"/>
-          <w:sz w:val="24"/>
-          <w:szCs w:val="24"/>
-          <w:lang w:val="en-US"/>
-        </w:rPr>
-      </w:pPr>
-      <w:r>
-        <w:rPr>
-          <w:rFonts w:ascii="Arial" w:hAnsi="Arial" w:cs="Arial"/>
-          <w:sz w:val="24"/>
-          <w:szCs w:val="24"/>
-          <w:lang w:val="en-US"/>
-        </w:rPr>
-        <w:t xml:space="preserve">      RETURN 0.0</w:t>
+      <w:proofErr w:type="spellStart"/>
+      <w:proofErr w:type="gramStart"/>
+      <w:r>
+        <w:rPr>
+          <w:rFonts w:ascii="Arial" w:hAnsi="Arial" w:cs="Arial"/>
+          <w:sz w:val="24"/>
+          <w:szCs w:val="24"/>
+          <w:lang w:val="en-US"/>
+        </w:rPr>
+        <w:t>CalculateProjectedGPA</w:t>
+      </w:r>
+      <w:proofErr w:type="spellEnd"/>
+      <w:r>
+        <w:rPr>
+          <w:rFonts w:ascii="Arial" w:hAnsi="Arial" w:cs="Arial"/>
+          <w:sz w:val="24"/>
+          <w:szCs w:val="24"/>
+          <w:lang w:val="en-US"/>
+        </w:rPr>
+        <w:t>(</w:t>
+      </w:r>
+      <w:proofErr w:type="spellStart"/>
+      <w:proofErr w:type="gramEnd"/>
+      <w:r>
+        <w:rPr>
+          <w:rFonts w:ascii="Arial" w:hAnsi="Arial" w:cs="Arial"/>
+          <w:sz w:val="24"/>
+          <w:szCs w:val="24"/>
+          <w:lang w:val="en-US"/>
+        </w:rPr>
+        <w:t>currentCourses</w:t>
+      </w:r>
+      <w:proofErr w:type="spellEnd"/>
+      <w:r>
+        <w:rPr>
+          <w:rFonts w:ascii="Arial" w:hAnsi="Arial" w:cs="Arial"/>
+          <w:sz w:val="24"/>
+          <w:szCs w:val="24"/>
+          <w:lang w:val="en-US"/>
+        </w:rPr>
+        <w:t>,</w:t>
+      </w:r>
+      <w:r>
+        <w:rPr>
+          <w:rFonts w:ascii="Arial" w:hAnsi="Arial" w:cs="Arial"/>
+          <w:sz w:val="24"/>
+          <w:szCs w:val="24"/>
+          <w:lang w:val="en-US"/>
+        </w:rPr>
+        <w:t xml:space="preserve"> </w:t>
+      </w:r>
+      <w:proofErr w:type="spellStart"/>
+      <w:r>
+        <w:rPr>
+          <w:rFonts w:ascii="Arial" w:hAnsi="Arial" w:cs="Arial"/>
+          <w:sz w:val="24"/>
+          <w:szCs w:val="24"/>
+          <w:lang w:val="en-US"/>
+        </w:rPr>
+        <w:t>hypothetical</w:t>
+      </w:r>
+      <w:r>
+        <w:rPr>
+          <w:rFonts w:ascii="Arial" w:hAnsi="Arial" w:cs="Arial"/>
+          <w:sz w:val="24"/>
+          <w:szCs w:val="24"/>
+          <w:lang w:val="en-US"/>
+        </w:rPr>
+        <w:t>Courses</w:t>
+      </w:r>
+      <w:proofErr w:type="spellEnd"/>
+      <w:r>
+        <w:rPr>
+          <w:rFonts w:ascii="Arial" w:hAnsi="Arial" w:cs="Arial"/>
+          <w:sz w:val="24"/>
+          <w:szCs w:val="24"/>
+          <w:lang w:val="en-US"/>
+        </w:rPr>
+        <w:t>)</w:t>
+      </w:r>
+    </w:p>
+    <w:p>
+      <w:pPr>
+        <w:spacing w:line="360" w:lineRule="auto"/>
+        <w:rPr>
+          <w:rFonts w:ascii="Arial" w:hAnsi="Arial" w:cs="Arial"/>
+          <w:sz w:val="24"/>
+          <w:szCs w:val="24"/>
+          <w:lang w:val="en-US"/>
+        </w:rPr>
+      </w:pPr>
+    </w:p>
+    <w:p>
+      <w:pPr>
+        <w:spacing w:line="360" w:lineRule="auto"/>
+        <w:rPr>
+          <w:rFonts w:ascii="Arial" w:hAnsi="Arial" w:cs="Arial"/>
+          <w:sz w:val="24"/>
+          <w:szCs w:val="24"/>
+          <w:lang w:val="en-US"/>
+        </w:rPr>
+      </w:pPr>
+      <w:r>
+        <w:rPr>
+          <w:rFonts w:ascii="Arial" w:hAnsi="Arial" w:cs="Arial"/>
+          <w:sz w:val="24"/>
+          <w:szCs w:val="24"/>
+          <w:lang w:val="en-US"/>
+        </w:rPr>
+        <w:t xml:space="preserve">   </w:t>
+      </w:r>
+      <w:proofErr w:type="spellStart"/>
+      <w:r>
+        <w:rPr>
+          <w:rFonts w:ascii="Arial" w:hAnsi="Arial" w:cs="Arial"/>
+          <w:sz w:val="24"/>
+          <w:szCs w:val="24"/>
+          <w:lang w:val="en-US"/>
+        </w:rPr>
+        <w:t>currentQualityPoints</w:t>
+      </w:r>
+      <w:proofErr w:type="spellEnd"/>
+      <w:r>
+        <w:rPr>
+          <w:rFonts w:ascii="Arial" w:hAnsi="Arial" w:cs="Arial"/>
+          <w:sz w:val="24"/>
+          <w:szCs w:val="24"/>
+          <w:lang w:val="en-US"/>
+        </w:rPr>
+        <w:t xml:space="preserve"> = </w:t>
+      </w:r>
+      <w:proofErr w:type="spellStart"/>
+      <w:r>
+        <w:rPr>
+          <w:rFonts w:ascii="Arial" w:hAnsi="Arial" w:cs="Arial"/>
+          <w:sz w:val="24"/>
+          <w:szCs w:val="24"/>
+          <w:lang w:val="en-US"/>
+        </w:rPr>
+        <w:t>CalculateQualityPoints</w:t>
+      </w:r>
+      <w:proofErr w:type="spellEnd"/>
+      <w:r>
+        <w:rPr>
+          <w:rFonts w:ascii="Arial" w:hAnsi="Arial" w:cs="Arial"/>
+          <w:sz w:val="24"/>
+          <w:szCs w:val="24"/>
+          <w:lang w:val="en-US"/>
+        </w:rPr>
+        <w:t>(</w:t>
+      </w:r>
+      <w:proofErr w:type="spellStart"/>
+      <w:r>
+        <w:rPr>
+          <w:rFonts w:ascii="Arial" w:hAnsi="Arial" w:cs="Arial"/>
+          <w:sz w:val="24"/>
+          <w:szCs w:val="24"/>
+          <w:lang w:val="en-US"/>
+        </w:rPr>
+        <w:t>currentCourses</w:t>
+      </w:r>
+      <w:proofErr w:type="spellEnd"/>
+      <w:r>
+        <w:rPr>
+          <w:rFonts w:ascii="Arial" w:hAnsi="Arial" w:cs="Arial"/>
+          <w:sz w:val="24"/>
+          <w:szCs w:val="24"/>
+          <w:lang w:val="en-US"/>
+        </w:rPr>
+        <w:t>)</w:t>
+      </w:r>
+    </w:p>
+    <w:p>
+      <w:pPr>
+        <w:spacing w:line="360" w:lineRule="auto"/>
+        <w:rPr>
+          <w:rFonts w:ascii="Arial" w:hAnsi="Arial" w:cs="Arial"/>
+          <w:sz w:val="24"/>
+          <w:szCs w:val="24"/>
+          <w:lang w:val="en-US"/>
+        </w:rPr>
+      </w:pPr>
+    </w:p>
+    <w:p>
+      <w:pPr>
+        <w:spacing w:line="360" w:lineRule="auto"/>
+        <w:rPr>
+          <w:rFonts w:ascii="Arial" w:hAnsi="Arial" w:cs="Arial"/>
+          <w:sz w:val="24"/>
+          <w:szCs w:val="24"/>
+          <w:lang w:val="en-US"/>
+        </w:rPr>
+      </w:pPr>
+      <w:r>
+        <w:rPr>
+          <w:rFonts w:ascii="Arial" w:hAnsi="Arial" w:cs="Arial"/>
+          <w:sz w:val="24"/>
+          <w:szCs w:val="24"/>
+          <w:lang w:val="en-US"/>
+        </w:rPr>
+        <w:t xml:space="preserve">   </w:t>
+      </w:r>
+      <w:proofErr w:type="spellStart"/>
+      <w:r>
+        <w:rPr>
+          <w:rFonts w:ascii="Arial" w:hAnsi="Arial" w:cs="Arial"/>
+          <w:sz w:val="24"/>
+          <w:szCs w:val="24"/>
+          <w:lang w:val="en-US"/>
+        </w:rPr>
+        <w:t>futureQualityPoints</w:t>
+      </w:r>
+      <w:proofErr w:type="spellEnd"/>
+      <w:r>
+        <w:rPr>
+          <w:rFonts w:ascii="Arial" w:hAnsi="Arial" w:cs="Arial"/>
+          <w:sz w:val="24"/>
+          <w:szCs w:val="24"/>
+          <w:lang w:val="en-US"/>
+        </w:rPr>
+        <w:t xml:space="preserve"> = </w:t>
+      </w:r>
+      <w:proofErr w:type="spellStart"/>
+      <w:r>
+        <w:rPr>
+          <w:rFonts w:ascii="Arial" w:hAnsi="Arial" w:cs="Arial"/>
+          <w:sz w:val="24"/>
+          <w:szCs w:val="24"/>
+          <w:lang w:val="en-US"/>
+        </w:rPr>
+        <w:t>CalculateQualityPoints</w:t>
+      </w:r>
+      <w:proofErr w:type="spellEnd"/>
+      <w:r>
+        <w:rPr>
+          <w:rFonts w:ascii="Arial" w:hAnsi="Arial" w:cs="Arial"/>
+          <w:sz w:val="24"/>
+          <w:szCs w:val="24"/>
+          <w:lang w:val="en-US"/>
+        </w:rPr>
+        <w:t>(</w:t>
+      </w:r>
+      <w:proofErr w:type="spellStart"/>
+      <w:r>
+        <w:rPr>
+          <w:rFonts w:ascii="Arial" w:hAnsi="Arial" w:cs="Arial"/>
+          <w:sz w:val="24"/>
+          <w:szCs w:val="24"/>
+          <w:lang w:val="en-US"/>
+        </w:rPr>
+        <w:t>hypotheticalCourses</w:t>
+      </w:r>
+      <w:proofErr w:type="spellEnd"/>
+      <w:r>
+        <w:rPr>
+          <w:rFonts w:ascii="Arial" w:hAnsi="Arial" w:cs="Arial"/>
+          <w:sz w:val="24"/>
+          <w:szCs w:val="24"/>
+          <w:lang w:val="en-US"/>
+        </w:rPr>
+        <w:t>)</w:t>
+      </w:r>
+    </w:p>
+    <w:p>
+      <w:pPr>
+        <w:spacing w:line="360" w:lineRule="auto"/>
+        <w:rPr>
+          <w:rFonts w:ascii="Arial" w:hAnsi="Arial" w:cs="Arial"/>
+          <w:sz w:val="24"/>
+          <w:szCs w:val="24"/>
+          <w:lang w:val="en-US"/>
+        </w:rPr>
+      </w:pPr>
+    </w:p>
+    <w:p>
+      <w:pPr>
+        <w:spacing w:line="360" w:lineRule="auto"/>
+        <w:rPr>
+          <w:rFonts w:ascii="Arial" w:hAnsi="Arial" w:cs="Arial"/>
+          <w:sz w:val="24"/>
+          <w:szCs w:val="24"/>
+          <w:lang w:val="en-US"/>
+        </w:rPr>
+      </w:pPr>
+      <w:r>
+        <w:rPr>
+          <w:rFonts w:ascii="Arial" w:hAnsi="Arial" w:cs="Arial"/>
+          <w:sz w:val="24"/>
+          <w:szCs w:val="24"/>
+          <w:lang w:val="en-US"/>
+        </w:rPr>
+        <w:t xml:space="preserve">   </w:t>
+      </w:r>
+      <w:proofErr w:type="spellStart"/>
+      <w:r>
+        <w:rPr>
+          <w:rFonts w:ascii="Arial" w:hAnsi="Arial" w:cs="Arial"/>
+          <w:sz w:val="24"/>
+          <w:szCs w:val="24"/>
+          <w:lang w:val="en-US"/>
+        </w:rPr>
+        <w:t>currentCredits</w:t>
+      </w:r>
+      <w:proofErr w:type="spellEnd"/>
+      <w:r>
+        <w:rPr>
+          <w:rFonts w:ascii="Arial" w:hAnsi="Arial" w:cs="Arial"/>
+          <w:sz w:val="24"/>
+          <w:szCs w:val="24"/>
+          <w:lang w:val="en-US"/>
+        </w:rPr>
+        <w:t xml:space="preserve"> = </w:t>
+      </w:r>
+      <w:proofErr w:type="spellStart"/>
+      <w:r>
+        <w:rPr>
+          <w:rFonts w:ascii="Arial" w:hAnsi="Arial" w:cs="Arial"/>
+          <w:sz w:val="24"/>
+          <w:szCs w:val="24"/>
+          <w:lang w:val="en-US"/>
+        </w:rPr>
+        <w:t>CalculateAttemptedCredits</w:t>
+      </w:r>
+      <w:proofErr w:type="spellEnd"/>
+      <w:r>
+        <w:rPr>
+          <w:rFonts w:ascii="Arial" w:hAnsi="Arial" w:cs="Arial"/>
+          <w:sz w:val="24"/>
+          <w:szCs w:val="24"/>
+          <w:lang w:val="en-US"/>
+        </w:rPr>
+        <w:t>(</w:t>
+      </w:r>
+      <w:proofErr w:type="spellStart"/>
+      <w:r>
+        <w:rPr>
+          <w:rFonts w:ascii="Arial" w:hAnsi="Arial" w:cs="Arial"/>
+          <w:sz w:val="24"/>
+          <w:szCs w:val="24"/>
+          <w:lang w:val="en-US"/>
+        </w:rPr>
+        <w:t>currentCourses</w:t>
+      </w:r>
+      <w:proofErr w:type="spellEnd"/>
+      <w:r>
+        <w:rPr>
+          <w:rFonts w:ascii="Arial" w:hAnsi="Arial" w:cs="Arial"/>
+          <w:sz w:val="24"/>
+          <w:szCs w:val="24"/>
+          <w:lang w:val="en-US"/>
+        </w:rPr>
+        <w:t>)</w:t>
+      </w:r>
+    </w:p>
+    <w:p>
+      <w:pPr>
+        <w:spacing w:line="360" w:lineRule="auto"/>
+        <w:rPr>
+          <w:rFonts w:ascii="Arial" w:hAnsi="Arial" w:cs="Arial"/>
+          <w:sz w:val="24"/>
+          <w:szCs w:val="24"/>
+          <w:lang w:val="en-US"/>
+        </w:rPr>
+      </w:pPr>
+    </w:p>
+    <w:p>
+      <w:pPr>
+        <w:spacing w:line="360" w:lineRule="auto"/>
+        <w:rPr>
+          <w:rFonts w:ascii="Arial" w:hAnsi="Arial" w:cs="Arial"/>
+          <w:sz w:val="24"/>
+          <w:szCs w:val="24"/>
+          <w:lang w:val="en-US"/>
+        </w:rPr>
+      </w:pPr>
+      <w:r>
+        <w:rPr>
+          <w:rFonts w:ascii="Arial" w:hAnsi="Arial" w:cs="Arial"/>
+          <w:sz w:val="24"/>
+          <w:szCs w:val="24"/>
+          <w:lang w:val="en-US"/>
+        </w:rPr>
+        <w:t xml:space="preserve">   </w:t>
+      </w:r>
+      <w:proofErr w:type="spellStart"/>
+      <w:r>
+        <w:rPr>
+          <w:rFonts w:ascii="Arial" w:hAnsi="Arial" w:cs="Arial"/>
+          <w:sz w:val="24"/>
+          <w:szCs w:val="24"/>
+          <w:lang w:val="en-US"/>
+        </w:rPr>
+        <w:t>futureCredits</w:t>
+      </w:r>
+      <w:proofErr w:type="spellEnd"/>
+      <w:r>
+        <w:rPr>
+          <w:rFonts w:ascii="Arial" w:hAnsi="Arial" w:cs="Arial"/>
+          <w:sz w:val="24"/>
+          <w:szCs w:val="24"/>
+          <w:lang w:val="en-US"/>
+        </w:rPr>
+        <w:t xml:space="preserve"> = </w:t>
+      </w:r>
+      <w:proofErr w:type="spellStart"/>
+      <w:r>
+        <w:rPr>
+          <w:rFonts w:ascii="Arial" w:hAnsi="Arial" w:cs="Arial"/>
+          <w:sz w:val="24"/>
+          <w:szCs w:val="24"/>
+          <w:lang w:val="en-US"/>
+        </w:rPr>
+        <w:t>CalculateAttemptedCredits</w:t>
+      </w:r>
+      <w:proofErr w:type="spellEnd"/>
+      <w:r>
+        <w:rPr>
+          <w:rFonts w:ascii="Arial" w:hAnsi="Arial" w:cs="Arial"/>
+          <w:sz w:val="24"/>
+          <w:szCs w:val="24"/>
+          <w:lang w:val="en-US"/>
+        </w:rPr>
+        <w:t>(</w:t>
+      </w:r>
+      <w:proofErr w:type="spellStart"/>
+      <w:r>
+        <w:rPr>
+          <w:rFonts w:ascii="Arial" w:hAnsi="Arial" w:cs="Arial"/>
+          <w:sz w:val="24"/>
+          <w:szCs w:val="24"/>
+          <w:lang w:val="en-US"/>
+        </w:rPr>
+        <w:t>hypotheticalCourses</w:t>
+      </w:r>
+      <w:proofErr w:type="spellEnd"/>
+      <w:r>
+        <w:rPr>
+          <w:rFonts w:ascii="Arial" w:hAnsi="Arial" w:cs="Arial"/>
+          <w:sz w:val="24"/>
+          <w:szCs w:val="24"/>
+          <w:lang w:val="en-US"/>
+        </w:rPr>
+        <w:t>)</w:t>
+      </w:r>
+    </w:p>
+    <w:p>
+      <w:pPr>
+        <w:spacing w:line="360" w:lineRule="auto"/>
+        <w:rPr>
+          <w:rFonts w:ascii="Arial" w:hAnsi="Arial" w:cs="Arial"/>
+          <w:sz w:val="24"/>
+          <w:szCs w:val="24"/>
+          <w:lang w:val="en-US"/>
+        </w:rPr>
+      </w:pPr>
+    </w:p>
+    <w:p>
+      <w:pPr>
+        <w:spacing w:line="360" w:lineRule="auto"/>
+        <w:ind w:left="204"/>
+        <w:rPr>
+          <w:rFonts w:ascii="Arial" w:hAnsi="Arial" w:cs="Arial"/>
+          <w:sz w:val="24"/>
+          <w:szCs w:val="24"/>
+          <w:lang w:val="en-US"/>
+        </w:rPr>
+      </w:pPr>
+      <w:proofErr w:type="spellStart"/>
+      <w:r>
+        <w:rPr>
+          <w:rFonts w:ascii="Arial" w:hAnsi="Arial" w:cs="Arial"/>
+          <w:sz w:val="24"/>
+          <w:szCs w:val="24"/>
+          <w:lang w:val="en-US"/>
+        </w:rPr>
+        <w:t>projectedGPA</w:t>
+      </w:r>
+      <w:proofErr w:type="spellEnd"/>
+      <w:r>
+        <w:rPr>
+          <w:rFonts w:ascii="Arial" w:hAnsi="Arial" w:cs="Arial"/>
+          <w:sz w:val="24"/>
+          <w:szCs w:val="24"/>
+          <w:lang w:val="en-US"/>
+        </w:rPr>
+        <w:t xml:space="preserve"> = (</w:t>
+      </w:r>
+      <w:proofErr w:type="spellStart"/>
+      <w:r>
+        <w:rPr>
+          <w:rFonts w:ascii="Arial" w:hAnsi="Arial" w:cs="Arial"/>
+          <w:sz w:val="24"/>
+          <w:szCs w:val="24"/>
+          <w:lang w:val="en-US"/>
+        </w:rPr>
+        <w:t>currentQualityPoints</w:t>
+      </w:r>
+      <w:proofErr w:type="spellEnd"/>
+      <w:r>
+        <w:rPr>
+          <w:rFonts w:ascii="Arial" w:hAnsi="Arial" w:cs="Arial"/>
+          <w:sz w:val="24"/>
+          <w:szCs w:val="24"/>
+          <w:lang w:val="en-US"/>
+        </w:rPr>
+        <w:t xml:space="preserve"> + </w:t>
+      </w:r>
+      <w:proofErr w:type="spellStart"/>
+      <w:r>
+        <w:rPr>
+          <w:rFonts w:ascii="Arial" w:hAnsi="Arial" w:cs="Arial"/>
+          <w:sz w:val="24"/>
+          <w:szCs w:val="24"/>
+          <w:lang w:val="en-US"/>
+        </w:rPr>
+        <w:t>futureQualityPoints</w:t>
+      </w:r>
+      <w:proofErr w:type="spellEnd"/>
+      <w:r>
+        <w:rPr>
+          <w:rFonts w:ascii="Arial" w:hAnsi="Arial" w:cs="Arial"/>
+          <w:sz w:val="24"/>
+          <w:szCs w:val="24"/>
+          <w:lang w:val="en-US"/>
+        </w:rPr>
+        <w:t>) / (</w:t>
+      </w:r>
+      <w:proofErr w:type="spellStart"/>
+      <w:r>
+        <w:rPr>
+          <w:rFonts w:ascii="Arial" w:hAnsi="Arial" w:cs="Arial"/>
+          <w:sz w:val="24"/>
+          <w:szCs w:val="24"/>
+          <w:lang w:val="en-US"/>
+        </w:rPr>
+        <w:t>currentCredits</w:t>
+      </w:r>
+      <w:proofErr w:type="spellEnd"/>
+      <w:r>
+        <w:rPr>
+          <w:rFonts w:ascii="Arial" w:hAnsi="Arial" w:cs="Arial"/>
+          <w:sz w:val="24"/>
+          <w:szCs w:val="24"/>
+          <w:lang w:val="en-US"/>
+        </w:rPr>
+        <w:t xml:space="preserve"> +</w:t>
+      </w:r>
+      <w:r>
+        <w:rPr>
+          <w:rFonts w:ascii="Arial" w:hAnsi="Arial" w:cs="Arial"/>
+          <w:sz w:val="24"/>
+          <w:szCs w:val="24"/>
+          <w:lang w:val="en-US"/>
+        </w:rPr>
+        <w:t xml:space="preserve"> </w:t>
+      </w:r>
+      <w:proofErr w:type="spellStart"/>
+      <w:r>
+        <w:rPr>
+          <w:rFonts w:ascii="Arial" w:hAnsi="Arial" w:cs="Arial"/>
+          <w:sz w:val="24"/>
+          <w:szCs w:val="24"/>
+          <w:lang w:val="en-US"/>
+        </w:rPr>
+        <w:t>futureCredits</w:t>
+      </w:r>
+      <w:proofErr w:type="spellEnd"/>
+      <w:r>
+        <w:rPr>
+          <w:rFonts w:ascii="Arial" w:hAnsi="Arial" w:cs="Arial"/>
+          <w:sz w:val="24"/>
+          <w:szCs w:val="24"/>
+          <w:lang w:val="en-US"/>
+        </w:rPr>
+        <w:t>)</w:t>
+      </w:r>
+    </w:p>
+    <w:p>
+      <w:pPr>
+        <w:spacing w:line="360" w:lineRule="auto"/>
+        <w:ind w:left="204"/>
+        <w:rPr>
+          <w:rFonts w:ascii="Arial" w:hAnsi="Arial" w:cs="Arial"/>
+          <w:sz w:val="24"/>
+          <w:szCs w:val="24"/>
+          <w:lang w:val="en-US"/>
+        </w:rPr>
+      </w:pPr>
+    </w:p>
+    <w:p>
+      <w:pPr>
+        <w:spacing w:line="360" w:lineRule="auto"/>
+        <w:ind w:left="204"/>
+        <w:rPr>
+          <w:rFonts w:ascii="Arial" w:hAnsi="Arial" w:cs="Arial"/>
+          <w:sz w:val="24"/>
+          <w:szCs w:val="24"/>
+          <w:lang w:val="en-US"/>
+        </w:rPr>
+      </w:pPr>
+      <w:r>
+        <w:rPr>
+          <w:rFonts w:ascii="Arial" w:hAnsi="Arial" w:cs="Arial"/>
+          <w:sz w:val="24"/>
+          <w:szCs w:val="24"/>
+          <w:lang w:val="en-US"/>
+        </w:rPr>
+        <w:t xml:space="preserve">RETURN </w:t>
+      </w:r>
+      <w:proofErr w:type="spellStart"/>
+      <w:r>
+        <w:rPr>
+          <w:rFonts w:ascii="Arial" w:hAnsi="Arial" w:cs="Arial"/>
+          <w:sz w:val="24"/>
+          <w:szCs w:val="24"/>
+          <w:lang w:val="en-US"/>
+        </w:rPr>
+        <w:t>projectedGPA</w:t>
+      </w:r>
+      <w:proofErr w:type="spellEnd"/>
+    </w:p>
+    <w:p>
+      <w:pPr>
+        <w:spacing w:line="360" w:lineRule="auto"/>
+        <w:rPr>
+          <w:rFonts w:ascii="Arial" w:hAnsi="Arial" w:cs="Arial"/>
+          <w:sz w:val="24"/>
+          <w:szCs w:val="24"/>
+          <w:lang w:val="en-US"/>
+        </w:rPr>
+      </w:pPr>
+    </w:p>
+    <w:p>
+      <w:pPr>
+        <w:spacing w:line="360" w:lineRule="auto"/>
+        <w:rPr>
+          <w:rFonts w:ascii="Arial" w:hAnsi="Arial" w:cs="Arial"/>
+          <w:sz w:val="24"/>
+          <w:szCs w:val="24"/>
+          <w:lang w:val="en-US"/>
+        </w:rPr>
+      </w:pPr>
+      <w:r>
+        <w:rPr>
+          <w:rFonts w:ascii="Arial" w:hAnsi="Arial" w:cs="Arial"/>
+          <w:sz w:val="24"/>
+          <w:szCs w:val="24"/>
+          <w:lang w:val="en-US"/>
+        </w:rPr>
+        <w:t>END FUNCTION</w:t>
+      </w:r>
+    </w:p>
+    <w:p>
+      <w:pPr>
+        <w:spacing w:line="360" w:lineRule="auto"/>
+        <w:rPr>
+          <w:rFonts w:ascii="Arial" w:hAnsi="Arial" w:cs="Arial"/>
+          <w:sz w:val="24"/>
+          <w:szCs w:val="24"/>
+          <w:lang w:val="en-US"/>
+        </w:rPr>
+      </w:pPr>
+    </w:p>
+    <w:p>
+      <w:pPr>
+        <w:spacing w:line="360" w:lineRule="auto"/>
+        <w:rPr>
+          <w:rFonts w:ascii="Arial" w:hAnsi="Arial" w:cs="Arial"/>
+          <w:sz w:val="24"/>
+          <w:szCs w:val="24"/>
+          <w:lang w:val="en-US"/>
+        </w:rPr>
+      </w:pPr>
+    </w:p>
+    <w:p>
+      <w:pPr>
+        <w:spacing w:line="360" w:lineRule="auto"/>
+        <w:rPr>
+          <w:rFonts w:ascii="Arial" w:hAnsi="Arial" w:cs="Arial"/>
+          <w:sz w:val="24"/>
+          <w:szCs w:val="24"/>
+          <w:lang w:val="en-US"/>
+        </w:rPr>
+      </w:pPr>
+    </w:p>
+    <w:p>
+      <w:pPr>
+        <w:spacing w:line="360" w:lineRule="auto"/>
+        <w:rPr>
+          <w:rFonts w:ascii="Arial" w:hAnsi="Arial" w:cs="Arial"/>
+          <w:sz w:val="24"/>
+          <w:szCs w:val="24"/>
+          <w:lang w:val="en-US"/>
+        </w:rPr>
+      </w:pPr>
+      <w:r>
+        <w:rPr>
+          <w:rFonts w:ascii="Arial" w:hAnsi="Arial" w:cs="Arial"/>
+          <w:sz w:val="24"/>
+          <w:szCs w:val="24"/>
+          <w:lang w:val="en-US"/>
+        </w:rPr>
+        <w:t xml:space="preserve">FUNCTION </w:t>
+      </w:r>
+      <w:proofErr w:type="spellStart"/>
+      <w:proofErr w:type="gramStart"/>
+      <w:r>
+        <w:rPr>
+          <w:rFonts w:ascii="Arial" w:hAnsi="Arial" w:cs="Arial"/>
+          <w:sz w:val="24"/>
+          <w:szCs w:val="24"/>
+          <w:lang w:val="en-US"/>
+        </w:rPr>
+        <w:t>CalculateDegreeProgress</w:t>
+      </w:r>
+      <w:proofErr w:type="spellEnd"/>
+      <w:r>
+        <w:rPr>
+          <w:rFonts w:ascii="Arial" w:hAnsi="Arial" w:cs="Arial"/>
+          <w:sz w:val="24"/>
+          <w:szCs w:val="24"/>
+          <w:lang w:val="en-US"/>
+        </w:rPr>
+        <w:t>(</w:t>
+      </w:r>
+      <w:proofErr w:type="spellStart"/>
+      <w:proofErr w:type="gramEnd"/>
+      <w:r>
+        <w:rPr>
+          <w:rFonts w:ascii="Arial" w:hAnsi="Arial" w:cs="Arial"/>
+          <w:sz w:val="24"/>
+          <w:szCs w:val="24"/>
+          <w:lang w:val="en-US"/>
+        </w:rPr>
+        <w:t>earnedCredits</w:t>
+      </w:r>
+      <w:proofErr w:type="spellEnd"/>
+      <w:r>
+        <w:rPr>
+          <w:rFonts w:ascii="Arial" w:hAnsi="Arial" w:cs="Arial"/>
+          <w:sz w:val="24"/>
+          <w:szCs w:val="24"/>
+          <w:lang w:val="en-US"/>
+        </w:rPr>
+        <w:t xml:space="preserve">, </w:t>
+      </w:r>
+      <w:proofErr w:type="spellStart"/>
+      <w:r>
+        <w:rPr>
+          <w:rFonts w:ascii="Arial" w:hAnsi="Arial" w:cs="Arial"/>
+          <w:sz w:val="24"/>
+          <w:szCs w:val="24"/>
+          <w:lang w:val="en-US"/>
+        </w:rPr>
+        <w:t>requiredCredits</w:t>
+      </w:r>
+      <w:proofErr w:type="spellEnd"/>
+      <w:r>
+        <w:rPr>
+          <w:rFonts w:ascii="Arial" w:hAnsi="Arial" w:cs="Arial"/>
+          <w:sz w:val="24"/>
+          <w:szCs w:val="24"/>
+          <w:lang w:val="en-US"/>
+        </w:rPr>
+        <w:t>)</w:t>
+      </w:r>
+    </w:p>
+    <w:p>
+      <w:pPr>
+        <w:spacing w:line="360" w:lineRule="auto"/>
+        <w:rPr>
+          <w:rFonts w:ascii="Arial" w:hAnsi="Arial" w:cs="Arial"/>
+          <w:sz w:val="24"/>
+          <w:szCs w:val="24"/>
+          <w:lang w:val="en-US"/>
+        </w:rPr>
+      </w:pPr>
+    </w:p>
+    <w:p>
+      <w:pPr>
+        <w:spacing w:line="360" w:lineRule="auto"/>
+        <w:rPr>
+          <w:rFonts w:ascii="Arial" w:hAnsi="Arial" w:cs="Arial"/>
+          <w:sz w:val="24"/>
+          <w:szCs w:val="24"/>
+          <w:lang w:val="en-US"/>
+        </w:rPr>
+      </w:pPr>
+      <w:r>
+        <w:rPr>
+          <w:rFonts w:ascii="Arial" w:hAnsi="Arial" w:cs="Arial"/>
+          <w:sz w:val="24"/>
+          <w:szCs w:val="24"/>
+          <w:lang w:val="en-US"/>
+        </w:rPr>
+        <w:lastRenderedPageBreak/>
+        <w:t xml:space="preserve">   </w:t>
+      </w:r>
+      <w:r>
+        <w:rPr>
+          <w:rFonts w:ascii="Arial" w:hAnsi="Arial" w:cs="Arial"/>
+          <w:sz w:val="24"/>
+          <w:szCs w:val="24"/>
+          <w:lang w:val="en-US"/>
+        </w:rPr>
+        <w:t xml:space="preserve">IF </w:t>
+      </w:r>
+      <w:proofErr w:type="spellStart"/>
+      <w:r>
+        <w:rPr>
+          <w:rFonts w:ascii="Arial" w:hAnsi="Arial" w:cs="Arial"/>
+          <w:sz w:val="24"/>
+          <w:szCs w:val="24"/>
+          <w:lang w:val="en-US"/>
+        </w:rPr>
+        <w:t>requiredCredits</w:t>
+      </w:r>
+      <w:proofErr w:type="spellEnd"/>
+      <w:r>
+        <w:rPr>
+          <w:rFonts w:ascii="Arial" w:hAnsi="Arial" w:cs="Arial"/>
+          <w:sz w:val="24"/>
+          <w:szCs w:val="24"/>
+          <w:lang w:val="en-US"/>
+        </w:rPr>
+        <w:t xml:space="preserve"> &lt;= 0</w:t>
+      </w:r>
+    </w:p>
+    <w:p>
+      <w:pPr>
+        <w:spacing w:line="360" w:lineRule="auto"/>
+        <w:rPr>
+          <w:rFonts w:ascii="Arial" w:hAnsi="Arial" w:cs="Arial"/>
+          <w:sz w:val="24"/>
+          <w:szCs w:val="24"/>
+          <w:lang w:val="en-US"/>
+        </w:rPr>
+      </w:pPr>
+      <w:r>
+        <w:rPr>
+          <w:rFonts w:ascii="Arial" w:hAnsi="Arial" w:cs="Arial"/>
+          <w:sz w:val="24"/>
+          <w:szCs w:val="24"/>
+          <w:lang w:val="en-US"/>
+        </w:rPr>
+        <w:t xml:space="preserve">   </w:t>
+      </w:r>
+      <w:r>
+        <w:rPr>
+          <w:rFonts w:ascii="Arial" w:hAnsi="Arial" w:cs="Arial"/>
+          <w:sz w:val="24"/>
+          <w:szCs w:val="24"/>
+          <w:lang w:val="en-US"/>
+        </w:rPr>
+        <w:t xml:space="preserve">   </w:t>
+      </w:r>
+      <w:r>
+        <w:rPr>
+          <w:rFonts w:ascii="Arial" w:hAnsi="Arial" w:cs="Arial"/>
+          <w:sz w:val="24"/>
+          <w:szCs w:val="24"/>
+          <w:lang w:val="en-US"/>
+        </w:rPr>
+        <w:t>RETURN 0</w:t>
       </w:r>
     </w:p>
     <w:p>
@@ -8272,6 +9492,215 @@
           <w:szCs w:val="24"/>
           <w:lang w:val="en-US"/>
         </w:rPr>
+        <w:t xml:space="preserve">   </w:t>
+      </w:r>
+      <w:r>
+        <w:rPr>
+          <w:rFonts w:ascii="Arial" w:hAnsi="Arial" w:cs="Arial"/>
+          <w:sz w:val="24"/>
+          <w:szCs w:val="24"/>
+          <w:lang w:val="en-US"/>
+        </w:rPr>
+        <w:t>p</w:t>
+      </w:r>
+      <w:r>
+        <w:rPr>
+          <w:rFonts w:ascii="Arial" w:hAnsi="Arial" w:cs="Arial"/>
+          <w:sz w:val="24"/>
+          <w:szCs w:val="24"/>
+          <w:lang w:val="en-US"/>
+        </w:rPr>
+        <w:t xml:space="preserve">ercentage = </w:t>
+      </w:r>
+      <w:proofErr w:type="spellStart"/>
+      <w:r>
+        <w:rPr>
+          <w:rFonts w:ascii="Arial" w:hAnsi="Arial" w:cs="Arial"/>
+          <w:sz w:val="24"/>
+          <w:szCs w:val="24"/>
+          <w:lang w:val="en-US"/>
+        </w:rPr>
+        <w:t>earnedCredits</w:t>
+      </w:r>
+      <w:proofErr w:type="spellEnd"/>
+      <w:r>
+        <w:rPr>
+          <w:rFonts w:ascii="Arial" w:hAnsi="Arial" w:cs="Arial"/>
+          <w:sz w:val="24"/>
+          <w:szCs w:val="24"/>
+          <w:lang w:val="en-US"/>
+        </w:rPr>
+        <w:t xml:space="preserve"> / </w:t>
+      </w:r>
+      <w:proofErr w:type="spellStart"/>
+      <w:r>
+        <w:rPr>
+          <w:rFonts w:ascii="Arial" w:hAnsi="Arial" w:cs="Arial"/>
+          <w:sz w:val="24"/>
+          <w:szCs w:val="24"/>
+          <w:lang w:val="en-US"/>
+        </w:rPr>
+        <w:t>requiredCredits</w:t>
+      </w:r>
+      <w:proofErr w:type="spellEnd"/>
+      <w:r>
+        <w:rPr>
+          <w:rFonts w:ascii="Arial" w:hAnsi="Arial" w:cs="Arial"/>
+          <w:sz w:val="24"/>
+          <w:szCs w:val="24"/>
+          <w:lang w:val="en-US"/>
+        </w:rPr>
+        <w:t xml:space="preserve"> * 100</w:t>
+      </w:r>
+    </w:p>
+    <w:p>
+      <w:pPr>
+        <w:spacing w:line="360" w:lineRule="auto"/>
+        <w:rPr>
+          <w:rFonts w:ascii="Arial" w:hAnsi="Arial" w:cs="Arial"/>
+          <w:sz w:val="24"/>
+          <w:szCs w:val="24"/>
+          <w:lang w:val="en-US"/>
+        </w:rPr>
+      </w:pPr>
+    </w:p>
+    <w:p>
+      <w:pPr>
+        <w:spacing w:line="360" w:lineRule="auto"/>
+        <w:rPr>
+          <w:rFonts w:ascii="Arial" w:hAnsi="Arial" w:cs="Arial"/>
+          <w:sz w:val="24"/>
+          <w:szCs w:val="24"/>
+          <w:lang w:val="en-US"/>
+        </w:rPr>
+      </w:pPr>
+      <w:r>
+        <w:rPr>
+          <w:rFonts w:ascii="Arial" w:hAnsi="Arial" w:cs="Arial"/>
+          <w:sz w:val="24"/>
+          <w:szCs w:val="24"/>
+          <w:lang w:val="en-US"/>
+        </w:rPr>
+        <w:t xml:space="preserve">   IF percentage &gt; 100</w:t>
+      </w:r>
+    </w:p>
+    <w:p>
+      <w:pPr>
+        <w:spacing w:line="360" w:lineRule="auto"/>
+        <w:rPr>
+          <w:rFonts w:ascii="Arial" w:hAnsi="Arial" w:cs="Arial"/>
+          <w:sz w:val="24"/>
+          <w:szCs w:val="24"/>
+          <w:lang w:val="en-US"/>
+        </w:rPr>
+      </w:pPr>
+      <w:r>
+        <w:rPr>
+          <w:rFonts w:ascii="Arial" w:hAnsi="Arial" w:cs="Arial"/>
+          <w:sz w:val="24"/>
+          <w:szCs w:val="24"/>
+          <w:lang w:val="en-US"/>
+        </w:rPr>
+        <w:t xml:space="preserve">      </w:t>
+      </w:r>
+      <w:r>
+        <w:rPr>
+          <w:rFonts w:ascii="Arial" w:hAnsi="Arial" w:cs="Arial"/>
+          <w:sz w:val="24"/>
+          <w:szCs w:val="24"/>
+          <w:lang w:val="en-US"/>
+        </w:rPr>
+        <w:t>percentage = 100</w:t>
+      </w:r>
+    </w:p>
+    <w:p>
+      <w:pPr>
+        <w:spacing w:line="360" w:lineRule="auto"/>
+        <w:rPr>
+          <w:rFonts w:ascii="Arial" w:hAnsi="Arial" w:cs="Arial"/>
+          <w:sz w:val="24"/>
+          <w:szCs w:val="24"/>
+          <w:lang w:val="en-US"/>
+        </w:rPr>
+      </w:pPr>
+      <w:r>
+        <w:rPr>
+          <w:rFonts w:ascii="Arial" w:hAnsi="Arial" w:cs="Arial"/>
+          <w:sz w:val="24"/>
+          <w:szCs w:val="24"/>
+          <w:lang w:val="en-US"/>
+        </w:rPr>
+        <w:t xml:space="preserve">   </w:t>
+      </w:r>
+      <w:r>
+        <w:rPr>
+          <w:rFonts w:ascii="Arial" w:hAnsi="Arial" w:cs="Arial"/>
+          <w:sz w:val="24"/>
+          <w:szCs w:val="24"/>
+          <w:lang w:val="en-US"/>
+        </w:rPr>
+        <w:t>END IF</w:t>
+      </w:r>
+    </w:p>
+    <w:p>
+      <w:pPr>
+        <w:spacing w:line="360" w:lineRule="auto"/>
+        <w:rPr>
+          <w:rFonts w:ascii="Arial" w:hAnsi="Arial" w:cs="Arial"/>
+          <w:sz w:val="24"/>
+          <w:szCs w:val="24"/>
+          <w:lang w:val="en-US"/>
+        </w:rPr>
+      </w:pPr>
+    </w:p>
+    <w:p>
+      <w:pPr>
+        <w:spacing w:line="360" w:lineRule="auto"/>
+        <w:rPr>
+          <w:rFonts w:ascii="Arial" w:hAnsi="Arial" w:cs="Arial"/>
+          <w:sz w:val="24"/>
+          <w:szCs w:val="24"/>
+          <w:lang w:val="en-US"/>
+        </w:rPr>
+      </w:pPr>
+      <w:r>
+        <w:rPr>
+          <w:rFonts w:ascii="Arial" w:hAnsi="Arial" w:cs="Arial"/>
+          <w:sz w:val="24"/>
+          <w:szCs w:val="24"/>
+          <w:lang w:val="en-US"/>
+        </w:rPr>
+        <w:t xml:space="preserve">   RETURN percentage</w:t>
+      </w:r>
+    </w:p>
+    <w:p>
+      <w:pPr>
+        <w:spacing w:line="360" w:lineRule="auto"/>
+        <w:rPr>
+          <w:rFonts w:ascii="Arial" w:hAnsi="Arial" w:cs="Arial"/>
+          <w:sz w:val="24"/>
+          <w:szCs w:val="24"/>
+          <w:lang w:val="en-US"/>
+        </w:rPr>
+      </w:pPr>
+    </w:p>
+    <w:p>
+      <w:pPr>
+        <w:spacing w:line="360" w:lineRule="auto"/>
+        <w:rPr>
+          <w:rFonts w:ascii="Arial" w:hAnsi="Arial" w:cs="Arial"/>
+          <w:sz w:val="24"/>
+          <w:szCs w:val="24"/>
+          <w:lang w:val="en-US"/>
+        </w:rPr>
+      </w:pPr>
+      <w:r>
+        <w:rPr>
+          <w:rFonts w:ascii="Arial" w:hAnsi="Arial" w:cs="Arial"/>
+          <w:sz w:val="24"/>
+          <w:szCs w:val="24"/>
+          <w:lang w:val="en-US"/>
+        </w:rPr>
         <w:t>END FUNCTION</w:t>
       </w:r>
     </w:p>
@@ -8296,51 +9725,68 @@
           <w:lang w:val="en-US"/>
         </w:rPr>
       </w:pPr>
-      <w:r>
-        <w:rPr>
-          <w:rFonts w:ascii="Arial" w:hAnsi="Arial" w:cs="Arial"/>
-          <w:sz w:val="24"/>
-          <w:szCs w:val="24"/>
-          <w:lang w:val="en-US"/>
-        </w:rPr>
-        <w:t>FUNCTION</w:t>
-      </w:r>
-      <w:r>
-        <w:rPr>
-          <w:rFonts w:ascii="Arial" w:hAnsi="Arial" w:cs="Arial"/>
-          <w:sz w:val="24"/>
-          <w:szCs w:val="24"/>
-          <w:lang w:val="en-US"/>
-        </w:rPr>
-        <w:t xml:space="preserve"> CalculateProjectedGPA(</w:t>
-      </w:r>
-      <w:r>
-        <w:rPr>
-          <w:rFonts w:ascii="Arial" w:hAnsi="Arial" w:cs="Arial"/>
-          <w:sz w:val="24"/>
-          <w:szCs w:val="24"/>
-          <w:lang w:val="en-US"/>
-        </w:rPr>
-        <w:t>currentCourses,</w:t>
-      </w:r>
-      <w:r>
-        <w:rPr>
-          <w:rFonts w:ascii="Arial" w:hAnsi="Arial" w:cs="Arial"/>
-          <w:sz w:val="24"/>
-          <w:szCs w:val="24"/>
-          <w:lang w:val="en-US"/>
-        </w:rPr>
-        <w:t xml:space="preserve"> hypothetical</w:t>
-      </w:r>
-      <w:r>
-        <w:rPr>
-          <w:rFonts w:ascii="Arial" w:hAnsi="Arial" w:cs="Arial"/>
-          <w:sz w:val="24"/>
-          <w:szCs w:val="24"/>
-          <w:lang w:val="en-US"/>
-        </w:rPr>
-        <w:t>Courses</w:t>
-      </w:r>
+    </w:p>
+    <w:p>
+      <w:pPr>
+        <w:spacing w:line="360" w:lineRule="auto"/>
+        <w:rPr>
+          <w:rFonts w:ascii="Arial" w:hAnsi="Arial" w:cs="Arial"/>
+          <w:sz w:val="24"/>
+          <w:szCs w:val="24"/>
+          <w:lang w:val="en-US"/>
+        </w:rPr>
+      </w:pPr>
+    </w:p>
+    <w:p>
+      <w:pPr>
+        <w:spacing w:line="360" w:lineRule="auto"/>
+        <w:rPr>
+          <w:rFonts w:ascii="Arial" w:hAnsi="Arial" w:cs="Arial"/>
+          <w:sz w:val="24"/>
+          <w:szCs w:val="24"/>
+          <w:lang w:val="en-US"/>
+        </w:rPr>
+      </w:pPr>
+      <w:r>
+        <w:rPr>
+          <w:rFonts w:ascii="Arial" w:hAnsi="Arial" w:cs="Arial"/>
+          <w:sz w:val="24"/>
+          <w:szCs w:val="24"/>
+          <w:lang w:val="en-US"/>
+        </w:rPr>
+        <w:t xml:space="preserve">FUNCTION </w:t>
+      </w:r>
+      <w:proofErr w:type="spellStart"/>
+      <w:r>
+        <w:rPr>
+          <w:rFonts w:ascii="Arial" w:hAnsi="Arial" w:cs="Arial"/>
+          <w:sz w:val="24"/>
+          <w:szCs w:val="24"/>
+          <w:lang w:val="en-US"/>
+        </w:rPr>
+        <w:t>DeleteCourse</w:t>
+      </w:r>
+      <w:proofErr w:type="spellEnd"/>
+      <w:r>
+        <w:rPr>
+          <w:rFonts w:ascii="Arial" w:hAnsi="Arial" w:cs="Arial"/>
+          <w:sz w:val="24"/>
+          <w:szCs w:val="24"/>
+          <w:lang w:val="en-US"/>
+        </w:rPr>
+        <w:t>(</w:t>
+      </w:r>
+      <w:proofErr w:type="spellStart"/>
+      <w:r>
+        <w:rPr>
+          <w:rFonts w:ascii="Arial" w:hAnsi="Arial" w:cs="Arial"/>
+          <w:sz w:val="24"/>
+          <w:szCs w:val="24"/>
+          <w:lang w:val="en-US"/>
+        </w:rPr>
+        <w:t>courseId</w:t>
+      </w:r>
+      <w:proofErr w:type="spellEnd"/>
       <w:r>
         <w:rPr>
           <w:rFonts w:ascii="Arial" w:hAnsi="Arial" w:cs="Arial"/>
@@ -8379,105 +9825,6 @@
           <w:szCs w:val="24"/>
           <w:lang w:val="en-US"/>
         </w:rPr>
-        <w:lastRenderedPageBreak/>
-        <w:t xml:space="preserve">   currentQualityPoints = </w:t>
-      </w:r>
-      <w:r>
-        <w:rPr>
-          <w:rFonts w:ascii="Arial" w:hAnsi="Arial" w:cs="Arial"/>
-          <w:sz w:val="24"/>
-          <w:szCs w:val="24"/>
-          <w:lang w:val="en-US"/>
-        </w:rPr>
-        <w:t>CalculateQualityPoints</w:t>
-      </w:r>
-      <w:r>
-        <w:rPr>
-          <w:rFonts w:ascii="Arial" w:hAnsi="Arial" w:cs="Arial"/>
-          <w:sz w:val="24"/>
-          <w:szCs w:val="24"/>
-          <w:lang w:val="en-US"/>
-        </w:rPr>
-        <w:t>(</w:t>
-      </w:r>
-      <w:r>
-        <w:rPr>
-          <w:rFonts w:ascii="Arial" w:hAnsi="Arial" w:cs="Arial"/>
-          <w:sz w:val="24"/>
-          <w:szCs w:val="24"/>
-          <w:lang w:val="en-US"/>
-        </w:rPr>
-        <w:t>currentCourses</w:t>
-      </w:r>
-      <w:r>
-        <w:rPr>
-          <w:rFonts w:ascii="Arial" w:hAnsi="Arial" w:cs="Arial"/>
-          <w:sz w:val="24"/>
-          <w:szCs w:val="24"/>
-          <w:lang w:val="en-US"/>
-        </w:rPr>
-        <w:t>)</w:t>
-      </w:r>
-    </w:p>
-    <w:p>
-      <w:pPr>
-        <w:spacing w:line="360" w:lineRule="auto"/>
-        <w:rPr>
-          <w:rFonts w:ascii="Arial" w:hAnsi="Arial" w:cs="Arial"/>
-          <w:sz w:val="24"/>
-          <w:szCs w:val="24"/>
-          <w:lang w:val="en-US"/>
-        </w:rPr>
-      </w:pPr>
-    </w:p>
-    <w:p>
-      <w:pPr>
-        <w:spacing w:line="360" w:lineRule="auto"/>
-        <w:rPr>
-          <w:rFonts w:ascii="Arial" w:hAnsi="Arial" w:cs="Arial"/>
-          <w:sz w:val="24"/>
-          <w:szCs w:val="24"/>
-          <w:lang w:val="en-US"/>
-        </w:rPr>
-      </w:pPr>
-      <w:r>
-        <w:rPr>
-          <w:rFonts w:ascii="Arial" w:hAnsi="Arial" w:cs="Arial"/>
-          <w:sz w:val="24"/>
-          <w:szCs w:val="24"/>
-          <w:lang w:val="en-US"/>
-        </w:rPr>
-        <w:t xml:space="preserve">   futureQualityPoints = CalculateQualityPoints(hypotheticalCourses)</w:t>
-      </w:r>
-    </w:p>
-    <w:p>
-      <w:pPr>
-        <w:spacing w:line="360" w:lineRule="auto"/>
-        <w:rPr>
-          <w:rFonts w:ascii="Arial" w:hAnsi="Arial" w:cs="Arial"/>
-          <w:sz w:val="24"/>
-          <w:szCs w:val="24"/>
-          <w:lang w:val="en-US"/>
-        </w:rPr>
-      </w:pPr>
-    </w:p>
-    <w:p>
-      <w:pPr>
-        <w:spacing w:line="360" w:lineRule="auto"/>
-        <w:rPr>
-          <w:rFonts w:ascii="Arial" w:hAnsi="Arial" w:cs="Arial"/>
-          <w:sz w:val="24"/>
-          <w:szCs w:val="24"/>
-          <w:lang w:val="en-US"/>
-        </w:rPr>
-      </w:pPr>
-      <w:r>
-        <w:rPr>
-          <w:rFonts w:ascii="Arial" w:hAnsi="Arial" w:cs="Arial"/>
-          <w:sz w:val="24"/>
-          <w:szCs w:val="24"/>
-          <w:lang w:val="en-US"/>
-        </w:rPr>
         <w:t xml:space="preserve">   </w:t>
       </w:r>
       <w:r>
@@ -8487,220 +9834,285 @@
           <w:szCs w:val="24"/>
           <w:lang w:val="en-US"/>
         </w:rPr>
-        <w:t>currentCredits</w:t>
-      </w:r>
-      <w:r>
-        <w:rPr>
-          <w:rFonts w:ascii="Arial" w:hAnsi="Arial" w:cs="Arial"/>
-          <w:sz w:val="24"/>
-          <w:szCs w:val="24"/>
-          <w:lang w:val="en-US"/>
-        </w:rPr>
-        <w:t xml:space="preserve"> = CalculateAttemptedCredits</w:t>
-      </w:r>
-      <w:r>
-        <w:rPr>
-          <w:rFonts w:ascii="Arial" w:hAnsi="Arial" w:cs="Arial"/>
-          <w:sz w:val="24"/>
-          <w:szCs w:val="24"/>
-          <w:lang w:val="en-US"/>
-        </w:rPr>
-        <w:t>(</w:t>
-      </w:r>
-      <w:r>
-        <w:rPr>
-          <w:rFonts w:ascii="Arial" w:hAnsi="Arial" w:cs="Arial"/>
-          <w:sz w:val="24"/>
-          <w:szCs w:val="24"/>
-          <w:lang w:val="en-US"/>
-        </w:rPr>
-        <w:t>currentCourses</w:t>
-      </w:r>
-      <w:r>
-        <w:rPr>
-          <w:rFonts w:ascii="Arial" w:hAnsi="Arial" w:cs="Arial"/>
-          <w:sz w:val="24"/>
-          <w:szCs w:val="24"/>
-          <w:lang w:val="en-US"/>
-        </w:rPr>
-        <w:t>)</w:t>
-      </w:r>
-    </w:p>
-    <w:p>
-      <w:pPr>
-        <w:spacing w:line="360" w:lineRule="auto"/>
-        <w:rPr>
-          <w:rFonts w:ascii="Arial" w:hAnsi="Arial" w:cs="Arial"/>
-          <w:sz w:val="24"/>
-          <w:szCs w:val="24"/>
-          <w:lang w:val="en-US"/>
-        </w:rPr>
-      </w:pPr>
-    </w:p>
-    <w:p>
-      <w:pPr>
-        <w:spacing w:line="360" w:lineRule="auto"/>
-        <w:rPr>
-          <w:rFonts w:ascii="Arial" w:hAnsi="Arial" w:cs="Arial"/>
-          <w:sz w:val="24"/>
-          <w:szCs w:val="24"/>
-          <w:lang w:val="en-US"/>
-        </w:rPr>
-      </w:pPr>
-      <w:r>
-        <w:rPr>
-          <w:rFonts w:ascii="Arial" w:hAnsi="Arial" w:cs="Arial"/>
-          <w:sz w:val="24"/>
-          <w:szCs w:val="24"/>
-          <w:lang w:val="en-US"/>
-        </w:rPr>
-        <w:t xml:space="preserve">   futureCredits</w:t>
-      </w:r>
-      <w:r>
-        <w:rPr>
-          <w:rFonts w:ascii="Arial" w:hAnsi="Arial" w:cs="Arial"/>
-          <w:sz w:val="24"/>
-          <w:szCs w:val="24"/>
-          <w:lang w:val="en-US"/>
-        </w:rPr>
-        <w:t xml:space="preserve"> = CalculateAttemptedCredits(hypotheticalCourses)</w:t>
-      </w:r>
-    </w:p>
-    <w:p>
-      <w:pPr>
-        <w:spacing w:line="360" w:lineRule="auto"/>
-        <w:rPr>
-          <w:rFonts w:ascii="Arial" w:hAnsi="Arial" w:cs="Arial"/>
-          <w:sz w:val="24"/>
-          <w:szCs w:val="24"/>
-          <w:lang w:val="en-US"/>
-        </w:rPr>
-      </w:pPr>
-    </w:p>
-    <w:p>
-      <w:pPr>
-        <w:spacing w:line="360" w:lineRule="auto"/>
-        <w:ind w:left="204"/>
-        <w:rPr>
-          <w:rFonts w:ascii="Arial" w:hAnsi="Arial" w:cs="Arial"/>
-          <w:sz w:val="24"/>
-          <w:szCs w:val="24"/>
-          <w:lang w:val="en-US"/>
-        </w:rPr>
-      </w:pPr>
-      <w:r>
-        <w:rPr>
-          <w:rFonts w:ascii="Arial" w:hAnsi="Arial" w:cs="Arial"/>
-          <w:sz w:val="24"/>
-          <w:szCs w:val="24"/>
-          <w:lang w:val="en-US"/>
-        </w:rPr>
-        <w:t>projectedGPA</w:t>
-      </w:r>
-      <w:r>
-        <w:rPr>
-          <w:rFonts w:ascii="Arial" w:hAnsi="Arial" w:cs="Arial"/>
-          <w:sz w:val="24"/>
-          <w:szCs w:val="24"/>
-          <w:lang w:val="en-US"/>
-        </w:rPr>
-        <w:t xml:space="preserve"> = (</w:t>
-      </w:r>
-      <w:r>
-        <w:rPr>
-          <w:rFonts w:ascii="Arial" w:hAnsi="Arial" w:cs="Arial"/>
-          <w:sz w:val="24"/>
-          <w:szCs w:val="24"/>
-          <w:lang w:val="en-US"/>
-        </w:rPr>
-        <w:t>currentQualityPoints</w:t>
-      </w:r>
-      <w:r>
-        <w:rPr>
-          <w:rFonts w:ascii="Arial" w:hAnsi="Arial" w:cs="Arial"/>
-          <w:sz w:val="24"/>
-          <w:szCs w:val="24"/>
-          <w:lang w:val="en-US"/>
-        </w:rPr>
-        <w:t xml:space="preserve"> + futureQualityPoints</w:t>
-      </w:r>
-      <w:r>
-        <w:rPr>
-          <w:rFonts w:ascii="Arial" w:hAnsi="Arial" w:cs="Arial"/>
-          <w:sz w:val="24"/>
-          <w:szCs w:val="24"/>
-          <w:lang w:val="en-US"/>
-        </w:rPr>
-        <w:t>) / (</w:t>
-      </w:r>
-      <w:r>
-        <w:rPr>
-          <w:rFonts w:ascii="Arial" w:hAnsi="Arial" w:cs="Arial"/>
-          <w:sz w:val="24"/>
-          <w:szCs w:val="24"/>
-          <w:lang w:val="en-US"/>
-        </w:rPr>
-        <w:t>currentCredits +</w:t>
-      </w:r>
-      <w:r>
-        <w:rPr>
-          <w:rFonts w:ascii="Arial" w:hAnsi="Arial" w:cs="Arial"/>
-          <w:sz w:val="24"/>
-          <w:szCs w:val="24"/>
-          <w:lang w:val="en-US"/>
-        </w:rPr>
-        <w:t xml:space="preserve"> </w:t>
-      </w:r>
-      <w:r>
-        <w:rPr>
-          <w:rFonts w:ascii="Arial" w:hAnsi="Arial" w:cs="Arial"/>
-          <w:sz w:val="24"/>
-          <w:szCs w:val="24"/>
-          <w:lang w:val="en-US"/>
-        </w:rPr>
-        <w:t>futureCredits</w:t>
-      </w:r>
-      <w:r>
-        <w:rPr>
-          <w:rFonts w:ascii="Arial" w:hAnsi="Arial" w:cs="Arial"/>
-          <w:sz w:val="24"/>
-          <w:szCs w:val="24"/>
-          <w:lang w:val="en-US"/>
-        </w:rPr>
-        <w:t>)</w:t>
-      </w:r>
-    </w:p>
-    <w:p>
-      <w:pPr>
-        <w:spacing w:line="360" w:lineRule="auto"/>
-        <w:ind w:left="204"/>
-        <w:rPr>
-          <w:rFonts w:ascii="Arial" w:hAnsi="Arial" w:cs="Arial"/>
-          <w:sz w:val="24"/>
-          <w:szCs w:val="24"/>
-          <w:lang w:val="en-US"/>
-        </w:rPr>
-      </w:pPr>
-    </w:p>
-    <w:p>
-      <w:pPr>
-        <w:spacing w:line="360" w:lineRule="auto"/>
-        <w:ind w:left="204"/>
-        <w:rPr>
-          <w:rFonts w:ascii="Arial" w:hAnsi="Arial" w:cs="Arial"/>
-          <w:sz w:val="24"/>
-          <w:szCs w:val="24"/>
-          <w:lang w:val="en-US"/>
-        </w:rPr>
-      </w:pPr>
-      <w:r>
-        <w:rPr>
-          <w:rFonts w:ascii="Arial" w:hAnsi="Arial" w:cs="Arial"/>
-          <w:sz w:val="24"/>
-          <w:szCs w:val="24"/>
-          <w:lang w:val="en-US"/>
-        </w:rPr>
-        <w:t>RETURN projectedGPA</w:t>
+        <w:t xml:space="preserve">FIND course by </w:t>
+      </w:r>
+      <w:proofErr w:type="spellStart"/>
+      <w:r>
+        <w:rPr>
+          <w:rFonts w:ascii="Arial" w:hAnsi="Arial" w:cs="Arial"/>
+          <w:sz w:val="24"/>
+          <w:szCs w:val="24"/>
+          <w:lang w:val="en-US"/>
+        </w:rPr>
+        <w:t>course</w:t>
+      </w:r>
+      <w:r>
+        <w:rPr>
+          <w:rFonts w:ascii="Arial" w:hAnsi="Arial" w:cs="Arial"/>
+          <w:sz w:val="24"/>
+          <w:szCs w:val="24"/>
+          <w:lang w:val="en-US"/>
+        </w:rPr>
+        <w:t>I</w:t>
+      </w:r>
+      <w:r>
+        <w:rPr>
+          <w:rFonts w:ascii="Arial" w:hAnsi="Arial" w:cs="Arial"/>
+          <w:sz w:val="24"/>
+          <w:szCs w:val="24"/>
+          <w:lang w:val="en-US"/>
+        </w:rPr>
+        <w:t>d</w:t>
+      </w:r>
+      <w:proofErr w:type="spellEnd"/>
+    </w:p>
+    <w:p>
+      <w:pPr>
+        <w:spacing w:line="360" w:lineRule="auto"/>
+        <w:rPr>
+          <w:rFonts w:ascii="Arial" w:hAnsi="Arial" w:cs="Arial"/>
+          <w:sz w:val="24"/>
+          <w:szCs w:val="24"/>
+          <w:lang w:val="en-US"/>
+        </w:rPr>
+      </w:pPr>
+    </w:p>
+    <w:p>
+      <w:pPr>
+        <w:spacing w:line="360" w:lineRule="auto"/>
+        <w:rPr>
+          <w:rFonts w:ascii="Arial" w:hAnsi="Arial" w:cs="Arial"/>
+          <w:sz w:val="24"/>
+          <w:szCs w:val="24"/>
+          <w:lang w:val="en-US"/>
+        </w:rPr>
+      </w:pPr>
+      <w:r>
+        <w:rPr>
+          <w:rFonts w:ascii="Arial" w:hAnsi="Arial" w:cs="Arial"/>
+          <w:sz w:val="24"/>
+          <w:szCs w:val="24"/>
+          <w:lang w:val="en-US"/>
+        </w:rPr>
+        <w:t xml:space="preserve">   IF </w:t>
+      </w:r>
+      <w:r>
+        <w:rPr>
+          <w:rFonts w:ascii="Arial" w:hAnsi="Arial" w:cs="Arial"/>
+          <w:sz w:val="24"/>
+          <w:szCs w:val="24"/>
+          <w:lang w:val="en-US"/>
+        </w:rPr>
+        <w:t>course does not exist</w:t>
+      </w:r>
+    </w:p>
+    <w:p>
+      <w:pPr>
+        <w:spacing w:line="360" w:lineRule="auto"/>
+        <w:rPr>
+          <w:rFonts w:ascii="Arial" w:hAnsi="Arial" w:cs="Arial"/>
+          <w:sz w:val="24"/>
+          <w:szCs w:val="24"/>
+          <w:lang w:val="en-US"/>
+        </w:rPr>
+      </w:pPr>
+      <w:r>
+        <w:rPr>
+          <w:rFonts w:ascii="Arial" w:hAnsi="Arial" w:cs="Arial"/>
+          <w:sz w:val="24"/>
+          <w:szCs w:val="24"/>
+          <w:lang w:val="en-US"/>
+        </w:rPr>
+        <w:t xml:space="preserve">      </w:t>
+      </w:r>
+      <w:r>
+        <w:rPr>
+          <w:rFonts w:ascii="Arial" w:hAnsi="Arial" w:cs="Arial"/>
+          <w:sz w:val="24"/>
+          <w:szCs w:val="24"/>
+          <w:lang w:val="en-US"/>
+        </w:rPr>
+        <w:t>DISPLAY error</w:t>
+      </w:r>
+    </w:p>
+    <w:p>
+      <w:pPr>
+        <w:spacing w:line="360" w:lineRule="auto"/>
+        <w:rPr>
+          <w:rFonts w:ascii="Arial" w:hAnsi="Arial" w:cs="Arial"/>
+          <w:sz w:val="24"/>
+          <w:szCs w:val="24"/>
+          <w:lang w:val="en-US"/>
+        </w:rPr>
+      </w:pPr>
+      <w:r>
+        <w:rPr>
+          <w:rFonts w:ascii="Arial" w:hAnsi="Arial" w:cs="Arial"/>
+          <w:sz w:val="24"/>
+          <w:szCs w:val="24"/>
+          <w:lang w:val="en-US"/>
+        </w:rPr>
+        <w:t xml:space="preserve">      STOP</w:t>
+      </w:r>
+    </w:p>
+    <w:p>
+      <w:pPr>
+        <w:spacing w:line="360" w:lineRule="auto"/>
+        <w:rPr>
+          <w:rFonts w:ascii="Arial" w:hAnsi="Arial" w:cs="Arial"/>
+          <w:sz w:val="24"/>
+          <w:szCs w:val="24"/>
+          <w:lang w:val="en-US"/>
+        </w:rPr>
+      </w:pPr>
+      <w:r>
+        <w:rPr>
+          <w:rFonts w:ascii="Arial" w:hAnsi="Arial" w:cs="Arial"/>
+          <w:sz w:val="24"/>
+          <w:szCs w:val="24"/>
+          <w:lang w:val="en-US"/>
+        </w:rPr>
+        <w:t xml:space="preserve">   END IF</w:t>
+      </w:r>
+    </w:p>
+    <w:p>
+      <w:pPr>
+        <w:spacing w:line="360" w:lineRule="auto"/>
+        <w:rPr>
+          <w:rFonts w:ascii="Arial" w:hAnsi="Arial" w:cs="Arial"/>
+          <w:sz w:val="24"/>
+          <w:szCs w:val="24"/>
+          <w:lang w:val="en-US"/>
+        </w:rPr>
+      </w:pPr>
+    </w:p>
+    <w:p>
+      <w:pPr>
+        <w:spacing w:line="360" w:lineRule="auto"/>
+        <w:rPr>
+          <w:rFonts w:ascii="Arial" w:hAnsi="Arial" w:cs="Arial"/>
+          <w:sz w:val="24"/>
+          <w:szCs w:val="24"/>
+          <w:lang w:val="en-US"/>
+        </w:rPr>
+      </w:pPr>
+      <w:r>
+        <w:rPr>
+          <w:rFonts w:ascii="Arial" w:hAnsi="Arial" w:cs="Arial"/>
+          <w:sz w:val="24"/>
+          <w:szCs w:val="24"/>
+          <w:lang w:val="en-US"/>
+        </w:rPr>
+        <w:t xml:space="preserve">   ASK user for confirmation</w:t>
+      </w:r>
+    </w:p>
+    <w:p>
+      <w:pPr>
+        <w:spacing w:line="360" w:lineRule="auto"/>
+        <w:rPr>
+          <w:rFonts w:ascii="Arial" w:hAnsi="Arial" w:cs="Arial"/>
+          <w:sz w:val="24"/>
+          <w:szCs w:val="24"/>
+          <w:lang w:val="en-US"/>
+        </w:rPr>
+      </w:pPr>
+    </w:p>
+    <w:p>
+      <w:pPr>
+        <w:spacing w:line="360" w:lineRule="auto"/>
+        <w:rPr>
+          <w:rFonts w:ascii="Arial" w:hAnsi="Arial" w:cs="Arial"/>
+          <w:sz w:val="24"/>
+          <w:szCs w:val="24"/>
+          <w:lang w:val="en-US"/>
+        </w:rPr>
+      </w:pPr>
+      <w:r>
+        <w:rPr>
+          <w:rFonts w:ascii="Arial" w:hAnsi="Arial" w:cs="Arial"/>
+          <w:sz w:val="24"/>
+          <w:szCs w:val="24"/>
+          <w:lang w:val="en-US"/>
+        </w:rPr>
+        <w:t xml:space="preserve">   </w:t>
+      </w:r>
+      <w:r>
+        <w:rPr>
+          <w:rFonts w:ascii="Arial" w:hAnsi="Arial" w:cs="Arial"/>
+          <w:sz w:val="24"/>
+          <w:szCs w:val="24"/>
+          <w:lang w:val="en-US"/>
+        </w:rPr>
+        <w:t>IF user confirms</w:t>
+      </w:r>
+    </w:p>
+    <w:p>
+      <w:pPr>
+        <w:spacing w:line="360" w:lineRule="auto"/>
+        <w:rPr>
+          <w:rFonts w:ascii="Arial" w:hAnsi="Arial" w:cs="Arial"/>
+          <w:sz w:val="24"/>
+          <w:szCs w:val="24"/>
+          <w:lang w:val="en-US"/>
+        </w:rPr>
+      </w:pPr>
+      <w:r>
+        <w:rPr>
+          <w:rFonts w:ascii="Arial" w:hAnsi="Arial" w:cs="Arial"/>
+          <w:sz w:val="24"/>
+          <w:szCs w:val="24"/>
+          <w:lang w:val="en-US"/>
+        </w:rPr>
+        <w:t xml:space="preserve">      </w:t>
+      </w:r>
+      <w:r>
+        <w:rPr>
+          <w:rFonts w:ascii="Arial" w:hAnsi="Arial" w:cs="Arial"/>
+          <w:sz w:val="24"/>
+          <w:szCs w:val="24"/>
+          <w:lang w:val="en-US"/>
+        </w:rPr>
+        <w:t>DELETE course</w:t>
+      </w:r>
+    </w:p>
+    <w:p>
+      <w:pPr>
+        <w:spacing w:line="360" w:lineRule="auto"/>
+        <w:rPr>
+          <w:rFonts w:ascii="Arial" w:hAnsi="Arial" w:cs="Arial"/>
+          <w:sz w:val="24"/>
+          <w:szCs w:val="24"/>
+          <w:lang w:val="en-US"/>
+        </w:rPr>
+      </w:pPr>
+      <w:r>
+        <w:rPr>
+          <w:rFonts w:ascii="Arial" w:hAnsi="Arial" w:cs="Arial"/>
+          <w:sz w:val="24"/>
+          <w:szCs w:val="24"/>
+          <w:lang w:val="en-US"/>
+        </w:rPr>
+        <w:t xml:space="preserve">      UPDATE course list</w:t>
+      </w:r>
+    </w:p>
+    <w:p>
+      <w:pPr>
+        <w:spacing w:line="360" w:lineRule="auto"/>
+        <w:rPr>
+          <w:rFonts w:ascii="Arial" w:hAnsi="Arial" w:cs="Arial"/>
+          <w:sz w:val="24"/>
+          <w:szCs w:val="24"/>
+          <w:lang w:val="en-US"/>
+        </w:rPr>
+      </w:pPr>
+      <w:r>
+        <w:rPr>
+          <w:rFonts w:ascii="Arial" w:hAnsi="Arial" w:cs="Arial"/>
+          <w:sz w:val="24"/>
+          <w:szCs w:val="24"/>
+          <w:lang w:val="en-US"/>
+        </w:rPr>
+        <w:t xml:space="preserve">   END IF</w:t>
       </w:r>
     </w:p>
     <w:p>

</xml_diff>

<commit_message>
The title of the third part of my thesis.
</commit_message>
<xml_diff>
--- a/Project Thesis.docx
+++ b/Project Thesis.docx
@@ -10145,6 +10145,220 @@
         </w:rPr>
         <w:t>END FUNCTION</w:t>
       </w:r>
+    </w:p>
+    <w:p>
+      <w:pPr>
+        <w:spacing w:line="360" w:lineRule="auto"/>
+        <w:rPr>
+          <w:rFonts w:ascii="Arial" w:hAnsi="Arial" w:cs="Arial"/>
+          <w:sz w:val="24"/>
+          <w:szCs w:val="24"/>
+          <w:lang w:val="en-US"/>
+        </w:rPr>
+      </w:pPr>
+    </w:p>
+    <w:p>
+      <w:pPr>
+        <w:spacing w:line="360" w:lineRule="auto"/>
+        <w:rPr>
+          <w:rFonts w:ascii="Arial" w:hAnsi="Arial" w:cs="Arial"/>
+          <w:sz w:val="24"/>
+          <w:szCs w:val="24"/>
+          <w:lang w:val="en-US"/>
+        </w:rPr>
+      </w:pPr>
+    </w:p>
+    <w:p>
+      <w:pPr>
+        <w:spacing w:line="360" w:lineRule="auto"/>
+        <w:rPr>
+          <w:rFonts w:ascii="Arial" w:hAnsi="Arial" w:cs="Arial"/>
+          <w:sz w:val="24"/>
+          <w:szCs w:val="24"/>
+          <w:lang w:val="en-US"/>
+        </w:rPr>
+      </w:pPr>
+    </w:p>
+    <w:p>
+      <w:pPr>
+        <w:spacing w:line="360" w:lineRule="auto"/>
+        <w:rPr>
+          <w:rFonts w:ascii="Arial" w:hAnsi="Arial" w:cs="Arial"/>
+          <w:sz w:val="24"/>
+          <w:szCs w:val="24"/>
+          <w:lang w:val="en-US"/>
+        </w:rPr>
+      </w:pPr>
+    </w:p>
+    <w:p>
+      <w:pPr>
+        <w:spacing w:line="360" w:lineRule="auto"/>
+        <w:rPr>
+          <w:rFonts w:ascii="Arial" w:hAnsi="Arial" w:cs="Arial"/>
+          <w:sz w:val="24"/>
+          <w:szCs w:val="24"/>
+          <w:lang w:val="en-US"/>
+        </w:rPr>
+      </w:pPr>
+    </w:p>
+    <w:p>
+      <w:pPr>
+        <w:spacing w:line="360" w:lineRule="auto"/>
+        <w:rPr>
+          <w:rFonts w:ascii="Arial" w:hAnsi="Arial" w:cs="Arial"/>
+          <w:sz w:val="24"/>
+          <w:szCs w:val="24"/>
+          <w:lang w:val="en-US"/>
+        </w:rPr>
+      </w:pPr>
+    </w:p>
+    <w:p>
+      <w:pPr>
+        <w:spacing w:line="360" w:lineRule="auto"/>
+        <w:rPr>
+          <w:rFonts w:ascii="Arial" w:hAnsi="Arial" w:cs="Arial"/>
+          <w:sz w:val="24"/>
+          <w:szCs w:val="24"/>
+          <w:lang w:val="en-US"/>
+        </w:rPr>
+      </w:pPr>
+    </w:p>
+    <w:p>
+      <w:pPr>
+        <w:spacing w:line="360" w:lineRule="auto"/>
+        <w:rPr>
+          <w:rFonts w:ascii="Arial" w:hAnsi="Arial" w:cs="Arial"/>
+          <w:sz w:val="24"/>
+          <w:szCs w:val="24"/>
+          <w:lang w:val="en-US"/>
+        </w:rPr>
+      </w:pPr>
+    </w:p>
+    <w:p>
+      <w:pPr>
+        <w:spacing w:line="360" w:lineRule="auto"/>
+        <w:rPr>
+          <w:rFonts w:ascii="Arial" w:hAnsi="Arial" w:cs="Arial"/>
+          <w:sz w:val="24"/>
+          <w:szCs w:val="24"/>
+          <w:lang w:val="en-US"/>
+        </w:rPr>
+      </w:pPr>
+    </w:p>
+    <w:p>
+      <w:pPr>
+        <w:spacing w:line="360" w:lineRule="auto"/>
+        <w:rPr>
+          <w:rFonts w:ascii="Arial" w:hAnsi="Arial" w:cs="Arial"/>
+          <w:sz w:val="24"/>
+          <w:szCs w:val="24"/>
+          <w:lang w:val="en-US"/>
+        </w:rPr>
+      </w:pPr>
+    </w:p>
+    <w:p>
+      <w:pPr>
+        <w:spacing w:line="360" w:lineRule="auto"/>
+        <w:rPr>
+          <w:rFonts w:ascii="Arial" w:hAnsi="Arial" w:cs="Arial"/>
+          <w:sz w:val="24"/>
+          <w:szCs w:val="24"/>
+          <w:lang w:val="en-US"/>
+        </w:rPr>
+      </w:pPr>
+    </w:p>
+    <w:p>
+      <w:pPr>
+        <w:spacing w:line="360" w:lineRule="auto"/>
+        <w:rPr>
+          <w:rFonts w:ascii="Arial" w:hAnsi="Arial" w:cs="Arial"/>
+          <w:sz w:val="24"/>
+          <w:szCs w:val="24"/>
+          <w:lang w:val="en-US"/>
+        </w:rPr>
+      </w:pPr>
+    </w:p>
+    <w:p>
+      <w:pPr>
+        <w:spacing w:line="360" w:lineRule="auto"/>
+        <w:rPr>
+          <w:rFonts w:ascii="Arial" w:hAnsi="Arial" w:cs="Arial"/>
+          <w:sz w:val="24"/>
+          <w:szCs w:val="24"/>
+          <w:lang w:val="en-US"/>
+        </w:rPr>
+      </w:pPr>
+    </w:p>
+    <w:p>
+      <w:pPr>
+        <w:spacing w:line="360" w:lineRule="auto"/>
+        <w:rPr>
+          <w:rFonts w:ascii="Arial" w:hAnsi="Arial" w:cs="Arial"/>
+          <w:sz w:val="24"/>
+          <w:szCs w:val="24"/>
+          <w:lang w:val="en-US"/>
+        </w:rPr>
+      </w:pPr>
+    </w:p>
+    <w:p>
+      <w:pPr>
+        <w:spacing w:line="360" w:lineRule="auto"/>
+        <w:rPr>
+          <w:rFonts w:ascii="Arial" w:hAnsi="Arial" w:cs="Arial"/>
+          <w:sz w:val="24"/>
+          <w:szCs w:val="24"/>
+          <w:lang w:val="en-US"/>
+        </w:rPr>
+      </w:pPr>
+    </w:p>
+    <w:p>
+      <w:pPr>
+        <w:pStyle w:val="ListParagraph"/>
+        <w:numPr>
+          <w:ilvl w:val="0"/>
+          <w:numId w:val="1"/>
+        </w:numPr>
+        <w:spacing w:line="360" w:lineRule="auto"/>
+        <w:jc w:val="center"/>
+        <w:rPr>
+          <w:rFonts w:ascii="Arial" w:hAnsi="Arial" w:cs="Arial"/>
+          <w:sz w:val="24"/>
+          <w:szCs w:val="24"/>
+          <w:lang w:val="en-US"/>
+        </w:rPr>
+      </w:pPr>
+      <w:r>
+        <w:rPr>
+          <w:rFonts w:ascii="Arial" w:hAnsi="Arial" w:cs="Arial"/>
+          <w:sz w:val="24"/>
+          <w:szCs w:val="24"/>
+          <w:lang w:val="en-US"/>
+        </w:rPr>
+        <w:lastRenderedPageBreak/>
+        <w:t>Design of Software Solution</w:t>
+      </w:r>
+    </w:p>
+    <w:p>
+      <w:pPr>
+        <w:spacing w:line="360" w:lineRule="auto"/>
+        <w:rPr>
+          <w:rFonts w:ascii="Arial" w:hAnsi="Arial" w:cs="Arial"/>
+          <w:sz w:val="24"/>
+          <w:szCs w:val="24"/>
+          <w:lang w:val="en-US"/>
+        </w:rPr>
+      </w:pPr>
+    </w:p>
+    <w:p>
+      <w:pPr>
+        <w:spacing w:line="360" w:lineRule="auto"/>
+        <w:rPr>
+          <w:rFonts w:ascii="Arial" w:hAnsi="Arial" w:cs="Arial"/>
+          <w:sz w:val="24"/>
+          <w:szCs w:val="24"/>
+          <w:lang w:val="en-US"/>
+        </w:rPr>
+      </w:pPr>
     </w:p>
     <w:sectPr>
       <w:footerReference w:type="default" r:id="rId7"/>

</xml_diff>

<commit_message>
Keep on working on my thesis.
</commit_message>
<xml_diff>
--- a/Project Thesis.docx
+++ b/Project Thesis.docx
@@ -10474,6 +10474,402 @@
           <w:lang w:val="en-US"/>
         </w:rPr>
         <w:t>, test, and extend.</w:t>
+      </w:r>
+    </w:p>
+    <w:p>
+      <w:pPr>
+        <w:spacing w:line="360" w:lineRule="auto"/>
+        <w:rPr>
+          <w:rFonts w:ascii="Arial" w:hAnsi="Arial" w:cs="Arial"/>
+          <w:sz w:val="24"/>
+          <w:szCs w:val="24"/>
+          <w:lang w:val="en-US"/>
+        </w:rPr>
+      </w:pPr>
+    </w:p>
+    <w:p>
+      <w:pPr>
+        <w:pStyle w:val="ListParagraph"/>
+        <w:numPr>
+          <w:ilvl w:val="1"/>
+          <w:numId w:val="1"/>
+        </w:numPr>
+        <w:spacing w:line="360" w:lineRule="auto"/>
+        <w:rPr>
+          <w:rFonts w:ascii="Arial" w:hAnsi="Arial" w:cs="Arial"/>
+          <w:sz w:val="24"/>
+          <w:szCs w:val="24"/>
+          <w:lang w:val="en-US"/>
+        </w:rPr>
+      </w:pPr>
+      <w:r>
+        <w:rPr>
+          <w:rFonts w:ascii="Arial" w:hAnsi="Arial" w:cs="Arial"/>
+          <w:sz w:val="24"/>
+          <w:szCs w:val="24"/>
+          <w:lang w:val="en-US"/>
+        </w:rPr>
+        <w:t>S</w:t>
+      </w:r>
+      <w:r>
+        <w:rPr>
+          <w:rFonts w:ascii="Arial" w:hAnsi="Arial" w:cs="Arial"/>
+          <w:sz w:val="24"/>
+          <w:szCs w:val="24"/>
+          <w:lang w:val="en-US"/>
+        </w:rPr>
+        <w:t>oftware Architecture</w:t>
+      </w:r>
+    </w:p>
+    <w:p>
+      <w:pPr>
+        <w:spacing w:line="360" w:lineRule="auto"/>
+        <w:rPr>
+          <w:rFonts w:ascii="Arial" w:hAnsi="Arial" w:cs="Arial"/>
+          <w:sz w:val="24"/>
+          <w:szCs w:val="24"/>
+          <w:lang w:val="en-US"/>
+        </w:rPr>
+      </w:pPr>
+    </w:p>
+    <w:p>
+      <w:pPr>
+        <w:pStyle w:val="ListParagraph"/>
+        <w:numPr>
+          <w:ilvl w:val="2"/>
+          <w:numId w:val="1"/>
+        </w:numPr>
+        <w:spacing w:line="360" w:lineRule="auto"/>
+        <w:rPr>
+          <w:rFonts w:ascii="Arial" w:hAnsi="Arial" w:cs="Arial"/>
+          <w:sz w:val="24"/>
+          <w:szCs w:val="24"/>
+          <w:lang w:val="en-US"/>
+        </w:rPr>
+      </w:pPr>
+      <w:r>
+        <w:rPr>
+          <w:rFonts w:ascii="Arial" w:hAnsi="Arial" w:cs="Arial"/>
+          <w:sz w:val="24"/>
+          <w:szCs w:val="24"/>
+          <w:lang w:val="en-US"/>
+        </w:rPr>
+        <w:t>Presentation layer</w:t>
+      </w:r>
+    </w:p>
+    <w:p>
+      <w:pPr>
+        <w:spacing w:line="360" w:lineRule="auto"/>
+        <w:rPr>
+          <w:rFonts w:ascii="Arial" w:hAnsi="Arial" w:cs="Arial"/>
+          <w:sz w:val="24"/>
+          <w:szCs w:val="24"/>
+          <w:lang w:val="en-US"/>
+        </w:rPr>
+      </w:pPr>
+    </w:p>
+    <w:p>
+      <w:pPr>
+        <w:spacing w:line="360" w:lineRule="auto"/>
+        <w:rPr>
+          <w:rFonts w:ascii="Arial" w:hAnsi="Arial" w:cs="Arial"/>
+          <w:sz w:val="24"/>
+          <w:szCs w:val="24"/>
+          <w:lang w:val="en-US"/>
+        </w:rPr>
+      </w:pPr>
+      <w:r>
+        <w:rPr>
+          <w:rFonts w:ascii="Arial" w:hAnsi="Arial" w:cs="Arial"/>
+          <w:sz w:val="24"/>
+          <w:szCs w:val="24"/>
+          <w:lang w:val="en-US"/>
+        </w:rPr>
+        <w:lastRenderedPageBreak/>
+        <w:t>The presentation layer</w:t>
+      </w:r>
+      <w:r>
+        <w:rPr>
+          <w:rFonts w:ascii="Arial" w:hAnsi="Arial" w:cs="Arial"/>
+          <w:sz w:val="24"/>
+          <w:szCs w:val="24"/>
+          <w:lang w:val="en-US"/>
+        </w:rPr>
+        <w:t xml:space="preserve"> contains</w:t>
+      </w:r>
+      <w:r>
+        <w:rPr>
+          <w:rFonts w:ascii="Arial" w:hAnsi="Arial" w:cs="Arial"/>
+          <w:sz w:val="24"/>
+          <w:szCs w:val="24"/>
+          <w:lang w:val="en-US"/>
+        </w:rPr>
+        <w:t xml:space="preserve"> the Blazor Razor</w:t>
+      </w:r>
+      <w:r>
+        <w:rPr>
+          <w:rFonts w:ascii="Arial" w:hAnsi="Arial" w:cs="Arial"/>
+          <w:sz w:val="24"/>
+          <w:szCs w:val="24"/>
+          <w:lang w:val="en-US"/>
+        </w:rPr>
+        <w:t xml:space="preserve"> components</w:t>
+      </w:r>
+      <w:r>
+        <w:rPr>
+          <w:rFonts w:ascii="Arial" w:hAnsi="Arial" w:cs="Arial"/>
+          <w:sz w:val="24"/>
+          <w:szCs w:val="24"/>
+          <w:lang w:val="en-US"/>
+        </w:rPr>
+        <w:t xml:space="preserve"> through which</w:t>
+      </w:r>
+      <w:r>
+        <w:rPr>
+          <w:rFonts w:ascii="Arial" w:hAnsi="Arial" w:cs="Arial"/>
+          <w:sz w:val="24"/>
+          <w:szCs w:val="24"/>
+          <w:lang w:val="en-US"/>
+        </w:rPr>
+        <w:t xml:space="preserve"> the user interacts with</w:t>
+      </w:r>
+      <w:r>
+        <w:rPr>
+          <w:rFonts w:ascii="Arial" w:hAnsi="Arial" w:cs="Arial"/>
+          <w:sz w:val="24"/>
+          <w:szCs w:val="24"/>
+          <w:lang w:val="en-US"/>
+        </w:rPr>
+        <w:t xml:space="preserve"> the program.</w:t>
+      </w:r>
+      <w:r>
+        <w:rPr>
+          <w:rFonts w:ascii="Arial" w:hAnsi="Arial" w:cs="Arial"/>
+          <w:sz w:val="24"/>
+          <w:szCs w:val="24"/>
+          <w:lang w:val="en-US"/>
+        </w:rPr>
+        <w:t xml:space="preserve"> These components display</w:t>
+      </w:r>
+      <w:r>
+        <w:rPr>
+          <w:rFonts w:ascii="Arial" w:hAnsi="Arial" w:cs="Arial"/>
+          <w:sz w:val="24"/>
+          <w:szCs w:val="24"/>
+          <w:lang w:val="en-US"/>
+        </w:rPr>
+        <w:t xml:space="preserve"> academic information</w:t>
+      </w:r>
+      <w:r>
+        <w:rPr>
+          <w:rFonts w:ascii="Arial" w:hAnsi="Arial" w:cs="Arial"/>
+          <w:sz w:val="24"/>
+          <w:szCs w:val="24"/>
+          <w:lang w:val="en-US"/>
+        </w:rPr>
+        <w:t>, receive user input</w:t>
+      </w:r>
+      <w:r>
+        <w:rPr>
+          <w:rFonts w:ascii="Arial" w:hAnsi="Arial" w:cs="Arial"/>
+          <w:sz w:val="24"/>
+          <w:szCs w:val="24"/>
+          <w:lang w:val="en-US"/>
+        </w:rPr>
+        <w:t>, show validation errors</w:t>
+      </w:r>
+      <w:r>
+        <w:rPr>
+          <w:rFonts w:ascii="Arial" w:hAnsi="Arial" w:cs="Arial"/>
+          <w:sz w:val="24"/>
+          <w:szCs w:val="24"/>
+          <w:lang w:val="en-US"/>
+        </w:rPr>
+        <w:t>, and initiate</w:t>
+      </w:r>
+      <w:r>
+        <w:rPr>
+          <w:rFonts w:ascii="Arial" w:hAnsi="Arial" w:cs="Arial"/>
+          <w:sz w:val="24"/>
+          <w:szCs w:val="24"/>
+          <w:lang w:val="en-US"/>
+        </w:rPr>
+        <w:t xml:space="preserve"> operations through</w:t>
+      </w:r>
+      <w:r>
+        <w:rPr>
+          <w:rFonts w:ascii="Arial" w:hAnsi="Arial" w:cs="Arial"/>
+          <w:sz w:val="24"/>
+          <w:szCs w:val="24"/>
+          <w:lang w:val="en-US"/>
+        </w:rPr>
+        <w:t xml:space="preserve"> the service layer.</w:t>
+      </w:r>
+    </w:p>
+    <w:p>
+      <w:pPr>
+        <w:spacing w:line="360" w:lineRule="auto"/>
+        <w:rPr>
+          <w:rFonts w:ascii="Arial" w:hAnsi="Arial" w:cs="Arial"/>
+          <w:sz w:val="24"/>
+          <w:szCs w:val="24"/>
+          <w:lang w:val="en-US"/>
+        </w:rPr>
+      </w:pPr>
+    </w:p>
+    <w:p>
+      <w:pPr>
+        <w:spacing w:line="360" w:lineRule="auto"/>
+        <w:rPr>
+          <w:rFonts w:ascii="Arial" w:hAnsi="Arial" w:cs="Arial"/>
+          <w:sz w:val="24"/>
+          <w:szCs w:val="24"/>
+          <w:lang w:val="en-US"/>
+        </w:rPr>
+      </w:pPr>
+      <w:r>
+        <w:rPr>
+          <w:rFonts w:ascii="Arial" w:hAnsi="Arial" w:cs="Arial"/>
+          <w:sz w:val="24"/>
+          <w:szCs w:val="24"/>
+          <w:lang w:val="en-US"/>
+        </w:rPr>
+        <w:t xml:space="preserve">The presentation layer does not </w:t>
+      </w:r>
+      <w:r>
+        <w:rPr>
+          <w:rFonts w:ascii="Arial" w:hAnsi="Arial" w:cs="Arial"/>
+          <w:sz w:val="24"/>
+          <w:szCs w:val="24"/>
+          <w:lang w:val="en-US"/>
+        </w:rPr>
+        <w:t>directly implement</w:t>
+      </w:r>
+      <w:r>
+        <w:rPr>
+          <w:rFonts w:ascii="Arial" w:hAnsi="Arial" w:cs="Arial"/>
+          <w:sz w:val="24"/>
+          <w:szCs w:val="24"/>
+          <w:lang w:val="en-US"/>
+        </w:rPr>
+        <w:t xml:space="preserve"> the main academic</w:t>
+      </w:r>
+      <w:r>
+        <w:rPr>
+          <w:rFonts w:ascii="Arial" w:hAnsi="Arial" w:cs="Arial"/>
+          <w:sz w:val="24"/>
+          <w:szCs w:val="24"/>
+          <w:lang w:val="en-US"/>
+        </w:rPr>
+        <w:t xml:space="preserve"> calculations</w:t>
+      </w:r>
+      <w:r>
+        <w:rPr>
+          <w:rFonts w:ascii="Arial" w:hAnsi="Arial" w:cs="Arial"/>
+          <w:sz w:val="24"/>
+          <w:szCs w:val="24"/>
+          <w:lang w:val="en-US"/>
+        </w:rPr>
+        <w:t xml:space="preserve"> or directly manipulate</w:t>
+      </w:r>
+      <w:r>
+        <w:rPr>
+          <w:rFonts w:ascii="Arial" w:hAnsi="Arial" w:cs="Arial"/>
+          <w:sz w:val="24"/>
+          <w:szCs w:val="24"/>
+          <w:lang w:val="en-US"/>
+        </w:rPr>
+        <w:t xml:space="preserve"> the SQLite database</w:t>
+      </w:r>
+      <w:r>
+        <w:rPr>
+          <w:rFonts w:ascii="Arial" w:hAnsi="Arial" w:cs="Arial"/>
+          <w:sz w:val="24"/>
+          <w:szCs w:val="24"/>
+          <w:lang w:val="en-US"/>
+        </w:rPr>
+        <w:t>.</w:t>
+      </w:r>
+      <w:r>
+        <w:rPr>
+          <w:rFonts w:ascii="Arial" w:hAnsi="Arial" w:cs="Arial"/>
+          <w:sz w:val="24"/>
+          <w:szCs w:val="24"/>
+          <w:lang w:val="en-US"/>
+        </w:rPr>
+        <w:t xml:space="preserve"> This separation reduces</w:t>
+      </w:r>
+      <w:r>
+        <w:rPr>
+          <w:rFonts w:ascii="Arial" w:hAnsi="Arial" w:cs="Arial"/>
+          <w:sz w:val="24"/>
+          <w:szCs w:val="24"/>
+          <w:lang w:val="en-US"/>
+        </w:rPr>
+        <w:t xml:space="preserve"> the amount of </w:t>
+      </w:r>
+      <w:r>
+        <w:rPr>
+          <w:rFonts w:ascii="Arial" w:hAnsi="Arial" w:cs="Arial"/>
+          <w:sz w:val="24"/>
+          <w:szCs w:val="24"/>
+          <w:lang w:val="en-US"/>
+        </w:rPr>
+        <w:t>application logic</w:t>
+      </w:r>
+      <w:r>
+        <w:rPr>
+          <w:rFonts w:ascii="Arial" w:hAnsi="Arial" w:cs="Arial"/>
+          <w:sz w:val="24"/>
+          <w:szCs w:val="24"/>
+          <w:lang w:val="en-US"/>
+        </w:rPr>
+        <w:t xml:space="preserve"> contained inside</w:t>
+      </w:r>
+      <w:r>
+        <w:rPr>
+          <w:rFonts w:ascii="Arial" w:hAnsi="Arial" w:cs="Arial"/>
+          <w:sz w:val="24"/>
+          <w:szCs w:val="24"/>
+          <w:lang w:val="en-US"/>
+        </w:rPr>
+        <w:t xml:space="preserve"> the user interface</w:t>
+      </w:r>
+      <w:r>
+        <w:rPr>
+          <w:rFonts w:ascii="Arial" w:hAnsi="Arial" w:cs="Arial"/>
+          <w:sz w:val="24"/>
+          <w:szCs w:val="24"/>
+          <w:lang w:val="en-US"/>
+        </w:rPr>
+        <w:t xml:space="preserve"> and allows the same</w:t>
+      </w:r>
+      <w:r>
+        <w:rPr>
+          <w:rFonts w:ascii="Arial" w:hAnsi="Arial" w:cs="Arial"/>
+          <w:sz w:val="24"/>
+          <w:szCs w:val="24"/>
+          <w:lang w:val="en-US"/>
+        </w:rPr>
+        <w:t xml:space="preserve"> business functionality</w:t>
+      </w:r>
+      <w:r>
+        <w:rPr>
+          <w:rFonts w:ascii="Arial" w:hAnsi="Arial" w:cs="Arial"/>
+          <w:sz w:val="24"/>
+          <w:szCs w:val="24"/>
+          <w:lang w:val="en-US"/>
+        </w:rPr>
+        <w:t xml:space="preserve"> to be reused</w:t>
+      </w:r>
+      <w:r>
+        <w:rPr>
+          <w:rFonts w:ascii="Arial" w:hAnsi="Arial" w:cs="Arial"/>
+          <w:sz w:val="24"/>
+          <w:szCs w:val="24"/>
+          <w:lang w:val="en-US"/>
+        </w:rPr>
+        <w:t xml:space="preserve"> by different components.</w:t>
       </w:r>
     </w:p>
     <w:sectPr>

</xml_diff>

<commit_message>
Finished some more work on the thesis and archived the programming part of the project.
</commit_message>
<xml_diff>
--- a/Project Thesis.docx
+++ b/Project Thesis.docx
@@ -10870,6 +10870,666 @@
           <w:lang w:val="en-US"/>
         </w:rPr>
         <w:t xml:space="preserve"> by different components.</w:t>
+      </w:r>
+    </w:p>
+    <w:p>
+      <w:pPr>
+        <w:spacing w:line="360" w:lineRule="auto"/>
+        <w:rPr>
+          <w:rFonts w:ascii="Arial" w:hAnsi="Arial" w:cs="Arial"/>
+          <w:sz w:val="24"/>
+          <w:szCs w:val="24"/>
+          <w:lang w:val="en-US"/>
+        </w:rPr>
+      </w:pPr>
+    </w:p>
+    <w:p>
+      <w:pPr>
+        <w:pStyle w:val="ListParagraph"/>
+        <w:numPr>
+          <w:ilvl w:val="2"/>
+          <w:numId w:val="1"/>
+        </w:numPr>
+        <w:spacing w:line="360" w:lineRule="auto"/>
+        <w:rPr>
+          <w:rFonts w:ascii="Arial" w:hAnsi="Arial" w:cs="Arial"/>
+          <w:sz w:val="24"/>
+          <w:szCs w:val="24"/>
+          <w:lang w:val="en-US"/>
+        </w:rPr>
+      </w:pPr>
+      <w:r>
+        <w:rPr>
+          <w:rFonts w:ascii="Arial" w:hAnsi="Arial" w:cs="Arial"/>
+          <w:sz w:val="24"/>
+          <w:szCs w:val="24"/>
+          <w:lang w:val="en-US"/>
+        </w:rPr>
+        <w:t>Business Logic</w:t>
+      </w:r>
+      <w:r>
+        <w:rPr>
+          <w:rFonts w:ascii="Arial" w:hAnsi="Arial" w:cs="Arial"/>
+          <w:sz w:val="24"/>
+          <w:szCs w:val="24"/>
+          <w:lang w:val="en-US"/>
+        </w:rPr>
+        <w:t xml:space="preserve"> / Service Layer</w:t>
+      </w:r>
+    </w:p>
+    <w:p>
+      <w:pPr>
+        <w:spacing w:line="360" w:lineRule="auto"/>
+        <w:rPr>
+          <w:rFonts w:ascii="Arial" w:hAnsi="Arial" w:cs="Arial"/>
+          <w:sz w:val="24"/>
+          <w:szCs w:val="24"/>
+          <w:lang w:val="en-US"/>
+        </w:rPr>
+      </w:pPr>
+    </w:p>
+    <w:p>
+      <w:pPr>
+        <w:spacing w:line="360" w:lineRule="auto"/>
+        <w:rPr>
+          <w:rFonts w:ascii="Arial" w:hAnsi="Arial" w:cs="Arial"/>
+          <w:sz w:val="24"/>
+          <w:szCs w:val="24"/>
+          <w:lang w:val="en-US"/>
+        </w:rPr>
+      </w:pPr>
+      <w:r>
+        <w:rPr>
+          <w:rFonts w:ascii="Arial" w:hAnsi="Arial" w:cs="Arial"/>
+          <w:sz w:val="24"/>
+          <w:szCs w:val="24"/>
+          <w:lang w:val="en-US"/>
+        </w:rPr>
+        <w:t>The service layer contains</w:t>
+      </w:r>
+      <w:r>
+        <w:rPr>
+          <w:rFonts w:ascii="Arial" w:hAnsi="Arial" w:cs="Arial"/>
+          <w:sz w:val="24"/>
+          <w:szCs w:val="24"/>
+          <w:lang w:val="en-US"/>
+        </w:rPr>
+        <w:t xml:space="preserve"> the business logic</w:t>
+      </w:r>
+      <w:r>
+        <w:rPr>
+          <w:rFonts w:ascii="Arial" w:hAnsi="Arial" w:cs="Arial"/>
+          <w:sz w:val="24"/>
+          <w:szCs w:val="24"/>
+          <w:lang w:val="en-US"/>
+        </w:rPr>
+        <w:t xml:space="preserve"> of the program.</w:t>
+      </w:r>
+      <w:r>
+        <w:rPr>
+          <w:rFonts w:ascii="Arial" w:hAnsi="Arial" w:cs="Arial"/>
+          <w:sz w:val="24"/>
+          <w:szCs w:val="24"/>
+          <w:lang w:val="en-US"/>
+        </w:rPr>
+        <w:t xml:space="preserve"> It acts as an</w:t>
+      </w:r>
+      <w:r>
+        <w:rPr>
+          <w:rFonts w:ascii="Arial" w:hAnsi="Arial" w:cs="Arial"/>
+          <w:sz w:val="24"/>
+          <w:szCs w:val="24"/>
+          <w:lang w:val="en-US"/>
+        </w:rPr>
+        <w:t xml:space="preserve"> intermediary</w:t>
+      </w:r>
+      <w:r>
+        <w:rPr>
+          <w:rFonts w:ascii="Arial" w:hAnsi="Arial" w:cs="Arial"/>
+          <w:sz w:val="24"/>
+          <w:szCs w:val="24"/>
+          <w:lang w:val="en-US"/>
+        </w:rPr>
+        <w:t xml:space="preserve"> between the</w:t>
+      </w:r>
+      <w:r>
+        <w:rPr>
+          <w:rFonts w:ascii="Arial" w:hAnsi="Arial" w:cs="Arial"/>
+          <w:sz w:val="24"/>
+          <w:szCs w:val="24"/>
+          <w:lang w:val="en-US"/>
+        </w:rPr>
+        <w:t xml:space="preserve"> user interface</w:t>
+      </w:r>
+      <w:r>
+        <w:rPr>
+          <w:rFonts w:ascii="Arial" w:hAnsi="Arial" w:cs="Arial"/>
+          <w:sz w:val="24"/>
+          <w:szCs w:val="24"/>
+          <w:lang w:val="en-US"/>
+        </w:rPr>
+        <w:t xml:space="preserve"> and the data-access layer.</w:t>
+      </w:r>
+      <w:r>
+        <w:rPr>
+          <w:rFonts w:ascii="Arial" w:hAnsi="Arial" w:cs="Arial"/>
+          <w:sz w:val="24"/>
+          <w:szCs w:val="24"/>
+          <w:lang w:val="en-US"/>
+        </w:rPr>
+        <w:t xml:space="preserve"> For example,</w:t>
+      </w:r>
+      <w:r>
+        <w:rPr>
+          <w:rFonts w:ascii="Arial" w:hAnsi="Arial" w:cs="Arial"/>
+          <w:sz w:val="24"/>
+          <w:szCs w:val="24"/>
+          <w:lang w:val="en-US"/>
+        </w:rPr>
+        <w:t xml:space="preserve"> the CourseService is responsible for</w:t>
+      </w:r>
+      <w:r>
+        <w:rPr>
+          <w:rFonts w:ascii="Arial" w:hAnsi="Arial" w:cs="Arial"/>
+          <w:sz w:val="24"/>
+          <w:szCs w:val="24"/>
+          <w:lang w:val="en-US"/>
+        </w:rPr>
+        <w:t xml:space="preserve"> operations</w:t>
+      </w:r>
+      <w:r>
+        <w:rPr>
+          <w:rFonts w:ascii="Arial" w:hAnsi="Arial" w:cs="Arial"/>
+          <w:sz w:val="24"/>
+          <w:szCs w:val="24"/>
+          <w:lang w:val="en-US"/>
+        </w:rPr>
+        <w:t xml:space="preserve"> involving</w:t>
+      </w:r>
+      <w:r>
+        <w:rPr>
+          <w:rFonts w:ascii="Arial" w:hAnsi="Arial" w:cs="Arial"/>
+          <w:sz w:val="24"/>
+          <w:szCs w:val="24"/>
+          <w:lang w:val="en-US"/>
+        </w:rPr>
+        <w:t xml:space="preserve"> Course objects</w:t>
+      </w:r>
+      <w:r>
+        <w:rPr>
+          <w:rFonts w:ascii="Arial" w:hAnsi="Arial" w:cs="Arial"/>
+          <w:sz w:val="24"/>
+          <w:szCs w:val="24"/>
+          <w:lang w:val="en-US"/>
+        </w:rPr>
+        <w:t xml:space="preserve"> rather than</w:t>
+      </w:r>
+      <w:r>
+        <w:rPr>
+          <w:rFonts w:ascii="Arial" w:hAnsi="Arial" w:cs="Arial"/>
+          <w:sz w:val="24"/>
+          <w:szCs w:val="24"/>
+          <w:lang w:val="en-US"/>
+        </w:rPr>
+        <w:t xml:space="preserve"> requiring</w:t>
+      </w:r>
+      <w:r>
+        <w:rPr>
+          <w:rFonts w:ascii="Arial" w:hAnsi="Arial" w:cs="Arial"/>
+          <w:sz w:val="24"/>
+          <w:szCs w:val="24"/>
+          <w:lang w:val="en-US"/>
+        </w:rPr>
+        <w:t xml:space="preserve"> the Courses and AddCourse</w:t>
+      </w:r>
+      <w:r>
+        <w:rPr>
+          <w:rFonts w:ascii="Arial" w:hAnsi="Arial" w:cs="Arial"/>
+          <w:sz w:val="24"/>
+          <w:szCs w:val="24"/>
+          <w:lang w:val="en-US"/>
+        </w:rPr>
+        <w:t xml:space="preserve"> pages </w:t>
+      </w:r>
+      <w:r>
+        <w:rPr>
+          <w:rFonts w:ascii="Arial" w:hAnsi="Arial" w:cs="Arial"/>
+          <w:sz w:val="24"/>
+          <w:szCs w:val="24"/>
+          <w:lang w:val="en-US"/>
+        </w:rPr>
+        <w:t>to directly manage</w:t>
+      </w:r>
+      <w:r>
+        <w:rPr>
+          <w:rFonts w:ascii="Arial" w:hAnsi="Arial" w:cs="Arial"/>
+          <w:sz w:val="24"/>
+          <w:szCs w:val="24"/>
+          <w:lang w:val="en-US"/>
+        </w:rPr>
+        <w:t xml:space="preserve"> stored data.</w:t>
+      </w:r>
+    </w:p>
+    <w:p>
+      <w:pPr>
+        <w:spacing w:line="360" w:lineRule="auto"/>
+        <w:rPr>
+          <w:rFonts w:ascii="Arial" w:hAnsi="Arial" w:cs="Arial"/>
+          <w:sz w:val="24"/>
+          <w:szCs w:val="24"/>
+          <w:lang w:val="en-US"/>
+        </w:rPr>
+      </w:pPr>
+    </w:p>
+    <w:p>
+      <w:pPr>
+        <w:spacing w:line="360" w:lineRule="auto"/>
+        <w:rPr>
+          <w:rFonts w:ascii="Arial" w:hAnsi="Arial" w:cs="Arial"/>
+          <w:sz w:val="24"/>
+          <w:szCs w:val="24"/>
+          <w:lang w:val="en-US"/>
+        </w:rPr>
+      </w:pPr>
+      <w:r>
+        <w:rPr>
+          <w:rFonts w:ascii="Arial" w:hAnsi="Arial" w:cs="Arial"/>
+          <w:sz w:val="24"/>
+          <w:szCs w:val="24"/>
+          <w:lang w:val="en-US"/>
+        </w:rPr>
+        <w:t>Additional services</w:t>
+      </w:r>
+      <w:r>
+        <w:rPr>
+          <w:rFonts w:ascii="Arial" w:hAnsi="Arial" w:cs="Arial"/>
+          <w:sz w:val="24"/>
+          <w:szCs w:val="24"/>
+          <w:lang w:val="en-US"/>
+        </w:rPr>
+        <w:t xml:space="preserve"> will perform </w:t>
+      </w:r>
+      <w:r>
+        <w:rPr>
+          <w:rFonts w:ascii="Arial" w:hAnsi="Arial" w:cs="Arial"/>
+          <w:sz w:val="24"/>
+          <w:szCs w:val="24"/>
+          <w:lang w:val="en-US"/>
+        </w:rPr>
+        <w:t>GPA calculation</w:t>
+      </w:r>
+      <w:r>
+        <w:rPr>
+          <w:rFonts w:ascii="Arial" w:hAnsi="Arial" w:cs="Arial"/>
+          <w:sz w:val="24"/>
+          <w:szCs w:val="24"/>
+          <w:lang w:val="en-US"/>
+        </w:rPr>
+        <w:t>, credit calculation</w:t>
+      </w:r>
+      <w:r>
+        <w:rPr>
+          <w:rFonts w:ascii="Arial" w:hAnsi="Arial" w:cs="Arial"/>
+          <w:sz w:val="24"/>
+          <w:szCs w:val="24"/>
+          <w:lang w:val="en-US"/>
+        </w:rPr>
+        <w:t>, degree-progress evaluation</w:t>
+      </w:r>
+      <w:r>
+        <w:rPr>
+          <w:rFonts w:ascii="Arial" w:hAnsi="Arial" w:cs="Arial"/>
+          <w:sz w:val="24"/>
+          <w:szCs w:val="24"/>
+          <w:lang w:val="en-US"/>
+        </w:rPr>
+        <w:t>,</w:t>
+      </w:r>
+      <w:r>
+        <w:rPr>
+          <w:rFonts w:ascii="Arial" w:hAnsi="Arial" w:cs="Arial"/>
+          <w:sz w:val="24"/>
+          <w:szCs w:val="24"/>
+          <w:lang w:val="en-US"/>
+        </w:rPr>
+        <w:t xml:space="preserve"> and hypothetical </w:t>
+      </w:r>
+      <w:r>
+        <w:rPr>
+          <w:rFonts w:ascii="Arial" w:hAnsi="Arial" w:cs="Arial"/>
+          <w:sz w:val="24"/>
+          <w:szCs w:val="24"/>
+          <w:lang w:val="en-US"/>
+        </w:rPr>
+        <w:t>GPA prediction</w:t>
+      </w:r>
+      <w:r>
+        <w:rPr>
+          <w:rFonts w:ascii="Arial" w:hAnsi="Arial" w:cs="Arial"/>
+          <w:sz w:val="24"/>
+          <w:szCs w:val="24"/>
+          <w:lang w:val="en-US"/>
+        </w:rPr>
+        <w:t>.</w:t>
+      </w:r>
+      <w:r>
+        <w:rPr>
+          <w:rFonts w:ascii="Arial" w:hAnsi="Arial" w:cs="Arial"/>
+          <w:sz w:val="24"/>
+          <w:szCs w:val="24"/>
+          <w:lang w:val="en-US"/>
+        </w:rPr>
+        <w:t xml:space="preserve"> Keeping these operations</w:t>
+      </w:r>
+      <w:r>
+        <w:rPr>
+          <w:rFonts w:ascii="Arial" w:hAnsi="Arial" w:cs="Arial"/>
+          <w:sz w:val="24"/>
+          <w:szCs w:val="24"/>
+          <w:lang w:val="en-US"/>
+        </w:rPr>
+        <w:t xml:space="preserve"> outside the user-interface</w:t>
+      </w:r>
+      <w:r>
+        <w:rPr>
+          <w:rFonts w:ascii="Arial" w:hAnsi="Arial" w:cs="Arial"/>
+          <w:sz w:val="24"/>
+          <w:szCs w:val="24"/>
+          <w:lang w:val="en-US"/>
+        </w:rPr>
+        <w:t xml:space="preserve"> components</w:t>
+      </w:r>
+      <w:r>
+        <w:rPr>
+          <w:rFonts w:ascii="Arial" w:hAnsi="Arial" w:cs="Arial"/>
+          <w:sz w:val="24"/>
+          <w:szCs w:val="24"/>
+          <w:lang w:val="en-US"/>
+        </w:rPr>
+        <w:t xml:space="preserve"> makes the </w:t>
+      </w:r>
+      <w:r>
+        <w:rPr>
+          <w:rFonts w:ascii="Arial" w:hAnsi="Arial" w:cs="Arial"/>
+          <w:sz w:val="24"/>
+          <w:szCs w:val="24"/>
+          <w:lang w:val="en-US"/>
+        </w:rPr>
+        <w:t>algorithms</w:t>
+      </w:r>
+      <w:r>
+        <w:rPr>
+          <w:rFonts w:ascii="Arial" w:hAnsi="Arial" w:cs="Arial"/>
+          <w:sz w:val="24"/>
+          <w:szCs w:val="24"/>
+          <w:lang w:val="en-US"/>
+        </w:rPr>
+        <w:t xml:space="preserve"> easier to test</w:t>
+      </w:r>
+      <w:r>
+        <w:rPr>
+          <w:rFonts w:ascii="Arial" w:hAnsi="Arial" w:cs="Arial"/>
+          <w:sz w:val="24"/>
+          <w:szCs w:val="24"/>
+          <w:lang w:val="en-US"/>
+        </w:rPr>
+        <w:t xml:space="preserve"> independently</w:t>
+      </w:r>
+      <w:r>
+        <w:rPr>
+          <w:rFonts w:ascii="Arial" w:hAnsi="Arial" w:cs="Arial"/>
+          <w:sz w:val="24"/>
+          <w:szCs w:val="24"/>
+          <w:lang w:val="en-US"/>
+        </w:rPr>
+        <w:t>.</w:t>
+      </w:r>
+    </w:p>
+    <w:p>
+      <w:pPr>
+        <w:spacing w:line="360" w:lineRule="auto"/>
+        <w:rPr>
+          <w:rFonts w:ascii="Arial" w:hAnsi="Arial" w:cs="Arial"/>
+          <w:sz w:val="24"/>
+          <w:szCs w:val="24"/>
+          <w:lang w:val="en-US"/>
+        </w:rPr>
+      </w:pPr>
+    </w:p>
+    <w:p>
+      <w:pPr>
+        <w:pStyle w:val="ListParagraph"/>
+        <w:numPr>
+          <w:ilvl w:val="2"/>
+          <w:numId w:val="1"/>
+        </w:numPr>
+        <w:spacing w:line="360" w:lineRule="auto"/>
+        <w:rPr>
+          <w:rFonts w:ascii="Arial" w:hAnsi="Arial" w:cs="Arial"/>
+          <w:sz w:val="24"/>
+          <w:szCs w:val="24"/>
+          <w:lang w:val="en-US"/>
+        </w:rPr>
+      </w:pPr>
+      <w:r>
+        <w:rPr>
+          <w:rFonts w:ascii="Arial" w:hAnsi="Arial" w:cs="Arial"/>
+          <w:sz w:val="24"/>
+          <w:szCs w:val="24"/>
+          <w:lang w:val="en-US"/>
+        </w:rPr>
+        <w:t>Data Access Layer</w:t>
+      </w:r>
+    </w:p>
+    <w:p>
+      <w:pPr>
+        <w:spacing w:line="360" w:lineRule="auto"/>
+        <w:rPr>
+          <w:rFonts w:ascii="Arial" w:hAnsi="Arial" w:cs="Arial"/>
+          <w:sz w:val="24"/>
+          <w:szCs w:val="24"/>
+          <w:lang w:val="en-US"/>
+        </w:rPr>
+      </w:pPr>
+    </w:p>
+    <w:p>
+      <w:pPr>
+        <w:spacing w:line="360" w:lineRule="auto"/>
+        <w:rPr>
+          <w:rFonts w:ascii="Arial" w:hAnsi="Arial" w:cs="Arial"/>
+          <w:sz w:val="24"/>
+          <w:szCs w:val="24"/>
+          <w:lang w:val="en-US"/>
+        </w:rPr>
+      </w:pPr>
+      <w:r>
+        <w:rPr>
+          <w:rFonts w:ascii="Arial" w:hAnsi="Arial" w:cs="Arial"/>
+          <w:sz w:val="24"/>
+          <w:szCs w:val="24"/>
+          <w:lang w:val="en-US"/>
+        </w:rPr>
+        <w:t>The data-access layer</w:t>
+      </w:r>
+      <w:r>
+        <w:rPr>
+          <w:rFonts w:ascii="Arial" w:hAnsi="Arial" w:cs="Arial"/>
+          <w:sz w:val="24"/>
+          <w:szCs w:val="24"/>
+          <w:lang w:val="en-US"/>
+        </w:rPr>
+        <w:t xml:space="preserve"> is responsible for</w:t>
+      </w:r>
+      <w:r>
+        <w:rPr>
+          <w:rFonts w:ascii="Arial" w:hAnsi="Arial" w:cs="Arial"/>
+          <w:sz w:val="24"/>
+          <w:szCs w:val="24"/>
+          <w:lang w:val="en-US"/>
+        </w:rPr>
+        <w:t xml:space="preserve"> communication </w:t>
+      </w:r>
+      <w:r>
+        <w:rPr>
+          <w:rFonts w:ascii="Arial" w:hAnsi="Arial" w:cs="Arial"/>
+          <w:sz w:val="24"/>
+          <w:szCs w:val="24"/>
+          <w:lang w:val="en-US"/>
+        </w:rPr>
+        <w:t xml:space="preserve">with the persistent </w:t>
+      </w:r>
+      <w:r>
+        <w:rPr>
+          <w:rFonts w:ascii="Arial" w:hAnsi="Arial" w:cs="Arial"/>
+          <w:sz w:val="24"/>
+          <w:szCs w:val="24"/>
+          <w:lang w:val="en-US"/>
+        </w:rPr>
+        <w:t>database.</w:t>
+      </w:r>
+      <w:r>
+        <w:rPr>
+          <w:rFonts w:ascii="Arial" w:hAnsi="Arial" w:cs="Arial"/>
+          <w:sz w:val="24"/>
+          <w:szCs w:val="24"/>
+          <w:lang w:val="en-US"/>
+        </w:rPr>
+        <w:t xml:space="preserve"> Entity Framework Core</w:t>
+      </w:r>
+      <w:r>
+        <w:rPr>
+          <w:rFonts w:ascii="Arial" w:hAnsi="Arial" w:cs="Arial"/>
+          <w:sz w:val="24"/>
+          <w:szCs w:val="24"/>
+          <w:lang w:val="en-US"/>
+        </w:rPr>
+        <w:t xml:space="preserve"> is used as an </w:t>
+      </w:r>
+      <w:r>
+        <w:rPr>
+          <w:rFonts w:ascii="Arial" w:hAnsi="Arial" w:cs="Arial"/>
+          <w:sz w:val="24"/>
+          <w:szCs w:val="24"/>
+          <w:lang w:val="en-US"/>
+        </w:rPr>
+        <w:t>Object-Relational Mapper (ORM)</w:t>
+      </w:r>
+      <w:r>
+        <w:rPr>
+          <w:rFonts w:ascii="Arial" w:hAnsi="Arial" w:cs="Arial"/>
+          <w:sz w:val="24"/>
+          <w:szCs w:val="24"/>
+          <w:lang w:val="en-US"/>
+        </w:rPr>
+        <w:t>, allowing database</w:t>
+      </w:r>
+      <w:r>
+        <w:rPr>
+          <w:rFonts w:ascii="Arial" w:hAnsi="Arial" w:cs="Arial"/>
+          <w:sz w:val="24"/>
+          <w:szCs w:val="24"/>
+          <w:lang w:val="en-US"/>
+        </w:rPr>
+        <w:t xml:space="preserve"> records</w:t>
+      </w:r>
+      <w:r>
+        <w:rPr>
+          <w:rFonts w:ascii="Arial" w:hAnsi="Arial" w:cs="Arial"/>
+          <w:sz w:val="24"/>
+          <w:szCs w:val="24"/>
+          <w:lang w:val="en-US"/>
+        </w:rPr>
+        <w:t xml:space="preserve"> to be represented</w:t>
+      </w:r>
+      <w:r>
+        <w:rPr>
+          <w:rFonts w:ascii="Arial" w:hAnsi="Arial" w:cs="Arial"/>
+          <w:sz w:val="24"/>
+          <w:szCs w:val="24"/>
+          <w:lang w:val="en-US"/>
+        </w:rPr>
+        <w:t xml:space="preserve"> and manipulated</w:t>
+      </w:r>
+      <w:r>
+        <w:rPr>
+          <w:rFonts w:ascii="Arial" w:hAnsi="Arial" w:cs="Arial"/>
+          <w:sz w:val="24"/>
+          <w:szCs w:val="24"/>
+          <w:lang w:val="en-US"/>
+        </w:rPr>
+        <w:t xml:space="preserve"> as C# objects</w:t>
+      </w:r>
+      <w:r>
+        <w:rPr>
+          <w:rFonts w:ascii="Arial" w:hAnsi="Arial" w:cs="Arial"/>
+          <w:sz w:val="24"/>
+          <w:szCs w:val="24"/>
+          <w:lang w:val="en-US"/>
+        </w:rPr>
+        <w:t xml:space="preserve">. </w:t>
+      </w:r>
+      <w:r>
+        <w:rPr>
+          <w:rFonts w:ascii="Arial" w:hAnsi="Arial" w:cs="Arial"/>
+          <w:sz w:val="24"/>
+          <w:szCs w:val="24"/>
+          <w:lang w:val="en-US"/>
+        </w:rPr>
+        <w:t>The AcademicDbContext class</w:t>
+      </w:r>
+      <w:r>
+        <w:rPr>
+          <w:rFonts w:ascii="Arial" w:hAnsi="Arial" w:cs="Arial"/>
+          <w:sz w:val="24"/>
+          <w:szCs w:val="24"/>
+          <w:lang w:val="en-US"/>
+        </w:rPr>
+        <w:t xml:space="preserve"> defines </w:t>
+      </w:r>
+      <w:r>
+        <w:rPr>
+          <w:rFonts w:ascii="Arial" w:hAnsi="Arial" w:cs="Arial"/>
+          <w:sz w:val="24"/>
+          <w:szCs w:val="24"/>
+          <w:lang w:val="en-US"/>
+        </w:rPr>
+        <w:t>the entities that are stored</w:t>
+      </w:r>
+      <w:r>
+        <w:rPr>
+          <w:rFonts w:ascii="Arial" w:hAnsi="Arial" w:cs="Arial"/>
+          <w:sz w:val="24"/>
+          <w:szCs w:val="24"/>
+          <w:lang w:val="en-US"/>
+        </w:rPr>
+        <w:t xml:space="preserve"> in the database</w:t>
+      </w:r>
+      <w:r>
+        <w:rPr>
+          <w:rFonts w:ascii="Arial" w:hAnsi="Arial" w:cs="Arial"/>
+          <w:sz w:val="24"/>
+          <w:szCs w:val="24"/>
+          <w:lang w:val="en-US"/>
+        </w:rPr>
+        <w:t xml:space="preserve"> and provides the connection</w:t>
+      </w:r>
+      <w:r>
+        <w:rPr>
+          <w:rFonts w:ascii="Arial" w:hAnsi="Arial" w:cs="Arial"/>
+          <w:sz w:val="24"/>
+          <w:szCs w:val="24"/>
+          <w:lang w:val="en-US"/>
+        </w:rPr>
+        <w:t xml:space="preserve"> between the service layer and</w:t>
+      </w:r>
+      <w:r>
+        <w:rPr>
+          <w:rFonts w:ascii="Arial" w:hAnsi="Arial" w:cs="Arial"/>
+          <w:sz w:val="24"/>
+          <w:szCs w:val="24"/>
+          <w:lang w:val="en-US"/>
+        </w:rPr>
+        <w:t xml:space="preserve"> SQLite.</w:t>
       </w:r>
     </w:p>
     <w:sectPr>

</xml_diff>

<commit_message>
Keep working on my thesis.
</commit_message>
<xml_diff>
--- a/Project Thesis.docx
+++ b/Project Thesis.docx
@@ -6061,8 +6061,19 @@
           <w:lang w:val="en-US"/>
         </w:rPr>
         <w:lastRenderedPageBreak/>
-        <w:t>FUNCTION AddCourse</w:t>
-      </w:r>
+        <w:t xml:space="preserve">FUNCTION </w:t>
+      </w:r>
+      <w:proofErr w:type="spellStart"/>
+      <w:r>
+        <w:rPr>
+          <w:rFonts w:ascii="Arial" w:hAnsi="Arial" w:cs="Arial"/>
+          <w:sz w:val="24"/>
+          <w:szCs w:val="24"/>
+          <w:lang w:val="en-US"/>
+        </w:rPr>
+        <w:t>AddCourse</w:t>
+      </w:r>
+      <w:proofErr w:type="spellEnd"/>
     </w:p>
     <w:p>
       <w:pPr>
@@ -7116,14 +7127,25 @@
         </w:rPr>
         <w:t xml:space="preserve">FUNCTION </w:t>
       </w:r>
-      <w:r>
-        <w:rPr>
-          <w:rFonts w:ascii="Arial" w:hAnsi="Arial" w:cs="Arial"/>
-          <w:sz w:val="24"/>
-          <w:szCs w:val="24"/>
-          <w:lang w:val="en-US"/>
-        </w:rPr>
-        <w:t>CalculateGPA(courses)</w:t>
+      <w:proofErr w:type="spellStart"/>
+      <w:r>
+        <w:rPr>
+          <w:rFonts w:ascii="Arial" w:hAnsi="Arial" w:cs="Arial"/>
+          <w:sz w:val="24"/>
+          <w:szCs w:val="24"/>
+          <w:lang w:val="en-US"/>
+        </w:rPr>
+        <w:t>CalculateGPA</w:t>
+      </w:r>
+      <w:proofErr w:type="spellEnd"/>
+      <w:r>
+        <w:rPr>
+          <w:rFonts w:ascii="Arial" w:hAnsi="Arial" w:cs="Arial"/>
+          <w:sz w:val="24"/>
+          <w:szCs w:val="24"/>
+          <w:lang w:val="en-US"/>
+        </w:rPr>
+        <w:t>(courses)</w:t>
       </w:r>
     </w:p>
     <w:p>
@@ -7156,14 +7178,25 @@
         </w:rPr>
         <w:t xml:space="preserve">   </w:t>
       </w:r>
-      <w:r>
-        <w:rPr>
-          <w:rFonts w:ascii="Arial" w:hAnsi="Arial" w:cs="Arial"/>
-          <w:sz w:val="24"/>
-          <w:szCs w:val="24"/>
-          <w:lang w:val="en-US"/>
-        </w:rPr>
-        <w:t>totalQualityPoints = 0</w:t>
+      <w:proofErr w:type="spellStart"/>
+      <w:r>
+        <w:rPr>
+          <w:rFonts w:ascii="Arial" w:hAnsi="Arial" w:cs="Arial"/>
+          <w:sz w:val="24"/>
+          <w:szCs w:val="24"/>
+          <w:lang w:val="en-US"/>
+        </w:rPr>
+        <w:t>totalQualityPoints</w:t>
+      </w:r>
+      <w:proofErr w:type="spellEnd"/>
+      <w:r>
+        <w:rPr>
+          <w:rFonts w:ascii="Arial" w:hAnsi="Arial" w:cs="Arial"/>
+          <w:sz w:val="24"/>
+          <w:szCs w:val="24"/>
+          <w:lang w:val="en-US"/>
+        </w:rPr>
+        <w:t xml:space="preserve"> = 0</w:t>
       </w:r>
     </w:p>
     <w:p>
@@ -7186,14 +7219,25 @@
         <w:lastRenderedPageBreak/>
         <w:t xml:space="preserve">   </w:t>
       </w:r>
-      <w:r>
-        <w:rPr>
-          <w:rFonts w:ascii="Arial" w:hAnsi="Arial" w:cs="Arial"/>
-          <w:sz w:val="24"/>
-          <w:szCs w:val="24"/>
-          <w:lang w:val="en-US"/>
-        </w:rPr>
-        <w:t>attemptedCredits = 0</w:t>
+      <w:proofErr w:type="spellStart"/>
+      <w:r>
+        <w:rPr>
+          <w:rFonts w:ascii="Arial" w:hAnsi="Arial" w:cs="Arial"/>
+          <w:sz w:val="24"/>
+          <w:szCs w:val="24"/>
+          <w:lang w:val="en-US"/>
+        </w:rPr>
+        <w:t>attemptedCredits</w:t>
+      </w:r>
+      <w:proofErr w:type="spellEnd"/>
+      <w:r>
+        <w:rPr>
+          <w:rFonts w:ascii="Arial" w:hAnsi="Arial" w:cs="Arial"/>
+          <w:sz w:val="24"/>
+          <w:szCs w:val="24"/>
+          <w:lang w:val="en-US"/>
+        </w:rPr>
+        <w:t xml:space="preserve"> = 0</w:t>
       </w:r>
     </w:p>
     <w:p>
@@ -7284,6 +7328,7 @@
         </w:rPr>
         <w:t xml:space="preserve">      </w:t>
       </w:r>
+      <w:proofErr w:type="spellStart"/>
       <w:r>
         <w:rPr>
           <w:rFonts w:ascii="Arial" w:hAnsi="Arial" w:cs="Arial"/>
@@ -7293,15 +7338,38 @@
         </w:rPr>
         <w:t>gradePoints</w:t>
       </w:r>
-      <w:r>
-        <w:rPr>
-          <w:rFonts w:ascii="Arial" w:hAnsi="Arial" w:cs="Arial"/>
-          <w:sz w:val="24"/>
-          <w:szCs w:val="24"/>
-          <w:lang w:val="en-US"/>
-        </w:rPr>
-        <w:t xml:space="preserve"> = ConvertGradeToPoints(</w:t>
-      </w:r>
+      <w:proofErr w:type="spellEnd"/>
+      <w:r>
+        <w:rPr>
+          <w:rFonts w:ascii="Arial" w:hAnsi="Arial" w:cs="Arial"/>
+          <w:sz w:val="24"/>
+          <w:szCs w:val="24"/>
+          <w:lang w:val="en-US"/>
+        </w:rPr>
+        <w:t xml:space="preserve"> = </w:t>
+      </w:r>
+      <w:proofErr w:type="spellStart"/>
+      <w:r>
+        <w:rPr>
+          <w:rFonts w:ascii="Arial" w:hAnsi="Arial" w:cs="Arial"/>
+          <w:sz w:val="24"/>
+          <w:szCs w:val="24"/>
+          <w:lang w:val="en-US"/>
+        </w:rPr>
+        <w:t>ConvertGradeToPoints</w:t>
+      </w:r>
+      <w:proofErr w:type="spellEnd"/>
+      <w:r>
+        <w:rPr>
+          <w:rFonts w:ascii="Arial" w:hAnsi="Arial" w:cs="Arial"/>
+          <w:sz w:val="24"/>
+          <w:szCs w:val="24"/>
+          <w:lang w:val="en-US"/>
+        </w:rPr>
+        <w:t>(</w:t>
+      </w:r>
+      <w:proofErr w:type="spellStart"/>
+      <w:proofErr w:type="gramStart"/>
       <w:r>
         <w:rPr>
           <w:rFonts w:ascii="Arial" w:hAnsi="Arial" w:cs="Arial"/>
@@ -7311,6 +7379,8 @@
         </w:rPr>
         <w:t>course.grade</w:t>
       </w:r>
+      <w:proofErr w:type="spellEnd"/>
+      <w:proofErr w:type="gramEnd"/>
       <w:r>
         <w:rPr>
           <w:rFonts w:ascii="Arial" w:hAnsi="Arial" w:cs="Arial"/>
@@ -7349,26 +7419,59 @@
           <w:szCs w:val="24"/>
           <w:lang w:val="en-US"/>
         </w:rPr>
-        <w:t xml:space="preserve">      totalQualityPoints</w:t>
-      </w:r>
-      <w:r>
-        <w:rPr>
-          <w:rFonts w:ascii="Arial" w:hAnsi="Arial" w:cs="Arial"/>
-          <w:sz w:val="24"/>
-          <w:szCs w:val="24"/>
-          <w:lang w:val="en-US"/>
-        </w:rPr>
-        <w:t xml:space="preserve"> = totalQualityPoints</w:t>
-      </w:r>
-      <w:r>
-        <w:rPr>
-          <w:rFonts w:ascii="Arial" w:hAnsi="Arial" w:cs="Arial"/>
-          <w:sz w:val="24"/>
-          <w:szCs w:val="24"/>
-          <w:lang w:val="en-US"/>
-        </w:rPr>
-        <w:t xml:space="preserve"> + gradePoints</w:t>
-      </w:r>
+        <w:t xml:space="preserve">      </w:t>
+      </w:r>
+      <w:proofErr w:type="spellStart"/>
+      <w:r>
+        <w:rPr>
+          <w:rFonts w:ascii="Arial" w:hAnsi="Arial" w:cs="Arial"/>
+          <w:sz w:val="24"/>
+          <w:szCs w:val="24"/>
+          <w:lang w:val="en-US"/>
+        </w:rPr>
+        <w:t>totalQualityPoints</w:t>
+      </w:r>
+      <w:proofErr w:type="spellEnd"/>
+      <w:r>
+        <w:rPr>
+          <w:rFonts w:ascii="Arial" w:hAnsi="Arial" w:cs="Arial"/>
+          <w:sz w:val="24"/>
+          <w:szCs w:val="24"/>
+          <w:lang w:val="en-US"/>
+        </w:rPr>
+        <w:t xml:space="preserve"> = </w:t>
+      </w:r>
+      <w:proofErr w:type="spellStart"/>
+      <w:r>
+        <w:rPr>
+          <w:rFonts w:ascii="Arial" w:hAnsi="Arial" w:cs="Arial"/>
+          <w:sz w:val="24"/>
+          <w:szCs w:val="24"/>
+          <w:lang w:val="en-US"/>
+        </w:rPr>
+        <w:t>totalQualityPoints</w:t>
+      </w:r>
+      <w:proofErr w:type="spellEnd"/>
+      <w:r>
+        <w:rPr>
+          <w:rFonts w:ascii="Arial" w:hAnsi="Arial" w:cs="Arial"/>
+          <w:sz w:val="24"/>
+          <w:szCs w:val="24"/>
+          <w:lang w:val="en-US"/>
+        </w:rPr>
+        <w:t xml:space="preserve"> + </w:t>
+      </w:r>
+      <w:proofErr w:type="spellStart"/>
+      <w:r>
+        <w:rPr>
+          <w:rFonts w:ascii="Arial" w:hAnsi="Arial" w:cs="Arial"/>
+          <w:sz w:val="24"/>
+          <w:szCs w:val="24"/>
+          <w:lang w:val="en-US"/>
+        </w:rPr>
+        <w:t>gradePoints</w:t>
+      </w:r>
+      <w:proofErr w:type="spellEnd"/>
       <w:r>
         <w:rPr>
           <w:rFonts w:ascii="Arial" w:hAnsi="Arial" w:cs="Arial"/>
@@ -7378,6 +7481,8 @@
         </w:rPr>
         <w:t xml:space="preserve"> * </w:t>
       </w:r>
+      <w:proofErr w:type="spellStart"/>
+      <w:proofErr w:type="gramStart"/>
       <w:r>
         <w:rPr>
           <w:rFonts w:ascii="Arial" w:hAnsi="Arial" w:cs="Arial"/>
@@ -7387,55 +7492,92 @@
         </w:rPr>
         <w:t>course.credits</w:t>
       </w:r>
-    </w:p>
-    <w:p>
-      <w:pPr>
-        <w:spacing w:line="360" w:lineRule="auto"/>
-        <w:rPr>
-          <w:rFonts w:ascii="Arial" w:hAnsi="Arial" w:cs="Arial"/>
-          <w:sz w:val="24"/>
-          <w:szCs w:val="24"/>
-          <w:lang w:val="en-US"/>
-        </w:rPr>
-      </w:pPr>
-    </w:p>
-    <w:p>
-      <w:pPr>
-        <w:spacing w:line="360" w:lineRule="auto"/>
-        <w:rPr>
-          <w:rFonts w:ascii="Arial" w:hAnsi="Arial" w:cs="Arial"/>
-          <w:sz w:val="24"/>
-          <w:szCs w:val="24"/>
-          <w:lang w:val="en-US"/>
-        </w:rPr>
-      </w:pPr>
-      <w:r>
-        <w:rPr>
-          <w:rFonts w:ascii="Arial" w:hAnsi="Arial" w:cs="Arial"/>
-          <w:sz w:val="24"/>
-          <w:szCs w:val="24"/>
-          <w:lang w:val="en-US"/>
-        </w:rPr>
-        <w:t xml:space="preserve">      attemptedCredits</w:t>
-      </w:r>
-      <w:r>
-        <w:rPr>
-          <w:rFonts w:ascii="Arial" w:hAnsi="Arial" w:cs="Arial"/>
-          <w:sz w:val="24"/>
-          <w:szCs w:val="24"/>
-          <w:lang w:val="en-US"/>
-        </w:rPr>
-        <w:t xml:space="preserve"> = attemptedCredits</w:t>
-      </w:r>
-      <w:r>
-        <w:rPr>
-          <w:rFonts w:ascii="Arial" w:hAnsi="Arial" w:cs="Arial"/>
-          <w:sz w:val="24"/>
-          <w:szCs w:val="24"/>
-          <w:lang w:val="en-US"/>
-        </w:rPr>
-        <w:t xml:space="preserve"> + course.credits</w:t>
-      </w:r>
+      <w:proofErr w:type="spellEnd"/>
+      <w:proofErr w:type="gramEnd"/>
+    </w:p>
+    <w:p>
+      <w:pPr>
+        <w:spacing w:line="360" w:lineRule="auto"/>
+        <w:rPr>
+          <w:rFonts w:ascii="Arial" w:hAnsi="Arial" w:cs="Arial"/>
+          <w:sz w:val="24"/>
+          <w:szCs w:val="24"/>
+          <w:lang w:val="en-US"/>
+        </w:rPr>
+      </w:pPr>
+    </w:p>
+    <w:p>
+      <w:pPr>
+        <w:spacing w:line="360" w:lineRule="auto"/>
+        <w:rPr>
+          <w:rFonts w:ascii="Arial" w:hAnsi="Arial" w:cs="Arial"/>
+          <w:sz w:val="24"/>
+          <w:szCs w:val="24"/>
+          <w:lang w:val="en-US"/>
+        </w:rPr>
+      </w:pPr>
+      <w:r>
+        <w:rPr>
+          <w:rFonts w:ascii="Arial" w:hAnsi="Arial" w:cs="Arial"/>
+          <w:sz w:val="24"/>
+          <w:szCs w:val="24"/>
+          <w:lang w:val="en-US"/>
+        </w:rPr>
+        <w:t xml:space="preserve">      </w:t>
+      </w:r>
+      <w:proofErr w:type="spellStart"/>
+      <w:r>
+        <w:rPr>
+          <w:rFonts w:ascii="Arial" w:hAnsi="Arial" w:cs="Arial"/>
+          <w:sz w:val="24"/>
+          <w:szCs w:val="24"/>
+          <w:lang w:val="en-US"/>
+        </w:rPr>
+        <w:t>attemptedCredits</w:t>
+      </w:r>
+      <w:proofErr w:type="spellEnd"/>
+      <w:r>
+        <w:rPr>
+          <w:rFonts w:ascii="Arial" w:hAnsi="Arial" w:cs="Arial"/>
+          <w:sz w:val="24"/>
+          <w:szCs w:val="24"/>
+          <w:lang w:val="en-US"/>
+        </w:rPr>
+        <w:t xml:space="preserve"> = </w:t>
+      </w:r>
+      <w:proofErr w:type="spellStart"/>
+      <w:r>
+        <w:rPr>
+          <w:rFonts w:ascii="Arial" w:hAnsi="Arial" w:cs="Arial"/>
+          <w:sz w:val="24"/>
+          <w:szCs w:val="24"/>
+          <w:lang w:val="en-US"/>
+        </w:rPr>
+        <w:t>attemptedCredits</w:t>
+      </w:r>
+      <w:proofErr w:type="spellEnd"/>
+      <w:r>
+        <w:rPr>
+          <w:rFonts w:ascii="Arial" w:hAnsi="Arial" w:cs="Arial"/>
+          <w:sz w:val="24"/>
+          <w:szCs w:val="24"/>
+          <w:lang w:val="en-US"/>
+        </w:rPr>
+        <w:t xml:space="preserve"> + </w:t>
+      </w:r>
+      <w:proofErr w:type="spellStart"/>
+      <w:proofErr w:type="gramStart"/>
+      <w:r>
+        <w:rPr>
+          <w:rFonts w:ascii="Arial" w:hAnsi="Arial" w:cs="Arial"/>
+          <w:sz w:val="24"/>
+          <w:szCs w:val="24"/>
+          <w:lang w:val="en-US"/>
+        </w:rPr>
+        <w:t>course.credits</w:t>
+      </w:r>
+      <w:proofErr w:type="spellEnd"/>
+      <w:proofErr w:type="gramEnd"/>
     </w:p>
     <w:p>
       <w:pPr>
@@ -7514,8 +7656,19 @@
           <w:szCs w:val="24"/>
           <w:lang w:val="en-US"/>
         </w:rPr>
-        <w:t>IF attemptedCredits</w:t>
-      </w:r>
+        <w:t xml:space="preserve">IF </w:t>
+      </w:r>
+      <w:proofErr w:type="spellStart"/>
+      <w:r>
+        <w:rPr>
+          <w:rFonts w:ascii="Arial" w:hAnsi="Arial" w:cs="Arial"/>
+          <w:sz w:val="24"/>
+          <w:szCs w:val="24"/>
+          <w:lang w:val="en-US"/>
+        </w:rPr>
+        <w:t>attemptedCredits</w:t>
+      </w:r>
+      <w:proofErr w:type="spellEnd"/>
       <w:r>
         <w:rPr>
           <w:rFonts w:ascii="Arial" w:hAnsi="Arial" w:cs="Arial"/>
@@ -7614,15 +7767,37 @@
         </w:rPr>
         <w:t xml:space="preserve"> </w:t>
       </w:r>
-      <w:r>
-        <w:rPr>
-          <w:rFonts w:ascii="Arial" w:hAnsi="Arial" w:cs="Arial"/>
-          <w:sz w:val="24"/>
-          <w:szCs w:val="24"/>
-          <w:lang w:val="en-US"/>
-        </w:rPr>
-        <w:t>totalQualityPoints / attemptedCredits</w:t>
-      </w:r>
+      <w:proofErr w:type="spellStart"/>
+      <w:r>
+        <w:rPr>
+          <w:rFonts w:ascii="Arial" w:hAnsi="Arial" w:cs="Arial"/>
+          <w:sz w:val="24"/>
+          <w:szCs w:val="24"/>
+          <w:lang w:val="en-US"/>
+        </w:rPr>
+        <w:t>totalQualityPoints</w:t>
+      </w:r>
+      <w:proofErr w:type="spellEnd"/>
+      <w:r>
+        <w:rPr>
+          <w:rFonts w:ascii="Arial" w:hAnsi="Arial" w:cs="Arial"/>
+          <w:sz w:val="24"/>
+          <w:szCs w:val="24"/>
+          <w:lang w:val="en-US"/>
+        </w:rPr>
+        <w:t xml:space="preserve"> / </w:t>
+      </w:r>
+      <w:proofErr w:type="spellStart"/>
+      <w:r>
+        <w:rPr>
+          <w:rFonts w:ascii="Arial" w:hAnsi="Arial" w:cs="Arial"/>
+          <w:sz w:val="24"/>
+          <w:szCs w:val="24"/>
+          <w:lang w:val="en-US"/>
+        </w:rPr>
+        <w:t>attemptedCredits</w:t>
+      </w:r>
+      <w:proofErr w:type="spellEnd"/>
     </w:p>
     <w:p>
       <w:pPr>
@@ -7705,7 +7880,27 @@
           <w:szCs w:val="24"/>
           <w:lang w:val="en-US"/>
         </w:rPr>
-        <w:t>FUNCTION ConvertGradeToPoints(grade)</w:t>
+        <w:t xml:space="preserve">FUNCTION </w:t>
+      </w:r>
+      <w:proofErr w:type="spellStart"/>
+      <w:r>
+        <w:rPr>
+          <w:rFonts w:ascii="Arial" w:hAnsi="Arial" w:cs="Arial"/>
+          <w:sz w:val="24"/>
+          <w:szCs w:val="24"/>
+          <w:lang w:val="en-US"/>
+        </w:rPr>
+        <w:t>ConvertGradeToPoints</w:t>
+      </w:r>
+      <w:proofErr w:type="spellEnd"/>
+      <w:r>
+        <w:rPr>
+          <w:rFonts w:ascii="Arial" w:hAnsi="Arial" w:cs="Arial"/>
+          <w:sz w:val="24"/>
+          <w:szCs w:val="24"/>
+          <w:lang w:val="en-US"/>
+        </w:rPr>
+        <w:t>(grade)</w:t>
       </w:r>
     </w:p>
     <w:p>
@@ -7795,16 +7990,36 @@
           <w:szCs w:val="24"/>
           <w:lang w:val="en-US"/>
         </w:rPr>
-        <w:t xml:space="preserve">   ELSE IF grade = ”</w:t>
-      </w:r>
-      <w:r>
-        <w:rPr>
-          <w:rFonts w:ascii="Arial" w:hAnsi="Arial" w:cs="Arial"/>
-          <w:sz w:val="24"/>
-          <w:szCs w:val="24"/>
-          <w:lang w:val="en-US"/>
-        </w:rPr>
-        <w:t>A-</w:t>
+        <w:t xml:space="preserve">   ELSE IF grade </w:t>
+      </w:r>
+      <w:proofErr w:type="gramStart"/>
+      <w:r>
+        <w:rPr>
+          <w:rFonts w:ascii="Arial" w:hAnsi="Arial" w:cs="Arial"/>
+          <w:sz w:val="24"/>
+          <w:szCs w:val="24"/>
+          <w:lang w:val="en-US"/>
+        </w:rPr>
+        <w:t>= ”</w:t>
+      </w:r>
+      <w:r>
+        <w:rPr>
+          <w:rFonts w:ascii="Arial" w:hAnsi="Arial" w:cs="Arial"/>
+          <w:sz w:val="24"/>
+          <w:szCs w:val="24"/>
+          <w:lang w:val="en-US"/>
+        </w:rPr>
+        <w:t>A</w:t>
+      </w:r>
+      <w:proofErr w:type="gramEnd"/>
+      <w:r>
+        <w:rPr>
+          <w:rFonts w:ascii="Arial" w:hAnsi="Arial" w:cs="Arial"/>
+          <w:sz w:val="24"/>
+          <w:szCs w:val="24"/>
+          <w:lang w:val="en-US"/>
+        </w:rPr>
+        <w:t>-</w:t>
       </w:r>
       <w:r>
         <w:rPr>
@@ -8361,25 +8576,68 @@
           <w:szCs w:val="24"/>
           <w:lang w:val="en-US"/>
         </w:rPr>
-        <w:t xml:space="preserve"> CalculateProjectedGPA(</w:t>
-      </w:r>
-      <w:r>
-        <w:rPr>
-          <w:rFonts w:ascii="Arial" w:hAnsi="Arial" w:cs="Arial"/>
-          <w:sz w:val="24"/>
-          <w:szCs w:val="24"/>
-          <w:lang w:val="en-US"/>
-        </w:rPr>
-        <w:t>currentCourses,</w:t>
-      </w:r>
-      <w:r>
-        <w:rPr>
-          <w:rFonts w:ascii="Arial" w:hAnsi="Arial" w:cs="Arial"/>
-          <w:sz w:val="24"/>
-          <w:szCs w:val="24"/>
-          <w:lang w:val="en-US"/>
-        </w:rPr>
-        <w:t xml:space="preserve"> hypothetical</w:t>
+        <w:t xml:space="preserve"> </w:t>
+      </w:r>
+      <w:proofErr w:type="spellStart"/>
+      <w:proofErr w:type="gramStart"/>
+      <w:r>
+        <w:rPr>
+          <w:rFonts w:ascii="Arial" w:hAnsi="Arial" w:cs="Arial"/>
+          <w:sz w:val="24"/>
+          <w:szCs w:val="24"/>
+          <w:lang w:val="en-US"/>
+        </w:rPr>
+        <w:t>CalculateProjectedGPA</w:t>
+      </w:r>
+      <w:proofErr w:type="spellEnd"/>
+      <w:r>
+        <w:rPr>
+          <w:rFonts w:ascii="Arial" w:hAnsi="Arial" w:cs="Arial"/>
+          <w:sz w:val="24"/>
+          <w:szCs w:val="24"/>
+          <w:lang w:val="en-US"/>
+        </w:rPr>
+        <w:t>(</w:t>
+      </w:r>
+      <w:proofErr w:type="spellStart"/>
+      <w:proofErr w:type="gramEnd"/>
+      <w:r>
+        <w:rPr>
+          <w:rFonts w:ascii="Arial" w:hAnsi="Arial" w:cs="Arial"/>
+          <w:sz w:val="24"/>
+          <w:szCs w:val="24"/>
+          <w:lang w:val="en-US"/>
+        </w:rPr>
+        <w:t>currentCourses</w:t>
+      </w:r>
+      <w:proofErr w:type="spellEnd"/>
+      <w:r>
+        <w:rPr>
+          <w:rFonts w:ascii="Arial" w:hAnsi="Arial" w:cs="Arial"/>
+          <w:sz w:val="24"/>
+          <w:szCs w:val="24"/>
+          <w:lang w:val="en-US"/>
+        </w:rPr>
+        <w:t>,</w:t>
+      </w:r>
+      <w:r>
+        <w:rPr>
+          <w:rFonts w:ascii="Arial" w:hAnsi="Arial" w:cs="Arial"/>
+          <w:sz w:val="24"/>
+          <w:szCs w:val="24"/>
+          <w:lang w:val="en-US"/>
+        </w:rPr>
+        <w:t xml:space="preserve"> </w:t>
+      </w:r>
+      <w:proofErr w:type="spellStart"/>
+      <w:r>
+        <w:rPr>
+          <w:rFonts w:ascii="Arial" w:hAnsi="Arial" w:cs="Arial"/>
+          <w:sz w:val="24"/>
+          <w:szCs w:val="24"/>
+          <w:lang w:val="en-US"/>
+        </w:rPr>
+        <w:t>hypothetical</w:t>
       </w:r>
       <w:r>
         <w:rPr>
@@ -8390,6 +8648,7 @@
         </w:rPr>
         <w:t>Courses</w:t>
       </w:r>
+      <w:proofErr w:type="spellEnd"/>
       <w:r>
         <w:rPr>
           <w:rFonts w:ascii="Arial" w:hAnsi="Arial" w:cs="Arial"/>
@@ -8428,8 +8687,29 @@
           <w:szCs w:val="24"/>
           <w:lang w:val="en-US"/>
         </w:rPr>
-        <w:t xml:space="preserve">   currentQualityPoints = </w:t>
-      </w:r>
+        <w:t xml:space="preserve">   </w:t>
+      </w:r>
+      <w:proofErr w:type="spellStart"/>
+      <w:r>
+        <w:rPr>
+          <w:rFonts w:ascii="Arial" w:hAnsi="Arial" w:cs="Arial"/>
+          <w:sz w:val="24"/>
+          <w:szCs w:val="24"/>
+          <w:lang w:val="en-US"/>
+        </w:rPr>
+        <w:t>currentQualityPoints</w:t>
+      </w:r>
+      <w:proofErr w:type="spellEnd"/>
+      <w:r>
+        <w:rPr>
+          <w:rFonts w:ascii="Arial" w:hAnsi="Arial" w:cs="Arial"/>
+          <w:sz w:val="24"/>
+          <w:szCs w:val="24"/>
+          <w:lang w:val="en-US"/>
+        </w:rPr>
+        <w:t xml:space="preserve"> = </w:t>
+      </w:r>
+      <w:proofErr w:type="spellStart"/>
       <w:r>
         <w:rPr>
           <w:rFonts w:ascii="Arial" w:hAnsi="Arial" w:cs="Arial"/>
@@ -8439,6 +8719,7 @@
         </w:rPr>
         <w:t>CalculateQualityPoints</w:t>
       </w:r>
+      <w:proofErr w:type="spellEnd"/>
       <w:r>
         <w:rPr>
           <w:rFonts w:ascii="Arial" w:hAnsi="Arial" w:cs="Arial"/>
@@ -8448,6 +8729,7 @@
         </w:rPr>
         <w:t>(</w:t>
       </w:r>
+      <w:proofErr w:type="spellStart"/>
       <w:r>
         <w:rPr>
           <w:rFonts w:ascii="Arial" w:hAnsi="Arial" w:cs="Arial"/>
@@ -8457,6 +8739,7 @@
         </w:rPr>
         <w:t>currentCourses</w:t>
       </w:r>
+      <w:proofErr w:type="spellEnd"/>
       <w:r>
         <w:rPr>
           <w:rFonts w:ascii="Arial" w:hAnsi="Arial" w:cs="Arial"/>
@@ -8495,39 +8778,100 @@
           <w:szCs w:val="24"/>
           <w:lang w:val="en-US"/>
         </w:rPr>
-        <w:t xml:space="preserve">   futureQualityPoints = CalculateQualityPoints(hypotheticalCourses)</w:t>
-      </w:r>
-    </w:p>
-    <w:p>
-      <w:pPr>
-        <w:spacing w:line="360" w:lineRule="auto"/>
-        <w:rPr>
-          <w:rFonts w:ascii="Arial" w:hAnsi="Arial" w:cs="Arial"/>
-          <w:sz w:val="24"/>
-          <w:szCs w:val="24"/>
-          <w:lang w:val="en-US"/>
-        </w:rPr>
-      </w:pPr>
-    </w:p>
-    <w:p>
-      <w:pPr>
-        <w:spacing w:line="360" w:lineRule="auto"/>
-        <w:rPr>
-          <w:rFonts w:ascii="Arial" w:hAnsi="Arial" w:cs="Arial"/>
-          <w:sz w:val="24"/>
-          <w:szCs w:val="24"/>
-          <w:lang w:val="en-US"/>
-        </w:rPr>
-      </w:pPr>
-      <w:r>
-        <w:rPr>
-          <w:rFonts w:ascii="Arial" w:hAnsi="Arial" w:cs="Arial"/>
-          <w:sz w:val="24"/>
-          <w:szCs w:val="24"/>
-          <w:lang w:val="en-US"/>
-        </w:rPr>
         <w:t xml:space="preserve">   </w:t>
       </w:r>
+      <w:proofErr w:type="spellStart"/>
+      <w:r>
+        <w:rPr>
+          <w:rFonts w:ascii="Arial" w:hAnsi="Arial" w:cs="Arial"/>
+          <w:sz w:val="24"/>
+          <w:szCs w:val="24"/>
+          <w:lang w:val="en-US"/>
+        </w:rPr>
+        <w:t>futureQualityPoints</w:t>
+      </w:r>
+      <w:proofErr w:type="spellEnd"/>
+      <w:r>
+        <w:rPr>
+          <w:rFonts w:ascii="Arial" w:hAnsi="Arial" w:cs="Arial"/>
+          <w:sz w:val="24"/>
+          <w:szCs w:val="24"/>
+          <w:lang w:val="en-US"/>
+        </w:rPr>
+        <w:t xml:space="preserve"> = </w:t>
+      </w:r>
+      <w:proofErr w:type="spellStart"/>
+      <w:r>
+        <w:rPr>
+          <w:rFonts w:ascii="Arial" w:hAnsi="Arial" w:cs="Arial"/>
+          <w:sz w:val="24"/>
+          <w:szCs w:val="24"/>
+          <w:lang w:val="en-US"/>
+        </w:rPr>
+        <w:t>CalculateQualityPoints</w:t>
+      </w:r>
+      <w:proofErr w:type="spellEnd"/>
+      <w:r>
+        <w:rPr>
+          <w:rFonts w:ascii="Arial" w:hAnsi="Arial" w:cs="Arial"/>
+          <w:sz w:val="24"/>
+          <w:szCs w:val="24"/>
+          <w:lang w:val="en-US"/>
+        </w:rPr>
+        <w:t>(</w:t>
+      </w:r>
+      <w:proofErr w:type="spellStart"/>
+      <w:r>
+        <w:rPr>
+          <w:rFonts w:ascii="Arial" w:hAnsi="Arial" w:cs="Arial"/>
+          <w:sz w:val="24"/>
+          <w:szCs w:val="24"/>
+          <w:lang w:val="en-US"/>
+        </w:rPr>
+        <w:t>hypotheticalCourses</w:t>
+      </w:r>
+      <w:proofErr w:type="spellEnd"/>
+      <w:r>
+        <w:rPr>
+          <w:rFonts w:ascii="Arial" w:hAnsi="Arial" w:cs="Arial"/>
+          <w:sz w:val="24"/>
+          <w:szCs w:val="24"/>
+          <w:lang w:val="en-US"/>
+        </w:rPr>
+        <w:t>)</w:t>
+      </w:r>
+    </w:p>
+    <w:p>
+      <w:pPr>
+        <w:spacing w:line="360" w:lineRule="auto"/>
+        <w:rPr>
+          <w:rFonts w:ascii="Arial" w:hAnsi="Arial" w:cs="Arial"/>
+          <w:sz w:val="24"/>
+          <w:szCs w:val="24"/>
+          <w:lang w:val="en-US"/>
+        </w:rPr>
+      </w:pPr>
+    </w:p>
+    <w:p>
+      <w:pPr>
+        <w:spacing w:line="360" w:lineRule="auto"/>
+        <w:rPr>
+          <w:rFonts w:ascii="Arial" w:hAnsi="Arial" w:cs="Arial"/>
+          <w:sz w:val="24"/>
+          <w:szCs w:val="24"/>
+          <w:lang w:val="en-US"/>
+        </w:rPr>
+      </w:pPr>
+      <w:r>
+        <w:rPr>
+          <w:rFonts w:ascii="Arial" w:hAnsi="Arial" w:cs="Arial"/>
+          <w:sz w:val="24"/>
+          <w:szCs w:val="24"/>
+          <w:lang w:val="en-US"/>
+        </w:rPr>
+        <w:t xml:space="preserve">   </w:t>
+      </w:r>
+      <w:proofErr w:type="spellStart"/>
       <w:r>
         <w:rPr>
           <w:rFonts w:ascii="Arial" w:hAnsi="Arial" w:cs="Arial"/>
@@ -8537,15 +8881,27 @@
         </w:rPr>
         <w:t>currentCredits</w:t>
       </w:r>
-      <w:r>
-        <w:rPr>
-          <w:rFonts w:ascii="Arial" w:hAnsi="Arial" w:cs="Arial"/>
-          <w:sz w:val="24"/>
-          <w:szCs w:val="24"/>
-          <w:lang w:val="en-US"/>
-        </w:rPr>
-        <w:t xml:space="preserve"> = CalculateAttemptedCredits</w:t>
-      </w:r>
+      <w:proofErr w:type="spellEnd"/>
+      <w:r>
+        <w:rPr>
+          <w:rFonts w:ascii="Arial" w:hAnsi="Arial" w:cs="Arial"/>
+          <w:sz w:val="24"/>
+          <w:szCs w:val="24"/>
+          <w:lang w:val="en-US"/>
+        </w:rPr>
+        <w:t xml:space="preserve"> = </w:t>
+      </w:r>
+      <w:proofErr w:type="spellStart"/>
+      <w:r>
+        <w:rPr>
+          <w:rFonts w:ascii="Arial" w:hAnsi="Arial" w:cs="Arial"/>
+          <w:sz w:val="24"/>
+          <w:szCs w:val="24"/>
+          <w:lang w:val="en-US"/>
+        </w:rPr>
+        <w:t>CalculateAttemptedCredits</w:t>
+      </w:r>
+      <w:proofErr w:type="spellEnd"/>
       <w:r>
         <w:rPr>
           <w:rFonts w:ascii="Arial" w:hAnsi="Arial" w:cs="Arial"/>
@@ -8555,6 +8911,7 @@
         </w:rPr>
         <w:t>(</w:t>
       </w:r>
+      <w:proofErr w:type="spellStart"/>
       <w:r>
         <w:rPr>
           <w:rFonts w:ascii="Arial" w:hAnsi="Arial" w:cs="Arial"/>
@@ -8564,6 +8921,7 @@
         </w:rPr>
         <w:t>currentCourses</w:t>
       </w:r>
+      <w:proofErr w:type="spellEnd"/>
       <w:r>
         <w:rPr>
           <w:rFonts w:ascii="Arial" w:hAnsi="Arial" w:cs="Arial"/>
@@ -8602,16 +8960,67 @@
           <w:szCs w:val="24"/>
           <w:lang w:val="en-US"/>
         </w:rPr>
-        <w:t xml:space="preserve">   futureCredits</w:t>
-      </w:r>
-      <w:r>
-        <w:rPr>
-          <w:rFonts w:ascii="Arial" w:hAnsi="Arial" w:cs="Arial"/>
-          <w:sz w:val="24"/>
-          <w:szCs w:val="24"/>
-          <w:lang w:val="en-US"/>
-        </w:rPr>
-        <w:t xml:space="preserve"> = CalculateAttemptedCredits(hypotheticalCourses)</w:t>
+        <w:t xml:space="preserve">   </w:t>
+      </w:r>
+      <w:proofErr w:type="spellStart"/>
+      <w:r>
+        <w:rPr>
+          <w:rFonts w:ascii="Arial" w:hAnsi="Arial" w:cs="Arial"/>
+          <w:sz w:val="24"/>
+          <w:szCs w:val="24"/>
+          <w:lang w:val="en-US"/>
+        </w:rPr>
+        <w:t>futureCredits</w:t>
+      </w:r>
+      <w:proofErr w:type="spellEnd"/>
+      <w:r>
+        <w:rPr>
+          <w:rFonts w:ascii="Arial" w:hAnsi="Arial" w:cs="Arial"/>
+          <w:sz w:val="24"/>
+          <w:szCs w:val="24"/>
+          <w:lang w:val="en-US"/>
+        </w:rPr>
+        <w:t xml:space="preserve"> = </w:t>
+      </w:r>
+      <w:proofErr w:type="spellStart"/>
+      <w:r>
+        <w:rPr>
+          <w:rFonts w:ascii="Arial" w:hAnsi="Arial" w:cs="Arial"/>
+          <w:sz w:val="24"/>
+          <w:szCs w:val="24"/>
+          <w:lang w:val="en-US"/>
+        </w:rPr>
+        <w:t>CalculateAttemptedCredits</w:t>
+      </w:r>
+      <w:proofErr w:type="spellEnd"/>
+      <w:r>
+        <w:rPr>
+          <w:rFonts w:ascii="Arial" w:hAnsi="Arial" w:cs="Arial"/>
+          <w:sz w:val="24"/>
+          <w:szCs w:val="24"/>
+          <w:lang w:val="en-US"/>
+        </w:rPr>
+        <w:t>(</w:t>
+      </w:r>
+      <w:proofErr w:type="spellStart"/>
+      <w:r>
+        <w:rPr>
+          <w:rFonts w:ascii="Arial" w:hAnsi="Arial" w:cs="Arial"/>
+          <w:sz w:val="24"/>
+          <w:szCs w:val="24"/>
+          <w:lang w:val="en-US"/>
+        </w:rPr>
+        <w:t>hypotheticalCourses</w:t>
+      </w:r>
+      <w:proofErr w:type="spellEnd"/>
+      <w:r>
+        <w:rPr>
+          <w:rFonts w:ascii="Arial" w:hAnsi="Arial" w:cs="Arial"/>
+          <w:sz w:val="24"/>
+          <w:szCs w:val="24"/>
+          <w:lang w:val="en-US"/>
+        </w:rPr>
+        <w:t>)</w:t>
       </w:r>
     </w:p>
     <w:p>
@@ -8636,6 +9045,7 @@
           <w:lang w:val="en-US"/>
         </w:rPr>
       </w:pPr>
+      <w:proofErr w:type="spellStart"/>
       <w:r>
         <w:rPr>
           <w:rFonts w:ascii="Arial" w:hAnsi="Arial" w:cs="Arial"/>
@@ -8645,6 +9055,7 @@
         </w:rPr>
         <w:t>projectedGPA</w:t>
       </w:r>
+      <w:proofErr w:type="spellEnd"/>
       <w:r>
         <w:rPr>
           <w:rFonts w:ascii="Arial" w:hAnsi="Arial" w:cs="Arial"/>
@@ -8654,6 +9065,7 @@
         </w:rPr>
         <w:t xml:space="preserve"> = (</w:t>
       </w:r>
+      <w:proofErr w:type="spellStart"/>
       <w:r>
         <w:rPr>
           <w:rFonts w:ascii="Arial" w:hAnsi="Arial" w:cs="Arial"/>
@@ -8663,15 +9075,27 @@
         </w:rPr>
         <w:t>currentQualityPoints</w:t>
       </w:r>
-      <w:r>
-        <w:rPr>
-          <w:rFonts w:ascii="Arial" w:hAnsi="Arial" w:cs="Arial"/>
-          <w:sz w:val="24"/>
-          <w:szCs w:val="24"/>
-          <w:lang w:val="en-US"/>
-        </w:rPr>
-        <w:t xml:space="preserve"> + futureQualityPoints</w:t>
-      </w:r>
+      <w:proofErr w:type="spellEnd"/>
+      <w:r>
+        <w:rPr>
+          <w:rFonts w:ascii="Arial" w:hAnsi="Arial" w:cs="Arial"/>
+          <w:sz w:val="24"/>
+          <w:szCs w:val="24"/>
+          <w:lang w:val="en-US"/>
+        </w:rPr>
+        <w:t xml:space="preserve"> + </w:t>
+      </w:r>
+      <w:proofErr w:type="spellStart"/>
+      <w:r>
+        <w:rPr>
+          <w:rFonts w:ascii="Arial" w:hAnsi="Arial" w:cs="Arial"/>
+          <w:sz w:val="24"/>
+          <w:szCs w:val="24"/>
+          <w:lang w:val="en-US"/>
+        </w:rPr>
+        <w:t>futureQualityPoints</w:t>
+      </w:r>
+      <w:proofErr w:type="spellEnd"/>
       <w:r>
         <w:rPr>
           <w:rFonts w:ascii="Arial" w:hAnsi="Arial" w:cs="Arial"/>
@@ -8681,14 +9105,25 @@
         </w:rPr>
         <w:t>) / (</w:t>
       </w:r>
-      <w:r>
-        <w:rPr>
-          <w:rFonts w:ascii="Arial" w:hAnsi="Arial" w:cs="Arial"/>
-          <w:sz w:val="24"/>
-          <w:szCs w:val="24"/>
-          <w:lang w:val="en-US"/>
-        </w:rPr>
-        <w:t>currentCredits +</w:t>
+      <w:proofErr w:type="spellStart"/>
+      <w:r>
+        <w:rPr>
+          <w:rFonts w:ascii="Arial" w:hAnsi="Arial" w:cs="Arial"/>
+          <w:sz w:val="24"/>
+          <w:szCs w:val="24"/>
+          <w:lang w:val="en-US"/>
+        </w:rPr>
+        <w:t>currentCredits</w:t>
+      </w:r>
+      <w:proofErr w:type="spellEnd"/>
+      <w:r>
+        <w:rPr>
+          <w:rFonts w:ascii="Arial" w:hAnsi="Arial" w:cs="Arial"/>
+          <w:sz w:val="24"/>
+          <w:szCs w:val="24"/>
+          <w:lang w:val="en-US"/>
+        </w:rPr>
+        <w:t xml:space="preserve"> +</w:t>
       </w:r>
       <w:r>
         <w:rPr>
@@ -8699,6 +9134,7 @@
         </w:rPr>
         <w:t xml:space="preserve"> </w:t>
       </w:r>
+      <w:proofErr w:type="spellStart"/>
       <w:r>
         <w:rPr>
           <w:rFonts w:ascii="Arial" w:hAnsi="Arial" w:cs="Arial"/>
@@ -8708,6 +9144,7 @@
         </w:rPr>
         <w:t>futureCredits</w:t>
       </w:r>
+      <w:proofErr w:type="spellEnd"/>
       <w:r>
         <w:rPr>
           <w:rFonts w:ascii="Arial" w:hAnsi="Arial" w:cs="Arial"/>
@@ -8748,8 +9185,19 @@
           <w:szCs w:val="24"/>
           <w:lang w:val="en-US"/>
         </w:rPr>
-        <w:t>RETURN projectedGPA</w:t>
-      </w:r>
+        <w:t xml:space="preserve">RETURN </w:t>
+      </w:r>
+      <w:proofErr w:type="spellStart"/>
+      <w:r>
+        <w:rPr>
+          <w:rFonts w:ascii="Arial" w:hAnsi="Arial" w:cs="Arial"/>
+          <w:sz w:val="24"/>
+          <w:szCs w:val="24"/>
+          <w:lang w:val="en-US"/>
+        </w:rPr>
+        <w:t>projectedGPA</w:t>
+      </w:r>
+      <w:proofErr w:type="spellEnd"/>
     </w:p>
     <w:p>
       <w:pPr>
@@ -8832,17 +9280,51 @@
           <w:szCs w:val="24"/>
           <w:lang w:val="en-US"/>
         </w:rPr>
-        <w:t>FUNCTION CalculateDegreeProgress(</w:t>
-      </w:r>
-      <w:r>
-        <w:rPr>
-          <w:rFonts w:ascii="Arial" w:hAnsi="Arial" w:cs="Arial"/>
-          <w:sz w:val="24"/>
-          <w:szCs w:val="24"/>
-          <w:lang w:val="en-US"/>
-        </w:rPr>
-        <w:t xml:space="preserve">earnedCredits, </w:t>
-      </w:r>
+        <w:t xml:space="preserve">FUNCTION </w:t>
+      </w:r>
+      <w:proofErr w:type="spellStart"/>
+      <w:proofErr w:type="gramStart"/>
+      <w:r>
+        <w:rPr>
+          <w:rFonts w:ascii="Arial" w:hAnsi="Arial" w:cs="Arial"/>
+          <w:sz w:val="24"/>
+          <w:szCs w:val="24"/>
+          <w:lang w:val="en-US"/>
+        </w:rPr>
+        <w:t>CalculateDegreeProgress</w:t>
+      </w:r>
+      <w:proofErr w:type="spellEnd"/>
+      <w:r>
+        <w:rPr>
+          <w:rFonts w:ascii="Arial" w:hAnsi="Arial" w:cs="Arial"/>
+          <w:sz w:val="24"/>
+          <w:szCs w:val="24"/>
+          <w:lang w:val="en-US"/>
+        </w:rPr>
+        <w:t>(</w:t>
+      </w:r>
+      <w:proofErr w:type="spellStart"/>
+      <w:proofErr w:type="gramEnd"/>
+      <w:r>
+        <w:rPr>
+          <w:rFonts w:ascii="Arial" w:hAnsi="Arial" w:cs="Arial"/>
+          <w:sz w:val="24"/>
+          <w:szCs w:val="24"/>
+          <w:lang w:val="en-US"/>
+        </w:rPr>
+        <w:t>earnedCredits</w:t>
+      </w:r>
+      <w:proofErr w:type="spellEnd"/>
+      <w:r>
+        <w:rPr>
+          <w:rFonts w:ascii="Arial" w:hAnsi="Arial" w:cs="Arial"/>
+          <w:sz w:val="24"/>
+          <w:szCs w:val="24"/>
+          <w:lang w:val="en-US"/>
+        </w:rPr>
+        <w:t xml:space="preserve">, </w:t>
+      </w:r>
+      <w:proofErr w:type="spellStart"/>
       <w:r>
         <w:rPr>
           <w:rFonts w:ascii="Arial" w:hAnsi="Arial" w:cs="Arial"/>
@@ -8852,6 +9334,7 @@
         </w:rPr>
         <w:t>requiredCredits</w:t>
       </w:r>
+      <w:proofErr w:type="spellEnd"/>
       <w:r>
         <w:rPr>
           <w:rFonts w:ascii="Arial" w:hAnsi="Arial" w:cs="Arial"/>
@@ -8900,7 +9383,27 @@
           <w:szCs w:val="24"/>
           <w:lang w:val="en-US"/>
         </w:rPr>
-        <w:t>IF requiredCredits &lt;= 0</w:t>
+        <w:t xml:space="preserve">IF </w:t>
+      </w:r>
+      <w:proofErr w:type="spellStart"/>
+      <w:r>
+        <w:rPr>
+          <w:rFonts w:ascii="Arial" w:hAnsi="Arial" w:cs="Arial"/>
+          <w:sz w:val="24"/>
+          <w:szCs w:val="24"/>
+          <w:lang w:val="en-US"/>
+        </w:rPr>
+        <w:t>requiredCredits</w:t>
+      </w:r>
+      <w:proofErr w:type="spellEnd"/>
+      <w:r>
+        <w:rPr>
+          <w:rFonts w:ascii="Arial" w:hAnsi="Arial" w:cs="Arial"/>
+          <w:sz w:val="24"/>
+          <w:szCs w:val="24"/>
+          <w:lang w:val="en-US"/>
+        </w:rPr>
+        <w:t xml:space="preserve"> &lt;= 0</w:t>
       </w:r>
     </w:p>
     <w:p>
@@ -9009,6 +9512,7 @@
         </w:rPr>
         <w:t xml:space="preserve">ercentage = </w:t>
       </w:r>
+      <w:proofErr w:type="spellStart"/>
       <w:r>
         <w:rPr>
           <w:rFonts w:ascii="Arial" w:hAnsi="Arial" w:cs="Arial"/>
@@ -9018,14 +9522,35 @@
         </w:rPr>
         <w:t>earnedCredits</w:t>
       </w:r>
-      <w:r>
-        <w:rPr>
-          <w:rFonts w:ascii="Arial" w:hAnsi="Arial" w:cs="Arial"/>
-          <w:sz w:val="24"/>
-          <w:szCs w:val="24"/>
-          <w:lang w:val="en-US"/>
-        </w:rPr>
-        <w:t xml:space="preserve"> / requiredCredits * 100</w:t>
+      <w:proofErr w:type="spellEnd"/>
+      <w:r>
+        <w:rPr>
+          <w:rFonts w:ascii="Arial" w:hAnsi="Arial" w:cs="Arial"/>
+          <w:sz w:val="24"/>
+          <w:szCs w:val="24"/>
+          <w:lang w:val="en-US"/>
+        </w:rPr>
+        <w:t xml:space="preserve"> / </w:t>
+      </w:r>
+      <w:proofErr w:type="spellStart"/>
+      <w:r>
+        <w:rPr>
+          <w:rFonts w:ascii="Arial" w:hAnsi="Arial" w:cs="Arial"/>
+          <w:sz w:val="24"/>
+          <w:szCs w:val="24"/>
+          <w:lang w:val="en-US"/>
+        </w:rPr>
+        <w:t>requiredCredits</w:t>
+      </w:r>
+      <w:proofErr w:type="spellEnd"/>
+      <w:r>
+        <w:rPr>
+          <w:rFonts w:ascii="Arial" w:hAnsi="Arial" w:cs="Arial"/>
+          <w:sz w:val="24"/>
+          <w:szCs w:val="24"/>
+          <w:lang w:val="en-US"/>
+        </w:rPr>
+        <w:t xml:space="preserve"> * 100</w:t>
       </w:r>
     </w:p>
     <w:p>
@@ -9231,15 +9756,27 @@
         </w:rPr>
         <w:t xml:space="preserve">FUNCTION </w:t>
       </w:r>
-      <w:r>
-        <w:rPr>
-          <w:rFonts w:ascii="Arial" w:hAnsi="Arial" w:cs="Arial"/>
-          <w:sz w:val="24"/>
-          <w:szCs w:val="24"/>
-          <w:lang w:val="en-US"/>
-        </w:rPr>
-        <w:t>DeleteCourse(</w:t>
-      </w:r>
+      <w:proofErr w:type="spellStart"/>
+      <w:r>
+        <w:rPr>
+          <w:rFonts w:ascii="Arial" w:hAnsi="Arial" w:cs="Arial"/>
+          <w:sz w:val="24"/>
+          <w:szCs w:val="24"/>
+          <w:lang w:val="en-US"/>
+        </w:rPr>
+        <w:t>DeleteCourse</w:t>
+      </w:r>
+      <w:proofErr w:type="spellEnd"/>
+      <w:r>
+        <w:rPr>
+          <w:rFonts w:ascii="Arial" w:hAnsi="Arial" w:cs="Arial"/>
+          <w:sz w:val="24"/>
+          <w:szCs w:val="24"/>
+          <w:lang w:val="en-US"/>
+        </w:rPr>
+        <w:t>(</w:t>
+      </w:r>
+      <w:proofErr w:type="spellStart"/>
       <w:r>
         <w:rPr>
           <w:rFonts w:ascii="Arial" w:hAnsi="Arial" w:cs="Arial"/>
@@ -9249,6 +9786,7 @@
         </w:rPr>
         <w:t>courseId</w:t>
       </w:r>
+      <w:proofErr w:type="spellEnd"/>
       <w:r>
         <w:rPr>
           <w:rFonts w:ascii="Arial" w:hAnsi="Arial" w:cs="Arial"/>
@@ -9298,6 +9836,7 @@
         </w:rPr>
         <w:t xml:space="preserve">FIND course by </w:t>
       </w:r>
+      <w:proofErr w:type="spellStart"/>
       <w:r>
         <w:rPr>
           <w:rFonts w:ascii="Arial" w:hAnsi="Arial" w:cs="Arial"/>
@@ -9325,6 +9864,7 @@
         </w:rPr>
         <w:t>d</w:t>
       </w:r>
+      <w:proofErr w:type="spellEnd"/>
     </w:p>
     <w:p>
       <w:pPr>
@@ -11026,7 +11566,27 @@
           <w:szCs w:val="24"/>
           <w:lang w:val="en-US"/>
         </w:rPr>
-        <w:t xml:space="preserve"> the CourseService is responsible for</w:t>
+        <w:t xml:space="preserve"> the </w:t>
+      </w:r>
+      <w:proofErr w:type="spellStart"/>
+      <w:r>
+        <w:rPr>
+          <w:rFonts w:ascii="Arial" w:hAnsi="Arial" w:cs="Arial"/>
+          <w:sz w:val="24"/>
+          <w:szCs w:val="24"/>
+          <w:lang w:val="en-US"/>
+        </w:rPr>
+        <w:t>CourseService</w:t>
+      </w:r>
+      <w:proofErr w:type="spellEnd"/>
+      <w:r>
+        <w:rPr>
+          <w:rFonts w:ascii="Arial" w:hAnsi="Arial" w:cs="Arial"/>
+          <w:sz w:val="24"/>
+          <w:szCs w:val="24"/>
+          <w:lang w:val="en-US"/>
+        </w:rPr>
+        <w:t xml:space="preserve"> is responsible for</w:t>
       </w:r>
       <w:r>
         <w:rPr>
@@ -11080,8 +11640,19 @@
           <w:szCs w:val="24"/>
           <w:lang w:val="en-US"/>
         </w:rPr>
-        <w:t xml:space="preserve"> the Courses and AddCourse</w:t>
-      </w:r>
+        <w:t xml:space="preserve"> the Courses and </w:t>
+      </w:r>
+      <w:proofErr w:type="spellStart"/>
+      <w:r>
+        <w:rPr>
+          <w:rFonts w:ascii="Arial" w:hAnsi="Arial" w:cs="Arial"/>
+          <w:sz w:val="24"/>
+          <w:szCs w:val="24"/>
+          <w:lang w:val="en-US"/>
+        </w:rPr>
+        <w:t>AddCourse</w:t>
+      </w:r>
+      <w:proofErr w:type="spellEnd"/>
       <w:r>
         <w:rPr>
           <w:rFonts w:ascii="Arial" w:hAnsi="Arial" w:cs="Arial"/>
@@ -11475,7 +12046,27 @@
           <w:szCs w:val="24"/>
           <w:lang w:val="en-US"/>
         </w:rPr>
-        <w:t>The AcademicDbContext class</w:t>
+        <w:t xml:space="preserve">The </w:t>
+      </w:r>
+      <w:proofErr w:type="spellStart"/>
+      <w:r>
+        <w:rPr>
+          <w:rFonts w:ascii="Arial" w:hAnsi="Arial" w:cs="Arial"/>
+          <w:sz w:val="24"/>
+          <w:szCs w:val="24"/>
+          <w:lang w:val="en-US"/>
+        </w:rPr>
+        <w:t>AcademicDbContext</w:t>
+      </w:r>
+      <w:proofErr w:type="spellEnd"/>
+      <w:r>
+        <w:rPr>
+          <w:rFonts w:ascii="Arial" w:hAnsi="Arial" w:cs="Arial"/>
+          <w:sz w:val="24"/>
+          <w:szCs w:val="24"/>
+          <w:lang w:val="en-US"/>
+        </w:rPr>
+        <w:t xml:space="preserve"> class</w:t>
       </w:r>
       <w:r>
         <w:rPr>
@@ -11532,8 +12123,1423 @@
         <w:t xml:space="preserve"> SQLite.</w:t>
       </w:r>
     </w:p>
+    <w:p>
+      <w:pPr>
+        <w:spacing w:line="360" w:lineRule="auto"/>
+        <w:rPr>
+          <w:rFonts w:ascii="Arial" w:hAnsi="Arial" w:cs="Arial"/>
+          <w:sz w:val="24"/>
+          <w:szCs w:val="24"/>
+          <w:lang w:val="en-US"/>
+        </w:rPr>
+      </w:pPr>
+    </w:p>
+    <w:p>
+      <w:pPr>
+        <w:pStyle w:val="ListParagraph"/>
+        <w:numPr>
+          <w:ilvl w:val="2"/>
+          <w:numId w:val="1"/>
+        </w:numPr>
+        <w:spacing w:line="360" w:lineRule="auto"/>
+        <w:rPr>
+          <w:rFonts w:ascii="Arial" w:hAnsi="Arial" w:cs="Arial"/>
+          <w:sz w:val="24"/>
+          <w:szCs w:val="24"/>
+          <w:lang w:val="en-US"/>
+        </w:rPr>
+      </w:pPr>
+      <w:r>
+        <w:rPr>
+          <w:rFonts w:ascii="Arial" w:hAnsi="Arial" w:cs="Arial"/>
+          <w:sz w:val="24"/>
+          <w:szCs w:val="24"/>
+          <w:lang w:val="en-US"/>
+        </w:rPr>
+        <w:lastRenderedPageBreak/>
+        <w:t>Database layer</w:t>
+      </w:r>
+    </w:p>
+    <w:p>
+      <w:pPr>
+        <w:spacing w:line="360" w:lineRule="auto"/>
+        <w:rPr>
+          <w:rFonts w:ascii="Arial" w:hAnsi="Arial" w:cs="Arial"/>
+          <w:sz w:val="24"/>
+          <w:szCs w:val="24"/>
+          <w:lang w:val="en-US"/>
+        </w:rPr>
+      </w:pPr>
+    </w:p>
+    <w:p>
+      <w:pPr>
+        <w:spacing w:line="360" w:lineRule="auto"/>
+        <w:rPr>
+          <w:rFonts w:ascii="Arial" w:hAnsi="Arial" w:cs="Arial"/>
+          <w:sz w:val="24"/>
+          <w:szCs w:val="24"/>
+          <w:lang w:val="en-US"/>
+        </w:rPr>
+      </w:pPr>
+      <w:r>
+        <w:rPr>
+          <w:rFonts w:ascii="Arial" w:hAnsi="Arial" w:cs="Arial"/>
+          <w:sz w:val="24"/>
+          <w:szCs w:val="24"/>
+          <w:lang w:val="en-US"/>
+        </w:rPr>
+        <w:t>SQLite is used as the</w:t>
+      </w:r>
+      <w:r>
+        <w:rPr>
+          <w:rFonts w:ascii="Arial" w:hAnsi="Arial" w:cs="Arial"/>
+          <w:sz w:val="24"/>
+          <w:szCs w:val="24"/>
+          <w:lang w:val="en-US"/>
+        </w:rPr>
+        <w:t xml:space="preserve"> persistent storage mechanism.</w:t>
+      </w:r>
+      <w:r>
+        <w:rPr>
+          <w:rFonts w:ascii="Arial" w:hAnsi="Arial" w:cs="Arial"/>
+          <w:sz w:val="24"/>
+          <w:szCs w:val="24"/>
+          <w:lang w:val="en-US"/>
+        </w:rPr>
+        <w:t xml:space="preserve"> Unlike the temporary in-memory</w:t>
+      </w:r>
+      <w:r>
+        <w:rPr>
+          <w:rFonts w:ascii="Arial" w:hAnsi="Arial" w:cs="Arial"/>
+          <w:sz w:val="24"/>
+          <w:szCs w:val="24"/>
+          <w:lang w:val="en-US"/>
+        </w:rPr>
+        <w:t xml:space="preserve"> list used</w:t>
+      </w:r>
+      <w:r>
+        <w:rPr>
+          <w:rFonts w:ascii="Arial" w:hAnsi="Arial" w:cs="Arial"/>
+          <w:sz w:val="24"/>
+          <w:szCs w:val="24"/>
+          <w:lang w:val="en-US"/>
+        </w:rPr>
+        <w:t xml:space="preserve"> during the early</w:t>
+      </w:r>
+      <w:r>
+        <w:rPr>
+          <w:rFonts w:ascii="Arial" w:hAnsi="Arial" w:cs="Arial"/>
+          <w:sz w:val="24"/>
+          <w:szCs w:val="24"/>
+          <w:lang w:val="en-US"/>
+        </w:rPr>
+        <w:t xml:space="preserve"> prototype stages</w:t>
+      </w:r>
+      <w:r>
+        <w:rPr>
+          <w:rFonts w:ascii="Arial" w:hAnsi="Arial" w:cs="Arial"/>
+          <w:sz w:val="24"/>
+          <w:szCs w:val="24"/>
+          <w:lang w:val="en-US"/>
+        </w:rPr>
+        <w:t>, the database allows</w:t>
+      </w:r>
+      <w:r>
+        <w:rPr>
+          <w:rFonts w:ascii="Arial" w:hAnsi="Arial" w:cs="Arial"/>
+          <w:sz w:val="24"/>
+          <w:szCs w:val="24"/>
+          <w:lang w:val="en-US"/>
+        </w:rPr>
+        <w:t xml:space="preserve"> information to remain</w:t>
+      </w:r>
+      <w:r>
+        <w:rPr>
+          <w:rFonts w:ascii="Arial" w:hAnsi="Arial" w:cs="Arial"/>
+          <w:sz w:val="24"/>
+          <w:szCs w:val="24"/>
+          <w:lang w:val="en-US"/>
+        </w:rPr>
+        <w:t xml:space="preserve"> available after</w:t>
+      </w:r>
+      <w:r>
+        <w:rPr>
+          <w:rFonts w:ascii="Arial" w:hAnsi="Arial" w:cs="Arial"/>
+          <w:sz w:val="24"/>
+          <w:szCs w:val="24"/>
+          <w:lang w:val="en-US"/>
+        </w:rPr>
+        <w:t xml:space="preserve"> the program has been closed</w:t>
+      </w:r>
+      <w:r>
+        <w:rPr>
+          <w:rFonts w:ascii="Arial" w:hAnsi="Arial" w:cs="Arial"/>
+          <w:sz w:val="24"/>
+          <w:szCs w:val="24"/>
+          <w:lang w:val="en-US"/>
+        </w:rPr>
+        <w:t xml:space="preserve"> and restarted.</w:t>
+      </w:r>
+    </w:p>
+    <w:p>
+      <w:pPr>
+        <w:spacing w:line="360" w:lineRule="auto"/>
+        <w:rPr>
+          <w:rFonts w:ascii="Arial" w:hAnsi="Arial" w:cs="Arial"/>
+          <w:sz w:val="24"/>
+          <w:szCs w:val="24"/>
+        </w:rPr>
+      </w:pPr>
+    </w:p>
+    <w:p>
+      <w:pPr>
+        <w:spacing w:line="360" w:lineRule="auto"/>
+        <w:rPr>
+          <w:rFonts w:ascii="Arial" w:hAnsi="Arial" w:cs="Arial"/>
+          <w:sz w:val="24"/>
+          <w:szCs w:val="24"/>
+        </w:rPr>
+      </w:pPr>
+      <w:r>
+        <w:rPr>
+          <w:rFonts w:ascii="Arial" w:hAnsi="Arial" w:cs="Arial"/>
+          <w:noProof/>
+          <w:sz w:val="24"/>
+          <w:szCs w:val="24"/>
+        </w:rPr>
+        <mc:AlternateContent>
+          <mc:Choice Requires="wps">
+            <w:drawing>
+              <wp:anchor distT="0" distB="0" distL="114300" distR="114300" simplePos="0" relativeHeight="251659264" behindDoc="0" locked="0" layoutInCell="1" allowOverlap="1" wp14:anchorId="1A603DF0" wp14:editId="535E2739">
+                <wp:simplePos x="0" y="0"/>
+                <wp:positionH relativeFrom="column">
+                  <wp:posOffset>1113319</wp:posOffset>
+                </wp:positionH>
+                <wp:positionV relativeFrom="paragraph">
+                  <wp:posOffset>223642</wp:posOffset>
+                </wp:positionV>
+                <wp:extent cx="2927555" cy="1393723"/>
+                <wp:effectExtent l="0" t="0" r="25400" b="16510"/>
+                <wp:wrapNone/>
+                <wp:docPr id="703413309" name="Rectangle 1"/>
+                <wp:cNvGraphicFramePr/>
+                <a:graphic xmlns:a="http://schemas.openxmlformats.org/drawingml/2006/main">
+                  <a:graphicData uri="http://schemas.microsoft.com/office/word/2010/wordprocessingShape">
+                    <wps:wsp>
+                      <wps:cNvSpPr/>
+                      <wps:spPr>
+                        <a:xfrm>
+                          <a:off x="0" y="0"/>
+                          <a:ext cx="2927555" cy="1393723"/>
+                        </a:xfrm>
+                        <a:prstGeom prst="rect">
+                          <a:avLst/>
+                        </a:prstGeom>
+                      </wps:spPr>
+                      <wps:style>
+                        <a:lnRef idx="2">
+                          <a:schemeClr val="accent6"/>
+                        </a:lnRef>
+                        <a:fillRef idx="1">
+                          <a:schemeClr val="lt1"/>
+                        </a:fillRef>
+                        <a:effectRef idx="0">
+                          <a:schemeClr val="accent6"/>
+                        </a:effectRef>
+                        <a:fontRef idx="minor">
+                          <a:schemeClr val="dk1"/>
+                        </a:fontRef>
+                      </wps:style>
+                      <wps:txbx>
+                        <w:txbxContent>
+                          <w:p>
+                            <w:pPr>
+                              <w:jc w:val="center"/>
+                              <w:rPr>
+                                <w:lang w:val="en-US"/>
+                              </w:rPr>
+                            </w:pPr>
+                            <w:r>
+                              <w:rPr>
+                                <w:lang w:val="en-US"/>
+                              </w:rPr>
+                              <w:t>Presentation Layer</w:t>
+                            </w:r>
+                          </w:p>
+                          <w:p>
+                            <w:pPr>
+                              <w:jc w:val="center"/>
+                              <w:rPr>
+                                <w:lang w:val="en-US"/>
+                              </w:rPr>
+                            </w:pPr>
+                            <w:r>
+                              <w:rPr>
+                                <w:lang w:val="en-US"/>
+                              </w:rPr>
+                              <w:t>Blazor Razor Components</w:t>
+                            </w:r>
+                          </w:p>
+                          <w:p>
+                            <w:pPr>
+                              <w:jc w:val="center"/>
+                              <w:rPr>
+                                <w:lang w:val="en-US"/>
+                              </w:rPr>
+                            </w:pPr>
+                            <w:r>
+                              <w:rPr>
+                                <w:lang w:val="en-US"/>
+                              </w:rPr>
+                              <w:t>(</w:t>
+                            </w:r>
+                            <w:r>
+                              <w:rPr>
+                                <w:lang w:val="en-US"/>
+                              </w:rPr>
+                              <w:t>Home, Courses</w:t>
+                            </w:r>
+                            <w:r>
+                              <w:rPr>
+                                <w:lang w:val="en-US"/>
+                              </w:rPr>
+                              <w:t xml:space="preserve">, </w:t>
+                            </w:r>
+                            <w:proofErr w:type="spellStart"/>
+                            <w:r>
+                              <w:rPr>
+                                <w:lang w:val="en-US"/>
+                              </w:rPr>
+                              <w:t>AddCourse</w:t>
+                            </w:r>
+                            <w:proofErr w:type="spellEnd"/>
+                            <w:r>
+                              <w:rPr>
+                                <w:lang w:val="en-US"/>
+                              </w:rPr>
+                              <w:t>)</w:t>
+                            </w:r>
+                          </w:p>
+                        </w:txbxContent>
+                      </wps:txbx>
+                      <wps:bodyPr rot="0" spcFirstLastPara="0" vertOverflow="overflow" horzOverflow="overflow" vert="horz" wrap="square" lIns="91440" tIns="45720" rIns="91440" bIns="45720" numCol="1" spcCol="0" rtlCol="0" fromWordArt="0" anchor="ctr" anchorCtr="0" forceAA="0" compatLnSpc="1">
+                        <a:prstTxWarp prst="textNoShape">
+                          <a:avLst/>
+                        </a:prstTxWarp>
+                        <a:noAutofit/>
+                      </wps:bodyPr>
+                    </wps:wsp>
+                  </a:graphicData>
+                </a:graphic>
+              </wp:anchor>
+            </w:drawing>
+          </mc:Choice>
+          <mc:Fallback>
+            <w:pict>
+              <v:rect w14:anchorId="1A603DF0" id="Rectangle 1" o:spid="_x0000_s1026" style="position:absolute;margin-left:87.65pt;margin-top:17.6pt;width:230.5pt;height:109.75pt;z-index:251659264;visibility:visible;mso-wrap-style:square;mso-wrap-distance-left:9pt;mso-wrap-distance-top:0;mso-wrap-distance-right:9pt;mso-wrap-distance-bottom:0;mso-position-horizontal:absolute;mso-position-horizontal-relative:text;mso-position-vertical:absolute;mso-position-vertical-relative:text;v-text-anchor:middle" o:gfxdata="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" fillcolor="white [3201]" strokecolor="#70ad47 [3209]" strokeweight="1pt">
+                <v:textbox>
+                  <w:txbxContent>
+                    <w:p>
+                      <w:pPr>
+                        <w:jc w:val="center"/>
+                        <w:rPr>
+                          <w:lang w:val="en-US"/>
+                        </w:rPr>
+                      </w:pPr>
+                      <w:r>
+                        <w:rPr>
+                          <w:lang w:val="en-US"/>
+                        </w:rPr>
+                        <w:t>Presentation Layer</w:t>
+                      </w:r>
+                    </w:p>
+                    <w:p>
+                      <w:pPr>
+                        <w:jc w:val="center"/>
+                        <w:rPr>
+                          <w:lang w:val="en-US"/>
+                        </w:rPr>
+                      </w:pPr>
+                      <w:r>
+                        <w:rPr>
+                          <w:lang w:val="en-US"/>
+                        </w:rPr>
+                        <w:t>Blazor Razor Components</w:t>
+                      </w:r>
+                    </w:p>
+                    <w:p>
+                      <w:pPr>
+                        <w:jc w:val="center"/>
+                        <w:rPr>
+                          <w:lang w:val="en-US"/>
+                        </w:rPr>
+                      </w:pPr>
+                      <w:r>
+                        <w:rPr>
+                          <w:lang w:val="en-US"/>
+                        </w:rPr>
+                        <w:t>(</w:t>
+                      </w:r>
+                      <w:r>
+                        <w:rPr>
+                          <w:lang w:val="en-US"/>
+                        </w:rPr>
+                        <w:t>Home, Courses</w:t>
+                      </w:r>
+                      <w:r>
+                        <w:rPr>
+                          <w:lang w:val="en-US"/>
+                        </w:rPr>
+                        <w:t xml:space="preserve">, </w:t>
+                      </w:r>
+                      <w:proofErr w:type="spellStart"/>
+                      <w:r>
+                        <w:rPr>
+                          <w:lang w:val="en-US"/>
+                        </w:rPr>
+                        <w:t>AddCourse</w:t>
+                      </w:r>
+                      <w:proofErr w:type="spellEnd"/>
+                      <w:r>
+                        <w:rPr>
+                          <w:lang w:val="en-US"/>
+                        </w:rPr>
+                        <w:t>)</w:t>
+                      </w:r>
+                    </w:p>
+                  </w:txbxContent>
+                </v:textbox>
+              </v:rect>
+            </w:pict>
+          </mc:Fallback>
+        </mc:AlternateContent>
+      </w:r>
+    </w:p>
+    <w:p>
+      <w:pPr>
+        <w:spacing w:line="360" w:lineRule="auto"/>
+        <w:rPr>
+          <w:rFonts w:ascii="Arial" w:hAnsi="Arial" w:cs="Arial"/>
+          <w:sz w:val="24"/>
+          <w:szCs w:val="24"/>
+        </w:rPr>
+      </w:pPr>
+    </w:p>
+    <w:p>
+      <w:pPr>
+        <w:rPr>
+          <w:rFonts w:ascii="Arial" w:hAnsi="Arial" w:cs="Arial"/>
+          <w:sz w:val="24"/>
+          <w:szCs w:val="24"/>
+        </w:rPr>
+      </w:pPr>
+    </w:p>
+    <w:p>
+      <w:pPr>
+        <w:rPr>
+          <w:rFonts w:ascii="Arial" w:hAnsi="Arial" w:cs="Arial"/>
+          <w:sz w:val="24"/>
+          <w:szCs w:val="24"/>
+        </w:rPr>
+      </w:pPr>
+    </w:p>
+    <w:p>
+      <w:pPr>
+        <w:tabs>
+          <w:tab w:val="left" w:pos="6770"/>
+        </w:tabs>
+        <w:rPr>
+          <w:rFonts w:ascii="Arial" w:hAnsi="Arial" w:cs="Arial"/>
+          <w:sz w:val="24"/>
+          <w:szCs w:val="24"/>
+        </w:rPr>
+      </w:pPr>
+      <w:r>
+        <w:rPr>
+          <w:rFonts w:ascii="Arial" w:hAnsi="Arial" w:cs="Arial"/>
+          <w:sz w:val="24"/>
+          <w:szCs w:val="24"/>
+        </w:rPr>
+        <w:tab/>
+      </w:r>
+    </w:p>
+    <w:p>
+      <w:pPr>
+        <w:tabs>
+          <w:tab w:val="left" w:pos="6770"/>
+        </w:tabs>
+        <w:rPr>
+          <w:rFonts w:ascii="Arial" w:hAnsi="Arial" w:cs="Arial"/>
+          <w:sz w:val="24"/>
+          <w:szCs w:val="24"/>
+        </w:rPr>
+      </w:pPr>
+      <w:r>
+        <w:rPr>
+          <w:rFonts w:ascii="Arial" w:hAnsi="Arial" w:cs="Arial"/>
+          <w:noProof/>
+          <w:sz w:val="24"/>
+          <w:szCs w:val="24"/>
+        </w:rPr>
+        <mc:AlternateContent>
+          <mc:Choice Requires="wps">
+            <w:drawing>
+              <wp:anchor distT="0" distB="0" distL="114300" distR="114300" simplePos="0" relativeHeight="251664384" behindDoc="0" locked="0" layoutInCell="1" allowOverlap="1" wp14:anchorId="66F58F69" wp14:editId="437DB6B7">
+                <wp:simplePos x="0" y="0"/>
+                <wp:positionH relativeFrom="column">
+                  <wp:posOffset>2418592</wp:posOffset>
+                </wp:positionH>
+                <wp:positionV relativeFrom="paragraph">
+                  <wp:posOffset>90785</wp:posOffset>
+                </wp:positionV>
+                <wp:extent cx="0" cy="412954"/>
+                <wp:effectExtent l="76200" t="0" r="57150" b="63500"/>
+                <wp:wrapNone/>
+                <wp:docPr id="1139730439" name="Straight Arrow Connector 8"/>
+                <wp:cNvGraphicFramePr/>
+                <a:graphic xmlns:a="http://schemas.openxmlformats.org/drawingml/2006/main">
+                  <a:graphicData uri="http://schemas.microsoft.com/office/word/2010/wordprocessingShape">
+                    <wps:wsp>
+                      <wps:cNvCnPr/>
+                      <wps:spPr>
+                        <a:xfrm>
+                          <a:off x="0" y="0"/>
+                          <a:ext cx="0" cy="412954"/>
+                        </a:xfrm>
+                        <a:prstGeom prst="straightConnector1">
+                          <a:avLst/>
+                        </a:prstGeom>
+                        <a:ln>
+                          <a:tailEnd type="triangle"/>
+                        </a:ln>
+                      </wps:spPr>
+                      <wps:style>
+                        <a:lnRef idx="1">
+                          <a:schemeClr val="accent1"/>
+                        </a:lnRef>
+                        <a:fillRef idx="0">
+                          <a:schemeClr val="accent1"/>
+                        </a:fillRef>
+                        <a:effectRef idx="0">
+                          <a:schemeClr val="accent1"/>
+                        </a:effectRef>
+                        <a:fontRef idx="minor">
+                          <a:schemeClr val="tx1"/>
+                        </a:fontRef>
+                      </wps:style>
+                      <wps:bodyPr/>
+                    </wps:wsp>
+                  </a:graphicData>
+                </a:graphic>
+              </wp:anchor>
+            </w:drawing>
+          </mc:Choice>
+          <mc:Fallback>
+            <w:pict>
+              <v:shapetype w14:anchorId="53DADE7F" id="_x0000_t32" coordsize="21600,21600" o:spt="32" o:oned="t" path="m,l21600,21600e" filled="f">
+                <v:path arrowok="t" fillok="f" o:connecttype="none"/>
+                <o:lock v:ext="edit" shapetype="t"/>
+              </v:shapetype>
+              <v:shape id="Straight Arrow Connector 8" o:spid="_x0000_s1026" type="#_x0000_t32" style="position:absolute;margin-left:190.45pt;margin-top:7.15pt;width:0;height:32.5pt;z-index:251664384;visibility:visible;mso-wrap-style:square;mso-wrap-distance-left:9pt;mso-wrap-distance-top:0;mso-wrap-distance-right:9pt;mso-wrap-distance-bottom:0;mso-position-horizontal:absolute;mso-position-horizontal-relative:text;mso-position-vertical:absolute;mso-position-vertical-relative:text" o:gfxdata="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" strokecolor="#5b9bd5 [3204]" strokeweight=".5pt">
+                <v:stroke endarrow="block" joinstyle="miter"/>
+              </v:shape>
+            </w:pict>
+          </mc:Fallback>
+        </mc:AlternateContent>
+      </w:r>
+    </w:p>
+    <w:p>
+      <w:pPr>
+        <w:tabs>
+          <w:tab w:val="left" w:pos="6770"/>
+        </w:tabs>
+        <w:rPr>
+          <w:rFonts w:ascii="Arial" w:hAnsi="Arial" w:cs="Arial"/>
+          <w:sz w:val="24"/>
+          <w:szCs w:val="24"/>
+        </w:rPr>
+      </w:pPr>
+    </w:p>
+    <w:p>
+      <w:pPr>
+        <w:tabs>
+          <w:tab w:val="left" w:pos="6770"/>
+        </w:tabs>
+        <w:rPr>
+          <w:rFonts w:ascii="Arial" w:hAnsi="Arial" w:cs="Arial"/>
+          <w:noProof/>
+          <w:sz w:val="24"/>
+          <w:szCs w:val="24"/>
+        </w:rPr>
+      </w:pPr>
+      <w:r>
+        <w:rPr>
+          <w:rFonts w:ascii="Arial" w:hAnsi="Arial" w:cs="Arial"/>
+          <w:noProof/>
+          <w:sz w:val="24"/>
+          <w:szCs w:val="24"/>
+        </w:rPr>
+        <mc:AlternateContent>
+          <mc:Choice Requires="wps">
+            <w:drawing>
+              <wp:anchor distT="0" distB="0" distL="114300" distR="114300" simplePos="0" relativeHeight="251665408" behindDoc="0" locked="0" layoutInCell="1" allowOverlap="1" wp14:anchorId="634100DF" wp14:editId="37DDB6AD">
+                <wp:simplePos x="0" y="0"/>
+                <wp:positionH relativeFrom="column">
+                  <wp:posOffset>2470211</wp:posOffset>
+                </wp:positionH>
+                <wp:positionV relativeFrom="paragraph">
+                  <wp:posOffset>1478034</wp:posOffset>
+                </wp:positionV>
+                <wp:extent cx="0" cy="545691"/>
+                <wp:effectExtent l="76200" t="0" r="57150" b="64135"/>
+                <wp:wrapNone/>
+                <wp:docPr id="489631569" name="Straight Arrow Connector 9"/>
+                <wp:cNvGraphicFramePr/>
+                <a:graphic xmlns:a="http://schemas.openxmlformats.org/drawingml/2006/main">
+                  <a:graphicData uri="http://schemas.microsoft.com/office/word/2010/wordprocessingShape">
+                    <wps:wsp>
+                      <wps:cNvCnPr/>
+                      <wps:spPr>
+                        <a:xfrm>
+                          <a:off x="0" y="0"/>
+                          <a:ext cx="0" cy="545691"/>
+                        </a:xfrm>
+                        <a:prstGeom prst="straightConnector1">
+                          <a:avLst/>
+                        </a:prstGeom>
+                        <a:ln>
+                          <a:tailEnd type="triangle"/>
+                        </a:ln>
+                      </wps:spPr>
+                      <wps:style>
+                        <a:lnRef idx="1">
+                          <a:schemeClr val="accent1"/>
+                        </a:lnRef>
+                        <a:fillRef idx="0">
+                          <a:schemeClr val="accent1"/>
+                        </a:fillRef>
+                        <a:effectRef idx="0">
+                          <a:schemeClr val="accent1"/>
+                        </a:effectRef>
+                        <a:fontRef idx="minor">
+                          <a:schemeClr val="tx1"/>
+                        </a:fontRef>
+                      </wps:style>
+                      <wps:bodyPr/>
+                    </wps:wsp>
+                  </a:graphicData>
+                </a:graphic>
+              </wp:anchor>
+            </w:drawing>
+          </mc:Choice>
+          <mc:Fallback>
+            <w:pict>
+              <v:shape w14:anchorId="5AD3B4E0" id="Straight Arrow Connector 9" o:spid="_x0000_s1026" type="#_x0000_t32" style="position:absolute;margin-left:194.5pt;margin-top:116.4pt;width:0;height:42.95pt;z-index:251665408;visibility:visible;mso-wrap-style:square;mso-wrap-distance-left:9pt;mso-wrap-distance-top:0;mso-wrap-distance-right:9pt;mso-wrap-distance-bottom:0;mso-position-horizontal:absolute;mso-position-horizontal-relative:text;mso-position-vertical:absolute;mso-position-vertical-relative:text" o:gfxdata="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" strokecolor="#5b9bd5 [3204]" strokeweight=".5pt">
+                <v:stroke endarrow="block" joinstyle="miter"/>
+              </v:shape>
+            </w:pict>
+          </mc:Fallback>
+        </mc:AlternateContent>
+      </w:r>
+      <w:r>
+        <w:rPr>
+          <w:rFonts w:ascii="Arial" w:hAnsi="Arial" w:cs="Arial"/>
+          <w:noProof/>
+          <w:sz w:val="24"/>
+          <w:szCs w:val="24"/>
+        </w:rPr>
+        <mc:AlternateContent>
+          <mc:Choice Requires="wps">
+            <w:drawing>
+              <wp:anchor distT="0" distB="0" distL="114300" distR="114300" simplePos="0" relativeHeight="251662336" behindDoc="0" locked="0" layoutInCell="1" allowOverlap="1" wp14:anchorId="52E356EF" wp14:editId="33947272">
+                <wp:simplePos x="0" y="0"/>
+                <wp:positionH relativeFrom="column">
+                  <wp:posOffset>1105986</wp:posOffset>
+                </wp:positionH>
+                <wp:positionV relativeFrom="paragraph">
+                  <wp:posOffset>17944</wp:posOffset>
+                </wp:positionV>
+                <wp:extent cx="2949677" cy="1387331"/>
+                <wp:effectExtent l="0" t="0" r="22225" b="22860"/>
+                <wp:wrapNone/>
+                <wp:docPr id="926980862" name="Text Box 6"/>
+                <wp:cNvGraphicFramePr/>
+                <a:graphic xmlns:a="http://schemas.openxmlformats.org/drawingml/2006/main">
+                  <a:graphicData uri="http://schemas.microsoft.com/office/word/2010/wordprocessingShape">
+                    <wps:wsp>
+                      <wps:cNvSpPr txBox="1"/>
+                      <wps:spPr>
+                        <a:xfrm>
+                          <a:off x="0" y="0"/>
+                          <a:ext cx="2949677" cy="1387331"/>
+                        </a:xfrm>
+                        <a:prstGeom prst="rect">
+                          <a:avLst/>
+                        </a:prstGeom>
+                        <a:solidFill>
+                          <a:schemeClr val="lt1"/>
+                        </a:solidFill>
+                        <a:ln w="6350">
+                          <a:solidFill>
+                            <a:prstClr val="black"/>
+                          </a:solidFill>
+                        </a:ln>
+                      </wps:spPr>
+                      <wps:txbx>
+                        <w:txbxContent>
+                          <w:p>
+                            <w:pPr>
+                              <w:jc w:val="center"/>
+                              <w:rPr>
+                                <w:lang w:val="en-US"/>
+                              </w:rPr>
+                            </w:pPr>
+                            <w:r>
+                              <w:rPr>
+                                <w:lang w:val="en-US"/>
+                              </w:rPr>
+                              <w:t xml:space="preserve">Service / Business </w:t>
+                            </w:r>
+                            <w:r>
+                              <w:rPr>
+                                <w:lang w:val="en-US"/>
+                              </w:rPr>
+                              <w:t>Logic Layer</w:t>
+                            </w:r>
+                          </w:p>
+                          <w:p>
+                            <w:pPr>
+                              <w:jc w:val="center"/>
+                              <w:rPr>
+                                <w:lang w:val="en-US"/>
+                              </w:rPr>
+                            </w:pPr>
+                            <w:proofErr w:type="spellStart"/>
+                            <w:r>
+                              <w:rPr>
+                                <w:lang w:val="en-US"/>
+                              </w:rPr>
+                              <w:t>CourseService</w:t>
+                            </w:r>
+                            <w:proofErr w:type="spellEnd"/>
+                          </w:p>
+                          <w:p>
+                            <w:pPr>
+                              <w:jc w:val="center"/>
+                              <w:rPr>
+                                <w:lang w:val="en-US"/>
+                              </w:rPr>
+                            </w:pPr>
+                            <w:r>
+                              <w:rPr>
+                                <w:lang w:val="en-US"/>
+                              </w:rPr>
+                              <w:t>(</w:t>
+                            </w:r>
+                            <w:r>
+                              <w:rPr>
+                                <w:lang w:val="en-US"/>
+                              </w:rPr>
+                              <w:t>GPA</w:t>
+                            </w:r>
+                            <w:r>
+                              <w:rPr>
+                                <w:lang w:val="en-US"/>
+                              </w:rPr>
+                              <w:t xml:space="preserve"> and </w:t>
+                            </w:r>
+                            <w:r>
+                              <w:rPr>
+                                <w:lang w:val="en-US"/>
+                              </w:rPr>
+                              <w:t>Credit</w:t>
+                            </w:r>
+                            <w:r>
+                              <w:rPr>
+                                <w:lang w:val="en-US"/>
+                              </w:rPr>
+                              <w:t xml:space="preserve"> Services later</w:t>
+                            </w:r>
+                            <w:r>
+                              <w:rPr>
+                                <w:lang w:val="en-US"/>
+                              </w:rPr>
+                              <w:t>)</w:t>
+                            </w:r>
+                          </w:p>
+                        </w:txbxContent>
+                      </wps:txbx>
+                      <wps:bodyPr rot="0" spcFirstLastPara="0" vertOverflow="overflow" horzOverflow="overflow" vert="horz" wrap="square" lIns="91440" tIns="45720" rIns="91440" bIns="45720" numCol="1" spcCol="0" rtlCol="0" fromWordArt="0" anchor="t" anchorCtr="0" forceAA="0" compatLnSpc="1">
+                        <a:prstTxWarp prst="textNoShape">
+                          <a:avLst/>
+                        </a:prstTxWarp>
+                        <a:noAutofit/>
+                      </wps:bodyPr>
+                    </wps:wsp>
+                  </a:graphicData>
+                </a:graphic>
+              </wp:anchor>
+            </w:drawing>
+          </mc:Choice>
+          <mc:Fallback>
+            <w:pict>
+              <v:shapetype w14:anchorId="52E356EF" id="_x0000_t202" coordsize="21600,21600" o:spt="202" path="m,l,21600r21600,l21600,xe">
+                <v:stroke joinstyle="miter"/>
+                <v:path gradientshapeok="t" o:connecttype="rect"/>
+              </v:shapetype>
+              <v:shape id="Text Box 6" o:spid="_x0000_s1027" type="#_x0000_t202" style="position:absolute;margin-left:87.1pt;margin-top:1.4pt;width:232.25pt;height:109.25pt;z-index:251662336;visibility:visible;mso-wrap-style:square;mso-wrap-distance-left:9pt;mso-wrap-distance-top:0;mso-wrap-distance-right:9pt;mso-wrap-distance-bottom:0;mso-position-horizontal:absolute;mso-position-horizontal-relative:text;mso-position-vertical:absolute;mso-position-vertical-relative:text;v-text-anchor:top" o:gfxdata="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" fillcolor="white [3201]" strokeweight=".5pt">
+                <v:textbox>
+                  <w:txbxContent>
+                    <w:p>
+                      <w:pPr>
+                        <w:jc w:val="center"/>
+                        <w:rPr>
+                          <w:lang w:val="en-US"/>
+                        </w:rPr>
+                      </w:pPr>
+                      <w:r>
+                        <w:rPr>
+                          <w:lang w:val="en-US"/>
+                        </w:rPr>
+                        <w:t xml:space="preserve">Service / Business </w:t>
+                      </w:r>
+                      <w:r>
+                        <w:rPr>
+                          <w:lang w:val="en-US"/>
+                        </w:rPr>
+                        <w:t>Logic Layer</w:t>
+                      </w:r>
+                    </w:p>
+                    <w:p>
+                      <w:pPr>
+                        <w:jc w:val="center"/>
+                        <w:rPr>
+                          <w:lang w:val="en-US"/>
+                        </w:rPr>
+                      </w:pPr>
+                      <w:proofErr w:type="spellStart"/>
+                      <w:r>
+                        <w:rPr>
+                          <w:lang w:val="en-US"/>
+                        </w:rPr>
+                        <w:t>CourseService</w:t>
+                      </w:r>
+                      <w:proofErr w:type="spellEnd"/>
+                    </w:p>
+                    <w:p>
+                      <w:pPr>
+                        <w:jc w:val="center"/>
+                        <w:rPr>
+                          <w:lang w:val="en-US"/>
+                        </w:rPr>
+                      </w:pPr>
+                      <w:r>
+                        <w:rPr>
+                          <w:lang w:val="en-US"/>
+                        </w:rPr>
+                        <w:t>(</w:t>
+                      </w:r>
+                      <w:r>
+                        <w:rPr>
+                          <w:lang w:val="en-US"/>
+                        </w:rPr>
+                        <w:t>GPA</w:t>
+                      </w:r>
+                      <w:r>
+                        <w:rPr>
+                          <w:lang w:val="en-US"/>
+                        </w:rPr>
+                        <w:t xml:space="preserve"> and </w:t>
+                      </w:r>
+                      <w:r>
+                        <w:rPr>
+                          <w:lang w:val="en-US"/>
+                        </w:rPr>
+                        <w:t>Credit</w:t>
+                      </w:r>
+                      <w:r>
+                        <w:rPr>
+                          <w:lang w:val="en-US"/>
+                        </w:rPr>
+                        <w:t xml:space="preserve"> Services later</w:t>
+                      </w:r>
+                      <w:r>
+                        <w:rPr>
+                          <w:lang w:val="en-US"/>
+                        </w:rPr>
+                        <w:t>)</w:t>
+                      </w:r>
+                    </w:p>
+                  </w:txbxContent>
+                </v:textbox>
+              </v:shape>
+            </w:pict>
+          </mc:Fallback>
+        </mc:AlternateContent>
+      </w:r>
+      <w:r>
+        <w:rPr>
+          <w:rFonts w:ascii="Arial" w:hAnsi="Arial" w:cs="Arial"/>
+          <w:noProof/>
+          <w:sz w:val="24"/>
+          <w:szCs w:val="24"/>
+        </w:rPr>
+        <w:t xml:space="preserve">                          </w:t>
+      </w:r>
+      <w:r>
+        <w:rPr>
+          <w:rFonts w:ascii="Arial" w:hAnsi="Arial" w:cs="Arial"/>
+          <w:noProof/>
+          <w:sz w:val="24"/>
+          <w:szCs w:val="24"/>
+        </w:rPr>
+        <w:drawing>
+          <wp:inline distT="0" distB="0" distL="0" distR="0" wp14:anchorId="44872D32" wp14:editId="10DDADC9">
+            <wp:extent cx="2938780" cy="1402080"/>
+            <wp:effectExtent l="0" t="0" r="0" b="7620"/>
+            <wp:docPr id="1852704989" name="Picture 4"/>
+            <wp:cNvGraphicFramePr>
+              <a:graphicFrameLocks xmlns:a="http://schemas.openxmlformats.org/drawingml/2006/main" noChangeAspect="1"/>
+            </wp:cNvGraphicFramePr>
+            <a:graphic xmlns:a="http://schemas.openxmlformats.org/drawingml/2006/main">
+              <a:graphicData uri="http://schemas.openxmlformats.org/drawingml/2006/picture">
+                <pic:pic xmlns:pic="http://schemas.openxmlformats.org/drawingml/2006/picture">
+                  <pic:nvPicPr>
+                    <pic:cNvPr id="0" name="Picture 4"/>
+                    <pic:cNvPicPr>
+                      <a:picLocks noChangeAspect="1" noChangeArrowheads="1"/>
+                    </pic:cNvPicPr>
+                  </pic:nvPicPr>
+                  <pic:blipFill>
+                    <a:blip r:embed="rId7">
+                      <a:extLst>
+                        <a:ext uri="{28A0092B-C50C-407E-A947-70E740481C1C}">
+                          <a14:useLocalDpi xmlns:a14="http://schemas.microsoft.com/office/drawing/2010/main" val="0"/>
+                        </a:ext>
+                      </a:extLst>
+                    </a:blip>
+                    <a:srcRect/>
+                    <a:stretch>
+                      <a:fillRect/>
+                    </a:stretch>
+                  </pic:blipFill>
+                  <pic:spPr bwMode="auto">
+                    <a:xfrm>
+                      <a:off x="0" y="0"/>
+                      <a:ext cx="2938780" cy="1402080"/>
+                    </a:xfrm>
+                    <a:prstGeom prst="rect">
+                      <a:avLst/>
+                    </a:prstGeom>
+                    <a:noFill/>
+                  </pic:spPr>
+                </pic:pic>
+              </a:graphicData>
+            </a:graphic>
+          </wp:inline>
+        </w:drawing>
+      </w:r>
+    </w:p>
+    <w:p>
+      <w:pPr>
+        <w:tabs>
+          <w:tab w:val="left" w:pos="6770"/>
+        </w:tabs>
+        <w:rPr>
+          <w:rFonts w:ascii="Arial" w:hAnsi="Arial" w:cs="Arial"/>
+          <w:noProof/>
+          <w:sz w:val="24"/>
+          <w:szCs w:val="24"/>
+        </w:rPr>
+      </w:pPr>
+    </w:p>
+    <w:p>
+      <w:pPr>
+        <w:tabs>
+          <w:tab w:val="left" w:pos="6770"/>
+        </w:tabs>
+        <w:rPr>
+          <w:rFonts w:ascii="Arial" w:hAnsi="Arial" w:cs="Arial"/>
+          <w:noProof/>
+          <w:sz w:val="24"/>
+          <w:szCs w:val="24"/>
+        </w:rPr>
+      </w:pPr>
+      <w:r>
+        <w:rPr>
+          <w:rFonts w:ascii="Arial" w:hAnsi="Arial" w:cs="Arial"/>
+          <w:noProof/>
+          <w:sz w:val="24"/>
+          <w:szCs w:val="24"/>
+        </w:rPr>
+        <mc:AlternateContent>
+          <mc:Choice Requires="wps">
+            <w:drawing>
+              <wp:anchor distT="0" distB="0" distL="114300" distR="114300" simplePos="0" relativeHeight="251663360" behindDoc="0" locked="0" layoutInCell="1" allowOverlap="1" wp14:anchorId="19D73CA5" wp14:editId="0C42911E">
+                <wp:simplePos x="0" y="0"/>
+                <wp:positionH relativeFrom="column">
+                  <wp:posOffset>1083863</wp:posOffset>
+                </wp:positionH>
+                <wp:positionV relativeFrom="paragraph">
+                  <wp:posOffset>288741</wp:posOffset>
+                </wp:positionV>
+                <wp:extent cx="2964221" cy="1402080"/>
+                <wp:effectExtent l="0" t="0" r="26670" b="26670"/>
+                <wp:wrapNone/>
+                <wp:docPr id="1795983823" name="Text Box 7"/>
+                <wp:cNvGraphicFramePr/>
+                <a:graphic xmlns:a="http://schemas.openxmlformats.org/drawingml/2006/main">
+                  <a:graphicData uri="http://schemas.microsoft.com/office/word/2010/wordprocessingShape">
+                    <wps:wsp>
+                      <wps:cNvSpPr txBox="1"/>
+                      <wps:spPr>
+                        <a:xfrm>
+                          <a:off x="0" y="0"/>
+                          <a:ext cx="2964221" cy="1402080"/>
+                        </a:xfrm>
+                        <a:prstGeom prst="rect">
+                          <a:avLst/>
+                        </a:prstGeom>
+                        <a:solidFill>
+                          <a:schemeClr val="lt1"/>
+                        </a:solidFill>
+                        <a:ln w="6350">
+                          <a:solidFill>
+                            <a:prstClr val="black"/>
+                          </a:solidFill>
+                        </a:ln>
+                      </wps:spPr>
+                      <wps:txbx>
+                        <w:txbxContent>
+                          <w:p>
+                            <w:pPr>
+                              <w:jc w:val="center"/>
+                              <w:rPr>
+                                <w:lang w:val="en-US"/>
+                              </w:rPr>
+                            </w:pPr>
+                            <w:r>
+                              <w:rPr>
+                                <w:lang w:val="en-US"/>
+                              </w:rPr>
+                              <w:t>Data Access Layer</w:t>
+                            </w:r>
+                          </w:p>
+                          <w:p>
+                            <w:pPr>
+                              <w:jc w:val="center"/>
+                              <w:rPr>
+                                <w:lang w:val="en-US"/>
+                              </w:rPr>
+                            </w:pPr>
+                            <w:proofErr w:type="spellStart"/>
+                            <w:r>
+                              <w:rPr>
+                                <w:lang w:val="en-US"/>
+                              </w:rPr>
+                              <w:t>AcademicDbContext</w:t>
+                            </w:r>
+                            <w:proofErr w:type="spellEnd"/>
+                          </w:p>
+                          <w:p>
+                            <w:pPr>
+                              <w:jc w:val="center"/>
+                              <w:rPr>
+                                <w:lang w:val="en-US"/>
+                              </w:rPr>
+                            </w:pPr>
+                            <w:r>
+                              <w:rPr>
+                                <w:lang w:val="en-US"/>
+                              </w:rPr>
+                              <w:t>Entity Framework Core</w:t>
+                            </w:r>
+                          </w:p>
+                        </w:txbxContent>
+                      </wps:txbx>
+                      <wps:bodyPr rot="0" spcFirstLastPara="0" vertOverflow="overflow" horzOverflow="overflow" vert="horz" wrap="square" lIns="91440" tIns="45720" rIns="91440" bIns="45720" numCol="1" spcCol="0" rtlCol="0" fromWordArt="0" anchor="t" anchorCtr="0" forceAA="0" compatLnSpc="1">
+                        <a:prstTxWarp prst="textNoShape">
+                          <a:avLst/>
+                        </a:prstTxWarp>
+                        <a:noAutofit/>
+                      </wps:bodyPr>
+                    </wps:wsp>
+                  </a:graphicData>
+                </a:graphic>
+              </wp:anchor>
+            </w:drawing>
+          </mc:Choice>
+          <mc:Fallback>
+            <w:pict>
+              <v:shape w14:anchorId="19D73CA5" id="Text Box 7" o:spid="_x0000_s1028" type="#_x0000_t202" style="position:absolute;margin-left:85.35pt;margin-top:22.75pt;width:233.4pt;height:110.4pt;z-index:251663360;visibility:visible;mso-wrap-style:square;mso-wrap-distance-left:9pt;mso-wrap-distance-top:0;mso-wrap-distance-right:9pt;mso-wrap-distance-bottom:0;mso-position-horizontal:absolute;mso-position-horizontal-relative:text;mso-position-vertical:absolute;mso-position-vertical-relative:text;v-text-anchor:top" o:gfxdata="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" fillcolor="white [3201]" strokeweight=".5pt">
+                <v:textbox>
+                  <w:txbxContent>
+                    <w:p>
+                      <w:pPr>
+                        <w:jc w:val="center"/>
+                        <w:rPr>
+                          <w:lang w:val="en-US"/>
+                        </w:rPr>
+                      </w:pPr>
+                      <w:r>
+                        <w:rPr>
+                          <w:lang w:val="en-US"/>
+                        </w:rPr>
+                        <w:t>Data Access Layer</w:t>
+                      </w:r>
+                    </w:p>
+                    <w:p>
+                      <w:pPr>
+                        <w:jc w:val="center"/>
+                        <w:rPr>
+                          <w:lang w:val="en-US"/>
+                        </w:rPr>
+                      </w:pPr>
+                      <w:proofErr w:type="spellStart"/>
+                      <w:r>
+                        <w:rPr>
+                          <w:lang w:val="en-US"/>
+                        </w:rPr>
+                        <w:t>AcademicDbContext</w:t>
+                      </w:r>
+                      <w:proofErr w:type="spellEnd"/>
+                    </w:p>
+                    <w:p>
+                      <w:pPr>
+                        <w:jc w:val="center"/>
+                        <w:rPr>
+                          <w:lang w:val="en-US"/>
+                        </w:rPr>
+                      </w:pPr>
+                      <w:r>
+                        <w:rPr>
+                          <w:lang w:val="en-US"/>
+                        </w:rPr>
+                        <w:t>Entity Framework Core</w:t>
+                      </w:r>
+                    </w:p>
+                  </w:txbxContent>
+                </v:textbox>
+              </v:shape>
+            </w:pict>
+          </mc:Fallback>
+        </mc:AlternateContent>
+      </w:r>
+    </w:p>
+    <w:p>
+      <w:pPr>
+        <w:tabs>
+          <w:tab w:val="left" w:pos="6770"/>
+        </w:tabs>
+        <w:rPr>
+          <w:rFonts w:ascii="Arial" w:hAnsi="Arial" w:cs="Arial"/>
+          <w:sz w:val="24"/>
+          <w:szCs w:val="24"/>
+        </w:rPr>
+      </w:pPr>
+      <w:r>
+        <w:rPr>
+          <w:rFonts w:ascii="Arial" w:hAnsi="Arial" w:cs="Arial"/>
+          <w:noProof/>
+          <w:sz w:val="24"/>
+          <w:szCs w:val="24"/>
+        </w:rPr>
+        <mc:AlternateContent>
+          <mc:Choice Requires="wps">
+            <w:drawing>
+              <wp:anchor distT="0" distB="0" distL="114300" distR="114300" simplePos="0" relativeHeight="251666432" behindDoc="0" locked="0" layoutInCell="1" allowOverlap="1" wp14:anchorId="5F96482D" wp14:editId="4925606F">
+                <wp:simplePos x="0" y="0"/>
+                <wp:positionH relativeFrom="column">
+                  <wp:posOffset>2396470</wp:posOffset>
+                </wp:positionH>
+                <wp:positionV relativeFrom="paragraph">
+                  <wp:posOffset>1443888</wp:posOffset>
+                </wp:positionV>
+                <wp:extent cx="14748" cy="412954"/>
+                <wp:effectExtent l="57150" t="0" r="61595" b="63500"/>
+                <wp:wrapNone/>
+                <wp:docPr id="2133329894" name="Straight Arrow Connector 10"/>
+                <wp:cNvGraphicFramePr/>
+                <a:graphic xmlns:a="http://schemas.openxmlformats.org/drawingml/2006/main">
+                  <a:graphicData uri="http://schemas.microsoft.com/office/word/2010/wordprocessingShape">
+                    <wps:wsp>
+                      <wps:cNvCnPr/>
+                      <wps:spPr>
+                        <a:xfrm>
+                          <a:off x="0" y="0"/>
+                          <a:ext cx="14748" cy="412954"/>
+                        </a:xfrm>
+                        <a:prstGeom prst="straightConnector1">
+                          <a:avLst/>
+                        </a:prstGeom>
+                        <a:ln>
+                          <a:tailEnd type="triangle"/>
+                        </a:ln>
+                      </wps:spPr>
+                      <wps:style>
+                        <a:lnRef idx="1">
+                          <a:schemeClr val="accent1"/>
+                        </a:lnRef>
+                        <a:fillRef idx="0">
+                          <a:schemeClr val="accent1"/>
+                        </a:fillRef>
+                        <a:effectRef idx="0">
+                          <a:schemeClr val="accent1"/>
+                        </a:effectRef>
+                        <a:fontRef idx="minor">
+                          <a:schemeClr val="tx1"/>
+                        </a:fontRef>
+                      </wps:style>
+                      <wps:bodyPr/>
+                    </wps:wsp>
+                  </a:graphicData>
+                </a:graphic>
+              </wp:anchor>
+            </w:drawing>
+          </mc:Choice>
+          <mc:Fallback>
+            <w:pict>
+              <v:shape w14:anchorId="4B773E7B" id="Straight Arrow Connector 10" o:spid="_x0000_s1026" type="#_x0000_t32" style="position:absolute;margin-left:188.7pt;margin-top:113.7pt;width:1.15pt;height:32.5pt;z-index:251666432;visibility:visible;mso-wrap-style:square;mso-wrap-distance-left:9pt;mso-wrap-distance-top:0;mso-wrap-distance-right:9pt;mso-wrap-distance-bottom:0;mso-position-horizontal:absolute;mso-position-horizontal-relative:text;mso-position-vertical:absolute;mso-position-vertical-relative:text" o:gfxdata="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" strokecolor="#5b9bd5 [3204]" strokeweight=".5pt">
+                <v:stroke endarrow="block" joinstyle="miter"/>
+              </v:shape>
+            </w:pict>
+          </mc:Fallback>
+        </mc:AlternateContent>
+      </w:r>
+      <w:r>
+        <w:rPr>
+          <w:rFonts w:ascii="Arial" w:hAnsi="Arial" w:cs="Arial"/>
+          <w:sz w:val="24"/>
+          <w:szCs w:val="24"/>
+        </w:rPr>
+        <w:t xml:space="preserve">                          </w:t>
+      </w:r>
+      <w:r>
+        <w:rPr>
+          <w:rFonts w:ascii="Arial" w:hAnsi="Arial" w:cs="Arial"/>
+          <w:noProof/>
+          <w:sz w:val="24"/>
+          <w:szCs w:val="24"/>
+        </w:rPr>
+        <w:drawing>
+          <wp:inline distT="0" distB="0" distL="0" distR="0" wp14:anchorId="1B3E9FE9" wp14:editId="0F365926">
+            <wp:extent cx="2938780" cy="1402080"/>
+            <wp:effectExtent l="0" t="0" r="0" b="7620"/>
+            <wp:docPr id="719938814" name="Picture 5"/>
+            <wp:cNvGraphicFramePr>
+              <a:graphicFrameLocks xmlns:a="http://schemas.openxmlformats.org/drawingml/2006/main" noChangeAspect="1"/>
+            </wp:cNvGraphicFramePr>
+            <a:graphic xmlns:a="http://schemas.openxmlformats.org/drawingml/2006/main">
+              <a:graphicData uri="http://schemas.openxmlformats.org/drawingml/2006/picture">
+                <pic:pic xmlns:pic="http://schemas.openxmlformats.org/drawingml/2006/picture">
+                  <pic:nvPicPr>
+                    <pic:cNvPr id="0" name="Picture 5"/>
+                    <pic:cNvPicPr>
+                      <a:picLocks noChangeAspect="1" noChangeArrowheads="1"/>
+                    </pic:cNvPicPr>
+                  </pic:nvPicPr>
+                  <pic:blipFill>
+                    <a:blip r:embed="rId7">
+                      <a:extLst>
+                        <a:ext uri="{28A0092B-C50C-407E-A947-70E740481C1C}">
+                          <a14:useLocalDpi xmlns:a14="http://schemas.microsoft.com/office/drawing/2010/main" val="0"/>
+                        </a:ext>
+                      </a:extLst>
+                    </a:blip>
+                    <a:srcRect/>
+                    <a:stretch>
+                      <a:fillRect/>
+                    </a:stretch>
+                  </pic:blipFill>
+                  <pic:spPr bwMode="auto">
+                    <a:xfrm>
+                      <a:off x="0" y="0"/>
+                      <a:ext cx="2938780" cy="1402080"/>
+                    </a:xfrm>
+                    <a:prstGeom prst="rect">
+                      <a:avLst/>
+                    </a:prstGeom>
+                    <a:noFill/>
+                  </pic:spPr>
+                </pic:pic>
+              </a:graphicData>
+            </a:graphic>
+          </wp:inline>
+        </w:drawing>
+      </w:r>
+    </w:p>
+    <w:p>
+      <w:pPr>
+        <w:tabs>
+          <w:tab w:val="left" w:pos="6770"/>
+        </w:tabs>
+        <w:rPr>
+          <w:rFonts w:ascii="Arial" w:hAnsi="Arial" w:cs="Arial"/>
+          <w:sz w:val="24"/>
+          <w:szCs w:val="24"/>
+        </w:rPr>
+      </w:pPr>
+    </w:p>
+    <w:p>
+      <w:pPr>
+        <w:tabs>
+          <w:tab w:val="left" w:pos="6770"/>
+        </w:tabs>
+        <w:rPr>
+          <w:rFonts w:ascii="Arial" w:hAnsi="Arial" w:cs="Arial"/>
+          <w:sz w:val="24"/>
+          <w:szCs w:val="24"/>
+        </w:rPr>
+      </w:pPr>
+      <w:r>
+        <w:rPr>
+          <w:rFonts w:ascii="Arial" w:hAnsi="Arial" w:cs="Arial"/>
+          <w:noProof/>
+          <w:sz w:val="24"/>
+          <w:szCs w:val="24"/>
+        </w:rPr>
+        <mc:AlternateContent>
+          <mc:Choice Requires="wps">
+            <w:drawing>
+              <wp:anchor distT="0" distB="0" distL="114300" distR="114300" simplePos="0" relativeHeight="251661312" behindDoc="0" locked="0" layoutInCell="1" allowOverlap="1" wp14:anchorId="2E9ECC7C" wp14:editId="1F3BAAF9">
+                <wp:simplePos x="0" y="0"/>
+                <wp:positionH relativeFrom="column">
+                  <wp:posOffset>1120878</wp:posOffset>
+                </wp:positionH>
+                <wp:positionV relativeFrom="paragraph">
+                  <wp:posOffset>127963</wp:posOffset>
+                </wp:positionV>
+                <wp:extent cx="2927555" cy="1393723"/>
+                <wp:effectExtent l="0" t="0" r="25400" b="16510"/>
+                <wp:wrapNone/>
+                <wp:docPr id="1085709576" name="Rectangle 1"/>
+                <wp:cNvGraphicFramePr/>
+                <a:graphic xmlns:a="http://schemas.openxmlformats.org/drawingml/2006/main">
+                  <a:graphicData uri="http://schemas.microsoft.com/office/word/2010/wordprocessingShape">
+                    <wps:wsp>
+                      <wps:cNvSpPr/>
+                      <wps:spPr>
+                        <a:xfrm>
+                          <a:off x="0" y="0"/>
+                          <a:ext cx="2927555" cy="1393723"/>
+                        </a:xfrm>
+                        <a:prstGeom prst="rect">
+                          <a:avLst/>
+                        </a:prstGeom>
+                      </wps:spPr>
+                      <wps:style>
+                        <a:lnRef idx="2">
+                          <a:schemeClr val="accent6"/>
+                        </a:lnRef>
+                        <a:fillRef idx="1">
+                          <a:schemeClr val="lt1"/>
+                        </a:fillRef>
+                        <a:effectRef idx="0">
+                          <a:schemeClr val="accent6"/>
+                        </a:effectRef>
+                        <a:fontRef idx="minor">
+                          <a:schemeClr val="dk1"/>
+                        </a:fontRef>
+                      </wps:style>
+                      <wps:txbx>
+                        <w:txbxContent>
+                          <w:p>
+                            <w:pPr>
+                              <w:jc w:val="center"/>
+                              <w:rPr>
+                                <w:lang w:val="en-US"/>
+                              </w:rPr>
+                            </w:pPr>
+                            <w:r>
+                              <w:rPr>
+                                <w:lang w:val="en-US"/>
+                              </w:rPr>
+                              <w:t>Database Layer</w:t>
+                            </w:r>
+                          </w:p>
+                          <w:p>
+                            <w:pPr>
+                              <w:jc w:val="center"/>
+                              <w:rPr>
+                                <w:lang w:val="en-US"/>
+                              </w:rPr>
+                            </w:pPr>
+                            <w:r>
+                              <w:rPr>
+                                <w:lang w:val="en-US"/>
+                              </w:rPr>
+                              <w:t>SQLite Database</w:t>
+                            </w:r>
+                          </w:p>
+                        </w:txbxContent>
+                      </wps:txbx>
+                      <wps:bodyPr rot="0" spcFirstLastPara="0" vertOverflow="overflow" horzOverflow="overflow" vert="horz" wrap="square" lIns="91440" tIns="45720" rIns="91440" bIns="45720" numCol="1" spcCol="0" rtlCol="0" fromWordArt="0" anchor="ctr" anchorCtr="0" forceAA="0" compatLnSpc="1">
+                        <a:prstTxWarp prst="textNoShape">
+                          <a:avLst/>
+                        </a:prstTxWarp>
+                        <a:noAutofit/>
+                      </wps:bodyPr>
+                    </wps:wsp>
+                  </a:graphicData>
+                </a:graphic>
+              </wp:anchor>
+            </w:drawing>
+          </mc:Choice>
+          <mc:Fallback>
+            <w:pict>
+              <v:rect w14:anchorId="2E9ECC7C" id="_x0000_s1029" style="position:absolute;margin-left:88.25pt;margin-top:10.1pt;width:230.5pt;height:109.75pt;z-index:251661312;visibility:visible;mso-wrap-style:square;mso-wrap-distance-left:9pt;mso-wrap-distance-top:0;mso-wrap-distance-right:9pt;mso-wrap-distance-bottom:0;mso-position-horizontal:absolute;mso-position-horizontal-relative:text;mso-position-vertical:absolute;mso-position-vertical-relative:text;v-text-anchor:middle" o:gfxdata="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" fillcolor="white [3201]" strokecolor="#70ad47 [3209]" strokeweight="1pt">
+                <v:textbox>
+                  <w:txbxContent>
+                    <w:p>
+                      <w:pPr>
+                        <w:jc w:val="center"/>
+                        <w:rPr>
+                          <w:lang w:val="en-US"/>
+                        </w:rPr>
+                      </w:pPr>
+                      <w:r>
+                        <w:rPr>
+                          <w:lang w:val="en-US"/>
+                        </w:rPr>
+                        <w:t>Database Layer</w:t>
+                      </w:r>
+                    </w:p>
+                    <w:p>
+                      <w:pPr>
+                        <w:jc w:val="center"/>
+                        <w:rPr>
+                          <w:lang w:val="en-US"/>
+                        </w:rPr>
+                      </w:pPr>
+                      <w:r>
+                        <w:rPr>
+                          <w:lang w:val="en-US"/>
+                        </w:rPr>
+                        <w:t>SQLite Database</w:t>
+                      </w:r>
+                    </w:p>
+                  </w:txbxContent>
+                </v:textbox>
+              </v:rect>
+            </w:pict>
+          </mc:Fallback>
+        </mc:AlternateContent>
+      </w:r>
+    </w:p>
+    <w:p>
+      <w:pPr>
+        <w:tabs>
+          <w:tab w:val="left" w:pos="6770"/>
+        </w:tabs>
+        <w:rPr>
+          <w:rFonts w:ascii="Arial" w:hAnsi="Arial" w:cs="Arial"/>
+          <w:sz w:val="24"/>
+          <w:szCs w:val="24"/>
+        </w:rPr>
+      </w:pPr>
+    </w:p>
     <w:sectPr>
-      <w:footerReference w:type="default" r:id="rId7"/>
+      <w:footerReference w:type="default" r:id="rId8"/>
       <w:pgSz w:w="11906" w:h="16838" w:code="9"/>
       <w:pgMar w:top="1417" w:right="1417" w:bottom="1417" w:left="1417" w:header="708" w:footer="708" w:gutter="0"/>
       <w:cols w:space="708"/>

</xml_diff>

<commit_message>
Archived the programing part of my project and did some more work on my thesis.
</commit_message>
<xml_diff>
--- a/Project Thesis.docx
+++ b/Project Thesis.docx
@@ -11923,14 +11923,1163 @@
           <w:lang w:val="en-US"/>
         </w:rPr>
       </w:pPr>
-      <w:r>
-        <w:rPr>
-          <w:rFonts w:ascii="Arial" w:hAnsi="Arial" w:cs="Arial"/>
-          <w:sz w:val="24"/>
-          <w:szCs w:val="24"/>
-          <w:lang w:val="en-US"/>
-        </w:rPr>
-        <w:t>f</w:t>
+    </w:p>
+    <w:p>
+      <w:pPr>
+        <w:spacing w:line="360" w:lineRule="auto"/>
+        <w:rPr>
+          <w:rFonts w:ascii="Arial" w:hAnsi="Arial" w:cs="Arial"/>
+          <w:sz w:val="24"/>
+          <w:szCs w:val="24"/>
+          <w:lang w:val="en-US"/>
+        </w:rPr>
+      </w:pPr>
+      <w:r>
+        <w:rPr>
+          <w:rFonts w:ascii="Arial" w:hAnsi="Arial" w:cs="Arial"/>
+          <w:sz w:val="24"/>
+          <w:szCs w:val="24"/>
+          <w:lang w:val="en-US"/>
+        </w:rPr>
+        <w:t>The database design</w:t>
+      </w:r>
+      <w:r>
+        <w:rPr>
+          <w:rFonts w:ascii="Arial" w:hAnsi="Arial" w:cs="Arial"/>
+          <w:sz w:val="24"/>
+          <w:szCs w:val="24"/>
+          <w:lang w:val="en-US"/>
+        </w:rPr>
+        <w:t xml:space="preserve"> currently consists of</w:t>
+      </w:r>
+      <w:r>
+        <w:rPr>
+          <w:rFonts w:ascii="Arial" w:hAnsi="Arial" w:cs="Arial"/>
+          <w:sz w:val="24"/>
+          <w:szCs w:val="24"/>
+          <w:lang w:val="en-US"/>
+        </w:rPr>
+        <w:t xml:space="preserve"> two related entities</w:t>
+      </w:r>
+      <w:r>
+        <w:rPr>
+          <w:rFonts w:ascii="Arial" w:hAnsi="Arial" w:cs="Arial"/>
+          <w:sz w:val="24"/>
+          <w:szCs w:val="24"/>
+          <w:lang w:val="en-US"/>
+        </w:rPr>
+        <w:t>: Semester and Course</w:t>
+      </w:r>
+      <w:r>
+        <w:rPr>
+          <w:rFonts w:ascii="Arial" w:hAnsi="Arial" w:cs="Arial"/>
+          <w:sz w:val="24"/>
+          <w:szCs w:val="24"/>
+          <w:lang w:val="en-US"/>
+        </w:rPr>
+        <w:t>.</w:t>
+      </w:r>
+      <w:r>
+        <w:rPr>
+          <w:rFonts w:ascii="Arial" w:hAnsi="Arial" w:cs="Arial"/>
+          <w:sz w:val="24"/>
+          <w:szCs w:val="24"/>
+          <w:lang w:val="en-US"/>
+        </w:rPr>
+        <w:t xml:space="preserve"> A semester can contain multiple courses</w:t>
+      </w:r>
+      <w:r>
+        <w:rPr>
+          <w:rFonts w:ascii="Arial" w:hAnsi="Arial" w:cs="Arial"/>
+          <w:sz w:val="24"/>
+          <w:szCs w:val="24"/>
+          <w:lang w:val="en-US"/>
+        </w:rPr>
+        <w:t>, while each course</w:t>
+      </w:r>
+      <w:r>
+        <w:rPr>
+          <w:rFonts w:ascii="Arial" w:hAnsi="Arial" w:cs="Arial"/>
+          <w:sz w:val="24"/>
+          <w:szCs w:val="24"/>
+          <w:lang w:val="en-US"/>
+        </w:rPr>
+        <w:t xml:space="preserve"> belongs</w:t>
+      </w:r>
+      <w:r>
+        <w:rPr>
+          <w:rFonts w:ascii="Arial" w:hAnsi="Arial" w:cs="Arial"/>
+          <w:sz w:val="24"/>
+          <w:szCs w:val="24"/>
+          <w:lang w:val="en-US"/>
+        </w:rPr>
+        <w:t xml:space="preserve"> to</w:t>
+      </w:r>
+      <w:r>
+        <w:rPr>
+          <w:rFonts w:ascii="Arial" w:hAnsi="Arial" w:cs="Arial"/>
+          <w:sz w:val="24"/>
+          <w:szCs w:val="24"/>
+          <w:lang w:val="en-US"/>
+        </w:rPr>
+        <w:t xml:space="preserve"> exactly one semester.</w:t>
+      </w:r>
+    </w:p>
+    <w:p>
+      <w:pPr>
+        <w:spacing w:line="360" w:lineRule="auto"/>
+        <w:rPr>
+          <w:rFonts w:ascii="Arial" w:hAnsi="Arial" w:cs="Arial"/>
+          <w:sz w:val="24"/>
+          <w:szCs w:val="24"/>
+          <w:lang w:val="en-US"/>
+        </w:rPr>
+      </w:pPr>
+      <w:r>
+        <w:rPr>
+          <w:rFonts w:ascii="Arial" w:hAnsi="Arial" w:cs="Arial"/>
+          <w:noProof/>
+          <w:sz w:val="24"/>
+          <w:szCs w:val="24"/>
+        </w:rPr>
+        <mc:AlternateContent>
+          <mc:Choice Requires="wps">
+            <w:drawing>
+              <wp:anchor distT="0" distB="0" distL="114300" distR="114300" simplePos="0" relativeHeight="251660288" behindDoc="0" locked="0" layoutInCell="1" allowOverlap="1" wp14:anchorId="145A54F1" wp14:editId="11027215">
+                <wp:simplePos x="0" y="0"/>
+                <wp:positionH relativeFrom="margin">
+                  <wp:align>center</wp:align>
+                </wp:positionH>
+                <wp:positionV relativeFrom="paragraph">
+                  <wp:posOffset>561975</wp:posOffset>
+                </wp:positionV>
+                <wp:extent cx="2804160" cy="7620"/>
+                <wp:effectExtent l="0" t="0" r="34290" b="30480"/>
+                <wp:wrapNone/>
+                <wp:docPr id="354543658" name="Straight Connector 2"/>
+                <wp:cNvGraphicFramePr/>
+                <a:graphic xmlns:a="http://schemas.openxmlformats.org/drawingml/2006/main">
+                  <a:graphicData uri="http://schemas.microsoft.com/office/word/2010/wordprocessingShape">
+                    <wps:wsp>
+                      <wps:cNvCnPr/>
+                      <wps:spPr>
+                        <a:xfrm>
+                          <a:off x="0" y="0"/>
+                          <a:ext cx="2804160" cy="7620"/>
+                        </a:xfrm>
+                        <a:prstGeom prst="line">
+                          <a:avLst/>
+                        </a:prstGeom>
+                      </wps:spPr>
+                      <wps:style>
+                        <a:lnRef idx="1">
+                          <a:schemeClr val="dk1"/>
+                        </a:lnRef>
+                        <a:fillRef idx="0">
+                          <a:schemeClr val="dk1"/>
+                        </a:fillRef>
+                        <a:effectRef idx="0">
+                          <a:schemeClr val="dk1"/>
+                        </a:effectRef>
+                        <a:fontRef idx="minor">
+                          <a:schemeClr val="tx1"/>
+                        </a:fontRef>
+                      </wps:style>
+                      <wps:bodyPr/>
+                    </wps:wsp>
+                  </a:graphicData>
+                </a:graphic>
+              </wp:anchor>
+            </w:drawing>
+          </mc:Choice>
+          <mc:Fallback>
+            <w:pict>
+              <v:line w14:anchorId="5CE0C5A0" id="Straight Connector 2" o:spid="_x0000_s1026" style="position:absolute;z-index:251660288;visibility:visible;mso-wrap-style:square;mso-wrap-distance-left:9pt;mso-wrap-distance-top:0;mso-wrap-distance-right:9pt;mso-wrap-distance-bottom:0;mso-position-horizontal:center;mso-position-horizontal-relative:margin;mso-position-vertical:absolute;mso-position-vertical-relative:text" from="0,44.25pt" to="220.8pt,44.85pt" o:gfxdata="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" strokecolor="black [3200]" strokeweight=".5pt">
+                <v:stroke joinstyle="miter"/>
+                <w10:wrap anchorx="margin"/>
+              </v:line>
+            </w:pict>
+          </mc:Fallback>
+        </mc:AlternateContent>
+      </w:r>
+      <w:r>
+        <w:rPr>
+          <w:rFonts w:ascii="Arial" w:hAnsi="Arial" w:cs="Arial"/>
+          <w:noProof/>
+          <w:sz w:val="24"/>
+          <w:szCs w:val="24"/>
+        </w:rPr>
+        <mc:AlternateContent>
+          <mc:Choice Requires="wps">
+            <w:drawing>
+              <wp:anchor distT="0" distB="0" distL="114300" distR="114300" simplePos="0" relativeHeight="251659264" behindDoc="0" locked="0" layoutInCell="1" allowOverlap="1" wp14:anchorId="220463A8" wp14:editId="499B71A7">
+                <wp:simplePos x="0" y="0"/>
+                <wp:positionH relativeFrom="column">
+                  <wp:posOffset>1477645</wp:posOffset>
+                </wp:positionH>
+                <wp:positionV relativeFrom="paragraph">
+                  <wp:posOffset>165735</wp:posOffset>
+                </wp:positionV>
+                <wp:extent cx="2758440" cy="1501140"/>
+                <wp:effectExtent l="0" t="0" r="22860" b="22860"/>
+                <wp:wrapNone/>
+                <wp:docPr id="254182111" name="Rectangle 1"/>
+                <wp:cNvGraphicFramePr/>
+                <a:graphic xmlns:a="http://schemas.openxmlformats.org/drawingml/2006/main">
+                  <a:graphicData uri="http://schemas.microsoft.com/office/word/2010/wordprocessingShape">
+                    <wps:wsp>
+                      <wps:cNvSpPr/>
+                      <wps:spPr>
+                        <a:xfrm>
+                          <a:off x="0" y="0"/>
+                          <a:ext cx="2758440" cy="1501140"/>
+                        </a:xfrm>
+                        <a:prstGeom prst="rect">
+                          <a:avLst/>
+                        </a:prstGeom>
+                      </wps:spPr>
+                      <wps:style>
+                        <a:lnRef idx="2">
+                          <a:schemeClr val="accent6"/>
+                        </a:lnRef>
+                        <a:fillRef idx="1">
+                          <a:schemeClr val="lt1"/>
+                        </a:fillRef>
+                        <a:effectRef idx="0">
+                          <a:schemeClr val="accent6"/>
+                        </a:effectRef>
+                        <a:fontRef idx="minor">
+                          <a:schemeClr val="dk1"/>
+                        </a:fontRef>
+                      </wps:style>
+                      <wps:txbx>
+                        <w:txbxContent>
+                          <w:p>
+                            <w:pPr>
+                              <w:jc w:val="center"/>
+                              <w:rPr>
+                                <w:lang w:val="en-US"/>
+                              </w:rPr>
+                            </w:pPr>
+                            <w:r>
+                              <w:rPr>
+                                <w:lang w:val="en-US"/>
+                              </w:rPr>
+                              <w:t>Semester</w:t>
+                            </w:r>
+                          </w:p>
+                          <w:p>
+                            <w:pPr>
+                              <w:rPr>
+                                <w:lang w:val="en-US"/>
+                              </w:rPr>
+                            </w:pPr>
+                            <w:r>
+                              <w:rPr>
+                                <w:lang w:val="en-US"/>
+                              </w:rPr>
+                              <w:t>PK Id</w:t>
+                            </w:r>
+                          </w:p>
+                          <w:p>
+                            <w:pPr>
+                              <w:rPr>
+                                <w:lang w:val="en-US"/>
+                              </w:rPr>
+                            </w:pPr>
+                            <w:r>
+                              <w:rPr>
+                                <w:lang w:val="en-US"/>
+                              </w:rPr>
+                              <w:t xml:space="preserve">       Term</w:t>
+                            </w:r>
+                          </w:p>
+                          <w:p>
+                            <w:pPr>
+                              <w:rPr>
+                                <w:lang w:val="en-US"/>
+                              </w:rPr>
+                            </w:pPr>
+                            <w:r>
+                              <w:rPr>
+                                <w:lang w:val="en-US"/>
+                              </w:rPr>
+                              <w:t xml:space="preserve">        Year</w:t>
+                            </w:r>
+                          </w:p>
+                        </w:txbxContent>
+                      </wps:txbx>
+                      <wps:bodyPr rot="0" spcFirstLastPara="0" vertOverflow="overflow" horzOverflow="overflow" vert="horz" wrap="square" lIns="91440" tIns="45720" rIns="91440" bIns="45720" numCol="1" spcCol="0" rtlCol="0" fromWordArt="0" anchor="ctr" anchorCtr="0" forceAA="0" compatLnSpc="1">
+                        <a:prstTxWarp prst="textNoShape">
+                          <a:avLst/>
+                        </a:prstTxWarp>
+                        <a:noAutofit/>
+                      </wps:bodyPr>
+                    </wps:wsp>
+                  </a:graphicData>
+                </a:graphic>
+              </wp:anchor>
+            </w:drawing>
+          </mc:Choice>
+          <mc:Fallback>
+            <w:pict>
+              <v:rect w14:anchorId="220463A8" id="Rectangle 1" o:spid="_x0000_s1026" style="position:absolute;margin-left:116.35pt;margin-top:13.05pt;width:217.2pt;height:118.2pt;z-index:251659264;visibility:visible;mso-wrap-style:square;mso-wrap-distance-left:9pt;mso-wrap-distance-top:0;mso-wrap-distance-right:9pt;mso-wrap-distance-bottom:0;mso-position-horizontal:absolute;mso-position-horizontal-relative:text;mso-position-vertical:absolute;mso-position-vertical-relative:text;v-text-anchor:middle" o:gfxdata="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" fillcolor="white [3201]" strokecolor="#70ad47 [3209]" strokeweight="1pt">
+                <v:textbox>
+                  <w:txbxContent>
+                    <w:p>
+                      <w:pPr>
+                        <w:jc w:val="center"/>
+                        <w:rPr>
+                          <w:lang w:val="en-US"/>
+                        </w:rPr>
+                      </w:pPr>
+                      <w:r>
+                        <w:rPr>
+                          <w:lang w:val="en-US"/>
+                        </w:rPr>
+                        <w:t>Semester</w:t>
+                      </w:r>
+                    </w:p>
+                    <w:p>
+                      <w:pPr>
+                        <w:rPr>
+                          <w:lang w:val="en-US"/>
+                        </w:rPr>
+                      </w:pPr>
+                      <w:r>
+                        <w:rPr>
+                          <w:lang w:val="en-US"/>
+                        </w:rPr>
+                        <w:t>PK Id</w:t>
+                      </w:r>
+                    </w:p>
+                    <w:p>
+                      <w:pPr>
+                        <w:rPr>
+                          <w:lang w:val="en-US"/>
+                        </w:rPr>
+                      </w:pPr>
+                      <w:r>
+                        <w:rPr>
+                          <w:lang w:val="en-US"/>
+                        </w:rPr>
+                        <w:t xml:space="preserve">       Term</w:t>
+                      </w:r>
+                    </w:p>
+                    <w:p>
+                      <w:pPr>
+                        <w:rPr>
+                          <w:lang w:val="en-US"/>
+                        </w:rPr>
+                      </w:pPr>
+                      <w:r>
+                        <w:rPr>
+                          <w:lang w:val="en-US"/>
+                        </w:rPr>
+                        <w:t xml:space="preserve">        Year</w:t>
+                      </w:r>
+                    </w:p>
+                  </w:txbxContent>
+                </v:textbox>
+              </v:rect>
+            </w:pict>
+          </mc:Fallback>
+        </mc:AlternateContent>
+      </w:r>
+    </w:p>
+    <w:p>
+      <w:pPr>
+        <w:rPr>
+          <w:rFonts w:ascii="Arial" w:hAnsi="Arial" w:cs="Arial"/>
+          <w:sz w:val="24"/>
+          <w:szCs w:val="24"/>
+          <w:lang w:val="en-US"/>
+        </w:rPr>
+      </w:pPr>
+    </w:p>
+    <w:p>
+      <w:pPr>
+        <w:rPr>
+          <w:rFonts w:ascii="Arial" w:hAnsi="Arial" w:cs="Arial"/>
+          <w:sz w:val="24"/>
+          <w:szCs w:val="24"/>
+          <w:lang w:val="en-US"/>
+        </w:rPr>
+      </w:pPr>
+    </w:p>
+    <w:p>
+      <w:pPr>
+        <w:rPr>
+          <w:rFonts w:ascii="Arial" w:hAnsi="Arial" w:cs="Arial"/>
+          <w:sz w:val="24"/>
+          <w:szCs w:val="24"/>
+          <w:lang w:val="en-US"/>
+        </w:rPr>
+      </w:pPr>
+    </w:p>
+    <w:p>
+      <w:pPr>
+        <w:tabs>
+          <w:tab w:val="left" w:pos="7212"/>
+        </w:tabs>
+        <w:rPr>
+          <w:rFonts w:ascii="Arial" w:hAnsi="Arial" w:cs="Arial"/>
+          <w:sz w:val="24"/>
+          <w:szCs w:val="24"/>
+          <w:lang w:val="en-US"/>
+        </w:rPr>
+      </w:pPr>
+      <w:r>
+        <w:rPr>
+          <w:rFonts w:ascii="Arial" w:hAnsi="Arial" w:cs="Arial"/>
+          <w:sz w:val="24"/>
+          <w:szCs w:val="24"/>
+          <w:lang w:val="en-US"/>
+        </w:rPr>
+        <w:tab/>
+      </w:r>
+    </w:p>
+    <w:p>
+      <w:pPr>
+        <w:tabs>
+          <w:tab w:val="left" w:pos="7212"/>
+        </w:tabs>
+        <w:rPr>
+          <w:rFonts w:ascii="Arial" w:hAnsi="Arial" w:cs="Arial"/>
+          <w:sz w:val="24"/>
+          <w:szCs w:val="24"/>
+          <w:lang w:val="en-US"/>
+        </w:rPr>
+      </w:pPr>
+      <w:r>
+        <w:rPr>
+          <w:rFonts w:ascii="Arial" w:hAnsi="Arial" w:cs="Arial"/>
+          <w:sz w:val="24"/>
+          <w:szCs w:val="24"/>
+          <w:lang w:val="en-US"/>
+        </w:rPr>
+        <w:t xml:space="preserve">                                                                      | 1</w:t>
+      </w:r>
+    </w:p>
+    <w:p>
+      <w:pPr>
+        <w:tabs>
+          <w:tab w:val="left" w:pos="7212"/>
+        </w:tabs>
+        <w:rPr>
+          <w:rFonts w:ascii="Arial" w:hAnsi="Arial" w:cs="Arial"/>
+          <w:sz w:val="24"/>
+          <w:szCs w:val="24"/>
+          <w:lang w:val="en-US"/>
+        </w:rPr>
+      </w:pPr>
+      <w:r>
+        <w:rPr>
+          <w:rFonts w:ascii="Arial" w:hAnsi="Arial" w:cs="Arial"/>
+          <w:sz w:val="24"/>
+          <w:szCs w:val="24"/>
+          <w:lang w:val="en-US"/>
+        </w:rPr>
+        <w:t xml:space="preserve">                                                                      |</w:t>
+      </w:r>
+    </w:p>
+    <w:p>
+      <w:pPr>
+        <w:tabs>
+          <w:tab w:val="left" w:pos="7212"/>
+        </w:tabs>
+        <w:rPr>
+          <w:rFonts w:ascii="Arial" w:hAnsi="Arial" w:cs="Arial"/>
+          <w:sz w:val="24"/>
+          <w:szCs w:val="24"/>
+          <w:lang w:val="en-US"/>
+        </w:rPr>
+      </w:pPr>
+      <w:r>
+        <w:rPr>
+          <w:rFonts w:ascii="Arial" w:hAnsi="Arial" w:cs="Arial"/>
+          <w:sz w:val="24"/>
+          <w:szCs w:val="24"/>
+          <w:lang w:val="en-US"/>
+        </w:rPr>
+        <w:t xml:space="preserve">                                                                      |</w:t>
+      </w:r>
+    </w:p>
+    <w:p>
+      <w:pPr>
+        <w:tabs>
+          <w:tab w:val="left" w:pos="7212"/>
+        </w:tabs>
+        <w:rPr>
+          <w:rFonts w:ascii="Arial" w:hAnsi="Arial" w:cs="Arial"/>
+          <w:sz w:val="24"/>
+          <w:szCs w:val="24"/>
+          <w:lang w:val="en-US"/>
+        </w:rPr>
+      </w:pPr>
+      <w:r>
+        <w:rPr>
+          <w:rFonts w:ascii="Arial" w:hAnsi="Arial" w:cs="Arial"/>
+          <w:sz w:val="24"/>
+          <w:szCs w:val="24"/>
+          <w:lang w:val="en-US"/>
+        </w:rPr>
+        <w:t xml:space="preserve">                                                                      |</w:t>
+      </w:r>
+    </w:p>
+    <w:p>
+      <w:pPr>
+        <w:tabs>
+          <w:tab w:val="left" w:pos="7212"/>
+        </w:tabs>
+        <w:rPr>
+          <w:rFonts w:ascii="Arial" w:hAnsi="Arial" w:cs="Arial"/>
+          <w:sz w:val="24"/>
+          <w:szCs w:val="24"/>
+          <w:lang w:val="en-US"/>
+        </w:rPr>
+      </w:pPr>
+      <w:r>
+        <w:rPr>
+          <w:rFonts w:ascii="Arial" w:hAnsi="Arial" w:cs="Arial"/>
+          <w:sz w:val="24"/>
+          <w:szCs w:val="24"/>
+          <w:lang w:val="en-US"/>
+        </w:rPr>
+        <w:t xml:space="preserve">                                                                      |</w:t>
+      </w:r>
+    </w:p>
+    <w:p>
+      <w:pPr>
+        <w:tabs>
+          <w:tab w:val="left" w:pos="7212"/>
+        </w:tabs>
+        <w:rPr>
+          <w:rFonts w:ascii="Arial" w:hAnsi="Arial" w:cs="Arial"/>
+          <w:sz w:val="24"/>
+          <w:szCs w:val="24"/>
+          <w:lang w:val="en-US"/>
+        </w:rPr>
+      </w:pPr>
+      <w:r>
+        <w:rPr>
+          <w:rFonts w:ascii="Arial" w:hAnsi="Arial" w:cs="Arial"/>
+          <w:noProof/>
+          <w:sz w:val="24"/>
+          <w:szCs w:val="24"/>
+          <w:lang w:val="en-US"/>
+        </w:rPr>
+        <mc:AlternateContent>
+          <mc:Choice Requires="wps">
+            <w:drawing>
+              <wp:anchor distT="0" distB="0" distL="114300" distR="114300" simplePos="0" relativeHeight="251661312" behindDoc="0" locked="0" layoutInCell="1" allowOverlap="1" wp14:anchorId="0B3DBDDC" wp14:editId="6C488188">
+                <wp:simplePos x="0" y="0"/>
+                <wp:positionH relativeFrom="column">
+                  <wp:posOffset>2879725</wp:posOffset>
+                </wp:positionH>
+                <wp:positionV relativeFrom="paragraph">
+                  <wp:posOffset>267970</wp:posOffset>
+                </wp:positionV>
+                <wp:extent cx="251460" cy="274320"/>
+                <wp:effectExtent l="38100" t="19050" r="15240" b="30480"/>
+                <wp:wrapNone/>
+                <wp:docPr id="920348512" name="Isosceles Triangle 3"/>
+                <wp:cNvGraphicFramePr/>
+                <a:graphic xmlns:a="http://schemas.openxmlformats.org/drawingml/2006/main">
+                  <a:graphicData uri="http://schemas.microsoft.com/office/word/2010/wordprocessingShape">
+                    <wps:wsp>
+                      <wps:cNvSpPr/>
+                      <wps:spPr>
+                        <a:xfrm rot="10629661">
+                          <a:off x="0" y="0"/>
+                          <a:ext cx="251460" cy="274320"/>
+                        </a:xfrm>
+                        <a:prstGeom prst="triangle">
+                          <a:avLst/>
+                        </a:prstGeom>
+                      </wps:spPr>
+                      <wps:style>
+                        <a:lnRef idx="2">
+                          <a:schemeClr val="accent6"/>
+                        </a:lnRef>
+                        <a:fillRef idx="1">
+                          <a:schemeClr val="lt1"/>
+                        </a:fillRef>
+                        <a:effectRef idx="0">
+                          <a:schemeClr val="accent6"/>
+                        </a:effectRef>
+                        <a:fontRef idx="minor">
+                          <a:schemeClr val="dk1"/>
+                        </a:fontRef>
+                      </wps:style>
+                      <wps:bodyPr rot="0" spcFirstLastPara="0" vertOverflow="overflow" horzOverflow="overflow" vert="horz" wrap="square" lIns="91440" tIns="45720" rIns="91440" bIns="45720" numCol="1" spcCol="0" rtlCol="0" fromWordArt="0" anchor="ctr" anchorCtr="0" forceAA="0" compatLnSpc="1">
+                        <a:prstTxWarp prst="textNoShape">
+                          <a:avLst/>
+                        </a:prstTxWarp>
+                        <a:noAutofit/>
+                      </wps:bodyPr>
+                    </wps:wsp>
+                  </a:graphicData>
+                </a:graphic>
+              </wp:anchor>
+            </w:drawing>
+          </mc:Choice>
+          <mc:Fallback>
+            <w:pict>
+              <v:shapetype w14:anchorId="7400F1CC" id="_x0000_t5" coordsize="21600,21600" o:spt="5" adj="10800" path="m@0,l,21600r21600,xe">
+                <v:stroke joinstyle="miter"/>
+                <v:formulas>
+                  <v:f eqn="val #0"/>
+                  <v:f eqn="prod #0 1 2"/>
+                  <v:f eqn="sum @1 10800 0"/>
+                </v:formulas>
+                <v:path gradientshapeok="t" o:connecttype="custom" o:connectlocs="@0,0;@1,10800;0,21600;10800,21600;21600,21600;@2,10800" textboxrect="0,10800,10800,18000;5400,10800,16200,18000;10800,10800,21600,18000;0,7200,7200,21600;7200,7200,14400,21600;14400,7200,21600,21600"/>
+                <v:handles>
+                  <v:h position="#0,topLeft" xrange="0,21600"/>
+                </v:handles>
+              </v:shapetype>
+              <v:shape id="Isosceles Triangle 3" o:spid="_x0000_s1026" type="#_x0000_t5" style="position:absolute;margin-left:226.75pt;margin-top:21.1pt;width:19.8pt;height:21.6pt;rotation:11610424fd;z-index:251661312;visibility:visible;mso-wrap-style:square;mso-wrap-distance-left:9pt;mso-wrap-distance-top:0;mso-wrap-distance-right:9pt;mso-wrap-distance-bottom:0;mso-position-horizontal:absolute;mso-position-horizontal-relative:text;mso-position-vertical:absolute;mso-position-vertical-relative:text;v-text-anchor:middle" o:gfxdata="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" fillcolor="white [3201]" strokecolor="#70ad47 [3209]" strokeweight="1pt"/>
+            </w:pict>
+          </mc:Fallback>
+        </mc:AlternateContent>
+      </w:r>
+      <w:r>
+        <w:rPr>
+          <w:rFonts w:ascii="Arial" w:hAnsi="Arial" w:cs="Arial"/>
+          <w:sz w:val="24"/>
+          <w:szCs w:val="24"/>
+          <w:lang w:val="en-US"/>
+        </w:rPr>
+        <w:t xml:space="preserve">                                                                      |</w:t>
+      </w:r>
+      <w:r>
+        <w:rPr>
+          <w:rFonts w:ascii="Arial" w:hAnsi="Arial" w:cs="Arial"/>
+          <w:sz w:val="24"/>
+          <w:szCs w:val="24"/>
+          <w:lang w:val="en-US"/>
+        </w:rPr>
+        <w:t xml:space="preserve"> N</w:t>
+      </w:r>
+    </w:p>
+    <w:p>
+      <w:pPr>
+        <w:tabs>
+          <w:tab w:val="left" w:pos="7212"/>
+        </w:tabs>
+        <w:rPr>
+          <w:rFonts w:ascii="Arial" w:hAnsi="Arial" w:cs="Arial"/>
+          <w:sz w:val="24"/>
+          <w:szCs w:val="24"/>
+          <w:lang w:val="en-US"/>
+        </w:rPr>
+      </w:pPr>
+      <w:r>
+        <w:rPr>
+          <w:rFonts w:ascii="Arial" w:hAnsi="Arial" w:cs="Arial"/>
+          <w:sz w:val="24"/>
+          <w:szCs w:val="24"/>
+          <w:lang w:val="en-US"/>
+        </w:rPr>
+        <w:t xml:space="preserve">                                                                      </w:t>
+      </w:r>
+    </w:p>
+    <w:p>
+      <w:pPr>
+        <w:tabs>
+          <w:tab w:val="left" w:pos="7212"/>
+        </w:tabs>
+        <w:rPr>
+          <w:rFonts w:ascii="Arial" w:hAnsi="Arial" w:cs="Arial"/>
+          <w:sz w:val="24"/>
+          <w:szCs w:val="24"/>
+          <w:lang w:val="en-US"/>
+        </w:rPr>
+      </w:pPr>
+      <w:r>
+        <w:rPr>
+          <w:rFonts w:ascii="Arial" w:hAnsi="Arial" w:cs="Arial"/>
+          <w:noProof/>
+          <w:sz w:val="24"/>
+          <w:szCs w:val="24"/>
+          <w:lang w:val="en-US"/>
+        </w:rPr>
+        <mc:AlternateContent>
+          <mc:Choice Requires="wps">
+            <w:drawing>
+              <wp:anchor distT="0" distB="0" distL="114300" distR="114300" simplePos="0" relativeHeight="251662336" behindDoc="0" locked="0" layoutInCell="1" allowOverlap="1" wp14:anchorId="39677FDA" wp14:editId="1ADA72B3">
+                <wp:simplePos x="0" y="0"/>
+                <wp:positionH relativeFrom="column">
+                  <wp:posOffset>1614805</wp:posOffset>
+                </wp:positionH>
+                <wp:positionV relativeFrom="paragraph">
+                  <wp:posOffset>288290</wp:posOffset>
+                </wp:positionV>
+                <wp:extent cx="2819400" cy="2103120"/>
+                <wp:effectExtent l="0" t="0" r="19050" b="11430"/>
+                <wp:wrapNone/>
+                <wp:docPr id="540973346" name="Rectangle 4"/>
+                <wp:cNvGraphicFramePr/>
+                <a:graphic xmlns:a="http://schemas.openxmlformats.org/drawingml/2006/main">
+                  <a:graphicData uri="http://schemas.microsoft.com/office/word/2010/wordprocessingShape">
+                    <wps:wsp>
+                      <wps:cNvSpPr/>
+                      <wps:spPr>
+                        <a:xfrm>
+                          <a:off x="0" y="0"/>
+                          <a:ext cx="2819400" cy="2103120"/>
+                        </a:xfrm>
+                        <a:prstGeom prst="rect">
+                          <a:avLst/>
+                        </a:prstGeom>
+                      </wps:spPr>
+                      <wps:style>
+                        <a:lnRef idx="2">
+                          <a:schemeClr val="accent6"/>
+                        </a:lnRef>
+                        <a:fillRef idx="1">
+                          <a:schemeClr val="lt1"/>
+                        </a:fillRef>
+                        <a:effectRef idx="0">
+                          <a:schemeClr val="accent6"/>
+                        </a:effectRef>
+                        <a:fontRef idx="minor">
+                          <a:schemeClr val="dk1"/>
+                        </a:fontRef>
+                      </wps:style>
+                      <wps:txbx>
+                        <w:txbxContent>
+                          <w:p>
+                            <w:pPr>
+                              <w:jc w:val="center"/>
+                              <w:rPr>
+                                <w:lang w:val="en-US"/>
+                              </w:rPr>
+                            </w:pPr>
+                            <w:r>
+                              <w:rPr>
+                                <w:lang w:val="en-US"/>
+                              </w:rPr>
+                              <w:t>Course</w:t>
+                            </w:r>
+                          </w:p>
+                          <w:p>
+                            <w:pPr>
+                              <w:rPr>
+                                <w:lang w:val="en-US"/>
+                              </w:rPr>
+                            </w:pPr>
+                            <w:r>
+                              <w:rPr>
+                                <w:lang w:val="en-US"/>
+                              </w:rPr>
+                              <w:t>PK Id</w:t>
+                            </w:r>
+                          </w:p>
+                          <w:p>
+                            <w:pPr>
+                              <w:rPr>
+                                <w:lang w:val="en-US"/>
+                              </w:rPr>
+                            </w:pPr>
+                            <w:r>
+                              <w:rPr>
+                                <w:lang w:val="en-US"/>
+                              </w:rPr>
+                              <w:t xml:space="preserve">       Code</w:t>
+                            </w:r>
+                          </w:p>
+                          <w:p>
+                            <w:pPr>
+                              <w:rPr>
+                                <w:lang w:val="en-US"/>
+                              </w:rPr>
+                            </w:pPr>
+                            <w:r>
+                              <w:rPr>
+                                <w:lang w:val="en-US"/>
+                              </w:rPr>
+                              <w:t xml:space="preserve">        Name</w:t>
+                            </w:r>
+                          </w:p>
+                          <w:p>
+                            <w:pPr>
+                              <w:rPr>
+                                <w:lang w:val="en-US"/>
+                              </w:rPr>
+                            </w:pPr>
+                            <w:r>
+                              <w:rPr>
+                                <w:lang w:val="en-US"/>
+                              </w:rPr>
+                              <w:t xml:space="preserve">        </w:t>
+                            </w:r>
+                            <w:r>
+                              <w:rPr>
+                                <w:lang w:val="en-US"/>
+                              </w:rPr>
+                              <w:t>Credits</w:t>
+                            </w:r>
+                          </w:p>
+                          <w:p>
+                            <w:pPr>
+                              <w:rPr>
+                                <w:lang w:val="en-US"/>
+                              </w:rPr>
+                            </w:pPr>
+                            <w:r>
+                              <w:rPr>
+                                <w:lang w:val="en-US"/>
+                              </w:rPr>
+                              <w:t xml:space="preserve">        Grade</w:t>
+                            </w:r>
+                          </w:p>
+                          <w:p>
+                            <w:pPr>
+                              <w:rPr>
+                                <w:lang w:val="en-US"/>
+                              </w:rPr>
+                            </w:pPr>
+                            <w:r>
+                              <w:rPr>
+                                <w:lang w:val="en-US"/>
+                              </w:rPr>
+                              <w:t>FK</w:t>
+                            </w:r>
+                            <w:r>
+                              <w:rPr>
+                                <w:lang w:val="en-US"/>
+                              </w:rPr>
+                              <w:t xml:space="preserve">   SemesterId</w:t>
+                            </w:r>
+                          </w:p>
+                        </w:txbxContent>
+                      </wps:txbx>
+                      <wps:bodyPr rot="0" spcFirstLastPara="0" vertOverflow="overflow" horzOverflow="overflow" vert="horz" wrap="square" lIns="91440" tIns="45720" rIns="91440" bIns="45720" numCol="1" spcCol="0" rtlCol="0" fromWordArt="0" anchor="ctr" anchorCtr="0" forceAA="0" compatLnSpc="1">
+                        <a:prstTxWarp prst="textNoShape">
+                          <a:avLst/>
+                        </a:prstTxWarp>
+                        <a:noAutofit/>
+                      </wps:bodyPr>
+                    </wps:wsp>
+                  </a:graphicData>
+                </a:graphic>
+                <wp14:sizeRelH relativeFrom="margin">
+                  <wp14:pctWidth>0</wp14:pctWidth>
+                </wp14:sizeRelH>
+                <wp14:sizeRelV relativeFrom="margin">
+                  <wp14:pctHeight>0</wp14:pctHeight>
+                </wp14:sizeRelV>
+              </wp:anchor>
+            </w:drawing>
+          </mc:Choice>
+          <mc:Fallback>
+            <w:pict>
+              <v:rect w14:anchorId="39677FDA" id="Rectangle 4" o:spid="_x0000_s1027" style="position:absolute;margin-left:127.15pt;margin-top:22.7pt;width:222pt;height:165.6pt;z-index:251662336;visibility:visible;mso-wrap-style:square;mso-width-percent:0;mso-height-percent:0;mso-wrap-distance-left:9pt;mso-wrap-distance-top:0;mso-wrap-distance-right:9pt;mso-wrap-distance-bottom:0;mso-position-horizontal:absolute;mso-position-horizontal-relative:text;mso-position-vertical:absolute;mso-position-vertical-relative:text;mso-width-percent:0;mso-height-percent:0;mso-width-relative:margin;mso-height-relative:margin;v-text-anchor:middle" o:gfxdata="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" fillcolor="white [3201]" strokecolor="#70ad47 [3209]" strokeweight="1pt">
+                <v:textbox>
+                  <w:txbxContent>
+                    <w:p>
+                      <w:pPr>
+                        <w:jc w:val="center"/>
+                        <w:rPr>
+                          <w:lang w:val="en-US"/>
+                        </w:rPr>
+                      </w:pPr>
+                      <w:r>
+                        <w:rPr>
+                          <w:lang w:val="en-US"/>
+                        </w:rPr>
+                        <w:t>Course</w:t>
+                      </w:r>
+                    </w:p>
+                    <w:p>
+                      <w:pPr>
+                        <w:rPr>
+                          <w:lang w:val="en-US"/>
+                        </w:rPr>
+                      </w:pPr>
+                      <w:r>
+                        <w:rPr>
+                          <w:lang w:val="en-US"/>
+                        </w:rPr>
+                        <w:t>PK Id</w:t>
+                      </w:r>
+                    </w:p>
+                    <w:p>
+                      <w:pPr>
+                        <w:rPr>
+                          <w:lang w:val="en-US"/>
+                        </w:rPr>
+                      </w:pPr>
+                      <w:r>
+                        <w:rPr>
+                          <w:lang w:val="en-US"/>
+                        </w:rPr>
+                        <w:t xml:space="preserve">       Code</w:t>
+                      </w:r>
+                    </w:p>
+                    <w:p>
+                      <w:pPr>
+                        <w:rPr>
+                          <w:lang w:val="en-US"/>
+                        </w:rPr>
+                      </w:pPr>
+                      <w:r>
+                        <w:rPr>
+                          <w:lang w:val="en-US"/>
+                        </w:rPr>
+                        <w:t xml:space="preserve">        Name</w:t>
+                      </w:r>
+                    </w:p>
+                    <w:p>
+                      <w:pPr>
+                        <w:rPr>
+                          <w:lang w:val="en-US"/>
+                        </w:rPr>
+                      </w:pPr>
+                      <w:r>
+                        <w:rPr>
+                          <w:lang w:val="en-US"/>
+                        </w:rPr>
+                        <w:t xml:space="preserve">        </w:t>
+                      </w:r>
+                      <w:r>
+                        <w:rPr>
+                          <w:lang w:val="en-US"/>
+                        </w:rPr>
+                        <w:t>Credits</w:t>
+                      </w:r>
+                    </w:p>
+                    <w:p>
+                      <w:pPr>
+                        <w:rPr>
+                          <w:lang w:val="en-US"/>
+                        </w:rPr>
+                      </w:pPr>
+                      <w:r>
+                        <w:rPr>
+                          <w:lang w:val="en-US"/>
+                        </w:rPr>
+                        <w:t xml:space="preserve">        Grade</w:t>
+                      </w:r>
+                    </w:p>
+                    <w:p>
+                      <w:pPr>
+                        <w:rPr>
+                          <w:lang w:val="en-US"/>
+                        </w:rPr>
+                      </w:pPr>
+                      <w:r>
+                        <w:rPr>
+                          <w:lang w:val="en-US"/>
+                        </w:rPr>
+                        <w:t>FK</w:t>
+                      </w:r>
+                      <w:r>
+                        <w:rPr>
+                          <w:lang w:val="en-US"/>
+                        </w:rPr>
+                        <w:t xml:space="preserve">   SemesterId</w:t>
+                      </w:r>
+                    </w:p>
+                  </w:txbxContent>
+                </v:textbox>
+              </v:rect>
+            </w:pict>
+          </mc:Fallback>
+        </mc:AlternateContent>
+      </w:r>
+    </w:p>
+    <w:p>
+      <w:pPr>
+        <w:tabs>
+          <w:tab w:val="left" w:pos="7212"/>
+        </w:tabs>
+        <w:rPr>
+          <w:rFonts w:ascii="Arial" w:hAnsi="Arial" w:cs="Arial"/>
+          <w:sz w:val="24"/>
+          <w:szCs w:val="24"/>
+          <w:lang w:val="en-US"/>
+        </w:rPr>
+      </w:pPr>
+      <w:r>
+        <w:rPr>
+          <w:rFonts w:ascii="Arial" w:hAnsi="Arial" w:cs="Arial"/>
+          <w:noProof/>
+          <w:sz w:val="24"/>
+          <w:szCs w:val="24"/>
+        </w:rPr>
+        <mc:AlternateContent>
+          <mc:Choice Requires="wps">
+            <w:drawing>
+              <wp:anchor distT="0" distB="0" distL="114300" distR="114300" simplePos="0" relativeHeight="251664384" behindDoc="0" locked="0" layoutInCell="1" allowOverlap="1" wp14:anchorId="2CE15A97" wp14:editId="68D203FA">
+                <wp:simplePos x="0" y="0"/>
+                <wp:positionH relativeFrom="margin">
+                  <wp:posOffset>1607185</wp:posOffset>
+                </wp:positionH>
+                <wp:positionV relativeFrom="paragraph">
+                  <wp:posOffset>218440</wp:posOffset>
+                </wp:positionV>
+                <wp:extent cx="2834640" cy="15240"/>
+                <wp:effectExtent l="0" t="0" r="22860" b="22860"/>
+                <wp:wrapNone/>
+                <wp:docPr id="685609476" name="Straight Connector 2"/>
+                <wp:cNvGraphicFramePr/>
+                <a:graphic xmlns:a="http://schemas.openxmlformats.org/drawingml/2006/main">
+                  <a:graphicData uri="http://schemas.microsoft.com/office/word/2010/wordprocessingShape">
+                    <wps:wsp>
+                      <wps:cNvCnPr/>
+                      <wps:spPr>
+                        <a:xfrm flipV="1">
+                          <a:off x="0" y="0"/>
+                          <a:ext cx="2834640" cy="15240"/>
+                        </a:xfrm>
+                        <a:prstGeom prst="line">
+                          <a:avLst/>
+                        </a:prstGeom>
+                      </wps:spPr>
+                      <wps:style>
+                        <a:lnRef idx="1">
+                          <a:schemeClr val="dk1"/>
+                        </a:lnRef>
+                        <a:fillRef idx="0">
+                          <a:schemeClr val="dk1"/>
+                        </a:fillRef>
+                        <a:effectRef idx="0">
+                          <a:schemeClr val="dk1"/>
+                        </a:effectRef>
+                        <a:fontRef idx="minor">
+                          <a:schemeClr val="tx1"/>
+                        </a:fontRef>
+                      </wps:style>
+                      <wps:bodyPr/>
+                    </wps:wsp>
+                  </a:graphicData>
+                </a:graphic>
+                <wp14:sizeRelH relativeFrom="margin">
+                  <wp14:pctWidth>0</wp14:pctWidth>
+                </wp14:sizeRelH>
+                <wp14:sizeRelV relativeFrom="margin">
+                  <wp14:pctHeight>0</wp14:pctHeight>
+                </wp14:sizeRelV>
+              </wp:anchor>
+            </w:drawing>
+          </mc:Choice>
+          <mc:Fallback>
+            <w:pict>
+              <v:line w14:anchorId="5ABDB3D8" id="Straight Connector 2" o:spid="_x0000_s1026" style="position:absolute;flip:y;z-index:251664384;visibility:visible;mso-wrap-style:square;mso-width-percent:0;mso-height-percent:0;mso-wrap-distance-left:9pt;mso-wrap-distance-top:0;mso-wrap-distance-right:9pt;mso-wrap-distance-bottom:0;mso-position-horizontal:absolute;mso-position-horizontal-relative:margin;mso-position-vertical:absolute;mso-position-vertical-relative:text;mso-width-percent:0;mso-height-percent:0;mso-width-relative:margin;mso-height-relative:margin" from="126.55pt,17.2pt" to="349.75pt,18.4pt" o:gfxdata="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" strokecolor="black [3200]" strokeweight=".5pt">
+                <v:stroke joinstyle="miter"/>
+                <w10:wrap anchorx="margin"/>
+              </v:line>
+            </w:pict>
+          </mc:Fallback>
+        </mc:AlternateContent>
+      </w:r>
+    </w:p>
+    <w:p>
+      <w:pPr>
+        <w:rPr>
+          <w:rFonts w:ascii="Arial" w:hAnsi="Arial" w:cs="Arial"/>
+          <w:sz w:val="24"/>
+          <w:szCs w:val="24"/>
+          <w:lang w:val="en-US"/>
+        </w:rPr>
+      </w:pPr>
+    </w:p>
+    <w:p>
+      <w:pPr>
+        <w:rPr>
+          <w:rFonts w:ascii="Arial" w:hAnsi="Arial" w:cs="Arial"/>
+          <w:sz w:val="24"/>
+          <w:szCs w:val="24"/>
+          <w:lang w:val="en-US"/>
+        </w:rPr>
+      </w:pPr>
+    </w:p>
+    <w:p>
+      <w:pPr>
+        <w:rPr>
+          <w:rFonts w:ascii="Arial" w:hAnsi="Arial" w:cs="Arial"/>
+          <w:sz w:val="24"/>
+          <w:szCs w:val="24"/>
+          <w:lang w:val="en-US"/>
+        </w:rPr>
+      </w:pPr>
+    </w:p>
+    <w:p>
+      <w:pPr>
+        <w:rPr>
+          <w:rFonts w:ascii="Arial" w:hAnsi="Arial" w:cs="Arial"/>
+          <w:sz w:val="24"/>
+          <w:szCs w:val="24"/>
+          <w:lang w:val="en-US"/>
+        </w:rPr>
+      </w:pPr>
+    </w:p>
+    <w:p>
+      <w:pPr>
+        <w:rPr>
+          <w:rFonts w:ascii="Arial" w:hAnsi="Arial" w:cs="Arial"/>
+          <w:sz w:val="24"/>
+          <w:szCs w:val="24"/>
+          <w:lang w:val="en-US"/>
+        </w:rPr>
+      </w:pPr>
+    </w:p>
+    <w:p>
+      <w:pPr>
+        <w:keepNext/>
+        <w:tabs>
+          <w:tab w:val="left" w:pos="7464"/>
+        </w:tabs>
+        <w:rPr>
+          <w:rFonts w:ascii="Arial" w:hAnsi="Arial" w:cs="Arial"/>
+          <w:sz w:val="24"/>
+          <w:szCs w:val="24"/>
+          <w:lang w:val="en-US"/>
+        </w:rPr>
+      </w:pPr>
+      <w:r>
+        <w:rPr>
+          <w:rFonts w:ascii="Arial" w:hAnsi="Arial" w:cs="Arial"/>
+          <w:sz w:val="24"/>
+          <w:szCs w:val="24"/>
+          <w:lang w:val="en-US"/>
+        </w:rPr>
+        <w:tab/>
+      </w:r>
+    </w:p>
+    <w:p>
+      <w:pPr>
+        <w:pStyle w:val="Caption"/>
+        <w:rPr>
+          <w:lang w:val="en-US"/>
+        </w:rPr>
+      </w:pPr>
+    </w:p>
+    <w:p>
+      <w:pPr>
+        <w:pStyle w:val="Caption"/>
+        <w:rPr>
+          <w:lang w:val="en-US"/>
+        </w:rPr>
+      </w:pPr>
+      <w:r>
+        <w:t xml:space="preserve">Figure </w:t>
+      </w:r>
+      <w:fldSimple w:instr=" SEQ Figure \* ARABIC ">
+        <w:r>
+          <w:rPr>
+            <w:noProof/>
+          </w:rPr>
+          <w:t>2</w:t>
+        </w:r>
+      </w:fldSimple>
+      <w:r>
+        <w:rPr>
+          <w:lang w:val="en-US"/>
+        </w:rPr>
+        <w:t>. E-R Diagram of the AUBG Academic Progress Tracker Database</w:t>
       </w:r>
     </w:p>
     <w:sectPr>

</xml_diff>

<commit_message>
Keep working on the thesis.
</commit_message>
<xml_diff>
--- a/Project Thesis.docx
+++ b/Project Thesis.docx
@@ -15256,6 +15256,862 @@
           <w:lang w:val="en-US"/>
         </w:rPr>
         <w:t>.</w:t>
+      </w:r>
+    </w:p>
+    <w:p>
+      <w:pPr>
+        <w:rPr>
+          <w:lang w:val="en-US"/>
+        </w:rPr>
+      </w:pPr>
+    </w:p>
+    <w:p>
+      <w:pPr>
+        <w:rPr>
+          <w:lang w:val="en-US"/>
+        </w:rPr>
+      </w:pPr>
+      <w:r>
+        <w:rPr>
+          <w:lang w:val="en-US"/>
+        </w:rPr>
+        <w:t>By placing these algorithms</w:t>
+      </w:r>
+      <w:r>
+        <w:rPr>
+          <w:lang w:val="en-US"/>
+        </w:rPr>
+        <w:t xml:space="preserve"> in service</w:t>
+      </w:r>
+      <w:r>
+        <w:rPr>
+          <w:lang w:val="en-US"/>
+        </w:rPr>
+        <w:t xml:space="preserve"> classes</w:t>
+      </w:r>
+      <w:r>
+        <w:rPr>
+          <w:lang w:val="en-US"/>
+        </w:rPr>
+        <w:t xml:space="preserve"> rather than directly</w:t>
+      </w:r>
+      <w:r>
+        <w:rPr>
+          <w:lang w:val="en-US"/>
+        </w:rPr>
+        <w:t xml:space="preserve"> inside the Razor pages</w:t>
+      </w:r>
+      <w:r>
+        <w:rPr>
+          <w:lang w:val="en-US"/>
+        </w:rPr>
+        <w:t>,</w:t>
+      </w:r>
+      <w:r>
+        <w:rPr>
+          <w:lang w:val="en-US"/>
+        </w:rPr>
+        <w:t xml:space="preserve"> the design follows</w:t>
+      </w:r>
+      <w:r>
+        <w:rPr>
+          <w:lang w:val="en-US"/>
+        </w:rPr>
+        <w:t xml:space="preserve"> the principle of</w:t>
+      </w:r>
+      <w:r>
+        <w:rPr>
+          <w:lang w:val="en-US"/>
+        </w:rPr>
+        <w:t xml:space="preserve"> separation of concerns</w:t>
+      </w:r>
+      <w:r>
+        <w:rPr>
+          <w:lang w:val="en-US"/>
+        </w:rPr>
+        <w:t>.</w:t>
+      </w:r>
+      <w:r>
+        <w:rPr>
+          <w:lang w:val="en-US"/>
+        </w:rPr>
+        <w:t xml:space="preserve"> Razor components</w:t>
+      </w:r>
+      <w:r>
+        <w:rPr>
+          <w:lang w:val="en-US"/>
+        </w:rPr>
+        <w:t xml:space="preserve"> are primarily</w:t>
+      </w:r>
+      <w:r>
+        <w:rPr>
+          <w:lang w:val="en-US"/>
+        </w:rPr>
+        <w:t xml:space="preserve"> responsible for</w:t>
+      </w:r>
+      <w:r>
+        <w:rPr>
+          <w:lang w:val="en-US"/>
+        </w:rPr>
+        <w:t xml:space="preserve"> accepting user input</w:t>
+      </w:r>
+      <w:r>
+        <w:rPr>
+          <w:lang w:val="en-US"/>
+        </w:rPr>
+        <w:t xml:space="preserve"> and presenting information</w:t>
+      </w:r>
+      <w:r>
+        <w:rPr>
+          <w:lang w:val="en-US"/>
+        </w:rPr>
+        <w:t>, while the service layer</w:t>
+      </w:r>
+      <w:r>
+        <w:rPr>
+          <w:lang w:val="en-US"/>
+        </w:rPr>
+        <w:t xml:space="preserve"> is responsible for</w:t>
+      </w:r>
+      <w:r>
+        <w:rPr>
+          <w:lang w:val="en-US"/>
+        </w:rPr>
+        <w:t xml:space="preserve"> calculations and application rules.</w:t>
+      </w:r>
+    </w:p>
+    <w:p>
+      <w:pPr>
+        <w:rPr>
+          <w:lang w:val="en-US"/>
+        </w:rPr>
+      </w:pPr>
+    </w:p>
+    <w:p>
+      <w:pPr>
+        <w:pStyle w:val="ListParagraph"/>
+        <w:numPr>
+          <w:ilvl w:val="1"/>
+          <w:numId w:val="1"/>
+        </w:numPr>
+        <w:rPr>
+          <w:lang w:val="en-US"/>
+        </w:rPr>
+      </w:pPr>
+      <w:r>
+        <w:rPr>
+          <w:lang w:val="en-US"/>
+        </w:rPr>
+        <w:lastRenderedPageBreak/>
+        <w:t>User Interface Design</w:t>
+      </w:r>
+    </w:p>
+    <w:p>
+      <w:pPr>
+        <w:rPr>
+          <w:lang w:val="en-US"/>
+        </w:rPr>
+      </w:pPr>
+    </w:p>
+    <w:p>
+      <w:pPr>
+        <w:rPr>
+          <w:lang w:val="en-US"/>
+        </w:rPr>
+      </w:pPr>
+      <w:r>
+        <w:rPr>
+          <w:lang w:val="en-US"/>
+        </w:rPr>
+        <w:t>The user interface of the AUBG</w:t>
+      </w:r>
+      <w:r>
+        <w:rPr>
+          <w:lang w:val="en-US"/>
+        </w:rPr>
+        <w:t xml:space="preserve"> Academic Progress Tracker</w:t>
+      </w:r>
+      <w:r>
+        <w:rPr>
+          <w:lang w:val="en-US"/>
+        </w:rPr>
+        <w:t xml:space="preserve"> is implemented using</w:t>
+      </w:r>
+      <w:r>
+        <w:rPr>
+          <w:lang w:val="en-US"/>
+        </w:rPr>
+        <w:t xml:space="preserve"> Blazor Razor components</w:t>
+      </w:r>
+      <w:r>
+        <w:rPr>
+          <w:lang w:val="en-US"/>
+        </w:rPr>
+        <w:t>.</w:t>
+      </w:r>
+      <w:r>
+        <w:rPr>
+          <w:lang w:val="en-US"/>
+        </w:rPr>
+        <w:t xml:space="preserve"> The interface</w:t>
+      </w:r>
+      <w:r>
+        <w:rPr>
+          <w:lang w:val="en-US"/>
+        </w:rPr>
+        <w:t xml:space="preserve"> is designed to provide</w:t>
+      </w:r>
+      <w:r>
+        <w:rPr>
+          <w:lang w:val="en-US"/>
+        </w:rPr>
+        <w:t xml:space="preserve"> direct access to</w:t>
+      </w:r>
+      <w:r>
+        <w:rPr>
+          <w:lang w:val="en-US"/>
+        </w:rPr>
+        <w:t xml:space="preserve"> the most important academic</w:t>
+      </w:r>
+      <w:r>
+        <w:rPr>
+          <w:lang w:val="en-US"/>
+        </w:rPr>
+        <w:t xml:space="preserve"> information</w:t>
+      </w:r>
+      <w:r>
+        <w:rPr>
+          <w:lang w:val="en-US"/>
+        </w:rPr>
+        <w:t xml:space="preserve"> while keeping</w:t>
+      </w:r>
+      <w:r>
+        <w:rPr>
+          <w:lang w:val="en-US"/>
+        </w:rPr>
+        <w:t xml:space="preserve"> data-entry operations simple</w:t>
+      </w:r>
+      <w:r>
+        <w:rPr>
+          <w:lang w:val="en-US"/>
+        </w:rPr>
+        <w:t>.</w:t>
+      </w:r>
+    </w:p>
+    <w:p>
+      <w:pPr>
+        <w:rPr>
+          <w:lang w:val="en-US"/>
+        </w:rPr>
+      </w:pPr>
+    </w:p>
+    <w:p>
+      <w:pPr>
+        <w:rPr>
+          <w:lang w:val="en-US"/>
+        </w:rPr>
+      </w:pPr>
+      <w:r>
+        <w:rPr>
+          <w:lang w:val="en-US"/>
+        </w:rPr>
+        <w:t>The Dashboard serves</w:t>
+      </w:r>
+      <w:r>
+        <w:rPr>
+          <w:lang w:val="en-US"/>
+        </w:rPr>
+        <w:t xml:space="preserve"> as the main</w:t>
+      </w:r>
+      <w:r>
+        <w:rPr>
+          <w:lang w:val="en-US"/>
+        </w:rPr>
+        <w:t xml:space="preserve"> entry point</w:t>
+      </w:r>
+      <w:r>
+        <w:rPr>
+          <w:lang w:val="en-US"/>
+        </w:rPr>
+        <w:t xml:space="preserve"> of the program.</w:t>
+      </w:r>
+      <w:r>
+        <w:rPr>
+          <w:lang w:val="en-US"/>
+        </w:rPr>
+        <w:t xml:space="preserve"> It is designed to</w:t>
+      </w:r>
+      <w:r>
+        <w:rPr>
+          <w:lang w:val="en-US"/>
+        </w:rPr>
+        <w:t xml:space="preserve"> provide a summary</w:t>
+      </w:r>
+      <w:r>
+        <w:rPr>
+          <w:lang w:val="en-US"/>
+        </w:rPr>
+        <w:t xml:space="preserve"> of the</w:t>
+      </w:r>
+      <w:r>
+        <w:rPr>
+          <w:lang w:val="en-US"/>
+        </w:rPr>
+        <w:t xml:space="preserve"> student’s academic status</w:t>
+      </w:r>
+      <w:r>
+        <w:rPr>
+          <w:lang w:val="en-US"/>
+        </w:rPr>
+        <w:t>, including</w:t>
+      </w:r>
+      <w:r>
+        <w:rPr>
+          <w:lang w:val="en-US"/>
+        </w:rPr>
+        <w:t xml:space="preserve"> the cumulative GPA</w:t>
+      </w:r>
+      <w:r>
+        <w:rPr>
+          <w:lang w:val="en-US"/>
+        </w:rPr>
+        <w:t>, earned credits</w:t>
+      </w:r>
+      <w:r>
+        <w:rPr>
+          <w:lang w:val="en-US"/>
+        </w:rPr>
+        <w:t>, attempted credits</w:t>
+      </w:r>
+      <w:r>
+        <w:rPr>
+          <w:lang w:val="en-US"/>
+        </w:rPr>
+        <w:t>, and number of</w:t>
+      </w:r>
+      <w:r>
+        <w:rPr>
+          <w:lang w:val="en-US"/>
+        </w:rPr>
+        <w:t xml:space="preserve"> completed courses.</w:t>
+      </w:r>
+      <w:r>
+        <w:rPr>
+          <w:lang w:val="en-US"/>
+        </w:rPr>
+        <w:t xml:space="preserve"> Navigation links </w:t>
+      </w:r>
+      <w:r>
+        <w:rPr>
+          <w:lang w:val="en-US"/>
+        </w:rPr>
+        <w:t xml:space="preserve">allow the user </w:t>
+      </w:r>
+      <w:r>
+        <w:rPr>
+          <w:lang w:val="en-US"/>
+        </w:rPr>
+        <w:t>to</w:t>
+      </w:r>
+      <w:r>
+        <w:rPr>
+          <w:lang w:val="en-US"/>
+        </w:rPr>
+        <w:t xml:space="preserve"> move from</w:t>
+      </w:r>
+      <w:r>
+        <w:rPr>
+          <w:lang w:val="en-US"/>
+        </w:rPr>
+        <w:t xml:space="preserve"> the Dashboard to</w:t>
+      </w:r>
+      <w:r>
+        <w:rPr>
+          <w:lang w:val="en-US"/>
+        </w:rPr>
+        <w:t xml:space="preserve"> more detailed sections</w:t>
+      </w:r>
+      <w:r>
+        <w:rPr>
+          <w:lang w:val="en-US"/>
+        </w:rPr>
+        <w:t xml:space="preserve"> of the program.</w:t>
+      </w:r>
+    </w:p>
+    <w:p>
+      <w:pPr>
+        <w:rPr>
+          <w:lang w:val="en-US"/>
+        </w:rPr>
+      </w:pPr>
+    </w:p>
+    <w:p>
+      <w:pPr>
+        <w:rPr>
+          <w:lang w:val="en-US"/>
+        </w:rPr>
+      </w:pPr>
+      <w:r>
+        <w:rPr>
+          <w:lang w:val="en-US"/>
+        </w:rPr>
+        <w:t>The Courses page presents</w:t>
+      </w:r>
+      <w:r>
+        <w:rPr>
+          <w:lang w:val="en-US"/>
+        </w:rPr>
+        <w:t xml:space="preserve"> the stored courses</w:t>
+      </w:r>
+      <w:r>
+        <w:rPr>
+          <w:lang w:val="en-US"/>
+        </w:rPr>
+        <w:t xml:space="preserve"> in a tabular format.</w:t>
+      </w:r>
+      <w:r>
+        <w:rPr>
+          <w:lang w:val="en-US"/>
+        </w:rPr>
+        <w:t xml:space="preserve"> Each row represents</w:t>
+      </w:r>
+      <w:r>
+        <w:rPr>
+          <w:lang w:val="en-US"/>
+        </w:rPr>
+        <w:t xml:space="preserve"> one course and</w:t>
+      </w:r>
+      <w:r>
+        <w:rPr>
+          <w:lang w:val="en-US"/>
+        </w:rPr>
+        <w:t xml:space="preserve"> displays information</w:t>
+      </w:r>
+      <w:r>
+        <w:rPr>
+          <w:lang w:val="en-US"/>
+        </w:rPr>
+        <w:t xml:space="preserve"> such as the course code</w:t>
+      </w:r>
+      <w:r>
+        <w:rPr>
+          <w:lang w:val="en-US"/>
+        </w:rPr>
+        <w:t>, course name</w:t>
+      </w:r>
+      <w:r>
+        <w:rPr>
+          <w:lang w:val="en-US"/>
+        </w:rPr>
+        <w:t>, credits, grade</w:t>
+      </w:r>
+      <w:r>
+        <w:rPr>
+          <w:lang w:val="en-US"/>
+        </w:rPr>
+        <w:t>, and semester.</w:t>
+      </w:r>
+      <w:r>
+        <w:rPr>
+          <w:lang w:val="en-US"/>
+        </w:rPr>
+        <w:t xml:space="preserve"> Actions for editing</w:t>
+      </w:r>
+      <w:r>
+        <w:rPr>
+          <w:lang w:val="en-US"/>
+        </w:rPr>
+        <w:t xml:space="preserve"> and deleting</w:t>
+      </w:r>
+      <w:r>
+        <w:rPr>
+          <w:lang w:val="en-US"/>
+        </w:rPr>
+        <w:t xml:space="preserve"> individual records</w:t>
+      </w:r>
+      <w:r>
+        <w:rPr>
+          <w:lang w:val="en-US"/>
+        </w:rPr>
+        <w:t xml:space="preserve"> are also</w:t>
+      </w:r>
+      <w:r>
+        <w:rPr>
+          <w:lang w:val="en-US"/>
+        </w:rPr>
+        <w:t xml:space="preserve"> provided.</w:t>
+      </w:r>
+      <w:r>
+        <w:rPr>
+          <w:lang w:val="en-US"/>
+        </w:rPr>
+        <w:t xml:space="preserve"> This design allows</w:t>
+      </w:r>
+      <w:r>
+        <w:rPr>
+          <w:lang w:val="en-US"/>
+        </w:rPr>
+        <w:t xml:space="preserve"> </w:t>
+      </w:r>
+      <w:r>
+        <w:rPr>
+          <w:lang w:val="en-US"/>
+        </w:rPr>
+        <w:t>the user</w:t>
+      </w:r>
+      <w:r>
+        <w:rPr>
+          <w:lang w:val="en-US"/>
+        </w:rPr>
+        <w:t xml:space="preserve"> to review</w:t>
+      </w:r>
+      <w:r>
+        <w:rPr>
+          <w:lang w:val="en-US"/>
+        </w:rPr>
+        <w:t xml:space="preserve"> the academic record</w:t>
+      </w:r>
+      <w:r>
+        <w:rPr>
+          <w:lang w:val="en-US"/>
+        </w:rPr>
+        <w:t xml:space="preserve"> without</w:t>
+      </w:r>
+      <w:r>
+        <w:rPr>
+          <w:lang w:val="en-US"/>
+        </w:rPr>
+        <w:t xml:space="preserve"> opening every</w:t>
+      </w:r>
+      <w:r>
+        <w:rPr>
+          <w:lang w:val="en-US"/>
+        </w:rPr>
+        <w:t xml:space="preserve"> course separately.</w:t>
+      </w:r>
+    </w:p>
+    <w:p>
+      <w:pPr>
+        <w:rPr>
+          <w:lang w:val="en-US"/>
+        </w:rPr>
+      </w:pPr>
+    </w:p>
+    <w:p>
+      <w:pPr>
+        <w:rPr>
+          <w:lang w:val="en-US"/>
+        </w:rPr>
+      </w:pPr>
+      <w:r>
+        <w:rPr>
+          <w:lang w:val="en-US"/>
+        </w:rPr>
+        <w:t>Adding and editing</w:t>
+      </w:r>
+      <w:r>
+        <w:rPr>
+          <w:lang w:val="en-US"/>
+        </w:rPr>
+        <w:t xml:space="preserve"> courses</w:t>
+      </w:r>
+      <w:r>
+        <w:rPr>
+          <w:lang w:val="en-US"/>
+        </w:rPr>
+        <w:t xml:space="preserve"> is performed through</w:t>
+      </w:r>
+      <w:r>
+        <w:rPr>
+          <w:lang w:val="en-US"/>
+        </w:rPr>
+        <w:t xml:space="preserve"> dedicated forms.</w:t>
+      </w:r>
+      <w:r>
+        <w:rPr>
+          <w:lang w:val="en-US"/>
+        </w:rPr>
+        <w:t xml:space="preserve"> The forms use Blazor</w:t>
+      </w:r>
+      <w:r>
+        <w:rPr>
+          <w:lang w:val="en-US"/>
+        </w:rPr>
+        <w:t xml:space="preserve"> input</w:t>
+      </w:r>
+      <w:r>
+        <w:rPr>
+          <w:lang w:val="en-US"/>
+        </w:rPr>
+        <w:t xml:space="preserve"> components</w:t>
+      </w:r>
+      <w:r>
+        <w:rPr>
+          <w:lang w:val="en-US"/>
+        </w:rPr>
+        <w:t xml:space="preserve"> together with</w:t>
+      </w:r>
+      <w:r>
+        <w:rPr>
+          <w:lang w:val="en-US"/>
+        </w:rPr>
+        <w:t xml:space="preserve"> data-annotation validation</w:t>
+      </w:r>
+      <w:r>
+        <w:rPr>
+          <w:lang w:val="en-US"/>
+        </w:rPr>
+        <w:t>.</w:t>
+      </w:r>
+      <w:r>
+        <w:rPr>
+          <w:lang w:val="en-US"/>
+        </w:rPr>
+        <w:t xml:space="preserve"> Fields such as course code</w:t>
+      </w:r>
+      <w:r>
+        <w:rPr>
+          <w:lang w:val="en-US"/>
+        </w:rPr>
+        <w:t xml:space="preserve"> and course name</w:t>
+      </w:r>
+      <w:r>
+        <w:rPr>
+          <w:lang w:val="en-US"/>
+        </w:rPr>
+        <w:t xml:space="preserve"> are required</w:t>
+      </w:r>
+      <w:r>
+        <w:rPr>
+          <w:lang w:val="en-US"/>
+        </w:rPr>
+        <w:t>, while</w:t>
+      </w:r>
+      <w:r>
+        <w:rPr>
+          <w:lang w:val="en-US"/>
+        </w:rPr>
+        <w:t xml:space="preserve"> the number of credits</w:t>
+      </w:r>
+      <w:r>
+        <w:rPr>
+          <w:lang w:val="en-US"/>
+        </w:rPr>
+        <w:t xml:space="preserve"> is restricted</w:t>
+      </w:r>
+      <w:r>
+        <w:rPr>
+          <w:lang w:val="en-US"/>
+        </w:rPr>
+        <w:t xml:space="preserve"> to an acceptable</w:t>
+      </w:r>
+      <w:r>
+        <w:rPr>
+          <w:lang w:val="en-US"/>
+        </w:rPr>
+        <w:t xml:space="preserve"> numerical range.</w:t>
+      </w:r>
+    </w:p>
+    <w:p>
+      <w:pPr>
+        <w:rPr>
+          <w:lang w:val="en-US"/>
+        </w:rPr>
+      </w:pPr>
+    </w:p>
+    <w:p>
+      <w:pPr>
+        <w:rPr>
+          <w:lang w:val="en-US"/>
+        </w:rPr>
+      </w:pPr>
+      <w:r>
+        <w:rPr>
+          <w:lang w:val="en-US"/>
+        </w:rPr>
+        <w:t>Grades are selected</w:t>
+      </w:r>
+      <w:r>
+        <w:rPr>
+          <w:lang w:val="en-US"/>
+        </w:rPr>
+        <w:t xml:space="preserve"> from a predefined</w:t>
+      </w:r>
+      <w:r>
+        <w:rPr>
+          <w:lang w:val="en-US"/>
+        </w:rPr>
+        <w:t xml:space="preserve"> list</w:t>
+      </w:r>
+      <w:r>
+        <w:rPr>
+          <w:lang w:val="en-US"/>
+        </w:rPr>
+        <w:t xml:space="preserve"> rather than</w:t>
+      </w:r>
+      <w:r>
+        <w:rPr>
+          <w:lang w:val="en-US"/>
+        </w:rPr>
+        <w:t xml:space="preserve"> entered as</w:t>
+      </w:r>
+      <w:r>
+        <w:rPr>
+          <w:lang w:val="en-US"/>
+        </w:rPr>
+        <w:t xml:space="preserve"> unrestricted</w:t>
+      </w:r>
+      <w:r>
+        <w:rPr>
+          <w:lang w:val="en-US"/>
+        </w:rPr>
+        <w:t xml:space="preserve"> text.</w:t>
+      </w:r>
+      <w:r>
+        <w:rPr>
+          <w:lang w:val="en-US"/>
+        </w:rPr>
+        <w:t xml:space="preserve"> This prevents</w:t>
+      </w:r>
+      <w:r>
+        <w:rPr>
+          <w:lang w:val="en-US"/>
+        </w:rPr>
+        <w:t xml:space="preserve"> unsupported</w:t>
+      </w:r>
+      <w:r>
+        <w:rPr>
+          <w:lang w:val="en-US"/>
+        </w:rPr>
+        <w:t xml:space="preserve"> values</w:t>
+      </w:r>
+      <w:r>
+        <w:rPr>
+          <w:lang w:val="en-US"/>
+        </w:rPr>
+        <w:t xml:space="preserve"> from being stored</w:t>
+      </w:r>
+      <w:r>
+        <w:rPr>
+          <w:lang w:val="en-US"/>
+        </w:rPr>
+        <w:t xml:space="preserve"> in the database</w:t>
+      </w:r>
+      <w:r>
+        <w:rPr>
+          <w:lang w:val="en-US"/>
+        </w:rPr>
+        <w:t xml:space="preserve"> and ensures that</w:t>
+      </w:r>
+      <w:r>
+        <w:rPr>
+          <w:lang w:val="en-US"/>
+        </w:rPr>
+        <w:t xml:space="preserve"> the GPA</w:t>
+      </w:r>
+      <w:r>
+        <w:rPr>
+          <w:lang w:val="en-US"/>
+        </w:rPr>
+        <w:t xml:space="preserve"> calculation</w:t>
+      </w:r>
+      <w:r>
+        <w:rPr>
+          <w:lang w:val="en-US"/>
+        </w:rPr>
+        <w:t xml:space="preserve"> receives grade</w:t>
+      </w:r>
+      <w:r>
+        <w:rPr>
+          <w:lang w:val="en-US"/>
+        </w:rPr>
+        <w:t xml:space="preserve"> values</w:t>
+      </w:r>
+      <w:r>
+        <w:rPr>
+          <w:lang w:val="en-US"/>
+        </w:rPr>
+        <w:t xml:space="preserve"> that it can correctly</w:t>
+      </w:r>
+      <w:r>
+        <w:rPr>
+          <w:lang w:val="en-US"/>
+        </w:rPr>
+        <w:t xml:space="preserve"> interpret.</w:t>
+      </w:r>
+    </w:p>
+    <w:p>
+      <w:pPr>
+        <w:rPr>
+          <w:lang w:val="en-US"/>
+        </w:rPr>
+      </w:pPr>
+    </w:p>
+    <w:p>
+      <w:pPr>
+        <w:rPr>
+          <w:lang w:val="en-US"/>
+        </w:rPr>
+      </w:pPr>
+      <w:r>
+        <w:rPr>
+          <w:lang w:val="en-US"/>
+        </w:rPr>
+        <w:t>The semester field also</w:t>
+      </w:r>
+      <w:r>
+        <w:rPr>
+          <w:lang w:val="en-US"/>
+        </w:rPr>
+        <w:t xml:space="preserve"> uses</w:t>
+      </w:r>
+      <w:r>
+        <w:rPr>
+          <w:lang w:val="en-US"/>
+        </w:rPr>
+        <w:t xml:space="preserve"> </w:t>
+      </w:r>
+      <w:r>
+        <w:rPr>
+          <w:lang w:val="en-US"/>
+        </w:rPr>
+        <w:t>selection</w:t>
+      </w:r>
+      <w:r>
+        <w:rPr>
+          <w:lang w:val="en-US"/>
+        </w:rPr>
+        <w:t xml:space="preserve"> control</w:t>
+      </w:r>
+      <w:r>
+        <w:rPr>
+          <w:lang w:val="en-US"/>
+        </w:rPr>
+        <w:t>.</w:t>
+      </w:r>
+      <w:r>
+        <w:rPr>
+          <w:lang w:val="en-US"/>
+        </w:rPr>
+        <w:t xml:space="preserve"> Instead of typing</w:t>
+      </w:r>
+      <w:r>
+        <w:rPr>
+          <w:lang w:val="en-US"/>
+        </w:rPr>
+        <w:t xml:space="preserve"> a semester name manually</w:t>
+      </w:r>
+      <w:r>
+        <w:rPr>
+          <w:lang w:val="en-US"/>
+        </w:rPr>
+        <w:t>, the user</w:t>
+      </w:r>
+      <w:r>
+        <w:rPr>
+          <w:lang w:val="en-US"/>
+        </w:rPr>
+        <w:t xml:space="preserve"> chooses an existing Semester entity.</w:t>
       </w:r>
     </w:p>
     <w:sectPr>

</xml_diff>

<commit_message>
Finished the fifth part of the third part of my thesis.
</commit_message>
<xml_diff>
--- a/Project Thesis.docx
+++ b/Project Thesis.docx
@@ -6061,8 +6061,19 @@
           <w:lang w:val="en-US"/>
         </w:rPr>
         <w:lastRenderedPageBreak/>
-        <w:t>FUNCTION AddCourse</w:t>
-      </w:r>
+        <w:t xml:space="preserve">FUNCTION </w:t>
+      </w:r>
+      <w:proofErr w:type="spellStart"/>
+      <w:r>
+        <w:rPr>
+          <w:rFonts w:ascii="Arial" w:hAnsi="Arial" w:cs="Arial"/>
+          <w:sz w:val="24"/>
+          <w:szCs w:val="24"/>
+          <w:lang w:val="en-US"/>
+        </w:rPr>
+        <w:t>AddCourse</w:t>
+      </w:r>
+      <w:proofErr w:type="spellEnd"/>
     </w:p>
     <w:p>
       <w:pPr>
@@ -7116,14 +7127,25 @@
         </w:rPr>
         <w:t xml:space="preserve">FUNCTION </w:t>
       </w:r>
-      <w:r>
-        <w:rPr>
-          <w:rFonts w:ascii="Arial" w:hAnsi="Arial" w:cs="Arial"/>
-          <w:sz w:val="24"/>
-          <w:szCs w:val="24"/>
-          <w:lang w:val="en-US"/>
-        </w:rPr>
-        <w:t>CalculateGPA(courses)</w:t>
+      <w:proofErr w:type="spellStart"/>
+      <w:r>
+        <w:rPr>
+          <w:rFonts w:ascii="Arial" w:hAnsi="Arial" w:cs="Arial"/>
+          <w:sz w:val="24"/>
+          <w:szCs w:val="24"/>
+          <w:lang w:val="en-US"/>
+        </w:rPr>
+        <w:t>CalculateGPA</w:t>
+      </w:r>
+      <w:proofErr w:type="spellEnd"/>
+      <w:r>
+        <w:rPr>
+          <w:rFonts w:ascii="Arial" w:hAnsi="Arial" w:cs="Arial"/>
+          <w:sz w:val="24"/>
+          <w:szCs w:val="24"/>
+          <w:lang w:val="en-US"/>
+        </w:rPr>
+        <w:t>(courses)</w:t>
       </w:r>
     </w:p>
     <w:p>
@@ -7156,14 +7178,25 @@
         </w:rPr>
         <w:t xml:space="preserve">   </w:t>
       </w:r>
-      <w:r>
-        <w:rPr>
-          <w:rFonts w:ascii="Arial" w:hAnsi="Arial" w:cs="Arial"/>
-          <w:sz w:val="24"/>
-          <w:szCs w:val="24"/>
-          <w:lang w:val="en-US"/>
-        </w:rPr>
-        <w:t>totalQualityPoints = 0</w:t>
+      <w:proofErr w:type="spellStart"/>
+      <w:r>
+        <w:rPr>
+          <w:rFonts w:ascii="Arial" w:hAnsi="Arial" w:cs="Arial"/>
+          <w:sz w:val="24"/>
+          <w:szCs w:val="24"/>
+          <w:lang w:val="en-US"/>
+        </w:rPr>
+        <w:t>totalQualityPoints</w:t>
+      </w:r>
+      <w:proofErr w:type="spellEnd"/>
+      <w:r>
+        <w:rPr>
+          <w:rFonts w:ascii="Arial" w:hAnsi="Arial" w:cs="Arial"/>
+          <w:sz w:val="24"/>
+          <w:szCs w:val="24"/>
+          <w:lang w:val="en-US"/>
+        </w:rPr>
+        <w:t xml:space="preserve"> = 0</w:t>
       </w:r>
     </w:p>
     <w:p>
@@ -7186,14 +7219,25 @@
         <w:lastRenderedPageBreak/>
         <w:t xml:space="preserve">   </w:t>
       </w:r>
-      <w:r>
-        <w:rPr>
-          <w:rFonts w:ascii="Arial" w:hAnsi="Arial" w:cs="Arial"/>
-          <w:sz w:val="24"/>
-          <w:szCs w:val="24"/>
-          <w:lang w:val="en-US"/>
-        </w:rPr>
-        <w:t>attemptedCredits = 0</w:t>
+      <w:proofErr w:type="spellStart"/>
+      <w:r>
+        <w:rPr>
+          <w:rFonts w:ascii="Arial" w:hAnsi="Arial" w:cs="Arial"/>
+          <w:sz w:val="24"/>
+          <w:szCs w:val="24"/>
+          <w:lang w:val="en-US"/>
+        </w:rPr>
+        <w:t>attemptedCredits</w:t>
+      </w:r>
+      <w:proofErr w:type="spellEnd"/>
+      <w:r>
+        <w:rPr>
+          <w:rFonts w:ascii="Arial" w:hAnsi="Arial" w:cs="Arial"/>
+          <w:sz w:val="24"/>
+          <w:szCs w:val="24"/>
+          <w:lang w:val="en-US"/>
+        </w:rPr>
+        <w:t xml:space="preserve"> = 0</w:t>
       </w:r>
     </w:p>
     <w:p>
@@ -7284,6 +7328,7 @@
         </w:rPr>
         <w:t xml:space="preserve">      </w:t>
       </w:r>
+      <w:proofErr w:type="spellStart"/>
       <w:r>
         <w:rPr>
           <w:rFonts w:ascii="Arial" w:hAnsi="Arial" w:cs="Arial"/>
@@ -7293,15 +7338,38 @@
         </w:rPr>
         <w:t>gradePoints</w:t>
       </w:r>
-      <w:r>
-        <w:rPr>
-          <w:rFonts w:ascii="Arial" w:hAnsi="Arial" w:cs="Arial"/>
-          <w:sz w:val="24"/>
-          <w:szCs w:val="24"/>
-          <w:lang w:val="en-US"/>
-        </w:rPr>
-        <w:t xml:space="preserve"> = ConvertGradeToPoints(</w:t>
-      </w:r>
+      <w:proofErr w:type="spellEnd"/>
+      <w:r>
+        <w:rPr>
+          <w:rFonts w:ascii="Arial" w:hAnsi="Arial" w:cs="Arial"/>
+          <w:sz w:val="24"/>
+          <w:szCs w:val="24"/>
+          <w:lang w:val="en-US"/>
+        </w:rPr>
+        <w:t xml:space="preserve"> = </w:t>
+      </w:r>
+      <w:proofErr w:type="spellStart"/>
+      <w:r>
+        <w:rPr>
+          <w:rFonts w:ascii="Arial" w:hAnsi="Arial" w:cs="Arial"/>
+          <w:sz w:val="24"/>
+          <w:szCs w:val="24"/>
+          <w:lang w:val="en-US"/>
+        </w:rPr>
+        <w:t>ConvertGradeToPoints</w:t>
+      </w:r>
+      <w:proofErr w:type="spellEnd"/>
+      <w:r>
+        <w:rPr>
+          <w:rFonts w:ascii="Arial" w:hAnsi="Arial" w:cs="Arial"/>
+          <w:sz w:val="24"/>
+          <w:szCs w:val="24"/>
+          <w:lang w:val="en-US"/>
+        </w:rPr>
+        <w:t>(</w:t>
+      </w:r>
+      <w:proofErr w:type="spellStart"/>
+      <w:proofErr w:type="gramStart"/>
       <w:r>
         <w:rPr>
           <w:rFonts w:ascii="Arial" w:hAnsi="Arial" w:cs="Arial"/>
@@ -7311,6 +7379,8 @@
         </w:rPr>
         <w:t>course.grade</w:t>
       </w:r>
+      <w:proofErr w:type="spellEnd"/>
+      <w:proofErr w:type="gramEnd"/>
       <w:r>
         <w:rPr>
           <w:rFonts w:ascii="Arial" w:hAnsi="Arial" w:cs="Arial"/>
@@ -7349,26 +7419,59 @@
           <w:szCs w:val="24"/>
           <w:lang w:val="en-US"/>
         </w:rPr>
-        <w:t xml:space="preserve">      totalQualityPoints</w:t>
-      </w:r>
-      <w:r>
-        <w:rPr>
-          <w:rFonts w:ascii="Arial" w:hAnsi="Arial" w:cs="Arial"/>
-          <w:sz w:val="24"/>
-          <w:szCs w:val="24"/>
-          <w:lang w:val="en-US"/>
-        </w:rPr>
-        <w:t xml:space="preserve"> = totalQualityPoints</w:t>
-      </w:r>
-      <w:r>
-        <w:rPr>
-          <w:rFonts w:ascii="Arial" w:hAnsi="Arial" w:cs="Arial"/>
-          <w:sz w:val="24"/>
-          <w:szCs w:val="24"/>
-          <w:lang w:val="en-US"/>
-        </w:rPr>
-        <w:t xml:space="preserve"> + gradePoints</w:t>
-      </w:r>
+        <w:t xml:space="preserve">      </w:t>
+      </w:r>
+      <w:proofErr w:type="spellStart"/>
+      <w:r>
+        <w:rPr>
+          <w:rFonts w:ascii="Arial" w:hAnsi="Arial" w:cs="Arial"/>
+          <w:sz w:val="24"/>
+          <w:szCs w:val="24"/>
+          <w:lang w:val="en-US"/>
+        </w:rPr>
+        <w:t>totalQualityPoints</w:t>
+      </w:r>
+      <w:proofErr w:type="spellEnd"/>
+      <w:r>
+        <w:rPr>
+          <w:rFonts w:ascii="Arial" w:hAnsi="Arial" w:cs="Arial"/>
+          <w:sz w:val="24"/>
+          <w:szCs w:val="24"/>
+          <w:lang w:val="en-US"/>
+        </w:rPr>
+        <w:t xml:space="preserve"> = </w:t>
+      </w:r>
+      <w:proofErr w:type="spellStart"/>
+      <w:r>
+        <w:rPr>
+          <w:rFonts w:ascii="Arial" w:hAnsi="Arial" w:cs="Arial"/>
+          <w:sz w:val="24"/>
+          <w:szCs w:val="24"/>
+          <w:lang w:val="en-US"/>
+        </w:rPr>
+        <w:t>totalQualityPoints</w:t>
+      </w:r>
+      <w:proofErr w:type="spellEnd"/>
+      <w:r>
+        <w:rPr>
+          <w:rFonts w:ascii="Arial" w:hAnsi="Arial" w:cs="Arial"/>
+          <w:sz w:val="24"/>
+          <w:szCs w:val="24"/>
+          <w:lang w:val="en-US"/>
+        </w:rPr>
+        <w:t xml:space="preserve"> + </w:t>
+      </w:r>
+      <w:proofErr w:type="spellStart"/>
+      <w:r>
+        <w:rPr>
+          <w:rFonts w:ascii="Arial" w:hAnsi="Arial" w:cs="Arial"/>
+          <w:sz w:val="24"/>
+          <w:szCs w:val="24"/>
+          <w:lang w:val="en-US"/>
+        </w:rPr>
+        <w:t>gradePoints</w:t>
+      </w:r>
+      <w:proofErr w:type="spellEnd"/>
       <w:r>
         <w:rPr>
           <w:rFonts w:ascii="Arial" w:hAnsi="Arial" w:cs="Arial"/>
@@ -7378,6 +7481,8 @@
         </w:rPr>
         <w:t xml:space="preserve"> * </w:t>
       </w:r>
+      <w:proofErr w:type="spellStart"/>
+      <w:proofErr w:type="gramStart"/>
       <w:r>
         <w:rPr>
           <w:rFonts w:ascii="Arial" w:hAnsi="Arial" w:cs="Arial"/>
@@ -7387,55 +7492,92 @@
         </w:rPr>
         <w:t>course.credits</w:t>
       </w:r>
-    </w:p>
-    <w:p>
-      <w:pPr>
-        <w:spacing w:line="360" w:lineRule="auto"/>
-        <w:rPr>
-          <w:rFonts w:ascii="Arial" w:hAnsi="Arial" w:cs="Arial"/>
-          <w:sz w:val="24"/>
-          <w:szCs w:val="24"/>
-          <w:lang w:val="en-US"/>
-        </w:rPr>
-      </w:pPr>
-    </w:p>
-    <w:p>
-      <w:pPr>
-        <w:spacing w:line="360" w:lineRule="auto"/>
-        <w:rPr>
-          <w:rFonts w:ascii="Arial" w:hAnsi="Arial" w:cs="Arial"/>
-          <w:sz w:val="24"/>
-          <w:szCs w:val="24"/>
-          <w:lang w:val="en-US"/>
-        </w:rPr>
-      </w:pPr>
-      <w:r>
-        <w:rPr>
-          <w:rFonts w:ascii="Arial" w:hAnsi="Arial" w:cs="Arial"/>
-          <w:sz w:val="24"/>
-          <w:szCs w:val="24"/>
-          <w:lang w:val="en-US"/>
-        </w:rPr>
-        <w:t xml:space="preserve">      attemptedCredits</w:t>
-      </w:r>
-      <w:r>
-        <w:rPr>
-          <w:rFonts w:ascii="Arial" w:hAnsi="Arial" w:cs="Arial"/>
-          <w:sz w:val="24"/>
-          <w:szCs w:val="24"/>
-          <w:lang w:val="en-US"/>
-        </w:rPr>
-        <w:t xml:space="preserve"> = attemptedCredits</w:t>
-      </w:r>
-      <w:r>
-        <w:rPr>
-          <w:rFonts w:ascii="Arial" w:hAnsi="Arial" w:cs="Arial"/>
-          <w:sz w:val="24"/>
-          <w:szCs w:val="24"/>
-          <w:lang w:val="en-US"/>
-        </w:rPr>
-        <w:t xml:space="preserve"> + course.credits</w:t>
-      </w:r>
+      <w:proofErr w:type="spellEnd"/>
+      <w:proofErr w:type="gramEnd"/>
+    </w:p>
+    <w:p>
+      <w:pPr>
+        <w:spacing w:line="360" w:lineRule="auto"/>
+        <w:rPr>
+          <w:rFonts w:ascii="Arial" w:hAnsi="Arial" w:cs="Arial"/>
+          <w:sz w:val="24"/>
+          <w:szCs w:val="24"/>
+          <w:lang w:val="en-US"/>
+        </w:rPr>
+      </w:pPr>
+    </w:p>
+    <w:p>
+      <w:pPr>
+        <w:spacing w:line="360" w:lineRule="auto"/>
+        <w:rPr>
+          <w:rFonts w:ascii="Arial" w:hAnsi="Arial" w:cs="Arial"/>
+          <w:sz w:val="24"/>
+          <w:szCs w:val="24"/>
+          <w:lang w:val="en-US"/>
+        </w:rPr>
+      </w:pPr>
+      <w:r>
+        <w:rPr>
+          <w:rFonts w:ascii="Arial" w:hAnsi="Arial" w:cs="Arial"/>
+          <w:sz w:val="24"/>
+          <w:szCs w:val="24"/>
+          <w:lang w:val="en-US"/>
+        </w:rPr>
+        <w:t xml:space="preserve">      </w:t>
+      </w:r>
+      <w:proofErr w:type="spellStart"/>
+      <w:r>
+        <w:rPr>
+          <w:rFonts w:ascii="Arial" w:hAnsi="Arial" w:cs="Arial"/>
+          <w:sz w:val="24"/>
+          <w:szCs w:val="24"/>
+          <w:lang w:val="en-US"/>
+        </w:rPr>
+        <w:t>attemptedCredits</w:t>
+      </w:r>
+      <w:proofErr w:type="spellEnd"/>
+      <w:r>
+        <w:rPr>
+          <w:rFonts w:ascii="Arial" w:hAnsi="Arial" w:cs="Arial"/>
+          <w:sz w:val="24"/>
+          <w:szCs w:val="24"/>
+          <w:lang w:val="en-US"/>
+        </w:rPr>
+        <w:t xml:space="preserve"> = </w:t>
+      </w:r>
+      <w:proofErr w:type="spellStart"/>
+      <w:r>
+        <w:rPr>
+          <w:rFonts w:ascii="Arial" w:hAnsi="Arial" w:cs="Arial"/>
+          <w:sz w:val="24"/>
+          <w:szCs w:val="24"/>
+          <w:lang w:val="en-US"/>
+        </w:rPr>
+        <w:t>attemptedCredits</w:t>
+      </w:r>
+      <w:proofErr w:type="spellEnd"/>
+      <w:r>
+        <w:rPr>
+          <w:rFonts w:ascii="Arial" w:hAnsi="Arial" w:cs="Arial"/>
+          <w:sz w:val="24"/>
+          <w:szCs w:val="24"/>
+          <w:lang w:val="en-US"/>
+        </w:rPr>
+        <w:t xml:space="preserve"> + </w:t>
+      </w:r>
+      <w:proofErr w:type="spellStart"/>
+      <w:proofErr w:type="gramStart"/>
+      <w:r>
+        <w:rPr>
+          <w:rFonts w:ascii="Arial" w:hAnsi="Arial" w:cs="Arial"/>
+          <w:sz w:val="24"/>
+          <w:szCs w:val="24"/>
+          <w:lang w:val="en-US"/>
+        </w:rPr>
+        <w:t>course.credits</w:t>
+      </w:r>
+      <w:proofErr w:type="spellEnd"/>
+      <w:proofErr w:type="gramEnd"/>
     </w:p>
     <w:p>
       <w:pPr>
@@ -7514,8 +7656,19 @@
           <w:szCs w:val="24"/>
           <w:lang w:val="en-US"/>
         </w:rPr>
-        <w:t>IF attemptedCredits</w:t>
-      </w:r>
+        <w:t xml:space="preserve">IF </w:t>
+      </w:r>
+      <w:proofErr w:type="spellStart"/>
+      <w:r>
+        <w:rPr>
+          <w:rFonts w:ascii="Arial" w:hAnsi="Arial" w:cs="Arial"/>
+          <w:sz w:val="24"/>
+          <w:szCs w:val="24"/>
+          <w:lang w:val="en-US"/>
+        </w:rPr>
+        <w:t>attemptedCredits</w:t>
+      </w:r>
+      <w:proofErr w:type="spellEnd"/>
       <w:r>
         <w:rPr>
           <w:rFonts w:ascii="Arial" w:hAnsi="Arial" w:cs="Arial"/>
@@ -7614,15 +7767,37 @@
         </w:rPr>
         <w:t xml:space="preserve"> </w:t>
       </w:r>
-      <w:r>
-        <w:rPr>
-          <w:rFonts w:ascii="Arial" w:hAnsi="Arial" w:cs="Arial"/>
-          <w:sz w:val="24"/>
-          <w:szCs w:val="24"/>
-          <w:lang w:val="en-US"/>
-        </w:rPr>
-        <w:t>totalQualityPoints / attemptedCredits</w:t>
-      </w:r>
+      <w:proofErr w:type="spellStart"/>
+      <w:r>
+        <w:rPr>
+          <w:rFonts w:ascii="Arial" w:hAnsi="Arial" w:cs="Arial"/>
+          <w:sz w:val="24"/>
+          <w:szCs w:val="24"/>
+          <w:lang w:val="en-US"/>
+        </w:rPr>
+        <w:t>totalQualityPoints</w:t>
+      </w:r>
+      <w:proofErr w:type="spellEnd"/>
+      <w:r>
+        <w:rPr>
+          <w:rFonts w:ascii="Arial" w:hAnsi="Arial" w:cs="Arial"/>
+          <w:sz w:val="24"/>
+          <w:szCs w:val="24"/>
+          <w:lang w:val="en-US"/>
+        </w:rPr>
+        <w:t xml:space="preserve"> / </w:t>
+      </w:r>
+      <w:proofErr w:type="spellStart"/>
+      <w:r>
+        <w:rPr>
+          <w:rFonts w:ascii="Arial" w:hAnsi="Arial" w:cs="Arial"/>
+          <w:sz w:val="24"/>
+          <w:szCs w:val="24"/>
+          <w:lang w:val="en-US"/>
+        </w:rPr>
+        <w:t>attemptedCredits</w:t>
+      </w:r>
+      <w:proofErr w:type="spellEnd"/>
     </w:p>
     <w:p>
       <w:pPr>
@@ -7705,7 +7880,27 @@
           <w:szCs w:val="24"/>
           <w:lang w:val="en-US"/>
         </w:rPr>
-        <w:t>FUNCTION ConvertGradeToPoints(grade)</w:t>
+        <w:t xml:space="preserve">FUNCTION </w:t>
+      </w:r>
+      <w:proofErr w:type="spellStart"/>
+      <w:r>
+        <w:rPr>
+          <w:rFonts w:ascii="Arial" w:hAnsi="Arial" w:cs="Arial"/>
+          <w:sz w:val="24"/>
+          <w:szCs w:val="24"/>
+          <w:lang w:val="en-US"/>
+        </w:rPr>
+        <w:t>ConvertGradeToPoints</w:t>
+      </w:r>
+      <w:proofErr w:type="spellEnd"/>
+      <w:r>
+        <w:rPr>
+          <w:rFonts w:ascii="Arial" w:hAnsi="Arial" w:cs="Arial"/>
+          <w:sz w:val="24"/>
+          <w:szCs w:val="24"/>
+          <w:lang w:val="en-US"/>
+        </w:rPr>
+        <w:t>(grade)</w:t>
       </w:r>
     </w:p>
     <w:p>
@@ -7795,16 +7990,36 @@
           <w:szCs w:val="24"/>
           <w:lang w:val="en-US"/>
         </w:rPr>
-        <w:t xml:space="preserve">   ELSE IF grade = ”</w:t>
-      </w:r>
-      <w:r>
-        <w:rPr>
-          <w:rFonts w:ascii="Arial" w:hAnsi="Arial" w:cs="Arial"/>
-          <w:sz w:val="24"/>
-          <w:szCs w:val="24"/>
-          <w:lang w:val="en-US"/>
-        </w:rPr>
-        <w:t>A-</w:t>
+        <w:t xml:space="preserve">   ELSE IF grade </w:t>
+      </w:r>
+      <w:proofErr w:type="gramStart"/>
+      <w:r>
+        <w:rPr>
+          <w:rFonts w:ascii="Arial" w:hAnsi="Arial" w:cs="Arial"/>
+          <w:sz w:val="24"/>
+          <w:szCs w:val="24"/>
+          <w:lang w:val="en-US"/>
+        </w:rPr>
+        <w:t>= ”</w:t>
+      </w:r>
+      <w:r>
+        <w:rPr>
+          <w:rFonts w:ascii="Arial" w:hAnsi="Arial" w:cs="Arial"/>
+          <w:sz w:val="24"/>
+          <w:szCs w:val="24"/>
+          <w:lang w:val="en-US"/>
+        </w:rPr>
+        <w:t>A</w:t>
+      </w:r>
+      <w:proofErr w:type="gramEnd"/>
+      <w:r>
+        <w:rPr>
+          <w:rFonts w:ascii="Arial" w:hAnsi="Arial" w:cs="Arial"/>
+          <w:sz w:val="24"/>
+          <w:szCs w:val="24"/>
+          <w:lang w:val="en-US"/>
+        </w:rPr>
+        <w:t>-</w:t>
       </w:r>
       <w:r>
         <w:rPr>
@@ -8361,25 +8576,68 @@
           <w:szCs w:val="24"/>
           <w:lang w:val="en-US"/>
         </w:rPr>
-        <w:t xml:space="preserve"> CalculateProjectedGPA(</w:t>
-      </w:r>
-      <w:r>
-        <w:rPr>
-          <w:rFonts w:ascii="Arial" w:hAnsi="Arial" w:cs="Arial"/>
-          <w:sz w:val="24"/>
-          <w:szCs w:val="24"/>
-          <w:lang w:val="en-US"/>
-        </w:rPr>
-        <w:t>currentCourses,</w:t>
-      </w:r>
-      <w:r>
-        <w:rPr>
-          <w:rFonts w:ascii="Arial" w:hAnsi="Arial" w:cs="Arial"/>
-          <w:sz w:val="24"/>
-          <w:szCs w:val="24"/>
-          <w:lang w:val="en-US"/>
-        </w:rPr>
-        <w:t xml:space="preserve"> hypothetical</w:t>
+        <w:t xml:space="preserve"> </w:t>
+      </w:r>
+      <w:proofErr w:type="spellStart"/>
+      <w:proofErr w:type="gramStart"/>
+      <w:r>
+        <w:rPr>
+          <w:rFonts w:ascii="Arial" w:hAnsi="Arial" w:cs="Arial"/>
+          <w:sz w:val="24"/>
+          <w:szCs w:val="24"/>
+          <w:lang w:val="en-US"/>
+        </w:rPr>
+        <w:t>CalculateProjectedGPA</w:t>
+      </w:r>
+      <w:proofErr w:type="spellEnd"/>
+      <w:r>
+        <w:rPr>
+          <w:rFonts w:ascii="Arial" w:hAnsi="Arial" w:cs="Arial"/>
+          <w:sz w:val="24"/>
+          <w:szCs w:val="24"/>
+          <w:lang w:val="en-US"/>
+        </w:rPr>
+        <w:t>(</w:t>
+      </w:r>
+      <w:proofErr w:type="spellStart"/>
+      <w:proofErr w:type="gramEnd"/>
+      <w:r>
+        <w:rPr>
+          <w:rFonts w:ascii="Arial" w:hAnsi="Arial" w:cs="Arial"/>
+          <w:sz w:val="24"/>
+          <w:szCs w:val="24"/>
+          <w:lang w:val="en-US"/>
+        </w:rPr>
+        <w:t>currentCourses</w:t>
+      </w:r>
+      <w:proofErr w:type="spellEnd"/>
+      <w:r>
+        <w:rPr>
+          <w:rFonts w:ascii="Arial" w:hAnsi="Arial" w:cs="Arial"/>
+          <w:sz w:val="24"/>
+          <w:szCs w:val="24"/>
+          <w:lang w:val="en-US"/>
+        </w:rPr>
+        <w:t>,</w:t>
+      </w:r>
+      <w:r>
+        <w:rPr>
+          <w:rFonts w:ascii="Arial" w:hAnsi="Arial" w:cs="Arial"/>
+          <w:sz w:val="24"/>
+          <w:szCs w:val="24"/>
+          <w:lang w:val="en-US"/>
+        </w:rPr>
+        <w:t xml:space="preserve"> </w:t>
+      </w:r>
+      <w:proofErr w:type="spellStart"/>
+      <w:r>
+        <w:rPr>
+          <w:rFonts w:ascii="Arial" w:hAnsi="Arial" w:cs="Arial"/>
+          <w:sz w:val="24"/>
+          <w:szCs w:val="24"/>
+          <w:lang w:val="en-US"/>
+        </w:rPr>
+        <w:t>hypothetical</w:t>
       </w:r>
       <w:r>
         <w:rPr>
@@ -8390,6 +8648,7 @@
         </w:rPr>
         <w:t>Courses</w:t>
       </w:r>
+      <w:proofErr w:type="spellEnd"/>
       <w:r>
         <w:rPr>
           <w:rFonts w:ascii="Arial" w:hAnsi="Arial" w:cs="Arial"/>
@@ -8428,8 +8687,29 @@
           <w:szCs w:val="24"/>
           <w:lang w:val="en-US"/>
         </w:rPr>
-        <w:t xml:space="preserve">   currentQualityPoints = </w:t>
-      </w:r>
+        <w:t xml:space="preserve">   </w:t>
+      </w:r>
+      <w:proofErr w:type="spellStart"/>
+      <w:r>
+        <w:rPr>
+          <w:rFonts w:ascii="Arial" w:hAnsi="Arial" w:cs="Arial"/>
+          <w:sz w:val="24"/>
+          <w:szCs w:val="24"/>
+          <w:lang w:val="en-US"/>
+        </w:rPr>
+        <w:t>currentQualityPoints</w:t>
+      </w:r>
+      <w:proofErr w:type="spellEnd"/>
+      <w:r>
+        <w:rPr>
+          <w:rFonts w:ascii="Arial" w:hAnsi="Arial" w:cs="Arial"/>
+          <w:sz w:val="24"/>
+          <w:szCs w:val="24"/>
+          <w:lang w:val="en-US"/>
+        </w:rPr>
+        <w:t xml:space="preserve"> = </w:t>
+      </w:r>
+      <w:proofErr w:type="spellStart"/>
       <w:r>
         <w:rPr>
           <w:rFonts w:ascii="Arial" w:hAnsi="Arial" w:cs="Arial"/>
@@ -8439,6 +8719,7 @@
         </w:rPr>
         <w:t>CalculateQualityPoints</w:t>
       </w:r>
+      <w:proofErr w:type="spellEnd"/>
       <w:r>
         <w:rPr>
           <w:rFonts w:ascii="Arial" w:hAnsi="Arial" w:cs="Arial"/>
@@ -8448,6 +8729,7 @@
         </w:rPr>
         <w:t>(</w:t>
       </w:r>
+      <w:proofErr w:type="spellStart"/>
       <w:r>
         <w:rPr>
           <w:rFonts w:ascii="Arial" w:hAnsi="Arial" w:cs="Arial"/>
@@ -8457,6 +8739,7 @@
         </w:rPr>
         <w:t>currentCourses</w:t>
       </w:r>
+      <w:proofErr w:type="spellEnd"/>
       <w:r>
         <w:rPr>
           <w:rFonts w:ascii="Arial" w:hAnsi="Arial" w:cs="Arial"/>
@@ -8495,39 +8778,100 @@
           <w:szCs w:val="24"/>
           <w:lang w:val="en-US"/>
         </w:rPr>
-        <w:t xml:space="preserve">   futureQualityPoints = CalculateQualityPoints(hypotheticalCourses)</w:t>
-      </w:r>
-    </w:p>
-    <w:p>
-      <w:pPr>
-        <w:spacing w:line="360" w:lineRule="auto"/>
-        <w:rPr>
-          <w:rFonts w:ascii="Arial" w:hAnsi="Arial" w:cs="Arial"/>
-          <w:sz w:val="24"/>
-          <w:szCs w:val="24"/>
-          <w:lang w:val="en-US"/>
-        </w:rPr>
-      </w:pPr>
-    </w:p>
-    <w:p>
-      <w:pPr>
-        <w:spacing w:line="360" w:lineRule="auto"/>
-        <w:rPr>
-          <w:rFonts w:ascii="Arial" w:hAnsi="Arial" w:cs="Arial"/>
-          <w:sz w:val="24"/>
-          <w:szCs w:val="24"/>
-          <w:lang w:val="en-US"/>
-        </w:rPr>
-      </w:pPr>
-      <w:r>
-        <w:rPr>
-          <w:rFonts w:ascii="Arial" w:hAnsi="Arial" w:cs="Arial"/>
-          <w:sz w:val="24"/>
-          <w:szCs w:val="24"/>
-          <w:lang w:val="en-US"/>
-        </w:rPr>
         <w:t xml:space="preserve">   </w:t>
       </w:r>
+      <w:proofErr w:type="spellStart"/>
+      <w:r>
+        <w:rPr>
+          <w:rFonts w:ascii="Arial" w:hAnsi="Arial" w:cs="Arial"/>
+          <w:sz w:val="24"/>
+          <w:szCs w:val="24"/>
+          <w:lang w:val="en-US"/>
+        </w:rPr>
+        <w:t>futureQualityPoints</w:t>
+      </w:r>
+      <w:proofErr w:type="spellEnd"/>
+      <w:r>
+        <w:rPr>
+          <w:rFonts w:ascii="Arial" w:hAnsi="Arial" w:cs="Arial"/>
+          <w:sz w:val="24"/>
+          <w:szCs w:val="24"/>
+          <w:lang w:val="en-US"/>
+        </w:rPr>
+        <w:t xml:space="preserve"> = </w:t>
+      </w:r>
+      <w:proofErr w:type="spellStart"/>
+      <w:r>
+        <w:rPr>
+          <w:rFonts w:ascii="Arial" w:hAnsi="Arial" w:cs="Arial"/>
+          <w:sz w:val="24"/>
+          <w:szCs w:val="24"/>
+          <w:lang w:val="en-US"/>
+        </w:rPr>
+        <w:t>CalculateQualityPoints</w:t>
+      </w:r>
+      <w:proofErr w:type="spellEnd"/>
+      <w:r>
+        <w:rPr>
+          <w:rFonts w:ascii="Arial" w:hAnsi="Arial" w:cs="Arial"/>
+          <w:sz w:val="24"/>
+          <w:szCs w:val="24"/>
+          <w:lang w:val="en-US"/>
+        </w:rPr>
+        <w:t>(</w:t>
+      </w:r>
+      <w:proofErr w:type="spellStart"/>
+      <w:r>
+        <w:rPr>
+          <w:rFonts w:ascii="Arial" w:hAnsi="Arial" w:cs="Arial"/>
+          <w:sz w:val="24"/>
+          <w:szCs w:val="24"/>
+          <w:lang w:val="en-US"/>
+        </w:rPr>
+        <w:t>hypotheticalCourses</w:t>
+      </w:r>
+      <w:proofErr w:type="spellEnd"/>
+      <w:r>
+        <w:rPr>
+          <w:rFonts w:ascii="Arial" w:hAnsi="Arial" w:cs="Arial"/>
+          <w:sz w:val="24"/>
+          <w:szCs w:val="24"/>
+          <w:lang w:val="en-US"/>
+        </w:rPr>
+        <w:t>)</w:t>
+      </w:r>
+    </w:p>
+    <w:p>
+      <w:pPr>
+        <w:spacing w:line="360" w:lineRule="auto"/>
+        <w:rPr>
+          <w:rFonts w:ascii="Arial" w:hAnsi="Arial" w:cs="Arial"/>
+          <w:sz w:val="24"/>
+          <w:szCs w:val="24"/>
+          <w:lang w:val="en-US"/>
+        </w:rPr>
+      </w:pPr>
+    </w:p>
+    <w:p>
+      <w:pPr>
+        <w:spacing w:line="360" w:lineRule="auto"/>
+        <w:rPr>
+          <w:rFonts w:ascii="Arial" w:hAnsi="Arial" w:cs="Arial"/>
+          <w:sz w:val="24"/>
+          <w:szCs w:val="24"/>
+          <w:lang w:val="en-US"/>
+        </w:rPr>
+      </w:pPr>
+      <w:r>
+        <w:rPr>
+          <w:rFonts w:ascii="Arial" w:hAnsi="Arial" w:cs="Arial"/>
+          <w:sz w:val="24"/>
+          <w:szCs w:val="24"/>
+          <w:lang w:val="en-US"/>
+        </w:rPr>
+        <w:t xml:space="preserve">   </w:t>
+      </w:r>
+      <w:proofErr w:type="spellStart"/>
       <w:r>
         <w:rPr>
           <w:rFonts w:ascii="Arial" w:hAnsi="Arial" w:cs="Arial"/>
@@ -8537,15 +8881,27 @@
         </w:rPr>
         <w:t>currentCredits</w:t>
       </w:r>
-      <w:r>
-        <w:rPr>
-          <w:rFonts w:ascii="Arial" w:hAnsi="Arial" w:cs="Arial"/>
-          <w:sz w:val="24"/>
-          <w:szCs w:val="24"/>
-          <w:lang w:val="en-US"/>
-        </w:rPr>
-        <w:t xml:space="preserve"> = CalculateAttemptedCredits</w:t>
-      </w:r>
+      <w:proofErr w:type="spellEnd"/>
+      <w:r>
+        <w:rPr>
+          <w:rFonts w:ascii="Arial" w:hAnsi="Arial" w:cs="Arial"/>
+          <w:sz w:val="24"/>
+          <w:szCs w:val="24"/>
+          <w:lang w:val="en-US"/>
+        </w:rPr>
+        <w:t xml:space="preserve"> = </w:t>
+      </w:r>
+      <w:proofErr w:type="spellStart"/>
+      <w:r>
+        <w:rPr>
+          <w:rFonts w:ascii="Arial" w:hAnsi="Arial" w:cs="Arial"/>
+          <w:sz w:val="24"/>
+          <w:szCs w:val="24"/>
+          <w:lang w:val="en-US"/>
+        </w:rPr>
+        <w:t>CalculateAttemptedCredits</w:t>
+      </w:r>
+      <w:proofErr w:type="spellEnd"/>
       <w:r>
         <w:rPr>
           <w:rFonts w:ascii="Arial" w:hAnsi="Arial" w:cs="Arial"/>
@@ -8555,6 +8911,7 @@
         </w:rPr>
         <w:t>(</w:t>
       </w:r>
+      <w:proofErr w:type="spellStart"/>
       <w:r>
         <w:rPr>
           <w:rFonts w:ascii="Arial" w:hAnsi="Arial" w:cs="Arial"/>
@@ -8564,6 +8921,7 @@
         </w:rPr>
         <w:t>currentCourses</w:t>
       </w:r>
+      <w:proofErr w:type="spellEnd"/>
       <w:r>
         <w:rPr>
           <w:rFonts w:ascii="Arial" w:hAnsi="Arial" w:cs="Arial"/>
@@ -8602,16 +8960,67 @@
           <w:szCs w:val="24"/>
           <w:lang w:val="en-US"/>
         </w:rPr>
-        <w:t xml:space="preserve">   futureCredits</w:t>
-      </w:r>
-      <w:r>
-        <w:rPr>
-          <w:rFonts w:ascii="Arial" w:hAnsi="Arial" w:cs="Arial"/>
-          <w:sz w:val="24"/>
-          <w:szCs w:val="24"/>
-          <w:lang w:val="en-US"/>
-        </w:rPr>
-        <w:t xml:space="preserve"> = CalculateAttemptedCredits(hypotheticalCourses)</w:t>
+        <w:t xml:space="preserve">   </w:t>
+      </w:r>
+      <w:proofErr w:type="spellStart"/>
+      <w:r>
+        <w:rPr>
+          <w:rFonts w:ascii="Arial" w:hAnsi="Arial" w:cs="Arial"/>
+          <w:sz w:val="24"/>
+          <w:szCs w:val="24"/>
+          <w:lang w:val="en-US"/>
+        </w:rPr>
+        <w:t>futureCredits</w:t>
+      </w:r>
+      <w:proofErr w:type="spellEnd"/>
+      <w:r>
+        <w:rPr>
+          <w:rFonts w:ascii="Arial" w:hAnsi="Arial" w:cs="Arial"/>
+          <w:sz w:val="24"/>
+          <w:szCs w:val="24"/>
+          <w:lang w:val="en-US"/>
+        </w:rPr>
+        <w:t xml:space="preserve"> = </w:t>
+      </w:r>
+      <w:proofErr w:type="spellStart"/>
+      <w:r>
+        <w:rPr>
+          <w:rFonts w:ascii="Arial" w:hAnsi="Arial" w:cs="Arial"/>
+          <w:sz w:val="24"/>
+          <w:szCs w:val="24"/>
+          <w:lang w:val="en-US"/>
+        </w:rPr>
+        <w:t>CalculateAttemptedCredits</w:t>
+      </w:r>
+      <w:proofErr w:type="spellEnd"/>
+      <w:r>
+        <w:rPr>
+          <w:rFonts w:ascii="Arial" w:hAnsi="Arial" w:cs="Arial"/>
+          <w:sz w:val="24"/>
+          <w:szCs w:val="24"/>
+          <w:lang w:val="en-US"/>
+        </w:rPr>
+        <w:t>(</w:t>
+      </w:r>
+      <w:proofErr w:type="spellStart"/>
+      <w:r>
+        <w:rPr>
+          <w:rFonts w:ascii="Arial" w:hAnsi="Arial" w:cs="Arial"/>
+          <w:sz w:val="24"/>
+          <w:szCs w:val="24"/>
+          <w:lang w:val="en-US"/>
+        </w:rPr>
+        <w:t>hypotheticalCourses</w:t>
+      </w:r>
+      <w:proofErr w:type="spellEnd"/>
+      <w:r>
+        <w:rPr>
+          <w:rFonts w:ascii="Arial" w:hAnsi="Arial" w:cs="Arial"/>
+          <w:sz w:val="24"/>
+          <w:szCs w:val="24"/>
+          <w:lang w:val="en-US"/>
+        </w:rPr>
+        <w:t>)</w:t>
       </w:r>
     </w:p>
     <w:p>
@@ -8636,6 +9045,7 @@
           <w:lang w:val="en-US"/>
         </w:rPr>
       </w:pPr>
+      <w:proofErr w:type="spellStart"/>
       <w:r>
         <w:rPr>
           <w:rFonts w:ascii="Arial" w:hAnsi="Arial" w:cs="Arial"/>
@@ -8645,6 +9055,7 @@
         </w:rPr>
         <w:t>projectedGPA</w:t>
       </w:r>
+      <w:proofErr w:type="spellEnd"/>
       <w:r>
         <w:rPr>
           <w:rFonts w:ascii="Arial" w:hAnsi="Arial" w:cs="Arial"/>
@@ -8654,6 +9065,7 @@
         </w:rPr>
         <w:t xml:space="preserve"> = (</w:t>
       </w:r>
+      <w:proofErr w:type="spellStart"/>
       <w:r>
         <w:rPr>
           <w:rFonts w:ascii="Arial" w:hAnsi="Arial" w:cs="Arial"/>
@@ -8663,15 +9075,27 @@
         </w:rPr>
         <w:t>currentQualityPoints</w:t>
       </w:r>
-      <w:r>
-        <w:rPr>
-          <w:rFonts w:ascii="Arial" w:hAnsi="Arial" w:cs="Arial"/>
-          <w:sz w:val="24"/>
-          <w:szCs w:val="24"/>
-          <w:lang w:val="en-US"/>
-        </w:rPr>
-        <w:t xml:space="preserve"> + futureQualityPoints</w:t>
-      </w:r>
+      <w:proofErr w:type="spellEnd"/>
+      <w:r>
+        <w:rPr>
+          <w:rFonts w:ascii="Arial" w:hAnsi="Arial" w:cs="Arial"/>
+          <w:sz w:val="24"/>
+          <w:szCs w:val="24"/>
+          <w:lang w:val="en-US"/>
+        </w:rPr>
+        <w:t xml:space="preserve"> + </w:t>
+      </w:r>
+      <w:proofErr w:type="spellStart"/>
+      <w:r>
+        <w:rPr>
+          <w:rFonts w:ascii="Arial" w:hAnsi="Arial" w:cs="Arial"/>
+          <w:sz w:val="24"/>
+          <w:szCs w:val="24"/>
+          <w:lang w:val="en-US"/>
+        </w:rPr>
+        <w:t>futureQualityPoints</w:t>
+      </w:r>
+      <w:proofErr w:type="spellEnd"/>
       <w:r>
         <w:rPr>
           <w:rFonts w:ascii="Arial" w:hAnsi="Arial" w:cs="Arial"/>
@@ -8681,14 +9105,25 @@
         </w:rPr>
         <w:t>) / (</w:t>
       </w:r>
-      <w:r>
-        <w:rPr>
-          <w:rFonts w:ascii="Arial" w:hAnsi="Arial" w:cs="Arial"/>
-          <w:sz w:val="24"/>
-          <w:szCs w:val="24"/>
-          <w:lang w:val="en-US"/>
-        </w:rPr>
-        <w:t>currentCredits +</w:t>
+      <w:proofErr w:type="spellStart"/>
+      <w:r>
+        <w:rPr>
+          <w:rFonts w:ascii="Arial" w:hAnsi="Arial" w:cs="Arial"/>
+          <w:sz w:val="24"/>
+          <w:szCs w:val="24"/>
+          <w:lang w:val="en-US"/>
+        </w:rPr>
+        <w:t>currentCredits</w:t>
+      </w:r>
+      <w:proofErr w:type="spellEnd"/>
+      <w:r>
+        <w:rPr>
+          <w:rFonts w:ascii="Arial" w:hAnsi="Arial" w:cs="Arial"/>
+          <w:sz w:val="24"/>
+          <w:szCs w:val="24"/>
+          <w:lang w:val="en-US"/>
+        </w:rPr>
+        <w:t xml:space="preserve"> +</w:t>
       </w:r>
       <w:r>
         <w:rPr>
@@ -8699,6 +9134,7 @@
         </w:rPr>
         <w:t xml:space="preserve"> </w:t>
       </w:r>
+      <w:proofErr w:type="spellStart"/>
       <w:r>
         <w:rPr>
           <w:rFonts w:ascii="Arial" w:hAnsi="Arial" w:cs="Arial"/>
@@ -8708,6 +9144,7 @@
         </w:rPr>
         <w:t>futureCredits</w:t>
       </w:r>
+      <w:proofErr w:type="spellEnd"/>
       <w:r>
         <w:rPr>
           <w:rFonts w:ascii="Arial" w:hAnsi="Arial" w:cs="Arial"/>
@@ -8748,8 +9185,19 @@
           <w:szCs w:val="24"/>
           <w:lang w:val="en-US"/>
         </w:rPr>
-        <w:t>RETURN projectedGPA</w:t>
-      </w:r>
+        <w:t xml:space="preserve">RETURN </w:t>
+      </w:r>
+      <w:proofErr w:type="spellStart"/>
+      <w:r>
+        <w:rPr>
+          <w:rFonts w:ascii="Arial" w:hAnsi="Arial" w:cs="Arial"/>
+          <w:sz w:val="24"/>
+          <w:szCs w:val="24"/>
+          <w:lang w:val="en-US"/>
+        </w:rPr>
+        <w:t>projectedGPA</w:t>
+      </w:r>
+      <w:proofErr w:type="spellEnd"/>
     </w:p>
     <w:p>
       <w:pPr>
@@ -8832,17 +9280,51 @@
           <w:szCs w:val="24"/>
           <w:lang w:val="en-US"/>
         </w:rPr>
-        <w:t>FUNCTION CalculateDegreeProgress(</w:t>
-      </w:r>
-      <w:r>
-        <w:rPr>
-          <w:rFonts w:ascii="Arial" w:hAnsi="Arial" w:cs="Arial"/>
-          <w:sz w:val="24"/>
-          <w:szCs w:val="24"/>
-          <w:lang w:val="en-US"/>
-        </w:rPr>
-        <w:t xml:space="preserve">earnedCredits, </w:t>
-      </w:r>
+        <w:t xml:space="preserve">FUNCTION </w:t>
+      </w:r>
+      <w:proofErr w:type="spellStart"/>
+      <w:proofErr w:type="gramStart"/>
+      <w:r>
+        <w:rPr>
+          <w:rFonts w:ascii="Arial" w:hAnsi="Arial" w:cs="Arial"/>
+          <w:sz w:val="24"/>
+          <w:szCs w:val="24"/>
+          <w:lang w:val="en-US"/>
+        </w:rPr>
+        <w:t>CalculateDegreeProgress</w:t>
+      </w:r>
+      <w:proofErr w:type="spellEnd"/>
+      <w:r>
+        <w:rPr>
+          <w:rFonts w:ascii="Arial" w:hAnsi="Arial" w:cs="Arial"/>
+          <w:sz w:val="24"/>
+          <w:szCs w:val="24"/>
+          <w:lang w:val="en-US"/>
+        </w:rPr>
+        <w:t>(</w:t>
+      </w:r>
+      <w:proofErr w:type="spellStart"/>
+      <w:proofErr w:type="gramEnd"/>
+      <w:r>
+        <w:rPr>
+          <w:rFonts w:ascii="Arial" w:hAnsi="Arial" w:cs="Arial"/>
+          <w:sz w:val="24"/>
+          <w:szCs w:val="24"/>
+          <w:lang w:val="en-US"/>
+        </w:rPr>
+        <w:t>earnedCredits</w:t>
+      </w:r>
+      <w:proofErr w:type="spellEnd"/>
+      <w:r>
+        <w:rPr>
+          <w:rFonts w:ascii="Arial" w:hAnsi="Arial" w:cs="Arial"/>
+          <w:sz w:val="24"/>
+          <w:szCs w:val="24"/>
+          <w:lang w:val="en-US"/>
+        </w:rPr>
+        <w:t xml:space="preserve">, </w:t>
+      </w:r>
+      <w:proofErr w:type="spellStart"/>
       <w:r>
         <w:rPr>
           <w:rFonts w:ascii="Arial" w:hAnsi="Arial" w:cs="Arial"/>
@@ -8852,6 +9334,7 @@
         </w:rPr>
         <w:t>requiredCredits</w:t>
       </w:r>
+      <w:proofErr w:type="spellEnd"/>
       <w:r>
         <w:rPr>
           <w:rFonts w:ascii="Arial" w:hAnsi="Arial" w:cs="Arial"/>
@@ -8900,7 +9383,27 @@
           <w:szCs w:val="24"/>
           <w:lang w:val="en-US"/>
         </w:rPr>
-        <w:t>IF requiredCredits &lt;= 0</w:t>
+        <w:t xml:space="preserve">IF </w:t>
+      </w:r>
+      <w:proofErr w:type="spellStart"/>
+      <w:r>
+        <w:rPr>
+          <w:rFonts w:ascii="Arial" w:hAnsi="Arial" w:cs="Arial"/>
+          <w:sz w:val="24"/>
+          <w:szCs w:val="24"/>
+          <w:lang w:val="en-US"/>
+        </w:rPr>
+        <w:t>requiredCredits</w:t>
+      </w:r>
+      <w:proofErr w:type="spellEnd"/>
+      <w:r>
+        <w:rPr>
+          <w:rFonts w:ascii="Arial" w:hAnsi="Arial" w:cs="Arial"/>
+          <w:sz w:val="24"/>
+          <w:szCs w:val="24"/>
+          <w:lang w:val="en-US"/>
+        </w:rPr>
+        <w:t xml:space="preserve"> &lt;= 0</w:t>
       </w:r>
     </w:p>
     <w:p>
@@ -9009,6 +9512,7 @@
         </w:rPr>
         <w:t xml:space="preserve">ercentage = </w:t>
       </w:r>
+      <w:proofErr w:type="spellStart"/>
       <w:r>
         <w:rPr>
           <w:rFonts w:ascii="Arial" w:hAnsi="Arial" w:cs="Arial"/>
@@ -9018,14 +9522,35 @@
         </w:rPr>
         <w:t>earnedCredits</w:t>
       </w:r>
-      <w:r>
-        <w:rPr>
-          <w:rFonts w:ascii="Arial" w:hAnsi="Arial" w:cs="Arial"/>
-          <w:sz w:val="24"/>
-          <w:szCs w:val="24"/>
-          <w:lang w:val="en-US"/>
-        </w:rPr>
-        <w:t xml:space="preserve"> / requiredCredits * 100</w:t>
+      <w:proofErr w:type="spellEnd"/>
+      <w:r>
+        <w:rPr>
+          <w:rFonts w:ascii="Arial" w:hAnsi="Arial" w:cs="Arial"/>
+          <w:sz w:val="24"/>
+          <w:szCs w:val="24"/>
+          <w:lang w:val="en-US"/>
+        </w:rPr>
+        <w:t xml:space="preserve"> / </w:t>
+      </w:r>
+      <w:proofErr w:type="spellStart"/>
+      <w:r>
+        <w:rPr>
+          <w:rFonts w:ascii="Arial" w:hAnsi="Arial" w:cs="Arial"/>
+          <w:sz w:val="24"/>
+          <w:szCs w:val="24"/>
+          <w:lang w:val="en-US"/>
+        </w:rPr>
+        <w:t>requiredCredits</w:t>
+      </w:r>
+      <w:proofErr w:type="spellEnd"/>
+      <w:r>
+        <w:rPr>
+          <w:rFonts w:ascii="Arial" w:hAnsi="Arial" w:cs="Arial"/>
+          <w:sz w:val="24"/>
+          <w:szCs w:val="24"/>
+          <w:lang w:val="en-US"/>
+        </w:rPr>
+        <w:t xml:space="preserve"> * 100</w:t>
       </w:r>
     </w:p>
     <w:p>
@@ -9231,15 +9756,27 @@
         </w:rPr>
         <w:t xml:space="preserve">FUNCTION </w:t>
       </w:r>
-      <w:r>
-        <w:rPr>
-          <w:rFonts w:ascii="Arial" w:hAnsi="Arial" w:cs="Arial"/>
-          <w:sz w:val="24"/>
-          <w:szCs w:val="24"/>
-          <w:lang w:val="en-US"/>
-        </w:rPr>
-        <w:t>DeleteCourse(</w:t>
-      </w:r>
+      <w:proofErr w:type="spellStart"/>
+      <w:r>
+        <w:rPr>
+          <w:rFonts w:ascii="Arial" w:hAnsi="Arial" w:cs="Arial"/>
+          <w:sz w:val="24"/>
+          <w:szCs w:val="24"/>
+          <w:lang w:val="en-US"/>
+        </w:rPr>
+        <w:t>DeleteCourse</w:t>
+      </w:r>
+      <w:proofErr w:type="spellEnd"/>
+      <w:r>
+        <w:rPr>
+          <w:rFonts w:ascii="Arial" w:hAnsi="Arial" w:cs="Arial"/>
+          <w:sz w:val="24"/>
+          <w:szCs w:val="24"/>
+          <w:lang w:val="en-US"/>
+        </w:rPr>
+        <w:t>(</w:t>
+      </w:r>
+      <w:proofErr w:type="spellStart"/>
       <w:r>
         <w:rPr>
           <w:rFonts w:ascii="Arial" w:hAnsi="Arial" w:cs="Arial"/>
@@ -9249,6 +9786,7 @@
         </w:rPr>
         <w:t>courseId</w:t>
       </w:r>
+      <w:proofErr w:type="spellEnd"/>
       <w:r>
         <w:rPr>
           <w:rFonts w:ascii="Arial" w:hAnsi="Arial" w:cs="Arial"/>
@@ -9298,6 +9836,7 @@
         </w:rPr>
         <w:t xml:space="preserve">FIND course by </w:t>
       </w:r>
+      <w:proofErr w:type="spellStart"/>
       <w:r>
         <w:rPr>
           <w:rFonts w:ascii="Arial" w:hAnsi="Arial" w:cs="Arial"/>
@@ -9325,6 +9864,7 @@
         </w:rPr>
         <w:t>d</w:t>
       </w:r>
+      <w:proofErr w:type="spellEnd"/>
     </w:p>
     <w:p>
       <w:pPr>
@@ -11026,7 +11566,27 @@
           <w:szCs w:val="24"/>
           <w:lang w:val="en-US"/>
         </w:rPr>
-        <w:t xml:space="preserve"> the CourseService is responsible for</w:t>
+        <w:t xml:space="preserve"> the </w:t>
+      </w:r>
+      <w:proofErr w:type="spellStart"/>
+      <w:r>
+        <w:rPr>
+          <w:rFonts w:ascii="Arial" w:hAnsi="Arial" w:cs="Arial"/>
+          <w:sz w:val="24"/>
+          <w:szCs w:val="24"/>
+          <w:lang w:val="en-US"/>
+        </w:rPr>
+        <w:t>CourseService</w:t>
+      </w:r>
+      <w:proofErr w:type="spellEnd"/>
+      <w:r>
+        <w:rPr>
+          <w:rFonts w:ascii="Arial" w:hAnsi="Arial" w:cs="Arial"/>
+          <w:sz w:val="24"/>
+          <w:szCs w:val="24"/>
+          <w:lang w:val="en-US"/>
+        </w:rPr>
+        <w:t xml:space="preserve"> is responsible for</w:t>
       </w:r>
       <w:r>
         <w:rPr>
@@ -11080,8 +11640,19 @@
           <w:szCs w:val="24"/>
           <w:lang w:val="en-US"/>
         </w:rPr>
-        <w:t xml:space="preserve"> the Courses and AddCourse</w:t>
-      </w:r>
+        <w:t xml:space="preserve"> the Courses and </w:t>
+      </w:r>
+      <w:proofErr w:type="spellStart"/>
+      <w:r>
+        <w:rPr>
+          <w:rFonts w:ascii="Arial" w:hAnsi="Arial" w:cs="Arial"/>
+          <w:sz w:val="24"/>
+          <w:szCs w:val="24"/>
+          <w:lang w:val="en-US"/>
+        </w:rPr>
+        <w:t>AddCourse</w:t>
+      </w:r>
+      <w:proofErr w:type="spellEnd"/>
       <w:r>
         <w:rPr>
           <w:rFonts w:ascii="Arial" w:hAnsi="Arial" w:cs="Arial"/>
@@ -11475,7 +12046,27 @@
           <w:szCs w:val="24"/>
           <w:lang w:val="en-US"/>
         </w:rPr>
-        <w:t>The AcademicDbContext class</w:t>
+        <w:t xml:space="preserve">The </w:t>
+      </w:r>
+      <w:proofErr w:type="spellStart"/>
+      <w:r>
+        <w:rPr>
+          <w:rFonts w:ascii="Arial" w:hAnsi="Arial" w:cs="Arial"/>
+          <w:sz w:val="24"/>
+          <w:szCs w:val="24"/>
+          <w:lang w:val="en-US"/>
+        </w:rPr>
+        <w:t>AcademicDbContext</w:t>
+      </w:r>
+      <w:proofErr w:type="spellEnd"/>
+      <w:r>
+        <w:rPr>
+          <w:rFonts w:ascii="Arial" w:hAnsi="Arial" w:cs="Arial"/>
+          <w:sz w:val="24"/>
+          <w:szCs w:val="24"/>
+          <w:lang w:val="en-US"/>
+        </w:rPr>
+        <w:t xml:space="preserve"> class</w:t>
       </w:r>
       <w:r>
         <w:rPr>
@@ -11859,8 +12450,13 @@
           <w:lang w:val="en-US"/>
         </w:rPr>
       </w:pPr>
-      <w:r>
-        <w:t xml:space="preserve">Figure </w:t>
+      <w:proofErr w:type="spellStart"/>
+      <w:r>
+        <w:t>Figure</w:t>
+      </w:r>
+      <w:proofErr w:type="spellEnd"/>
+      <w:r>
+        <w:t xml:space="preserve"> </w:t>
       </w:r>
       <w:fldSimple w:instr=" SEQ Figure \* ARABIC ">
         <w:r>
@@ -12049,7 +12645,27 @@
           <w:szCs w:val="24"/>
           <w:lang w:val="en-US"/>
         </w:rPr>
-        <w:t xml:space="preserve"> the SemesterId foreign key</w:t>
+        <w:t xml:space="preserve"> the </w:t>
+      </w:r>
+      <w:proofErr w:type="spellStart"/>
+      <w:r>
+        <w:rPr>
+          <w:rFonts w:ascii="Arial" w:hAnsi="Arial" w:cs="Arial"/>
+          <w:sz w:val="24"/>
+          <w:szCs w:val="24"/>
+          <w:lang w:val="en-US"/>
+        </w:rPr>
+        <w:t>SemesterId</w:t>
+      </w:r>
+      <w:proofErr w:type="spellEnd"/>
+      <w:r>
+        <w:rPr>
+          <w:rFonts w:ascii="Arial" w:hAnsi="Arial" w:cs="Arial"/>
+          <w:sz w:val="24"/>
+          <w:szCs w:val="24"/>
+          <w:lang w:val="en-US"/>
+        </w:rPr>
+        <w:t xml:space="preserve"> foreign key</w:t>
       </w:r>
       <w:r>
         <w:rPr>
@@ -13137,8 +13753,13 @@
       <w:pPr>
         <w:pStyle w:val="Caption"/>
       </w:pPr>
-      <w:r>
-        <w:t xml:space="preserve">Figure </w:t>
+      <w:proofErr w:type="spellStart"/>
+      <w:r>
+        <w:t>Figure</w:t>
+      </w:r>
+      <w:proofErr w:type="spellEnd"/>
+      <w:r>
+        <w:t xml:space="preserve"> </w:t>
       </w:r>
       <w:fldSimple w:instr=" SEQ Figure \* ARABIC ">
         <w:r>
@@ -13232,7 +13853,21 @@
         <w:rPr>
           <w:lang w:val="en-US"/>
         </w:rPr>
-        <w:t xml:space="preserve"> The SemesterId property</w:t>
+        <w:t xml:space="preserve"> The </w:t>
+      </w:r>
+      <w:proofErr w:type="spellStart"/>
+      <w:r>
+        <w:rPr>
+          <w:lang w:val="en-US"/>
+        </w:rPr>
+        <w:t>SemesterId</w:t>
+      </w:r>
+      <w:proofErr w:type="spellEnd"/>
+      <w:r>
+        <w:rPr>
+          <w:lang w:val="en-US"/>
+        </w:rPr>
+        <w:t xml:space="preserve"> property</w:t>
       </w:r>
       <w:r>
         <w:rPr>
@@ -13366,7 +14001,21 @@
         <w:rPr>
           <w:lang w:val="en-US"/>
         </w:rPr>
-        <w:t xml:space="preserve"> AcademicDbContext.</w:t>
+        <w:t xml:space="preserve"> </w:t>
+      </w:r>
+      <w:proofErr w:type="spellStart"/>
+      <w:r>
+        <w:rPr>
+          <w:lang w:val="en-US"/>
+        </w:rPr>
+        <w:t>AcademicDbContext</w:t>
+      </w:r>
+      <w:proofErr w:type="spellEnd"/>
+      <w:r>
+        <w:rPr>
+          <w:lang w:val="en-US"/>
+        </w:rPr>
+        <w:t>.</w:t>
       </w:r>
       <w:r>
         <w:rPr>
@@ -13726,7 +14375,21 @@
         <w:rPr>
           <w:lang w:val="en-US"/>
         </w:rPr>
-        <w:t xml:space="preserve"> the GPA calculation</w:t>
+        <w:t xml:space="preserve"> </w:t>
+      </w:r>
+      <w:proofErr w:type="gramStart"/>
+      <w:r>
+        <w:rPr>
+          <w:lang w:val="en-US"/>
+        </w:rPr>
+        <w:t>the GPA</w:t>
+      </w:r>
+      <w:proofErr w:type="gramEnd"/>
+      <w:r>
+        <w:rPr>
+          <w:lang w:val="en-US"/>
+        </w:rPr>
+        <w:t xml:space="preserve"> calculation</w:t>
       </w:r>
       <w:r>
         <w:rPr>
@@ -13834,13 +14497,41 @@
         <w:rPr>
           <w:lang w:val="en-US"/>
         </w:rPr>
-        <w:t xml:space="preserve"> of the corresponding course</w:t>
-      </w:r>
-      <w:r>
-        <w:rPr>
-          <w:lang w:val="en-US"/>
-        </w:rPr>
-        <w:t xml:space="preserve"> in order to obtain</w:t>
+        <w:t xml:space="preserve"> </w:t>
+      </w:r>
+      <w:proofErr w:type="gramStart"/>
+      <w:r>
+        <w:rPr>
+          <w:lang w:val="en-US"/>
+        </w:rPr>
+        <w:t>of</w:t>
+      </w:r>
+      <w:proofErr w:type="gramEnd"/>
+      <w:r>
+        <w:rPr>
+          <w:lang w:val="en-US"/>
+        </w:rPr>
+        <w:t xml:space="preserve"> the corresponding course</w:t>
+      </w:r>
+      <w:r>
+        <w:rPr>
+          <w:lang w:val="en-US"/>
+        </w:rPr>
+        <w:t xml:space="preserve"> </w:t>
+      </w:r>
+      <w:proofErr w:type="gramStart"/>
+      <w:r>
+        <w:rPr>
+          <w:lang w:val="en-US"/>
+        </w:rPr>
+        <w:t>in order to</w:t>
+      </w:r>
+      <w:proofErr w:type="gramEnd"/>
+      <w:r>
+        <w:rPr>
+          <w:lang w:val="en-US"/>
+        </w:rPr>
+        <w:t xml:space="preserve"> obtain</w:t>
       </w:r>
       <w:r>
         <w:rPr>
@@ -14216,7 +14907,21 @@
         <w:rPr>
           <w:lang w:val="en-US"/>
         </w:rPr>
-        <w:t xml:space="preserve"> GpaCalculator service.</w:t>
+        <w:t xml:space="preserve"> </w:t>
+      </w:r>
+      <w:proofErr w:type="spellStart"/>
+      <w:r>
+        <w:rPr>
+          <w:lang w:val="en-US"/>
+        </w:rPr>
+        <w:t>GpaCalculator</w:t>
+      </w:r>
+      <w:proofErr w:type="spellEnd"/>
+      <w:r>
+        <w:rPr>
+          <w:lang w:val="en-US"/>
+        </w:rPr>
+        <w:t xml:space="preserve"> service.</w:t>
       </w:r>
       <w:r>
         <w:rPr>
@@ -14441,7 +15146,21 @@
         <w:rPr>
           <w:lang w:val="en-US"/>
         </w:rPr>
-        <w:t>, the method returns a GPA</w:t>
+        <w:t xml:space="preserve">, the method </w:t>
+      </w:r>
+      <w:proofErr w:type="gramStart"/>
+      <w:r>
+        <w:rPr>
+          <w:lang w:val="en-US"/>
+        </w:rPr>
+        <w:t>returns</w:t>
+      </w:r>
+      <w:proofErr w:type="gramEnd"/>
+      <w:r>
+        <w:rPr>
+          <w:lang w:val="en-US"/>
+        </w:rPr>
+        <w:t xml:space="preserve"> a GPA</w:t>
       </w:r>
       <w:r>
         <w:rPr>
@@ -14569,7 +15288,21 @@
         <w:rPr>
           <w:lang w:val="en-US"/>
         </w:rPr>
-        <w:t>, or O(1)</w:t>
+        <w:t xml:space="preserve">, or </w:t>
+      </w:r>
+      <w:proofErr w:type="gramStart"/>
+      <w:r>
+        <w:rPr>
+          <w:lang w:val="en-US"/>
+        </w:rPr>
+        <w:t>O(</w:t>
+      </w:r>
+      <w:proofErr w:type="gramEnd"/>
+      <w:r>
+        <w:rPr>
+          <w:lang w:val="en-US"/>
+        </w:rPr>
+        <w:t>1)</w:t>
       </w:r>
       <w:r>
         <w:rPr>
@@ -15043,7 +15776,21 @@
         <w:rPr>
           <w:lang w:val="en-US"/>
         </w:rPr>
-        <w:t xml:space="preserve"> Because the hypothetical courses</w:t>
+        <w:t xml:space="preserve"> Because </w:t>
+      </w:r>
+      <w:proofErr w:type="gramStart"/>
+      <w:r>
+        <w:rPr>
+          <w:lang w:val="en-US"/>
+        </w:rPr>
+        <w:t>the hypothetical</w:t>
+      </w:r>
+      <w:proofErr w:type="gramEnd"/>
+      <w:r>
+        <w:rPr>
+          <w:lang w:val="en-US"/>
+        </w:rPr>
+        <w:t xml:space="preserve"> courses</w:t>
       </w:r>
       <w:r>
         <w:rPr>
@@ -15819,7 +16566,21 @@
         <w:rPr>
           <w:lang w:val="en-US"/>
         </w:rPr>
-        <w:t xml:space="preserve"> is performed through</w:t>
+        <w:t xml:space="preserve"> </w:t>
+      </w:r>
+      <w:proofErr w:type="gramStart"/>
+      <w:r>
+        <w:rPr>
+          <w:lang w:val="en-US"/>
+        </w:rPr>
+        <w:t>is</w:t>
+      </w:r>
+      <w:proofErr w:type="gramEnd"/>
+      <w:r>
+        <w:rPr>
+          <w:lang w:val="en-US"/>
+        </w:rPr>
+        <w:t xml:space="preserve"> performed through</w:t>
       </w:r>
       <w:r>
         <w:rPr>
@@ -16113,6 +16874,718 @@
         </w:rPr>
         <w:t xml:space="preserve"> chooses an existing Semester entity.</w:t>
       </w:r>
+      <w:r>
+        <w:rPr>
+          <w:lang w:val="en-US"/>
+        </w:rPr>
+        <w:t xml:space="preserve"> This design reduces </w:t>
+      </w:r>
+      <w:r>
+        <w:rPr>
+          <w:lang w:val="en-US"/>
+        </w:rPr>
+        <w:t>inconsistent values</w:t>
+      </w:r>
+      <w:r>
+        <w:rPr>
+          <w:lang w:val="en-US"/>
+        </w:rPr>
+        <w:t xml:space="preserve"> such as</w:t>
+      </w:r>
+      <w:r>
+        <w:rPr>
+          <w:lang w:val="en-US"/>
+        </w:rPr>
+        <w:t xml:space="preserve"> different spellings of</w:t>
+      </w:r>
+      <w:r>
+        <w:rPr>
+          <w:lang w:val="en-US"/>
+        </w:rPr>
+        <w:t xml:space="preserve"> the same semester</w:t>
+      </w:r>
+      <w:r>
+        <w:rPr>
+          <w:lang w:val="en-US"/>
+        </w:rPr>
+        <w:t xml:space="preserve"> and preserves</w:t>
+      </w:r>
+      <w:r>
+        <w:rPr>
+          <w:lang w:val="en-US"/>
+        </w:rPr>
+        <w:t xml:space="preserve"> the relationship between</w:t>
+      </w:r>
+      <w:r>
+        <w:rPr>
+          <w:lang w:val="en-US"/>
+        </w:rPr>
+        <w:t xml:space="preserve"> Course and Semester records.</w:t>
+      </w:r>
+    </w:p>
+    <w:p>
+      <w:pPr>
+        <w:rPr>
+          <w:lang w:val="en-US"/>
+        </w:rPr>
+      </w:pPr>
+    </w:p>
+    <w:p>
+      <w:pPr>
+        <w:rPr>
+          <w:lang w:val="en-US"/>
+        </w:rPr>
+      </w:pPr>
+      <w:r>
+        <w:rPr>
+          <w:lang w:val="en-US"/>
+        </w:rPr>
+        <w:t>The Semesters page</w:t>
+      </w:r>
+      <w:r>
+        <w:rPr>
+          <w:lang w:val="en-US"/>
+        </w:rPr>
+        <w:t xml:space="preserve"> provides a </w:t>
+      </w:r>
+      <w:r>
+        <w:rPr>
+          <w:lang w:val="en-US"/>
+        </w:rPr>
+        <w:t>higher-level view</w:t>
+      </w:r>
+      <w:r>
+        <w:rPr>
+          <w:lang w:val="en-US"/>
+        </w:rPr>
+        <w:t xml:space="preserve"> of the academic record.</w:t>
+      </w:r>
+      <w:r>
+        <w:rPr>
+          <w:lang w:val="en-US"/>
+        </w:rPr>
+        <w:t xml:space="preserve"> Each semester can</w:t>
+      </w:r>
+      <w:r>
+        <w:rPr>
+          <w:lang w:val="en-US"/>
+        </w:rPr>
+        <w:t xml:space="preserve"> display the</w:t>
+      </w:r>
+      <w:r>
+        <w:rPr>
+          <w:lang w:val="en-US"/>
+        </w:rPr>
+        <w:t xml:space="preserve"> number of associated courses</w:t>
+      </w:r>
+      <w:r>
+        <w:rPr>
+          <w:lang w:val="en-US"/>
+        </w:rPr>
+        <w:t>, attempted credits</w:t>
+      </w:r>
+      <w:r>
+        <w:rPr>
+          <w:lang w:val="en-US"/>
+        </w:rPr>
+        <w:t>, and semester GPA</w:t>
+      </w:r>
+      <w:r>
+        <w:rPr>
+          <w:lang w:val="en-US"/>
+        </w:rPr>
+        <w:t>.</w:t>
+      </w:r>
+      <w:r>
+        <w:rPr>
+          <w:lang w:val="en-US"/>
+        </w:rPr>
+        <w:t xml:space="preserve"> A semester-details page</w:t>
+      </w:r>
+      <w:r>
+        <w:rPr>
+          <w:lang w:val="en-US"/>
+        </w:rPr>
+        <w:t xml:space="preserve"> allows the user</w:t>
+      </w:r>
+      <w:r>
+        <w:rPr>
+          <w:lang w:val="en-US"/>
+        </w:rPr>
+        <w:t xml:space="preserve"> to inspect the individual</w:t>
+      </w:r>
+      <w:r>
+        <w:rPr>
+          <w:lang w:val="en-US"/>
+        </w:rPr>
+        <w:t xml:space="preserve"> courses belonging to</w:t>
+      </w:r>
+      <w:r>
+        <w:rPr>
+          <w:lang w:val="en-US"/>
+        </w:rPr>
+        <w:t xml:space="preserve"> that semester.</w:t>
+      </w:r>
+    </w:p>
+    <w:p>
+      <w:pPr>
+        <w:rPr>
+          <w:lang w:val="en-US"/>
+        </w:rPr>
+      </w:pPr>
+    </w:p>
+    <w:p>
+      <w:pPr>
+        <w:rPr>
+          <w:lang w:val="en-US"/>
+        </w:rPr>
+      </w:pPr>
+      <w:r>
+        <w:rPr>
+          <w:lang w:val="en-US"/>
+        </w:rPr>
+        <w:t>The interface is</w:t>
+      </w:r>
+      <w:r>
+        <w:rPr>
+          <w:lang w:val="en-US"/>
+        </w:rPr>
+        <w:t xml:space="preserve"> intentionally divided into</w:t>
+      </w:r>
+      <w:r>
+        <w:rPr>
+          <w:lang w:val="en-US"/>
+        </w:rPr>
+        <w:t xml:space="preserve"> separate pages</w:t>
+      </w:r>
+      <w:r>
+        <w:rPr>
+          <w:lang w:val="en-US"/>
+        </w:rPr>
+        <w:t xml:space="preserve"> rather than combining</w:t>
+      </w:r>
+      <w:r>
+        <w:rPr>
+          <w:lang w:val="en-US"/>
+        </w:rPr>
+        <w:t xml:space="preserve"> every feature</w:t>
+      </w:r>
+      <w:r>
+        <w:rPr>
+          <w:lang w:val="en-US"/>
+        </w:rPr>
+        <w:t xml:space="preserve"> into one larger</w:t>
+      </w:r>
+      <w:r>
+        <w:rPr>
+          <w:lang w:val="en-US"/>
+        </w:rPr>
+        <w:t xml:space="preserve"> form.</w:t>
+      </w:r>
+      <w:r>
+        <w:rPr>
+          <w:lang w:val="en-US"/>
+        </w:rPr>
+        <w:t xml:space="preserve"> This reduces visual</w:t>
+      </w:r>
+      <w:r>
+        <w:rPr>
+          <w:lang w:val="en-US"/>
+        </w:rPr>
+        <w:t xml:space="preserve"> complexity</w:t>
+      </w:r>
+      <w:r>
+        <w:rPr>
+          <w:lang w:val="en-US"/>
+        </w:rPr>
+        <w:t xml:space="preserve"> and reflects the</w:t>
+      </w:r>
+      <w:r>
+        <w:rPr>
+          <w:lang w:val="en-US"/>
+        </w:rPr>
+        <w:t xml:space="preserve"> underlying separation</w:t>
+      </w:r>
+      <w:r>
+        <w:rPr>
+          <w:lang w:val="en-US"/>
+        </w:rPr>
+        <w:t xml:space="preserve"> of responsibilities in the</w:t>
+      </w:r>
+      <w:r>
+        <w:rPr>
+          <w:lang w:val="en-US"/>
+        </w:rPr>
+        <w:t xml:space="preserve"> program.</w:t>
+      </w:r>
+      <w:r>
+        <w:rPr>
+          <w:lang w:val="en-US"/>
+        </w:rPr>
+        <w:t xml:space="preserve"> Course management, semester management</w:t>
+      </w:r>
+      <w:r>
+        <w:rPr>
+          <w:lang w:val="en-US"/>
+        </w:rPr>
+        <w:t>, calculations</w:t>
+      </w:r>
+      <w:r>
+        <w:rPr>
+          <w:lang w:val="en-US"/>
+        </w:rPr>
+        <w:t>, and progress</w:t>
+      </w:r>
+      <w:r>
+        <w:rPr>
+          <w:lang w:val="en-US"/>
+        </w:rPr>
+        <w:t xml:space="preserve"> information can</w:t>
+      </w:r>
+      <w:r>
+        <w:rPr>
+          <w:lang w:val="en-US"/>
+        </w:rPr>
+        <w:t xml:space="preserve"> therefore evolve</w:t>
+      </w:r>
+      <w:r>
+        <w:rPr>
+          <w:lang w:val="en-US"/>
+        </w:rPr>
+        <w:t xml:space="preserve"> independently while</w:t>
+      </w:r>
+      <w:r>
+        <w:rPr>
+          <w:lang w:val="en-US"/>
+        </w:rPr>
+        <w:t xml:space="preserve"> still being accessible</w:t>
+      </w:r>
+      <w:r>
+        <w:rPr>
+          <w:lang w:val="en-US"/>
+        </w:rPr>
+        <w:t xml:space="preserve"> through a consistent</w:t>
+      </w:r>
+      <w:r>
+        <w:rPr>
+          <w:lang w:val="en-US"/>
+        </w:rPr>
+        <w:t xml:space="preserve"> navigation structure.</w:t>
+      </w:r>
+    </w:p>
+    <w:p>
+      <w:pPr>
+        <w:rPr>
+          <w:lang w:val="en-US"/>
+        </w:rPr>
+      </w:pPr>
+    </w:p>
+    <w:p>
+      <w:pPr>
+        <w:rPr>
+          <w:lang w:val="en-US"/>
+        </w:rPr>
+      </w:pPr>
+      <w:r>
+        <w:rPr>
+          <w:lang w:val="en-US"/>
+        </w:rPr>
+        <w:lastRenderedPageBreak/>
+        <w:t>Validation feedback</w:t>
+      </w:r>
+      <w:r>
+        <w:rPr>
+          <w:lang w:val="en-US"/>
+        </w:rPr>
+        <w:t xml:space="preserve"> is displayed near</w:t>
+      </w:r>
+      <w:r>
+        <w:rPr>
+          <w:lang w:val="en-US"/>
+        </w:rPr>
+        <w:t xml:space="preserve"> the relevant fields</w:t>
+      </w:r>
+      <w:r>
+        <w:rPr>
+          <w:lang w:val="en-US"/>
+        </w:rPr>
+        <w:t xml:space="preserve"> and through validation</w:t>
+      </w:r>
+      <w:r>
+        <w:rPr>
+          <w:lang w:val="en-US"/>
+        </w:rPr>
+        <w:t xml:space="preserve"> summaries</w:t>
+      </w:r>
+      <w:r>
+        <w:rPr>
+          <w:lang w:val="en-US"/>
+        </w:rPr>
+        <w:t>.</w:t>
+      </w:r>
+      <w:r>
+        <w:rPr>
+          <w:lang w:val="en-US"/>
+        </w:rPr>
+        <w:t xml:space="preserve"> This gives the user</w:t>
+      </w:r>
+      <w:r>
+        <w:rPr>
+          <w:lang w:val="en-US"/>
+        </w:rPr>
+        <w:t xml:space="preserve"> immediate information</w:t>
+      </w:r>
+      <w:r>
+        <w:rPr>
+          <w:lang w:val="en-US"/>
+        </w:rPr>
+        <w:t xml:space="preserve"> when entered values</w:t>
+      </w:r>
+      <w:r>
+        <w:rPr>
+          <w:lang w:val="en-US"/>
+        </w:rPr>
+        <w:t xml:space="preserve"> do not satisfy the</w:t>
+      </w:r>
+      <w:r>
+        <w:rPr>
+          <w:lang w:val="en-US"/>
+        </w:rPr>
+        <w:t xml:space="preserve"> requirements</w:t>
+      </w:r>
+      <w:r>
+        <w:rPr>
+          <w:lang w:val="en-US"/>
+        </w:rPr>
+        <w:t xml:space="preserve"> of the data model</w:t>
+      </w:r>
+      <w:r>
+        <w:rPr>
+          <w:lang w:val="en-US"/>
+        </w:rPr>
+        <w:t>.</w:t>
+      </w:r>
+      <w:r>
+        <w:rPr>
+          <w:lang w:val="en-US"/>
+        </w:rPr>
+        <w:t xml:space="preserve"> Confir</w:t>
+      </w:r>
+      <w:r>
+        <w:rPr>
+          <w:lang w:val="en-US"/>
+        </w:rPr>
+        <w:t>mation is also</w:t>
+      </w:r>
+      <w:r>
+        <w:rPr>
+          <w:lang w:val="en-US"/>
+        </w:rPr>
+        <w:t xml:space="preserve"> used before</w:t>
+      </w:r>
+      <w:r>
+        <w:rPr>
+          <w:lang w:val="en-US"/>
+        </w:rPr>
+        <w:t xml:space="preserve"> destructive actions</w:t>
+      </w:r>
+      <w:r>
+        <w:rPr>
+          <w:lang w:val="en-US"/>
+        </w:rPr>
+        <w:t xml:space="preserve"> such as deleting</w:t>
+      </w:r>
+      <w:r>
+        <w:rPr>
+          <w:lang w:val="en-US"/>
+        </w:rPr>
+        <w:t xml:space="preserve"> a course </w:t>
+      </w:r>
+      <w:proofErr w:type="gramStart"/>
+      <w:r>
+        <w:rPr>
+          <w:lang w:val="en-US"/>
+        </w:rPr>
+        <w:t>in order to</w:t>
+      </w:r>
+      <w:proofErr w:type="gramEnd"/>
+      <w:r>
+        <w:rPr>
+          <w:lang w:val="en-US"/>
+        </w:rPr>
+        <w:t xml:space="preserve"> reduce accidental</w:t>
+      </w:r>
+      <w:r>
+        <w:rPr>
+          <w:lang w:val="en-US"/>
+        </w:rPr>
+        <w:t xml:space="preserve"> data loss</w:t>
+      </w:r>
+      <w:r>
+        <w:rPr>
+          <w:lang w:val="en-US"/>
+        </w:rPr>
+        <w:t>.</w:t>
+      </w:r>
+    </w:p>
+    <w:p>
+      <w:pPr>
+        <w:rPr>
+          <w:lang w:val="en-US"/>
+        </w:rPr>
+      </w:pPr>
+    </w:p>
+    <w:p>
+      <w:pPr>
+        <w:rPr>
+          <w:lang w:val="en-US"/>
+        </w:rPr>
+      </w:pPr>
+      <w:r>
+        <w:rPr>
+          <w:lang w:val="en-US"/>
+        </w:rPr>
+        <w:t>Additional interface</w:t>
+      </w:r>
+      <w:r>
+        <w:rPr>
+          <w:lang w:val="en-US"/>
+        </w:rPr>
+        <w:t xml:space="preserve"> sections are planned</w:t>
+      </w:r>
+      <w:r>
+        <w:rPr>
+          <w:lang w:val="en-US"/>
+        </w:rPr>
+        <w:t xml:space="preserve"> for the </w:t>
+      </w:r>
+      <w:r>
+        <w:rPr>
+          <w:lang w:val="en-US"/>
+        </w:rPr>
+        <w:t>What-if GPA Calculator</w:t>
+      </w:r>
+      <w:r>
+        <w:rPr>
+          <w:lang w:val="en-US"/>
+        </w:rPr>
+        <w:t xml:space="preserve"> and </w:t>
+      </w:r>
+      <w:r>
+        <w:rPr>
+          <w:lang w:val="en-US"/>
+        </w:rPr>
+        <w:t>Degree Progress</w:t>
+      </w:r>
+      <w:r>
+        <w:rPr>
+          <w:lang w:val="en-US"/>
+        </w:rPr>
+        <w:t xml:space="preserve"> functionality.</w:t>
+      </w:r>
+      <w:r>
+        <w:rPr>
+          <w:lang w:val="en-US"/>
+        </w:rPr>
+        <w:t xml:space="preserve"> These pages will</w:t>
+      </w:r>
+      <w:r>
+        <w:rPr>
+          <w:lang w:val="en-US"/>
+        </w:rPr>
+        <w:t xml:space="preserve"> follow the same design</w:t>
+      </w:r>
+      <w:r>
+        <w:rPr>
+          <w:lang w:val="en-US"/>
+        </w:rPr>
+        <w:t xml:space="preserve"> principles</w:t>
+      </w:r>
+      <w:r>
+        <w:rPr>
+          <w:lang w:val="en-US"/>
+        </w:rPr>
+        <w:t xml:space="preserve"> as the existing pages</w:t>
+      </w:r>
+      <w:r>
+        <w:rPr>
+          <w:lang w:val="en-US"/>
+        </w:rPr>
+        <w:t>: clearly grouped</w:t>
+      </w:r>
+      <w:r>
+        <w:rPr>
+          <w:lang w:val="en-US"/>
+        </w:rPr>
+        <w:t xml:space="preserve"> input controls</w:t>
+      </w:r>
+      <w:r>
+        <w:rPr>
+          <w:lang w:val="en-US"/>
+        </w:rPr>
+        <w:t>,</w:t>
+      </w:r>
+      <w:r>
+        <w:rPr>
+          <w:lang w:val="en-US"/>
+        </w:rPr>
+        <w:t xml:space="preserve"> immediate</w:t>
+      </w:r>
+      <w:r>
+        <w:rPr>
+          <w:lang w:val="en-US"/>
+        </w:rPr>
+        <w:t xml:space="preserve"> validation</w:t>
+      </w:r>
+      <w:r>
+        <w:rPr>
+          <w:lang w:val="en-US"/>
+        </w:rPr>
+        <w:t>, and easily</w:t>
+      </w:r>
+      <w:r>
+        <w:rPr>
+          <w:lang w:val="en-US"/>
+        </w:rPr>
+        <w:t xml:space="preserve"> interpretable output.</w:t>
+      </w:r>
+    </w:p>
+    <w:p>
+      <w:pPr>
+        <w:rPr>
+          <w:lang w:val="en-US"/>
+        </w:rPr>
+      </w:pPr>
+    </w:p>
+    <w:p>
+      <w:pPr>
+        <w:rPr>
+          <w:lang w:val="en-US"/>
+        </w:rPr>
+      </w:pPr>
+      <w:r>
+        <w:rPr>
+          <w:lang w:val="en-US"/>
+        </w:rPr>
+        <w:t>At the current stage</w:t>
+      </w:r>
+      <w:r>
+        <w:rPr>
+          <w:lang w:val="en-US"/>
+        </w:rPr>
+        <w:t>, visual complexity</w:t>
+      </w:r>
+      <w:r>
+        <w:rPr>
+          <w:lang w:val="en-US"/>
+        </w:rPr>
+        <w:t xml:space="preserve"> is intentionally limited.</w:t>
+      </w:r>
+      <w:r>
+        <w:rPr>
+          <w:lang w:val="en-US"/>
+        </w:rPr>
+        <w:t xml:space="preserve"> The primary objective</w:t>
+      </w:r>
+      <w:r>
+        <w:rPr>
+          <w:lang w:val="en-US"/>
+        </w:rPr>
+        <w:t xml:space="preserve"> of the interface</w:t>
+      </w:r>
+      <w:r>
+        <w:rPr>
+          <w:lang w:val="en-US"/>
+        </w:rPr>
+        <w:t xml:space="preserve"> is to support</w:t>
+      </w:r>
+      <w:r>
+        <w:rPr>
+          <w:lang w:val="en-US"/>
+        </w:rPr>
+        <w:t xml:space="preserve"> the application functionality</w:t>
+      </w:r>
+      <w:r>
+        <w:rPr>
+          <w:lang w:val="en-US"/>
+        </w:rPr>
+        <w:t xml:space="preserve"> clearly and </w:t>
+      </w:r>
+      <w:r>
+        <w:rPr>
+          <w:lang w:val="en-US"/>
+        </w:rPr>
+        <w:t>reliably</w:t>
+      </w:r>
+      <w:r>
+        <w:rPr>
+          <w:lang w:val="en-US"/>
+        </w:rPr>
+        <w:t xml:space="preserve"> rather</w:t>
+      </w:r>
+      <w:r>
+        <w:rPr>
+          <w:lang w:val="en-US"/>
+        </w:rPr>
+        <w:t xml:space="preserve"> than to</w:t>
+      </w:r>
+      <w:r>
+        <w:rPr>
+          <w:lang w:val="en-US"/>
+        </w:rPr>
+        <w:t xml:space="preserve"> introduce</w:t>
+      </w:r>
+      <w:r>
+        <w:rPr>
+          <w:lang w:val="en-US"/>
+        </w:rPr>
+        <w:t xml:space="preserve"> unnecessary graphical</w:t>
+      </w:r>
+      <w:r>
+        <w:rPr>
+          <w:lang w:val="en-US"/>
+        </w:rPr>
+        <w:t xml:space="preserve"> elements.</w:t>
+      </w:r>
+    </w:p>
+    <w:p>
+      <w:pPr>
+        <w:rPr>
+          <w:lang w:val="en-US"/>
+        </w:rPr>
+      </w:pPr>
+    </w:p>
+    <w:p>
+      <w:pPr>
+        <w:pStyle w:val="ListParagraph"/>
+        <w:numPr>
+          <w:ilvl w:val="1"/>
+          <w:numId w:val="1"/>
+        </w:numPr>
+        <w:rPr>
+          <w:lang w:val="en-US"/>
+        </w:rPr>
+      </w:pPr>
+      <w:r>
+        <w:rPr>
+          <w:lang w:val="en-US"/>
+        </w:rPr>
+        <w:t>Deployment Design</w:t>
+      </w:r>
+    </w:p>
+    <w:p>
+      <w:pPr>
+        <w:rPr>
+          <w:lang w:val="en-US"/>
+        </w:rPr>
+      </w:pPr>
+    </w:p>
+    <w:p>
+      <w:pPr>
+        <w:rPr>
+          <w:lang w:val="en-US"/>
+        </w:rPr>
+      </w:pPr>
     </w:p>
     <w:sectPr>
       <w:footerReference w:type="default" r:id="rId9"/>

</xml_diff>

<commit_message>
Did a little more work on my thesis.
</commit_message>
<xml_diff>
--- a/Project Thesis.docx
+++ b/Project Thesis.docx
@@ -6061,19 +6061,1070 @@
           <w:lang w:val="en-US"/>
         </w:rPr>
         <w:lastRenderedPageBreak/>
+        <w:t>FUNCTION AddCourse</w:t>
+      </w:r>
+    </w:p>
+    <w:p>
+      <w:pPr>
+        <w:spacing w:line="360" w:lineRule="auto"/>
+        <w:rPr>
+          <w:rFonts w:ascii="Arial" w:hAnsi="Arial" w:cs="Arial"/>
+          <w:sz w:val="24"/>
+          <w:szCs w:val="24"/>
+          <w:lang w:val="en-US"/>
+        </w:rPr>
+      </w:pPr>
+    </w:p>
+    <w:p>
+      <w:pPr>
+        <w:spacing w:line="360" w:lineRule="auto"/>
+        <w:rPr>
+          <w:rFonts w:ascii="Arial" w:hAnsi="Arial" w:cs="Arial"/>
+          <w:sz w:val="24"/>
+          <w:szCs w:val="24"/>
+          <w:lang w:val="en-US"/>
+        </w:rPr>
+      </w:pPr>
+      <w:r>
+        <w:rPr>
+          <w:rFonts w:ascii="Arial" w:hAnsi="Arial" w:cs="Arial"/>
+          <w:sz w:val="24"/>
+          <w:szCs w:val="24"/>
+          <w:lang w:val="en-US"/>
+        </w:rPr>
+        <w:t xml:space="preserve">   </w:t>
+      </w:r>
+      <w:r>
+        <w:rPr>
+          <w:rFonts w:ascii="Arial" w:hAnsi="Arial" w:cs="Arial"/>
+          <w:sz w:val="24"/>
+          <w:szCs w:val="24"/>
+          <w:lang w:val="en-US"/>
+        </w:rPr>
+        <w:t>DISPLAY Add Course form</w:t>
+      </w:r>
+    </w:p>
+    <w:p>
+      <w:pPr>
+        <w:spacing w:line="360" w:lineRule="auto"/>
+        <w:rPr>
+          <w:rFonts w:ascii="Arial" w:hAnsi="Arial" w:cs="Arial"/>
+          <w:sz w:val="24"/>
+          <w:szCs w:val="24"/>
+          <w:lang w:val="en-US"/>
+        </w:rPr>
+      </w:pPr>
+    </w:p>
+    <w:p>
+      <w:pPr>
+        <w:spacing w:line="360" w:lineRule="auto"/>
+        <w:rPr>
+          <w:rFonts w:ascii="Arial" w:hAnsi="Arial" w:cs="Arial"/>
+          <w:sz w:val="24"/>
+          <w:szCs w:val="24"/>
+          <w:lang w:val="en-US"/>
+        </w:rPr>
+      </w:pPr>
+      <w:r>
+        <w:rPr>
+          <w:rFonts w:ascii="Arial" w:hAnsi="Arial" w:cs="Arial"/>
+          <w:sz w:val="24"/>
+          <w:szCs w:val="24"/>
+          <w:lang w:val="en-US"/>
+        </w:rPr>
+        <w:t xml:space="preserve">   </w:t>
+      </w:r>
+      <w:r>
+        <w:rPr>
+          <w:rFonts w:ascii="Arial" w:hAnsi="Arial" w:cs="Arial"/>
+          <w:sz w:val="24"/>
+          <w:szCs w:val="24"/>
+          <w:lang w:val="en-US"/>
+        </w:rPr>
+        <w:t>READ course code</w:t>
+      </w:r>
+    </w:p>
+    <w:p>
+      <w:pPr>
+        <w:spacing w:line="360" w:lineRule="auto"/>
+        <w:rPr>
+          <w:rFonts w:ascii="Arial" w:hAnsi="Arial" w:cs="Arial"/>
+          <w:sz w:val="24"/>
+          <w:szCs w:val="24"/>
+          <w:lang w:val="en-US"/>
+        </w:rPr>
+      </w:pPr>
+      <w:r>
+        <w:rPr>
+          <w:rFonts w:ascii="Arial" w:hAnsi="Arial" w:cs="Arial"/>
+          <w:sz w:val="24"/>
+          <w:szCs w:val="24"/>
+          <w:lang w:val="en-US"/>
+        </w:rPr>
+        <w:t xml:space="preserve">   </w:t>
+      </w:r>
+      <w:r>
+        <w:rPr>
+          <w:rFonts w:ascii="Arial" w:hAnsi="Arial" w:cs="Arial"/>
+          <w:sz w:val="24"/>
+          <w:szCs w:val="24"/>
+          <w:lang w:val="en-US"/>
+        </w:rPr>
+        <w:t>READ course name</w:t>
+      </w:r>
+    </w:p>
+    <w:p>
+      <w:pPr>
+        <w:spacing w:line="360" w:lineRule="auto"/>
+        <w:rPr>
+          <w:rFonts w:ascii="Arial" w:hAnsi="Arial" w:cs="Arial"/>
+          <w:sz w:val="24"/>
+          <w:szCs w:val="24"/>
+          <w:lang w:val="en-US"/>
+        </w:rPr>
+      </w:pPr>
+      <w:r>
+        <w:rPr>
+          <w:rFonts w:ascii="Arial" w:hAnsi="Arial" w:cs="Arial"/>
+          <w:sz w:val="24"/>
+          <w:szCs w:val="24"/>
+          <w:lang w:val="en-US"/>
+        </w:rPr>
+        <w:t xml:space="preserve">   </w:t>
+      </w:r>
+      <w:r>
+        <w:rPr>
+          <w:rFonts w:ascii="Arial" w:hAnsi="Arial" w:cs="Arial"/>
+          <w:sz w:val="24"/>
+          <w:szCs w:val="24"/>
+          <w:lang w:val="en-US"/>
+        </w:rPr>
+        <w:t>READ credits</w:t>
+      </w:r>
+    </w:p>
+    <w:p>
+      <w:pPr>
+        <w:spacing w:line="360" w:lineRule="auto"/>
+        <w:rPr>
+          <w:rFonts w:ascii="Arial" w:hAnsi="Arial" w:cs="Arial"/>
+          <w:sz w:val="24"/>
+          <w:szCs w:val="24"/>
+          <w:lang w:val="en-US"/>
+        </w:rPr>
+      </w:pPr>
+      <w:r>
+        <w:rPr>
+          <w:rFonts w:ascii="Arial" w:hAnsi="Arial" w:cs="Arial"/>
+          <w:sz w:val="24"/>
+          <w:szCs w:val="24"/>
+          <w:lang w:val="en-US"/>
+        </w:rPr>
+        <w:t xml:space="preserve">   </w:t>
+      </w:r>
+      <w:r>
+        <w:rPr>
+          <w:rFonts w:ascii="Arial" w:hAnsi="Arial" w:cs="Arial"/>
+          <w:sz w:val="24"/>
+          <w:szCs w:val="24"/>
+          <w:lang w:val="en-US"/>
+        </w:rPr>
+        <w:t>READ grade</w:t>
+      </w:r>
+    </w:p>
+    <w:p>
+      <w:pPr>
+        <w:spacing w:line="360" w:lineRule="auto"/>
+        <w:rPr>
+          <w:rFonts w:ascii="Arial" w:hAnsi="Arial" w:cs="Arial"/>
+          <w:sz w:val="24"/>
+          <w:szCs w:val="24"/>
+          <w:lang w:val="en-US"/>
+        </w:rPr>
+      </w:pPr>
+      <w:r>
+        <w:rPr>
+          <w:rFonts w:ascii="Arial" w:hAnsi="Arial" w:cs="Arial"/>
+          <w:sz w:val="24"/>
+          <w:szCs w:val="24"/>
+          <w:lang w:val="en-US"/>
+        </w:rPr>
+        <w:t xml:space="preserve">   </w:t>
+      </w:r>
+      <w:r>
+        <w:rPr>
+          <w:rFonts w:ascii="Arial" w:hAnsi="Arial" w:cs="Arial"/>
+          <w:sz w:val="24"/>
+          <w:szCs w:val="24"/>
+          <w:lang w:val="en-US"/>
+        </w:rPr>
+        <w:t>READ semester</w:t>
+      </w:r>
+    </w:p>
+    <w:p>
+      <w:pPr>
+        <w:spacing w:line="360" w:lineRule="auto"/>
+        <w:rPr>
+          <w:rFonts w:ascii="Arial" w:hAnsi="Arial" w:cs="Arial"/>
+          <w:sz w:val="24"/>
+          <w:szCs w:val="24"/>
+          <w:lang w:val="en-US"/>
+        </w:rPr>
+      </w:pPr>
+    </w:p>
+    <w:p>
+      <w:pPr>
+        <w:spacing w:line="360" w:lineRule="auto"/>
+        <w:rPr>
+          <w:rFonts w:ascii="Arial" w:hAnsi="Arial" w:cs="Arial"/>
+          <w:sz w:val="24"/>
+          <w:szCs w:val="24"/>
+          <w:lang w:val="en-US"/>
+        </w:rPr>
+      </w:pPr>
+      <w:r>
+        <w:rPr>
+          <w:rFonts w:ascii="Arial" w:hAnsi="Arial" w:cs="Arial"/>
+          <w:sz w:val="24"/>
+          <w:szCs w:val="24"/>
+          <w:lang w:val="en-US"/>
+        </w:rPr>
+        <w:t xml:space="preserve">   </w:t>
+      </w:r>
+      <w:r>
+        <w:rPr>
+          <w:rFonts w:ascii="Arial" w:hAnsi="Arial" w:cs="Arial"/>
+          <w:sz w:val="24"/>
+          <w:szCs w:val="24"/>
+          <w:lang w:val="en-US"/>
+        </w:rPr>
+        <w:t>IF course code is empty</w:t>
+      </w:r>
+    </w:p>
+    <w:p>
+      <w:pPr>
+        <w:spacing w:line="360" w:lineRule="auto"/>
+        <w:rPr>
+          <w:rFonts w:ascii="Arial" w:hAnsi="Arial" w:cs="Arial"/>
+          <w:sz w:val="24"/>
+          <w:szCs w:val="24"/>
+          <w:lang w:val="en-US"/>
+        </w:rPr>
+      </w:pPr>
+      <w:r>
+        <w:rPr>
+          <w:rFonts w:ascii="Arial" w:hAnsi="Arial" w:cs="Arial"/>
+          <w:sz w:val="24"/>
+          <w:szCs w:val="24"/>
+          <w:lang w:val="en-US"/>
+        </w:rPr>
+        <w:t xml:space="preserve">      </w:t>
+      </w:r>
+      <w:r>
+        <w:rPr>
+          <w:rFonts w:ascii="Arial" w:hAnsi="Arial" w:cs="Arial"/>
+          <w:sz w:val="24"/>
+          <w:szCs w:val="24"/>
+          <w:lang w:val="en-US"/>
+        </w:rPr>
+        <w:t>DISPLAY validation error</w:t>
+      </w:r>
+    </w:p>
+    <w:p>
+      <w:pPr>
+        <w:spacing w:line="360" w:lineRule="auto"/>
+        <w:rPr>
+          <w:rFonts w:ascii="Arial" w:hAnsi="Arial" w:cs="Arial"/>
+          <w:sz w:val="24"/>
+          <w:szCs w:val="24"/>
+          <w:lang w:val="en-US"/>
+        </w:rPr>
+      </w:pPr>
+      <w:r>
+        <w:rPr>
+          <w:rFonts w:ascii="Arial" w:hAnsi="Arial" w:cs="Arial"/>
+          <w:sz w:val="24"/>
+          <w:szCs w:val="24"/>
+          <w:lang w:val="en-US"/>
+        </w:rPr>
+        <w:t xml:space="preserve">      </w:t>
+      </w:r>
+      <w:r>
+        <w:rPr>
+          <w:rFonts w:ascii="Arial" w:hAnsi="Arial" w:cs="Arial"/>
+          <w:sz w:val="24"/>
+          <w:szCs w:val="24"/>
+          <w:lang w:val="en-US"/>
+        </w:rPr>
+        <w:t>STOP</w:t>
+      </w:r>
+    </w:p>
+    <w:p>
+      <w:pPr>
+        <w:spacing w:line="360" w:lineRule="auto"/>
+        <w:rPr>
+          <w:rFonts w:ascii="Arial" w:hAnsi="Arial" w:cs="Arial"/>
+          <w:sz w:val="24"/>
+          <w:szCs w:val="24"/>
+          <w:lang w:val="en-US"/>
+        </w:rPr>
+      </w:pPr>
+      <w:r>
+        <w:rPr>
+          <w:rFonts w:ascii="Arial" w:hAnsi="Arial" w:cs="Arial"/>
+          <w:sz w:val="24"/>
+          <w:szCs w:val="24"/>
+          <w:lang w:val="en-US"/>
+        </w:rPr>
+        <w:t xml:space="preserve">   </w:t>
+      </w:r>
+      <w:r>
+        <w:rPr>
+          <w:rFonts w:ascii="Arial" w:hAnsi="Arial" w:cs="Arial"/>
+          <w:sz w:val="24"/>
+          <w:szCs w:val="24"/>
+          <w:lang w:val="en-US"/>
+        </w:rPr>
+        <w:t>END IF</w:t>
+      </w:r>
+    </w:p>
+    <w:p>
+      <w:pPr>
+        <w:spacing w:line="360" w:lineRule="auto"/>
+        <w:rPr>
+          <w:rFonts w:ascii="Arial" w:hAnsi="Arial" w:cs="Arial"/>
+          <w:sz w:val="24"/>
+          <w:szCs w:val="24"/>
+          <w:lang w:val="en-US"/>
+        </w:rPr>
+      </w:pPr>
+    </w:p>
+    <w:p>
+      <w:pPr>
+        <w:spacing w:line="360" w:lineRule="auto"/>
+        <w:rPr>
+          <w:rFonts w:ascii="Arial" w:hAnsi="Arial" w:cs="Arial"/>
+          <w:sz w:val="24"/>
+          <w:szCs w:val="24"/>
+          <w:lang w:val="en-US"/>
+        </w:rPr>
+      </w:pPr>
+      <w:r>
+        <w:rPr>
+          <w:rFonts w:ascii="Arial" w:hAnsi="Arial" w:cs="Arial"/>
+          <w:sz w:val="24"/>
+          <w:szCs w:val="24"/>
+          <w:lang w:val="en-US"/>
+        </w:rPr>
+        <w:t xml:space="preserve">   </w:t>
+      </w:r>
+      <w:r>
+        <w:rPr>
+          <w:rFonts w:ascii="Arial" w:hAnsi="Arial" w:cs="Arial"/>
+          <w:sz w:val="24"/>
+          <w:szCs w:val="24"/>
+          <w:lang w:val="en-US"/>
+        </w:rPr>
+        <w:t>IF course name is empty</w:t>
+      </w:r>
+    </w:p>
+    <w:p>
+      <w:pPr>
+        <w:spacing w:line="360" w:lineRule="auto"/>
+        <w:rPr>
+          <w:rFonts w:ascii="Arial" w:hAnsi="Arial" w:cs="Arial"/>
+          <w:sz w:val="24"/>
+          <w:szCs w:val="24"/>
+          <w:lang w:val="en-US"/>
+        </w:rPr>
+      </w:pPr>
+      <w:r>
+        <w:rPr>
+          <w:rFonts w:ascii="Arial" w:hAnsi="Arial" w:cs="Arial"/>
+          <w:sz w:val="24"/>
+          <w:szCs w:val="24"/>
+          <w:lang w:val="en-US"/>
+        </w:rPr>
+        <w:t xml:space="preserve">      </w:t>
+      </w:r>
+      <w:r>
+        <w:rPr>
+          <w:rFonts w:ascii="Arial" w:hAnsi="Arial" w:cs="Arial"/>
+          <w:sz w:val="24"/>
+          <w:szCs w:val="24"/>
+          <w:lang w:val="en-US"/>
+        </w:rPr>
+        <w:t>DISPLAY validation error</w:t>
+      </w:r>
+    </w:p>
+    <w:p>
+      <w:pPr>
+        <w:spacing w:line="360" w:lineRule="auto"/>
+        <w:rPr>
+          <w:rFonts w:ascii="Arial" w:hAnsi="Arial" w:cs="Arial"/>
+          <w:sz w:val="24"/>
+          <w:szCs w:val="24"/>
+          <w:lang w:val="en-US"/>
+        </w:rPr>
+      </w:pPr>
+      <w:r>
+        <w:rPr>
+          <w:rFonts w:ascii="Arial" w:hAnsi="Arial" w:cs="Arial"/>
+          <w:sz w:val="24"/>
+          <w:szCs w:val="24"/>
+          <w:lang w:val="en-US"/>
+        </w:rPr>
+        <w:t xml:space="preserve">      </w:t>
+      </w:r>
+      <w:r>
+        <w:rPr>
+          <w:rFonts w:ascii="Arial" w:hAnsi="Arial" w:cs="Arial"/>
+          <w:sz w:val="24"/>
+          <w:szCs w:val="24"/>
+          <w:lang w:val="en-US"/>
+        </w:rPr>
+        <w:t>STOP</w:t>
+      </w:r>
+    </w:p>
+    <w:p>
+      <w:pPr>
+        <w:spacing w:line="360" w:lineRule="auto"/>
+        <w:rPr>
+          <w:rFonts w:ascii="Arial" w:hAnsi="Arial" w:cs="Arial"/>
+          <w:sz w:val="24"/>
+          <w:szCs w:val="24"/>
+          <w:lang w:val="en-US"/>
+        </w:rPr>
+      </w:pPr>
+      <w:r>
+        <w:rPr>
+          <w:rFonts w:ascii="Arial" w:hAnsi="Arial" w:cs="Arial"/>
+          <w:sz w:val="24"/>
+          <w:szCs w:val="24"/>
+          <w:lang w:val="en-US"/>
+        </w:rPr>
+        <w:t xml:space="preserve">   </w:t>
+      </w:r>
+      <w:r>
+        <w:rPr>
+          <w:rFonts w:ascii="Arial" w:hAnsi="Arial" w:cs="Arial"/>
+          <w:sz w:val="24"/>
+          <w:szCs w:val="24"/>
+          <w:lang w:val="en-US"/>
+        </w:rPr>
+        <w:t>END IF</w:t>
+      </w:r>
+    </w:p>
+    <w:p>
+      <w:pPr>
+        <w:spacing w:line="360" w:lineRule="auto"/>
+        <w:rPr>
+          <w:rFonts w:ascii="Arial" w:hAnsi="Arial" w:cs="Arial"/>
+          <w:sz w:val="24"/>
+          <w:szCs w:val="24"/>
+          <w:lang w:val="en-US"/>
+        </w:rPr>
+      </w:pPr>
+    </w:p>
+    <w:p>
+      <w:pPr>
+        <w:spacing w:line="360" w:lineRule="auto"/>
+        <w:rPr>
+          <w:rFonts w:ascii="Arial" w:hAnsi="Arial" w:cs="Arial"/>
+          <w:sz w:val="24"/>
+          <w:szCs w:val="24"/>
+          <w:lang w:val="en-US"/>
+        </w:rPr>
+      </w:pPr>
+      <w:r>
+        <w:rPr>
+          <w:rFonts w:ascii="Arial" w:hAnsi="Arial" w:cs="Arial"/>
+          <w:sz w:val="24"/>
+          <w:szCs w:val="24"/>
+          <w:lang w:val="en-US"/>
+        </w:rPr>
+        <w:t xml:space="preserve">   </w:t>
+      </w:r>
+      <w:r>
+        <w:rPr>
+          <w:rFonts w:ascii="Arial" w:hAnsi="Arial" w:cs="Arial"/>
+          <w:sz w:val="24"/>
+          <w:szCs w:val="24"/>
+          <w:lang w:val="en-US"/>
+        </w:rPr>
+        <w:t>IF credits are outside the valid range</w:t>
+      </w:r>
+    </w:p>
+    <w:p>
+      <w:pPr>
+        <w:spacing w:line="360" w:lineRule="auto"/>
+        <w:rPr>
+          <w:rFonts w:ascii="Arial" w:hAnsi="Arial" w:cs="Arial"/>
+          <w:sz w:val="24"/>
+          <w:szCs w:val="24"/>
+          <w:lang w:val="en-US"/>
+        </w:rPr>
+      </w:pPr>
+      <w:r>
+        <w:rPr>
+          <w:rFonts w:ascii="Arial" w:hAnsi="Arial" w:cs="Arial"/>
+          <w:sz w:val="24"/>
+          <w:szCs w:val="24"/>
+          <w:lang w:val="en-US"/>
+        </w:rPr>
+        <w:t xml:space="preserve">      </w:t>
+      </w:r>
+      <w:r>
+        <w:rPr>
+          <w:rFonts w:ascii="Arial" w:hAnsi="Arial" w:cs="Arial"/>
+          <w:sz w:val="24"/>
+          <w:szCs w:val="24"/>
+          <w:lang w:val="en-US"/>
+        </w:rPr>
+        <w:t>DISPLAY validation error</w:t>
+      </w:r>
+    </w:p>
+    <w:p>
+      <w:pPr>
+        <w:spacing w:line="360" w:lineRule="auto"/>
+        <w:rPr>
+          <w:rFonts w:ascii="Arial" w:hAnsi="Arial" w:cs="Arial"/>
+          <w:sz w:val="24"/>
+          <w:szCs w:val="24"/>
+          <w:lang w:val="en-US"/>
+        </w:rPr>
+      </w:pPr>
+      <w:r>
+        <w:rPr>
+          <w:rFonts w:ascii="Arial" w:hAnsi="Arial" w:cs="Arial"/>
+          <w:sz w:val="24"/>
+          <w:szCs w:val="24"/>
+          <w:lang w:val="en-US"/>
+        </w:rPr>
+        <w:t xml:space="preserve">      </w:t>
+      </w:r>
+      <w:r>
+        <w:rPr>
+          <w:rFonts w:ascii="Arial" w:hAnsi="Arial" w:cs="Arial"/>
+          <w:sz w:val="24"/>
+          <w:szCs w:val="24"/>
+          <w:lang w:val="en-US"/>
+        </w:rPr>
+        <w:t>STOP</w:t>
+      </w:r>
+    </w:p>
+    <w:p>
+      <w:pPr>
+        <w:spacing w:line="360" w:lineRule="auto"/>
+        <w:rPr>
+          <w:rFonts w:ascii="Arial" w:hAnsi="Arial" w:cs="Arial"/>
+          <w:sz w:val="24"/>
+          <w:szCs w:val="24"/>
+          <w:lang w:val="en-US"/>
+        </w:rPr>
+      </w:pPr>
+      <w:r>
+        <w:rPr>
+          <w:rFonts w:ascii="Arial" w:hAnsi="Arial" w:cs="Arial"/>
+          <w:sz w:val="24"/>
+          <w:szCs w:val="24"/>
+          <w:lang w:val="en-US"/>
+        </w:rPr>
+        <w:t xml:space="preserve">   </w:t>
+      </w:r>
+      <w:r>
+        <w:rPr>
+          <w:rFonts w:ascii="Arial" w:hAnsi="Arial" w:cs="Arial"/>
+          <w:sz w:val="24"/>
+          <w:szCs w:val="24"/>
+          <w:lang w:val="en-US"/>
+        </w:rPr>
+        <w:t>END IF</w:t>
+      </w:r>
+    </w:p>
+    <w:p>
+      <w:pPr>
+        <w:spacing w:line="360" w:lineRule="auto"/>
+        <w:rPr>
+          <w:rFonts w:ascii="Arial" w:hAnsi="Arial" w:cs="Arial"/>
+          <w:sz w:val="24"/>
+          <w:szCs w:val="24"/>
+          <w:lang w:val="en-US"/>
+        </w:rPr>
+      </w:pPr>
+    </w:p>
+    <w:p>
+      <w:pPr>
+        <w:spacing w:line="360" w:lineRule="auto"/>
+        <w:rPr>
+          <w:rFonts w:ascii="Arial" w:hAnsi="Arial" w:cs="Arial"/>
+          <w:sz w:val="24"/>
+          <w:szCs w:val="24"/>
+          <w:lang w:val="en-US"/>
+        </w:rPr>
+      </w:pPr>
+      <w:r>
+        <w:rPr>
+          <w:rFonts w:ascii="Arial" w:hAnsi="Arial" w:cs="Arial"/>
+          <w:sz w:val="24"/>
+          <w:szCs w:val="24"/>
+          <w:lang w:val="en-US"/>
+        </w:rPr>
+        <w:t xml:space="preserve">   </w:t>
+      </w:r>
+      <w:r>
+        <w:rPr>
+          <w:rFonts w:ascii="Arial" w:hAnsi="Arial" w:cs="Arial"/>
+          <w:sz w:val="24"/>
+          <w:szCs w:val="24"/>
+          <w:lang w:val="en-US"/>
+        </w:rPr>
+        <w:t>IF grade is not valid</w:t>
+      </w:r>
+    </w:p>
+    <w:p>
+      <w:pPr>
+        <w:spacing w:line="360" w:lineRule="auto"/>
+        <w:rPr>
+          <w:rFonts w:ascii="Arial" w:hAnsi="Arial" w:cs="Arial"/>
+          <w:sz w:val="24"/>
+          <w:szCs w:val="24"/>
+          <w:lang w:val="en-US"/>
+        </w:rPr>
+      </w:pPr>
+      <w:r>
+        <w:rPr>
+          <w:rFonts w:ascii="Arial" w:hAnsi="Arial" w:cs="Arial"/>
+          <w:sz w:val="24"/>
+          <w:szCs w:val="24"/>
+          <w:lang w:val="en-US"/>
+        </w:rPr>
+        <w:t xml:space="preserve">      </w:t>
+      </w:r>
+      <w:r>
+        <w:rPr>
+          <w:rFonts w:ascii="Arial" w:hAnsi="Arial" w:cs="Arial"/>
+          <w:sz w:val="24"/>
+          <w:szCs w:val="24"/>
+          <w:lang w:val="en-US"/>
+        </w:rPr>
+        <w:t>DISPLAY validation error</w:t>
+      </w:r>
+    </w:p>
+    <w:p>
+      <w:pPr>
+        <w:spacing w:line="360" w:lineRule="auto"/>
+        <w:rPr>
+          <w:rFonts w:ascii="Arial" w:hAnsi="Arial" w:cs="Arial"/>
+          <w:sz w:val="24"/>
+          <w:szCs w:val="24"/>
+          <w:lang w:val="en-US"/>
+        </w:rPr>
+      </w:pPr>
+      <w:r>
+        <w:rPr>
+          <w:rFonts w:ascii="Arial" w:hAnsi="Arial" w:cs="Arial"/>
+          <w:sz w:val="24"/>
+          <w:szCs w:val="24"/>
+          <w:lang w:val="en-US"/>
+        </w:rPr>
+        <w:t xml:space="preserve">      </w:t>
+      </w:r>
+      <w:r>
+        <w:rPr>
+          <w:rFonts w:ascii="Arial" w:hAnsi="Arial" w:cs="Arial"/>
+          <w:sz w:val="24"/>
+          <w:szCs w:val="24"/>
+          <w:lang w:val="en-US"/>
+        </w:rPr>
+        <w:t>STOP</w:t>
+      </w:r>
+    </w:p>
+    <w:p>
+      <w:pPr>
+        <w:spacing w:line="360" w:lineRule="auto"/>
+        <w:rPr>
+          <w:rFonts w:ascii="Arial" w:hAnsi="Arial" w:cs="Arial"/>
+          <w:sz w:val="24"/>
+          <w:szCs w:val="24"/>
+          <w:lang w:val="en-US"/>
+        </w:rPr>
+      </w:pPr>
+      <w:r>
+        <w:rPr>
+          <w:rFonts w:ascii="Arial" w:hAnsi="Arial" w:cs="Arial"/>
+          <w:sz w:val="24"/>
+          <w:szCs w:val="24"/>
+          <w:lang w:val="en-US"/>
+        </w:rPr>
+        <w:t xml:space="preserve">   </w:t>
+      </w:r>
+      <w:r>
+        <w:rPr>
+          <w:rFonts w:ascii="Arial" w:hAnsi="Arial" w:cs="Arial"/>
+          <w:sz w:val="24"/>
+          <w:szCs w:val="24"/>
+          <w:lang w:val="en-US"/>
+        </w:rPr>
+        <w:t>END IF</w:t>
+      </w:r>
+    </w:p>
+    <w:p>
+      <w:pPr>
+        <w:spacing w:line="360" w:lineRule="auto"/>
+        <w:rPr>
+          <w:rFonts w:ascii="Arial" w:hAnsi="Arial" w:cs="Arial"/>
+          <w:sz w:val="24"/>
+          <w:szCs w:val="24"/>
+          <w:lang w:val="en-US"/>
+        </w:rPr>
+      </w:pPr>
+    </w:p>
+    <w:p>
+      <w:pPr>
+        <w:spacing w:line="360" w:lineRule="auto"/>
+        <w:rPr>
+          <w:rFonts w:ascii="Arial" w:hAnsi="Arial" w:cs="Arial"/>
+          <w:sz w:val="24"/>
+          <w:szCs w:val="24"/>
+          <w:lang w:val="en-US"/>
+        </w:rPr>
+      </w:pPr>
+      <w:r>
+        <w:rPr>
+          <w:rFonts w:ascii="Arial" w:hAnsi="Arial" w:cs="Arial"/>
+          <w:sz w:val="24"/>
+          <w:szCs w:val="24"/>
+          <w:lang w:val="en-US"/>
+        </w:rPr>
+        <w:t xml:space="preserve">   </w:t>
+      </w:r>
+      <w:r>
+        <w:rPr>
+          <w:rFonts w:ascii="Arial" w:hAnsi="Arial" w:cs="Arial"/>
+          <w:sz w:val="24"/>
+          <w:szCs w:val="24"/>
+          <w:lang w:val="en-US"/>
+        </w:rPr>
+        <w:t>IF semester is empty</w:t>
+      </w:r>
+    </w:p>
+    <w:p>
+      <w:pPr>
+        <w:spacing w:line="360" w:lineRule="auto"/>
+        <w:rPr>
+          <w:rFonts w:ascii="Arial" w:hAnsi="Arial" w:cs="Arial"/>
+          <w:sz w:val="24"/>
+          <w:szCs w:val="24"/>
+          <w:lang w:val="en-US"/>
+        </w:rPr>
+      </w:pPr>
+      <w:r>
+        <w:rPr>
+          <w:rFonts w:ascii="Arial" w:hAnsi="Arial" w:cs="Arial"/>
+          <w:sz w:val="24"/>
+          <w:szCs w:val="24"/>
+          <w:lang w:val="en-US"/>
+        </w:rPr>
+        <w:t xml:space="preserve">      </w:t>
+      </w:r>
+      <w:r>
+        <w:rPr>
+          <w:rFonts w:ascii="Arial" w:hAnsi="Arial" w:cs="Arial"/>
+          <w:sz w:val="24"/>
+          <w:szCs w:val="24"/>
+          <w:lang w:val="en-US"/>
+        </w:rPr>
+        <w:t>DISPLAY validation error</w:t>
+      </w:r>
+    </w:p>
+    <w:p>
+      <w:pPr>
+        <w:spacing w:line="360" w:lineRule="auto"/>
+        <w:rPr>
+          <w:rFonts w:ascii="Arial" w:hAnsi="Arial" w:cs="Arial"/>
+          <w:sz w:val="24"/>
+          <w:szCs w:val="24"/>
+          <w:lang w:val="en-US"/>
+        </w:rPr>
+      </w:pPr>
+      <w:r>
+        <w:rPr>
+          <w:rFonts w:ascii="Arial" w:hAnsi="Arial" w:cs="Arial"/>
+          <w:sz w:val="24"/>
+          <w:szCs w:val="24"/>
+          <w:lang w:val="en-US"/>
+        </w:rPr>
+        <w:t xml:space="preserve">      </w:t>
+      </w:r>
+      <w:r>
+        <w:rPr>
+          <w:rFonts w:ascii="Arial" w:hAnsi="Arial" w:cs="Arial"/>
+          <w:sz w:val="24"/>
+          <w:szCs w:val="24"/>
+          <w:lang w:val="en-US"/>
+        </w:rPr>
+        <w:t>STOP</w:t>
+      </w:r>
+    </w:p>
+    <w:p>
+      <w:pPr>
+        <w:spacing w:line="360" w:lineRule="auto"/>
+        <w:rPr>
+          <w:rFonts w:ascii="Arial" w:hAnsi="Arial" w:cs="Arial"/>
+          <w:sz w:val="24"/>
+          <w:szCs w:val="24"/>
+          <w:lang w:val="en-US"/>
+        </w:rPr>
+      </w:pPr>
+      <w:r>
+        <w:rPr>
+          <w:rFonts w:ascii="Arial" w:hAnsi="Arial" w:cs="Arial"/>
+          <w:sz w:val="24"/>
+          <w:szCs w:val="24"/>
+          <w:lang w:val="en-US"/>
+        </w:rPr>
+        <w:t xml:space="preserve">   </w:t>
+      </w:r>
+      <w:r>
+        <w:rPr>
+          <w:rFonts w:ascii="Arial" w:hAnsi="Arial" w:cs="Arial"/>
+          <w:sz w:val="24"/>
+          <w:szCs w:val="24"/>
+          <w:lang w:val="en-US"/>
+        </w:rPr>
+        <w:t>END IF</w:t>
+      </w:r>
+    </w:p>
+    <w:p>
+      <w:pPr>
+        <w:spacing w:line="360" w:lineRule="auto"/>
+        <w:rPr>
+          <w:rFonts w:ascii="Arial" w:hAnsi="Arial" w:cs="Arial"/>
+          <w:sz w:val="24"/>
+          <w:szCs w:val="24"/>
+          <w:lang w:val="en-US"/>
+        </w:rPr>
+      </w:pPr>
+    </w:p>
+    <w:p>
+      <w:pPr>
+        <w:spacing w:line="360" w:lineRule="auto"/>
+        <w:rPr>
+          <w:rFonts w:ascii="Arial" w:hAnsi="Arial" w:cs="Arial"/>
+          <w:sz w:val="24"/>
+          <w:szCs w:val="24"/>
+          <w:lang w:val="en-US"/>
+        </w:rPr>
+      </w:pPr>
+      <w:r>
+        <w:rPr>
+          <w:rFonts w:ascii="Arial" w:hAnsi="Arial" w:cs="Arial"/>
+          <w:sz w:val="24"/>
+          <w:szCs w:val="24"/>
+          <w:lang w:val="en-US"/>
+        </w:rPr>
+        <w:t xml:space="preserve">   </w:t>
+      </w:r>
+      <w:r>
+        <w:rPr>
+          <w:rFonts w:ascii="Arial" w:hAnsi="Arial" w:cs="Arial"/>
+          <w:sz w:val="24"/>
+          <w:szCs w:val="24"/>
+          <w:lang w:val="en-US"/>
+        </w:rPr>
+        <w:t xml:space="preserve">CREATE new </w:t>
+      </w:r>
+      <w:r>
+        <w:rPr>
+          <w:rFonts w:ascii="Arial" w:hAnsi="Arial" w:cs="Arial"/>
+          <w:sz w:val="24"/>
+          <w:szCs w:val="24"/>
+          <w:lang w:val="en-US"/>
+        </w:rPr>
+        <w:t>C</w:t>
+      </w:r>
+      <w:r>
+        <w:rPr>
+          <w:rFonts w:ascii="Arial" w:hAnsi="Arial" w:cs="Arial"/>
+          <w:sz w:val="24"/>
+          <w:szCs w:val="24"/>
+          <w:lang w:val="en-US"/>
+        </w:rPr>
+        <w:t>ourse</w:t>
+      </w:r>
+    </w:p>
+    <w:p>
+      <w:pPr>
+        <w:spacing w:line="360" w:lineRule="auto"/>
+        <w:rPr>
+          <w:rFonts w:ascii="Arial" w:hAnsi="Arial" w:cs="Arial"/>
+          <w:sz w:val="24"/>
+          <w:szCs w:val="24"/>
+          <w:lang w:val="en-US"/>
+        </w:rPr>
+      </w:pPr>
+    </w:p>
+    <w:p>
+      <w:pPr>
+        <w:spacing w:line="360" w:lineRule="auto"/>
+        <w:rPr>
+          <w:rFonts w:ascii="Arial" w:hAnsi="Arial" w:cs="Arial"/>
+          <w:sz w:val="24"/>
+          <w:szCs w:val="24"/>
+          <w:lang w:val="en-US"/>
+        </w:rPr>
+      </w:pPr>
+      <w:r>
+        <w:rPr>
+          <w:rFonts w:ascii="Arial" w:hAnsi="Arial" w:cs="Arial"/>
+          <w:sz w:val="24"/>
+          <w:szCs w:val="24"/>
+          <w:lang w:val="en-US"/>
+        </w:rPr>
+        <w:t xml:space="preserve">   </w:t>
+      </w:r>
+      <w:r>
+        <w:rPr>
+          <w:rFonts w:ascii="Arial" w:hAnsi="Arial" w:cs="Arial"/>
+          <w:sz w:val="24"/>
+          <w:szCs w:val="24"/>
+          <w:lang w:val="en-US"/>
+        </w:rPr>
+        <w:t>STORE Course</w:t>
+      </w:r>
+    </w:p>
+    <w:p>
+      <w:pPr>
+        <w:spacing w:line="360" w:lineRule="auto"/>
+        <w:rPr>
+          <w:rFonts w:ascii="Arial" w:hAnsi="Arial" w:cs="Arial"/>
+          <w:sz w:val="24"/>
+          <w:szCs w:val="24"/>
+          <w:lang w:val="en-US"/>
+        </w:rPr>
+      </w:pPr>
+    </w:p>
+    <w:p>
+      <w:pPr>
+        <w:spacing w:line="360" w:lineRule="auto"/>
+        <w:rPr>
+          <w:rFonts w:ascii="Arial" w:hAnsi="Arial" w:cs="Arial"/>
+          <w:sz w:val="24"/>
+          <w:szCs w:val="24"/>
+          <w:lang w:val="en-US"/>
+        </w:rPr>
+      </w:pPr>
+      <w:r>
+        <w:rPr>
+          <w:rFonts w:ascii="Arial" w:hAnsi="Arial" w:cs="Arial"/>
+          <w:sz w:val="24"/>
+          <w:szCs w:val="24"/>
+          <w:lang w:val="en-US"/>
+        </w:rPr>
+        <w:t xml:space="preserve">   </w:t>
+      </w:r>
+      <w:r>
+        <w:rPr>
+          <w:rFonts w:ascii="Arial" w:hAnsi="Arial" w:cs="Arial"/>
+          <w:sz w:val="24"/>
+          <w:szCs w:val="24"/>
+          <w:lang w:val="en-US"/>
+        </w:rPr>
+        <w:t>REDIRECT user to Courses page</w:t>
+      </w:r>
+    </w:p>
+    <w:p>
+      <w:pPr>
+        <w:spacing w:line="360" w:lineRule="auto"/>
+        <w:rPr>
+          <w:rFonts w:ascii="Arial" w:hAnsi="Arial" w:cs="Arial"/>
+          <w:sz w:val="24"/>
+          <w:szCs w:val="24"/>
+          <w:lang w:val="en-US"/>
+        </w:rPr>
+      </w:pPr>
+    </w:p>
+    <w:p>
+      <w:pPr>
+        <w:spacing w:line="360" w:lineRule="auto"/>
+        <w:rPr>
+          <w:rFonts w:ascii="Arial" w:hAnsi="Arial" w:cs="Arial"/>
+          <w:sz w:val="24"/>
+          <w:szCs w:val="24"/>
+          <w:lang w:val="en-US"/>
+        </w:rPr>
+      </w:pPr>
+      <w:r>
+        <w:rPr>
+          <w:rFonts w:ascii="Arial" w:hAnsi="Arial" w:cs="Arial"/>
+          <w:sz w:val="24"/>
+          <w:szCs w:val="24"/>
+          <w:lang w:val="en-US"/>
+        </w:rPr>
+        <w:t>END FUNCTION</w:t>
+      </w:r>
+    </w:p>
+    <w:p>
+      <w:pPr>
+        <w:spacing w:line="360" w:lineRule="auto"/>
+        <w:rPr>
+          <w:rFonts w:ascii="Arial" w:hAnsi="Arial" w:cs="Arial"/>
+          <w:sz w:val="24"/>
+          <w:szCs w:val="24"/>
+          <w:lang w:val="en-US"/>
+        </w:rPr>
+      </w:pPr>
+    </w:p>
+    <w:p>
+      <w:pPr>
+        <w:spacing w:line="360" w:lineRule="auto"/>
+        <w:rPr>
+          <w:rFonts w:ascii="Arial" w:hAnsi="Arial" w:cs="Arial"/>
+          <w:sz w:val="24"/>
+          <w:szCs w:val="24"/>
+          <w:lang w:val="en-US"/>
+        </w:rPr>
+      </w:pPr>
+    </w:p>
+    <w:p>
+      <w:pPr>
+        <w:spacing w:line="360" w:lineRule="auto"/>
+        <w:rPr>
+          <w:rFonts w:ascii="Arial" w:hAnsi="Arial" w:cs="Arial"/>
+          <w:sz w:val="24"/>
+          <w:szCs w:val="24"/>
+          <w:lang w:val="en-US"/>
+        </w:rPr>
+      </w:pPr>
+    </w:p>
+    <w:p>
+      <w:pPr>
+        <w:spacing w:line="360" w:lineRule="auto"/>
+        <w:rPr>
+          <w:rFonts w:ascii="Arial" w:hAnsi="Arial" w:cs="Arial"/>
+          <w:sz w:val="24"/>
+          <w:szCs w:val="24"/>
+          <w:lang w:val="en-US"/>
+        </w:rPr>
+      </w:pPr>
+      <w:r>
+        <w:rPr>
+          <w:rFonts w:ascii="Arial" w:hAnsi="Arial" w:cs="Arial"/>
+          <w:sz w:val="24"/>
+          <w:szCs w:val="24"/>
+          <w:lang w:val="en-US"/>
+        </w:rPr>
         <w:t xml:space="preserve">FUNCTION </w:t>
       </w:r>
-      <w:proofErr w:type="spellStart"/>
-      <w:r>
-        <w:rPr>
-          <w:rFonts w:ascii="Arial" w:hAnsi="Arial" w:cs="Arial"/>
-          <w:sz w:val="24"/>
-          <w:szCs w:val="24"/>
-          <w:lang w:val="en-US"/>
-        </w:rPr>
-        <w:t>AddCourse</w:t>
-      </w:r>
-      <w:proofErr w:type="spellEnd"/>
+      <w:r>
+        <w:rPr>
+          <w:rFonts w:ascii="Arial" w:hAnsi="Arial" w:cs="Arial"/>
+          <w:sz w:val="24"/>
+          <w:szCs w:val="24"/>
+          <w:lang w:val="en-US"/>
+        </w:rPr>
+        <w:t>CalculateGPA(courses)</w:t>
+      </w:r>
     </w:p>
     <w:p>
       <w:pPr>
@@ -6112,1091 +7163,7 @@
           <w:szCs w:val="24"/>
           <w:lang w:val="en-US"/>
         </w:rPr>
-        <w:t>DISPLAY Add Course form</w:t>
-      </w:r>
-    </w:p>
-    <w:p>
-      <w:pPr>
-        <w:spacing w:line="360" w:lineRule="auto"/>
-        <w:rPr>
-          <w:rFonts w:ascii="Arial" w:hAnsi="Arial" w:cs="Arial"/>
-          <w:sz w:val="24"/>
-          <w:szCs w:val="24"/>
-          <w:lang w:val="en-US"/>
-        </w:rPr>
-      </w:pPr>
-    </w:p>
-    <w:p>
-      <w:pPr>
-        <w:spacing w:line="360" w:lineRule="auto"/>
-        <w:rPr>
-          <w:rFonts w:ascii="Arial" w:hAnsi="Arial" w:cs="Arial"/>
-          <w:sz w:val="24"/>
-          <w:szCs w:val="24"/>
-          <w:lang w:val="en-US"/>
-        </w:rPr>
-      </w:pPr>
-      <w:r>
-        <w:rPr>
-          <w:rFonts w:ascii="Arial" w:hAnsi="Arial" w:cs="Arial"/>
-          <w:sz w:val="24"/>
-          <w:szCs w:val="24"/>
-          <w:lang w:val="en-US"/>
-        </w:rPr>
-        <w:t xml:space="preserve">   </w:t>
-      </w:r>
-      <w:r>
-        <w:rPr>
-          <w:rFonts w:ascii="Arial" w:hAnsi="Arial" w:cs="Arial"/>
-          <w:sz w:val="24"/>
-          <w:szCs w:val="24"/>
-          <w:lang w:val="en-US"/>
-        </w:rPr>
-        <w:t>READ course code</w:t>
-      </w:r>
-    </w:p>
-    <w:p>
-      <w:pPr>
-        <w:spacing w:line="360" w:lineRule="auto"/>
-        <w:rPr>
-          <w:rFonts w:ascii="Arial" w:hAnsi="Arial" w:cs="Arial"/>
-          <w:sz w:val="24"/>
-          <w:szCs w:val="24"/>
-          <w:lang w:val="en-US"/>
-        </w:rPr>
-      </w:pPr>
-      <w:r>
-        <w:rPr>
-          <w:rFonts w:ascii="Arial" w:hAnsi="Arial" w:cs="Arial"/>
-          <w:sz w:val="24"/>
-          <w:szCs w:val="24"/>
-          <w:lang w:val="en-US"/>
-        </w:rPr>
-        <w:t xml:space="preserve">   </w:t>
-      </w:r>
-      <w:r>
-        <w:rPr>
-          <w:rFonts w:ascii="Arial" w:hAnsi="Arial" w:cs="Arial"/>
-          <w:sz w:val="24"/>
-          <w:szCs w:val="24"/>
-          <w:lang w:val="en-US"/>
-        </w:rPr>
-        <w:t>READ course name</w:t>
-      </w:r>
-    </w:p>
-    <w:p>
-      <w:pPr>
-        <w:spacing w:line="360" w:lineRule="auto"/>
-        <w:rPr>
-          <w:rFonts w:ascii="Arial" w:hAnsi="Arial" w:cs="Arial"/>
-          <w:sz w:val="24"/>
-          <w:szCs w:val="24"/>
-          <w:lang w:val="en-US"/>
-        </w:rPr>
-      </w:pPr>
-      <w:r>
-        <w:rPr>
-          <w:rFonts w:ascii="Arial" w:hAnsi="Arial" w:cs="Arial"/>
-          <w:sz w:val="24"/>
-          <w:szCs w:val="24"/>
-          <w:lang w:val="en-US"/>
-        </w:rPr>
-        <w:t xml:space="preserve">   </w:t>
-      </w:r>
-      <w:r>
-        <w:rPr>
-          <w:rFonts w:ascii="Arial" w:hAnsi="Arial" w:cs="Arial"/>
-          <w:sz w:val="24"/>
-          <w:szCs w:val="24"/>
-          <w:lang w:val="en-US"/>
-        </w:rPr>
-        <w:t>READ credits</w:t>
-      </w:r>
-    </w:p>
-    <w:p>
-      <w:pPr>
-        <w:spacing w:line="360" w:lineRule="auto"/>
-        <w:rPr>
-          <w:rFonts w:ascii="Arial" w:hAnsi="Arial" w:cs="Arial"/>
-          <w:sz w:val="24"/>
-          <w:szCs w:val="24"/>
-          <w:lang w:val="en-US"/>
-        </w:rPr>
-      </w:pPr>
-      <w:r>
-        <w:rPr>
-          <w:rFonts w:ascii="Arial" w:hAnsi="Arial" w:cs="Arial"/>
-          <w:sz w:val="24"/>
-          <w:szCs w:val="24"/>
-          <w:lang w:val="en-US"/>
-        </w:rPr>
-        <w:t xml:space="preserve">   </w:t>
-      </w:r>
-      <w:r>
-        <w:rPr>
-          <w:rFonts w:ascii="Arial" w:hAnsi="Arial" w:cs="Arial"/>
-          <w:sz w:val="24"/>
-          <w:szCs w:val="24"/>
-          <w:lang w:val="en-US"/>
-        </w:rPr>
-        <w:t>READ grade</w:t>
-      </w:r>
-    </w:p>
-    <w:p>
-      <w:pPr>
-        <w:spacing w:line="360" w:lineRule="auto"/>
-        <w:rPr>
-          <w:rFonts w:ascii="Arial" w:hAnsi="Arial" w:cs="Arial"/>
-          <w:sz w:val="24"/>
-          <w:szCs w:val="24"/>
-          <w:lang w:val="en-US"/>
-        </w:rPr>
-      </w:pPr>
-      <w:r>
-        <w:rPr>
-          <w:rFonts w:ascii="Arial" w:hAnsi="Arial" w:cs="Arial"/>
-          <w:sz w:val="24"/>
-          <w:szCs w:val="24"/>
-          <w:lang w:val="en-US"/>
-        </w:rPr>
-        <w:t xml:space="preserve">   </w:t>
-      </w:r>
-      <w:r>
-        <w:rPr>
-          <w:rFonts w:ascii="Arial" w:hAnsi="Arial" w:cs="Arial"/>
-          <w:sz w:val="24"/>
-          <w:szCs w:val="24"/>
-          <w:lang w:val="en-US"/>
-        </w:rPr>
-        <w:t>READ semester</w:t>
-      </w:r>
-    </w:p>
-    <w:p>
-      <w:pPr>
-        <w:spacing w:line="360" w:lineRule="auto"/>
-        <w:rPr>
-          <w:rFonts w:ascii="Arial" w:hAnsi="Arial" w:cs="Arial"/>
-          <w:sz w:val="24"/>
-          <w:szCs w:val="24"/>
-          <w:lang w:val="en-US"/>
-        </w:rPr>
-      </w:pPr>
-    </w:p>
-    <w:p>
-      <w:pPr>
-        <w:spacing w:line="360" w:lineRule="auto"/>
-        <w:rPr>
-          <w:rFonts w:ascii="Arial" w:hAnsi="Arial" w:cs="Arial"/>
-          <w:sz w:val="24"/>
-          <w:szCs w:val="24"/>
-          <w:lang w:val="en-US"/>
-        </w:rPr>
-      </w:pPr>
-      <w:r>
-        <w:rPr>
-          <w:rFonts w:ascii="Arial" w:hAnsi="Arial" w:cs="Arial"/>
-          <w:sz w:val="24"/>
-          <w:szCs w:val="24"/>
-          <w:lang w:val="en-US"/>
-        </w:rPr>
-        <w:t xml:space="preserve">   </w:t>
-      </w:r>
-      <w:r>
-        <w:rPr>
-          <w:rFonts w:ascii="Arial" w:hAnsi="Arial" w:cs="Arial"/>
-          <w:sz w:val="24"/>
-          <w:szCs w:val="24"/>
-          <w:lang w:val="en-US"/>
-        </w:rPr>
-        <w:t>IF course code is empty</w:t>
-      </w:r>
-    </w:p>
-    <w:p>
-      <w:pPr>
-        <w:spacing w:line="360" w:lineRule="auto"/>
-        <w:rPr>
-          <w:rFonts w:ascii="Arial" w:hAnsi="Arial" w:cs="Arial"/>
-          <w:sz w:val="24"/>
-          <w:szCs w:val="24"/>
-          <w:lang w:val="en-US"/>
-        </w:rPr>
-      </w:pPr>
-      <w:r>
-        <w:rPr>
-          <w:rFonts w:ascii="Arial" w:hAnsi="Arial" w:cs="Arial"/>
-          <w:sz w:val="24"/>
-          <w:szCs w:val="24"/>
-          <w:lang w:val="en-US"/>
-        </w:rPr>
-        <w:t xml:space="preserve">      </w:t>
-      </w:r>
-      <w:r>
-        <w:rPr>
-          <w:rFonts w:ascii="Arial" w:hAnsi="Arial" w:cs="Arial"/>
-          <w:sz w:val="24"/>
-          <w:szCs w:val="24"/>
-          <w:lang w:val="en-US"/>
-        </w:rPr>
-        <w:t>DISPLAY validation error</w:t>
-      </w:r>
-    </w:p>
-    <w:p>
-      <w:pPr>
-        <w:spacing w:line="360" w:lineRule="auto"/>
-        <w:rPr>
-          <w:rFonts w:ascii="Arial" w:hAnsi="Arial" w:cs="Arial"/>
-          <w:sz w:val="24"/>
-          <w:szCs w:val="24"/>
-          <w:lang w:val="en-US"/>
-        </w:rPr>
-      </w:pPr>
-      <w:r>
-        <w:rPr>
-          <w:rFonts w:ascii="Arial" w:hAnsi="Arial" w:cs="Arial"/>
-          <w:sz w:val="24"/>
-          <w:szCs w:val="24"/>
-          <w:lang w:val="en-US"/>
-        </w:rPr>
-        <w:t xml:space="preserve">      </w:t>
-      </w:r>
-      <w:r>
-        <w:rPr>
-          <w:rFonts w:ascii="Arial" w:hAnsi="Arial" w:cs="Arial"/>
-          <w:sz w:val="24"/>
-          <w:szCs w:val="24"/>
-          <w:lang w:val="en-US"/>
-        </w:rPr>
-        <w:t>STOP</w:t>
-      </w:r>
-    </w:p>
-    <w:p>
-      <w:pPr>
-        <w:spacing w:line="360" w:lineRule="auto"/>
-        <w:rPr>
-          <w:rFonts w:ascii="Arial" w:hAnsi="Arial" w:cs="Arial"/>
-          <w:sz w:val="24"/>
-          <w:szCs w:val="24"/>
-          <w:lang w:val="en-US"/>
-        </w:rPr>
-      </w:pPr>
-      <w:r>
-        <w:rPr>
-          <w:rFonts w:ascii="Arial" w:hAnsi="Arial" w:cs="Arial"/>
-          <w:sz w:val="24"/>
-          <w:szCs w:val="24"/>
-          <w:lang w:val="en-US"/>
-        </w:rPr>
-        <w:t xml:space="preserve">   </w:t>
-      </w:r>
-      <w:r>
-        <w:rPr>
-          <w:rFonts w:ascii="Arial" w:hAnsi="Arial" w:cs="Arial"/>
-          <w:sz w:val="24"/>
-          <w:szCs w:val="24"/>
-          <w:lang w:val="en-US"/>
-        </w:rPr>
-        <w:t>END IF</w:t>
-      </w:r>
-    </w:p>
-    <w:p>
-      <w:pPr>
-        <w:spacing w:line="360" w:lineRule="auto"/>
-        <w:rPr>
-          <w:rFonts w:ascii="Arial" w:hAnsi="Arial" w:cs="Arial"/>
-          <w:sz w:val="24"/>
-          <w:szCs w:val="24"/>
-          <w:lang w:val="en-US"/>
-        </w:rPr>
-      </w:pPr>
-    </w:p>
-    <w:p>
-      <w:pPr>
-        <w:spacing w:line="360" w:lineRule="auto"/>
-        <w:rPr>
-          <w:rFonts w:ascii="Arial" w:hAnsi="Arial" w:cs="Arial"/>
-          <w:sz w:val="24"/>
-          <w:szCs w:val="24"/>
-          <w:lang w:val="en-US"/>
-        </w:rPr>
-      </w:pPr>
-      <w:r>
-        <w:rPr>
-          <w:rFonts w:ascii="Arial" w:hAnsi="Arial" w:cs="Arial"/>
-          <w:sz w:val="24"/>
-          <w:szCs w:val="24"/>
-          <w:lang w:val="en-US"/>
-        </w:rPr>
-        <w:t xml:space="preserve">   </w:t>
-      </w:r>
-      <w:r>
-        <w:rPr>
-          <w:rFonts w:ascii="Arial" w:hAnsi="Arial" w:cs="Arial"/>
-          <w:sz w:val="24"/>
-          <w:szCs w:val="24"/>
-          <w:lang w:val="en-US"/>
-        </w:rPr>
-        <w:t>IF course name is empty</w:t>
-      </w:r>
-    </w:p>
-    <w:p>
-      <w:pPr>
-        <w:spacing w:line="360" w:lineRule="auto"/>
-        <w:rPr>
-          <w:rFonts w:ascii="Arial" w:hAnsi="Arial" w:cs="Arial"/>
-          <w:sz w:val="24"/>
-          <w:szCs w:val="24"/>
-          <w:lang w:val="en-US"/>
-        </w:rPr>
-      </w:pPr>
-      <w:r>
-        <w:rPr>
-          <w:rFonts w:ascii="Arial" w:hAnsi="Arial" w:cs="Arial"/>
-          <w:sz w:val="24"/>
-          <w:szCs w:val="24"/>
-          <w:lang w:val="en-US"/>
-        </w:rPr>
-        <w:t xml:space="preserve">      </w:t>
-      </w:r>
-      <w:r>
-        <w:rPr>
-          <w:rFonts w:ascii="Arial" w:hAnsi="Arial" w:cs="Arial"/>
-          <w:sz w:val="24"/>
-          <w:szCs w:val="24"/>
-          <w:lang w:val="en-US"/>
-        </w:rPr>
-        <w:t>DISPLAY validation error</w:t>
-      </w:r>
-    </w:p>
-    <w:p>
-      <w:pPr>
-        <w:spacing w:line="360" w:lineRule="auto"/>
-        <w:rPr>
-          <w:rFonts w:ascii="Arial" w:hAnsi="Arial" w:cs="Arial"/>
-          <w:sz w:val="24"/>
-          <w:szCs w:val="24"/>
-          <w:lang w:val="en-US"/>
-        </w:rPr>
-      </w:pPr>
-      <w:r>
-        <w:rPr>
-          <w:rFonts w:ascii="Arial" w:hAnsi="Arial" w:cs="Arial"/>
-          <w:sz w:val="24"/>
-          <w:szCs w:val="24"/>
-          <w:lang w:val="en-US"/>
-        </w:rPr>
-        <w:t xml:space="preserve">      </w:t>
-      </w:r>
-      <w:r>
-        <w:rPr>
-          <w:rFonts w:ascii="Arial" w:hAnsi="Arial" w:cs="Arial"/>
-          <w:sz w:val="24"/>
-          <w:szCs w:val="24"/>
-          <w:lang w:val="en-US"/>
-        </w:rPr>
-        <w:t>STOP</w:t>
-      </w:r>
-    </w:p>
-    <w:p>
-      <w:pPr>
-        <w:spacing w:line="360" w:lineRule="auto"/>
-        <w:rPr>
-          <w:rFonts w:ascii="Arial" w:hAnsi="Arial" w:cs="Arial"/>
-          <w:sz w:val="24"/>
-          <w:szCs w:val="24"/>
-          <w:lang w:val="en-US"/>
-        </w:rPr>
-      </w:pPr>
-      <w:r>
-        <w:rPr>
-          <w:rFonts w:ascii="Arial" w:hAnsi="Arial" w:cs="Arial"/>
-          <w:sz w:val="24"/>
-          <w:szCs w:val="24"/>
-          <w:lang w:val="en-US"/>
-        </w:rPr>
-        <w:t xml:space="preserve">   </w:t>
-      </w:r>
-      <w:r>
-        <w:rPr>
-          <w:rFonts w:ascii="Arial" w:hAnsi="Arial" w:cs="Arial"/>
-          <w:sz w:val="24"/>
-          <w:szCs w:val="24"/>
-          <w:lang w:val="en-US"/>
-        </w:rPr>
-        <w:t>END IF</w:t>
-      </w:r>
-    </w:p>
-    <w:p>
-      <w:pPr>
-        <w:spacing w:line="360" w:lineRule="auto"/>
-        <w:rPr>
-          <w:rFonts w:ascii="Arial" w:hAnsi="Arial" w:cs="Arial"/>
-          <w:sz w:val="24"/>
-          <w:szCs w:val="24"/>
-          <w:lang w:val="en-US"/>
-        </w:rPr>
-      </w:pPr>
-    </w:p>
-    <w:p>
-      <w:pPr>
-        <w:spacing w:line="360" w:lineRule="auto"/>
-        <w:rPr>
-          <w:rFonts w:ascii="Arial" w:hAnsi="Arial" w:cs="Arial"/>
-          <w:sz w:val="24"/>
-          <w:szCs w:val="24"/>
-          <w:lang w:val="en-US"/>
-        </w:rPr>
-      </w:pPr>
-      <w:r>
-        <w:rPr>
-          <w:rFonts w:ascii="Arial" w:hAnsi="Arial" w:cs="Arial"/>
-          <w:sz w:val="24"/>
-          <w:szCs w:val="24"/>
-          <w:lang w:val="en-US"/>
-        </w:rPr>
-        <w:t xml:space="preserve">   </w:t>
-      </w:r>
-      <w:r>
-        <w:rPr>
-          <w:rFonts w:ascii="Arial" w:hAnsi="Arial" w:cs="Arial"/>
-          <w:sz w:val="24"/>
-          <w:szCs w:val="24"/>
-          <w:lang w:val="en-US"/>
-        </w:rPr>
-        <w:t>IF credits are outside the valid range</w:t>
-      </w:r>
-    </w:p>
-    <w:p>
-      <w:pPr>
-        <w:spacing w:line="360" w:lineRule="auto"/>
-        <w:rPr>
-          <w:rFonts w:ascii="Arial" w:hAnsi="Arial" w:cs="Arial"/>
-          <w:sz w:val="24"/>
-          <w:szCs w:val="24"/>
-          <w:lang w:val="en-US"/>
-        </w:rPr>
-      </w:pPr>
-      <w:r>
-        <w:rPr>
-          <w:rFonts w:ascii="Arial" w:hAnsi="Arial" w:cs="Arial"/>
-          <w:sz w:val="24"/>
-          <w:szCs w:val="24"/>
-          <w:lang w:val="en-US"/>
-        </w:rPr>
-        <w:t xml:space="preserve">      </w:t>
-      </w:r>
-      <w:r>
-        <w:rPr>
-          <w:rFonts w:ascii="Arial" w:hAnsi="Arial" w:cs="Arial"/>
-          <w:sz w:val="24"/>
-          <w:szCs w:val="24"/>
-          <w:lang w:val="en-US"/>
-        </w:rPr>
-        <w:t>DISPLAY validation error</w:t>
-      </w:r>
-    </w:p>
-    <w:p>
-      <w:pPr>
-        <w:spacing w:line="360" w:lineRule="auto"/>
-        <w:rPr>
-          <w:rFonts w:ascii="Arial" w:hAnsi="Arial" w:cs="Arial"/>
-          <w:sz w:val="24"/>
-          <w:szCs w:val="24"/>
-          <w:lang w:val="en-US"/>
-        </w:rPr>
-      </w:pPr>
-      <w:r>
-        <w:rPr>
-          <w:rFonts w:ascii="Arial" w:hAnsi="Arial" w:cs="Arial"/>
-          <w:sz w:val="24"/>
-          <w:szCs w:val="24"/>
-          <w:lang w:val="en-US"/>
-        </w:rPr>
-        <w:t xml:space="preserve">      </w:t>
-      </w:r>
-      <w:r>
-        <w:rPr>
-          <w:rFonts w:ascii="Arial" w:hAnsi="Arial" w:cs="Arial"/>
-          <w:sz w:val="24"/>
-          <w:szCs w:val="24"/>
-          <w:lang w:val="en-US"/>
-        </w:rPr>
-        <w:t>STOP</w:t>
-      </w:r>
-    </w:p>
-    <w:p>
-      <w:pPr>
-        <w:spacing w:line="360" w:lineRule="auto"/>
-        <w:rPr>
-          <w:rFonts w:ascii="Arial" w:hAnsi="Arial" w:cs="Arial"/>
-          <w:sz w:val="24"/>
-          <w:szCs w:val="24"/>
-          <w:lang w:val="en-US"/>
-        </w:rPr>
-      </w:pPr>
-      <w:r>
-        <w:rPr>
-          <w:rFonts w:ascii="Arial" w:hAnsi="Arial" w:cs="Arial"/>
-          <w:sz w:val="24"/>
-          <w:szCs w:val="24"/>
-          <w:lang w:val="en-US"/>
-        </w:rPr>
-        <w:t xml:space="preserve">   </w:t>
-      </w:r>
-      <w:r>
-        <w:rPr>
-          <w:rFonts w:ascii="Arial" w:hAnsi="Arial" w:cs="Arial"/>
-          <w:sz w:val="24"/>
-          <w:szCs w:val="24"/>
-          <w:lang w:val="en-US"/>
-        </w:rPr>
-        <w:t>END IF</w:t>
-      </w:r>
-    </w:p>
-    <w:p>
-      <w:pPr>
-        <w:spacing w:line="360" w:lineRule="auto"/>
-        <w:rPr>
-          <w:rFonts w:ascii="Arial" w:hAnsi="Arial" w:cs="Arial"/>
-          <w:sz w:val="24"/>
-          <w:szCs w:val="24"/>
-          <w:lang w:val="en-US"/>
-        </w:rPr>
-      </w:pPr>
-    </w:p>
-    <w:p>
-      <w:pPr>
-        <w:spacing w:line="360" w:lineRule="auto"/>
-        <w:rPr>
-          <w:rFonts w:ascii="Arial" w:hAnsi="Arial" w:cs="Arial"/>
-          <w:sz w:val="24"/>
-          <w:szCs w:val="24"/>
-          <w:lang w:val="en-US"/>
-        </w:rPr>
-      </w:pPr>
-      <w:r>
-        <w:rPr>
-          <w:rFonts w:ascii="Arial" w:hAnsi="Arial" w:cs="Arial"/>
-          <w:sz w:val="24"/>
-          <w:szCs w:val="24"/>
-          <w:lang w:val="en-US"/>
-        </w:rPr>
-        <w:t xml:space="preserve">   </w:t>
-      </w:r>
-      <w:r>
-        <w:rPr>
-          <w:rFonts w:ascii="Arial" w:hAnsi="Arial" w:cs="Arial"/>
-          <w:sz w:val="24"/>
-          <w:szCs w:val="24"/>
-          <w:lang w:val="en-US"/>
-        </w:rPr>
-        <w:t>IF grade is not valid</w:t>
-      </w:r>
-    </w:p>
-    <w:p>
-      <w:pPr>
-        <w:spacing w:line="360" w:lineRule="auto"/>
-        <w:rPr>
-          <w:rFonts w:ascii="Arial" w:hAnsi="Arial" w:cs="Arial"/>
-          <w:sz w:val="24"/>
-          <w:szCs w:val="24"/>
-          <w:lang w:val="en-US"/>
-        </w:rPr>
-      </w:pPr>
-      <w:r>
-        <w:rPr>
-          <w:rFonts w:ascii="Arial" w:hAnsi="Arial" w:cs="Arial"/>
-          <w:sz w:val="24"/>
-          <w:szCs w:val="24"/>
-          <w:lang w:val="en-US"/>
-        </w:rPr>
-        <w:t xml:space="preserve">      </w:t>
-      </w:r>
-      <w:r>
-        <w:rPr>
-          <w:rFonts w:ascii="Arial" w:hAnsi="Arial" w:cs="Arial"/>
-          <w:sz w:val="24"/>
-          <w:szCs w:val="24"/>
-          <w:lang w:val="en-US"/>
-        </w:rPr>
-        <w:t>DISPLAY validation error</w:t>
-      </w:r>
-    </w:p>
-    <w:p>
-      <w:pPr>
-        <w:spacing w:line="360" w:lineRule="auto"/>
-        <w:rPr>
-          <w:rFonts w:ascii="Arial" w:hAnsi="Arial" w:cs="Arial"/>
-          <w:sz w:val="24"/>
-          <w:szCs w:val="24"/>
-          <w:lang w:val="en-US"/>
-        </w:rPr>
-      </w:pPr>
-      <w:r>
-        <w:rPr>
-          <w:rFonts w:ascii="Arial" w:hAnsi="Arial" w:cs="Arial"/>
-          <w:sz w:val="24"/>
-          <w:szCs w:val="24"/>
-          <w:lang w:val="en-US"/>
-        </w:rPr>
-        <w:t xml:space="preserve">      </w:t>
-      </w:r>
-      <w:r>
-        <w:rPr>
-          <w:rFonts w:ascii="Arial" w:hAnsi="Arial" w:cs="Arial"/>
-          <w:sz w:val="24"/>
-          <w:szCs w:val="24"/>
-          <w:lang w:val="en-US"/>
-        </w:rPr>
-        <w:t>STOP</w:t>
-      </w:r>
-    </w:p>
-    <w:p>
-      <w:pPr>
-        <w:spacing w:line="360" w:lineRule="auto"/>
-        <w:rPr>
-          <w:rFonts w:ascii="Arial" w:hAnsi="Arial" w:cs="Arial"/>
-          <w:sz w:val="24"/>
-          <w:szCs w:val="24"/>
-          <w:lang w:val="en-US"/>
-        </w:rPr>
-      </w:pPr>
-      <w:r>
-        <w:rPr>
-          <w:rFonts w:ascii="Arial" w:hAnsi="Arial" w:cs="Arial"/>
-          <w:sz w:val="24"/>
-          <w:szCs w:val="24"/>
-          <w:lang w:val="en-US"/>
-        </w:rPr>
-        <w:t xml:space="preserve">   </w:t>
-      </w:r>
-      <w:r>
-        <w:rPr>
-          <w:rFonts w:ascii="Arial" w:hAnsi="Arial" w:cs="Arial"/>
-          <w:sz w:val="24"/>
-          <w:szCs w:val="24"/>
-          <w:lang w:val="en-US"/>
-        </w:rPr>
-        <w:t>END IF</w:t>
-      </w:r>
-    </w:p>
-    <w:p>
-      <w:pPr>
-        <w:spacing w:line="360" w:lineRule="auto"/>
-        <w:rPr>
-          <w:rFonts w:ascii="Arial" w:hAnsi="Arial" w:cs="Arial"/>
-          <w:sz w:val="24"/>
-          <w:szCs w:val="24"/>
-          <w:lang w:val="en-US"/>
-        </w:rPr>
-      </w:pPr>
-    </w:p>
-    <w:p>
-      <w:pPr>
-        <w:spacing w:line="360" w:lineRule="auto"/>
-        <w:rPr>
-          <w:rFonts w:ascii="Arial" w:hAnsi="Arial" w:cs="Arial"/>
-          <w:sz w:val="24"/>
-          <w:szCs w:val="24"/>
-          <w:lang w:val="en-US"/>
-        </w:rPr>
-      </w:pPr>
-      <w:r>
-        <w:rPr>
-          <w:rFonts w:ascii="Arial" w:hAnsi="Arial" w:cs="Arial"/>
-          <w:sz w:val="24"/>
-          <w:szCs w:val="24"/>
-          <w:lang w:val="en-US"/>
-        </w:rPr>
-        <w:t xml:space="preserve">   </w:t>
-      </w:r>
-      <w:r>
-        <w:rPr>
-          <w:rFonts w:ascii="Arial" w:hAnsi="Arial" w:cs="Arial"/>
-          <w:sz w:val="24"/>
-          <w:szCs w:val="24"/>
-          <w:lang w:val="en-US"/>
-        </w:rPr>
-        <w:t>IF semester is empty</w:t>
-      </w:r>
-    </w:p>
-    <w:p>
-      <w:pPr>
-        <w:spacing w:line="360" w:lineRule="auto"/>
-        <w:rPr>
-          <w:rFonts w:ascii="Arial" w:hAnsi="Arial" w:cs="Arial"/>
-          <w:sz w:val="24"/>
-          <w:szCs w:val="24"/>
-          <w:lang w:val="en-US"/>
-        </w:rPr>
-      </w:pPr>
-      <w:r>
-        <w:rPr>
-          <w:rFonts w:ascii="Arial" w:hAnsi="Arial" w:cs="Arial"/>
-          <w:sz w:val="24"/>
-          <w:szCs w:val="24"/>
-          <w:lang w:val="en-US"/>
-        </w:rPr>
-        <w:t xml:space="preserve">      </w:t>
-      </w:r>
-      <w:r>
-        <w:rPr>
-          <w:rFonts w:ascii="Arial" w:hAnsi="Arial" w:cs="Arial"/>
-          <w:sz w:val="24"/>
-          <w:szCs w:val="24"/>
-          <w:lang w:val="en-US"/>
-        </w:rPr>
-        <w:t>DISPLAY validation error</w:t>
-      </w:r>
-    </w:p>
-    <w:p>
-      <w:pPr>
-        <w:spacing w:line="360" w:lineRule="auto"/>
-        <w:rPr>
-          <w:rFonts w:ascii="Arial" w:hAnsi="Arial" w:cs="Arial"/>
-          <w:sz w:val="24"/>
-          <w:szCs w:val="24"/>
-          <w:lang w:val="en-US"/>
-        </w:rPr>
-      </w:pPr>
-      <w:r>
-        <w:rPr>
-          <w:rFonts w:ascii="Arial" w:hAnsi="Arial" w:cs="Arial"/>
-          <w:sz w:val="24"/>
-          <w:szCs w:val="24"/>
-          <w:lang w:val="en-US"/>
-        </w:rPr>
-        <w:t xml:space="preserve">      </w:t>
-      </w:r>
-      <w:r>
-        <w:rPr>
-          <w:rFonts w:ascii="Arial" w:hAnsi="Arial" w:cs="Arial"/>
-          <w:sz w:val="24"/>
-          <w:szCs w:val="24"/>
-          <w:lang w:val="en-US"/>
-        </w:rPr>
-        <w:t>STOP</w:t>
-      </w:r>
-    </w:p>
-    <w:p>
-      <w:pPr>
-        <w:spacing w:line="360" w:lineRule="auto"/>
-        <w:rPr>
-          <w:rFonts w:ascii="Arial" w:hAnsi="Arial" w:cs="Arial"/>
-          <w:sz w:val="24"/>
-          <w:szCs w:val="24"/>
-          <w:lang w:val="en-US"/>
-        </w:rPr>
-      </w:pPr>
-      <w:r>
-        <w:rPr>
-          <w:rFonts w:ascii="Arial" w:hAnsi="Arial" w:cs="Arial"/>
-          <w:sz w:val="24"/>
-          <w:szCs w:val="24"/>
-          <w:lang w:val="en-US"/>
-        </w:rPr>
-        <w:t xml:space="preserve">   </w:t>
-      </w:r>
-      <w:r>
-        <w:rPr>
-          <w:rFonts w:ascii="Arial" w:hAnsi="Arial" w:cs="Arial"/>
-          <w:sz w:val="24"/>
-          <w:szCs w:val="24"/>
-          <w:lang w:val="en-US"/>
-        </w:rPr>
-        <w:t>END IF</w:t>
-      </w:r>
-    </w:p>
-    <w:p>
-      <w:pPr>
-        <w:spacing w:line="360" w:lineRule="auto"/>
-        <w:rPr>
-          <w:rFonts w:ascii="Arial" w:hAnsi="Arial" w:cs="Arial"/>
-          <w:sz w:val="24"/>
-          <w:szCs w:val="24"/>
-          <w:lang w:val="en-US"/>
-        </w:rPr>
-      </w:pPr>
-    </w:p>
-    <w:p>
-      <w:pPr>
-        <w:spacing w:line="360" w:lineRule="auto"/>
-        <w:rPr>
-          <w:rFonts w:ascii="Arial" w:hAnsi="Arial" w:cs="Arial"/>
-          <w:sz w:val="24"/>
-          <w:szCs w:val="24"/>
-          <w:lang w:val="en-US"/>
-        </w:rPr>
-      </w:pPr>
-      <w:r>
-        <w:rPr>
-          <w:rFonts w:ascii="Arial" w:hAnsi="Arial" w:cs="Arial"/>
-          <w:sz w:val="24"/>
-          <w:szCs w:val="24"/>
-          <w:lang w:val="en-US"/>
-        </w:rPr>
-        <w:t xml:space="preserve">   </w:t>
-      </w:r>
-      <w:r>
-        <w:rPr>
-          <w:rFonts w:ascii="Arial" w:hAnsi="Arial" w:cs="Arial"/>
-          <w:sz w:val="24"/>
-          <w:szCs w:val="24"/>
-          <w:lang w:val="en-US"/>
-        </w:rPr>
-        <w:t xml:space="preserve">CREATE new </w:t>
-      </w:r>
-      <w:r>
-        <w:rPr>
-          <w:rFonts w:ascii="Arial" w:hAnsi="Arial" w:cs="Arial"/>
-          <w:sz w:val="24"/>
-          <w:szCs w:val="24"/>
-          <w:lang w:val="en-US"/>
-        </w:rPr>
-        <w:t>C</w:t>
-      </w:r>
-      <w:r>
-        <w:rPr>
-          <w:rFonts w:ascii="Arial" w:hAnsi="Arial" w:cs="Arial"/>
-          <w:sz w:val="24"/>
-          <w:szCs w:val="24"/>
-          <w:lang w:val="en-US"/>
-        </w:rPr>
-        <w:t>ourse</w:t>
-      </w:r>
-    </w:p>
-    <w:p>
-      <w:pPr>
-        <w:spacing w:line="360" w:lineRule="auto"/>
-        <w:rPr>
-          <w:rFonts w:ascii="Arial" w:hAnsi="Arial" w:cs="Arial"/>
-          <w:sz w:val="24"/>
-          <w:szCs w:val="24"/>
-          <w:lang w:val="en-US"/>
-        </w:rPr>
-      </w:pPr>
-    </w:p>
-    <w:p>
-      <w:pPr>
-        <w:spacing w:line="360" w:lineRule="auto"/>
-        <w:rPr>
-          <w:rFonts w:ascii="Arial" w:hAnsi="Arial" w:cs="Arial"/>
-          <w:sz w:val="24"/>
-          <w:szCs w:val="24"/>
-          <w:lang w:val="en-US"/>
-        </w:rPr>
-      </w:pPr>
-      <w:r>
-        <w:rPr>
-          <w:rFonts w:ascii="Arial" w:hAnsi="Arial" w:cs="Arial"/>
-          <w:sz w:val="24"/>
-          <w:szCs w:val="24"/>
-          <w:lang w:val="en-US"/>
-        </w:rPr>
-        <w:t xml:space="preserve">   </w:t>
-      </w:r>
-      <w:r>
-        <w:rPr>
-          <w:rFonts w:ascii="Arial" w:hAnsi="Arial" w:cs="Arial"/>
-          <w:sz w:val="24"/>
-          <w:szCs w:val="24"/>
-          <w:lang w:val="en-US"/>
-        </w:rPr>
-        <w:t>STORE Course</w:t>
-      </w:r>
-    </w:p>
-    <w:p>
-      <w:pPr>
-        <w:spacing w:line="360" w:lineRule="auto"/>
-        <w:rPr>
-          <w:rFonts w:ascii="Arial" w:hAnsi="Arial" w:cs="Arial"/>
-          <w:sz w:val="24"/>
-          <w:szCs w:val="24"/>
-          <w:lang w:val="en-US"/>
-        </w:rPr>
-      </w:pPr>
-    </w:p>
-    <w:p>
-      <w:pPr>
-        <w:spacing w:line="360" w:lineRule="auto"/>
-        <w:rPr>
-          <w:rFonts w:ascii="Arial" w:hAnsi="Arial" w:cs="Arial"/>
-          <w:sz w:val="24"/>
-          <w:szCs w:val="24"/>
-          <w:lang w:val="en-US"/>
-        </w:rPr>
-      </w:pPr>
-      <w:r>
-        <w:rPr>
-          <w:rFonts w:ascii="Arial" w:hAnsi="Arial" w:cs="Arial"/>
-          <w:sz w:val="24"/>
-          <w:szCs w:val="24"/>
-          <w:lang w:val="en-US"/>
-        </w:rPr>
-        <w:t xml:space="preserve">   </w:t>
-      </w:r>
-      <w:r>
-        <w:rPr>
-          <w:rFonts w:ascii="Arial" w:hAnsi="Arial" w:cs="Arial"/>
-          <w:sz w:val="24"/>
-          <w:szCs w:val="24"/>
-          <w:lang w:val="en-US"/>
-        </w:rPr>
-        <w:t>REDIRECT user to Courses page</w:t>
-      </w:r>
-    </w:p>
-    <w:p>
-      <w:pPr>
-        <w:spacing w:line="360" w:lineRule="auto"/>
-        <w:rPr>
-          <w:rFonts w:ascii="Arial" w:hAnsi="Arial" w:cs="Arial"/>
-          <w:sz w:val="24"/>
-          <w:szCs w:val="24"/>
-          <w:lang w:val="en-US"/>
-        </w:rPr>
-      </w:pPr>
-    </w:p>
-    <w:p>
-      <w:pPr>
-        <w:spacing w:line="360" w:lineRule="auto"/>
-        <w:rPr>
-          <w:rFonts w:ascii="Arial" w:hAnsi="Arial" w:cs="Arial"/>
-          <w:sz w:val="24"/>
-          <w:szCs w:val="24"/>
-          <w:lang w:val="en-US"/>
-        </w:rPr>
-      </w:pPr>
-      <w:r>
-        <w:rPr>
-          <w:rFonts w:ascii="Arial" w:hAnsi="Arial" w:cs="Arial"/>
-          <w:sz w:val="24"/>
-          <w:szCs w:val="24"/>
-          <w:lang w:val="en-US"/>
-        </w:rPr>
-        <w:t>END FUNCTION</w:t>
-      </w:r>
-    </w:p>
-    <w:p>
-      <w:pPr>
-        <w:spacing w:line="360" w:lineRule="auto"/>
-        <w:rPr>
-          <w:rFonts w:ascii="Arial" w:hAnsi="Arial" w:cs="Arial"/>
-          <w:sz w:val="24"/>
-          <w:szCs w:val="24"/>
-          <w:lang w:val="en-US"/>
-        </w:rPr>
-      </w:pPr>
-    </w:p>
-    <w:p>
-      <w:pPr>
-        <w:spacing w:line="360" w:lineRule="auto"/>
-        <w:rPr>
-          <w:rFonts w:ascii="Arial" w:hAnsi="Arial" w:cs="Arial"/>
-          <w:sz w:val="24"/>
-          <w:szCs w:val="24"/>
-          <w:lang w:val="en-US"/>
-        </w:rPr>
-      </w:pPr>
-    </w:p>
-    <w:p>
-      <w:pPr>
-        <w:spacing w:line="360" w:lineRule="auto"/>
-        <w:rPr>
-          <w:rFonts w:ascii="Arial" w:hAnsi="Arial" w:cs="Arial"/>
-          <w:sz w:val="24"/>
-          <w:szCs w:val="24"/>
-          <w:lang w:val="en-US"/>
-        </w:rPr>
-      </w:pPr>
-    </w:p>
-    <w:p>
-      <w:pPr>
-        <w:spacing w:line="360" w:lineRule="auto"/>
-        <w:rPr>
-          <w:rFonts w:ascii="Arial" w:hAnsi="Arial" w:cs="Arial"/>
-          <w:sz w:val="24"/>
-          <w:szCs w:val="24"/>
-          <w:lang w:val="en-US"/>
-        </w:rPr>
-      </w:pPr>
-      <w:r>
-        <w:rPr>
-          <w:rFonts w:ascii="Arial" w:hAnsi="Arial" w:cs="Arial"/>
-          <w:sz w:val="24"/>
-          <w:szCs w:val="24"/>
-          <w:lang w:val="en-US"/>
-        </w:rPr>
-        <w:t xml:space="preserve">FUNCTION </w:t>
-      </w:r>
-      <w:proofErr w:type="spellStart"/>
-      <w:r>
-        <w:rPr>
-          <w:rFonts w:ascii="Arial" w:hAnsi="Arial" w:cs="Arial"/>
-          <w:sz w:val="24"/>
-          <w:szCs w:val="24"/>
-          <w:lang w:val="en-US"/>
-        </w:rPr>
-        <w:t>CalculateGPA</w:t>
-      </w:r>
-      <w:proofErr w:type="spellEnd"/>
-      <w:r>
-        <w:rPr>
-          <w:rFonts w:ascii="Arial" w:hAnsi="Arial" w:cs="Arial"/>
-          <w:sz w:val="24"/>
-          <w:szCs w:val="24"/>
-          <w:lang w:val="en-US"/>
-        </w:rPr>
-        <w:t>(courses)</w:t>
-      </w:r>
-    </w:p>
-    <w:p>
-      <w:pPr>
-        <w:spacing w:line="360" w:lineRule="auto"/>
-        <w:rPr>
-          <w:rFonts w:ascii="Arial" w:hAnsi="Arial" w:cs="Arial"/>
-          <w:sz w:val="24"/>
-          <w:szCs w:val="24"/>
-          <w:lang w:val="en-US"/>
-        </w:rPr>
-      </w:pPr>
-    </w:p>
-    <w:p>
-      <w:pPr>
-        <w:spacing w:line="360" w:lineRule="auto"/>
-        <w:rPr>
-          <w:rFonts w:ascii="Arial" w:hAnsi="Arial" w:cs="Arial"/>
-          <w:sz w:val="24"/>
-          <w:szCs w:val="24"/>
-          <w:lang w:val="en-US"/>
-        </w:rPr>
-      </w:pPr>
-      <w:r>
-        <w:rPr>
-          <w:rFonts w:ascii="Arial" w:hAnsi="Arial" w:cs="Arial"/>
-          <w:sz w:val="24"/>
-          <w:szCs w:val="24"/>
-          <w:lang w:val="en-US"/>
-        </w:rPr>
-        <w:t xml:space="preserve">   </w:t>
-      </w:r>
-      <w:proofErr w:type="spellStart"/>
-      <w:r>
-        <w:rPr>
-          <w:rFonts w:ascii="Arial" w:hAnsi="Arial" w:cs="Arial"/>
-          <w:sz w:val="24"/>
-          <w:szCs w:val="24"/>
-          <w:lang w:val="en-US"/>
-        </w:rPr>
-        <w:t>totalQualityPoints</w:t>
-      </w:r>
-      <w:proofErr w:type="spellEnd"/>
-      <w:r>
-        <w:rPr>
-          <w:rFonts w:ascii="Arial" w:hAnsi="Arial" w:cs="Arial"/>
-          <w:sz w:val="24"/>
-          <w:szCs w:val="24"/>
-          <w:lang w:val="en-US"/>
-        </w:rPr>
-        <w:t xml:space="preserve"> = 0</w:t>
+        <w:t>totalQualityPoints = 0</w:t>
       </w:r>
     </w:p>
     <w:p>
@@ -7219,17 +7186,336 @@
         <w:lastRenderedPageBreak/>
         <w:t xml:space="preserve">   </w:t>
       </w:r>
-      <w:proofErr w:type="spellStart"/>
-      <w:r>
-        <w:rPr>
-          <w:rFonts w:ascii="Arial" w:hAnsi="Arial" w:cs="Arial"/>
-          <w:sz w:val="24"/>
-          <w:szCs w:val="24"/>
-          <w:lang w:val="en-US"/>
-        </w:rPr>
-        <w:t>attemptedCredits</w:t>
-      </w:r>
-      <w:proofErr w:type="spellEnd"/>
+      <w:r>
+        <w:rPr>
+          <w:rFonts w:ascii="Arial" w:hAnsi="Arial" w:cs="Arial"/>
+          <w:sz w:val="24"/>
+          <w:szCs w:val="24"/>
+          <w:lang w:val="en-US"/>
+        </w:rPr>
+        <w:t>attemptedCredits = 0</w:t>
+      </w:r>
+    </w:p>
+    <w:p>
+      <w:pPr>
+        <w:spacing w:line="360" w:lineRule="auto"/>
+        <w:rPr>
+          <w:rFonts w:ascii="Arial" w:hAnsi="Arial" w:cs="Arial"/>
+          <w:sz w:val="24"/>
+          <w:szCs w:val="24"/>
+          <w:lang w:val="en-US"/>
+        </w:rPr>
+      </w:pPr>
+    </w:p>
+    <w:p>
+      <w:pPr>
+        <w:spacing w:line="360" w:lineRule="auto"/>
+        <w:rPr>
+          <w:rFonts w:ascii="Arial" w:hAnsi="Arial" w:cs="Arial"/>
+          <w:sz w:val="24"/>
+          <w:szCs w:val="24"/>
+          <w:lang w:val="en-US"/>
+        </w:rPr>
+      </w:pPr>
+      <w:r>
+        <w:rPr>
+          <w:rFonts w:ascii="Arial" w:hAnsi="Arial" w:cs="Arial"/>
+          <w:sz w:val="24"/>
+          <w:szCs w:val="24"/>
+          <w:lang w:val="en-US"/>
+        </w:rPr>
+        <w:t xml:space="preserve">   </w:t>
+      </w:r>
+      <w:r>
+        <w:rPr>
+          <w:rFonts w:ascii="Arial" w:hAnsi="Arial" w:cs="Arial"/>
+          <w:sz w:val="24"/>
+          <w:szCs w:val="24"/>
+          <w:lang w:val="en-US"/>
+        </w:rPr>
+        <w:t>FOR EACH</w:t>
+      </w:r>
+      <w:r>
+        <w:rPr>
+          <w:rFonts w:ascii="Arial" w:hAnsi="Arial" w:cs="Arial"/>
+          <w:sz w:val="24"/>
+          <w:szCs w:val="24"/>
+          <w:lang w:val="en-US"/>
+        </w:rPr>
+        <w:t xml:space="preserve"> </w:t>
+      </w:r>
+      <w:r>
+        <w:rPr>
+          <w:rFonts w:ascii="Arial" w:hAnsi="Arial" w:cs="Arial"/>
+          <w:sz w:val="24"/>
+          <w:szCs w:val="24"/>
+          <w:lang w:val="en-US"/>
+        </w:rPr>
+        <w:t>course IN courses</w:t>
+      </w:r>
+    </w:p>
+    <w:p>
+      <w:pPr>
+        <w:spacing w:line="360" w:lineRule="auto"/>
+        <w:rPr>
+          <w:rFonts w:ascii="Arial" w:hAnsi="Arial" w:cs="Arial"/>
+          <w:sz w:val="24"/>
+          <w:szCs w:val="24"/>
+          <w:lang w:val="en-US"/>
+        </w:rPr>
+      </w:pPr>
+    </w:p>
+    <w:p>
+      <w:pPr>
+        <w:spacing w:line="360" w:lineRule="auto"/>
+        <w:rPr>
+          <w:rFonts w:ascii="Arial" w:hAnsi="Arial" w:cs="Arial"/>
+          <w:sz w:val="24"/>
+          <w:szCs w:val="24"/>
+          <w:lang w:val="en-US"/>
+        </w:rPr>
+      </w:pPr>
+      <w:r>
+        <w:rPr>
+          <w:rFonts w:ascii="Arial" w:hAnsi="Arial" w:cs="Arial"/>
+          <w:sz w:val="24"/>
+          <w:szCs w:val="24"/>
+          <w:lang w:val="en-US"/>
+        </w:rPr>
+        <w:t xml:space="preserve">      </w:t>
+      </w:r>
+      <w:r>
+        <w:rPr>
+          <w:rFonts w:ascii="Arial" w:hAnsi="Arial" w:cs="Arial"/>
+          <w:sz w:val="24"/>
+          <w:szCs w:val="24"/>
+          <w:lang w:val="en-US"/>
+        </w:rPr>
+        <w:t>gradePoints</w:t>
+      </w:r>
+      <w:r>
+        <w:rPr>
+          <w:rFonts w:ascii="Arial" w:hAnsi="Arial" w:cs="Arial"/>
+          <w:sz w:val="24"/>
+          <w:szCs w:val="24"/>
+          <w:lang w:val="en-US"/>
+        </w:rPr>
+        <w:t xml:space="preserve"> = ConvertGradeToPoints(</w:t>
+      </w:r>
+      <w:r>
+        <w:rPr>
+          <w:rFonts w:ascii="Arial" w:hAnsi="Arial" w:cs="Arial"/>
+          <w:sz w:val="24"/>
+          <w:szCs w:val="24"/>
+          <w:lang w:val="en-US"/>
+        </w:rPr>
+        <w:t>course.grade</w:t>
+      </w:r>
+      <w:r>
+        <w:rPr>
+          <w:rFonts w:ascii="Arial" w:hAnsi="Arial" w:cs="Arial"/>
+          <w:sz w:val="24"/>
+          <w:szCs w:val="24"/>
+          <w:lang w:val="en-US"/>
+        </w:rPr>
+        <w:t>)</w:t>
+      </w:r>
+    </w:p>
+    <w:p>
+      <w:pPr>
+        <w:spacing w:line="360" w:lineRule="auto"/>
+        <w:rPr>
+          <w:rFonts w:ascii="Arial" w:hAnsi="Arial" w:cs="Arial"/>
+          <w:sz w:val="24"/>
+          <w:szCs w:val="24"/>
+          <w:lang w:val="en-US"/>
+        </w:rPr>
+      </w:pPr>
+    </w:p>
+    <w:p>
+      <w:pPr>
+        <w:spacing w:line="360" w:lineRule="auto"/>
+        <w:rPr>
+          <w:rFonts w:ascii="Arial" w:hAnsi="Arial" w:cs="Arial"/>
+          <w:sz w:val="24"/>
+          <w:szCs w:val="24"/>
+          <w:lang w:val="en-US"/>
+        </w:rPr>
+      </w:pPr>
+      <w:r>
+        <w:rPr>
+          <w:rFonts w:ascii="Arial" w:hAnsi="Arial" w:cs="Arial"/>
+          <w:sz w:val="24"/>
+          <w:szCs w:val="24"/>
+          <w:lang w:val="en-US"/>
+        </w:rPr>
+        <w:t xml:space="preserve">      totalQualityPoints</w:t>
+      </w:r>
+      <w:r>
+        <w:rPr>
+          <w:rFonts w:ascii="Arial" w:hAnsi="Arial" w:cs="Arial"/>
+          <w:sz w:val="24"/>
+          <w:szCs w:val="24"/>
+          <w:lang w:val="en-US"/>
+        </w:rPr>
+        <w:t xml:space="preserve"> = totalQualityPoints</w:t>
+      </w:r>
+      <w:r>
+        <w:rPr>
+          <w:rFonts w:ascii="Arial" w:hAnsi="Arial" w:cs="Arial"/>
+          <w:sz w:val="24"/>
+          <w:szCs w:val="24"/>
+          <w:lang w:val="en-US"/>
+        </w:rPr>
+        <w:t xml:space="preserve"> + gradePoints</w:t>
+      </w:r>
+      <w:r>
+        <w:rPr>
+          <w:rFonts w:ascii="Arial" w:hAnsi="Arial" w:cs="Arial"/>
+          <w:sz w:val="24"/>
+          <w:szCs w:val="24"/>
+          <w:lang w:val="en-US"/>
+        </w:rPr>
+        <w:t xml:space="preserve"> * </w:t>
+      </w:r>
+      <w:r>
+        <w:rPr>
+          <w:rFonts w:ascii="Arial" w:hAnsi="Arial" w:cs="Arial"/>
+          <w:sz w:val="24"/>
+          <w:szCs w:val="24"/>
+          <w:lang w:val="en-US"/>
+        </w:rPr>
+        <w:t>course.credits</w:t>
+      </w:r>
+    </w:p>
+    <w:p>
+      <w:pPr>
+        <w:spacing w:line="360" w:lineRule="auto"/>
+        <w:rPr>
+          <w:rFonts w:ascii="Arial" w:hAnsi="Arial" w:cs="Arial"/>
+          <w:sz w:val="24"/>
+          <w:szCs w:val="24"/>
+          <w:lang w:val="en-US"/>
+        </w:rPr>
+      </w:pPr>
+    </w:p>
+    <w:p>
+      <w:pPr>
+        <w:spacing w:line="360" w:lineRule="auto"/>
+        <w:rPr>
+          <w:rFonts w:ascii="Arial" w:hAnsi="Arial" w:cs="Arial"/>
+          <w:sz w:val="24"/>
+          <w:szCs w:val="24"/>
+          <w:lang w:val="en-US"/>
+        </w:rPr>
+      </w:pPr>
+      <w:r>
+        <w:rPr>
+          <w:rFonts w:ascii="Arial" w:hAnsi="Arial" w:cs="Arial"/>
+          <w:sz w:val="24"/>
+          <w:szCs w:val="24"/>
+          <w:lang w:val="en-US"/>
+        </w:rPr>
+        <w:t xml:space="preserve">      attemptedCredits</w:t>
+      </w:r>
+      <w:r>
+        <w:rPr>
+          <w:rFonts w:ascii="Arial" w:hAnsi="Arial" w:cs="Arial"/>
+          <w:sz w:val="24"/>
+          <w:szCs w:val="24"/>
+          <w:lang w:val="en-US"/>
+        </w:rPr>
+        <w:t xml:space="preserve"> = attemptedCredits</w:t>
+      </w:r>
+      <w:r>
+        <w:rPr>
+          <w:rFonts w:ascii="Arial" w:hAnsi="Arial" w:cs="Arial"/>
+          <w:sz w:val="24"/>
+          <w:szCs w:val="24"/>
+          <w:lang w:val="en-US"/>
+        </w:rPr>
+        <w:t xml:space="preserve"> + course.credits</w:t>
+      </w:r>
+    </w:p>
+    <w:p>
+      <w:pPr>
+        <w:spacing w:line="360" w:lineRule="auto"/>
+        <w:rPr>
+          <w:rFonts w:ascii="Arial" w:hAnsi="Arial" w:cs="Arial"/>
+          <w:sz w:val="24"/>
+          <w:szCs w:val="24"/>
+          <w:lang w:val="en-US"/>
+        </w:rPr>
+      </w:pPr>
+    </w:p>
+    <w:p>
+      <w:pPr>
+        <w:spacing w:line="360" w:lineRule="auto"/>
+        <w:rPr>
+          <w:rFonts w:ascii="Arial" w:hAnsi="Arial" w:cs="Arial"/>
+          <w:sz w:val="24"/>
+          <w:szCs w:val="24"/>
+          <w:lang w:val="en-US"/>
+        </w:rPr>
+      </w:pPr>
+      <w:r>
+        <w:rPr>
+          <w:rFonts w:ascii="Arial" w:hAnsi="Arial" w:cs="Arial"/>
+          <w:sz w:val="24"/>
+          <w:szCs w:val="24"/>
+          <w:lang w:val="en-US"/>
+        </w:rPr>
+        <w:t xml:space="preserve">   </w:t>
+      </w:r>
+      <w:r>
+        <w:rPr>
+          <w:rFonts w:ascii="Arial" w:hAnsi="Arial" w:cs="Arial"/>
+          <w:sz w:val="24"/>
+          <w:szCs w:val="24"/>
+          <w:lang w:val="en-US"/>
+        </w:rPr>
+        <w:t>END FOR</w:t>
+      </w:r>
+    </w:p>
+    <w:p>
+      <w:pPr>
+        <w:spacing w:line="360" w:lineRule="auto"/>
+        <w:rPr>
+          <w:rFonts w:ascii="Arial" w:hAnsi="Arial" w:cs="Arial"/>
+          <w:sz w:val="24"/>
+          <w:szCs w:val="24"/>
+          <w:lang w:val="en-US"/>
+        </w:rPr>
+      </w:pPr>
+    </w:p>
+    <w:p>
+      <w:pPr>
+        <w:spacing w:line="360" w:lineRule="auto"/>
+        <w:rPr>
+          <w:rFonts w:ascii="Arial" w:hAnsi="Arial" w:cs="Arial"/>
+          <w:sz w:val="24"/>
+          <w:szCs w:val="24"/>
+          <w:lang w:val="en-US"/>
+        </w:rPr>
+      </w:pPr>
+      <w:r>
+        <w:rPr>
+          <w:rFonts w:ascii="Arial" w:hAnsi="Arial" w:cs="Arial"/>
+          <w:sz w:val="24"/>
+          <w:szCs w:val="24"/>
+          <w:lang w:val="en-US"/>
+        </w:rPr>
+        <w:t xml:space="preserve">   </w:t>
+      </w:r>
+      <w:r>
+        <w:rPr>
+          <w:rFonts w:ascii="Arial" w:hAnsi="Arial" w:cs="Arial"/>
+          <w:sz w:val="24"/>
+          <w:szCs w:val="24"/>
+          <w:lang w:val="en-US"/>
+        </w:rPr>
+        <w:t>IF attemptedCredits</w:t>
+      </w:r>
       <w:r>
         <w:rPr>
           <w:rFonts w:ascii="Arial" w:hAnsi="Arial" w:cs="Arial"/>
@@ -7250,6 +7536,46 @@
           <w:lang w:val="en-US"/>
         </w:rPr>
       </w:pPr>
+      <w:r>
+        <w:rPr>
+          <w:rFonts w:ascii="Arial" w:hAnsi="Arial" w:cs="Arial"/>
+          <w:sz w:val="24"/>
+          <w:szCs w:val="24"/>
+          <w:lang w:val="en-US"/>
+        </w:rPr>
+        <w:t xml:space="preserve">      RETURN 0</w:t>
+      </w:r>
+    </w:p>
+    <w:p>
+      <w:pPr>
+        <w:spacing w:line="360" w:lineRule="auto"/>
+        <w:rPr>
+          <w:rFonts w:ascii="Arial" w:hAnsi="Arial" w:cs="Arial"/>
+          <w:sz w:val="24"/>
+          <w:szCs w:val="24"/>
+          <w:lang w:val="en-US"/>
+        </w:rPr>
+      </w:pPr>
+      <w:r>
+        <w:rPr>
+          <w:rFonts w:ascii="Arial" w:hAnsi="Arial" w:cs="Arial"/>
+          <w:sz w:val="24"/>
+          <w:szCs w:val="24"/>
+          <w:lang w:val="en-US"/>
+        </w:rPr>
+        <w:t xml:space="preserve">   END IF</w:t>
+      </w:r>
+    </w:p>
+    <w:p>
+      <w:pPr>
+        <w:spacing w:line="360" w:lineRule="auto"/>
+        <w:rPr>
+          <w:rFonts w:ascii="Arial" w:hAnsi="Arial" w:cs="Arial"/>
+          <w:sz w:val="24"/>
+          <w:szCs w:val="24"/>
+          <w:lang w:val="en-US"/>
+        </w:rPr>
+      </w:pPr>
     </w:p>
     <w:p>
       <w:pPr>
@@ -7277,7 +7603,7 @@
           <w:szCs w:val="24"/>
           <w:lang w:val="en-US"/>
         </w:rPr>
-        <w:t>FOR EACH</w:t>
+        <w:t>RETURN</w:t>
       </w:r>
       <w:r>
         <w:rPr>
@@ -7295,509 +7621,8 @@
           <w:szCs w:val="24"/>
           <w:lang w:val="en-US"/>
         </w:rPr>
-        <w:t>course IN courses</w:t>
-      </w:r>
-    </w:p>
-    <w:p>
-      <w:pPr>
-        <w:spacing w:line="360" w:lineRule="auto"/>
-        <w:rPr>
-          <w:rFonts w:ascii="Arial" w:hAnsi="Arial" w:cs="Arial"/>
-          <w:sz w:val="24"/>
-          <w:szCs w:val="24"/>
-          <w:lang w:val="en-US"/>
-        </w:rPr>
-      </w:pPr>
-    </w:p>
-    <w:p>
-      <w:pPr>
-        <w:spacing w:line="360" w:lineRule="auto"/>
-        <w:rPr>
-          <w:rFonts w:ascii="Arial" w:hAnsi="Arial" w:cs="Arial"/>
-          <w:sz w:val="24"/>
-          <w:szCs w:val="24"/>
-          <w:lang w:val="en-US"/>
-        </w:rPr>
-      </w:pPr>
-      <w:r>
-        <w:rPr>
-          <w:rFonts w:ascii="Arial" w:hAnsi="Arial" w:cs="Arial"/>
-          <w:sz w:val="24"/>
-          <w:szCs w:val="24"/>
-          <w:lang w:val="en-US"/>
-        </w:rPr>
-        <w:t xml:space="preserve">      </w:t>
-      </w:r>
-      <w:proofErr w:type="spellStart"/>
-      <w:r>
-        <w:rPr>
-          <w:rFonts w:ascii="Arial" w:hAnsi="Arial" w:cs="Arial"/>
-          <w:sz w:val="24"/>
-          <w:szCs w:val="24"/>
-          <w:lang w:val="en-US"/>
-        </w:rPr>
-        <w:t>gradePoints</w:t>
-      </w:r>
-      <w:proofErr w:type="spellEnd"/>
-      <w:r>
-        <w:rPr>
-          <w:rFonts w:ascii="Arial" w:hAnsi="Arial" w:cs="Arial"/>
-          <w:sz w:val="24"/>
-          <w:szCs w:val="24"/>
-          <w:lang w:val="en-US"/>
-        </w:rPr>
-        <w:t xml:space="preserve"> = </w:t>
-      </w:r>
-      <w:proofErr w:type="spellStart"/>
-      <w:r>
-        <w:rPr>
-          <w:rFonts w:ascii="Arial" w:hAnsi="Arial" w:cs="Arial"/>
-          <w:sz w:val="24"/>
-          <w:szCs w:val="24"/>
-          <w:lang w:val="en-US"/>
-        </w:rPr>
-        <w:t>ConvertGradeToPoints</w:t>
-      </w:r>
-      <w:proofErr w:type="spellEnd"/>
-      <w:r>
-        <w:rPr>
-          <w:rFonts w:ascii="Arial" w:hAnsi="Arial" w:cs="Arial"/>
-          <w:sz w:val="24"/>
-          <w:szCs w:val="24"/>
-          <w:lang w:val="en-US"/>
-        </w:rPr>
-        <w:t>(</w:t>
-      </w:r>
-      <w:proofErr w:type="spellStart"/>
-      <w:proofErr w:type="gramStart"/>
-      <w:r>
-        <w:rPr>
-          <w:rFonts w:ascii="Arial" w:hAnsi="Arial" w:cs="Arial"/>
-          <w:sz w:val="24"/>
-          <w:szCs w:val="24"/>
-          <w:lang w:val="en-US"/>
-        </w:rPr>
-        <w:t>course.grade</w:t>
-      </w:r>
-      <w:proofErr w:type="spellEnd"/>
-      <w:proofErr w:type="gramEnd"/>
-      <w:r>
-        <w:rPr>
-          <w:rFonts w:ascii="Arial" w:hAnsi="Arial" w:cs="Arial"/>
-          <w:sz w:val="24"/>
-          <w:szCs w:val="24"/>
-          <w:lang w:val="en-US"/>
-        </w:rPr>
-        <w:t>)</w:t>
-      </w:r>
-    </w:p>
-    <w:p>
-      <w:pPr>
-        <w:spacing w:line="360" w:lineRule="auto"/>
-        <w:rPr>
-          <w:rFonts w:ascii="Arial" w:hAnsi="Arial" w:cs="Arial"/>
-          <w:sz w:val="24"/>
-          <w:szCs w:val="24"/>
-          <w:lang w:val="en-US"/>
-        </w:rPr>
-      </w:pPr>
-    </w:p>
-    <w:p>
-      <w:pPr>
-        <w:spacing w:line="360" w:lineRule="auto"/>
-        <w:rPr>
-          <w:rFonts w:ascii="Arial" w:hAnsi="Arial" w:cs="Arial"/>
-          <w:sz w:val="24"/>
-          <w:szCs w:val="24"/>
-          <w:lang w:val="en-US"/>
-        </w:rPr>
-      </w:pPr>
-      <w:r>
-        <w:rPr>
-          <w:rFonts w:ascii="Arial" w:hAnsi="Arial" w:cs="Arial"/>
-          <w:sz w:val="24"/>
-          <w:szCs w:val="24"/>
-          <w:lang w:val="en-US"/>
-        </w:rPr>
-        <w:t xml:space="preserve">      </w:t>
-      </w:r>
-      <w:proofErr w:type="spellStart"/>
-      <w:r>
-        <w:rPr>
-          <w:rFonts w:ascii="Arial" w:hAnsi="Arial" w:cs="Arial"/>
-          <w:sz w:val="24"/>
-          <w:szCs w:val="24"/>
-          <w:lang w:val="en-US"/>
-        </w:rPr>
-        <w:t>totalQualityPoints</w:t>
-      </w:r>
-      <w:proofErr w:type="spellEnd"/>
-      <w:r>
-        <w:rPr>
-          <w:rFonts w:ascii="Arial" w:hAnsi="Arial" w:cs="Arial"/>
-          <w:sz w:val="24"/>
-          <w:szCs w:val="24"/>
-          <w:lang w:val="en-US"/>
-        </w:rPr>
-        <w:t xml:space="preserve"> = </w:t>
-      </w:r>
-      <w:proofErr w:type="spellStart"/>
-      <w:r>
-        <w:rPr>
-          <w:rFonts w:ascii="Arial" w:hAnsi="Arial" w:cs="Arial"/>
-          <w:sz w:val="24"/>
-          <w:szCs w:val="24"/>
-          <w:lang w:val="en-US"/>
-        </w:rPr>
-        <w:t>totalQualityPoints</w:t>
-      </w:r>
-      <w:proofErr w:type="spellEnd"/>
-      <w:r>
-        <w:rPr>
-          <w:rFonts w:ascii="Arial" w:hAnsi="Arial" w:cs="Arial"/>
-          <w:sz w:val="24"/>
-          <w:szCs w:val="24"/>
-          <w:lang w:val="en-US"/>
-        </w:rPr>
-        <w:t xml:space="preserve"> + </w:t>
-      </w:r>
-      <w:proofErr w:type="spellStart"/>
-      <w:r>
-        <w:rPr>
-          <w:rFonts w:ascii="Arial" w:hAnsi="Arial" w:cs="Arial"/>
-          <w:sz w:val="24"/>
-          <w:szCs w:val="24"/>
-          <w:lang w:val="en-US"/>
-        </w:rPr>
-        <w:t>gradePoints</w:t>
-      </w:r>
-      <w:proofErr w:type="spellEnd"/>
-      <w:r>
-        <w:rPr>
-          <w:rFonts w:ascii="Arial" w:hAnsi="Arial" w:cs="Arial"/>
-          <w:sz w:val="24"/>
-          <w:szCs w:val="24"/>
-          <w:lang w:val="en-US"/>
-        </w:rPr>
-        <w:t xml:space="preserve"> * </w:t>
-      </w:r>
-      <w:proofErr w:type="spellStart"/>
-      <w:proofErr w:type="gramStart"/>
-      <w:r>
-        <w:rPr>
-          <w:rFonts w:ascii="Arial" w:hAnsi="Arial" w:cs="Arial"/>
-          <w:sz w:val="24"/>
-          <w:szCs w:val="24"/>
-          <w:lang w:val="en-US"/>
-        </w:rPr>
-        <w:t>course.credits</w:t>
-      </w:r>
-      <w:proofErr w:type="spellEnd"/>
-      <w:proofErr w:type="gramEnd"/>
-    </w:p>
-    <w:p>
-      <w:pPr>
-        <w:spacing w:line="360" w:lineRule="auto"/>
-        <w:rPr>
-          <w:rFonts w:ascii="Arial" w:hAnsi="Arial" w:cs="Arial"/>
-          <w:sz w:val="24"/>
-          <w:szCs w:val="24"/>
-          <w:lang w:val="en-US"/>
-        </w:rPr>
-      </w:pPr>
-    </w:p>
-    <w:p>
-      <w:pPr>
-        <w:spacing w:line="360" w:lineRule="auto"/>
-        <w:rPr>
-          <w:rFonts w:ascii="Arial" w:hAnsi="Arial" w:cs="Arial"/>
-          <w:sz w:val="24"/>
-          <w:szCs w:val="24"/>
-          <w:lang w:val="en-US"/>
-        </w:rPr>
-      </w:pPr>
-      <w:r>
-        <w:rPr>
-          <w:rFonts w:ascii="Arial" w:hAnsi="Arial" w:cs="Arial"/>
-          <w:sz w:val="24"/>
-          <w:szCs w:val="24"/>
-          <w:lang w:val="en-US"/>
-        </w:rPr>
-        <w:t xml:space="preserve">      </w:t>
-      </w:r>
-      <w:proofErr w:type="spellStart"/>
-      <w:r>
-        <w:rPr>
-          <w:rFonts w:ascii="Arial" w:hAnsi="Arial" w:cs="Arial"/>
-          <w:sz w:val="24"/>
-          <w:szCs w:val="24"/>
-          <w:lang w:val="en-US"/>
-        </w:rPr>
-        <w:t>attemptedCredits</w:t>
-      </w:r>
-      <w:proofErr w:type="spellEnd"/>
-      <w:r>
-        <w:rPr>
-          <w:rFonts w:ascii="Arial" w:hAnsi="Arial" w:cs="Arial"/>
-          <w:sz w:val="24"/>
-          <w:szCs w:val="24"/>
-          <w:lang w:val="en-US"/>
-        </w:rPr>
-        <w:t xml:space="preserve"> = </w:t>
-      </w:r>
-      <w:proofErr w:type="spellStart"/>
-      <w:r>
-        <w:rPr>
-          <w:rFonts w:ascii="Arial" w:hAnsi="Arial" w:cs="Arial"/>
-          <w:sz w:val="24"/>
-          <w:szCs w:val="24"/>
-          <w:lang w:val="en-US"/>
-        </w:rPr>
-        <w:t>attemptedCredits</w:t>
-      </w:r>
-      <w:proofErr w:type="spellEnd"/>
-      <w:r>
-        <w:rPr>
-          <w:rFonts w:ascii="Arial" w:hAnsi="Arial" w:cs="Arial"/>
-          <w:sz w:val="24"/>
-          <w:szCs w:val="24"/>
-          <w:lang w:val="en-US"/>
-        </w:rPr>
-        <w:t xml:space="preserve"> + </w:t>
-      </w:r>
-      <w:proofErr w:type="spellStart"/>
-      <w:proofErr w:type="gramStart"/>
-      <w:r>
-        <w:rPr>
-          <w:rFonts w:ascii="Arial" w:hAnsi="Arial" w:cs="Arial"/>
-          <w:sz w:val="24"/>
-          <w:szCs w:val="24"/>
-          <w:lang w:val="en-US"/>
-        </w:rPr>
-        <w:t>course.credits</w:t>
-      </w:r>
-      <w:proofErr w:type="spellEnd"/>
-      <w:proofErr w:type="gramEnd"/>
-    </w:p>
-    <w:p>
-      <w:pPr>
-        <w:spacing w:line="360" w:lineRule="auto"/>
-        <w:rPr>
-          <w:rFonts w:ascii="Arial" w:hAnsi="Arial" w:cs="Arial"/>
-          <w:sz w:val="24"/>
-          <w:szCs w:val="24"/>
-          <w:lang w:val="en-US"/>
-        </w:rPr>
-      </w:pPr>
-    </w:p>
-    <w:p>
-      <w:pPr>
-        <w:spacing w:line="360" w:lineRule="auto"/>
-        <w:rPr>
-          <w:rFonts w:ascii="Arial" w:hAnsi="Arial" w:cs="Arial"/>
-          <w:sz w:val="24"/>
-          <w:szCs w:val="24"/>
-          <w:lang w:val="en-US"/>
-        </w:rPr>
-      </w:pPr>
-      <w:r>
-        <w:rPr>
-          <w:rFonts w:ascii="Arial" w:hAnsi="Arial" w:cs="Arial"/>
-          <w:sz w:val="24"/>
-          <w:szCs w:val="24"/>
-          <w:lang w:val="en-US"/>
-        </w:rPr>
-        <w:t xml:space="preserve">   </w:t>
-      </w:r>
-      <w:r>
-        <w:rPr>
-          <w:rFonts w:ascii="Arial" w:hAnsi="Arial" w:cs="Arial"/>
-          <w:sz w:val="24"/>
-          <w:szCs w:val="24"/>
-          <w:lang w:val="en-US"/>
-        </w:rPr>
-        <w:t>END FOR</w:t>
-      </w:r>
-    </w:p>
-    <w:p>
-      <w:pPr>
-        <w:spacing w:line="360" w:lineRule="auto"/>
-        <w:rPr>
-          <w:rFonts w:ascii="Arial" w:hAnsi="Arial" w:cs="Arial"/>
-          <w:sz w:val="24"/>
-          <w:szCs w:val="24"/>
-          <w:lang w:val="en-US"/>
-        </w:rPr>
-      </w:pPr>
-    </w:p>
-    <w:p>
-      <w:pPr>
-        <w:spacing w:line="360" w:lineRule="auto"/>
-        <w:rPr>
-          <w:rFonts w:ascii="Arial" w:hAnsi="Arial" w:cs="Arial"/>
-          <w:sz w:val="24"/>
-          <w:szCs w:val="24"/>
-          <w:lang w:val="en-US"/>
-        </w:rPr>
-      </w:pPr>
-      <w:r>
-        <w:rPr>
-          <w:rFonts w:ascii="Arial" w:hAnsi="Arial" w:cs="Arial"/>
-          <w:sz w:val="24"/>
-          <w:szCs w:val="24"/>
-          <w:lang w:val="en-US"/>
-        </w:rPr>
-        <w:t xml:space="preserve">   </w:t>
-      </w:r>
-      <w:r>
-        <w:rPr>
-          <w:rFonts w:ascii="Arial" w:hAnsi="Arial" w:cs="Arial"/>
-          <w:sz w:val="24"/>
-          <w:szCs w:val="24"/>
-          <w:lang w:val="en-US"/>
-        </w:rPr>
-        <w:t xml:space="preserve">IF </w:t>
-      </w:r>
-      <w:proofErr w:type="spellStart"/>
-      <w:r>
-        <w:rPr>
-          <w:rFonts w:ascii="Arial" w:hAnsi="Arial" w:cs="Arial"/>
-          <w:sz w:val="24"/>
-          <w:szCs w:val="24"/>
-          <w:lang w:val="en-US"/>
-        </w:rPr>
-        <w:t>attemptedCredits</w:t>
-      </w:r>
-      <w:proofErr w:type="spellEnd"/>
-      <w:r>
-        <w:rPr>
-          <w:rFonts w:ascii="Arial" w:hAnsi="Arial" w:cs="Arial"/>
-          <w:sz w:val="24"/>
-          <w:szCs w:val="24"/>
-          <w:lang w:val="en-US"/>
-        </w:rPr>
-        <w:t xml:space="preserve"> = 0</w:t>
-      </w:r>
-    </w:p>
-    <w:p>
-      <w:pPr>
-        <w:spacing w:line="360" w:lineRule="auto"/>
-        <w:rPr>
-          <w:rFonts w:ascii="Arial" w:hAnsi="Arial" w:cs="Arial"/>
-          <w:sz w:val="24"/>
-          <w:szCs w:val="24"/>
-          <w:lang w:val="en-US"/>
-        </w:rPr>
-      </w:pPr>
-      <w:r>
-        <w:rPr>
-          <w:rFonts w:ascii="Arial" w:hAnsi="Arial" w:cs="Arial"/>
-          <w:sz w:val="24"/>
-          <w:szCs w:val="24"/>
-          <w:lang w:val="en-US"/>
-        </w:rPr>
-        <w:t xml:space="preserve">      RETURN 0</w:t>
-      </w:r>
-    </w:p>
-    <w:p>
-      <w:pPr>
-        <w:spacing w:line="360" w:lineRule="auto"/>
-        <w:rPr>
-          <w:rFonts w:ascii="Arial" w:hAnsi="Arial" w:cs="Arial"/>
-          <w:sz w:val="24"/>
-          <w:szCs w:val="24"/>
-          <w:lang w:val="en-US"/>
-        </w:rPr>
-      </w:pPr>
-      <w:r>
-        <w:rPr>
-          <w:rFonts w:ascii="Arial" w:hAnsi="Arial" w:cs="Arial"/>
-          <w:sz w:val="24"/>
-          <w:szCs w:val="24"/>
-          <w:lang w:val="en-US"/>
-        </w:rPr>
-        <w:t xml:space="preserve">   END IF</w:t>
-      </w:r>
-    </w:p>
-    <w:p>
-      <w:pPr>
-        <w:spacing w:line="360" w:lineRule="auto"/>
-        <w:rPr>
-          <w:rFonts w:ascii="Arial" w:hAnsi="Arial" w:cs="Arial"/>
-          <w:sz w:val="24"/>
-          <w:szCs w:val="24"/>
-          <w:lang w:val="en-US"/>
-        </w:rPr>
-      </w:pPr>
-    </w:p>
-    <w:p>
-      <w:pPr>
-        <w:spacing w:line="360" w:lineRule="auto"/>
-        <w:rPr>
-          <w:rFonts w:ascii="Arial" w:hAnsi="Arial" w:cs="Arial"/>
-          <w:sz w:val="24"/>
-          <w:szCs w:val="24"/>
-          <w:lang w:val="en-US"/>
-        </w:rPr>
-      </w:pPr>
-      <w:r>
-        <w:rPr>
-          <w:rFonts w:ascii="Arial" w:hAnsi="Arial" w:cs="Arial"/>
-          <w:sz w:val="24"/>
-          <w:szCs w:val="24"/>
-          <w:lang w:val="en-US"/>
-        </w:rPr>
-        <w:t xml:space="preserve">   </w:t>
-      </w:r>
-      <w:r>
-        <w:rPr>
-          <w:rFonts w:ascii="Arial" w:hAnsi="Arial" w:cs="Arial"/>
-          <w:sz w:val="24"/>
-          <w:szCs w:val="24"/>
-          <w:lang w:val="en-US"/>
-        </w:rPr>
-        <w:t>RETURN</w:t>
-      </w:r>
-      <w:r>
-        <w:rPr>
-          <w:rFonts w:ascii="Arial" w:hAnsi="Arial" w:cs="Arial"/>
-          <w:sz w:val="24"/>
-          <w:szCs w:val="24"/>
-          <w:lang w:val="en-US"/>
-        </w:rPr>
-        <w:t xml:space="preserve"> </w:t>
-      </w:r>
-      <w:proofErr w:type="spellStart"/>
-      <w:r>
-        <w:rPr>
-          <w:rFonts w:ascii="Arial" w:hAnsi="Arial" w:cs="Arial"/>
-          <w:sz w:val="24"/>
-          <w:szCs w:val="24"/>
-          <w:lang w:val="en-US"/>
-        </w:rPr>
-        <w:t>totalQualityPoints</w:t>
-      </w:r>
-      <w:proofErr w:type="spellEnd"/>
-      <w:r>
-        <w:rPr>
-          <w:rFonts w:ascii="Arial" w:hAnsi="Arial" w:cs="Arial"/>
-          <w:sz w:val="24"/>
-          <w:szCs w:val="24"/>
-          <w:lang w:val="en-US"/>
-        </w:rPr>
-        <w:t xml:space="preserve"> / </w:t>
-      </w:r>
-      <w:proofErr w:type="spellStart"/>
-      <w:r>
-        <w:rPr>
-          <w:rFonts w:ascii="Arial" w:hAnsi="Arial" w:cs="Arial"/>
-          <w:sz w:val="24"/>
-          <w:szCs w:val="24"/>
-          <w:lang w:val="en-US"/>
-        </w:rPr>
-        <w:t>attemptedCredits</w:t>
-      </w:r>
-      <w:proofErr w:type="spellEnd"/>
+        <w:t>totalQualityPoints / attemptedCredits</w:t>
+      </w:r>
     </w:p>
     <w:p>
       <w:pPr>
@@ -7880,27 +7705,7 @@
           <w:szCs w:val="24"/>
           <w:lang w:val="en-US"/>
         </w:rPr>
-        <w:t xml:space="preserve">FUNCTION </w:t>
-      </w:r>
-      <w:proofErr w:type="spellStart"/>
-      <w:r>
-        <w:rPr>
-          <w:rFonts w:ascii="Arial" w:hAnsi="Arial" w:cs="Arial"/>
-          <w:sz w:val="24"/>
-          <w:szCs w:val="24"/>
-          <w:lang w:val="en-US"/>
-        </w:rPr>
-        <w:t>ConvertGradeToPoints</w:t>
-      </w:r>
-      <w:proofErr w:type="spellEnd"/>
-      <w:r>
-        <w:rPr>
-          <w:rFonts w:ascii="Arial" w:hAnsi="Arial" w:cs="Arial"/>
-          <w:sz w:val="24"/>
-          <w:szCs w:val="24"/>
-          <w:lang w:val="en-US"/>
-        </w:rPr>
-        <w:t>(grade)</w:t>
+        <w:t>FUNCTION ConvertGradeToPoints(grade)</w:t>
       </w:r>
     </w:p>
     <w:p>
@@ -7990,36 +7795,16 @@
           <w:szCs w:val="24"/>
           <w:lang w:val="en-US"/>
         </w:rPr>
-        <w:t xml:space="preserve">   ELSE IF grade </w:t>
-      </w:r>
-      <w:proofErr w:type="gramStart"/>
-      <w:r>
-        <w:rPr>
-          <w:rFonts w:ascii="Arial" w:hAnsi="Arial" w:cs="Arial"/>
-          <w:sz w:val="24"/>
-          <w:szCs w:val="24"/>
-          <w:lang w:val="en-US"/>
-        </w:rPr>
-        <w:t>= ”</w:t>
-      </w:r>
-      <w:r>
-        <w:rPr>
-          <w:rFonts w:ascii="Arial" w:hAnsi="Arial" w:cs="Arial"/>
-          <w:sz w:val="24"/>
-          <w:szCs w:val="24"/>
-          <w:lang w:val="en-US"/>
-        </w:rPr>
-        <w:t>A</w:t>
-      </w:r>
-      <w:proofErr w:type="gramEnd"/>
-      <w:r>
-        <w:rPr>
-          <w:rFonts w:ascii="Arial" w:hAnsi="Arial" w:cs="Arial"/>
-          <w:sz w:val="24"/>
-          <w:szCs w:val="24"/>
-          <w:lang w:val="en-US"/>
-        </w:rPr>
-        <w:t>-</w:t>
+        <w:t xml:space="preserve">   ELSE IF grade = ”</w:t>
+      </w:r>
+      <w:r>
+        <w:rPr>
+          <w:rFonts w:ascii="Arial" w:hAnsi="Arial" w:cs="Arial"/>
+          <w:sz w:val="24"/>
+          <w:szCs w:val="24"/>
+          <w:lang w:val="en-US"/>
+        </w:rPr>
+        <w:t>A-</w:t>
       </w:r>
       <w:r>
         <w:rPr>
@@ -8576,79 +8361,353 @@
           <w:szCs w:val="24"/>
           <w:lang w:val="en-US"/>
         </w:rPr>
+        <w:t xml:space="preserve"> CalculateProjectedGPA(</w:t>
+      </w:r>
+      <w:r>
+        <w:rPr>
+          <w:rFonts w:ascii="Arial" w:hAnsi="Arial" w:cs="Arial"/>
+          <w:sz w:val="24"/>
+          <w:szCs w:val="24"/>
+          <w:lang w:val="en-US"/>
+        </w:rPr>
+        <w:t>currentCourses,</w:t>
+      </w:r>
+      <w:r>
+        <w:rPr>
+          <w:rFonts w:ascii="Arial" w:hAnsi="Arial" w:cs="Arial"/>
+          <w:sz w:val="24"/>
+          <w:szCs w:val="24"/>
+          <w:lang w:val="en-US"/>
+        </w:rPr>
+        <w:t xml:space="preserve"> hypothetical</w:t>
+      </w:r>
+      <w:r>
+        <w:rPr>
+          <w:rFonts w:ascii="Arial" w:hAnsi="Arial" w:cs="Arial"/>
+          <w:sz w:val="24"/>
+          <w:szCs w:val="24"/>
+          <w:lang w:val="en-US"/>
+        </w:rPr>
+        <w:t>Courses</w:t>
+      </w:r>
+      <w:r>
+        <w:rPr>
+          <w:rFonts w:ascii="Arial" w:hAnsi="Arial" w:cs="Arial"/>
+          <w:sz w:val="24"/>
+          <w:szCs w:val="24"/>
+          <w:lang w:val="en-US"/>
+        </w:rPr>
+        <w:t>)</w:t>
+      </w:r>
+    </w:p>
+    <w:p>
+      <w:pPr>
+        <w:spacing w:line="360" w:lineRule="auto"/>
+        <w:rPr>
+          <w:rFonts w:ascii="Arial" w:hAnsi="Arial" w:cs="Arial"/>
+          <w:sz w:val="24"/>
+          <w:szCs w:val="24"/>
+          <w:lang w:val="en-US"/>
+        </w:rPr>
+      </w:pPr>
+    </w:p>
+    <w:p>
+      <w:pPr>
+        <w:spacing w:line="360" w:lineRule="auto"/>
+        <w:rPr>
+          <w:rFonts w:ascii="Arial" w:hAnsi="Arial" w:cs="Arial"/>
+          <w:sz w:val="24"/>
+          <w:szCs w:val="24"/>
+          <w:lang w:val="en-US"/>
+        </w:rPr>
+      </w:pPr>
+      <w:r>
+        <w:rPr>
+          <w:rFonts w:ascii="Arial" w:hAnsi="Arial" w:cs="Arial"/>
+          <w:sz w:val="24"/>
+          <w:szCs w:val="24"/>
+          <w:lang w:val="en-US"/>
+        </w:rPr>
+        <w:t xml:space="preserve">   currentQualityPoints = </w:t>
+      </w:r>
+      <w:r>
+        <w:rPr>
+          <w:rFonts w:ascii="Arial" w:hAnsi="Arial" w:cs="Arial"/>
+          <w:sz w:val="24"/>
+          <w:szCs w:val="24"/>
+          <w:lang w:val="en-US"/>
+        </w:rPr>
+        <w:t>CalculateQualityPoints</w:t>
+      </w:r>
+      <w:r>
+        <w:rPr>
+          <w:rFonts w:ascii="Arial" w:hAnsi="Arial" w:cs="Arial"/>
+          <w:sz w:val="24"/>
+          <w:szCs w:val="24"/>
+          <w:lang w:val="en-US"/>
+        </w:rPr>
+        <w:t>(</w:t>
+      </w:r>
+      <w:r>
+        <w:rPr>
+          <w:rFonts w:ascii="Arial" w:hAnsi="Arial" w:cs="Arial"/>
+          <w:sz w:val="24"/>
+          <w:szCs w:val="24"/>
+          <w:lang w:val="en-US"/>
+        </w:rPr>
+        <w:t>currentCourses</w:t>
+      </w:r>
+      <w:r>
+        <w:rPr>
+          <w:rFonts w:ascii="Arial" w:hAnsi="Arial" w:cs="Arial"/>
+          <w:sz w:val="24"/>
+          <w:szCs w:val="24"/>
+          <w:lang w:val="en-US"/>
+        </w:rPr>
+        <w:t>)</w:t>
+      </w:r>
+    </w:p>
+    <w:p>
+      <w:pPr>
+        <w:spacing w:line="360" w:lineRule="auto"/>
+        <w:rPr>
+          <w:rFonts w:ascii="Arial" w:hAnsi="Arial" w:cs="Arial"/>
+          <w:sz w:val="24"/>
+          <w:szCs w:val="24"/>
+          <w:lang w:val="en-US"/>
+        </w:rPr>
+      </w:pPr>
+    </w:p>
+    <w:p>
+      <w:pPr>
+        <w:spacing w:line="360" w:lineRule="auto"/>
+        <w:rPr>
+          <w:rFonts w:ascii="Arial" w:hAnsi="Arial" w:cs="Arial"/>
+          <w:sz w:val="24"/>
+          <w:szCs w:val="24"/>
+          <w:lang w:val="en-US"/>
+        </w:rPr>
+      </w:pPr>
+      <w:r>
+        <w:rPr>
+          <w:rFonts w:ascii="Arial" w:hAnsi="Arial" w:cs="Arial"/>
+          <w:sz w:val="24"/>
+          <w:szCs w:val="24"/>
+          <w:lang w:val="en-US"/>
+        </w:rPr>
+        <w:t xml:space="preserve">   futureQualityPoints = CalculateQualityPoints(hypotheticalCourses)</w:t>
+      </w:r>
+    </w:p>
+    <w:p>
+      <w:pPr>
+        <w:spacing w:line="360" w:lineRule="auto"/>
+        <w:rPr>
+          <w:rFonts w:ascii="Arial" w:hAnsi="Arial" w:cs="Arial"/>
+          <w:sz w:val="24"/>
+          <w:szCs w:val="24"/>
+          <w:lang w:val="en-US"/>
+        </w:rPr>
+      </w:pPr>
+    </w:p>
+    <w:p>
+      <w:pPr>
+        <w:spacing w:line="360" w:lineRule="auto"/>
+        <w:rPr>
+          <w:rFonts w:ascii="Arial" w:hAnsi="Arial" w:cs="Arial"/>
+          <w:sz w:val="24"/>
+          <w:szCs w:val="24"/>
+          <w:lang w:val="en-US"/>
+        </w:rPr>
+      </w:pPr>
+      <w:r>
+        <w:rPr>
+          <w:rFonts w:ascii="Arial" w:hAnsi="Arial" w:cs="Arial"/>
+          <w:sz w:val="24"/>
+          <w:szCs w:val="24"/>
+          <w:lang w:val="en-US"/>
+        </w:rPr>
+        <w:t xml:space="preserve">   </w:t>
+      </w:r>
+      <w:r>
+        <w:rPr>
+          <w:rFonts w:ascii="Arial" w:hAnsi="Arial" w:cs="Arial"/>
+          <w:sz w:val="24"/>
+          <w:szCs w:val="24"/>
+          <w:lang w:val="en-US"/>
+        </w:rPr>
+        <w:t>currentCredits</w:t>
+      </w:r>
+      <w:r>
+        <w:rPr>
+          <w:rFonts w:ascii="Arial" w:hAnsi="Arial" w:cs="Arial"/>
+          <w:sz w:val="24"/>
+          <w:szCs w:val="24"/>
+          <w:lang w:val="en-US"/>
+        </w:rPr>
+        <w:t xml:space="preserve"> = CalculateAttemptedCredits</w:t>
+      </w:r>
+      <w:r>
+        <w:rPr>
+          <w:rFonts w:ascii="Arial" w:hAnsi="Arial" w:cs="Arial"/>
+          <w:sz w:val="24"/>
+          <w:szCs w:val="24"/>
+          <w:lang w:val="en-US"/>
+        </w:rPr>
+        <w:t>(</w:t>
+      </w:r>
+      <w:r>
+        <w:rPr>
+          <w:rFonts w:ascii="Arial" w:hAnsi="Arial" w:cs="Arial"/>
+          <w:sz w:val="24"/>
+          <w:szCs w:val="24"/>
+          <w:lang w:val="en-US"/>
+        </w:rPr>
+        <w:t>currentCourses</w:t>
+      </w:r>
+      <w:r>
+        <w:rPr>
+          <w:rFonts w:ascii="Arial" w:hAnsi="Arial" w:cs="Arial"/>
+          <w:sz w:val="24"/>
+          <w:szCs w:val="24"/>
+          <w:lang w:val="en-US"/>
+        </w:rPr>
+        <w:t>)</w:t>
+      </w:r>
+    </w:p>
+    <w:p>
+      <w:pPr>
+        <w:spacing w:line="360" w:lineRule="auto"/>
+        <w:rPr>
+          <w:rFonts w:ascii="Arial" w:hAnsi="Arial" w:cs="Arial"/>
+          <w:sz w:val="24"/>
+          <w:szCs w:val="24"/>
+          <w:lang w:val="en-US"/>
+        </w:rPr>
+      </w:pPr>
+    </w:p>
+    <w:p>
+      <w:pPr>
+        <w:spacing w:line="360" w:lineRule="auto"/>
+        <w:rPr>
+          <w:rFonts w:ascii="Arial" w:hAnsi="Arial" w:cs="Arial"/>
+          <w:sz w:val="24"/>
+          <w:szCs w:val="24"/>
+          <w:lang w:val="en-US"/>
+        </w:rPr>
+      </w:pPr>
+      <w:r>
+        <w:rPr>
+          <w:rFonts w:ascii="Arial" w:hAnsi="Arial" w:cs="Arial"/>
+          <w:sz w:val="24"/>
+          <w:szCs w:val="24"/>
+          <w:lang w:val="en-US"/>
+        </w:rPr>
+        <w:t xml:space="preserve">   futureCredits</w:t>
+      </w:r>
+      <w:r>
+        <w:rPr>
+          <w:rFonts w:ascii="Arial" w:hAnsi="Arial" w:cs="Arial"/>
+          <w:sz w:val="24"/>
+          <w:szCs w:val="24"/>
+          <w:lang w:val="en-US"/>
+        </w:rPr>
+        <w:t xml:space="preserve"> = CalculateAttemptedCredits(hypotheticalCourses)</w:t>
+      </w:r>
+    </w:p>
+    <w:p>
+      <w:pPr>
+        <w:spacing w:line="360" w:lineRule="auto"/>
+        <w:rPr>
+          <w:rFonts w:ascii="Arial" w:hAnsi="Arial" w:cs="Arial"/>
+          <w:sz w:val="24"/>
+          <w:szCs w:val="24"/>
+          <w:lang w:val="en-US"/>
+        </w:rPr>
+      </w:pPr>
+    </w:p>
+    <w:p>
+      <w:pPr>
+        <w:spacing w:line="360" w:lineRule="auto"/>
+        <w:ind w:left="204"/>
+        <w:rPr>
+          <w:rFonts w:ascii="Arial" w:hAnsi="Arial" w:cs="Arial"/>
+          <w:sz w:val="24"/>
+          <w:szCs w:val="24"/>
+          <w:lang w:val="en-US"/>
+        </w:rPr>
+      </w:pPr>
+      <w:r>
+        <w:rPr>
+          <w:rFonts w:ascii="Arial" w:hAnsi="Arial" w:cs="Arial"/>
+          <w:sz w:val="24"/>
+          <w:szCs w:val="24"/>
+          <w:lang w:val="en-US"/>
+        </w:rPr>
+        <w:t>projectedGPA</w:t>
+      </w:r>
+      <w:r>
+        <w:rPr>
+          <w:rFonts w:ascii="Arial" w:hAnsi="Arial" w:cs="Arial"/>
+          <w:sz w:val="24"/>
+          <w:szCs w:val="24"/>
+          <w:lang w:val="en-US"/>
+        </w:rPr>
+        <w:t xml:space="preserve"> = (</w:t>
+      </w:r>
+      <w:r>
+        <w:rPr>
+          <w:rFonts w:ascii="Arial" w:hAnsi="Arial" w:cs="Arial"/>
+          <w:sz w:val="24"/>
+          <w:szCs w:val="24"/>
+          <w:lang w:val="en-US"/>
+        </w:rPr>
+        <w:t>currentQualityPoints</w:t>
+      </w:r>
+      <w:r>
+        <w:rPr>
+          <w:rFonts w:ascii="Arial" w:hAnsi="Arial" w:cs="Arial"/>
+          <w:sz w:val="24"/>
+          <w:szCs w:val="24"/>
+          <w:lang w:val="en-US"/>
+        </w:rPr>
+        <w:t xml:space="preserve"> + futureQualityPoints</w:t>
+      </w:r>
+      <w:r>
+        <w:rPr>
+          <w:rFonts w:ascii="Arial" w:hAnsi="Arial" w:cs="Arial"/>
+          <w:sz w:val="24"/>
+          <w:szCs w:val="24"/>
+          <w:lang w:val="en-US"/>
+        </w:rPr>
+        <w:t>) / (</w:t>
+      </w:r>
+      <w:r>
+        <w:rPr>
+          <w:rFonts w:ascii="Arial" w:hAnsi="Arial" w:cs="Arial"/>
+          <w:sz w:val="24"/>
+          <w:szCs w:val="24"/>
+          <w:lang w:val="en-US"/>
+        </w:rPr>
+        <w:t>currentCredits +</w:t>
+      </w:r>
+      <w:r>
+        <w:rPr>
+          <w:rFonts w:ascii="Arial" w:hAnsi="Arial" w:cs="Arial"/>
+          <w:sz w:val="24"/>
+          <w:szCs w:val="24"/>
+          <w:lang w:val="en-US"/>
+        </w:rPr>
         <w:t xml:space="preserve"> </w:t>
       </w:r>
-      <w:proofErr w:type="spellStart"/>
-      <w:proofErr w:type="gramStart"/>
-      <w:r>
-        <w:rPr>
-          <w:rFonts w:ascii="Arial" w:hAnsi="Arial" w:cs="Arial"/>
-          <w:sz w:val="24"/>
-          <w:szCs w:val="24"/>
-          <w:lang w:val="en-US"/>
-        </w:rPr>
-        <w:t>CalculateProjectedGPA</w:t>
-      </w:r>
-      <w:proofErr w:type="spellEnd"/>
-      <w:r>
-        <w:rPr>
-          <w:rFonts w:ascii="Arial" w:hAnsi="Arial" w:cs="Arial"/>
-          <w:sz w:val="24"/>
-          <w:szCs w:val="24"/>
-          <w:lang w:val="en-US"/>
-        </w:rPr>
-        <w:t>(</w:t>
-      </w:r>
-      <w:proofErr w:type="spellStart"/>
-      <w:proofErr w:type="gramEnd"/>
-      <w:r>
-        <w:rPr>
-          <w:rFonts w:ascii="Arial" w:hAnsi="Arial" w:cs="Arial"/>
-          <w:sz w:val="24"/>
-          <w:szCs w:val="24"/>
-          <w:lang w:val="en-US"/>
-        </w:rPr>
-        <w:t>currentCourses</w:t>
-      </w:r>
-      <w:proofErr w:type="spellEnd"/>
-      <w:r>
-        <w:rPr>
-          <w:rFonts w:ascii="Arial" w:hAnsi="Arial" w:cs="Arial"/>
-          <w:sz w:val="24"/>
-          <w:szCs w:val="24"/>
-          <w:lang w:val="en-US"/>
-        </w:rPr>
-        <w:t>,</w:t>
-      </w:r>
-      <w:r>
-        <w:rPr>
-          <w:rFonts w:ascii="Arial" w:hAnsi="Arial" w:cs="Arial"/>
-          <w:sz w:val="24"/>
-          <w:szCs w:val="24"/>
-          <w:lang w:val="en-US"/>
-        </w:rPr>
-        <w:t xml:space="preserve"> </w:t>
-      </w:r>
-      <w:proofErr w:type="spellStart"/>
-      <w:r>
-        <w:rPr>
-          <w:rFonts w:ascii="Arial" w:hAnsi="Arial" w:cs="Arial"/>
-          <w:sz w:val="24"/>
-          <w:szCs w:val="24"/>
-          <w:lang w:val="en-US"/>
-        </w:rPr>
-        <w:t>hypothetical</w:t>
-      </w:r>
-      <w:r>
-        <w:rPr>
-          <w:rFonts w:ascii="Arial" w:hAnsi="Arial" w:cs="Arial"/>
-          <w:sz w:val="24"/>
-          <w:szCs w:val="24"/>
-          <w:lang w:val="en-US"/>
-        </w:rPr>
-        <w:t>Courses</w:t>
-      </w:r>
-      <w:proofErr w:type="spellEnd"/>
+      <w:r>
+        <w:rPr>
+          <w:rFonts w:ascii="Arial" w:hAnsi="Arial" w:cs="Arial"/>
+          <w:sz w:val="24"/>
+          <w:szCs w:val="24"/>
+          <w:lang w:val="en-US"/>
+        </w:rPr>
+        <w:t>futureCredits</w:t>
+      </w:r>
       <w:r>
         <w:rPr>
           <w:rFonts w:ascii="Arial" w:hAnsi="Arial" w:cs="Arial"/>
@@ -8662,381 +8721,6 @@
     <w:p>
       <w:pPr>
         <w:spacing w:line="360" w:lineRule="auto"/>
-        <w:rPr>
-          <w:rFonts w:ascii="Arial" w:hAnsi="Arial" w:cs="Arial"/>
-          <w:sz w:val="24"/>
-          <w:szCs w:val="24"/>
-          <w:lang w:val="en-US"/>
-        </w:rPr>
-      </w:pPr>
-    </w:p>
-    <w:p>
-      <w:pPr>
-        <w:spacing w:line="360" w:lineRule="auto"/>
-        <w:rPr>
-          <w:rFonts w:ascii="Arial" w:hAnsi="Arial" w:cs="Arial"/>
-          <w:sz w:val="24"/>
-          <w:szCs w:val="24"/>
-          <w:lang w:val="en-US"/>
-        </w:rPr>
-      </w:pPr>
-      <w:r>
-        <w:rPr>
-          <w:rFonts w:ascii="Arial" w:hAnsi="Arial" w:cs="Arial"/>
-          <w:sz w:val="24"/>
-          <w:szCs w:val="24"/>
-          <w:lang w:val="en-US"/>
-        </w:rPr>
-        <w:t xml:space="preserve">   </w:t>
-      </w:r>
-      <w:proofErr w:type="spellStart"/>
-      <w:r>
-        <w:rPr>
-          <w:rFonts w:ascii="Arial" w:hAnsi="Arial" w:cs="Arial"/>
-          <w:sz w:val="24"/>
-          <w:szCs w:val="24"/>
-          <w:lang w:val="en-US"/>
-        </w:rPr>
-        <w:t>currentQualityPoints</w:t>
-      </w:r>
-      <w:proofErr w:type="spellEnd"/>
-      <w:r>
-        <w:rPr>
-          <w:rFonts w:ascii="Arial" w:hAnsi="Arial" w:cs="Arial"/>
-          <w:sz w:val="24"/>
-          <w:szCs w:val="24"/>
-          <w:lang w:val="en-US"/>
-        </w:rPr>
-        <w:t xml:space="preserve"> = </w:t>
-      </w:r>
-      <w:proofErr w:type="spellStart"/>
-      <w:r>
-        <w:rPr>
-          <w:rFonts w:ascii="Arial" w:hAnsi="Arial" w:cs="Arial"/>
-          <w:sz w:val="24"/>
-          <w:szCs w:val="24"/>
-          <w:lang w:val="en-US"/>
-        </w:rPr>
-        <w:t>CalculateQualityPoints</w:t>
-      </w:r>
-      <w:proofErr w:type="spellEnd"/>
-      <w:r>
-        <w:rPr>
-          <w:rFonts w:ascii="Arial" w:hAnsi="Arial" w:cs="Arial"/>
-          <w:sz w:val="24"/>
-          <w:szCs w:val="24"/>
-          <w:lang w:val="en-US"/>
-        </w:rPr>
-        <w:t>(</w:t>
-      </w:r>
-      <w:proofErr w:type="spellStart"/>
-      <w:r>
-        <w:rPr>
-          <w:rFonts w:ascii="Arial" w:hAnsi="Arial" w:cs="Arial"/>
-          <w:sz w:val="24"/>
-          <w:szCs w:val="24"/>
-          <w:lang w:val="en-US"/>
-        </w:rPr>
-        <w:t>currentCourses</w:t>
-      </w:r>
-      <w:proofErr w:type="spellEnd"/>
-      <w:r>
-        <w:rPr>
-          <w:rFonts w:ascii="Arial" w:hAnsi="Arial" w:cs="Arial"/>
-          <w:sz w:val="24"/>
-          <w:szCs w:val="24"/>
-          <w:lang w:val="en-US"/>
-        </w:rPr>
-        <w:t>)</w:t>
-      </w:r>
-    </w:p>
-    <w:p>
-      <w:pPr>
-        <w:spacing w:line="360" w:lineRule="auto"/>
-        <w:rPr>
-          <w:rFonts w:ascii="Arial" w:hAnsi="Arial" w:cs="Arial"/>
-          <w:sz w:val="24"/>
-          <w:szCs w:val="24"/>
-          <w:lang w:val="en-US"/>
-        </w:rPr>
-      </w:pPr>
-    </w:p>
-    <w:p>
-      <w:pPr>
-        <w:spacing w:line="360" w:lineRule="auto"/>
-        <w:rPr>
-          <w:rFonts w:ascii="Arial" w:hAnsi="Arial" w:cs="Arial"/>
-          <w:sz w:val="24"/>
-          <w:szCs w:val="24"/>
-          <w:lang w:val="en-US"/>
-        </w:rPr>
-      </w:pPr>
-      <w:r>
-        <w:rPr>
-          <w:rFonts w:ascii="Arial" w:hAnsi="Arial" w:cs="Arial"/>
-          <w:sz w:val="24"/>
-          <w:szCs w:val="24"/>
-          <w:lang w:val="en-US"/>
-        </w:rPr>
-        <w:t xml:space="preserve">   </w:t>
-      </w:r>
-      <w:proofErr w:type="spellStart"/>
-      <w:r>
-        <w:rPr>
-          <w:rFonts w:ascii="Arial" w:hAnsi="Arial" w:cs="Arial"/>
-          <w:sz w:val="24"/>
-          <w:szCs w:val="24"/>
-          <w:lang w:val="en-US"/>
-        </w:rPr>
-        <w:t>futureQualityPoints</w:t>
-      </w:r>
-      <w:proofErr w:type="spellEnd"/>
-      <w:r>
-        <w:rPr>
-          <w:rFonts w:ascii="Arial" w:hAnsi="Arial" w:cs="Arial"/>
-          <w:sz w:val="24"/>
-          <w:szCs w:val="24"/>
-          <w:lang w:val="en-US"/>
-        </w:rPr>
-        <w:t xml:space="preserve"> = </w:t>
-      </w:r>
-      <w:proofErr w:type="spellStart"/>
-      <w:r>
-        <w:rPr>
-          <w:rFonts w:ascii="Arial" w:hAnsi="Arial" w:cs="Arial"/>
-          <w:sz w:val="24"/>
-          <w:szCs w:val="24"/>
-          <w:lang w:val="en-US"/>
-        </w:rPr>
-        <w:t>CalculateQualityPoints</w:t>
-      </w:r>
-      <w:proofErr w:type="spellEnd"/>
-      <w:r>
-        <w:rPr>
-          <w:rFonts w:ascii="Arial" w:hAnsi="Arial" w:cs="Arial"/>
-          <w:sz w:val="24"/>
-          <w:szCs w:val="24"/>
-          <w:lang w:val="en-US"/>
-        </w:rPr>
-        <w:t>(</w:t>
-      </w:r>
-      <w:proofErr w:type="spellStart"/>
-      <w:r>
-        <w:rPr>
-          <w:rFonts w:ascii="Arial" w:hAnsi="Arial" w:cs="Arial"/>
-          <w:sz w:val="24"/>
-          <w:szCs w:val="24"/>
-          <w:lang w:val="en-US"/>
-        </w:rPr>
-        <w:t>hypotheticalCourses</w:t>
-      </w:r>
-      <w:proofErr w:type="spellEnd"/>
-      <w:r>
-        <w:rPr>
-          <w:rFonts w:ascii="Arial" w:hAnsi="Arial" w:cs="Arial"/>
-          <w:sz w:val="24"/>
-          <w:szCs w:val="24"/>
-          <w:lang w:val="en-US"/>
-        </w:rPr>
-        <w:t>)</w:t>
-      </w:r>
-    </w:p>
-    <w:p>
-      <w:pPr>
-        <w:spacing w:line="360" w:lineRule="auto"/>
-        <w:rPr>
-          <w:rFonts w:ascii="Arial" w:hAnsi="Arial" w:cs="Arial"/>
-          <w:sz w:val="24"/>
-          <w:szCs w:val="24"/>
-          <w:lang w:val="en-US"/>
-        </w:rPr>
-      </w:pPr>
-    </w:p>
-    <w:p>
-      <w:pPr>
-        <w:spacing w:line="360" w:lineRule="auto"/>
-        <w:rPr>
-          <w:rFonts w:ascii="Arial" w:hAnsi="Arial" w:cs="Arial"/>
-          <w:sz w:val="24"/>
-          <w:szCs w:val="24"/>
-          <w:lang w:val="en-US"/>
-        </w:rPr>
-      </w:pPr>
-      <w:r>
-        <w:rPr>
-          <w:rFonts w:ascii="Arial" w:hAnsi="Arial" w:cs="Arial"/>
-          <w:sz w:val="24"/>
-          <w:szCs w:val="24"/>
-          <w:lang w:val="en-US"/>
-        </w:rPr>
-        <w:t xml:space="preserve">   </w:t>
-      </w:r>
-      <w:proofErr w:type="spellStart"/>
-      <w:r>
-        <w:rPr>
-          <w:rFonts w:ascii="Arial" w:hAnsi="Arial" w:cs="Arial"/>
-          <w:sz w:val="24"/>
-          <w:szCs w:val="24"/>
-          <w:lang w:val="en-US"/>
-        </w:rPr>
-        <w:t>currentCredits</w:t>
-      </w:r>
-      <w:proofErr w:type="spellEnd"/>
-      <w:r>
-        <w:rPr>
-          <w:rFonts w:ascii="Arial" w:hAnsi="Arial" w:cs="Arial"/>
-          <w:sz w:val="24"/>
-          <w:szCs w:val="24"/>
-          <w:lang w:val="en-US"/>
-        </w:rPr>
-        <w:t xml:space="preserve"> = </w:t>
-      </w:r>
-      <w:proofErr w:type="spellStart"/>
-      <w:r>
-        <w:rPr>
-          <w:rFonts w:ascii="Arial" w:hAnsi="Arial" w:cs="Arial"/>
-          <w:sz w:val="24"/>
-          <w:szCs w:val="24"/>
-          <w:lang w:val="en-US"/>
-        </w:rPr>
-        <w:t>CalculateAttemptedCredits</w:t>
-      </w:r>
-      <w:proofErr w:type="spellEnd"/>
-      <w:r>
-        <w:rPr>
-          <w:rFonts w:ascii="Arial" w:hAnsi="Arial" w:cs="Arial"/>
-          <w:sz w:val="24"/>
-          <w:szCs w:val="24"/>
-          <w:lang w:val="en-US"/>
-        </w:rPr>
-        <w:t>(</w:t>
-      </w:r>
-      <w:proofErr w:type="spellStart"/>
-      <w:r>
-        <w:rPr>
-          <w:rFonts w:ascii="Arial" w:hAnsi="Arial" w:cs="Arial"/>
-          <w:sz w:val="24"/>
-          <w:szCs w:val="24"/>
-          <w:lang w:val="en-US"/>
-        </w:rPr>
-        <w:t>currentCourses</w:t>
-      </w:r>
-      <w:proofErr w:type="spellEnd"/>
-      <w:r>
-        <w:rPr>
-          <w:rFonts w:ascii="Arial" w:hAnsi="Arial" w:cs="Arial"/>
-          <w:sz w:val="24"/>
-          <w:szCs w:val="24"/>
-          <w:lang w:val="en-US"/>
-        </w:rPr>
-        <w:t>)</w:t>
-      </w:r>
-    </w:p>
-    <w:p>
-      <w:pPr>
-        <w:spacing w:line="360" w:lineRule="auto"/>
-        <w:rPr>
-          <w:rFonts w:ascii="Arial" w:hAnsi="Arial" w:cs="Arial"/>
-          <w:sz w:val="24"/>
-          <w:szCs w:val="24"/>
-          <w:lang w:val="en-US"/>
-        </w:rPr>
-      </w:pPr>
-    </w:p>
-    <w:p>
-      <w:pPr>
-        <w:spacing w:line="360" w:lineRule="auto"/>
-        <w:rPr>
-          <w:rFonts w:ascii="Arial" w:hAnsi="Arial" w:cs="Arial"/>
-          <w:sz w:val="24"/>
-          <w:szCs w:val="24"/>
-          <w:lang w:val="en-US"/>
-        </w:rPr>
-      </w:pPr>
-      <w:r>
-        <w:rPr>
-          <w:rFonts w:ascii="Arial" w:hAnsi="Arial" w:cs="Arial"/>
-          <w:sz w:val="24"/>
-          <w:szCs w:val="24"/>
-          <w:lang w:val="en-US"/>
-        </w:rPr>
-        <w:t xml:space="preserve">   </w:t>
-      </w:r>
-      <w:proofErr w:type="spellStart"/>
-      <w:r>
-        <w:rPr>
-          <w:rFonts w:ascii="Arial" w:hAnsi="Arial" w:cs="Arial"/>
-          <w:sz w:val="24"/>
-          <w:szCs w:val="24"/>
-          <w:lang w:val="en-US"/>
-        </w:rPr>
-        <w:t>futureCredits</w:t>
-      </w:r>
-      <w:proofErr w:type="spellEnd"/>
-      <w:r>
-        <w:rPr>
-          <w:rFonts w:ascii="Arial" w:hAnsi="Arial" w:cs="Arial"/>
-          <w:sz w:val="24"/>
-          <w:szCs w:val="24"/>
-          <w:lang w:val="en-US"/>
-        </w:rPr>
-        <w:t xml:space="preserve"> = </w:t>
-      </w:r>
-      <w:proofErr w:type="spellStart"/>
-      <w:r>
-        <w:rPr>
-          <w:rFonts w:ascii="Arial" w:hAnsi="Arial" w:cs="Arial"/>
-          <w:sz w:val="24"/>
-          <w:szCs w:val="24"/>
-          <w:lang w:val="en-US"/>
-        </w:rPr>
-        <w:t>CalculateAttemptedCredits</w:t>
-      </w:r>
-      <w:proofErr w:type="spellEnd"/>
-      <w:r>
-        <w:rPr>
-          <w:rFonts w:ascii="Arial" w:hAnsi="Arial" w:cs="Arial"/>
-          <w:sz w:val="24"/>
-          <w:szCs w:val="24"/>
-          <w:lang w:val="en-US"/>
-        </w:rPr>
-        <w:t>(</w:t>
-      </w:r>
-      <w:proofErr w:type="spellStart"/>
-      <w:r>
-        <w:rPr>
-          <w:rFonts w:ascii="Arial" w:hAnsi="Arial" w:cs="Arial"/>
-          <w:sz w:val="24"/>
-          <w:szCs w:val="24"/>
-          <w:lang w:val="en-US"/>
-        </w:rPr>
-        <w:t>hypotheticalCourses</w:t>
-      </w:r>
-      <w:proofErr w:type="spellEnd"/>
-      <w:r>
-        <w:rPr>
-          <w:rFonts w:ascii="Arial" w:hAnsi="Arial" w:cs="Arial"/>
-          <w:sz w:val="24"/>
-          <w:szCs w:val="24"/>
-          <w:lang w:val="en-US"/>
-        </w:rPr>
-        <w:t>)</w:t>
-      </w:r>
-    </w:p>
-    <w:p>
-      <w:pPr>
-        <w:spacing w:line="360" w:lineRule="auto"/>
-        <w:rPr>
-          <w:rFonts w:ascii="Arial" w:hAnsi="Arial" w:cs="Arial"/>
-          <w:sz w:val="24"/>
-          <w:szCs w:val="24"/>
-          <w:lang w:val="en-US"/>
-        </w:rPr>
-      </w:pPr>
-    </w:p>
-    <w:p>
-      <w:pPr>
-        <w:spacing w:line="360" w:lineRule="auto"/>
         <w:ind w:left="204"/>
         <w:rPr>
           <w:rFonts w:ascii="Arial" w:hAnsi="Arial" w:cs="Arial"/>
@@ -9045,115 +8729,6 @@
           <w:lang w:val="en-US"/>
         </w:rPr>
       </w:pPr>
-      <w:proofErr w:type="spellStart"/>
-      <w:r>
-        <w:rPr>
-          <w:rFonts w:ascii="Arial" w:hAnsi="Arial" w:cs="Arial"/>
-          <w:sz w:val="24"/>
-          <w:szCs w:val="24"/>
-          <w:lang w:val="en-US"/>
-        </w:rPr>
-        <w:t>projectedGPA</w:t>
-      </w:r>
-      <w:proofErr w:type="spellEnd"/>
-      <w:r>
-        <w:rPr>
-          <w:rFonts w:ascii="Arial" w:hAnsi="Arial" w:cs="Arial"/>
-          <w:sz w:val="24"/>
-          <w:szCs w:val="24"/>
-          <w:lang w:val="en-US"/>
-        </w:rPr>
-        <w:t xml:space="preserve"> = (</w:t>
-      </w:r>
-      <w:proofErr w:type="spellStart"/>
-      <w:r>
-        <w:rPr>
-          <w:rFonts w:ascii="Arial" w:hAnsi="Arial" w:cs="Arial"/>
-          <w:sz w:val="24"/>
-          <w:szCs w:val="24"/>
-          <w:lang w:val="en-US"/>
-        </w:rPr>
-        <w:t>currentQualityPoints</w:t>
-      </w:r>
-      <w:proofErr w:type="spellEnd"/>
-      <w:r>
-        <w:rPr>
-          <w:rFonts w:ascii="Arial" w:hAnsi="Arial" w:cs="Arial"/>
-          <w:sz w:val="24"/>
-          <w:szCs w:val="24"/>
-          <w:lang w:val="en-US"/>
-        </w:rPr>
-        <w:t xml:space="preserve"> + </w:t>
-      </w:r>
-      <w:proofErr w:type="spellStart"/>
-      <w:r>
-        <w:rPr>
-          <w:rFonts w:ascii="Arial" w:hAnsi="Arial" w:cs="Arial"/>
-          <w:sz w:val="24"/>
-          <w:szCs w:val="24"/>
-          <w:lang w:val="en-US"/>
-        </w:rPr>
-        <w:t>futureQualityPoints</w:t>
-      </w:r>
-      <w:proofErr w:type="spellEnd"/>
-      <w:r>
-        <w:rPr>
-          <w:rFonts w:ascii="Arial" w:hAnsi="Arial" w:cs="Arial"/>
-          <w:sz w:val="24"/>
-          <w:szCs w:val="24"/>
-          <w:lang w:val="en-US"/>
-        </w:rPr>
-        <w:t>) / (</w:t>
-      </w:r>
-      <w:proofErr w:type="spellStart"/>
-      <w:r>
-        <w:rPr>
-          <w:rFonts w:ascii="Arial" w:hAnsi="Arial" w:cs="Arial"/>
-          <w:sz w:val="24"/>
-          <w:szCs w:val="24"/>
-          <w:lang w:val="en-US"/>
-        </w:rPr>
-        <w:t>currentCredits</w:t>
-      </w:r>
-      <w:proofErr w:type="spellEnd"/>
-      <w:r>
-        <w:rPr>
-          <w:rFonts w:ascii="Arial" w:hAnsi="Arial" w:cs="Arial"/>
-          <w:sz w:val="24"/>
-          <w:szCs w:val="24"/>
-          <w:lang w:val="en-US"/>
-        </w:rPr>
-        <w:t xml:space="preserve"> +</w:t>
-      </w:r>
-      <w:r>
-        <w:rPr>
-          <w:rFonts w:ascii="Arial" w:hAnsi="Arial" w:cs="Arial"/>
-          <w:sz w:val="24"/>
-          <w:szCs w:val="24"/>
-          <w:lang w:val="en-US"/>
-        </w:rPr>
-        <w:t xml:space="preserve"> </w:t>
-      </w:r>
-      <w:proofErr w:type="spellStart"/>
-      <w:r>
-        <w:rPr>
-          <w:rFonts w:ascii="Arial" w:hAnsi="Arial" w:cs="Arial"/>
-          <w:sz w:val="24"/>
-          <w:szCs w:val="24"/>
-          <w:lang w:val="en-US"/>
-        </w:rPr>
-        <w:t>futureCredits</w:t>
-      </w:r>
-      <w:proofErr w:type="spellEnd"/>
-      <w:r>
-        <w:rPr>
-          <w:rFonts w:ascii="Arial" w:hAnsi="Arial" w:cs="Arial"/>
-          <w:sz w:val="24"/>
-          <w:szCs w:val="24"/>
-          <w:lang w:val="en-US"/>
-        </w:rPr>
-        <w:t>)</w:t>
-      </w:r>
     </w:p>
     <w:p>
       <w:pPr>
@@ -9166,38 +8741,15 @@
           <w:lang w:val="en-US"/>
         </w:rPr>
       </w:pPr>
-    </w:p>
-    <w:p>
-      <w:pPr>
-        <w:spacing w:line="360" w:lineRule="auto"/>
-        <w:ind w:left="204"/>
-        <w:rPr>
-          <w:rFonts w:ascii="Arial" w:hAnsi="Arial" w:cs="Arial"/>
-          <w:sz w:val="24"/>
-          <w:szCs w:val="24"/>
-          <w:lang w:val="en-US"/>
-        </w:rPr>
-      </w:pPr>
-      <w:r>
-        <w:rPr>
-          <w:rFonts w:ascii="Arial" w:hAnsi="Arial" w:cs="Arial"/>
-          <w:sz w:val="24"/>
-          <w:szCs w:val="24"/>
-          <w:lang w:val="en-US"/>
-        </w:rPr>
-        <w:t xml:space="preserve">RETURN </w:t>
-      </w:r>
-      <w:proofErr w:type="spellStart"/>
-      <w:r>
-        <w:rPr>
-          <w:rFonts w:ascii="Arial" w:hAnsi="Arial" w:cs="Arial"/>
-          <w:sz w:val="24"/>
-          <w:szCs w:val="24"/>
-          <w:lang w:val="en-US"/>
-        </w:rPr>
-        <w:t>projectedGPA</w:t>
-      </w:r>
-      <w:proofErr w:type="spellEnd"/>
+      <w:r>
+        <w:rPr>
+          <w:rFonts w:ascii="Arial" w:hAnsi="Arial" w:cs="Arial"/>
+          <w:sz w:val="24"/>
+          <w:szCs w:val="24"/>
+          <w:lang w:val="en-US"/>
+        </w:rPr>
+        <w:t>RETURN projectedGPA</w:t>
+      </w:r>
     </w:p>
     <w:p>
       <w:pPr>
@@ -9280,51 +8832,17 @@
           <w:szCs w:val="24"/>
           <w:lang w:val="en-US"/>
         </w:rPr>
-        <w:t xml:space="preserve">FUNCTION </w:t>
-      </w:r>
-      <w:proofErr w:type="spellStart"/>
-      <w:proofErr w:type="gramStart"/>
-      <w:r>
-        <w:rPr>
-          <w:rFonts w:ascii="Arial" w:hAnsi="Arial" w:cs="Arial"/>
-          <w:sz w:val="24"/>
-          <w:szCs w:val="24"/>
-          <w:lang w:val="en-US"/>
-        </w:rPr>
-        <w:t>CalculateDegreeProgress</w:t>
-      </w:r>
-      <w:proofErr w:type="spellEnd"/>
-      <w:r>
-        <w:rPr>
-          <w:rFonts w:ascii="Arial" w:hAnsi="Arial" w:cs="Arial"/>
-          <w:sz w:val="24"/>
-          <w:szCs w:val="24"/>
-          <w:lang w:val="en-US"/>
-        </w:rPr>
-        <w:t>(</w:t>
-      </w:r>
-      <w:proofErr w:type="spellStart"/>
-      <w:proofErr w:type="gramEnd"/>
-      <w:r>
-        <w:rPr>
-          <w:rFonts w:ascii="Arial" w:hAnsi="Arial" w:cs="Arial"/>
-          <w:sz w:val="24"/>
-          <w:szCs w:val="24"/>
-          <w:lang w:val="en-US"/>
-        </w:rPr>
-        <w:t>earnedCredits</w:t>
-      </w:r>
-      <w:proofErr w:type="spellEnd"/>
-      <w:r>
-        <w:rPr>
-          <w:rFonts w:ascii="Arial" w:hAnsi="Arial" w:cs="Arial"/>
-          <w:sz w:val="24"/>
-          <w:szCs w:val="24"/>
-          <w:lang w:val="en-US"/>
-        </w:rPr>
-        <w:t xml:space="preserve">, </w:t>
-      </w:r>
-      <w:proofErr w:type="spellStart"/>
+        <w:t>FUNCTION CalculateDegreeProgress(</w:t>
+      </w:r>
+      <w:r>
+        <w:rPr>
+          <w:rFonts w:ascii="Arial" w:hAnsi="Arial" w:cs="Arial"/>
+          <w:sz w:val="24"/>
+          <w:szCs w:val="24"/>
+          <w:lang w:val="en-US"/>
+        </w:rPr>
+        <w:t xml:space="preserve">earnedCredits, </w:t>
+      </w:r>
       <w:r>
         <w:rPr>
           <w:rFonts w:ascii="Arial" w:hAnsi="Arial" w:cs="Arial"/>
@@ -9334,7 +8852,6 @@
         </w:rPr>
         <w:t>requiredCredits</w:t>
       </w:r>
-      <w:proofErr w:type="spellEnd"/>
       <w:r>
         <w:rPr>
           <w:rFonts w:ascii="Arial" w:hAnsi="Arial" w:cs="Arial"/>
@@ -9383,27 +8900,7 @@
           <w:szCs w:val="24"/>
           <w:lang w:val="en-US"/>
         </w:rPr>
-        <w:t xml:space="preserve">IF </w:t>
-      </w:r>
-      <w:proofErr w:type="spellStart"/>
-      <w:r>
-        <w:rPr>
-          <w:rFonts w:ascii="Arial" w:hAnsi="Arial" w:cs="Arial"/>
-          <w:sz w:val="24"/>
-          <w:szCs w:val="24"/>
-          <w:lang w:val="en-US"/>
-        </w:rPr>
-        <w:t>requiredCredits</w:t>
-      </w:r>
-      <w:proofErr w:type="spellEnd"/>
-      <w:r>
-        <w:rPr>
-          <w:rFonts w:ascii="Arial" w:hAnsi="Arial" w:cs="Arial"/>
-          <w:sz w:val="24"/>
-          <w:szCs w:val="24"/>
-          <w:lang w:val="en-US"/>
-        </w:rPr>
-        <w:t xml:space="preserve"> &lt;= 0</w:t>
+        <w:t>IF requiredCredits &lt;= 0</w:t>
       </w:r>
     </w:p>
     <w:p>
@@ -9512,7 +9009,6 @@
         </w:rPr>
         <w:t xml:space="preserve">ercentage = </w:t>
       </w:r>
-      <w:proofErr w:type="spellStart"/>
       <w:r>
         <w:rPr>
           <w:rFonts w:ascii="Arial" w:hAnsi="Arial" w:cs="Arial"/>
@@ -9522,35 +9018,14 @@
         </w:rPr>
         <w:t>earnedCredits</w:t>
       </w:r>
-      <w:proofErr w:type="spellEnd"/>
-      <w:r>
-        <w:rPr>
-          <w:rFonts w:ascii="Arial" w:hAnsi="Arial" w:cs="Arial"/>
-          <w:sz w:val="24"/>
-          <w:szCs w:val="24"/>
-          <w:lang w:val="en-US"/>
-        </w:rPr>
-        <w:t xml:space="preserve"> / </w:t>
-      </w:r>
-      <w:proofErr w:type="spellStart"/>
-      <w:r>
-        <w:rPr>
-          <w:rFonts w:ascii="Arial" w:hAnsi="Arial" w:cs="Arial"/>
-          <w:sz w:val="24"/>
-          <w:szCs w:val="24"/>
-          <w:lang w:val="en-US"/>
-        </w:rPr>
-        <w:t>requiredCredits</w:t>
-      </w:r>
-      <w:proofErr w:type="spellEnd"/>
-      <w:r>
-        <w:rPr>
-          <w:rFonts w:ascii="Arial" w:hAnsi="Arial" w:cs="Arial"/>
-          <w:sz w:val="24"/>
-          <w:szCs w:val="24"/>
-          <w:lang w:val="en-US"/>
-        </w:rPr>
-        <w:t xml:space="preserve"> * 100</w:t>
+      <w:r>
+        <w:rPr>
+          <w:rFonts w:ascii="Arial" w:hAnsi="Arial" w:cs="Arial"/>
+          <w:sz w:val="24"/>
+          <w:szCs w:val="24"/>
+          <w:lang w:val="en-US"/>
+        </w:rPr>
+        <w:t xml:space="preserve"> / requiredCredits * 100</w:t>
       </w:r>
     </w:p>
     <w:p>
@@ -9756,27 +9231,15 @@
         </w:rPr>
         <w:t xml:space="preserve">FUNCTION </w:t>
       </w:r>
-      <w:proofErr w:type="spellStart"/>
-      <w:r>
-        <w:rPr>
-          <w:rFonts w:ascii="Arial" w:hAnsi="Arial" w:cs="Arial"/>
-          <w:sz w:val="24"/>
-          <w:szCs w:val="24"/>
-          <w:lang w:val="en-US"/>
-        </w:rPr>
-        <w:t>DeleteCourse</w:t>
-      </w:r>
-      <w:proofErr w:type="spellEnd"/>
-      <w:r>
-        <w:rPr>
-          <w:rFonts w:ascii="Arial" w:hAnsi="Arial" w:cs="Arial"/>
-          <w:sz w:val="24"/>
-          <w:szCs w:val="24"/>
-          <w:lang w:val="en-US"/>
-        </w:rPr>
-        <w:t>(</w:t>
-      </w:r>
-      <w:proofErr w:type="spellStart"/>
+      <w:r>
+        <w:rPr>
+          <w:rFonts w:ascii="Arial" w:hAnsi="Arial" w:cs="Arial"/>
+          <w:sz w:val="24"/>
+          <w:szCs w:val="24"/>
+          <w:lang w:val="en-US"/>
+        </w:rPr>
+        <w:t>DeleteCourse(</w:t>
+      </w:r>
       <w:r>
         <w:rPr>
           <w:rFonts w:ascii="Arial" w:hAnsi="Arial" w:cs="Arial"/>
@@ -9786,7 +9249,6 @@
         </w:rPr>
         <w:t>courseId</w:t>
       </w:r>
-      <w:proofErr w:type="spellEnd"/>
       <w:r>
         <w:rPr>
           <w:rFonts w:ascii="Arial" w:hAnsi="Arial" w:cs="Arial"/>
@@ -9836,7 +9298,6 @@
         </w:rPr>
         <w:t xml:space="preserve">FIND course by </w:t>
       </w:r>
-      <w:proofErr w:type="spellStart"/>
       <w:r>
         <w:rPr>
           <w:rFonts w:ascii="Arial" w:hAnsi="Arial" w:cs="Arial"/>
@@ -9864,7 +9325,6 @@
         </w:rPr>
         <w:t>d</w:t>
       </w:r>
-      <w:proofErr w:type="spellEnd"/>
     </w:p>
     <w:p>
       <w:pPr>
@@ -11566,27 +11026,7 @@
           <w:szCs w:val="24"/>
           <w:lang w:val="en-US"/>
         </w:rPr>
-        <w:t xml:space="preserve"> the </w:t>
-      </w:r>
-      <w:proofErr w:type="spellStart"/>
-      <w:r>
-        <w:rPr>
-          <w:rFonts w:ascii="Arial" w:hAnsi="Arial" w:cs="Arial"/>
-          <w:sz w:val="24"/>
-          <w:szCs w:val="24"/>
-          <w:lang w:val="en-US"/>
-        </w:rPr>
-        <w:t>CourseService</w:t>
-      </w:r>
-      <w:proofErr w:type="spellEnd"/>
-      <w:r>
-        <w:rPr>
-          <w:rFonts w:ascii="Arial" w:hAnsi="Arial" w:cs="Arial"/>
-          <w:sz w:val="24"/>
-          <w:szCs w:val="24"/>
-          <w:lang w:val="en-US"/>
-        </w:rPr>
-        <w:t xml:space="preserve"> is responsible for</w:t>
+        <w:t xml:space="preserve"> the CourseService is responsible for</w:t>
       </w:r>
       <w:r>
         <w:rPr>
@@ -11640,19 +11080,8 @@
           <w:szCs w:val="24"/>
           <w:lang w:val="en-US"/>
         </w:rPr>
-        <w:t xml:space="preserve"> the Courses and </w:t>
-      </w:r>
-      <w:proofErr w:type="spellStart"/>
-      <w:r>
-        <w:rPr>
-          <w:rFonts w:ascii="Arial" w:hAnsi="Arial" w:cs="Arial"/>
-          <w:sz w:val="24"/>
-          <w:szCs w:val="24"/>
-          <w:lang w:val="en-US"/>
-        </w:rPr>
-        <w:t>AddCourse</w:t>
-      </w:r>
-      <w:proofErr w:type="spellEnd"/>
+        <w:t xml:space="preserve"> the Courses and AddCourse</w:t>
+      </w:r>
       <w:r>
         <w:rPr>
           <w:rFonts w:ascii="Arial" w:hAnsi="Arial" w:cs="Arial"/>
@@ -12046,27 +11475,7 @@
           <w:szCs w:val="24"/>
           <w:lang w:val="en-US"/>
         </w:rPr>
-        <w:t xml:space="preserve">The </w:t>
-      </w:r>
-      <w:proofErr w:type="spellStart"/>
-      <w:r>
-        <w:rPr>
-          <w:rFonts w:ascii="Arial" w:hAnsi="Arial" w:cs="Arial"/>
-          <w:sz w:val="24"/>
-          <w:szCs w:val="24"/>
-          <w:lang w:val="en-US"/>
-        </w:rPr>
-        <w:t>AcademicDbContext</w:t>
-      </w:r>
-      <w:proofErr w:type="spellEnd"/>
-      <w:r>
-        <w:rPr>
-          <w:rFonts w:ascii="Arial" w:hAnsi="Arial" w:cs="Arial"/>
-          <w:sz w:val="24"/>
-          <w:szCs w:val="24"/>
-          <w:lang w:val="en-US"/>
-        </w:rPr>
-        <w:t xml:space="preserve"> class</w:t>
+        <w:t>The AcademicDbContext class</w:t>
       </w:r>
       <w:r>
         <w:rPr>
@@ -12450,13 +11859,8 @@
           <w:lang w:val="en-US"/>
         </w:rPr>
       </w:pPr>
-      <w:proofErr w:type="spellStart"/>
-      <w:r>
-        <w:t>Figure</w:t>
-      </w:r>
-      <w:proofErr w:type="spellEnd"/>
-      <w:r>
-        <w:t xml:space="preserve"> </w:t>
+      <w:r>
+        <w:t xml:space="preserve">Figure </w:t>
       </w:r>
       <w:fldSimple w:instr=" SEQ Figure \* ARABIC ">
         <w:r>
@@ -12645,27 +12049,7 @@
           <w:szCs w:val="24"/>
           <w:lang w:val="en-US"/>
         </w:rPr>
-        <w:t xml:space="preserve"> the </w:t>
-      </w:r>
-      <w:proofErr w:type="spellStart"/>
-      <w:r>
-        <w:rPr>
-          <w:rFonts w:ascii="Arial" w:hAnsi="Arial" w:cs="Arial"/>
-          <w:sz w:val="24"/>
-          <w:szCs w:val="24"/>
-          <w:lang w:val="en-US"/>
-        </w:rPr>
-        <w:t>SemesterId</w:t>
-      </w:r>
-      <w:proofErr w:type="spellEnd"/>
-      <w:r>
-        <w:rPr>
-          <w:rFonts w:ascii="Arial" w:hAnsi="Arial" w:cs="Arial"/>
-          <w:sz w:val="24"/>
-          <w:szCs w:val="24"/>
-          <w:lang w:val="en-US"/>
-        </w:rPr>
-        <w:t xml:space="preserve"> foreign key</w:t>
+        <w:t xml:space="preserve"> the SemesterId foreign key</w:t>
       </w:r>
       <w:r>
         <w:rPr>
@@ -13753,13 +13137,8 @@
       <w:pPr>
         <w:pStyle w:val="Caption"/>
       </w:pPr>
-      <w:proofErr w:type="spellStart"/>
-      <w:r>
-        <w:t>Figure</w:t>
-      </w:r>
-      <w:proofErr w:type="spellEnd"/>
-      <w:r>
-        <w:t xml:space="preserve"> </w:t>
+      <w:r>
+        <w:t xml:space="preserve">Figure </w:t>
       </w:r>
       <w:fldSimple w:instr=" SEQ Figure \* ARABIC ">
         <w:r>
@@ -13853,21 +13232,7 @@
         <w:rPr>
           <w:lang w:val="en-US"/>
         </w:rPr>
-        <w:t xml:space="preserve"> The </w:t>
-      </w:r>
-      <w:proofErr w:type="spellStart"/>
-      <w:r>
-        <w:rPr>
-          <w:lang w:val="en-US"/>
-        </w:rPr>
-        <w:t>SemesterId</w:t>
-      </w:r>
-      <w:proofErr w:type="spellEnd"/>
-      <w:r>
-        <w:rPr>
-          <w:lang w:val="en-US"/>
-        </w:rPr>
-        <w:t xml:space="preserve"> property</w:t>
+        <w:t xml:space="preserve"> The SemesterId property</w:t>
       </w:r>
       <w:r>
         <w:rPr>
@@ -14001,21 +13366,7 @@
         <w:rPr>
           <w:lang w:val="en-US"/>
         </w:rPr>
-        <w:t xml:space="preserve"> </w:t>
-      </w:r>
-      <w:proofErr w:type="spellStart"/>
-      <w:r>
-        <w:rPr>
-          <w:lang w:val="en-US"/>
-        </w:rPr>
-        <w:t>AcademicDbContext</w:t>
-      </w:r>
-      <w:proofErr w:type="spellEnd"/>
-      <w:r>
-        <w:rPr>
-          <w:lang w:val="en-US"/>
-        </w:rPr>
-        <w:t>.</w:t>
+        <w:t xml:space="preserve"> AcademicDbContext.</w:t>
       </w:r>
       <w:r>
         <w:rPr>
@@ -14375,21 +13726,7 @@
         <w:rPr>
           <w:lang w:val="en-US"/>
         </w:rPr>
-        <w:t xml:space="preserve"> </w:t>
-      </w:r>
-      <w:proofErr w:type="gramStart"/>
-      <w:r>
-        <w:rPr>
-          <w:lang w:val="en-US"/>
-        </w:rPr>
-        <w:t>the GPA</w:t>
-      </w:r>
-      <w:proofErr w:type="gramEnd"/>
-      <w:r>
-        <w:rPr>
-          <w:lang w:val="en-US"/>
-        </w:rPr>
-        <w:t xml:space="preserve"> calculation</w:t>
+        <w:t xml:space="preserve"> the GPA calculation</w:t>
       </w:r>
       <w:r>
         <w:rPr>
@@ -14497,41 +13834,13 @@
         <w:rPr>
           <w:lang w:val="en-US"/>
         </w:rPr>
-        <w:t xml:space="preserve"> </w:t>
-      </w:r>
-      <w:proofErr w:type="gramStart"/>
-      <w:r>
-        <w:rPr>
-          <w:lang w:val="en-US"/>
-        </w:rPr>
-        <w:t>of</w:t>
-      </w:r>
-      <w:proofErr w:type="gramEnd"/>
-      <w:r>
-        <w:rPr>
-          <w:lang w:val="en-US"/>
-        </w:rPr>
-        <w:t xml:space="preserve"> the corresponding course</w:t>
-      </w:r>
-      <w:r>
-        <w:rPr>
-          <w:lang w:val="en-US"/>
-        </w:rPr>
-        <w:t xml:space="preserve"> </w:t>
-      </w:r>
-      <w:proofErr w:type="gramStart"/>
-      <w:r>
-        <w:rPr>
-          <w:lang w:val="en-US"/>
-        </w:rPr>
-        <w:t>in order to</w:t>
-      </w:r>
-      <w:proofErr w:type="gramEnd"/>
-      <w:r>
-        <w:rPr>
-          <w:lang w:val="en-US"/>
-        </w:rPr>
-        <w:t xml:space="preserve"> obtain</w:t>
+        <w:t xml:space="preserve"> of the corresponding course</w:t>
+      </w:r>
+      <w:r>
+        <w:rPr>
+          <w:lang w:val="en-US"/>
+        </w:rPr>
+        <w:t xml:space="preserve"> in order to obtain</w:t>
       </w:r>
       <w:r>
         <w:rPr>
@@ -14907,21 +14216,7 @@
         <w:rPr>
           <w:lang w:val="en-US"/>
         </w:rPr>
-        <w:t xml:space="preserve"> </w:t>
-      </w:r>
-      <w:proofErr w:type="spellStart"/>
-      <w:r>
-        <w:rPr>
-          <w:lang w:val="en-US"/>
-        </w:rPr>
-        <w:t>GpaCalculator</w:t>
-      </w:r>
-      <w:proofErr w:type="spellEnd"/>
-      <w:r>
-        <w:rPr>
-          <w:lang w:val="en-US"/>
-        </w:rPr>
-        <w:t xml:space="preserve"> service.</w:t>
+        <w:t xml:space="preserve"> GpaCalculator service.</w:t>
       </w:r>
       <w:r>
         <w:rPr>
@@ -15146,21 +14441,7 @@
         <w:rPr>
           <w:lang w:val="en-US"/>
         </w:rPr>
-        <w:t xml:space="preserve">, the method </w:t>
-      </w:r>
-      <w:proofErr w:type="gramStart"/>
-      <w:r>
-        <w:rPr>
-          <w:lang w:val="en-US"/>
-        </w:rPr>
-        <w:t>returns</w:t>
-      </w:r>
-      <w:proofErr w:type="gramEnd"/>
-      <w:r>
-        <w:rPr>
-          <w:lang w:val="en-US"/>
-        </w:rPr>
-        <w:t xml:space="preserve"> a GPA</w:t>
+        <w:t>, the method returns a GPA</w:t>
       </w:r>
       <w:r>
         <w:rPr>
@@ -15288,21 +14569,7 @@
         <w:rPr>
           <w:lang w:val="en-US"/>
         </w:rPr>
-        <w:t xml:space="preserve">, or </w:t>
-      </w:r>
-      <w:proofErr w:type="gramStart"/>
-      <w:r>
-        <w:rPr>
-          <w:lang w:val="en-US"/>
-        </w:rPr>
-        <w:t>O(</w:t>
-      </w:r>
-      <w:proofErr w:type="gramEnd"/>
-      <w:r>
-        <w:rPr>
-          <w:lang w:val="en-US"/>
-        </w:rPr>
-        <w:t>1)</w:t>
+        <w:t>, or O(1)</w:t>
       </w:r>
       <w:r>
         <w:rPr>
@@ -15776,21 +15043,7 @@
         <w:rPr>
           <w:lang w:val="en-US"/>
         </w:rPr>
-        <w:t xml:space="preserve"> Because </w:t>
-      </w:r>
-      <w:proofErr w:type="gramStart"/>
-      <w:r>
-        <w:rPr>
-          <w:lang w:val="en-US"/>
-        </w:rPr>
-        <w:t>the hypothetical</w:t>
-      </w:r>
-      <w:proofErr w:type="gramEnd"/>
-      <w:r>
-        <w:rPr>
-          <w:lang w:val="en-US"/>
-        </w:rPr>
-        <w:t xml:space="preserve"> courses</w:t>
+        <w:t xml:space="preserve"> Because the hypothetical courses</w:t>
       </w:r>
       <w:r>
         <w:rPr>
@@ -16566,21 +15819,7 @@
         <w:rPr>
           <w:lang w:val="en-US"/>
         </w:rPr>
-        <w:t xml:space="preserve"> </w:t>
-      </w:r>
-      <w:proofErr w:type="gramStart"/>
-      <w:r>
-        <w:rPr>
-          <w:lang w:val="en-US"/>
-        </w:rPr>
-        <w:t>is</w:t>
-      </w:r>
-      <w:proofErr w:type="gramEnd"/>
-      <w:r>
-        <w:rPr>
-          <w:lang w:val="en-US"/>
-        </w:rPr>
-        <w:t xml:space="preserve"> performed through</w:t>
+        <w:t xml:space="preserve"> is performed through</w:t>
       </w:r>
       <w:r>
         <w:rPr>
@@ -17299,16 +16538,8 @@
         <w:rPr>
           <w:lang w:val="en-US"/>
         </w:rPr>
-        <w:t xml:space="preserve"> a course </w:t>
-      </w:r>
-      <w:proofErr w:type="gramStart"/>
-      <w:r>
-        <w:rPr>
-          <w:lang w:val="en-US"/>
-        </w:rPr>
-        <w:t>in order to</w:t>
-      </w:r>
-      <w:proofErr w:type="gramEnd"/>
+        <w:t xml:space="preserve"> a course in order to</w:t>
+      </w:r>
       <w:r>
         <w:rPr>
           <w:lang w:val="en-US"/>
@@ -17586,6 +16817,30 @@
           <w:lang w:val="en-US"/>
         </w:rPr>
       </w:pPr>
+      <w:r>
+        <w:rPr>
+          <w:lang w:val="en-US"/>
+        </w:rPr>
+        <w:t>The AUBG Academic Progress Tracker</w:t>
+      </w:r>
+      <w:r>
+        <w:rPr>
+          <w:lang w:val="en-US"/>
+        </w:rPr>
+        <w:t xml:space="preserve"> is designed as a local</w:t>
+      </w:r>
+      <w:r>
+        <w:rPr>
+          <w:lang w:val="en-US"/>
+        </w:rPr>
+        <w:t xml:space="preserve"> single-user program.</w:t>
+      </w:r>
+      <w:r>
+        <w:rPr>
+          <w:lang w:val="en-US"/>
+        </w:rPr>
+        <w:t xml:space="preserve"> Although the user interface</w:t>
+      </w:r>
     </w:p>
     <w:sectPr>
       <w:footerReference w:type="default" r:id="rId9"/>

</xml_diff>

<commit_message>
Keep working on the third part of my thesis.
</commit_message>
<xml_diff>
--- a/Project Thesis.docx
+++ b/Project Thesis.docx
@@ -6061,8 +6061,19 @@
           <w:lang w:val="en-US"/>
         </w:rPr>
         <w:lastRenderedPageBreak/>
-        <w:t>FUNCTION AddCourse</w:t>
-      </w:r>
+        <w:t xml:space="preserve">FUNCTION </w:t>
+      </w:r>
+      <w:proofErr w:type="spellStart"/>
+      <w:r>
+        <w:rPr>
+          <w:rFonts w:ascii="Arial" w:hAnsi="Arial" w:cs="Arial"/>
+          <w:sz w:val="24"/>
+          <w:szCs w:val="24"/>
+          <w:lang w:val="en-US"/>
+        </w:rPr>
+        <w:t>AddCourse</w:t>
+      </w:r>
+      <w:proofErr w:type="spellEnd"/>
     </w:p>
     <w:p>
       <w:pPr>
@@ -7116,14 +7127,25 @@
         </w:rPr>
         <w:t xml:space="preserve">FUNCTION </w:t>
       </w:r>
-      <w:r>
-        <w:rPr>
-          <w:rFonts w:ascii="Arial" w:hAnsi="Arial" w:cs="Arial"/>
-          <w:sz w:val="24"/>
-          <w:szCs w:val="24"/>
-          <w:lang w:val="en-US"/>
-        </w:rPr>
-        <w:t>CalculateGPA(courses)</w:t>
+      <w:proofErr w:type="spellStart"/>
+      <w:r>
+        <w:rPr>
+          <w:rFonts w:ascii="Arial" w:hAnsi="Arial" w:cs="Arial"/>
+          <w:sz w:val="24"/>
+          <w:szCs w:val="24"/>
+          <w:lang w:val="en-US"/>
+        </w:rPr>
+        <w:t>CalculateGPA</w:t>
+      </w:r>
+      <w:proofErr w:type="spellEnd"/>
+      <w:r>
+        <w:rPr>
+          <w:rFonts w:ascii="Arial" w:hAnsi="Arial" w:cs="Arial"/>
+          <w:sz w:val="24"/>
+          <w:szCs w:val="24"/>
+          <w:lang w:val="en-US"/>
+        </w:rPr>
+        <w:t>(courses)</w:t>
       </w:r>
     </w:p>
     <w:p>
@@ -7156,14 +7178,25 @@
         </w:rPr>
         <w:t xml:space="preserve">   </w:t>
       </w:r>
-      <w:r>
-        <w:rPr>
-          <w:rFonts w:ascii="Arial" w:hAnsi="Arial" w:cs="Arial"/>
-          <w:sz w:val="24"/>
-          <w:szCs w:val="24"/>
-          <w:lang w:val="en-US"/>
-        </w:rPr>
-        <w:t>totalQualityPoints = 0</w:t>
+      <w:proofErr w:type="spellStart"/>
+      <w:r>
+        <w:rPr>
+          <w:rFonts w:ascii="Arial" w:hAnsi="Arial" w:cs="Arial"/>
+          <w:sz w:val="24"/>
+          <w:szCs w:val="24"/>
+          <w:lang w:val="en-US"/>
+        </w:rPr>
+        <w:t>totalQualityPoints</w:t>
+      </w:r>
+      <w:proofErr w:type="spellEnd"/>
+      <w:r>
+        <w:rPr>
+          <w:rFonts w:ascii="Arial" w:hAnsi="Arial" w:cs="Arial"/>
+          <w:sz w:val="24"/>
+          <w:szCs w:val="24"/>
+          <w:lang w:val="en-US"/>
+        </w:rPr>
+        <w:t xml:space="preserve"> = 0</w:t>
       </w:r>
     </w:p>
     <w:p>
@@ -7186,14 +7219,25 @@
         <w:lastRenderedPageBreak/>
         <w:t xml:space="preserve">   </w:t>
       </w:r>
-      <w:r>
-        <w:rPr>
-          <w:rFonts w:ascii="Arial" w:hAnsi="Arial" w:cs="Arial"/>
-          <w:sz w:val="24"/>
-          <w:szCs w:val="24"/>
-          <w:lang w:val="en-US"/>
-        </w:rPr>
-        <w:t>attemptedCredits = 0</w:t>
+      <w:proofErr w:type="spellStart"/>
+      <w:r>
+        <w:rPr>
+          <w:rFonts w:ascii="Arial" w:hAnsi="Arial" w:cs="Arial"/>
+          <w:sz w:val="24"/>
+          <w:szCs w:val="24"/>
+          <w:lang w:val="en-US"/>
+        </w:rPr>
+        <w:t>attemptedCredits</w:t>
+      </w:r>
+      <w:proofErr w:type="spellEnd"/>
+      <w:r>
+        <w:rPr>
+          <w:rFonts w:ascii="Arial" w:hAnsi="Arial" w:cs="Arial"/>
+          <w:sz w:val="24"/>
+          <w:szCs w:val="24"/>
+          <w:lang w:val="en-US"/>
+        </w:rPr>
+        <w:t xml:space="preserve"> = 0</w:t>
       </w:r>
     </w:p>
     <w:p>
@@ -7284,6 +7328,7 @@
         </w:rPr>
         <w:t xml:space="preserve">      </w:t>
       </w:r>
+      <w:proofErr w:type="spellStart"/>
       <w:r>
         <w:rPr>
           <w:rFonts w:ascii="Arial" w:hAnsi="Arial" w:cs="Arial"/>
@@ -7293,15 +7338,38 @@
         </w:rPr>
         <w:t>gradePoints</w:t>
       </w:r>
-      <w:r>
-        <w:rPr>
-          <w:rFonts w:ascii="Arial" w:hAnsi="Arial" w:cs="Arial"/>
-          <w:sz w:val="24"/>
-          <w:szCs w:val="24"/>
-          <w:lang w:val="en-US"/>
-        </w:rPr>
-        <w:t xml:space="preserve"> = ConvertGradeToPoints(</w:t>
-      </w:r>
+      <w:proofErr w:type="spellEnd"/>
+      <w:r>
+        <w:rPr>
+          <w:rFonts w:ascii="Arial" w:hAnsi="Arial" w:cs="Arial"/>
+          <w:sz w:val="24"/>
+          <w:szCs w:val="24"/>
+          <w:lang w:val="en-US"/>
+        </w:rPr>
+        <w:t xml:space="preserve"> = </w:t>
+      </w:r>
+      <w:proofErr w:type="spellStart"/>
+      <w:r>
+        <w:rPr>
+          <w:rFonts w:ascii="Arial" w:hAnsi="Arial" w:cs="Arial"/>
+          <w:sz w:val="24"/>
+          <w:szCs w:val="24"/>
+          <w:lang w:val="en-US"/>
+        </w:rPr>
+        <w:t>ConvertGradeToPoints</w:t>
+      </w:r>
+      <w:proofErr w:type="spellEnd"/>
+      <w:r>
+        <w:rPr>
+          <w:rFonts w:ascii="Arial" w:hAnsi="Arial" w:cs="Arial"/>
+          <w:sz w:val="24"/>
+          <w:szCs w:val="24"/>
+          <w:lang w:val="en-US"/>
+        </w:rPr>
+        <w:t>(</w:t>
+      </w:r>
+      <w:proofErr w:type="spellStart"/>
+      <w:proofErr w:type="gramStart"/>
       <w:r>
         <w:rPr>
           <w:rFonts w:ascii="Arial" w:hAnsi="Arial" w:cs="Arial"/>
@@ -7311,6 +7379,8 @@
         </w:rPr>
         <w:t>course.grade</w:t>
       </w:r>
+      <w:proofErr w:type="spellEnd"/>
+      <w:proofErr w:type="gramEnd"/>
       <w:r>
         <w:rPr>
           <w:rFonts w:ascii="Arial" w:hAnsi="Arial" w:cs="Arial"/>
@@ -7349,26 +7419,59 @@
           <w:szCs w:val="24"/>
           <w:lang w:val="en-US"/>
         </w:rPr>
-        <w:t xml:space="preserve">      totalQualityPoints</w:t>
-      </w:r>
-      <w:r>
-        <w:rPr>
-          <w:rFonts w:ascii="Arial" w:hAnsi="Arial" w:cs="Arial"/>
-          <w:sz w:val="24"/>
-          <w:szCs w:val="24"/>
-          <w:lang w:val="en-US"/>
-        </w:rPr>
-        <w:t xml:space="preserve"> = totalQualityPoints</w:t>
-      </w:r>
-      <w:r>
-        <w:rPr>
-          <w:rFonts w:ascii="Arial" w:hAnsi="Arial" w:cs="Arial"/>
-          <w:sz w:val="24"/>
-          <w:szCs w:val="24"/>
-          <w:lang w:val="en-US"/>
-        </w:rPr>
-        <w:t xml:space="preserve"> + gradePoints</w:t>
-      </w:r>
+        <w:t xml:space="preserve">      </w:t>
+      </w:r>
+      <w:proofErr w:type="spellStart"/>
+      <w:r>
+        <w:rPr>
+          <w:rFonts w:ascii="Arial" w:hAnsi="Arial" w:cs="Arial"/>
+          <w:sz w:val="24"/>
+          <w:szCs w:val="24"/>
+          <w:lang w:val="en-US"/>
+        </w:rPr>
+        <w:t>totalQualityPoints</w:t>
+      </w:r>
+      <w:proofErr w:type="spellEnd"/>
+      <w:r>
+        <w:rPr>
+          <w:rFonts w:ascii="Arial" w:hAnsi="Arial" w:cs="Arial"/>
+          <w:sz w:val="24"/>
+          <w:szCs w:val="24"/>
+          <w:lang w:val="en-US"/>
+        </w:rPr>
+        <w:t xml:space="preserve"> = </w:t>
+      </w:r>
+      <w:proofErr w:type="spellStart"/>
+      <w:r>
+        <w:rPr>
+          <w:rFonts w:ascii="Arial" w:hAnsi="Arial" w:cs="Arial"/>
+          <w:sz w:val="24"/>
+          <w:szCs w:val="24"/>
+          <w:lang w:val="en-US"/>
+        </w:rPr>
+        <w:t>totalQualityPoints</w:t>
+      </w:r>
+      <w:proofErr w:type="spellEnd"/>
+      <w:r>
+        <w:rPr>
+          <w:rFonts w:ascii="Arial" w:hAnsi="Arial" w:cs="Arial"/>
+          <w:sz w:val="24"/>
+          <w:szCs w:val="24"/>
+          <w:lang w:val="en-US"/>
+        </w:rPr>
+        <w:t xml:space="preserve"> + </w:t>
+      </w:r>
+      <w:proofErr w:type="spellStart"/>
+      <w:r>
+        <w:rPr>
+          <w:rFonts w:ascii="Arial" w:hAnsi="Arial" w:cs="Arial"/>
+          <w:sz w:val="24"/>
+          <w:szCs w:val="24"/>
+          <w:lang w:val="en-US"/>
+        </w:rPr>
+        <w:t>gradePoints</w:t>
+      </w:r>
+      <w:proofErr w:type="spellEnd"/>
       <w:r>
         <w:rPr>
           <w:rFonts w:ascii="Arial" w:hAnsi="Arial" w:cs="Arial"/>
@@ -7378,6 +7481,8 @@
         </w:rPr>
         <w:t xml:space="preserve"> * </w:t>
       </w:r>
+      <w:proofErr w:type="spellStart"/>
+      <w:proofErr w:type="gramStart"/>
       <w:r>
         <w:rPr>
           <w:rFonts w:ascii="Arial" w:hAnsi="Arial" w:cs="Arial"/>
@@ -7387,55 +7492,92 @@
         </w:rPr>
         <w:t>course.credits</w:t>
       </w:r>
-    </w:p>
-    <w:p>
-      <w:pPr>
-        <w:spacing w:line="360" w:lineRule="auto"/>
-        <w:rPr>
-          <w:rFonts w:ascii="Arial" w:hAnsi="Arial" w:cs="Arial"/>
-          <w:sz w:val="24"/>
-          <w:szCs w:val="24"/>
-          <w:lang w:val="en-US"/>
-        </w:rPr>
-      </w:pPr>
-    </w:p>
-    <w:p>
-      <w:pPr>
-        <w:spacing w:line="360" w:lineRule="auto"/>
-        <w:rPr>
-          <w:rFonts w:ascii="Arial" w:hAnsi="Arial" w:cs="Arial"/>
-          <w:sz w:val="24"/>
-          <w:szCs w:val="24"/>
-          <w:lang w:val="en-US"/>
-        </w:rPr>
-      </w:pPr>
-      <w:r>
-        <w:rPr>
-          <w:rFonts w:ascii="Arial" w:hAnsi="Arial" w:cs="Arial"/>
-          <w:sz w:val="24"/>
-          <w:szCs w:val="24"/>
-          <w:lang w:val="en-US"/>
-        </w:rPr>
-        <w:t xml:space="preserve">      attemptedCredits</w:t>
-      </w:r>
-      <w:r>
-        <w:rPr>
-          <w:rFonts w:ascii="Arial" w:hAnsi="Arial" w:cs="Arial"/>
-          <w:sz w:val="24"/>
-          <w:szCs w:val="24"/>
-          <w:lang w:val="en-US"/>
-        </w:rPr>
-        <w:t xml:space="preserve"> = attemptedCredits</w:t>
-      </w:r>
-      <w:r>
-        <w:rPr>
-          <w:rFonts w:ascii="Arial" w:hAnsi="Arial" w:cs="Arial"/>
-          <w:sz w:val="24"/>
-          <w:szCs w:val="24"/>
-          <w:lang w:val="en-US"/>
-        </w:rPr>
-        <w:t xml:space="preserve"> + course.credits</w:t>
-      </w:r>
+      <w:proofErr w:type="spellEnd"/>
+      <w:proofErr w:type="gramEnd"/>
+    </w:p>
+    <w:p>
+      <w:pPr>
+        <w:spacing w:line="360" w:lineRule="auto"/>
+        <w:rPr>
+          <w:rFonts w:ascii="Arial" w:hAnsi="Arial" w:cs="Arial"/>
+          <w:sz w:val="24"/>
+          <w:szCs w:val="24"/>
+          <w:lang w:val="en-US"/>
+        </w:rPr>
+      </w:pPr>
+    </w:p>
+    <w:p>
+      <w:pPr>
+        <w:spacing w:line="360" w:lineRule="auto"/>
+        <w:rPr>
+          <w:rFonts w:ascii="Arial" w:hAnsi="Arial" w:cs="Arial"/>
+          <w:sz w:val="24"/>
+          <w:szCs w:val="24"/>
+          <w:lang w:val="en-US"/>
+        </w:rPr>
+      </w:pPr>
+      <w:r>
+        <w:rPr>
+          <w:rFonts w:ascii="Arial" w:hAnsi="Arial" w:cs="Arial"/>
+          <w:sz w:val="24"/>
+          <w:szCs w:val="24"/>
+          <w:lang w:val="en-US"/>
+        </w:rPr>
+        <w:t xml:space="preserve">      </w:t>
+      </w:r>
+      <w:proofErr w:type="spellStart"/>
+      <w:r>
+        <w:rPr>
+          <w:rFonts w:ascii="Arial" w:hAnsi="Arial" w:cs="Arial"/>
+          <w:sz w:val="24"/>
+          <w:szCs w:val="24"/>
+          <w:lang w:val="en-US"/>
+        </w:rPr>
+        <w:t>attemptedCredits</w:t>
+      </w:r>
+      <w:proofErr w:type="spellEnd"/>
+      <w:r>
+        <w:rPr>
+          <w:rFonts w:ascii="Arial" w:hAnsi="Arial" w:cs="Arial"/>
+          <w:sz w:val="24"/>
+          <w:szCs w:val="24"/>
+          <w:lang w:val="en-US"/>
+        </w:rPr>
+        <w:t xml:space="preserve"> = </w:t>
+      </w:r>
+      <w:proofErr w:type="spellStart"/>
+      <w:r>
+        <w:rPr>
+          <w:rFonts w:ascii="Arial" w:hAnsi="Arial" w:cs="Arial"/>
+          <w:sz w:val="24"/>
+          <w:szCs w:val="24"/>
+          <w:lang w:val="en-US"/>
+        </w:rPr>
+        <w:t>attemptedCredits</w:t>
+      </w:r>
+      <w:proofErr w:type="spellEnd"/>
+      <w:r>
+        <w:rPr>
+          <w:rFonts w:ascii="Arial" w:hAnsi="Arial" w:cs="Arial"/>
+          <w:sz w:val="24"/>
+          <w:szCs w:val="24"/>
+          <w:lang w:val="en-US"/>
+        </w:rPr>
+        <w:t xml:space="preserve"> + </w:t>
+      </w:r>
+      <w:proofErr w:type="spellStart"/>
+      <w:proofErr w:type="gramStart"/>
+      <w:r>
+        <w:rPr>
+          <w:rFonts w:ascii="Arial" w:hAnsi="Arial" w:cs="Arial"/>
+          <w:sz w:val="24"/>
+          <w:szCs w:val="24"/>
+          <w:lang w:val="en-US"/>
+        </w:rPr>
+        <w:t>course.credits</w:t>
+      </w:r>
+      <w:proofErr w:type="spellEnd"/>
+      <w:proofErr w:type="gramEnd"/>
     </w:p>
     <w:p>
       <w:pPr>
@@ -7514,8 +7656,19 @@
           <w:szCs w:val="24"/>
           <w:lang w:val="en-US"/>
         </w:rPr>
-        <w:t>IF attemptedCredits</w:t>
-      </w:r>
+        <w:t xml:space="preserve">IF </w:t>
+      </w:r>
+      <w:proofErr w:type="spellStart"/>
+      <w:r>
+        <w:rPr>
+          <w:rFonts w:ascii="Arial" w:hAnsi="Arial" w:cs="Arial"/>
+          <w:sz w:val="24"/>
+          <w:szCs w:val="24"/>
+          <w:lang w:val="en-US"/>
+        </w:rPr>
+        <w:t>attemptedCredits</w:t>
+      </w:r>
+      <w:proofErr w:type="spellEnd"/>
       <w:r>
         <w:rPr>
           <w:rFonts w:ascii="Arial" w:hAnsi="Arial" w:cs="Arial"/>
@@ -7614,15 +7767,37 @@
         </w:rPr>
         <w:t xml:space="preserve"> </w:t>
       </w:r>
-      <w:r>
-        <w:rPr>
-          <w:rFonts w:ascii="Arial" w:hAnsi="Arial" w:cs="Arial"/>
-          <w:sz w:val="24"/>
-          <w:szCs w:val="24"/>
-          <w:lang w:val="en-US"/>
-        </w:rPr>
-        <w:t>totalQualityPoints / attemptedCredits</w:t>
-      </w:r>
+      <w:proofErr w:type="spellStart"/>
+      <w:r>
+        <w:rPr>
+          <w:rFonts w:ascii="Arial" w:hAnsi="Arial" w:cs="Arial"/>
+          <w:sz w:val="24"/>
+          <w:szCs w:val="24"/>
+          <w:lang w:val="en-US"/>
+        </w:rPr>
+        <w:t>totalQualityPoints</w:t>
+      </w:r>
+      <w:proofErr w:type="spellEnd"/>
+      <w:r>
+        <w:rPr>
+          <w:rFonts w:ascii="Arial" w:hAnsi="Arial" w:cs="Arial"/>
+          <w:sz w:val="24"/>
+          <w:szCs w:val="24"/>
+          <w:lang w:val="en-US"/>
+        </w:rPr>
+        <w:t xml:space="preserve"> / </w:t>
+      </w:r>
+      <w:proofErr w:type="spellStart"/>
+      <w:r>
+        <w:rPr>
+          <w:rFonts w:ascii="Arial" w:hAnsi="Arial" w:cs="Arial"/>
+          <w:sz w:val="24"/>
+          <w:szCs w:val="24"/>
+          <w:lang w:val="en-US"/>
+        </w:rPr>
+        <w:t>attemptedCredits</w:t>
+      </w:r>
+      <w:proofErr w:type="spellEnd"/>
     </w:p>
     <w:p>
       <w:pPr>
@@ -7705,7 +7880,27 @@
           <w:szCs w:val="24"/>
           <w:lang w:val="en-US"/>
         </w:rPr>
-        <w:t>FUNCTION ConvertGradeToPoints(grade)</w:t>
+        <w:t xml:space="preserve">FUNCTION </w:t>
+      </w:r>
+      <w:proofErr w:type="spellStart"/>
+      <w:r>
+        <w:rPr>
+          <w:rFonts w:ascii="Arial" w:hAnsi="Arial" w:cs="Arial"/>
+          <w:sz w:val="24"/>
+          <w:szCs w:val="24"/>
+          <w:lang w:val="en-US"/>
+        </w:rPr>
+        <w:t>ConvertGradeToPoints</w:t>
+      </w:r>
+      <w:proofErr w:type="spellEnd"/>
+      <w:r>
+        <w:rPr>
+          <w:rFonts w:ascii="Arial" w:hAnsi="Arial" w:cs="Arial"/>
+          <w:sz w:val="24"/>
+          <w:szCs w:val="24"/>
+          <w:lang w:val="en-US"/>
+        </w:rPr>
+        <w:t>(grade)</w:t>
       </w:r>
     </w:p>
     <w:p>
@@ -7795,16 +7990,36 @@
           <w:szCs w:val="24"/>
           <w:lang w:val="en-US"/>
         </w:rPr>
-        <w:t xml:space="preserve">   ELSE IF grade = ”</w:t>
-      </w:r>
-      <w:r>
-        <w:rPr>
-          <w:rFonts w:ascii="Arial" w:hAnsi="Arial" w:cs="Arial"/>
-          <w:sz w:val="24"/>
-          <w:szCs w:val="24"/>
-          <w:lang w:val="en-US"/>
-        </w:rPr>
-        <w:t>A-</w:t>
+        <w:t xml:space="preserve">   ELSE IF grade </w:t>
+      </w:r>
+      <w:proofErr w:type="gramStart"/>
+      <w:r>
+        <w:rPr>
+          <w:rFonts w:ascii="Arial" w:hAnsi="Arial" w:cs="Arial"/>
+          <w:sz w:val="24"/>
+          <w:szCs w:val="24"/>
+          <w:lang w:val="en-US"/>
+        </w:rPr>
+        <w:t>= ”</w:t>
+      </w:r>
+      <w:r>
+        <w:rPr>
+          <w:rFonts w:ascii="Arial" w:hAnsi="Arial" w:cs="Arial"/>
+          <w:sz w:val="24"/>
+          <w:szCs w:val="24"/>
+          <w:lang w:val="en-US"/>
+        </w:rPr>
+        <w:t>A</w:t>
+      </w:r>
+      <w:proofErr w:type="gramEnd"/>
+      <w:r>
+        <w:rPr>
+          <w:rFonts w:ascii="Arial" w:hAnsi="Arial" w:cs="Arial"/>
+          <w:sz w:val="24"/>
+          <w:szCs w:val="24"/>
+          <w:lang w:val="en-US"/>
+        </w:rPr>
+        <w:t>-</w:t>
       </w:r>
       <w:r>
         <w:rPr>
@@ -8361,25 +8576,68 @@
           <w:szCs w:val="24"/>
           <w:lang w:val="en-US"/>
         </w:rPr>
-        <w:t xml:space="preserve"> CalculateProjectedGPA(</w:t>
-      </w:r>
-      <w:r>
-        <w:rPr>
-          <w:rFonts w:ascii="Arial" w:hAnsi="Arial" w:cs="Arial"/>
-          <w:sz w:val="24"/>
-          <w:szCs w:val="24"/>
-          <w:lang w:val="en-US"/>
-        </w:rPr>
-        <w:t>currentCourses,</w:t>
-      </w:r>
-      <w:r>
-        <w:rPr>
-          <w:rFonts w:ascii="Arial" w:hAnsi="Arial" w:cs="Arial"/>
-          <w:sz w:val="24"/>
-          <w:szCs w:val="24"/>
-          <w:lang w:val="en-US"/>
-        </w:rPr>
-        <w:t xml:space="preserve"> hypothetical</w:t>
+        <w:t xml:space="preserve"> </w:t>
+      </w:r>
+      <w:proofErr w:type="spellStart"/>
+      <w:proofErr w:type="gramStart"/>
+      <w:r>
+        <w:rPr>
+          <w:rFonts w:ascii="Arial" w:hAnsi="Arial" w:cs="Arial"/>
+          <w:sz w:val="24"/>
+          <w:szCs w:val="24"/>
+          <w:lang w:val="en-US"/>
+        </w:rPr>
+        <w:t>CalculateProjectedGPA</w:t>
+      </w:r>
+      <w:proofErr w:type="spellEnd"/>
+      <w:r>
+        <w:rPr>
+          <w:rFonts w:ascii="Arial" w:hAnsi="Arial" w:cs="Arial"/>
+          <w:sz w:val="24"/>
+          <w:szCs w:val="24"/>
+          <w:lang w:val="en-US"/>
+        </w:rPr>
+        <w:t>(</w:t>
+      </w:r>
+      <w:proofErr w:type="spellStart"/>
+      <w:proofErr w:type="gramEnd"/>
+      <w:r>
+        <w:rPr>
+          <w:rFonts w:ascii="Arial" w:hAnsi="Arial" w:cs="Arial"/>
+          <w:sz w:val="24"/>
+          <w:szCs w:val="24"/>
+          <w:lang w:val="en-US"/>
+        </w:rPr>
+        <w:t>currentCourses</w:t>
+      </w:r>
+      <w:proofErr w:type="spellEnd"/>
+      <w:r>
+        <w:rPr>
+          <w:rFonts w:ascii="Arial" w:hAnsi="Arial" w:cs="Arial"/>
+          <w:sz w:val="24"/>
+          <w:szCs w:val="24"/>
+          <w:lang w:val="en-US"/>
+        </w:rPr>
+        <w:t>,</w:t>
+      </w:r>
+      <w:r>
+        <w:rPr>
+          <w:rFonts w:ascii="Arial" w:hAnsi="Arial" w:cs="Arial"/>
+          <w:sz w:val="24"/>
+          <w:szCs w:val="24"/>
+          <w:lang w:val="en-US"/>
+        </w:rPr>
+        <w:t xml:space="preserve"> </w:t>
+      </w:r>
+      <w:proofErr w:type="spellStart"/>
+      <w:r>
+        <w:rPr>
+          <w:rFonts w:ascii="Arial" w:hAnsi="Arial" w:cs="Arial"/>
+          <w:sz w:val="24"/>
+          <w:szCs w:val="24"/>
+          <w:lang w:val="en-US"/>
+        </w:rPr>
+        <w:t>hypothetical</w:t>
       </w:r>
       <w:r>
         <w:rPr>
@@ -8390,6 +8648,7 @@
         </w:rPr>
         <w:t>Courses</w:t>
       </w:r>
+      <w:proofErr w:type="spellEnd"/>
       <w:r>
         <w:rPr>
           <w:rFonts w:ascii="Arial" w:hAnsi="Arial" w:cs="Arial"/>
@@ -8428,8 +8687,29 @@
           <w:szCs w:val="24"/>
           <w:lang w:val="en-US"/>
         </w:rPr>
-        <w:t xml:space="preserve">   currentQualityPoints = </w:t>
-      </w:r>
+        <w:t xml:space="preserve">   </w:t>
+      </w:r>
+      <w:proofErr w:type="spellStart"/>
+      <w:r>
+        <w:rPr>
+          <w:rFonts w:ascii="Arial" w:hAnsi="Arial" w:cs="Arial"/>
+          <w:sz w:val="24"/>
+          <w:szCs w:val="24"/>
+          <w:lang w:val="en-US"/>
+        </w:rPr>
+        <w:t>currentQualityPoints</w:t>
+      </w:r>
+      <w:proofErr w:type="spellEnd"/>
+      <w:r>
+        <w:rPr>
+          <w:rFonts w:ascii="Arial" w:hAnsi="Arial" w:cs="Arial"/>
+          <w:sz w:val="24"/>
+          <w:szCs w:val="24"/>
+          <w:lang w:val="en-US"/>
+        </w:rPr>
+        <w:t xml:space="preserve"> = </w:t>
+      </w:r>
+      <w:proofErr w:type="spellStart"/>
       <w:r>
         <w:rPr>
           <w:rFonts w:ascii="Arial" w:hAnsi="Arial" w:cs="Arial"/>
@@ -8439,6 +8719,7 @@
         </w:rPr>
         <w:t>CalculateQualityPoints</w:t>
       </w:r>
+      <w:proofErr w:type="spellEnd"/>
       <w:r>
         <w:rPr>
           <w:rFonts w:ascii="Arial" w:hAnsi="Arial" w:cs="Arial"/>
@@ -8448,6 +8729,7 @@
         </w:rPr>
         <w:t>(</w:t>
       </w:r>
+      <w:proofErr w:type="spellStart"/>
       <w:r>
         <w:rPr>
           <w:rFonts w:ascii="Arial" w:hAnsi="Arial" w:cs="Arial"/>
@@ -8457,6 +8739,7 @@
         </w:rPr>
         <w:t>currentCourses</w:t>
       </w:r>
+      <w:proofErr w:type="spellEnd"/>
       <w:r>
         <w:rPr>
           <w:rFonts w:ascii="Arial" w:hAnsi="Arial" w:cs="Arial"/>
@@ -8495,39 +8778,100 @@
           <w:szCs w:val="24"/>
           <w:lang w:val="en-US"/>
         </w:rPr>
-        <w:t xml:space="preserve">   futureQualityPoints = CalculateQualityPoints(hypotheticalCourses)</w:t>
-      </w:r>
-    </w:p>
-    <w:p>
-      <w:pPr>
-        <w:spacing w:line="360" w:lineRule="auto"/>
-        <w:rPr>
-          <w:rFonts w:ascii="Arial" w:hAnsi="Arial" w:cs="Arial"/>
-          <w:sz w:val="24"/>
-          <w:szCs w:val="24"/>
-          <w:lang w:val="en-US"/>
-        </w:rPr>
-      </w:pPr>
-    </w:p>
-    <w:p>
-      <w:pPr>
-        <w:spacing w:line="360" w:lineRule="auto"/>
-        <w:rPr>
-          <w:rFonts w:ascii="Arial" w:hAnsi="Arial" w:cs="Arial"/>
-          <w:sz w:val="24"/>
-          <w:szCs w:val="24"/>
-          <w:lang w:val="en-US"/>
-        </w:rPr>
-      </w:pPr>
-      <w:r>
-        <w:rPr>
-          <w:rFonts w:ascii="Arial" w:hAnsi="Arial" w:cs="Arial"/>
-          <w:sz w:val="24"/>
-          <w:szCs w:val="24"/>
-          <w:lang w:val="en-US"/>
-        </w:rPr>
         <w:t xml:space="preserve">   </w:t>
       </w:r>
+      <w:proofErr w:type="spellStart"/>
+      <w:r>
+        <w:rPr>
+          <w:rFonts w:ascii="Arial" w:hAnsi="Arial" w:cs="Arial"/>
+          <w:sz w:val="24"/>
+          <w:szCs w:val="24"/>
+          <w:lang w:val="en-US"/>
+        </w:rPr>
+        <w:t>futureQualityPoints</w:t>
+      </w:r>
+      <w:proofErr w:type="spellEnd"/>
+      <w:r>
+        <w:rPr>
+          <w:rFonts w:ascii="Arial" w:hAnsi="Arial" w:cs="Arial"/>
+          <w:sz w:val="24"/>
+          <w:szCs w:val="24"/>
+          <w:lang w:val="en-US"/>
+        </w:rPr>
+        <w:t xml:space="preserve"> = </w:t>
+      </w:r>
+      <w:proofErr w:type="spellStart"/>
+      <w:r>
+        <w:rPr>
+          <w:rFonts w:ascii="Arial" w:hAnsi="Arial" w:cs="Arial"/>
+          <w:sz w:val="24"/>
+          <w:szCs w:val="24"/>
+          <w:lang w:val="en-US"/>
+        </w:rPr>
+        <w:t>CalculateQualityPoints</w:t>
+      </w:r>
+      <w:proofErr w:type="spellEnd"/>
+      <w:r>
+        <w:rPr>
+          <w:rFonts w:ascii="Arial" w:hAnsi="Arial" w:cs="Arial"/>
+          <w:sz w:val="24"/>
+          <w:szCs w:val="24"/>
+          <w:lang w:val="en-US"/>
+        </w:rPr>
+        <w:t>(</w:t>
+      </w:r>
+      <w:proofErr w:type="spellStart"/>
+      <w:r>
+        <w:rPr>
+          <w:rFonts w:ascii="Arial" w:hAnsi="Arial" w:cs="Arial"/>
+          <w:sz w:val="24"/>
+          <w:szCs w:val="24"/>
+          <w:lang w:val="en-US"/>
+        </w:rPr>
+        <w:t>hypotheticalCourses</w:t>
+      </w:r>
+      <w:proofErr w:type="spellEnd"/>
+      <w:r>
+        <w:rPr>
+          <w:rFonts w:ascii="Arial" w:hAnsi="Arial" w:cs="Arial"/>
+          <w:sz w:val="24"/>
+          <w:szCs w:val="24"/>
+          <w:lang w:val="en-US"/>
+        </w:rPr>
+        <w:t>)</w:t>
+      </w:r>
+    </w:p>
+    <w:p>
+      <w:pPr>
+        <w:spacing w:line="360" w:lineRule="auto"/>
+        <w:rPr>
+          <w:rFonts w:ascii="Arial" w:hAnsi="Arial" w:cs="Arial"/>
+          <w:sz w:val="24"/>
+          <w:szCs w:val="24"/>
+          <w:lang w:val="en-US"/>
+        </w:rPr>
+      </w:pPr>
+    </w:p>
+    <w:p>
+      <w:pPr>
+        <w:spacing w:line="360" w:lineRule="auto"/>
+        <w:rPr>
+          <w:rFonts w:ascii="Arial" w:hAnsi="Arial" w:cs="Arial"/>
+          <w:sz w:val="24"/>
+          <w:szCs w:val="24"/>
+          <w:lang w:val="en-US"/>
+        </w:rPr>
+      </w:pPr>
+      <w:r>
+        <w:rPr>
+          <w:rFonts w:ascii="Arial" w:hAnsi="Arial" w:cs="Arial"/>
+          <w:sz w:val="24"/>
+          <w:szCs w:val="24"/>
+          <w:lang w:val="en-US"/>
+        </w:rPr>
+        <w:t xml:space="preserve">   </w:t>
+      </w:r>
+      <w:proofErr w:type="spellStart"/>
       <w:r>
         <w:rPr>
           <w:rFonts w:ascii="Arial" w:hAnsi="Arial" w:cs="Arial"/>
@@ -8537,15 +8881,27 @@
         </w:rPr>
         <w:t>currentCredits</w:t>
       </w:r>
-      <w:r>
-        <w:rPr>
-          <w:rFonts w:ascii="Arial" w:hAnsi="Arial" w:cs="Arial"/>
-          <w:sz w:val="24"/>
-          <w:szCs w:val="24"/>
-          <w:lang w:val="en-US"/>
-        </w:rPr>
-        <w:t xml:space="preserve"> = CalculateAttemptedCredits</w:t>
-      </w:r>
+      <w:proofErr w:type="spellEnd"/>
+      <w:r>
+        <w:rPr>
+          <w:rFonts w:ascii="Arial" w:hAnsi="Arial" w:cs="Arial"/>
+          <w:sz w:val="24"/>
+          <w:szCs w:val="24"/>
+          <w:lang w:val="en-US"/>
+        </w:rPr>
+        <w:t xml:space="preserve"> = </w:t>
+      </w:r>
+      <w:proofErr w:type="spellStart"/>
+      <w:r>
+        <w:rPr>
+          <w:rFonts w:ascii="Arial" w:hAnsi="Arial" w:cs="Arial"/>
+          <w:sz w:val="24"/>
+          <w:szCs w:val="24"/>
+          <w:lang w:val="en-US"/>
+        </w:rPr>
+        <w:t>CalculateAttemptedCredits</w:t>
+      </w:r>
+      <w:proofErr w:type="spellEnd"/>
       <w:r>
         <w:rPr>
           <w:rFonts w:ascii="Arial" w:hAnsi="Arial" w:cs="Arial"/>
@@ -8555,6 +8911,7 @@
         </w:rPr>
         <w:t>(</w:t>
       </w:r>
+      <w:proofErr w:type="spellStart"/>
       <w:r>
         <w:rPr>
           <w:rFonts w:ascii="Arial" w:hAnsi="Arial" w:cs="Arial"/>
@@ -8564,6 +8921,7 @@
         </w:rPr>
         <w:t>currentCourses</w:t>
       </w:r>
+      <w:proofErr w:type="spellEnd"/>
       <w:r>
         <w:rPr>
           <w:rFonts w:ascii="Arial" w:hAnsi="Arial" w:cs="Arial"/>
@@ -8602,16 +8960,67 @@
           <w:szCs w:val="24"/>
           <w:lang w:val="en-US"/>
         </w:rPr>
-        <w:t xml:space="preserve">   futureCredits</w:t>
-      </w:r>
-      <w:r>
-        <w:rPr>
-          <w:rFonts w:ascii="Arial" w:hAnsi="Arial" w:cs="Arial"/>
-          <w:sz w:val="24"/>
-          <w:szCs w:val="24"/>
-          <w:lang w:val="en-US"/>
-        </w:rPr>
-        <w:t xml:space="preserve"> = CalculateAttemptedCredits(hypotheticalCourses)</w:t>
+        <w:t xml:space="preserve">   </w:t>
+      </w:r>
+      <w:proofErr w:type="spellStart"/>
+      <w:r>
+        <w:rPr>
+          <w:rFonts w:ascii="Arial" w:hAnsi="Arial" w:cs="Arial"/>
+          <w:sz w:val="24"/>
+          <w:szCs w:val="24"/>
+          <w:lang w:val="en-US"/>
+        </w:rPr>
+        <w:t>futureCredits</w:t>
+      </w:r>
+      <w:proofErr w:type="spellEnd"/>
+      <w:r>
+        <w:rPr>
+          <w:rFonts w:ascii="Arial" w:hAnsi="Arial" w:cs="Arial"/>
+          <w:sz w:val="24"/>
+          <w:szCs w:val="24"/>
+          <w:lang w:val="en-US"/>
+        </w:rPr>
+        <w:t xml:space="preserve"> = </w:t>
+      </w:r>
+      <w:proofErr w:type="spellStart"/>
+      <w:r>
+        <w:rPr>
+          <w:rFonts w:ascii="Arial" w:hAnsi="Arial" w:cs="Arial"/>
+          <w:sz w:val="24"/>
+          <w:szCs w:val="24"/>
+          <w:lang w:val="en-US"/>
+        </w:rPr>
+        <w:t>CalculateAttemptedCredits</w:t>
+      </w:r>
+      <w:proofErr w:type="spellEnd"/>
+      <w:r>
+        <w:rPr>
+          <w:rFonts w:ascii="Arial" w:hAnsi="Arial" w:cs="Arial"/>
+          <w:sz w:val="24"/>
+          <w:szCs w:val="24"/>
+          <w:lang w:val="en-US"/>
+        </w:rPr>
+        <w:t>(</w:t>
+      </w:r>
+      <w:proofErr w:type="spellStart"/>
+      <w:r>
+        <w:rPr>
+          <w:rFonts w:ascii="Arial" w:hAnsi="Arial" w:cs="Arial"/>
+          <w:sz w:val="24"/>
+          <w:szCs w:val="24"/>
+          <w:lang w:val="en-US"/>
+        </w:rPr>
+        <w:t>hypotheticalCourses</w:t>
+      </w:r>
+      <w:proofErr w:type="spellEnd"/>
+      <w:r>
+        <w:rPr>
+          <w:rFonts w:ascii="Arial" w:hAnsi="Arial" w:cs="Arial"/>
+          <w:sz w:val="24"/>
+          <w:szCs w:val="24"/>
+          <w:lang w:val="en-US"/>
+        </w:rPr>
+        <w:t>)</w:t>
       </w:r>
     </w:p>
     <w:p>
@@ -8636,6 +9045,7 @@
           <w:lang w:val="en-US"/>
         </w:rPr>
       </w:pPr>
+      <w:proofErr w:type="spellStart"/>
       <w:r>
         <w:rPr>
           <w:rFonts w:ascii="Arial" w:hAnsi="Arial" w:cs="Arial"/>
@@ -8645,6 +9055,7 @@
         </w:rPr>
         <w:t>projectedGPA</w:t>
       </w:r>
+      <w:proofErr w:type="spellEnd"/>
       <w:r>
         <w:rPr>
           <w:rFonts w:ascii="Arial" w:hAnsi="Arial" w:cs="Arial"/>
@@ -8654,6 +9065,7 @@
         </w:rPr>
         <w:t xml:space="preserve"> = (</w:t>
       </w:r>
+      <w:proofErr w:type="spellStart"/>
       <w:r>
         <w:rPr>
           <w:rFonts w:ascii="Arial" w:hAnsi="Arial" w:cs="Arial"/>
@@ -8663,15 +9075,27 @@
         </w:rPr>
         <w:t>currentQualityPoints</w:t>
       </w:r>
-      <w:r>
-        <w:rPr>
-          <w:rFonts w:ascii="Arial" w:hAnsi="Arial" w:cs="Arial"/>
-          <w:sz w:val="24"/>
-          <w:szCs w:val="24"/>
-          <w:lang w:val="en-US"/>
-        </w:rPr>
-        <w:t xml:space="preserve"> + futureQualityPoints</w:t>
-      </w:r>
+      <w:proofErr w:type="spellEnd"/>
+      <w:r>
+        <w:rPr>
+          <w:rFonts w:ascii="Arial" w:hAnsi="Arial" w:cs="Arial"/>
+          <w:sz w:val="24"/>
+          <w:szCs w:val="24"/>
+          <w:lang w:val="en-US"/>
+        </w:rPr>
+        <w:t xml:space="preserve"> + </w:t>
+      </w:r>
+      <w:proofErr w:type="spellStart"/>
+      <w:r>
+        <w:rPr>
+          <w:rFonts w:ascii="Arial" w:hAnsi="Arial" w:cs="Arial"/>
+          <w:sz w:val="24"/>
+          <w:szCs w:val="24"/>
+          <w:lang w:val="en-US"/>
+        </w:rPr>
+        <w:t>futureQualityPoints</w:t>
+      </w:r>
+      <w:proofErr w:type="spellEnd"/>
       <w:r>
         <w:rPr>
           <w:rFonts w:ascii="Arial" w:hAnsi="Arial" w:cs="Arial"/>
@@ -8681,14 +9105,25 @@
         </w:rPr>
         <w:t>) / (</w:t>
       </w:r>
-      <w:r>
-        <w:rPr>
-          <w:rFonts w:ascii="Arial" w:hAnsi="Arial" w:cs="Arial"/>
-          <w:sz w:val="24"/>
-          <w:szCs w:val="24"/>
-          <w:lang w:val="en-US"/>
-        </w:rPr>
-        <w:t>currentCredits +</w:t>
+      <w:proofErr w:type="spellStart"/>
+      <w:r>
+        <w:rPr>
+          <w:rFonts w:ascii="Arial" w:hAnsi="Arial" w:cs="Arial"/>
+          <w:sz w:val="24"/>
+          <w:szCs w:val="24"/>
+          <w:lang w:val="en-US"/>
+        </w:rPr>
+        <w:t>currentCredits</w:t>
+      </w:r>
+      <w:proofErr w:type="spellEnd"/>
+      <w:r>
+        <w:rPr>
+          <w:rFonts w:ascii="Arial" w:hAnsi="Arial" w:cs="Arial"/>
+          <w:sz w:val="24"/>
+          <w:szCs w:val="24"/>
+          <w:lang w:val="en-US"/>
+        </w:rPr>
+        <w:t xml:space="preserve"> +</w:t>
       </w:r>
       <w:r>
         <w:rPr>
@@ -8699,6 +9134,7 @@
         </w:rPr>
         <w:t xml:space="preserve"> </w:t>
       </w:r>
+      <w:proofErr w:type="spellStart"/>
       <w:r>
         <w:rPr>
           <w:rFonts w:ascii="Arial" w:hAnsi="Arial" w:cs="Arial"/>
@@ -8708,6 +9144,7 @@
         </w:rPr>
         <w:t>futureCredits</w:t>
       </w:r>
+      <w:proofErr w:type="spellEnd"/>
       <w:r>
         <w:rPr>
           <w:rFonts w:ascii="Arial" w:hAnsi="Arial" w:cs="Arial"/>
@@ -8748,8 +9185,19 @@
           <w:szCs w:val="24"/>
           <w:lang w:val="en-US"/>
         </w:rPr>
-        <w:t>RETURN projectedGPA</w:t>
-      </w:r>
+        <w:t xml:space="preserve">RETURN </w:t>
+      </w:r>
+      <w:proofErr w:type="spellStart"/>
+      <w:r>
+        <w:rPr>
+          <w:rFonts w:ascii="Arial" w:hAnsi="Arial" w:cs="Arial"/>
+          <w:sz w:val="24"/>
+          <w:szCs w:val="24"/>
+          <w:lang w:val="en-US"/>
+        </w:rPr>
+        <w:t>projectedGPA</w:t>
+      </w:r>
+      <w:proofErr w:type="spellEnd"/>
     </w:p>
     <w:p>
       <w:pPr>
@@ -8832,17 +9280,51 @@
           <w:szCs w:val="24"/>
           <w:lang w:val="en-US"/>
         </w:rPr>
-        <w:t>FUNCTION CalculateDegreeProgress(</w:t>
-      </w:r>
-      <w:r>
-        <w:rPr>
-          <w:rFonts w:ascii="Arial" w:hAnsi="Arial" w:cs="Arial"/>
-          <w:sz w:val="24"/>
-          <w:szCs w:val="24"/>
-          <w:lang w:val="en-US"/>
-        </w:rPr>
-        <w:t xml:space="preserve">earnedCredits, </w:t>
-      </w:r>
+        <w:t xml:space="preserve">FUNCTION </w:t>
+      </w:r>
+      <w:proofErr w:type="spellStart"/>
+      <w:proofErr w:type="gramStart"/>
+      <w:r>
+        <w:rPr>
+          <w:rFonts w:ascii="Arial" w:hAnsi="Arial" w:cs="Arial"/>
+          <w:sz w:val="24"/>
+          <w:szCs w:val="24"/>
+          <w:lang w:val="en-US"/>
+        </w:rPr>
+        <w:t>CalculateDegreeProgress</w:t>
+      </w:r>
+      <w:proofErr w:type="spellEnd"/>
+      <w:r>
+        <w:rPr>
+          <w:rFonts w:ascii="Arial" w:hAnsi="Arial" w:cs="Arial"/>
+          <w:sz w:val="24"/>
+          <w:szCs w:val="24"/>
+          <w:lang w:val="en-US"/>
+        </w:rPr>
+        <w:t>(</w:t>
+      </w:r>
+      <w:proofErr w:type="spellStart"/>
+      <w:proofErr w:type="gramEnd"/>
+      <w:r>
+        <w:rPr>
+          <w:rFonts w:ascii="Arial" w:hAnsi="Arial" w:cs="Arial"/>
+          <w:sz w:val="24"/>
+          <w:szCs w:val="24"/>
+          <w:lang w:val="en-US"/>
+        </w:rPr>
+        <w:t>earnedCredits</w:t>
+      </w:r>
+      <w:proofErr w:type="spellEnd"/>
+      <w:r>
+        <w:rPr>
+          <w:rFonts w:ascii="Arial" w:hAnsi="Arial" w:cs="Arial"/>
+          <w:sz w:val="24"/>
+          <w:szCs w:val="24"/>
+          <w:lang w:val="en-US"/>
+        </w:rPr>
+        <w:t xml:space="preserve">, </w:t>
+      </w:r>
+      <w:proofErr w:type="spellStart"/>
       <w:r>
         <w:rPr>
           <w:rFonts w:ascii="Arial" w:hAnsi="Arial" w:cs="Arial"/>
@@ -8852,6 +9334,7 @@
         </w:rPr>
         <w:t>requiredCredits</w:t>
       </w:r>
+      <w:proofErr w:type="spellEnd"/>
       <w:r>
         <w:rPr>
           <w:rFonts w:ascii="Arial" w:hAnsi="Arial" w:cs="Arial"/>
@@ -8900,7 +9383,27 @@
           <w:szCs w:val="24"/>
           <w:lang w:val="en-US"/>
         </w:rPr>
-        <w:t>IF requiredCredits &lt;= 0</w:t>
+        <w:t xml:space="preserve">IF </w:t>
+      </w:r>
+      <w:proofErr w:type="spellStart"/>
+      <w:r>
+        <w:rPr>
+          <w:rFonts w:ascii="Arial" w:hAnsi="Arial" w:cs="Arial"/>
+          <w:sz w:val="24"/>
+          <w:szCs w:val="24"/>
+          <w:lang w:val="en-US"/>
+        </w:rPr>
+        <w:t>requiredCredits</w:t>
+      </w:r>
+      <w:proofErr w:type="spellEnd"/>
+      <w:r>
+        <w:rPr>
+          <w:rFonts w:ascii="Arial" w:hAnsi="Arial" w:cs="Arial"/>
+          <w:sz w:val="24"/>
+          <w:szCs w:val="24"/>
+          <w:lang w:val="en-US"/>
+        </w:rPr>
+        <w:t xml:space="preserve"> &lt;= 0</w:t>
       </w:r>
     </w:p>
     <w:p>
@@ -9009,6 +9512,7 @@
         </w:rPr>
         <w:t xml:space="preserve">ercentage = </w:t>
       </w:r>
+      <w:proofErr w:type="spellStart"/>
       <w:r>
         <w:rPr>
           <w:rFonts w:ascii="Arial" w:hAnsi="Arial" w:cs="Arial"/>
@@ -9018,14 +9522,35 @@
         </w:rPr>
         <w:t>earnedCredits</w:t>
       </w:r>
-      <w:r>
-        <w:rPr>
-          <w:rFonts w:ascii="Arial" w:hAnsi="Arial" w:cs="Arial"/>
-          <w:sz w:val="24"/>
-          <w:szCs w:val="24"/>
-          <w:lang w:val="en-US"/>
-        </w:rPr>
-        <w:t xml:space="preserve"> / requiredCredits * 100</w:t>
+      <w:proofErr w:type="spellEnd"/>
+      <w:r>
+        <w:rPr>
+          <w:rFonts w:ascii="Arial" w:hAnsi="Arial" w:cs="Arial"/>
+          <w:sz w:val="24"/>
+          <w:szCs w:val="24"/>
+          <w:lang w:val="en-US"/>
+        </w:rPr>
+        <w:t xml:space="preserve"> / </w:t>
+      </w:r>
+      <w:proofErr w:type="spellStart"/>
+      <w:r>
+        <w:rPr>
+          <w:rFonts w:ascii="Arial" w:hAnsi="Arial" w:cs="Arial"/>
+          <w:sz w:val="24"/>
+          <w:szCs w:val="24"/>
+          <w:lang w:val="en-US"/>
+        </w:rPr>
+        <w:t>requiredCredits</w:t>
+      </w:r>
+      <w:proofErr w:type="spellEnd"/>
+      <w:r>
+        <w:rPr>
+          <w:rFonts w:ascii="Arial" w:hAnsi="Arial" w:cs="Arial"/>
+          <w:sz w:val="24"/>
+          <w:szCs w:val="24"/>
+          <w:lang w:val="en-US"/>
+        </w:rPr>
+        <w:t xml:space="preserve"> * 100</w:t>
       </w:r>
     </w:p>
     <w:p>
@@ -9231,15 +9756,27 @@
         </w:rPr>
         <w:t xml:space="preserve">FUNCTION </w:t>
       </w:r>
-      <w:r>
-        <w:rPr>
-          <w:rFonts w:ascii="Arial" w:hAnsi="Arial" w:cs="Arial"/>
-          <w:sz w:val="24"/>
-          <w:szCs w:val="24"/>
-          <w:lang w:val="en-US"/>
-        </w:rPr>
-        <w:t>DeleteCourse(</w:t>
-      </w:r>
+      <w:proofErr w:type="spellStart"/>
+      <w:r>
+        <w:rPr>
+          <w:rFonts w:ascii="Arial" w:hAnsi="Arial" w:cs="Arial"/>
+          <w:sz w:val="24"/>
+          <w:szCs w:val="24"/>
+          <w:lang w:val="en-US"/>
+        </w:rPr>
+        <w:t>DeleteCourse</w:t>
+      </w:r>
+      <w:proofErr w:type="spellEnd"/>
+      <w:r>
+        <w:rPr>
+          <w:rFonts w:ascii="Arial" w:hAnsi="Arial" w:cs="Arial"/>
+          <w:sz w:val="24"/>
+          <w:szCs w:val="24"/>
+          <w:lang w:val="en-US"/>
+        </w:rPr>
+        <w:t>(</w:t>
+      </w:r>
+      <w:proofErr w:type="spellStart"/>
       <w:r>
         <w:rPr>
           <w:rFonts w:ascii="Arial" w:hAnsi="Arial" w:cs="Arial"/>
@@ -9249,6 +9786,7 @@
         </w:rPr>
         <w:t>courseId</w:t>
       </w:r>
+      <w:proofErr w:type="spellEnd"/>
       <w:r>
         <w:rPr>
           <w:rFonts w:ascii="Arial" w:hAnsi="Arial" w:cs="Arial"/>
@@ -9298,6 +9836,7 @@
         </w:rPr>
         <w:t xml:space="preserve">FIND course by </w:t>
       </w:r>
+      <w:proofErr w:type="spellStart"/>
       <w:r>
         <w:rPr>
           <w:rFonts w:ascii="Arial" w:hAnsi="Arial" w:cs="Arial"/>
@@ -9325,6 +9864,7 @@
         </w:rPr>
         <w:t>d</w:t>
       </w:r>
+      <w:proofErr w:type="spellEnd"/>
     </w:p>
     <w:p>
       <w:pPr>
@@ -11026,7 +11566,27 @@
           <w:szCs w:val="24"/>
           <w:lang w:val="en-US"/>
         </w:rPr>
-        <w:t xml:space="preserve"> the CourseService is responsible for</w:t>
+        <w:t xml:space="preserve"> the </w:t>
+      </w:r>
+      <w:proofErr w:type="spellStart"/>
+      <w:r>
+        <w:rPr>
+          <w:rFonts w:ascii="Arial" w:hAnsi="Arial" w:cs="Arial"/>
+          <w:sz w:val="24"/>
+          <w:szCs w:val="24"/>
+          <w:lang w:val="en-US"/>
+        </w:rPr>
+        <w:t>CourseService</w:t>
+      </w:r>
+      <w:proofErr w:type="spellEnd"/>
+      <w:r>
+        <w:rPr>
+          <w:rFonts w:ascii="Arial" w:hAnsi="Arial" w:cs="Arial"/>
+          <w:sz w:val="24"/>
+          <w:szCs w:val="24"/>
+          <w:lang w:val="en-US"/>
+        </w:rPr>
+        <w:t xml:space="preserve"> is responsible for</w:t>
       </w:r>
       <w:r>
         <w:rPr>
@@ -11080,8 +11640,19 @@
           <w:szCs w:val="24"/>
           <w:lang w:val="en-US"/>
         </w:rPr>
-        <w:t xml:space="preserve"> the Courses and AddCourse</w:t>
-      </w:r>
+        <w:t xml:space="preserve"> the Courses and </w:t>
+      </w:r>
+      <w:proofErr w:type="spellStart"/>
+      <w:r>
+        <w:rPr>
+          <w:rFonts w:ascii="Arial" w:hAnsi="Arial" w:cs="Arial"/>
+          <w:sz w:val="24"/>
+          <w:szCs w:val="24"/>
+          <w:lang w:val="en-US"/>
+        </w:rPr>
+        <w:t>AddCourse</w:t>
+      </w:r>
+      <w:proofErr w:type="spellEnd"/>
       <w:r>
         <w:rPr>
           <w:rFonts w:ascii="Arial" w:hAnsi="Arial" w:cs="Arial"/>
@@ -11475,7 +12046,27 @@
           <w:szCs w:val="24"/>
           <w:lang w:val="en-US"/>
         </w:rPr>
-        <w:t>The AcademicDbContext class</w:t>
+        <w:t xml:space="preserve">The </w:t>
+      </w:r>
+      <w:proofErr w:type="spellStart"/>
+      <w:r>
+        <w:rPr>
+          <w:rFonts w:ascii="Arial" w:hAnsi="Arial" w:cs="Arial"/>
+          <w:sz w:val="24"/>
+          <w:szCs w:val="24"/>
+          <w:lang w:val="en-US"/>
+        </w:rPr>
+        <w:t>AcademicDbContext</w:t>
+      </w:r>
+      <w:proofErr w:type="spellEnd"/>
+      <w:r>
+        <w:rPr>
+          <w:rFonts w:ascii="Arial" w:hAnsi="Arial" w:cs="Arial"/>
+          <w:sz w:val="24"/>
+          <w:szCs w:val="24"/>
+          <w:lang w:val="en-US"/>
+        </w:rPr>
+        <w:t xml:space="preserve"> class</w:t>
       </w:r>
       <w:r>
         <w:rPr>
@@ -11859,8 +12450,13 @@
           <w:lang w:val="en-US"/>
         </w:rPr>
       </w:pPr>
-      <w:r>
-        <w:t xml:space="preserve">Figure </w:t>
+      <w:proofErr w:type="spellStart"/>
+      <w:r>
+        <w:t>Figure</w:t>
+      </w:r>
+      <w:proofErr w:type="spellEnd"/>
+      <w:r>
+        <w:t xml:space="preserve"> </w:t>
       </w:r>
       <w:fldSimple w:instr=" SEQ Figure \* ARABIC ">
         <w:r>
@@ -12049,7 +12645,27 @@
           <w:szCs w:val="24"/>
           <w:lang w:val="en-US"/>
         </w:rPr>
-        <w:t xml:space="preserve"> the SemesterId foreign key</w:t>
+        <w:t xml:space="preserve"> the </w:t>
+      </w:r>
+      <w:proofErr w:type="spellStart"/>
+      <w:r>
+        <w:rPr>
+          <w:rFonts w:ascii="Arial" w:hAnsi="Arial" w:cs="Arial"/>
+          <w:sz w:val="24"/>
+          <w:szCs w:val="24"/>
+          <w:lang w:val="en-US"/>
+        </w:rPr>
+        <w:t>SemesterId</w:t>
+      </w:r>
+      <w:proofErr w:type="spellEnd"/>
+      <w:r>
+        <w:rPr>
+          <w:rFonts w:ascii="Arial" w:hAnsi="Arial" w:cs="Arial"/>
+          <w:sz w:val="24"/>
+          <w:szCs w:val="24"/>
+          <w:lang w:val="en-US"/>
+        </w:rPr>
+        <w:t xml:space="preserve"> foreign key</w:t>
       </w:r>
       <w:r>
         <w:rPr>
@@ -13137,8 +13753,13 @@
       <w:pPr>
         <w:pStyle w:val="Caption"/>
       </w:pPr>
-      <w:r>
-        <w:t xml:space="preserve">Figure </w:t>
+      <w:proofErr w:type="spellStart"/>
+      <w:r>
+        <w:t>Figure</w:t>
+      </w:r>
+      <w:proofErr w:type="spellEnd"/>
+      <w:r>
+        <w:t xml:space="preserve"> </w:t>
       </w:r>
       <w:fldSimple w:instr=" SEQ Figure \* ARABIC ">
         <w:r>
@@ -13232,7 +13853,21 @@
         <w:rPr>
           <w:lang w:val="en-US"/>
         </w:rPr>
-        <w:t xml:space="preserve"> The SemesterId property</w:t>
+        <w:t xml:space="preserve"> The </w:t>
+      </w:r>
+      <w:proofErr w:type="spellStart"/>
+      <w:r>
+        <w:rPr>
+          <w:lang w:val="en-US"/>
+        </w:rPr>
+        <w:t>SemesterId</w:t>
+      </w:r>
+      <w:proofErr w:type="spellEnd"/>
+      <w:r>
+        <w:rPr>
+          <w:lang w:val="en-US"/>
+        </w:rPr>
+        <w:t xml:space="preserve"> property</w:t>
       </w:r>
       <w:r>
         <w:rPr>
@@ -13366,7 +14001,21 @@
         <w:rPr>
           <w:lang w:val="en-US"/>
         </w:rPr>
-        <w:t xml:space="preserve"> AcademicDbContext.</w:t>
+        <w:t xml:space="preserve"> </w:t>
+      </w:r>
+      <w:proofErr w:type="spellStart"/>
+      <w:r>
+        <w:rPr>
+          <w:lang w:val="en-US"/>
+        </w:rPr>
+        <w:t>AcademicDbContext</w:t>
+      </w:r>
+      <w:proofErr w:type="spellEnd"/>
+      <w:r>
+        <w:rPr>
+          <w:lang w:val="en-US"/>
+        </w:rPr>
+        <w:t>.</w:t>
       </w:r>
       <w:r>
         <w:rPr>
@@ -13726,7 +14375,21 @@
         <w:rPr>
           <w:lang w:val="en-US"/>
         </w:rPr>
-        <w:t xml:space="preserve"> the GPA calculation</w:t>
+        <w:t xml:space="preserve"> </w:t>
+      </w:r>
+      <w:proofErr w:type="gramStart"/>
+      <w:r>
+        <w:rPr>
+          <w:lang w:val="en-US"/>
+        </w:rPr>
+        <w:t>the GPA</w:t>
+      </w:r>
+      <w:proofErr w:type="gramEnd"/>
+      <w:r>
+        <w:rPr>
+          <w:lang w:val="en-US"/>
+        </w:rPr>
+        <w:t xml:space="preserve"> calculation</w:t>
       </w:r>
       <w:r>
         <w:rPr>
@@ -13834,13 +14497,41 @@
         <w:rPr>
           <w:lang w:val="en-US"/>
         </w:rPr>
-        <w:t xml:space="preserve"> of the corresponding course</w:t>
-      </w:r>
-      <w:r>
-        <w:rPr>
-          <w:lang w:val="en-US"/>
-        </w:rPr>
-        <w:t xml:space="preserve"> in order to obtain</w:t>
+        <w:t xml:space="preserve"> </w:t>
+      </w:r>
+      <w:proofErr w:type="gramStart"/>
+      <w:r>
+        <w:rPr>
+          <w:lang w:val="en-US"/>
+        </w:rPr>
+        <w:t>of</w:t>
+      </w:r>
+      <w:proofErr w:type="gramEnd"/>
+      <w:r>
+        <w:rPr>
+          <w:lang w:val="en-US"/>
+        </w:rPr>
+        <w:t xml:space="preserve"> the corresponding course</w:t>
+      </w:r>
+      <w:r>
+        <w:rPr>
+          <w:lang w:val="en-US"/>
+        </w:rPr>
+        <w:t xml:space="preserve"> </w:t>
+      </w:r>
+      <w:proofErr w:type="gramStart"/>
+      <w:r>
+        <w:rPr>
+          <w:lang w:val="en-US"/>
+        </w:rPr>
+        <w:t>in order to</w:t>
+      </w:r>
+      <w:proofErr w:type="gramEnd"/>
+      <w:r>
+        <w:rPr>
+          <w:lang w:val="en-US"/>
+        </w:rPr>
+        <w:t xml:space="preserve"> obtain</w:t>
       </w:r>
       <w:r>
         <w:rPr>
@@ -14216,7 +14907,21 @@
         <w:rPr>
           <w:lang w:val="en-US"/>
         </w:rPr>
-        <w:t xml:space="preserve"> GpaCalculator service.</w:t>
+        <w:t xml:space="preserve"> </w:t>
+      </w:r>
+      <w:proofErr w:type="spellStart"/>
+      <w:r>
+        <w:rPr>
+          <w:lang w:val="en-US"/>
+        </w:rPr>
+        <w:t>GpaCalculator</w:t>
+      </w:r>
+      <w:proofErr w:type="spellEnd"/>
+      <w:r>
+        <w:rPr>
+          <w:lang w:val="en-US"/>
+        </w:rPr>
+        <w:t xml:space="preserve"> service.</w:t>
       </w:r>
       <w:r>
         <w:rPr>
@@ -14441,7 +15146,21 @@
         <w:rPr>
           <w:lang w:val="en-US"/>
         </w:rPr>
-        <w:t>, the method returns a GPA</w:t>
+        <w:t xml:space="preserve">, the method </w:t>
+      </w:r>
+      <w:proofErr w:type="gramStart"/>
+      <w:r>
+        <w:rPr>
+          <w:lang w:val="en-US"/>
+        </w:rPr>
+        <w:t>returns</w:t>
+      </w:r>
+      <w:proofErr w:type="gramEnd"/>
+      <w:r>
+        <w:rPr>
+          <w:lang w:val="en-US"/>
+        </w:rPr>
+        <w:t xml:space="preserve"> a GPA</w:t>
       </w:r>
       <w:r>
         <w:rPr>
@@ -14569,7 +15288,21 @@
         <w:rPr>
           <w:lang w:val="en-US"/>
         </w:rPr>
-        <w:t>, or O(1)</w:t>
+        <w:t xml:space="preserve">, or </w:t>
+      </w:r>
+      <w:proofErr w:type="gramStart"/>
+      <w:r>
+        <w:rPr>
+          <w:lang w:val="en-US"/>
+        </w:rPr>
+        <w:t>O(</w:t>
+      </w:r>
+      <w:proofErr w:type="gramEnd"/>
+      <w:r>
+        <w:rPr>
+          <w:lang w:val="en-US"/>
+        </w:rPr>
+        <w:t>1)</w:t>
       </w:r>
       <w:r>
         <w:rPr>
@@ -15043,7 +15776,21 @@
         <w:rPr>
           <w:lang w:val="en-US"/>
         </w:rPr>
-        <w:t xml:space="preserve"> Because the hypothetical courses</w:t>
+        <w:t xml:space="preserve"> Because </w:t>
+      </w:r>
+      <w:proofErr w:type="gramStart"/>
+      <w:r>
+        <w:rPr>
+          <w:lang w:val="en-US"/>
+        </w:rPr>
+        <w:t>the hypothetical</w:t>
+      </w:r>
+      <w:proofErr w:type="gramEnd"/>
+      <w:r>
+        <w:rPr>
+          <w:lang w:val="en-US"/>
+        </w:rPr>
+        <w:t xml:space="preserve"> courses</w:t>
       </w:r>
       <w:r>
         <w:rPr>
@@ -15819,7 +16566,21 @@
         <w:rPr>
           <w:lang w:val="en-US"/>
         </w:rPr>
-        <w:t xml:space="preserve"> is performed through</w:t>
+        <w:t xml:space="preserve"> </w:t>
+      </w:r>
+      <w:proofErr w:type="gramStart"/>
+      <w:r>
+        <w:rPr>
+          <w:lang w:val="en-US"/>
+        </w:rPr>
+        <w:t>is</w:t>
+      </w:r>
+      <w:proofErr w:type="gramEnd"/>
+      <w:r>
+        <w:rPr>
+          <w:lang w:val="en-US"/>
+        </w:rPr>
+        <w:t xml:space="preserve"> performed through</w:t>
       </w:r>
       <w:r>
         <w:rPr>
@@ -16538,8 +17299,16 @@
         <w:rPr>
           <w:lang w:val="en-US"/>
         </w:rPr>
-        <w:t xml:space="preserve"> a course in order to</w:t>
-      </w:r>
+        <w:t xml:space="preserve"> a course </w:t>
+      </w:r>
+      <w:proofErr w:type="gramStart"/>
+      <w:r>
+        <w:rPr>
+          <w:lang w:val="en-US"/>
+        </w:rPr>
+        <w:t>in order to</w:t>
+      </w:r>
+      <w:proofErr w:type="gramEnd"/>
       <w:r>
         <w:rPr>
           <w:lang w:val="en-US"/>
@@ -16841,6 +17610,235 @@
         </w:rPr>
         <w:t xml:space="preserve"> Although the user interface</w:t>
       </w:r>
+      <w:r>
+        <w:rPr>
+          <w:lang w:val="en-US"/>
+        </w:rPr>
+        <w:t xml:space="preserve"> is accessed through a web</w:t>
+      </w:r>
+      <w:r>
+        <w:rPr>
+          <w:lang w:val="en-US"/>
+        </w:rPr>
+        <w:t xml:space="preserve"> browser,</w:t>
+      </w:r>
+      <w:r>
+        <w:rPr>
+          <w:lang w:val="en-US"/>
+        </w:rPr>
+        <w:t xml:space="preserve"> the program does not</w:t>
+      </w:r>
+      <w:r>
+        <w:rPr>
+          <w:lang w:val="en-US"/>
+        </w:rPr>
+        <w:t xml:space="preserve"> require a remote</w:t>
+      </w:r>
+      <w:r>
+        <w:rPr>
+          <w:lang w:val="en-US"/>
+        </w:rPr>
+        <w:t xml:space="preserve"> database server</w:t>
+      </w:r>
+      <w:r>
+        <w:rPr>
+          <w:lang w:val="en-US"/>
+        </w:rPr>
+        <w:t xml:space="preserve"> or external cloud infrastructure</w:t>
+      </w:r>
+      <w:r>
+        <w:rPr>
+          <w:lang w:val="en-US"/>
+        </w:rPr>
+        <w:t>.</w:t>
+      </w:r>
+    </w:p>
+    <w:p>
+      <w:pPr>
+        <w:rPr>
+          <w:lang w:val="en-US"/>
+        </w:rPr>
+      </w:pPr>
+    </w:p>
+    <w:p>
+      <w:pPr>
+        <w:rPr>
+          <w:lang w:val="en-US"/>
+        </w:rPr>
+      </w:pPr>
+      <w:r>
+        <w:rPr>
+          <w:lang w:val="en-US"/>
+        </w:rPr>
+        <w:t>The program consists of</w:t>
+      </w:r>
+      <w:r>
+        <w:rPr>
+          <w:lang w:val="en-US"/>
+        </w:rPr>
+        <w:t xml:space="preserve"> several software elements</w:t>
+      </w:r>
+      <w:r>
+        <w:rPr>
+          <w:lang w:val="en-US"/>
+        </w:rPr>
+        <w:t xml:space="preserve"> running on the user’s computer</w:t>
+      </w:r>
+      <w:r>
+        <w:rPr>
+          <w:lang w:val="en-US"/>
+        </w:rPr>
+        <w:t>.</w:t>
+      </w:r>
+      <w:r>
+        <w:rPr>
+          <w:lang w:val="en-US"/>
+        </w:rPr>
+        <w:t xml:space="preserve"> The browser displays</w:t>
+      </w:r>
+      <w:r>
+        <w:rPr>
+          <w:lang w:val="en-US"/>
+        </w:rPr>
+        <w:t xml:space="preserve"> the Blazor user interface</w:t>
+      </w:r>
+      <w:r>
+        <w:rPr>
+          <w:lang w:val="en-US"/>
+        </w:rPr>
+        <w:t xml:space="preserve"> and communicates</w:t>
+      </w:r>
+      <w:r>
+        <w:rPr>
+          <w:lang w:val="en-US"/>
+        </w:rPr>
+        <w:t xml:space="preserve"> with the ASP.NET</w:t>
+      </w:r>
+      <w:r>
+        <w:rPr>
+          <w:lang w:val="en-US"/>
+        </w:rPr>
+        <w:t xml:space="preserve"> Core</w:t>
+      </w:r>
+      <w:r>
+        <w:rPr>
+          <w:lang w:val="en-US"/>
+        </w:rPr>
+        <w:t xml:space="preserve"> application.</w:t>
+      </w:r>
+      <w:r>
+        <w:rPr>
+          <w:lang w:val="en-US"/>
+        </w:rPr>
+        <w:t xml:space="preserve"> The</w:t>
+      </w:r>
+      <w:r>
+        <w:rPr>
+          <w:lang w:val="en-US"/>
+        </w:rPr>
+        <w:t xml:space="preserve"> program</w:t>
+      </w:r>
+      <w:r>
+        <w:rPr>
+          <w:lang w:val="en-US"/>
+        </w:rPr>
+        <w:t xml:space="preserve"> executes </w:t>
+      </w:r>
+      <w:proofErr w:type="gramStart"/>
+      <w:r>
+        <w:rPr>
+          <w:lang w:val="en-US"/>
+        </w:rPr>
+        <w:t>the business</w:t>
+      </w:r>
+      <w:proofErr w:type="gramEnd"/>
+      <w:r>
+        <w:rPr>
+          <w:lang w:val="en-US"/>
+        </w:rPr>
+        <w:t xml:space="preserve"> logic</w:t>
+      </w:r>
+      <w:r>
+        <w:rPr>
+          <w:lang w:val="en-US"/>
+        </w:rPr>
+        <w:t xml:space="preserve"> and uses </w:t>
+      </w:r>
+      <w:r>
+        <w:rPr>
+          <w:lang w:val="en-US"/>
+        </w:rPr>
+        <w:t>E</w:t>
+      </w:r>
+      <w:r>
+        <w:rPr>
+          <w:lang w:val="en-US"/>
+        </w:rPr>
+        <w:t>ntity</w:t>
+      </w:r>
+      <w:r>
+        <w:rPr>
+          <w:lang w:val="en-US"/>
+        </w:rPr>
+        <w:t xml:space="preserve"> Framework Core</w:t>
+      </w:r>
+      <w:r>
+        <w:rPr>
+          <w:lang w:val="en-US"/>
+        </w:rPr>
+        <w:t xml:space="preserve"> to access the local</w:t>
+      </w:r>
+      <w:r>
+        <w:rPr>
+          <w:lang w:val="en-US"/>
+        </w:rPr>
+        <w:t xml:space="preserve"> SQLite</w:t>
+      </w:r>
+      <w:r>
+        <w:rPr>
+          <w:lang w:val="en-US"/>
+        </w:rPr>
+        <w:t xml:space="preserve"> database.</w:t>
+      </w:r>
+    </w:p>
+    <w:p>
+      <w:pPr>
+        <w:rPr>
+          <w:lang w:val="en-US"/>
+        </w:rPr>
+      </w:pPr>
+    </w:p>
+    <w:p>
+      <w:pPr>
+        <w:rPr>
+          <w:lang w:val="en-US"/>
+        </w:rPr>
+      </w:pPr>
+      <w:r>
+        <w:rPr>
+          <w:lang w:val="en-US"/>
+        </w:rPr>
+        <w:t>The deployment structure</w:t>
+      </w:r>
+      <w:r>
+        <w:rPr>
+          <w:lang w:val="en-US"/>
+        </w:rPr>
+        <w:t xml:space="preserve"> can therefore be</w:t>
+      </w:r>
+      <w:r>
+        <w:rPr>
+          <w:lang w:val="en-US"/>
+        </w:rPr>
+        <w:t xml:space="preserve"> represented as follows:</w:t>
+      </w:r>
+    </w:p>
+    <w:p>
+      <w:pPr>
+        <w:rPr>
+          <w:lang w:val="en-US"/>
+        </w:rPr>
+      </w:pPr>
     </w:p>
     <w:sectPr>
       <w:footerReference w:type="default" r:id="rId9"/>

</xml_diff>

<commit_message>
Finished with the sixth part of the third part of my thesis.
</commit_message>
<xml_diff>
--- a/Project Thesis.docx
+++ b/Project Thesis.docx
@@ -6061,8 +6061,19 @@
           <w:lang w:val="en-US"/>
         </w:rPr>
         <w:lastRenderedPageBreak/>
-        <w:t>FUNCTION AddCourse</w:t>
-      </w:r>
+        <w:t xml:space="preserve">FUNCTION </w:t>
+      </w:r>
+      <w:proofErr w:type="spellStart"/>
+      <w:r>
+        <w:rPr>
+          <w:rFonts w:ascii="Arial" w:hAnsi="Arial" w:cs="Arial"/>
+          <w:sz w:val="24"/>
+          <w:szCs w:val="24"/>
+          <w:lang w:val="en-US"/>
+        </w:rPr>
+        <w:t>AddCourse</w:t>
+      </w:r>
+      <w:proofErr w:type="spellEnd"/>
     </w:p>
     <w:p>
       <w:pPr>
@@ -7116,14 +7127,25 @@
         </w:rPr>
         <w:t xml:space="preserve">FUNCTION </w:t>
       </w:r>
-      <w:r>
-        <w:rPr>
-          <w:rFonts w:ascii="Arial" w:hAnsi="Arial" w:cs="Arial"/>
-          <w:sz w:val="24"/>
-          <w:szCs w:val="24"/>
-          <w:lang w:val="en-US"/>
-        </w:rPr>
-        <w:t>CalculateGPA(courses)</w:t>
+      <w:proofErr w:type="spellStart"/>
+      <w:r>
+        <w:rPr>
+          <w:rFonts w:ascii="Arial" w:hAnsi="Arial" w:cs="Arial"/>
+          <w:sz w:val="24"/>
+          <w:szCs w:val="24"/>
+          <w:lang w:val="en-US"/>
+        </w:rPr>
+        <w:t>CalculateGPA</w:t>
+      </w:r>
+      <w:proofErr w:type="spellEnd"/>
+      <w:r>
+        <w:rPr>
+          <w:rFonts w:ascii="Arial" w:hAnsi="Arial" w:cs="Arial"/>
+          <w:sz w:val="24"/>
+          <w:szCs w:val="24"/>
+          <w:lang w:val="en-US"/>
+        </w:rPr>
+        <w:t>(courses)</w:t>
       </w:r>
     </w:p>
     <w:p>
@@ -7156,14 +7178,25 @@
         </w:rPr>
         <w:t xml:space="preserve">   </w:t>
       </w:r>
-      <w:r>
-        <w:rPr>
-          <w:rFonts w:ascii="Arial" w:hAnsi="Arial" w:cs="Arial"/>
-          <w:sz w:val="24"/>
-          <w:szCs w:val="24"/>
-          <w:lang w:val="en-US"/>
-        </w:rPr>
-        <w:t>totalQualityPoints = 0</w:t>
+      <w:proofErr w:type="spellStart"/>
+      <w:r>
+        <w:rPr>
+          <w:rFonts w:ascii="Arial" w:hAnsi="Arial" w:cs="Arial"/>
+          <w:sz w:val="24"/>
+          <w:szCs w:val="24"/>
+          <w:lang w:val="en-US"/>
+        </w:rPr>
+        <w:t>totalQualityPoints</w:t>
+      </w:r>
+      <w:proofErr w:type="spellEnd"/>
+      <w:r>
+        <w:rPr>
+          <w:rFonts w:ascii="Arial" w:hAnsi="Arial" w:cs="Arial"/>
+          <w:sz w:val="24"/>
+          <w:szCs w:val="24"/>
+          <w:lang w:val="en-US"/>
+        </w:rPr>
+        <w:t xml:space="preserve"> = 0</w:t>
       </w:r>
     </w:p>
     <w:p>
@@ -7186,14 +7219,25 @@
         <w:lastRenderedPageBreak/>
         <w:t xml:space="preserve">   </w:t>
       </w:r>
-      <w:r>
-        <w:rPr>
-          <w:rFonts w:ascii="Arial" w:hAnsi="Arial" w:cs="Arial"/>
-          <w:sz w:val="24"/>
-          <w:szCs w:val="24"/>
-          <w:lang w:val="en-US"/>
-        </w:rPr>
-        <w:t>attemptedCredits = 0</w:t>
+      <w:proofErr w:type="spellStart"/>
+      <w:r>
+        <w:rPr>
+          <w:rFonts w:ascii="Arial" w:hAnsi="Arial" w:cs="Arial"/>
+          <w:sz w:val="24"/>
+          <w:szCs w:val="24"/>
+          <w:lang w:val="en-US"/>
+        </w:rPr>
+        <w:t>attemptedCredits</w:t>
+      </w:r>
+      <w:proofErr w:type="spellEnd"/>
+      <w:r>
+        <w:rPr>
+          <w:rFonts w:ascii="Arial" w:hAnsi="Arial" w:cs="Arial"/>
+          <w:sz w:val="24"/>
+          <w:szCs w:val="24"/>
+          <w:lang w:val="en-US"/>
+        </w:rPr>
+        <w:t xml:space="preserve"> = 0</w:t>
       </w:r>
     </w:p>
     <w:p>
@@ -7284,6 +7328,7 @@
         </w:rPr>
         <w:t xml:space="preserve">      </w:t>
       </w:r>
+      <w:proofErr w:type="spellStart"/>
       <w:r>
         <w:rPr>
           <w:rFonts w:ascii="Arial" w:hAnsi="Arial" w:cs="Arial"/>
@@ -7293,15 +7338,38 @@
         </w:rPr>
         <w:t>gradePoints</w:t>
       </w:r>
-      <w:r>
-        <w:rPr>
-          <w:rFonts w:ascii="Arial" w:hAnsi="Arial" w:cs="Arial"/>
-          <w:sz w:val="24"/>
-          <w:szCs w:val="24"/>
-          <w:lang w:val="en-US"/>
-        </w:rPr>
-        <w:t xml:space="preserve"> = ConvertGradeToPoints(</w:t>
-      </w:r>
+      <w:proofErr w:type="spellEnd"/>
+      <w:r>
+        <w:rPr>
+          <w:rFonts w:ascii="Arial" w:hAnsi="Arial" w:cs="Arial"/>
+          <w:sz w:val="24"/>
+          <w:szCs w:val="24"/>
+          <w:lang w:val="en-US"/>
+        </w:rPr>
+        <w:t xml:space="preserve"> = </w:t>
+      </w:r>
+      <w:proofErr w:type="spellStart"/>
+      <w:r>
+        <w:rPr>
+          <w:rFonts w:ascii="Arial" w:hAnsi="Arial" w:cs="Arial"/>
+          <w:sz w:val="24"/>
+          <w:szCs w:val="24"/>
+          <w:lang w:val="en-US"/>
+        </w:rPr>
+        <w:t>ConvertGradeToPoints</w:t>
+      </w:r>
+      <w:proofErr w:type="spellEnd"/>
+      <w:r>
+        <w:rPr>
+          <w:rFonts w:ascii="Arial" w:hAnsi="Arial" w:cs="Arial"/>
+          <w:sz w:val="24"/>
+          <w:szCs w:val="24"/>
+          <w:lang w:val="en-US"/>
+        </w:rPr>
+        <w:t>(</w:t>
+      </w:r>
+      <w:proofErr w:type="spellStart"/>
+      <w:proofErr w:type="gramStart"/>
       <w:r>
         <w:rPr>
           <w:rFonts w:ascii="Arial" w:hAnsi="Arial" w:cs="Arial"/>
@@ -7311,6 +7379,8 @@
         </w:rPr>
         <w:t>course.grade</w:t>
       </w:r>
+      <w:proofErr w:type="spellEnd"/>
+      <w:proofErr w:type="gramEnd"/>
       <w:r>
         <w:rPr>
           <w:rFonts w:ascii="Arial" w:hAnsi="Arial" w:cs="Arial"/>
@@ -7349,26 +7419,59 @@
           <w:szCs w:val="24"/>
           <w:lang w:val="en-US"/>
         </w:rPr>
-        <w:t xml:space="preserve">      totalQualityPoints</w:t>
-      </w:r>
-      <w:r>
-        <w:rPr>
-          <w:rFonts w:ascii="Arial" w:hAnsi="Arial" w:cs="Arial"/>
-          <w:sz w:val="24"/>
-          <w:szCs w:val="24"/>
-          <w:lang w:val="en-US"/>
-        </w:rPr>
-        <w:t xml:space="preserve"> = totalQualityPoints</w:t>
-      </w:r>
-      <w:r>
-        <w:rPr>
-          <w:rFonts w:ascii="Arial" w:hAnsi="Arial" w:cs="Arial"/>
-          <w:sz w:val="24"/>
-          <w:szCs w:val="24"/>
-          <w:lang w:val="en-US"/>
-        </w:rPr>
-        <w:t xml:space="preserve"> + gradePoints</w:t>
-      </w:r>
+        <w:t xml:space="preserve">      </w:t>
+      </w:r>
+      <w:proofErr w:type="spellStart"/>
+      <w:r>
+        <w:rPr>
+          <w:rFonts w:ascii="Arial" w:hAnsi="Arial" w:cs="Arial"/>
+          <w:sz w:val="24"/>
+          <w:szCs w:val="24"/>
+          <w:lang w:val="en-US"/>
+        </w:rPr>
+        <w:t>totalQualityPoints</w:t>
+      </w:r>
+      <w:proofErr w:type="spellEnd"/>
+      <w:r>
+        <w:rPr>
+          <w:rFonts w:ascii="Arial" w:hAnsi="Arial" w:cs="Arial"/>
+          <w:sz w:val="24"/>
+          <w:szCs w:val="24"/>
+          <w:lang w:val="en-US"/>
+        </w:rPr>
+        <w:t xml:space="preserve"> = </w:t>
+      </w:r>
+      <w:proofErr w:type="spellStart"/>
+      <w:r>
+        <w:rPr>
+          <w:rFonts w:ascii="Arial" w:hAnsi="Arial" w:cs="Arial"/>
+          <w:sz w:val="24"/>
+          <w:szCs w:val="24"/>
+          <w:lang w:val="en-US"/>
+        </w:rPr>
+        <w:t>totalQualityPoints</w:t>
+      </w:r>
+      <w:proofErr w:type="spellEnd"/>
+      <w:r>
+        <w:rPr>
+          <w:rFonts w:ascii="Arial" w:hAnsi="Arial" w:cs="Arial"/>
+          <w:sz w:val="24"/>
+          <w:szCs w:val="24"/>
+          <w:lang w:val="en-US"/>
+        </w:rPr>
+        <w:t xml:space="preserve"> + </w:t>
+      </w:r>
+      <w:proofErr w:type="spellStart"/>
+      <w:r>
+        <w:rPr>
+          <w:rFonts w:ascii="Arial" w:hAnsi="Arial" w:cs="Arial"/>
+          <w:sz w:val="24"/>
+          <w:szCs w:val="24"/>
+          <w:lang w:val="en-US"/>
+        </w:rPr>
+        <w:t>gradePoints</w:t>
+      </w:r>
+      <w:proofErr w:type="spellEnd"/>
       <w:r>
         <w:rPr>
           <w:rFonts w:ascii="Arial" w:hAnsi="Arial" w:cs="Arial"/>
@@ -7378,6 +7481,8 @@
         </w:rPr>
         <w:t xml:space="preserve"> * </w:t>
       </w:r>
+      <w:proofErr w:type="spellStart"/>
+      <w:proofErr w:type="gramStart"/>
       <w:r>
         <w:rPr>
           <w:rFonts w:ascii="Arial" w:hAnsi="Arial" w:cs="Arial"/>
@@ -7387,55 +7492,92 @@
         </w:rPr>
         <w:t>course.credits</w:t>
       </w:r>
-    </w:p>
-    <w:p>
-      <w:pPr>
-        <w:spacing w:line="360" w:lineRule="auto"/>
-        <w:rPr>
-          <w:rFonts w:ascii="Arial" w:hAnsi="Arial" w:cs="Arial"/>
-          <w:sz w:val="24"/>
-          <w:szCs w:val="24"/>
-          <w:lang w:val="en-US"/>
-        </w:rPr>
-      </w:pPr>
-    </w:p>
-    <w:p>
-      <w:pPr>
-        <w:spacing w:line="360" w:lineRule="auto"/>
-        <w:rPr>
-          <w:rFonts w:ascii="Arial" w:hAnsi="Arial" w:cs="Arial"/>
-          <w:sz w:val="24"/>
-          <w:szCs w:val="24"/>
-          <w:lang w:val="en-US"/>
-        </w:rPr>
-      </w:pPr>
-      <w:r>
-        <w:rPr>
-          <w:rFonts w:ascii="Arial" w:hAnsi="Arial" w:cs="Arial"/>
-          <w:sz w:val="24"/>
-          <w:szCs w:val="24"/>
-          <w:lang w:val="en-US"/>
-        </w:rPr>
-        <w:t xml:space="preserve">      attemptedCredits</w:t>
-      </w:r>
-      <w:r>
-        <w:rPr>
-          <w:rFonts w:ascii="Arial" w:hAnsi="Arial" w:cs="Arial"/>
-          <w:sz w:val="24"/>
-          <w:szCs w:val="24"/>
-          <w:lang w:val="en-US"/>
-        </w:rPr>
-        <w:t xml:space="preserve"> = attemptedCredits</w:t>
-      </w:r>
-      <w:r>
-        <w:rPr>
-          <w:rFonts w:ascii="Arial" w:hAnsi="Arial" w:cs="Arial"/>
-          <w:sz w:val="24"/>
-          <w:szCs w:val="24"/>
-          <w:lang w:val="en-US"/>
-        </w:rPr>
-        <w:t xml:space="preserve"> + course.credits</w:t>
-      </w:r>
+      <w:proofErr w:type="spellEnd"/>
+      <w:proofErr w:type="gramEnd"/>
+    </w:p>
+    <w:p>
+      <w:pPr>
+        <w:spacing w:line="360" w:lineRule="auto"/>
+        <w:rPr>
+          <w:rFonts w:ascii="Arial" w:hAnsi="Arial" w:cs="Arial"/>
+          <w:sz w:val="24"/>
+          <w:szCs w:val="24"/>
+          <w:lang w:val="en-US"/>
+        </w:rPr>
+      </w:pPr>
+    </w:p>
+    <w:p>
+      <w:pPr>
+        <w:spacing w:line="360" w:lineRule="auto"/>
+        <w:rPr>
+          <w:rFonts w:ascii="Arial" w:hAnsi="Arial" w:cs="Arial"/>
+          <w:sz w:val="24"/>
+          <w:szCs w:val="24"/>
+          <w:lang w:val="en-US"/>
+        </w:rPr>
+      </w:pPr>
+      <w:r>
+        <w:rPr>
+          <w:rFonts w:ascii="Arial" w:hAnsi="Arial" w:cs="Arial"/>
+          <w:sz w:val="24"/>
+          <w:szCs w:val="24"/>
+          <w:lang w:val="en-US"/>
+        </w:rPr>
+        <w:t xml:space="preserve">      </w:t>
+      </w:r>
+      <w:proofErr w:type="spellStart"/>
+      <w:r>
+        <w:rPr>
+          <w:rFonts w:ascii="Arial" w:hAnsi="Arial" w:cs="Arial"/>
+          <w:sz w:val="24"/>
+          <w:szCs w:val="24"/>
+          <w:lang w:val="en-US"/>
+        </w:rPr>
+        <w:t>attemptedCredits</w:t>
+      </w:r>
+      <w:proofErr w:type="spellEnd"/>
+      <w:r>
+        <w:rPr>
+          <w:rFonts w:ascii="Arial" w:hAnsi="Arial" w:cs="Arial"/>
+          <w:sz w:val="24"/>
+          <w:szCs w:val="24"/>
+          <w:lang w:val="en-US"/>
+        </w:rPr>
+        <w:t xml:space="preserve"> = </w:t>
+      </w:r>
+      <w:proofErr w:type="spellStart"/>
+      <w:r>
+        <w:rPr>
+          <w:rFonts w:ascii="Arial" w:hAnsi="Arial" w:cs="Arial"/>
+          <w:sz w:val="24"/>
+          <w:szCs w:val="24"/>
+          <w:lang w:val="en-US"/>
+        </w:rPr>
+        <w:t>attemptedCredits</w:t>
+      </w:r>
+      <w:proofErr w:type="spellEnd"/>
+      <w:r>
+        <w:rPr>
+          <w:rFonts w:ascii="Arial" w:hAnsi="Arial" w:cs="Arial"/>
+          <w:sz w:val="24"/>
+          <w:szCs w:val="24"/>
+          <w:lang w:val="en-US"/>
+        </w:rPr>
+        <w:t xml:space="preserve"> + </w:t>
+      </w:r>
+      <w:proofErr w:type="spellStart"/>
+      <w:proofErr w:type="gramStart"/>
+      <w:r>
+        <w:rPr>
+          <w:rFonts w:ascii="Arial" w:hAnsi="Arial" w:cs="Arial"/>
+          <w:sz w:val="24"/>
+          <w:szCs w:val="24"/>
+          <w:lang w:val="en-US"/>
+        </w:rPr>
+        <w:t>course.credits</w:t>
+      </w:r>
+      <w:proofErr w:type="spellEnd"/>
+      <w:proofErr w:type="gramEnd"/>
     </w:p>
     <w:p>
       <w:pPr>
@@ -7514,8 +7656,19 @@
           <w:szCs w:val="24"/>
           <w:lang w:val="en-US"/>
         </w:rPr>
-        <w:t>IF attemptedCredits</w:t>
-      </w:r>
+        <w:t xml:space="preserve">IF </w:t>
+      </w:r>
+      <w:proofErr w:type="spellStart"/>
+      <w:r>
+        <w:rPr>
+          <w:rFonts w:ascii="Arial" w:hAnsi="Arial" w:cs="Arial"/>
+          <w:sz w:val="24"/>
+          <w:szCs w:val="24"/>
+          <w:lang w:val="en-US"/>
+        </w:rPr>
+        <w:t>attemptedCredits</w:t>
+      </w:r>
+      <w:proofErr w:type="spellEnd"/>
       <w:r>
         <w:rPr>
           <w:rFonts w:ascii="Arial" w:hAnsi="Arial" w:cs="Arial"/>
@@ -7614,15 +7767,37 @@
         </w:rPr>
         <w:t xml:space="preserve"> </w:t>
       </w:r>
-      <w:r>
-        <w:rPr>
-          <w:rFonts w:ascii="Arial" w:hAnsi="Arial" w:cs="Arial"/>
-          <w:sz w:val="24"/>
-          <w:szCs w:val="24"/>
-          <w:lang w:val="en-US"/>
-        </w:rPr>
-        <w:t>totalQualityPoints / attemptedCredits</w:t>
-      </w:r>
+      <w:proofErr w:type="spellStart"/>
+      <w:r>
+        <w:rPr>
+          <w:rFonts w:ascii="Arial" w:hAnsi="Arial" w:cs="Arial"/>
+          <w:sz w:val="24"/>
+          <w:szCs w:val="24"/>
+          <w:lang w:val="en-US"/>
+        </w:rPr>
+        <w:t>totalQualityPoints</w:t>
+      </w:r>
+      <w:proofErr w:type="spellEnd"/>
+      <w:r>
+        <w:rPr>
+          <w:rFonts w:ascii="Arial" w:hAnsi="Arial" w:cs="Arial"/>
+          <w:sz w:val="24"/>
+          <w:szCs w:val="24"/>
+          <w:lang w:val="en-US"/>
+        </w:rPr>
+        <w:t xml:space="preserve"> / </w:t>
+      </w:r>
+      <w:proofErr w:type="spellStart"/>
+      <w:r>
+        <w:rPr>
+          <w:rFonts w:ascii="Arial" w:hAnsi="Arial" w:cs="Arial"/>
+          <w:sz w:val="24"/>
+          <w:szCs w:val="24"/>
+          <w:lang w:val="en-US"/>
+        </w:rPr>
+        <w:t>attemptedCredits</w:t>
+      </w:r>
+      <w:proofErr w:type="spellEnd"/>
     </w:p>
     <w:p>
       <w:pPr>
@@ -7705,7 +7880,27 @@
           <w:szCs w:val="24"/>
           <w:lang w:val="en-US"/>
         </w:rPr>
-        <w:t>FUNCTION ConvertGradeToPoints(grade)</w:t>
+        <w:t xml:space="preserve">FUNCTION </w:t>
+      </w:r>
+      <w:proofErr w:type="spellStart"/>
+      <w:r>
+        <w:rPr>
+          <w:rFonts w:ascii="Arial" w:hAnsi="Arial" w:cs="Arial"/>
+          <w:sz w:val="24"/>
+          <w:szCs w:val="24"/>
+          <w:lang w:val="en-US"/>
+        </w:rPr>
+        <w:t>ConvertGradeToPoints</w:t>
+      </w:r>
+      <w:proofErr w:type="spellEnd"/>
+      <w:r>
+        <w:rPr>
+          <w:rFonts w:ascii="Arial" w:hAnsi="Arial" w:cs="Arial"/>
+          <w:sz w:val="24"/>
+          <w:szCs w:val="24"/>
+          <w:lang w:val="en-US"/>
+        </w:rPr>
+        <w:t>(grade)</w:t>
       </w:r>
     </w:p>
     <w:p>
@@ -7795,16 +7990,36 @@
           <w:szCs w:val="24"/>
           <w:lang w:val="en-US"/>
         </w:rPr>
-        <w:t xml:space="preserve">   ELSE IF grade = ”</w:t>
-      </w:r>
-      <w:r>
-        <w:rPr>
-          <w:rFonts w:ascii="Arial" w:hAnsi="Arial" w:cs="Arial"/>
-          <w:sz w:val="24"/>
-          <w:szCs w:val="24"/>
-          <w:lang w:val="en-US"/>
-        </w:rPr>
-        <w:t>A-</w:t>
+        <w:t xml:space="preserve">   ELSE IF grade </w:t>
+      </w:r>
+      <w:proofErr w:type="gramStart"/>
+      <w:r>
+        <w:rPr>
+          <w:rFonts w:ascii="Arial" w:hAnsi="Arial" w:cs="Arial"/>
+          <w:sz w:val="24"/>
+          <w:szCs w:val="24"/>
+          <w:lang w:val="en-US"/>
+        </w:rPr>
+        <w:t>= ”</w:t>
+      </w:r>
+      <w:r>
+        <w:rPr>
+          <w:rFonts w:ascii="Arial" w:hAnsi="Arial" w:cs="Arial"/>
+          <w:sz w:val="24"/>
+          <w:szCs w:val="24"/>
+          <w:lang w:val="en-US"/>
+        </w:rPr>
+        <w:t>A</w:t>
+      </w:r>
+      <w:proofErr w:type="gramEnd"/>
+      <w:r>
+        <w:rPr>
+          <w:rFonts w:ascii="Arial" w:hAnsi="Arial" w:cs="Arial"/>
+          <w:sz w:val="24"/>
+          <w:szCs w:val="24"/>
+          <w:lang w:val="en-US"/>
+        </w:rPr>
+        <w:t>-</w:t>
       </w:r>
       <w:r>
         <w:rPr>
@@ -8361,25 +8576,68 @@
           <w:szCs w:val="24"/>
           <w:lang w:val="en-US"/>
         </w:rPr>
-        <w:t xml:space="preserve"> CalculateProjectedGPA(</w:t>
-      </w:r>
-      <w:r>
-        <w:rPr>
-          <w:rFonts w:ascii="Arial" w:hAnsi="Arial" w:cs="Arial"/>
-          <w:sz w:val="24"/>
-          <w:szCs w:val="24"/>
-          <w:lang w:val="en-US"/>
-        </w:rPr>
-        <w:t>currentCourses,</w:t>
-      </w:r>
-      <w:r>
-        <w:rPr>
-          <w:rFonts w:ascii="Arial" w:hAnsi="Arial" w:cs="Arial"/>
-          <w:sz w:val="24"/>
-          <w:szCs w:val="24"/>
-          <w:lang w:val="en-US"/>
-        </w:rPr>
-        <w:t xml:space="preserve"> hypothetical</w:t>
+        <w:t xml:space="preserve"> </w:t>
+      </w:r>
+      <w:proofErr w:type="spellStart"/>
+      <w:proofErr w:type="gramStart"/>
+      <w:r>
+        <w:rPr>
+          <w:rFonts w:ascii="Arial" w:hAnsi="Arial" w:cs="Arial"/>
+          <w:sz w:val="24"/>
+          <w:szCs w:val="24"/>
+          <w:lang w:val="en-US"/>
+        </w:rPr>
+        <w:t>CalculateProjectedGPA</w:t>
+      </w:r>
+      <w:proofErr w:type="spellEnd"/>
+      <w:r>
+        <w:rPr>
+          <w:rFonts w:ascii="Arial" w:hAnsi="Arial" w:cs="Arial"/>
+          <w:sz w:val="24"/>
+          <w:szCs w:val="24"/>
+          <w:lang w:val="en-US"/>
+        </w:rPr>
+        <w:t>(</w:t>
+      </w:r>
+      <w:proofErr w:type="spellStart"/>
+      <w:proofErr w:type="gramEnd"/>
+      <w:r>
+        <w:rPr>
+          <w:rFonts w:ascii="Arial" w:hAnsi="Arial" w:cs="Arial"/>
+          <w:sz w:val="24"/>
+          <w:szCs w:val="24"/>
+          <w:lang w:val="en-US"/>
+        </w:rPr>
+        <w:t>currentCourses</w:t>
+      </w:r>
+      <w:proofErr w:type="spellEnd"/>
+      <w:r>
+        <w:rPr>
+          <w:rFonts w:ascii="Arial" w:hAnsi="Arial" w:cs="Arial"/>
+          <w:sz w:val="24"/>
+          <w:szCs w:val="24"/>
+          <w:lang w:val="en-US"/>
+        </w:rPr>
+        <w:t>,</w:t>
+      </w:r>
+      <w:r>
+        <w:rPr>
+          <w:rFonts w:ascii="Arial" w:hAnsi="Arial" w:cs="Arial"/>
+          <w:sz w:val="24"/>
+          <w:szCs w:val="24"/>
+          <w:lang w:val="en-US"/>
+        </w:rPr>
+        <w:t xml:space="preserve"> </w:t>
+      </w:r>
+      <w:proofErr w:type="spellStart"/>
+      <w:r>
+        <w:rPr>
+          <w:rFonts w:ascii="Arial" w:hAnsi="Arial" w:cs="Arial"/>
+          <w:sz w:val="24"/>
+          <w:szCs w:val="24"/>
+          <w:lang w:val="en-US"/>
+        </w:rPr>
+        <w:t>hypothetical</w:t>
       </w:r>
       <w:r>
         <w:rPr>
@@ -8390,6 +8648,7 @@
         </w:rPr>
         <w:t>Courses</w:t>
       </w:r>
+      <w:proofErr w:type="spellEnd"/>
       <w:r>
         <w:rPr>
           <w:rFonts w:ascii="Arial" w:hAnsi="Arial" w:cs="Arial"/>
@@ -8428,8 +8687,29 @@
           <w:szCs w:val="24"/>
           <w:lang w:val="en-US"/>
         </w:rPr>
-        <w:t xml:space="preserve">   currentQualityPoints = </w:t>
-      </w:r>
+        <w:t xml:space="preserve">   </w:t>
+      </w:r>
+      <w:proofErr w:type="spellStart"/>
+      <w:r>
+        <w:rPr>
+          <w:rFonts w:ascii="Arial" w:hAnsi="Arial" w:cs="Arial"/>
+          <w:sz w:val="24"/>
+          <w:szCs w:val="24"/>
+          <w:lang w:val="en-US"/>
+        </w:rPr>
+        <w:t>currentQualityPoints</w:t>
+      </w:r>
+      <w:proofErr w:type="spellEnd"/>
+      <w:r>
+        <w:rPr>
+          <w:rFonts w:ascii="Arial" w:hAnsi="Arial" w:cs="Arial"/>
+          <w:sz w:val="24"/>
+          <w:szCs w:val="24"/>
+          <w:lang w:val="en-US"/>
+        </w:rPr>
+        <w:t xml:space="preserve"> = </w:t>
+      </w:r>
+      <w:proofErr w:type="spellStart"/>
       <w:r>
         <w:rPr>
           <w:rFonts w:ascii="Arial" w:hAnsi="Arial" w:cs="Arial"/>
@@ -8439,6 +8719,7 @@
         </w:rPr>
         <w:t>CalculateQualityPoints</w:t>
       </w:r>
+      <w:proofErr w:type="spellEnd"/>
       <w:r>
         <w:rPr>
           <w:rFonts w:ascii="Arial" w:hAnsi="Arial" w:cs="Arial"/>
@@ -8448,6 +8729,7 @@
         </w:rPr>
         <w:t>(</w:t>
       </w:r>
+      <w:proofErr w:type="spellStart"/>
       <w:r>
         <w:rPr>
           <w:rFonts w:ascii="Arial" w:hAnsi="Arial" w:cs="Arial"/>
@@ -8457,6 +8739,7 @@
         </w:rPr>
         <w:t>currentCourses</w:t>
       </w:r>
+      <w:proofErr w:type="spellEnd"/>
       <w:r>
         <w:rPr>
           <w:rFonts w:ascii="Arial" w:hAnsi="Arial" w:cs="Arial"/>
@@ -8495,39 +8778,100 @@
           <w:szCs w:val="24"/>
           <w:lang w:val="en-US"/>
         </w:rPr>
-        <w:t xml:space="preserve">   futureQualityPoints = CalculateQualityPoints(hypotheticalCourses)</w:t>
-      </w:r>
-    </w:p>
-    <w:p>
-      <w:pPr>
-        <w:spacing w:line="360" w:lineRule="auto"/>
-        <w:rPr>
-          <w:rFonts w:ascii="Arial" w:hAnsi="Arial" w:cs="Arial"/>
-          <w:sz w:val="24"/>
-          <w:szCs w:val="24"/>
-          <w:lang w:val="en-US"/>
-        </w:rPr>
-      </w:pPr>
-    </w:p>
-    <w:p>
-      <w:pPr>
-        <w:spacing w:line="360" w:lineRule="auto"/>
-        <w:rPr>
-          <w:rFonts w:ascii="Arial" w:hAnsi="Arial" w:cs="Arial"/>
-          <w:sz w:val="24"/>
-          <w:szCs w:val="24"/>
-          <w:lang w:val="en-US"/>
-        </w:rPr>
-      </w:pPr>
-      <w:r>
-        <w:rPr>
-          <w:rFonts w:ascii="Arial" w:hAnsi="Arial" w:cs="Arial"/>
-          <w:sz w:val="24"/>
-          <w:szCs w:val="24"/>
-          <w:lang w:val="en-US"/>
-        </w:rPr>
         <w:t xml:space="preserve">   </w:t>
       </w:r>
+      <w:proofErr w:type="spellStart"/>
+      <w:r>
+        <w:rPr>
+          <w:rFonts w:ascii="Arial" w:hAnsi="Arial" w:cs="Arial"/>
+          <w:sz w:val="24"/>
+          <w:szCs w:val="24"/>
+          <w:lang w:val="en-US"/>
+        </w:rPr>
+        <w:t>futureQualityPoints</w:t>
+      </w:r>
+      <w:proofErr w:type="spellEnd"/>
+      <w:r>
+        <w:rPr>
+          <w:rFonts w:ascii="Arial" w:hAnsi="Arial" w:cs="Arial"/>
+          <w:sz w:val="24"/>
+          <w:szCs w:val="24"/>
+          <w:lang w:val="en-US"/>
+        </w:rPr>
+        <w:t xml:space="preserve"> = </w:t>
+      </w:r>
+      <w:proofErr w:type="spellStart"/>
+      <w:r>
+        <w:rPr>
+          <w:rFonts w:ascii="Arial" w:hAnsi="Arial" w:cs="Arial"/>
+          <w:sz w:val="24"/>
+          <w:szCs w:val="24"/>
+          <w:lang w:val="en-US"/>
+        </w:rPr>
+        <w:t>CalculateQualityPoints</w:t>
+      </w:r>
+      <w:proofErr w:type="spellEnd"/>
+      <w:r>
+        <w:rPr>
+          <w:rFonts w:ascii="Arial" w:hAnsi="Arial" w:cs="Arial"/>
+          <w:sz w:val="24"/>
+          <w:szCs w:val="24"/>
+          <w:lang w:val="en-US"/>
+        </w:rPr>
+        <w:t>(</w:t>
+      </w:r>
+      <w:proofErr w:type="spellStart"/>
+      <w:r>
+        <w:rPr>
+          <w:rFonts w:ascii="Arial" w:hAnsi="Arial" w:cs="Arial"/>
+          <w:sz w:val="24"/>
+          <w:szCs w:val="24"/>
+          <w:lang w:val="en-US"/>
+        </w:rPr>
+        <w:t>hypotheticalCourses</w:t>
+      </w:r>
+      <w:proofErr w:type="spellEnd"/>
+      <w:r>
+        <w:rPr>
+          <w:rFonts w:ascii="Arial" w:hAnsi="Arial" w:cs="Arial"/>
+          <w:sz w:val="24"/>
+          <w:szCs w:val="24"/>
+          <w:lang w:val="en-US"/>
+        </w:rPr>
+        <w:t>)</w:t>
+      </w:r>
+    </w:p>
+    <w:p>
+      <w:pPr>
+        <w:spacing w:line="360" w:lineRule="auto"/>
+        <w:rPr>
+          <w:rFonts w:ascii="Arial" w:hAnsi="Arial" w:cs="Arial"/>
+          <w:sz w:val="24"/>
+          <w:szCs w:val="24"/>
+          <w:lang w:val="en-US"/>
+        </w:rPr>
+      </w:pPr>
+    </w:p>
+    <w:p>
+      <w:pPr>
+        <w:spacing w:line="360" w:lineRule="auto"/>
+        <w:rPr>
+          <w:rFonts w:ascii="Arial" w:hAnsi="Arial" w:cs="Arial"/>
+          <w:sz w:val="24"/>
+          <w:szCs w:val="24"/>
+          <w:lang w:val="en-US"/>
+        </w:rPr>
+      </w:pPr>
+      <w:r>
+        <w:rPr>
+          <w:rFonts w:ascii="Arial" w:hAnsi="Arial" w:cs="Arial"/>
+          <w:sz w:val="24"/>
+          <w:szCs w:val="24"/>
+          <w:lang w:val="en-US"/>
+        </w:rPr>
+        <w:t xml:space="preserve">   </w:t>
+      </w:r>
+      <w:proofErr w:type="spellStart"/>
       <w:r>
         <w:rPr>
           <w:rFonts w:ascii="Arial" w:hAnsi="Arial" w:cs="Arial"/>
@@ -8537,15 +8881,27 @@
         </w:rPr>
         <w:t>currentCredits</w:t>
       </w:r>
-      <w:r>
-        <w:rPr>
-          <w:rFonts w:ascii="Arial" w:hAnsi="Arial" w:cs="Arial"/>
-          <w:sz w:val="24"/>
-          <w:szCs w:val="24"/>
-          <w:lang w:val="en-US"/>
-        </w:rPr>
-        <w:t xml:space="preserve"> = CalculateAttemptedCredits</w:t>
-      </w:r>
+      <w:proofErr w:type="spellEnd"/>
+      <w:r>
+        <w:rPr>
+          <w:rFonts w:ascii="Arial" w:hAnsi="Arial" w:cs="Arial"/>
+          <w:sz w:val="24"/>
+          <w:szCs w:val="24"/>
+          <w:lang w:val="en-US"/>
+        </w:rPr>
+        <w:t xml:space="preserve"> = </w:t>
+      </w:r>
+      <w:proofErr w:type="spellStart"/>
+      <w:r>
+        <w:rPr>
+          <w:rFonts w:ascii="Arial" w:hAnsi="Arial" w:cs="Arial"/>
+          <w:sz w:val="24"/>
+          <w:szCs w:val="24"/>
+          <w:lang w:val="en-US"/>
+        </w:rPr>
+        <w:t>CalculateAttemptedCredits</w:t>
+      </w:r>
+      <w:proofErr w:type="spellEnd"/>
       <w:r>
         <w:rPr>
           <w:rFonts w:ascii="Arial" w:hAnsi="Arial" w:cs="Arial"/>
@@ -8555,6 +8911,7 @@
         </w:rPr>
         <w:t>(</w:t>
       </w:r>
+      <w:proofErr w:type="spellStart"/>
       <w:r>
         <w:rPr>
           <w:rFonts w:ascii="Arial" w:hAnsi="Arial" w:cs="Arial"/>
@@ -8564,6 +8921,7 @@
         </w:rPr>
         <w:t>currentCourses</w:t>
       </w:r>
+      <w:proofErr w:type="spellEnd"/>
       <w:r>
         <w:rPr>
           <w:rFonts w:ascii="Arial" w:hAnsi="Arial" w:cs="Arial"/>
@@ -8602,16 +8960,67 @@
           <w:szCs w:val="24"/>
           <w:lang w:val="en-US"/>
         </w:rPr>
-        <w:t xml:space="preserve">   futureCredits</w:t>
-      </w:r>
-      <w:r>
-        <w:rPr>
-          <w:rFonts w:ascii="Arial" w:hAnsi="Arial" w:cs="Arial"/>
-          <w:sz w:val="24"/>
-          <w:szCs w:val="24"/>
-          <w:lang w:val="en-US"/>
-        </w:rPr>
-        <w:t xml:space="preserve"> = CalculateAttemptedCredits(hypotheticalCourses)</w:t>
+        <w:t xml:space="preserve">   </w:t>
+      </w:r>
+      <w:proofErr w:type="spellStart"/>
+      <w:r>
+        <w:rPr>
+          <w:rFonts w:ascii="Arial" w:hAnsi="Arial" w:cs="Arial"/>
+          <w:sz w:val="24"/>
+          <w:szCs w:val="24"/>
+          <w:lang w:val="en-US"/>
+        </w:rPr>
+        <w:t>futureCredits</w:t>
+      </w:r>
+      <w:proofErr w:type="spellEnd"/>
+      <w:r>
+        <w:rPr>
+          <w:rFonts w:ascii="Arial" w:hAnsi="Arial" w:cs="Arial"/>
+          <w:sz w:val="24"/>
+          <w:szCs w:val="24"/>
+          <w:lang w:val="en-US"/>
+        </w:rPr>
+        <w:t xml:space="preserve"> = </w:t>
+      </w:r>
+      <w:proofErr w:type="spellStart"/>
+      <w:r>
+        <w:rPr>
+          <w:rFonts w:ascii="Arial" w:hAnsi="Arial" w:cs="Arial"/>
+          <w:sz w:val="24"/>
+          <w:szCs w:val="24"/>
+          <w:lang w:val="en-US"/>
+        </w:rPr>
+        <w:t>CalculateAttemptedCredits</w:t>
+      </w:r>
+      <w:proofErr w:type="spellEnd"/>
+      <w:r>
+        <w:rPr>
+          <w:rFonts w:ascii="Arial" w:hAnsi="Arial" w:cs="Arial"/>
+          <w:sz w:val="24"/>
+          <w:szCs w:val="24"/>
+          <w:lang w:val="en-US"/>
+        </w:rPr>
+        <w:t>(</w:t>
+      </w:r>
+      <w:proofErr w:type="spellStart"/>
+      <w:r>
+        <w:rPr>
+          <w:rFonts w:ascii="Arial" w:hAnsi="Arial" w:cs="Arial"/>
+          <w:sz w:val="24"/>
+          <w:szCs w:val="24"/>
+          <w:lang w:val="en-US"/>
+        </w:rPr>
+        <w:t>hypotheticalCourses</w:t>
+      </w:r>
+      <w:proofErr w:type="spellEnd"/>
+      <w:r>
+        <w:rPr>
+          <w:rFonts w:ascii="Arial" w:hAnsi="Arial" w:cs="Arial"/>
+          <w:sz w:val="24"/>
+          <w:szCs w:val="24"/>
+          <w:lang w:val="en-US"/>
+        </w:rPr>
+        <w:t>)</w:t>
       </w:r>
     </w:p>
     <w:p>
@@ -8636,6 +9045,7 @@
           <w:lang w:val="en-US"/>
         </w:rPr>
       </w:pPr>
+      <w:proofErr w:type="spellStart"/>
       <w:r>
         <w:rPr>
           <w:rFonts w:ascii="Arial" w:hAnsi="Arial" w:cs="Arial"/>
@@ -8645,6 +9055,7 @@
         </w:rPr>
         <w:t>projectedGPA</w:t>
       </w:r>
+      <w:proofErr w:type="spellEnd"/>
       <w:r>
         <w:rPr>
           <w:rFonts w:ascii="Arial" w:hAnsi="Arial" w:cs="Arial"/>
@@ -8654,6 +9065,7 @@
         </w:rPr>
         <w:t xml:space="preserve"> = (</w:t>
       </w:r>
+      <w:proofErr w:type="spellStart"/>
       <w:r>
         <w:rPr>
           <w:rFonts w:ascii="Arial" w:hAnsi="Arial" w:cs="Arial"/>
@@ -8663,15 +9075,27 @@
         </w:rPr>
         <w:t>currentQualityPoints</w:t>
       </w:r>
-      <w:r>
-        <w:rPr>
-          <w:rFonts w:ascii="Arial" w:hAnsi="Arial" w:cs="Arial"/>
-          <w:sz w:val="24"/>
-          <w:szCs w:val="24"/>
-          <w:lang w:val="en-US"/>
-        </w:rPr>
-        <w:t xml:space="preserve"> + futureQualityPoints</w:t>
-      </w:r>
+      <w:proofErr w:type="spellEnd"/>
+      <w:r>
+        <w:rPr>
+          <w:rFonts w:ascii="Arial" w:hAnsi="Arial" w:cs="Arial"/>
+          <w:sz w:val="24"/>
+          <w:szCs w:val="24"/>
+          <w:lang w:val="en-US"/>
+        </w:rPr>
+        <w:t xml:space="preserve"> + </w:t>
+      </w:r>
+      <w:proofErr w:type="spellStart"/>
+      <w:r>
+        <w:rPr>
+          <w:rFonts w:ascii="Arial" w:hAnsi="Arial" w:cs="Arial"/>
+          <w:sz w:val="24"/>
+          <w:szCs w:val="24"/>
+          <w:lang w:val="en-US"/>
+        </w:rPr>
+        <w:t>futureQualityPoints</w:t>
+      </w:r>
+      <w:proofErr w:type="spellEnd"/>
       <w:r>
         <w:rPr>
           <w:rFonts w:ascii="Arial" w:hAnsi="Arial" w:cs="Arial"/>
@@ -8681,14 +9105,25 @@
         </w:rPr>
         <w:t>) / (</w:t>
       </w:r>
-      <w:r>
-        <w:rPr>
-          <w:rFonts w:ascii="Arial" w:hAnsi="Arial" w:cs="Arial"/>
-          <w:sz w:val="24"/>
-          <w:szCs w:val="24"/>
-          <w:lang w:val="en-US"/>
-        </w:rPr>
-        <w:t>currentCredits +</w:t>
+      <w:proofErr w:type="spellStart"/>
+      <w:r>
+        <w:rPr>
+          <w:rFonts w:ascii="Arial" w:hAnsi="Arial" w:cs="Arial"/>
+          <w:sz w:val="24"/>
+          <w:szCs w:val="24"/>
+          <w:lang w:val="en-US"/>
+        </w:rPr>
+        <w:t>currentCredits</w:t>
+      </w:r>
+      <w:proofErr w:type="spellEnd"/>
+      <w:r>
+        <w:rPr>
+          <w:rFonts w:ascii="Arial" w:hAnsi="Arial" w:cs="Arial"/>
+          <w:sz w:val="24"/>
+          <w:szCs w:val="24"/>
+          <w:lang w:val="en-US"/>
+        </w:rPr>
+        <w:t xml:space="preserve"> +</w:t>
       </w:r>
       <w:r>
         <w:rPr>
@@ -8699,6 +9134,7 @@
         </w:rPr>
         <w:t xml:space="preserve"> </w:t>
       </w:r>
+      <w:proofErr w:type="spellStart"/>
       <w:r>
         <w:rPr>
           <w:rFonts w:ascii="Arial" w:hAnsi="Arial" w:cs="Arial"/>
@@ -8708,6 +9144,7 @@
         </w:rPr>
         <w:t>futureCredits</w:t>
       </w:r>
+      <w:proofErr w:type="spellEnd"/>
       <w:r>
         <w:rPr>
           <w:rFonts w:ascii="Arial" w:hAnsi="Arial" w:cs="Arial"/>
@@ -8748,8 +9185,19 @@
           <w:szCs w:val="24"/>
           <w:lang w:val="en-US"/>
         </w:rPr>
-        <w:t>RETURN projectedGPA</w:t>
-      </w:r>
+        <w:t xml:space="preserve">RETURN </w:t>
+      </w:r>
+      <w:proofErr w:type="spellStart"/>
+      <w:r>
+        <w:rPr>
+          <w:rFonts w:ascii="Arial" w:hAnsi="Arial" w:cs="Arial"/>
+          <w:sz w:val="24"/>
+          <w:szCs w:val="24"/>
+          <w:lang w:val="en-US"/>
+        </w:rPr>
+        <w:t>projectedGPA</w:t>
+      </w:r>
+      <w:proofErr w:type="spellEnd"/>
     </w:p>
     <w:p>
       <w:pPr>
@@ -8832,17 +9280,51 @@
           <w:szCs w:val="24"/>
           <w:lang w:val="en-US"/>
         </w:rPr>
-        <w:t>FUNCTION CalculateDegreeProgress(</w:t>
-      </w:r>
-      <w:r>
-        <w:rPr>
-          <w:rFonts w:ascii="Arial" w:hAnsi="Arial" w:cs="Arial"/>
-          <w:sz w:val="24"/>
-          <w:szCs w:val="24"/>
-          <w:lang w:val="en-US"/>
-        </w:rPr>
-        <w:t xml:space="preserve">earnedCredits, </w:t>
-      </w:r>
+        <w:t xml:space="preserve">FUNCTION </w:t>
+      </w:r>
+      <w:proofErr w:type="spellStart"/>
+      <w:proofErr w:type="gramStart"/>
+      <w:r>
+        <w:rPr>
+          <w:rFonts w:ascii="Arial" w:hAnsi="Arial" w:cs="Arial"/>
+          <w:sz w:val="24"/>
+          <w:szCs w:val="24"/>
+          <w:lang w:val="en-US"/>
+        </w:rPr>
+        <w:t>CalculateDegreeProgress</w:t>
+      </w:r>
+      <w:proofErr w:type="spellEnd"/>
+      <w:r>
+        <w:rPr>
+          <w:rFonts w:ascii="Arial" w:hAnsi="Arial" w:cs="Arial"/>
+          <w:sz w:val="24"/>
+          <w:szCs w:val="24"/>
+          <w:lang w:val="en-US"/>
+        </w:rPr>
+        <w:t>(</w:t>
+      </w:r>
+      <w:proofErr w:type="spellStart"/>
+      <w:proofErr w:type="gramEnd"/>
+      <w:r>
+        <w:rPr>
+          <w:rFonts w:ascii="Arial" w:hAnsi="Arial" w:cs="Arial"/>
+          <w:sz w:val="24"/>
+          <w:szCs w:val="24"/>
+          <w:lang w:val="en-US"/>
+        </w:rPr>
+        <w:t>earnedCredits</w:t>
+      </w:r>
+      <w:proofErr w:type="spellEnd"/>
+      <w:r>
+        <w:rPr>
+          <w:rFonts w:ascii="Arial" w:hAnsi="Arial" w:cs="Arial"/>
+          <w:sz w:val="24"/>
+          <w:szCs w:val="24"/>
+          <w:lang w:val="en-US"/>
+        </w:rPr>
+        <w:t xml:space="preserve">, </w:t>
+      </w:r>
+      <w:proofErr w:type="spellStart"/>
       <w:r>
         <w:rPr>
           <w:rFonts w:ascii="Arial" w:hAnsi="Arial" w:cs="Arial"/>
@@ -8852,6 +9334,7 @@
         </w:rPr>
         <w:t>requiredCredits</w:t>
       </w:r>
+      <w:proofErr w:type="spellEnd"/>
       <w:r>
         <w:rPr>
           <w:rFonts w:ascii="Arial" w:hAnsi="Arial" w:cs="Arial"/>
@@ -8900,7 +9383,27 @@
           <w:szCs w:val="24"/>
           <w:lang w:val="en-US"/>
         </w:rPr>
-        <w:t>IF requiredCredits &lt;= 0</w:t>
+        <w:t xml:space="preserve">IF </w:t>
+      </w:r>
+      <w:proofErr w:type="spellStart"/>
+      <w:r>
+        <w:rPr>
+          <w:rFonts w:ascii="Arial" w:hAnsi="Arial" w:cs="Arial"/>
+          <w:sz w:val="24"/>
+          <w:szCs w:val="24"/>
+          <w:lang w:val="en-US"/>
+        </w:rPr>
+        <w:t>requiredCredits</w:t>
+      </w:r>
+      <w:proofErr w:type="spellEnd"/>
+      <w:r>
+        <w:rPr>
+          <w:rFonts w:ascii="Arial" w:hAnsi="Arial" w:cs="Arial"/>
+          <w:sz w:val="24"/>
+          <w:szCs w:val="24"/>
+          <w:lang w:val="en-US"/>
+        </w:rPr>
+        <w:t xml:space="preserve"> &lt;= 0</w:t>
       </w:r>
     </w:p>
     <w:p>
@@ -9009,6 +9512,7 @@
         </w:rPr>
         <w:t xml:space="preserve">ercentage = </w:t>
       </w:r>
+      <w:proofErr w:type="spellStart"/>
       <w:r>
         <w:rPr>
           <w:rFonts w:ascii="Arial" w:hAnsi="Arial" w:cs="Arial"/>
@@ -9018,14 +9522,35 @@
         </w:rPr>
         <w:t>earnedCredits</w:t>
       </w:r>
-      <w:r>
-        <w:rPr>
-          <w:rFonts w:ascii="Arial" w:hAnsi="Arial" w:cs="Arial"/>
-          <w:sz w:val="24"/>
-          <w:szCs w:val="24"/>
-          <w:lang w:val="en-US"/>
-        </w:rPr>
-        <w:t xml:space="preserve"> / requiredCredits * 100</w:t>
+      <w:proofErr w:type="spellEnd"/>
+      <w:r>
+        <w:rPr>
+          <w:rFonts w:ascii="Arial" w:hAnsi="Arial" w:cs="Arial"/>
+          <w:sz w:val="24"/>
+          <w:szCs w:val="24"/>
+          <w:lang w:val="en-US"/>
+        </w:rPr>
+        <w:t xml:space="preserve"> / </w:t>
+      </w:r>
+      <w:proofErr w:type="spellStart"/>
+      <w:r>
+        <w:rPr>
+          <w:rFonts w:ascii="Arial" w:hAnsi="Arial" w:cs="Arial"/>
+          <w:sz w:val="24"/>
+          <w:szCs w:val="24"/>
+          <w:lang w:val="en-US"/>
+        </w:rPr>
+        <w:t>requiredCredits</w:t>
+      </w:r>
+      <w:proofErr w:type="spellEnd"/>
+      <w:r>
+        <w:rPr>
+          <w:rFonts w:ascii="Arial" w:hAnsi="Arial" w:cs="Arial"/>
+          <w:sz w:val="24"/>
+          <w:szCs w:val="24"/>
+          <w:lang w:val="en-US"/>
+        </w:rPr>
+        <w:t xml:space="preserve"> * 100</w:t>
       </w:r>
     </w:p>
     <w:p>
@@ -9231,15 +9756,27 @@
         </w:rPr>
         <w:t xml:space="preserve">FUNCTION </w:t>
       </w:r>
-      <w:r>
-        <w:rPr>
-          <w:rFonts w:ascii="Arial" w:hAnsi="Arial" w:cs="Arial"/>
-          <w:sz w:val="24"/>
-          <w:szCs w:val="24"/>
-          <w:lang w:val="en-US"/>
-        </w:rPr>
-        <w:t>DeleteCourse(</w:t>
-      </w:r>
+      <w:proofErr w:type="spellStart"/>
+      <w:r>
+        <w:rPr>
+          <w:rFonts w:ascii="Arial" w:hAnsi="Arial" w:cs="Arial"/>
+          <w:sz w:val="24"/>
+          <w:szCs w:val="24"/>
+          <w:lang w:val="en-US"/>
+        </w:rPr>
+        <w:t>DeleteCourse</w:t>
+      </w:r>
+      <w:proofErr w:type="spellEnd"/>
+      <w:r>
+        <w:rPr>
+          <w:rFonts w:ascii="Arial" w:hAnsi="Arial" w:cs="Arial"/>
+          <w:sz w:val="24"/>
+          <w:szCs w:val="24"/>
+          <w:lang w:val="en-US"/>
+        </w:rPr>
+        <w:t>(</w:t>
+      </w:r>
+      <w:proofErr w:type="spellStart"/>
       <w:r>
         <w:rPr>
           <w:rFonts w:ascii="Arial" w:hAnsi="Arial" w:cs="Arial"/>
@@ -9249,6 +9786,7 @@
         </w:rPr>
         <w:t>courseId</w:t>
       </w:r>
+      <w:proofErr w:type="spellEnd"/>
       <w:r>
         <w:rPr>
           <w:rFonts w:ascii="Arial" w:hAnsi="Arial" w:cs="Arial"/>
@@ -9298,6 +9836,7 @@
         </w:rPr>
         <w:t xml:space="preserve">FIND course by </w:t>
       </w:r>
+      <w:proofErr w:type="spellStart"/>
       <w:r>
         <w:rPr>
           <w:rFonts w:ascii="Arial" w:hAnsi="Arial" w:cs="Arial"/>
@@ -9325,6 +9864,7 @@
         </w:rPr>
         <w:t>d</w:t>
       </w:r>
+      <w:proofErr w:type="spellEnd"/>
     </w:p>
     <w:p>
       <w:pPr>
@@ -11026,7 +11566,27 @@
           <w:szCs w:val="24"/>
           <w:lang w:val="en-US"/>
         </w:rPr>
-        <w:t xml:space="preserve"> the CourseService is responsible for</w:t>
+        <w:t xml:space="preserve"> the </w:t>
+      </w:r>
+      <w:proofErr w:type="spellStart"/>
+      <w:r>
+        <w:rPr>
+          <w:rFonts w:ascii="Arial" w:hAnsi="Arial" w:cs="Arial"/>
+          <w:sz w:val="24"/>
+          <w:szCs w:val="24"/>
+          <w:lang w:val="en-US"/>
+        </w:rPr>
+        <w:t>CourseService</w:t>
+      </w:r>
+      <w:proofErr w:type="spellEnd"/>
+      <w:r>
+        <w:rPr>
+          <w:rFonts w:ascii="Arial" w:hAnsi="Arial" w:cs="Arial"/>
+          <w:sz w:val="24"/>
+          <w:szCs w:val="24"/>
+          <w:lang w:val="en-US"/>
+        </w:rPr>
+        <w:t xml:space="preserve"> is responsible for</w:t>
       </w:r>
       <w:r>
         <w:rPr>
@@ -11080,8 +11640,19 @@
           <w:szCs w:val="24"/>
           <w:lang w:val="en-US"/>
         </w:rPr>
-        <w:t xml:space="preserve"> the Courses and AddCourse</w:t>
-      </w:r>
+        <w:t xml:space="preserve"> the Courses and </w:t>
+      </w:r>
+      <w:proofErr w:type="spellStart"/>
+      <w:r>
+        <w:rPr>
+          <w:rFonts w:ascii="Arial" w:hAnsi="Arial" w:cs="Arial"/>
+          <w:sz w:val="24"/>
+          <w:szCs w:val="24"/>
+          <w:lang w:val="en-US"/>
+        </w:rPr>
+        <w:t>AddCourse</w:t>
+      </w:r>
+      <w:proofErr w:type="spellEnd"/>
       <w:r>
         <w:rPr>
           <w:rFonts w:ascii="Arial" w:hAnsi="Arial" w:cs="Arial"/>
@@ -11475,7 +12046,27 @@
           <w:szCs w:val="24"/>
           <w:lang w:val="en-US"/>
         </w:rPr>
-        <w:t>The AcademicDbContext class</w:t>
+        <w:t xml:space="preserve">The </w:t>
+      </w:r>
+      <w:proofErr w:type="spellStart"/>
+      <w:r>
+        <w:rPr>
+          <w:rFonts w:ascii="Arial" w:hAnsi="Arial" w:cs="Arial"/>
+          <w:sz w:val="24"/>
+          <w:szCs w:val="24"/>
+          <w:lang w:val="en-US"/>
+        </w:rPr>
+        <w:t>AcademicDbContext</w:t>
+      </w:r>
+      <w:proofErr w:type="spellEnd"/>
+      <w:r>
+        <w:rPr>
+          <w:rFonts w:ascii="Arial" w:hAnsi="Arial" w:cs="Arial"/>
+          <w:sz w:val="24"/>
+          <w:szCs w:val="24"/>
+          <w:lang w:val="en-US"/>
+        </w:rPr>
+        <w:t xml:space="preserve"> class</w:t>
       </w:r>
       <w:r>
         <w:rPr>
@@ -11859,8 +12450,13 @@
           <w:lang w:val="en-US"/>
         </w:rPr>
       </w:pPr>
-      <w:r>
-        <w:t xml:space="preserve">Figure </w:t>
+      <w:proofErr w:type="spellStart"/>
+      <w:r>
+        <w:t>Figure</w:t>
+      </w:r>
+      <w:proofErr w:type="spellEnd"/>
+      <w:r>
+        <w:t xml:space="preserve"> </w:t>
       </w:r>
       <w:fldSimple w:instr=" SEQ Figure \* ARABIC ">
         <w:r>
@@ -12049,7 +12645,27 @@
           <w:szCs w:val="24"/>
           <w:lang w:val="en-US"/>
         </w:rPr>
-        <w:t xml:space="preserve"> the SemesterId foreign key</w:t>
+        <w:t xml:space="preserve"> the </w:t>
+      </w:r>
+      <w:proofErr w:type="spellStart"/>
+      <w:r>
+        <w:rPr>
+          <w:rFonts w:ascii="Arial" w:hAnsi="Arial" w:cs="Arial"/>
+          <w:sz w:val="24"/>
+          <w:szCs w:val="24"/>
+          <w:lang w:val="en-US"/>
+        </w:rPr>
+        <w:t>SemesterId</w:t>
+      </w:r>
+      <w:proofErr w:type="spellEnd"/>
+      <w:r>
+        <w:rPr>
+          <w:rFonts w:ascii="Arial" w:hAnsi="Arial" w:cs="Arial"/>
+          <w:sz w:val="24"/>
+          <w:szCs w:val="24"/>
+          <w:lang w:val="en-US"/>
+        </w:rPr>
+        <w:t xml:space="preserve"> foreign key</w:t>
       </w:r>
       <w:r>
         <w:rPr>
@@ -12826,8 +13442,16 @@
                               <w:rPr>
                                 <w:lang w:val="en-US"/>
                               </w:rPr>
-                              <w:t xml:space="preserve">   SemesterId</w:t>
+                              <w:t xml:space="preserve">   </w:t>
                             </w:r>
+                            <w:proofErr w:type="spellStart"/>
+                            <w:r>
+                              <w:rPr>
+                                <w:lang w:val="en-US"/>
+                              </w:rPr>
+                              <w:t>SemesterId</w:t>
+                            </w:r>
+                            <w:proofErr w:type="spellEnd"/>
                           </w:p>
                         </w:txbxContent>
                       </wps:txbx>
@@ -13137,8 +13761,13 @@
       <w:pPr>
         <w:pStyle w:val="Caption"/>
       </w:pPr>
-      <w:r>
-        <w:t xml:space="preserve">Figure </w:t>
+      <w:proofErr w:type="spellStart"/>
+      <w:r>
+        <w:t>Figure</w:t>
+      </w:r>
+      <w:proofErr w:type="spellEnd"/>
+      <w:r>
+        <w:t xml:space="preserve"> </w:t>
       </w:r>
       <w:fldSimple w:instr=" SEQ Figure \* ARABIC ">
         <w:r>
@@ -13232,7 +13861,21 @@
         <w:rPr>
           <w:lang w:val="en-US"/>
         </w:rPr>
-        <w:t xml:space="preserve"> The SemesterId property</w:t>
+        <w:t xml:space="preserve"> The </w:t>
+      </w:r>
+      <w:proofErr w:type="spellStart"/>
+      <w:r>
+        <w:rPr>
+          <w:lang w:val="en-US"/>
+        </w:rPr>
+        <w:t>SemesterId</w:t>
+      </w:r>
+      <w:proofErr w:type="spellEnd"/>
+      <w:r>
+        <w:rPr>
+          <w:lang w:val="en-US"/>
+        </w:rPr>
+        <w:t xml:space="preserve"> property</w:t>
       </w:r>
       <w:r>
         <w:rPr>
@@ -13366,7 +14009,21 @@
         <w:rPr>
           <w:lang w:val="en-US"/>
         </w:rPr>
-        <w:t xml:space="preserve"> AcademicDbContext.</w:t>
+        <w:t xml:space="preserve"> </w:t>
+      </w:r>
+      <w:proofErr w:type="spellStart"/>
+      <w:r>
+        <w:rPr>
+          <w:lang w:val="en-US"/>
+        </w:rPr>
+        <w:t>AcademicDbContext</w:t>
+      </w:r>
+      <w:proofErr w:type="spellEnd"/>
+      <w:r>
+        <w:rPr>
+          <w:lang w:val="en-US"/>
+        </w:rPr>
+        <w:t>.</w:t>
       </w:r>
       <w:r>
         <w:rPr>
@@ -13726,7 +14383,21 @@
         <w:rPr>
           <w:lang w:val="en-US"/>
         </w:rPr>
-        <w:t xml:space="preserve"> the GPA calculation</w:t>
+        <w:t xml:space="preserve"> </w:t>
+      </w:r>
+      <w:proofErr w:type="gramStart"/>
+      <w:r>
+        <w:rPr>
+          <w:lang w:val="en-US"/>
+        </w:rPr>
+        <w:t>the GPA</w:t>
+      </w:r>
+      <w:proofErr w:type="gramEnd"/>
+      <w:r>
+        <w:rPr>
+          <w:lang w:val="en-US"/>
+        </w:rPr>
+        <w:t xml:space="preserve"> calculation</w:t>
       </w:r>
       <w:r>
         <w:rPr>
@@ -13834,13 +14505,41 @@
         <w:rPr>
           <w:lang w:val="en-US"/>
         </w:rPr>
-        <w:t xml:space="preserve"> of the corresponding course</w:t>
-      </w:r>
-      <w:r>
-        <w:rPr>
-          <w:lang w:val="en-US"/>
-        </w:rPr>
-        <w:t xml:space="preserve"> in order to obtain</w:t>
+        <w:t xml:space="preserve"> </w:t>
+      </w:r>
+      <w:proofErr w:type="gramStart"/>
+      <w:r>
+        <w:rPr>
+          <w:lang w:val="en-US"/>
+        </w:rPr>
+        <w:t>of</w:t>
+      </w:r>
+      <w:proofErr w:type="gramEnd"/>
+      <w:r>
+        <w:rPr>
+          <w:lang w:val="en-US"/>
+        </w:rPr>
+        <w:t xml:space="preserve"> the corresponding course</w:t>
+      </w:r>
+      <w:r>
+        <w:rPr>
+          <w:lang w:val="en-US"/>
+        </w:rPr>
+        <w:t xml:space="preserve"> </w:t>
+      </w:r>
+      <w:proofErr w:type="gramStart"/>
+      <w:r>
+        <w:rPr>
+          <w:lang w:val="en-US"/>
+        </w:rPr>
+        <w:t>in order to</w:t>
+      </w:r>
+      <w:proofErr w:type="gramEnd"/>
+      <w:r>
+        <w:rPr>
+          <w:lang w:val="en-US"/>
+        </w:rPr>
+        <w:t xml:space="preserve"> obtain</w:t>
       </w:r>
       <w:r>
         <w:rPr>
@@ -14216,7 +14915,21 @@
         <w:rPr>
           <w:lang w:val="en-US"/>
         </w:rPr>
-        <w:t xml:space="preserve"> GpaCalculator service.</w:t>
+        <w:t xml:space="preserve"> </w:t>
+      </w:r>
+      <w:proofErr w:type="spellStart"/>
+      <w:r>
+        <w:rPr>
+          <w:lang w:val="en-US"/>
+        </w:rPr>
+        <w:t>GpaCalculator</w:t>
+      </w:r>
+      <w:proofErr w:type="spellEnd"/>
+      <w:r>
+        <w:rPr>
+          <w:lang w:val="en-US"/>
+        </w:rPr>
+        <w:t xml:space="preserve"> service.</w:t>
       </w:r>
       <w:r>
         <w:rPr>
@@ -14441,7 +15154,21 @@
         <w:rPr>
           <w:lang w:val="en-US"/>
         </w:rPr>
-        <w:t>, the method returns a GPA</w:t>
+        <w:t xml:space="preserve">, the method </w:t>
+      </w:r>
+      <w:proofErr w:type="gramStart"/>
+      <w:r>
+        <w:rPr>
+          <w:lang w:val="en-US"/>
+        </w:rPr>
+        <w:t>returns</w:t>
+      </w:r>
+      <w:proofErr w:type="gramEnd"/>
+      <w:r>
+        <w:rPr>
+          <w:lang w:val="en-US"/>
+        </w:rPr>
+        <w:t xml:space="preserve"> a GPA</w:t>
       </w:r>
       <w:r>
         <w:rPr>
@@ -14569,7 +15296,21 @@
         <w:rPr>
           <w:lang w:val="en-US"/>
         </w:rPr>
-        <w:t>, or O(1)</w:t>
+        <w:t xml:space="preserve">, or </w:t>
+      </w:r>
+      <w:proofErr w:type="gramStart"/>
+      <w:r>
+        <w:rPr>
+          <w:lang w:val="en-US"/>
+        </w:rPr>
+        <w:t>O(</w:t>
+      </w:r>
+      <w:proofErr w:type="gramEnd"/>
+      <w:r>
+        <w:rPr>
+          <w:lang w:val="en-US"/>
+        </w:rPr>
+        <w:t>1)</w:t>
       </w:r>
       <w:r>
         <w:rPr>
@@ -15043,7 +15784,21 @@
         <w:rPr>
           <w:lang w:val="en-US"/>
         </w:rPr>
-        <w:t xml:space="preserve"> Because the hypothetical courses</w:t>
+        <w:t xml:space="preserve"> Because </w:t>
+      </w:r>
+      <w:proofErr w:type="gramStart"/>
+      <w:r>
+        <w:rPr>
+          <w:lang w:val="en-US"/>
+        </w:rPr>
+        <w:t>the hypothetical</w:t>
+      </w:r>
+      <w:proofErr w:type="gramEnd"/>
+      <w:r>
+        <w:rPr>
+          <w:lang w:val="en-US"/>
+        </w:rPr>
+        <w:t xml:space="preserve"> courses</w:t>
       </w:r>
       <w:r>
         <w:rPr>
@@ -15819,7 +16574,21 @@
         <w:rPr>
           <w:lang w:val="en-US"/>
         </w:rPr>
-        <w:t xml:space="preserve"> is performed through</w:t>
+        <w:t xml:space="preserve"> </w:t>
+      </w:r>
+      <w:proofErr w:type="gramStart"/>
+      <w:r>
+        <w:rPr>
+          <w:lang w:val="en-US"/>
+        </w:rPr>
+        <w:t>is</w:t>
+      </w:r>
+      <w:proofErr w:type="gramEnd"/>
+      <w:r>
+        <w:rPr>
+          <w:lang w:val="en-US"/>
+        </w:rPr>
+        <w:t xml:space="preserve"> performed through</w:t>
       </w:r>
       <w:r>
         <w:rPr>
@@ -16538,8 +17307,16 @@
         <w:rPr>
           <w:lang w:val="en-US"/>
         </w:rPr>
-        <w:t xml:space="preserve"> a course in order to</w:t>
-      </w:r>
+        <w:t xml:space="preserve"> a course </w:t>
+      </w:r>
+      <w:proofErr w:type="gramStart"/>
+      <w:r>
+        <w:rPr>
+          <w:lang w:val="en-US"/>
+        </w:rPr>
+        <w:t>in order to</w:t>
+      </w:r>
+      <w:proofErr w:type="gramEnd"/>
       <w:r>
         <w:rPr>
           <w:lang w:val="en-US"/>
@@ -16973,7 +17750,21 @@
         <w:rPr>
           <w:lang w:val="en-US"/>
         </w:rPr>
-        <w:t xml:space="preserve"> executes the business logic</w:t>
+        <w:t xml:space="preserve"> executes </w:t>
+      </w:r>
+      <w:proofErr w:type="gramStart"/>
+      <w:r>
+        <w:rPr>
+          <w:lang w:val="en-US"/>
+        </w:rPr>
+        <w:t>the business</w:t>
+      </w:r>
+      <w:proofErr w:type="gramEnd"/>
+      <w:r>
+        <w:rPr>
+          <w:lang w:val="en-US"/>
+        </w:rPr>
+        <w:t xml:space="preserve"> logic</w:t>
       </w:r>
       <w:r>
         <w:rPr>
@@ -17035,56 +17826,37 @@
         <w:rPr>
           <w:lang w:val="en-US"/>
         </w:rPr>
-        <w:t>The deployment structure</w:t>
-      </w:r>
-      <w:r>
-        <w:rPr>
-          <w:lang w:val="en-US"/>
-        </w:rPr>
-        <w:t xml:space="preserve"> can therefore be</w:t>
-      </w:r>
-      <w:r>
-        <w:rPr>
-          <w:lang w:val="en-US"/>
-        </w:rPr>
-        <w:t xml:space="preserve"> represented as follows:</w:t>
-      </w:r>
-    </w:p>
-    <w:p>
-      <w:pPr>
-        <w:rPr>
-          <w:lang w:val="en-US"/>
-        </w:rPr>
-      </w:pPr>
-      <w:r>
-        <w:rPr>
-          <w:lang w:val="en-US"/>
-        </w:rPr>
-        <w:t>(</w:t>
-      </w:r>
-      <w:r>
-        <w:rPr>
-          <w:lang w:val="en-US"/>
-        </w:rPr>
-        <w:t>Figure 3 illustrates</w:t>
-      </w:r>
-      <w:r>
-        <w:rPr>
-          <w:lang w:val="en-US"/>
-        </w:rPr>
-        <w:t xml:space="preserve"> the deployment structure</w:t>
-      </w:r>
-      <w:r>
-        <w:rPr>
-          <w:lang w:val="en-US"/>
-        </w:rPr>
-        <w:t xml:space="preserve"> of the AUBG</w:t>
-      </w:r>
-      <w:r>
-        <w:rPr>
-          <w:lang w:val="en-US"/>
-        </w:rPr>
-        <w:t xml:space="preserve"> Academic Progress Tracker</w:t>
+        <w:t>The program is intended to operate on</w:t>
+      </w:r>
+      <w:r>
+        <w:rPr>
+          <w:lang w:val="en-US"/>
+        </w:rPr>
+        <w:t xml:space="preserve"> a single user’s</w:t>
+      </w:r>
+      <w:r>
+        <w:rPr>
+          <w:lang w:val="en-US"/>
+        </w:rPr>
+        <w:t xml:space="preserve"> computer without</w:t>
+      </w:r>
+      <w:r>
+        <w:rPr>
+          <w:lang w:val="en-US"/>
+        </w:rPr>
+        <w:t xml:space="preserve"> requiring an external</w:t>
+      </w:r>
+      <w:r>
+        <w:rPr>
+          <w:lang w:val="en-US"/>
+        </w:rPr>
+        <w:t xml:space="preserve"> database </w:t>
+      </w:r>
+      <w:r>
+        <w:rPr>
+          <w:lang w:val="en-US"/>
+        </w:rPr>
+        <w:t>server</w:t>
       </w:r>
       <w:r>
         <w:rPr>
@@ -17096,7 +17868,97 @@
         <w:rPr>
           <w:lang w:val="en-US"/>
         </w:rPr>
-        <w:t>)</w:t>
+        <w:t xml:space="preserve"> The browser provides access</w:t>
+      </w:r>
+      <w:r>
+        <w:rPr>
+          <w:lang w:val="en-US"/>
+        </w:rPr>
+        <w:t xml:space="preserve"> to the Blazor interface</w:t>
+      </w:r>
+      <w:r>
+        <w:rPr>
+          <w:lang w:val="en-US"/>
+        </w:rPr>
+        <w:t>, while the ASP.NET Core</w:t>
+      </w:r>
+      <w:r>
+        <w:rPr>
+          <w:lang w:val="en-US"/>
+        </w:rPr>
+        <w:t xml:space="preserve"> application</w:t>
+      </w:r>
+      <w:r>
+        <w:rPr>
+          <w:lang w:val="en-US"/>
+        </w:rPr>
+        <w:t xml:space="preserve"> performs the program logic</w:t>
+      </w:r>
+      <w:r>
+        <w:rPr>
+          <w:lang w:val="en-US"/>
+        </w:rPr>
+        <w:t>.</w:t>
+      </w:r>
+      <w:r>
+        <w:rPr>
+          <w:lang w:val="en-US"/>
+        </w:rPr>
+        <w:t xml:space="preserve"> Entity Framework Core provides</w:t>
+      </w:r>
+      <w:r>
+        <w:rPr>
+          <w:lang w:val="en-US"/>
+        </w:rPr>
+        <w:t xml:space="preserve"> communication between</w:t>
+      </w:r>
+      <w:r>
+        <w:rPr>
+          <w:lang w:val="en-US"/>
+        </w:rPr>
+        <w:t xml:space="preserve"> the program</w:t>
+      </w:r>
+      <w:r>
+        <w:rPr>
+          <w:lang w:val="en-US"/>
+        </w:rPr>
+        <w:t xml:space="preserve"> and the local</w:t>
+      </w:r>
+      <w:r>
+        <w:rPr>
+          <w:lang w:val="en-US"/>
+        </w:rPr>
+        <w:t xml:space="preserve"> SQLite database</w:t>
+      </w:r>
+      <w:r>
+        <w:rPr>
+          <w:lang w:val="en-US"/>
+        </w:rPr>
+        <w:t>.</w:t>
+      </w:r>
+      <w:r>
+        <w:rPr>
+          <w:lang w:val="en-US"/>
+        </w:rPr>
+        <w:t xml:space="preserve"> Figure 3</w:t>
+      </w:r>
+      <w:r>
+        <w:rPr>
+          <w:lang w:val="en-US"/>
+        </w:rPr>
+        <w:t xml:space="preserve"> illustrates the deployment</w:t>
+      </w:r>
+      <w:r>
+        <w:rPr>
+          <w:lang w:val="en-US"/>
+        </w:rPr>
+        <w:t xml:space="preserve"> structure of the system</w:t>
+      </w:r>
+      <w:r>
+        <w:rPr>
+          <w:lang w:val="en-US"/>
+        </w:rPr>
+        <w:t>.</w:t>
       </w:r>
     </w:p>
     <w:p>
@@ -17171,7 +18033,6 @@
           <w:noProof/>
           <w:lang w:val="en-US"/>
         </w:rPr>
-        <w:lastRenderedPageBreak/>
         <mc:AlternateContent>
           <mc:Choice Requires="wps">
             <w:drawing>
@@ -17575,7 +18436,7 @@
                                     </pic:cNvPicPr>
                                   </pic:nvPicPr>
                                   <pic:blipFill>
-                                    <a:blip r:embed="rId9">
+                                    <a:blip r:embed="rId10">
                                       <a:extLst>
                                         <a:ext uri="{28A0092B-C50C-407E-A947-70E740481C1C}">
                                           <a14:useLocalDpi xmlns:a14="http://schemas.microsoft.com/office/drawing/2010/main" val="0"/>
@@ -18500,8 +19361,13 @@
           <w:lang w:val="en-US"/>
         </w:rPr>
       </w:pPr>
-      <w:r>
-        <w:t xml:space="preserve">Figure </w:t>
+      <w:proofErr w:type="spellStart"/>
+      <w:r>
+        <w:t>Figure</w:t>
+      </w:r>
+      <w:proofErr w:type="spellEnd"/>
+      <w:r>
+        <w:t xml:space="preserve"> </w:t>
       </w:r>
       <w:fldSimple w:instr=" SEQ Figure \* ARABIC ">
         <w:r>
@@ -18531,9 +19397,388 @@
           <w:lang w:val="en-US"/>
         </w:rPr>
       </w:pPr>
+      <w:r>
+        <w:rPr>
+          <w:lang w:val="en-US"/>
+        </w:rPr>
+        <w:t>The use of SQLite simplifies</w:t>
+      </w:r>
+      <w:r>
+        <w:rPr>
+          <w:lang w:val="en-US"/>
+        </w:rPr>
+        <w:t xml:space="preserve"> deployment because</w:t>
+      </w:r>
+      <w:r>
+        <w:rPr>
+          <w:lang w:val="en-US"/>
+        </w:rPr>
+        <w:t xml:space="preserve"> the program does not</w:t>
+      </w:r>
+      <w:r>
+        <w:rPr>
+          <w:lang w:val="en-US"/>
+        </w:rPr>
+        <w:t xml:space="preserve"> require the installation</w:t>
+      </w:r>
+      <w:r>
+        <w:rPr>
+          <w:lang w:val="en-US"/>
+        </w:rPr>
+        <w:t xml:space="preserve"> or </w:t>
+      </w:r>
+      <w:r>
+        <w:rPr>
+          <w:lang w:val="en-US"/>
+        </w:rPr>
+        <w:t>administration</w:t>
+      </w:r>
+      <w:r>
+        <w:rPr>
+          <w:lang w:val="en-US"/>
+        </w:rPr>
+        <w:t xml:space="preserve"> of a separate</w:t>
+      </w:r>
+      <w:r>
+        <w:rPr>
+          <w:lang w:val="en-US"/>
+        </w:rPr>
+        <w:t xml:space="preserve"> database server.</w:t>
+      </w:r>
+      <w:r>
+        <w:rPr>
+          <w:lang w:val="en-US"/>
+        </w:rPr>
+        <w:t xml:space="preserve"> The database is stored</w:t>
+      </w:r>
+      <w:r>
+        <w:rPr>
+          <w:lang w:val="en-US"/>
+        </w:rPr>
+        <w:t xml:space="preserve"> locally as a file</w:t>
+      </w:r>
+      <w:r>
+        <w:rPr>
+          <w:lang w:val="en-US"/>
+        </w:rPr>
+        <w:t xml:space="preserve"> and is accessed through</w:t>
+      </w:r>
+      <w:r>
+        <w:rPr>
+          <w:lang w:val="en-US"/>
+        </w:rPr>
+        <w:t xml:space="preserve"> Entity Framework Core.</w:t>
+      </w:r>
+    </w:p>
+    <w:p>
+      <w:pPr>
+        <w:rPr>
+          <w:lang w:val="en-US"/>
+        </w:rPr>
+      </w:pPr>
+    </w:p>
+    <w:p>
+      <w:pPr>
+        <w:rPr>
+          <w:lang w:val="en-US"/>
+        </w:rPr>
+      </w:pPr>
+      <w:r>
+        <w:rPr>
+          <w:lang w:val="en-US"/>
+        </w:rPr>
+        <w:t>This deployment model</w:t>
+      </w:r>
+      <w:r>
+        <w:rPr>
+          <w:lang w:val="en-US"/>
+        </w:rPr>
+        <w:t xml:space="preserve"> is appropriate</w:t>
+      </w:r>
+      <w:r>
+        <w:rPr>
+          <w:lang w:val="en-US"/>
+        </w:rPr>
+        <w:t xml:space="preserve"> for the intended scope</w:t>
+      </w:r>
+      <w:r>
+        <w:rPr>
+          <w:lang w:val="en-US"/>
+        </w:rPr>
+        <w:t xml:space="preserve"> of the project because</w:t>
+      </w:r>
+      <w:r>
+        <w:rPr>
+          <w:lang w:val="en-US"/>
+        </w:rPr>
+        <w:t xml:space="preserve"> the program is designed</w:t>
+      </w:r>
+      <w:r>
+        <w:rPr>
+          <w:lang w:val="en-US"/>
+        </w:rPr>
+        <w:t xml:space="preserve"> as a personal academic</w:t>
+      </w:r>
+      <w:r>
+        <w:rPr>
+          <w:lang w:val="en-US"/>
+        </w:rPr>
+        <w:t xml:space="preserve"> tracking tool</w:t>
+      </w:r>
+      <w:r>
+        <w:rPr>
+          <w:lang w:val="en-US"/>
+        </w:rPr>
+        <w:t xml:space="preserve"> rather than</w:t>
+      </w:r>
+      <w:r>
+        <w:rPr>
+          <w:lang w:val="en-US"/>
+        </w:rPr>
+        <w:t xml:space="preserve"> a multi-user</w:t>
+      </w:r>
+      <w:r>
+        <w:rPr>
+          <w:lang w:val="en-US"/>
+        </w:rPr>
+        <w:t xml:space="preserve"> institutional</w:t>
+      </w:r>
+      <w:r>
+        <w:rPr>
+          <w:lang w:val="en-US"/>
+        </w:rPr>
+        <w:t xml:space="preserve"> information system.</w:t>
+      </w:r>
+      <w:r>
+        <w:rPr>
+          <w:lang w:val="en-US"/>
+        </w:rPr>
+        <w:t xml:space="preserve"> It also reduces</w:t>
+      </w:r>
+      <w:r>
+        <w:rPr>
+          <w:lang w:val="en-US"/>
+        </w:rPr>
+        <w:t xml:space="preserve"> infrastructure</w:t>
+      </w:r>
+      <w:r>
+        <w:rPr>
+          <w:lang w:val="en-US"/>
+        </w:rPr>
+        <w:t xml:space="preserve"> requirements</w:t>
+      </w:r>
+      <w:r>
+        <w:rPr>
+          <w:lang w:val="en-US"/>
+        </w:rPr>
+        <w:t xml:space="preserve"> and allows</w:t>
+      </w:r>
+      <w:r>
+        <w:rPr>
+          <w:lang w:val="en-US"/>
+        </w:rPr>
+        <w:t xml:space="preserve"> the project to concentrate</w:t>
+      </w:r>
+      <w:r>
+        <w:rPr>
+          <w:lang w:val="en-US"/>
+        </w:rPr>
+        <w:t xml:space="preserve"> on the program logic</w:t>
+      </w:r>
+      <w:r>
+        <w:rPr>
+          <w:lang w:val="en-US"/>
+        </w:rPr>
+        <w:t>, data model</w:t>
+      </w:r>
+      <w:r>
+        <w:rPr>
+          <w:lang w:val="en-US"/>
+        </w:rPr>
+        <w:t>, persistence</w:t>
+      </w:r>
+      <w:r>
+        <w:rPr>
+          <w:lang w:val="en-US"/>
+        </w:rPr>
+        <w:t>, and user-facing functionality.</w:t>
+      </w:r>
+    </w:p>
+    <w:p>
+      <w:pPr>
+        <w:rPr>
+          <w:lang w:val="en-US"/>
+        </w:rPr>
+      </w:pPr>
+    </w:p>
+    <w:p>
+      <w:pPr>
+        <w:rPr>
+          <w:lang w:val="en-US"/>
+        </w:rPr>
+      </w:pPr>
+      <w:r>
+        <w:rPr>
+          <w:lang w:val="en-US"/>
+        </w:rPr>
+        <w:t>A limitation of this design is that</w:t>
+      </w:r>
+      <w:r>
+        <w:rPr>
+          <w:lang w:val="en-US"/>
+        </w:rPr>
+        <w:t xml:space="preserve"> the program data</w:t>
+      </w:r>
+      <w:r>
+        <w:rPr>
+          <w:lang w:val="en-US"/>
+        </w:rPr>
+        <w:t xml:space="preserve"> is tied to the local</w:t>
+      </w:r>
+      <w:r>
+        <w:rPr>
+          <w:lang w:val="en-US"/>
+        </w:rPr>
+        <w:t xml:space="preserve"> environment</w:t>
+      </w:r>
+      <w:r>
+        <w:rPr>
+          <w:lang w:val="en-US"/>
+        </w:rPr>
+        <w:t xml:space="preserve"> in which the database</w:t>
+      </w:r>
+      <w:r>
+        <w:rPr>
+          <w:lang w:val="en-US"/>
+        </w:rPr>
+        <w:t xml:space="preserve"> file is stored.</w:t>
+      </w:r>
+      <w:r>
+        <w:rPr>
+          <w:lang w:val="en-US"/>
+        </w:rPr>
+        <w:t xml:space="preserve"> The current design does not provide</w:t>
+      </w:r>
+      <w:r>
+        <w:rPr>
+          <w:lang w:val="en-US"/>
+        </w:rPr>
+        <w:t xml:space="preserve"> synchronization</w:t>
+      </w:r>
+      <w:r>
+        <w:rPr>
+          <w:lang w:val="en-US"/>
+        </w:rPr>
+        <w:t xml:space="preserve"> between multiple computers</w:t>
+      </w:r>
+      <w:r>
+        <w:rPr>
+          <w:lang w:val="en-US"/>
+        </w:rPr>
+        <w:t xml:space="preserve"> or centralized access</w:t>
+      </w:r>
+      <w:r>
+        <w:rPr>
+          <w:lang w:val="en-US"/>
+        </w:rPr>
+        <w:t xml:space="preserve"> from multiple users</w:t>
+      </w:r>
+      <w:r>
+        <w:rPr>
+          <w:lang w:val="en-US"/>
+        </w:rPr>
+        <w:t>.</w:t>
+      </w:r>
+      <w:r>
+        <w:rPr>
+          <w:lang w:val="en-US"/>
+        </w:rPr>
+        <w:t xml:space="preserve"> Such functionality would</w:t>
+      </w:r>
+      <w:r>
+        <w:rPr>
+          <w:lang w:val="en-US"/>
+        </w:rPr>
+        <w:t xml:space="preserve"> require a different</w:t>
+      </w:r>
+      <w:r>
+        <w:rPr>
+          <w:lang w:val="en-US"/>
+        </w:rPr>
+        <w:t xml:space="preserve"> deployment architecture</w:t>
+      </w:r>
+      <w:r>
+        <w:rPr>
+          <w:lang w:val="en-US"/>
+        </w:rPr>
+        <w:t xml:space="preserve"> and could be considered</w:t>
+      </w:r>
+      <w:r>
+        <w:rPr>
+          <w:lang w:val="en-US"/>
+        </w:rPr>
+        <w:t xml:space="preserve"> as a possible</w:t>
+      </w:r>
+      <w:r>
+        <w:rPr>
+          <w:lang w:val="en-US"/>
+        </w:rPr>
+        <w:t xml:space="preserve"> future extension.</w:t>
+      </w:r>
+    </w:p>
+    <w:p>
+      <w:pPr>
+        <w:rPr>
+          <w:lang w:val="en-US"/>
+        </w:rPr>
+      </w:pPr>
+    </w:p>
+    <w:p>
+      <w:pPr>
+        <w:pStyle w:val="ListParagraph"/>
+        <w:numPr>
+          <w:ilvl w:val="1"/>
+          <w:numId w:val="1"/>
+        </w:numPr>
+        <w:rPr>
+          <w:lang w:val="en-US"/>
+        </w:rPr>
+      </w:pPr>
+      <w:r>
+        <w:rPr>
+          <w:lang w:val="en-US"/>
+        </w:rPr>
+        <w:t>Reliability</w:t>
+      </w:r>
+      <w:r>
+        <w:rPr>
+          <w:lang w:val="en-US"/>
+        </w:rPr>
+        <w:t xml:space="preserve"> and Security</w:t>
+      </w:r>
+      <w:r>
+        <w:rPr>
+          <w:lang w:val="en-US"/>
+        </w:rPr>
+        <w:t xml:space="preserve"> Considerations</w:t>
+      </w:r>
+    </w:p>
+    <w:p>
+      <w:pPr>
+        <w:rPr>
+          <w:lang w:val="en-US"/>
+        </w:rPr>
+      </w:pPr>
+    </w:p>
+    <w:p>
+      <w:pPr>
+        <w:rPr>
+          <w:lang w:val="en-US"/>
+        </w:rPr>
+      </w:pPr>
     </w:p>
     <w:sectPr>
-      <w:footerReference w:type="default" r:id="rId10"/>
+      <w:footerReference w:type="default" r:id="rId11"/>
       <w:pgSz w:w="11906" w:h="16838" w:code="9"/>
       <w:pgMar w:top="1417" w:right="1417" w:bottom="1417" w:left="1417" w:header="708" w:footer="708" w:gutter="0"/>
       <w:cols w:space="708"/>

</xml_diff>

<commit_message>
Finished the third part of my thesis and added a report for the fourth week of the semester.
</commit_message>
<xml_diff>
--- a/Project Thesis.docx
+++ b/Project Thesis.docx
@@ -6061,19 +6061,1070 @@
           <w:lang w:val="en-US"/>
         </w:rPr>
         <w:lastRenderedPageBreak/>
+        <w:t>FUNCTION AddCourse</w:t>
+      </w:r>
+    </w:p>
+    <w:p>
+      <w:pPr>
+        <w:spacing w:line="360" w:lineRule="auto"/>
+        <w:rPr>
+          <w:rFonts w:ascii="Arial" w:hAnsi="Arial" w:cs="Arial"/>
+          <w:sz w:val="24"/>
+          <w:szCs w:val="24"/>
+          <w:lang w:val="en-US"/>
+        </w:rPr>
+      </w:pPr>
+    </w:p>
+    <w:p>
+      <w:pPr>
+        <w:spacing w:line="360" w:lineRule="auto"/>
+        <w:rPr>
+          <w:rFonts w:ascii="Arial" w:hAnsi="Arial" w:cs="Arial"/>
+          <w:sz w:val="24"/>
+          <w:szCs w:val="24"/>
+          <w:lang w:val="en-US"/>
+        </w:rPr>
+      </w:pPr>
+      <w:r>
+        <w:rPr>
+          <w:rFonts w:ascii="Arial" w:hAnsi="Arial" w:cs="Arial"/>
+          <w:sz w:val="24"/>
+          <w:szCs w:val="24"/>
+          <w:lang w:val="en-US"/>
+        </w:rPr>
+        <w:t xml:space="preserve">   </w:t>
+      </w:r>
+      <w:r>
+        <w:rPr>
+          <w:rFonts w:ascii="Arial" w:hAnsi="Arial" w:cs="Arial"/>
+          <w:sz w:val="24"/>
+          <w:szCs w:val="24"/>
+          <w:lang w:val="en-US"/>
+        </w:rPr>
+        <w:t>DISPLAY Add Course form</w:t>
+      </w:r>
+    </w:p>
+    <w:p>
+      <w:pPr>
+        <w:spacing w:line="360" w:lineRule="auto"/>
+        <w:rPr>
+          <w:rFonts w:ascii="Arial" w:hAnsi="Arial" w:cs="Arial"/>
+          <w:sz w:val="24"/>
+          <w:szCs w:val="24"/>
+          <w:lang w:val="en-US"/>
+        </w:rPr>
+      </w:pPr>
+    </w:p>
+    <w:p>
+      <w:pPr>
+        <w:spacing w:line="360" w:lineRule="auto"/>
+        <w:rPr>
+          <w:rFonts w:ascii="Arial" w:hAnsi="Arial" w:cs="Arial"/>
+          <w:sz w:val="24"/>
+          <w:szCs w:val="24"/>
+          <w:lang w:val="en-US"/>
+        </w:rPr>
+      </w:pPr>
+      <w:r>
+        <w:rPr>
+          <w:rFonts w:ascii="Arial" w:hAnsi="Arial" w:cs="Arial"/>
+          <w:sz w:val="24"/>
+          <w:szCs w:val="24"/>
+          <w:lang w:val="en-US"/>
+        </w:rPr>
+        <w:t xml:space="preserve">   </w:t>
+      </w:r>
+      <w:r>
+        <w:rPr>
+          <w:rFonts w:ascii="Arial" w:hAnsi="Arial" w:cs="Arial"/>
+          <w:sz w:val="24"/>
+          <w:szCs w:val="24"/>
+          <w:lang w:val="en-US"/>
+        </w:rPr>
+        <w:t>READ course code</w:t>
+      </w:r>
+    </w:p>
+    <w:p>
+      <w:pPr>
+        <w:spacing w:line="360" w:lineRule="auto"/>
+        <w:rPr>
+          <w:rFonts w:ascii="Arial" w:hAnsi="Arial" w:cs="Arial"/>
+          <w:sz w:val="24"/>
+          <w:szCs w:val="24"/>
+          <w:lang w:val="en-US"/>
+        </w:rPr>
+      </w:pPr>
+      <w:r>
+        <w:rPr>
+          <w:rFonts w:ascii="Arial" w:hAnsi="Arial" w:cs="Arial"/>
+          <w:sz w:val="24"/>
+          <w:szCs w:val="24"/>
+          <w:lang w:val="en-US"/>
+        </w:rPr>
+        <w:t xml:space="preserve">   </w:t>
+      </w:r>
+      <w:r>
+        <w:rPr>
+          <w:rFonts w:ascii="Arial" w:hAnsi="Arial" w:cs="Arial"/>
+          <w:sz w:val="24"/>
+          <w:szCs w:val="24"/>
+          <w:lang w:val="en-US"/>
+        </w:rPr>
+        <w:t>READ course name</w:t>
+      </w:r>
+    </w:p>
+    <w:p>
+      <w:pPr>
+        <w:spacing w:line="360" w:lineRule="auto"/>
+        <w:rPr>
+          <w:rFonts w:ascii="Arial" w:hAnsi="Arial" w:cs="Arial"/>
+          <w:sz w:val="24"/>
+          <w:szCs w:val="24"/>
+          <w:lang w:val="en-US"/>
+        </w:rPr>
+      </w:pPr>
+      <w:r>
+        <w:rPr>
+          <w:rFonts w:ascii="Arial" w:hAnsi="Arial" w:cs="Arial"/>
+          <w:sz w:val="24"/>
+          <w:szCs w:val="24"/>
+          <w:lang w:val="en-US"/>
+        </w:rPr>
+        <w:t xml:space="preserve">   </w:t>
+      </w:r>
+      <w:r>
+        <w:rPr>
+          <w:rFonts w:ascii="Arial" w:hAnsi="Arial" w:cs="Arial"/>
+          <w:sz w:val="24"/>
+          <w:szCs w:val="24"/>
+          <w:lang w:val="en-US"/>
+        </w:rPr>
+        <w:t>READ credits</w:t>
+      </w:r>
+    </w:p>
+    <w:p>
+      <w:pPr>
+        <w:spacing w:line="360" w:lineRule="auto"/>
+        <w:rPr>
+          <w:rFonts w:ascii="Arial" w:hAnsi="Arial" w:cs="Arial"/>
+          <w:sz w:val="24"/>
+          <w:szCs w:val="24"/>
+          <w:lang w:val="en-US"/>
+        </w:rPr>
+      </w:pPr>
+      <w:r>
+        <w:rPr>
+          <w:rFonts w:ascii="Arial" w:hAnsi="Arial" w:cs="Arial"/>
+          <w:sz w:val="24"/>
+          <w:szCs w:val="24"/>
+          <w:lang w:val="en-US"/>
+        </w:rPr>
+        <w:t xml:space="preserve">   </w:t>
+      </w:r>
+      <w:r>
+        <w:rPr>
+          <w:rFonts w:ascii="Arial" w:hAnsi="Arial" w:cs="Arial"/>
+          <w:sz w:val="24"/>
+          <w:szCs w:val="24"/>
+          <w:lang w:val="en-US"/>
+        </w:rPr>
+        <w:t>READ grade</w:t>
+      </w:r>
+    </w:p>
+    <w:p>
+      <w:pPr>
+        <w:spacing w:line="360" w:lineRule="auto"/>
+        <w:rPr>
+          <w:rFonts w:ascii="Arial" w:hAnsi="Arial" w:cs="Arial"/>
+          <w:sz w:val="24"/>
+          <w:szCs w:val="24"/>
+          <w:lang w:val="en-US"/>
+        </w:rPr>
+      </w:pPr>
+      <w:r>
+        <w:rPr>
+          <w:rFonts w:ascii="Arial" w:hAnsi="Arial" w:cs="Arial"/>
+          <w:sz w:val="24"/>
+          <w:szCs w:val="24"/>
+          <w:lang w:val="en-US"/>
+        </w:rPr>
+        <w:t xml:space="preserve">   </w:t>
+      </w:r>
+      <w:r>
+        <w:rPr>
+          <w:rFonts w:ascii="Arial" w:hAnsi="Arial" w:cs="Arial"/>
+          <w:sz w:val="24"/>
+          <w:szCs w:val="24"/>
+          <w:lang w:val="en-US"/>
+        </w:rPr>
+        <w:t>READ semester</w:t>
+      </w:r>
+    </w:p>
+    <w:p>
+      <w:pPr>
+        <w:spacing w:line="360" w:lineRule="auto"/>
+        <w:rPr>
+          <w:rFonts w:ascii="Arial" w:hAnsi="Arial" w:cs="Arial"/>
+          <w:sz w:val="24"/>
+          <w:szCs w:val="24"/>
+          <w:lang w:val="en-US"/>
+        </w:rPr>
+      </w:pPr>
+    </w:p>
+    <w:p>
+      <w:pPr>
+        <w:spacing w:line="360" w:lineRule="auto"/>
+        <w:rPr>
+          <w:rFonts w:ascii="Arial" w:hAnsi="Arial" w:cs="Arial"/>
+          <w:sz w:val="24"/>
+          <w:szCs w:val="24"/>
+          <w:lang w:val="en-US"/>
+        </w:rPr>
+      </w:pPr>
+      <w:r>
+        <w:rPr>
+          <w:rFonts w:ascii="Arial" w:hAnsi="Arial" w:cs="Arial"/>
+          <w:sz w:val="24"/>
+          <w:szCs w:val="24"/>
+          <w:lang w:val="en-US"/>
+        </w:rPr>
+        <w:t xml:space="preserve">   </w:t>
+      </w:r>
+      <w:r>
+        <w:rPr>
+          <w:rFonts w:ascii="Arial" w:hAnsi="Arial" w:cs="Arial"/>
+          <w:sz w:val="24"/>
+          <w:szCs w:val="24"/>
+          <w:lang w:val="en-US"/>
+        </w:rPr>
+        <w:t>IF course code is empty</w:t>
+      </w:r>
+    </w:p>
+    <w:p>
+      <w:pPr>
+        <w:spacing w:line="360" w:lineRule="auto"/>
+        <w:rPr>
+          <w:rFonts w:ascii="Arial" w:hAnsi="Arial" w:cs="Arial"/>
+          <w:sz w:val="24"/>
+          <w:szCs w:val="24"/>
+          <w:lang w:val="en-US"/>
+        </w:rPr>
+      </w:pPr>
+      <w:r>
+        <w:rPr>
+          <w:rFonts w:ascii="Arial" w:hAnsi="Arial" w:cs="Arial"/>
+          <w:sz w:val="24"/>
+          <w:szCs w:val="24"/>
+          <w:lang w:val="en-US"/>
+        </w:rPr>
+        <w:t xml:space="preserve">      </w:t>
+      </w:r>
+      <w:r>
+        <w:rPr>
+          <w:rFonts w:ascii="Arial" w:hAnsi="Arial" w:cs="Arial"/>
+          <w:sz w:val="24"/>
+          <w:szCs w:val="24"/>
+          <w:lang w:val="en-US"/>
+        </w:rPr>
+        <w:t>DISPLAY validation error</w:t>
+      </w:r>
+    </w:p>
+    <w:p>
+      <w:pPr>
+        <w:spacing w:line="360" w:lineRule="auto"/>
+        <w:rPr>
+          <w:rFonts w:ascii="Arial" w:hAnsi="Arial" w:cs="Arial"/>
+          <w:sz w:val="24"/>
+          <w:szCs w:val="24"/>
+          <w:lang w:val="en-US"/>
+        </w:rPr>
+      </w:pPr>
+      <w:r>
+        <w:rPr>
+          <w:rFonts w:ascii="Arial" w:hAnsi="Arial" w:cs="Arial"/>
+          <w:sz w:val="24"/>
+          <w:szCs w:val="24"/>
+          <w:lang w:val="en-US"/>
+        </w:rPr>
+        <w:t xml:space="preserve">      </w:t>
+      </w:r>
+      <w:r>
+        <w:rPr>
+          <w:rFonts w:ascii="Arial" w:hAnsi="Arial" w:cs="Arial"/>
+          <w:sz w:val="24"/>
+          <w:szCs w:val="24"/>
+          <w:lang w:val="en-US"/>
+        </w:rPr>
+        <w:t>STOP</w:t>
+      </w:r>
+    </w:p>
+    <w:p>
+      <w:pPr>
+        <w:spacing w:line="360" w:lineRule="auto"/>
+        <w:rPr>
+          <w:rFonts w:ascii="Arial" w:hAnsi="Arial" w:cs="Arial"/>
+          <w:sz w:val="24"/>
+          <w:szCs w:val="24"/>
+          <w:lang w:val="en-US"/>
+        </w:rPr>
+      </w:pPr>
+      <w:r>
+        <w:rPr>
+          <w:rFonts w:ascii="Arial" w:hAnsi="Arial" w:cs="Arial"/>
+          <w:sz w:val="24"/>
+          <w:szCs w:val="24"/>
+          <w:lang w:val="en-US"/>
+        </w:rPr>
+        <w:t xml:space="preserve">   </w:t>
+      </w:r>
+      <w:r>
+        <w:rPr>
+          <w:rFonts w:ascii="Arial" w:hAnsi="Arial" w:cs="Arial"/>
+          <w:sz w:val="24"/>
+          <w:szCs w:val="24"/>
+          <w:lang w:val="en-US"/>
+        </w:rPr>
+        <w:t>END IF</w:t>
+      </w:r>
+    </w:p>
+    <w:p>
+      <w:pPr>
+        <w:spacing w:line="360" w:lineRule="auto"/>
+        <w:rPr>
+          <w:rFonts w:ascii="Arial" w:hAnsi="Arial" w:cs="Arial"/>
+          <w:sz w:val="24"/>
+          <w:szCs w:val="24"/>
+          <w:lang w:val="en-US"/>
+        </w:rPr>
+      </w:pPr>
+    </w:p>
+    <w:p>
+      <w:pPr>
+        <w:spacing w:line="360" w:lineRule="auto"/>
+        <w:rPr>
+          <w:rFonts w:ascii="Arial" w:hAnsi="Arial" w:cs="Arial"/>
+          <w:sz w:val="24"/>
+          <w:szCs w:val="24"/>
+          <w:lang w:val="en-US"/>
+        </w:rPr>
+      </w:pPr>
+      <w:r>
+        <w:rPr>
+          <w:rFonts w:ascii="Arial" w:hAnsi="Arial" w:cs="Arial"/>
+          <w:sz w:val="24"/>
+          <w:szCs w:val="24"/>
+          <w:lang w:val="en-US"/>
+        </w:rPr>
+        <w:t xml:space="preserve">   </w:t>
+      </w:r>
+      <w:r>
+        <w:rPr>
+          <w:rFonts w:ascii="Arial" w:hAnsi="Arial" w:cs="Arial"/>
+          <w:sz w:val="24"/>
+          <w:szCs w:val="24"/>
+          <w:lang w:val="en-US"/>
+        </w:rPr>
+        <w:t>IF course name is empty</w:t>
+      </w:r>
+    </w:p>
+    <w:p>
+      <w:pPr>
+        <w:spacing w:line="360" w:lineRule="auto"/>
+        <w:rPr>
+          <w:rFonts w:ascii="Arial" w:hAnsi="Arial" w:cs="Arial"/>
+          <w:sz w:val="24"/>
+          <w:szCs w:val="24"/>
+          <w:lang w:val="en-US"/>
+        </w:rPr>
+      </w:pPr>
+      <w:r>
+        <w:rPr>
+          <w:rFonts w:ascii="Arial" w:hAnsi="Arial" w:cs="Arial"/>
+          <w:sz w:val="24"/>
+          <w:szCs w:val="24"/>
+          <w:lang w:val="en-US"/>
+        </w:rPr>
+        <w:t xml:space="preserve">      </w:t>
+      </w:r>
+      <w:r>
+        <w:rPr>
+          <w:rFonts w:ascii="Arial" w:hAnsi="Arial" w:cs="Arial"/>
+          <w:sz w:val="24"/>
+          <w:szCs w:val="24"/>
+          <w:lang w:val="en-US"/>
+        </w:rPr>
+        <w:t>DISPLAY validation error</w:t>
+      </w:r>
+    </w:p>
+    <w:p>
+      <w:pPr>
+        <w:spacing w:line="360" w:lineRule="auto"/>
+        <w:rPr>
+          <w:rFonts w:ascii="Arial" w:hAnsi="Arial" w:cs="Arial"/>
+          <w:sz w:val="24"/>
+          <w:szCs w:val="24"/>
+          <w:lang w:val="en-US"/>
+        </w:rPr>
+      </w:pPr>
+      <w:r>
+        <w:rPr>
+          <w:rFonts w:ascii="Arial" w:hAnsi="Arial" w:cs="Arial"/>
+          <w:sz w:val="24"/>
+          <w:szCs w:val="24"/>
+          <w:lang w:val="en-US"/>
+        </w:rPr>
+        <w:t xml:space="preserve">      </w:t>
+      </w:r>
+      <w:r>
+        <w:rPr>
+          <w:rFonts w:ascii="Arial" w:hAnsi="Arial" w:cs="Arial"/>
+          <w:sz w:val="24"/>
+          <w:szCs w:val="24"/>
+          <w:lang w:val="en-US"/>
+        </w:rPr>
+        <w:t>STOP</w:t>
+      </w:r>
+    </w:p>
+    <w:p>
+      <w:pPr>
+        <w:spacing w:line="360" w:lineRule="auto"/>
+        <w:rPr>
+          <w:rFonts w:ascii="Arial" w:hAnsi="Arial" w:cs="Arial"/>
+          <w:sz w:val="24"/>
+          <w:szCs w:val="24"/>
+          <w:lang w:val="en-US"/>
+        </w:rPr>
+      </w:pPr>
+      <w:r>
+        <w:rPr>
+          <w:rFonts w:ascii="Arial" w:hAnsi="Arial" w:cs="Arial"/>
+          <w:sz w:val="24"/>
+          <w:szCs w:val="24"/>
+          <w:lang w:val="en-US"/>
+        </w:rPr>
+        <w:t xml:space="preserve">   </w:t>
+      </w:r>
+      <w:r>
+        <w:rPr>
+          <w:rFonts w:ascii="Arial" w:hAnsi="Arial" w:cs="Arial"/>
+          <w:sz w:val="24"/>
+          <w:szCs w:val="24"/>
+          <w:lang w:val="en-US"/>
+        </w:rPr>
+        <w:t>END IF</w:t>
+      </w:r>
+    </w:p>
+    <w:p>
+      <w:pPr>
+        <w:spacing w:line="360" w:lineRule="auto"/>
+        <w:rPr>
+          <w:rFonts w:ascii="Arial" w:hAnsi="Arial" w:cs="Arial"/>
+          <w:sz w:val="24"/>
+          <w:szCs w:val="24"/>
+          <w:lang w:val="en-US"/>
+        </w:rPr>
+      </w:pPr>
+    </w:p>
+    <w:p>
+      <w:pPr>
+        <w:spacing w:line="360" w:lineRule="auto"/>
+        <w:rPr>
+          <w:rFonts w:ascii="Arial" w:hAnsi="Arial" w:cs="Arial"/>
+          <w:sz w:val="24"/>
+          <w:szCs w:val="24"/>
+          <w:lang w:val="en-US"/>
+        </w:rPr>
+      </w:pPr>
+      <w:r>
+        <w:rPr>
+          <w:rFonts w:ascii="Arial" w:hAnsi="Arial" w:cs="Arial"/>
+          <w:sz w:val="24"/>
+          <w:szCs w:val="24"/>
+          <w:lang w:val="en-US"/>
+        </w:rPr>
+        <w:t xml:space="preserve">   </w:t>
+      </w:r>
+      <w:r>
+        <w:rPr>
+          <w:rFonts w:ascii="Arial" w:hAnsi="Arial" w:cs="Arial"/>
+          <w:sz w:val="24"/>
+          <w:szCs w:val="24"/>
+          <w:lang w:val="en-US"/>
+        </w:rPr>
+        <w:t>IF credits are outside the valid range</w:t>
+      </w:r>
+    </w:p>
+    <w:p>
+      <w:pPr>
+        <w:spacing w:line="360" w:lineRule="auto"/>
+        <w:rPr>
+          <w:rFonts w:ascii="Arial" w:hAnsi="Arial" w:cs="Arial"/>
+          <w:sz w:val="24"/>
+          <w:szCs w:val="24"/>
+          <w:lang w:val="en-US"/>
+        </w:rPr>
+      </w:pPr>
+      <w:r>
+        <w:rPr>
+          <w:rFonts w:ascii="Arial" w:hAnsi="Arial" w:cs="Arial"/>
+          <w:sz w:val="24"/>
+          <w:szCs w:val="24"/>
+          <w:lang w:val="en-US"/>
+        </w:rPr>
+        <w:t xml:space="preserve">      </w:t>
+      </w:r>
+      <w:r>
+        <w:rPr>
+          <w:rFonts w:ascii="Arial" w:hAnsi="Arial" w:cs="Arial"/>
+          <w:sz w:val="24"/>
+          <w:szCs w:val="24"/>
+          <w:lang w:val="en-US"/>
+        </w:rPr>
+        <w:t>DISPLAY validation error</w:t>
+      </w:r>
+    </w:p>
+    <w:p>
+      <w:pPr>
+        <w:spacing w:line="360" w:lineRule="auto"/>
+        <w:rPr>
+          <w:rFonts w:ascii="Arial" w:hAnsi="Arial" w:cs="Arial"/>
+          <w:sz w:val="24"/>
+          <w:szCs w:val="24"/>
+          <w:lang w:val="en-US"/>
+        </w:rPr>
+      </w:pPr>
+      <w:r>
+        <w:rPr>
+          <w:rFonts w:ascii="Arial" w:hAnsi="Arial" w:cs="Arial"/>
+          <w:sz w:val="24"/>
+          <w:szCs w:val="24"/>
+          <w:lang w:val="en-US"/>
+        </w:rPr>
+        <w:t xml:space="preserve">      </w:t>
+      </w:r>
+      <w:r>
+        <w:rPr>
+          <w:rFonts w:ascii="Arial" w:hAnsi="Arial" w:cs="Arial"/>
+          <w:sz w:val="24"/>
+          <w:szCs w:val="24"/>
+          <w:lang w:val="en-US"/>
+        </w:rPr>
+        <w:t>STOP</w:t>
+      </w:r>
+    </w:p>
+    <w:p>
+      <w:pPr>
+        <w:spacing w:line="360" w:lineRule="auto"/>
+        <w:rPr>
+          <w:rFonts w:ascii="Arial" w:hAnsi="Arial" w:cs="Arial"/>
+          <w:sz w:val="24"/>
+          <w:szCs w:val="24"/>
+          <w:lang w:val="en-US"/>
+        </w:rPr>
+      </w:pPr>
+      <w:r>
+        <w:rPr>
+          <w:rFonts w:ascii="Arial" w:hAnsi="Arial" w:cs="Arial"/>
+          <w:sz w:val="24"/>
+          <w:szCs w:val="24"/>
+          <w:lang w:val="en-US"/>
+        </w:rPr>
+        <w:t xml:space="preserve">   </w:t>
+      </w:r>
+      <w:r>
+        <w:rPr>
+          <w:rFonts w:ascii="Arial" w:hAnsi="Arial" w:cs="Arial"/>
+          <w:sz w:val="24"/>
+          <w:szCs w:val="24"/>
+          <w:lang w:val="en-US"/>
+        </w:rPr>
+        <w:t>END IF</w:t>
+      </w:r>
+    </w:p>
+    <w:p>
+      <w:pPr>
+        <w:spacing w:line="360" w:lineRule="auto"/>
+        <w:rPr>
+          <w:rFonts w:ascii="Arial" w:hAnsi="Arial" w:cs="Arial"/>
+          <w:sz w:val="24"/>
+          <w:szCs w:val="24"/>
+          <w:lang w:val="en-US"/>
+        </w:rPr>
+      </w:pPr>
+    </w:p>
+    <w:p>
+      <w:pPr>
+        <w:spacing w:line="360" w:lineRule="auto"/>
+        <w:rPr>
+          <w:rFonts w:ascii="Arial" w:hAnsi="Arial" w:cs="Arial"/>
+          <w:sz w:val="24"/>
+          <w:szCs w:val="24"/>
+          <w:lang w:val="en-US"/>
+        </w:rPr>
+      </w:pPr>
+      <w:r>
+        <w:rPr>
+          <w:rFonts w:ascii="Arial" w:hAnsi="Arial" w:cs="Arial"/>
+          <w:sz w:val="24"/>
+          <w:szCs w:val="24"/>
+          <w:lang w:val="en-US"/>
+        </w:rPr>
+        <w:t xml:space="preserve">   </w:t>
+      </w:r>
+      <w:r>
+        <w:rPr>
+          <w:rFonts w:ascii="Arial" w:hAnsi="Arial" w:cs="Arial"/>
+          <w:sz w:val="24"/>
+          <w:szCs w:val="24"/>
+          <w:lang w:val="en-US"/>
+        </w:rPr>
+        <w:t>IF grade is not valid</w:t>
+      </w:r>
+    </w:p>
+    <w:p>
+      <w:pPr>
+        <w:spacing w:line="360" w:lineRule="auto"/>
+        <w:rPr>
+          <w:rFonts w:ascii="Arial" w:hAnsi="Arial" w:cs="Arial"/>
+          <w:sz w:val="24"/>
+          <w:szCs w:val="24"/>
+          <w:lang w:val="en-US"/>
+        </w:rPr>
+      </w:pPr>
+      <w:r>
+        <w:rPr>
+          <w:rFonts w:ascii="Arial" w:hAnsi="Arial" w:cs="Arial"/>
+          <w:sz w:val="24"/>
+          <w:szCs w:val="24"/>
+          <w:lang w:val="en-US"/>
+        </w:rPr>
+        <w:t xml:space="preserve">      </w:t>
+      </w:r>
+      <w:r>
+        <w:rPr>
+          <w:rFonts w:ascii="Arial" w:hAnsi="Arial" w:cs="Arial"/>
+          <w:sz w:val="24"/>
+          <w:szCs w:val="24"/>
+          <w:lang w:val="en-US"/>
+        </w:rPr>
+        <w:t>DISPLAY validation error</w:t>
+      </w:r>
+    </w:p>
+    <w:p>
+      <w:pPr>
+        <w:spacing w:line="360" w:lineRule="auto"/>
+        <w:rPr>
+          <w:rFonts w:ascii="Arial" w:hAnsi="Arial" w:cs="Arial"/>
+          <w:sz w:val="24"/>
+          <w:szCs w:val="24"/>
+          <w:lang w:val="en-US"/>
+        </w:rPr>
+      </w:pPr>
+      <w:r>
+        <w:rPr>
+          <w:rFonts w:ascii="Arial" w:hAnsi="Arial" w:cs="Arial"/>
+          <w:sz w:val="24"/>
+          <w:szCs w:val="24"/>
+          <w:lang w:val="en-US"/>
+        </w:rPr>
+        <w:t xml:space="preserve">      </w:t>
+      </w:r>
+      <w:r>
+        <w:rPr>
+          <w:rFonts w:ascii="Arial" w:hAnsi="Arial" w:cs="Arial"/>
+          <w:sz w:val="24"/>
+          <w:szCs w:val="24"/>
+          <w:lang w:val="en-US"/>
+        </w:rPr>
+        <w:t>STOP</w:t>
+      </w:r>
+    </w:p>
+    <w:p>
+      <w:pPr>
+        <w:spacing w:line="360" w:lineRule="auto"/>
+        <w:rPr>
+          <w:rFonts w:ascii="Arial" w:hAnsi="Arial" w:cs="Arial"/>
+          <w:sz w:val="24"/>
+          <w:szCs w:val="24"/>
+          <w:lang w:val="en-US"/>
+        </w:rPr>
+      </w:pPr>
+      <w:r>
+        <w:rPr>
+          <w:rFonts w:ascii="Arial" w:hAnsi="Arial" w:cs="Arial"/>
+          <w:sz w:val="24"/>
+          <w:szCs w:val="24"/>
+          <w:lang w:val="en-US"/>
+        </w:rPr>
+        <w:t xml:space="preserve">   </w:t>
+      </w:r>
+      <w:r>
+        <w:rPr>
+          <w:rFonts w:ascii="Arial" w:hAnsi="Arial" w:cs="Arial"/>
+          <w:sz w:val="24"/>
+          <w:szCs w:val="24"/>
+          <w:lang w:val="en-US"/>
+        </w:rPr>
+        <w:t>END IF</w:t>
+      </w:r>
+    </w:p>
+    <w:p>
+      <w:pPr>
+        <w:spacing w:line="360" w:lineRule="auto"/>
+        <w:rPr>
+          <w:rFonts w:ascii="Arial" w:hAnsi="Arial" w:cs="Arial"/>
+          <w:sz w:val="24"/>
+          <w:szCs w:val="24"/>
+          <w:lang w:val="en-US"/>
+        </w:rPr>
+      </w:pPr>
+    </w:p>
+    <w:p>
+      <w:pPr>
+        <w:spacing w:line="360" w:lineRule="auto"/>
+        <w:rPr>
+          <w:rFonts w:ascii="Arial" w:hAnsi="Arial" w:cs="Arial"/>
+          <w:sz w:val="24"/>
+          <w:szCs w:val="24"/>
+          <w:lang w:val="en-US"/>
+        </w:rPr>
+      </w:pPr>
+      <w:r>
+        <w:rPr>
+          <w:rFonts w:ascii="Arial" w:hAnsi="Arial" w:cs="Arial"/>
+          <w:sz w:val="24"/>
+          <w:szCs w:val="24"/>
+          <w:lang w:val="en-US"/>
+        </w:rPr>
+        <w:t xml:space="preserve">   </w:t>
+      </w:r>
+      <w:r>
+        <w:rPr>
+          <w:rFonts w:ascii="Arial" w:hAnsi="Arial" w:cs="Arial"/>
+          <w:sz w:val="24"/>
+          <w:szCs w:val="24"/>
+          <w:lang w:val="en-US"/>
+        </w:rPr>
+        <w:t>IF semester is empty</w:t>
+      </w:r>
+    </w:p>
+    <w:p>
+      <w:pPr>
+        <w:spacing w:line="360" w:lineRule="auto"/>
+        <w:rPr>
+          <w:rFonts w:ascii="Arial" w:hAnsi="Arial" w:cs="Arial"/>
+          <w:sz w:val="24"/>
+          <w:szCs w:val="24"/>
+          <w:lang w:val="en-US"/>
+        </w:rPr>
+      </w:pPr>
+      <w:r>
+        <w:rPr>
+          <w:rFonts w:ascii="Arial" w:hAnsi="Arial" w:cs="Arial"/>
+          <w:sz w:val="24"/>
+          <w:szCs w:val="24"/>
+          <w:lang w:val="en-US"/>
+        </w:rPr>
+        <w:t xml:space="preserve">      </w:t>
+      </w:r>
+      <w:r>
+        <w:rPr>
+          <w:rFonts w:ascii="Arial" w:hAnsi="Arial" w:cs="Arial"/>
+          <w:sz w:val="24"/>
+          <w:szCs w:val="24"/>
+          <w:lang w:val="en-US"/>
+        </w:rPr>
+        <w:t>DISPLAY validation error</w:t>
+      </w:r>
+    </w:p>
+    <w:p>
+      <w:pPr>
+        <w:spacing w:line="360" w:lineRule="auto"/>
+        <w:rPr>
+          <w:rFonts w:ascii="Arial" w:hAnsi="Arial" w:cs="Arial"/>
+          <w:sz w:val="24"/>
+          <w:szCs w:val="24"/>
+          <w:lang w:val="en-US"/>
+        </w:rPr>
+      </w:pPr>
+      <w:r>
+        <w:rPr>
+          <w:rFonts w:ascii="Arial" w:hAnsi="Arial" w:cs="Arial"/>
+          <w:sz w:val="24"/>
+          <w:szCs w:val="24"/>
+          <w:lang w:val="en-US"/>
+        </w:rPr>
+        <w:t xml:space="preserve">      </w:t>
+      </w:r>
+      <w:r>
+        <w:rPr>
+          <w:rFonts w:ascii="Arial" w:hAnsi="Arial" w:cs="Arial"/>
+          <w:sz w:val="24"/>
+          <w:szCs w:val="24"/>
+          <w:lang w:val="en-US"/>
+        </w:rPr>
+        <w:t>STOP</w:t>
+      </w:r>
+    </w:p>
+    <w:p>
+      <w:pPr>
+        <w:spacing w:line="360" w:lineRule="auto"/>
+        <w:rPr>
+          <w:rFonts w:ascii="Arial" w:hAnsi="Arial" w:cs="Arial"/>
+          <w:sz w:val="24"/>
+          <w:szCs w:val="24"/>
+          <w:lang w:val="en-US"/>
+        </w:rPr>
+      </w:pPr>
+      <w:r>
+        <w:rPr>
+          <w:rFonts w:ascii="Arial" w:hAnsi="Arial" w:cs="Arial"/>
+          <w:sz w:val="24"/>
+          <w:szCs w:val="24"/>
+          <w:lang w:val="en-US"/>
+        </w:rPr>
+        <w:t xml:space="preserve">   </w:t>
+      </w:r>
+      <w:r>
+        <w:rPr>
+          <w:rFonts w:ascii="Arial" w:hAnsi="Arial" w:cs="Arial"/>
+          <w:sz w:val="24"/>
+          <w:szCs w:val="24"/>
+          <w:lang w:val="en-US"/>
+        </w:rPr>
+        <w:t>END IF</w:t>
+      </w:r>
+    </w:p>
+    <w:p>
+      <w:pPr>
+        <w:spacing w:line="360" w:lineRule="auto"/>
+        <w:rPr>
+          <w:rFonts w:ascii="Arial" w:hAnsi="Arial" w:cs="Arial"/>
+          <w:sz w:val="24"/>
+          <w:szCs w:val="24"/>
+          <w:lang w:val="en-US"/>
+        </w:rPr>
+      </w:pPr>
+    </w:p>
+    <w:p>
+      <w:pPr>
+        <w:spacing w:line="360" w:lineRule="auto"/>
+        <w:rPr>
+          <w:rFonts w:ascii="Arial" w:hAnsi="Arial" w:cs="Arial"/>
+          <w:sz w:val="24"/>
+          <w:szCs w:val="24"/>
+          <w:lang w:val="en-US"/>
+        </w:rPr>
+      </w:pPr>
+      <w:r>
+        <w:rPr>
+          <w:rFonts w:ascii="Arial" w:hAnsi="Arial" w:cs="Arial"/>
+          <w:sz w:val="24"/>
+          <w:szCs w:val="24"/>
+          <w:lang w:val="en-US"/>
+        </w:rPr>
+        <w:t xml:space="preserve">   </w:t>
+      </w:r>
+      <w:r>
+        <w:rPr>
+          <w:rFonts w:ascii="Arial" w:hAnsi="Arial" w:cs="Arial"/>
+          <w:sz w:val="24"/>
+          <w:szCs w:val="24"/>
+          <w:lang w:val="en-US"/>
+        </w:rPr>
+        <w:t xml:space="preserve">CREATE new </w:t>
+      </w:r>
+      <w:r>
+        <w:rPr>
+          <w:rFonts w:ascii="Arial" w:hAnsi="Arial" w:cs="Arial"/>
+          <w:sz w:val="24"/>
+          <w:szCs w:val="24"/>
+          <w:lang w:val="en-US"/>
+        </w:rPr>
+        <w:t>C</w:t>
+      </w:r>
+      <w:r>
+        <w:rPr>
+          <w:rFonts w:ascii="Arial" w:hAnsi="Arial" w:cs="Arial"/>
+          <w:sz w:val="24"/>
+          <w:szCs w:val="24"/>
+          <w:lang w:val="en-US"/>
+        </w:rPr>
+        <w:t>ourse</w:t>
+      </w:r>
+    </w:p>
+    <w:p>
+      <w:pPr>
+        <w:spacing w:line="360" w:lineRule="auto"/>
+        <w:rPr>
+          <w:rFonts w:ascii="Arial" w:hAnsi="Arial" w:cs="Arial"/>
+          <w:sz w:val="24"/>
+          <w:szCs w:val="24"/>
+          <w:lang w:val="en-US"/>
+        </w:rPr>
+      </w:pPr>
+    </w:p>
+    <w:p>
+      <w:pPr>
+        <w:spacing w:line="360" w:lineRule="auto"/>
+        <w:rPr>
+          <w:rFonts w:ascii="Arial" w:hAnsi="Arial" w:cs="Arial"/>
+          <w:sz w:val="24"/>
+          <w:szCs w:val="24"/>
+          <w:lang w:val="en-US"/>
+        </w:rPr>
+      </w:pPr>
+      <w:r>
+        <w:rPr>
+          <w:rFonts w:ascii="Arial" w:hAnsi="Arial" w:cs="Arial"/>
+          <w:sz w:val="24"/>
+          <w:szCs w:val="24"/>
+          <w:lang w:val="en-US"/>
+        </w:rPr>
+        <w:t xml:space="preserve">   </w:t>
+      </w:r>
+      <w:r>
+        <w:rPr>
+          <w:rFonts w:ascii="Arial" w:hAnsi="Arial" w:cs="Arial"/>
+          <w:sz w:val="24"/>
+          <w:szCs w:val="24"/>
+          <w:lang w:val="en-US"/>
+        </w:rPr>
+        <w:t>STORE Course</w:t>
+      </w:r>
+    </w:p>
+    <w:p>
+      <w:pPr>
+        <w:spacing w:line="360" w:lineRule="auto"/>
+        <w:rPr>
+          <w:rFonts w:ascii="Arial" w:hAnsi="Arial" w:cs="Arial"/>
+          <w:sz w:val="24"/>
+          <w:szCs w:val="24"/>
+          <w:lang w:val="en-US"/>
+        </w:rPr>
+      </w:pPr>
+    </w:p>
+    <w:p>
+      <w:pPr>
+        <w:spacing w:line="360" w:lineRule="auto"/>
+        <w:rPr>
+          <w:rFonts w:ascii="Arial" w:hAnsi="Arial" w:cs="Arial"/>
+          <w:sz w:val="24"/>
+          <w:szCs w:val="24"/>
+          <w:lang w:val="en-US"/>
+        </w:rPr>
+      </w:pPr>
+      <w:r>
+        <w:rPr>
+          <w:rFonts w:ascii="Arial" w:hAnsi="Arial" w:cs="Arial"/>
+          <w:sz w:val="24"/>
+          <w:szCs w:val="24"/>
+          <w:lang w:val="en-US"/>
+        </w:rPr>
+        <w:t xml:space="preserve">   </w:t>
+      </w:r>
+      <w:r>
+        <w:rPr>
+          <w:rFonts w:ascii="Arial" w:hAnsi="Arial" w:cs="Arial"/>
+          <w:sz w:val="24"/>
+          <w:szCs w:val="24"/>
+          <w:lang w:val="en-US"/>
+        </w:rPr>
+        <w:t>REDIRECT user to Courses page</w:t>
+      </w:r>
+    </w:p>
+    <w:p>
+      <w:pPr>
+        <w:spacing w:line="360" w:lineRule="auto"/>
+        <w:rPr>
+          <w:rFonts w:ascii="Arial" w:hAnsi="Arial" w:cs="Arial"/>
+          <w:sz w:val="24"/>
+          <w:szCs w:val="24"/>
+          <w:lang w:val="en-US"/>
+        </w:rPr>
+      </w:pPr>
+    </w:p>
+    <w:p>
+      <w:pPr>
+        <w:spacing w:line="360" w:lineRule="auto"/>
+        <w:rPr>
+          <w:rFonts w:ascii="Arial" w:hAnsi="Arial" w:cs="Arial"/>
+          <w:sz w:val="24"/>
+          <w:szCs w:val="24"/>
+          <w:lang w:val="en-US"/>
+        </w:rPr>
+      </w:pPr>
+      <w:r>
+        <w:rPr>
+          <w:rFonts w:ascii="Arial" w:hAnsi="Arial" w:cs="Arial"/>
+          <w:sz w:val="24"/>
+          <w:szCs w:val="24"/>
+          <w:lang w:val="en-US"/>
+        </w:rPr>
+        <w:t>END FUNCTION</w:t>
+      </w:r>
+    </w:p>
+    <w:p>
+      <w:pPr>
+        <w:spacing w:line="360" w:lineRule="auto"/>
+        <w:rPr>
+          <w:rFonts w:ascii="Arial" w:hAnsi="Arial" w:cs="Arial"/>
+          <w:sz w:val="24"/>
+          <w:szCs w:val="24"/>
+          <w:lang w:val="en-US"/>
+        </w:rPr>
+      </w:pPr>
+    </w:p>
+    <w:p>
+      <w:pPr>
+        <w:spacing w:line="360" w:lineRule="auto"/>
+        <w:rPr>
+          <w:rFonts w:ascii="Arial" w:hAnsi="Arial" w:cs="Arial"/>
+          <w:sz w:val="24"/>
+          <w:szCs w:val="24"/>
+          <w:lang w:val="en-US"/>
+        </w:rPr>
+      </w:pPr>
+    </w:p>
+    <w:p>
+      <w:pPr>
+        <w:spacing w:line="360" w:lineRule="auto"/>
+        <w:rPr>
+          <w:rFonts w:ascii="Arial" w:hAnsi="Arial" w:cs="Arial"/>
+          <w:sz w:val="24"/>
+          <w:szCs w:val="24"/>
+          <w:lang w:val="en-US"/>
+        </w:rPr>
+      </w:pPr>
+    </w:p>
+    <w:p>
+      <w:pPr>
+        <w:spacing w:line="360" w:lineRule="auto"/>
+        <w:rPr>
+          <w:rFonts w:ascii="Arial" w:hAnsi="Arial" w:cs="Arial"/>
+          <w:sz w:val="24"/>
+          <w:szCs w:val="24"/>
+          <w:lang w:val="en-US"/>
+        </w:rPr>
+      </w:pPr>
+      <w:r>
+        <w:rPr>
+          <w:rFonts w:ascii="Arial" w:hAnsi="Arial" w:cs="Arial"/>
+          <w:sz w:val="24"/>
+          <w:szCs w:val="24"/>
+          <w:lang w:val="en-US"/>
+        </w:rPr>
         <w:t xml:space="preserve">FUNCTION </w:t>
       </w:r>
-      <w:proofErr w:type="spellStart"/>
-      <w:r>
-        <w:rPr>
-          <w:rFonts w:ascii="Arial" w:hAnsi="Arial" w:cs="Arial"/>
-          <w:sz w:val="24"/>
-          <w:szCs w:val="24"/>
-          <w:lang w:val="en-US"/>
-        </w:rPr>
-        <w:t>AddCourse</w:t>
-      </w:r>
-      <w:proofErr w:type="spellEnd"/>
+      <w:r>
+        <w:rPr>
+          <w:rFonts w:ascii="Arial" w:hAnsi="Arial" w:cs="Arial"/>
+          <w:sz w:val="24"/>
+          <w:szCs w:val="24"/>
+          <w:lang w:val="en-US"/>
+        </w:rPr>
+        <w:t>CalculateGPA(courses)</w:t>
+      </w:r>
     </w:p>
     <w:p>
       <w:pPr>
@@ -6112,1091 +7163,7 @@
           <w:szCs w:val="24"/>
           <w:lang w:val="en-US"/>
         </w:rPr>
-        <w:t>DISPLAY Add Course form</w:t>
-      </w:r>
-    </w:p>
-    <w:p>
-      <w:pPr>
-        <w:spacing w:line="360" w:lineRule="auto"/>
-        <w:rPr>
-          <w:rFonts w:ascii="Arial" w:hAnsi="Arial" w:cs="Arial"/>
-          <w:sz w:val="24"/>
-          <w:szCs w:val="24"/>
-          <w:lang w:val="en-US"/>
-        </w:rPr>
-      </w:pPr>
-    </w:p>
-    <w:p>
-      <w:pPr>
-        <w:spacing w:line="360" w:lineRule="auto"/>
-        <w:rPr>
-          <w:rFonts w:ascii="Arial" w:hAnsi="Arial" w:cs="Arial"/>
-          <w:sz w:val="24"/>
-          <w:szCs w:val="24"/>
-          <w:lang w:val="en-US"/>
-        </w:rPr>
-      </w:pPr>
-      <w:r>
-        <w:rPr>
-          <w:rFonts w:ascii="Arial" w:hAnsi="Arial" w:cs="Arial"/>
-          <w:sz w:val="24"/>
-          <w:szCs w:val="24"/>
-          <w:lang w:val="en-US"/>
-        </w:rPr>
-        <w:t xml:space="preserve">   </w:t>
-      </w:r>
-      <w:r>
-        <w:rPr>
-          <w:rFonts w:ascii="Arial" w:hAnsi="Arial" w:cs="Arial"/>
-          <w:sz w:val="24"/>
-          <w:szCs w:val="24"/>
-          <w:lang w:val="en-US"/>
-        </w:rPr>
-        <w:t>READ course code</w:t>
-      </w:r>
-    </w:p>
-    <w:p>
-      <w:pPr>
-        <w:spacing w:line="360" w:lineRule="auto"/>
-        <w:rPr>
-          <w:rFonts w:ascii="Arial" w:hAnsi="Arial" w:cs="Arial"/>
-          <w:sz w:val="24"/>
-          <w:szCs w:val="24"/>
-          <w:lang w:val="en-US"/>
-        </w:rPr>
-      </w:pPr>
-      <w:r>
-        <w:rPr>
-          <w:rFonts w:ascii="Arial" w:hAnsi="Arial" w:cs="Arial"/>
-          <w:sz w:val="24"/>
-          <w:szCs w:val="24"/>
-          <w:lang w:val="en-US"/>
-        </w:rPr>
-        <w:t xml:space="preserve">   </w:t>
-      </w:r>
-      <w:r>
-        <w:rPr>
-          <w:rFonts w:ascii="Arial" w:hAnsi="Arial" w:cs="Arial"/>
-          <w:sz w:val="24"/>
-          <w:szCs w:val="24"/>
-          <w:lang w:val="en-US"/>
-        </w:rPr>
-        <w:t>READ course name</w:t>
-      </w:r>
-    </w:p>
-    <w:p>
-      <w:pPr>
-        <w:spacing w:line="360" w:lineRule="auto"/>
-        <w:rPr>
-          <w:rFonts w:ascii="Arial" w:hAnsi="Arial" w:cs="Arial"/>
-          <w:sz w:val="24"/>
-          <w:szCs w:val="24"/>
-          <w:lang w:val="en-US"/>
-        </w:rPr>
-      </w:pPr>
-      <w:r>
-        <w:rPr>
-          <w:rFonts w:ascii="Arial" w:hAnsi="Arial" w:cs="Arial"/>
-          <w:sz w:val="24"/>
-          <w:szCs w:val="24"/>
-          <w:lang w:val="en-US"/>
-        </w:rPr>
-        <w:t xml:space="preserve">   </w:t>
-      </w:r>
-      <w:r>
-        <w:rPr>
-          <w:rFonts w:ascii="Arial" w:hAnsi="Arial" w:cs="Arial"/>
-          <w:sz w:val="24"/>
-          <w:szCs w:val="24"/>
-          <w:lang w:val="en-US"/>
-        </w:rPr>
-        <w:t>READ credits</w:t>
-      </w:r>
-    </w:p>
-    <w:p>
-      <w:pPr>
-        <w:spacing w:line="360" w:lineRule="auto"/>
-        <w:rPr>
-          <w:rFonts w:ascii="Arial" w:hAnsi="Arial" w:cs="Arial"/>
-          <w:sz w:val="24"/>
-          <w:szCs w:val="24"/>
-          <w:lang w:val="en-US"/>
-        </w:rPr>
-      </w:pPr>
-      <w:r>
-        <w:rPr>
-          <w:rFonts w:ascii="Arial" w:hAnsi="Arial" w:cs="Arial"/>
-          <w:sz w:val="24"/>
-          <w:szCs w:val="24"/>
-          <w:lang w:val="en-US"/>
-        </w:rPr>
-        <w:t xml:space="preserve">   </w:t>
-      </w:r>
-      <w:r>
-        <w:rPr>
-          <w:rFonts w:ascii="Arial" w:hAnsi="Arial" w:cs="Arial"/>
-          <w:sz w:val="24"/>
-          <w:szCs w:val="24"/>
-          <w:lang w:val="en-US"/>
-        </w:rPr>
-        <w:t>READ grade</w:t>
-      </w:r>
-    </w:p>
-    <w:p>
-      <w:pPr>
-        <w:spacing w:line="360" w:lineRule="auto"/>
-        <w:rPr>
-          <w:rFonts w:ascii="Arial" w:hAnsi="Arial" w:cs="Arial"/>
-          <w:sz w:val="24"/>
-          <w:szCs w:val="24"/>
-          <w:lang w:val="en-US"/>
-        </w:rPr>
-      </w:pPr>
-      <w:r>
-        <w:rPr>
-          <w:rFonts w:ascii="Arial" w:hAnsi="Arial" w:cs="Arial"/>
-          <w:sz w:val="24"/>
-          <w:szCs w:val="24"/>
-          <w:lang w:val="en-US"/>
-        </w:rPr>
-        <w:t xml:space="preserve">   </w:t>
-      </w:r>
-      <w:r>
-        <w:rPr>
-          <w:rFonts w:ascii="Arial" w:hAnsi="Arial" w:cs="Arial"/>
-          <w:sz w:val="24"/>
-          <w:szCs w:val="24"/>
-          <w:lang w:val="en-US"/>
-        </w:rPr>
-        <w:t>READ semester</w:t>
-      </w:r>
-    </w:p>
-    <w:p>
-      <w:pPr>
-        <w:spacing w:line="360" w:lineRule="auto"/>
-        <w:rPr>
-          <w:rFonts w:ascii="Arial" w:hAnsi="Arial" w:cs="Arial"/>
-          <w:sz w:val="24"/>
-          <w:szCs w:val="24"/>
-          <w:lang w:val="en-US"/>
-        </w:rPr>
-      </w:pPr>
-    </w:p>
-    <w:p>
-      <w:pPr>
-        <w:spacing w:line="360" w:lineRule="auto"/>
-        <w:rPr>
-          <w:rFonts w:ascii="Arial" w:hAnsi="Arial" w:cs="Arial"/>
-          <w:sz w:val="24"/>
-          <w:szCs w:val="24"/>
-          <w:lang w:val="en-US"/>
-        </w:rPr>
-      </w:pPr>
-      <w:r>
-        <w:rPr>
-          <w:rFonts w:ascii="Arial" w:hAnsi="Arial" w:cs="Arial"/>
-          <w:sz w:val="24"/>
-          <w:szCs w:val="24"/>
-          <w:lang w:val="en-US"/>
-        </w:rPr>
-        <w:t xml:space="preserve">   </w:t>
-      </w:r>
-      <w:r>
-        <w:rPr>
-          <w:rFonts w:ascii="Arial" w:hAnsi="Arial" w:cs="Arial"/>
-          <w:sz w:val="24"/>
-          <w:szCs w:val="24"/>
-          <w:lang w:val="en-US"/>
-        </w:rPr>
-        <w:t>IF course code is empty</w:t>
-      </w:r>
-    </w:p>
-    <w:p>
-      <w:pPr>
-        <w:spacing w:line="360" w:lineRule="auto"/>
-        <w:rPr>
-          <w:rFonts w:ascii="Arial" w:hAnsi="Arial" w:cs="Arial"/>
-          <w:sz w:val="24"/>
-          <w:szCs w:val="24"/>
-          <w:lang w:val="en-US"/>
-        </w:rPr>
-      </w:pPr>
-      <w:r>
-        <w:rPr>
-          <w:rFonts w:ascii="Arial" w:hAnsi="Arial" w:cs="Arial"/>
-          <w:sz w:val="24"/>
-          <w:szCs w:val="24"/>
-          <w:lang w:val="en-US"/>
-        </w:rPr>
-        <w:t xml:space="preserve">      </w:t>
-      </w:r>
-      <w:r>
-        <w:rPr>
-          <w:rFonts w:ascii="Arial" w:hAnsi="Arial" w:cs="Arial"/>
-          <w:sz w:val="24"/>
-          <w:szCs w:val="24"/>
-          <w:lang w:val="en-US"/>
-        </w:rPr>
-        <w:t>DISPLAY validation error</w:t>
-      </w:r>
-    </w:p>
-    <w:p>
-      <w:pPr>
-        <w:spacing w:line="360" w:lineRule="auto"/>
-        <w:rPr>
-          <w:rFonts w:ascii="Arial" w:hAnsi="Arial" w:cs="Arial"/>
-          <w:sz w:val="24"/>
-          <w:szCs w:val="24"/>
-          <w:lang w:val="en-US"/>
-        </w:rPr>
-      </w:pPr>
-      <w:r>
-        <w:rPr>
-          <w:rFonts w:ascii="Arial" w:hAnsi="Arial" w:cs="Arial"/>
-          <w:sz w:val="24"/>
-          <w:szCs w:val="24"/>
-          <w:lang w:val="en-US"/>
-        </w:rPr>
-        <w:t xml:space="preserve">      </w:t>
-      </w:r>
-      <w:r>
-        <w:rPr>
-          <w:rFonts w:ascii="Arial" w:hAnsi="Arial" w:cs="Arial"/>
-          <w:sz w:val="24"/>
-          <w:szCs w:val="24"/>
-          <w:lang w:val="en-US"/>
-        </w:rPr>
-        <w:t>STOP</w:t>
-      </w:r>
-    </w:p>
-    <w:p>
-      <w:pPr>
-        <w:spacing w:line="360" w:lineRule="auto"/>
-        <w:rPr>
-          <w:rFonts w:ascii="Arial" w:hAnsi="Arial" w:cs="Arial"/>
-          <w:sz w:val="24"/>
-          <w:szCs w:val="24"/>
-          <w:lang w:val="en-US"/>
-        </w:rPr>
-      </w:pPr>
-      <w:r>
-        <w:rPr>
-          <w:rFonts w:ascii="Arial" w:hAnsi="Arial" w:cs="Arial"/>
-          <w:sz w:val="24"/>
-          <w:szCs w:val="24"/>
-          <w:lang w:val="en-US"/>
-        </w:rPr>
-        <w:t xml:space="preserve">   </w:t>
-      </w:r>
-      <w:r>
-        <w:rPr>
-          <w:rFonts w:ascii="Arial" w:hAnsi="Arial" w:cs="Arial"/>
-          <w:sz w:val="24"/>
-          <w:szCs w:val="24"/>
-          <w:lang w:val="en-US"/>
-        </w:rPr>
-        <w:t>END IF</w:t>
-      </w:r>
-    </w:p>
-    <w:p>
-      <w:pPr>
-        <w:spacing w:line="360" w:lineRule="auto"/>
-        <w:rPr>
-          <w:rFonts w:ascii="Arial" w:hAnsi="Arial" w:cs="Arial"/>
-          <w:sz w:val="24"/>
-          <w:szCs w:val="24"/>
-          <w:lang w:val="en-US"/>
-        </w:rPr>
-      </w:pPr>
-    </w:p>
-    <w:p>
-      <w:pPr>
-        <w:spacing w:line="360" w:lineRule="auto"/>
-        <w:rPr>
-          <w:rFonts w:ascii="Arial" w:hAnsi="Arial" w:cs="Arial"/>
-          <w:sz w:val="24"/>
-          <w:szCs w:val="24"/>
-          <w:lang w:val="en-US"/>
-        </w:rPr>
-      </w:pPr>
-      <w:r>
-        <w:rPr>
-          <w:rFonts w:ascii="Arial" w:hAnsi="Arial" w:cs="Arial"/>
-          <w:sz w:val="24"/>
-          <w:szCs w:val="24"/>
-          <w:lang w:val="en-US"/>
-        </w:rPr>
-        <w:t xml:space="preserve">   </w:t>
-      </w:r>
-      <w:r>
-        <w:rPr>
-          <w:rFonts w:ascii="Arial" w:hAnsi="Arial" w:cs="Arial"/>
-          <w:sz w:val="24"/>
-          <w:szCs w:val="24"/>
-          <w:lang w:val="en-US"/>
-        </w:rPr>
-        <w:t>IF course name is empty</w:t>
-      </w:r>
-    </w:p>
-    <w:p>
-      <w:pPr>
-        <w:spacing w:line="360" w:lineRule="auto"/>
-        <w:rPr>
-          <w:rFonts w:ascii="Arial" w:hAnsi="Arial" w:cs="Arial"/>
-          <w:sz w:val="24"/>
-          <w:szCs w:val="24"/>
-          <w:lang w:val="en-US"/>
-        </w:rPr>
-      </w:pPr>
-      <w:r>
-        <w:rPr>
-          <w:rFonts w:ascii="Arial" w:hAnsi="Arial" w:cs="Arial"/>
-          <w:sz w:val="24"/>
-          <w:szCs w:val="24"/>
-          <w:lang w:val="en-US"/>
-        </w:rPr>
-        <w:t xml:space="preserve">      </w:t>
-      </w:r>
-      <w:r>
-        <w:rPr>
-          <w:rFonts w:ascii="Arial" w:hAnsi="Arial" w:cs="Arial"/>
-          <w:sz w:val="24"/>
-          <w:szCs w:val="24"/>
-          <w:lang w:val="en-US"/>
-        </w:rPr>
-        <w:t>DISPLAY validation error</w:t>
-      </w:r>
-    </w:p>
-    <w:p>
-      <w:pPr>
-        <w:spacing w:line="360" w:lineRule="auto"/>
-        <w:rPr>
-          <w:rFonts w:ascii="Arial" w:hAnsi="Arial" w:cs="Arial"/>
-          <w:sz w:val="24"/>
-          <w:szCs w:val="24"/>
-          <w:lang w:val="en-US"/>
-        </w:rPr>
-      </w:pPr>
-      <w:r>
-        <w:rPr>
-          <w:rFonts w:ascii="Arial" w:hAnsi="Arial" w:cs="Arial"/>
-          <w:sz w:val="24"/>
-          <w:szCs w:val="24"/>
-          <w:lang w:val="en-US"/>
-        </w:rPr>
-        <w:t xml:space="preserve">      </w:t>
-      </w:r>
-      <w:r>
-        <w:rPr>
-          <w:rFonts w:ascii="Arial" w:hAnsi="Arial" w:cs="Arial"/>
-          <w:sz w:val="24"/>
-          <w:szCs w:val="24"/>
-          <w:lang w:val="en-US"/>
-        </w:rPr>
-        <w:t>STOP</w:t>
-      </w:r>
-    </w:p>
-    <w:p>
-      <w:pPr>
-        <w:spacing w:line="360" w:lineRule="auto"/>
-        <w:rPr>
-          <w:rFonts w:ascii="Arial" w:hAnsi="Arial" w:cs="Arial"/>
-          <w:sz w:val="24"/>
-          <w:szCs w:val="24"/>
-          <w:lang w:val="en-US"/>
-        </w:rPr>
-      </w:pPr>
-      <w:r>
-        <w:rPr>
-          <w:rFonts w:ascii="Arial" w:hAnsi="Arial" w:cs="Arial"/>
-          <w:sz w:val="24"/>
-          <w:szCs w:val="24"/>
-          <w:lang w:val="en-US"/>
-        </w:rPr>
-        <w:t xml:space="preserve">   </w:t>
-      </w:r>
-      <w:r>
-        <w:rPr>
-          <w:rFonts w:ascii="Arial" w:hAnsi="Arial" w:cs="Arial"/>
-          <w:sz w:val="24"/>
-          <w:szCs w:val="24"/>
-          <w:lang w:val="en-US"/>
-        </w:rPr>
-        <w:t>END IF</w:t>
-      </w:r>
-    </w:p>
-    <w:p>
-      <w:pPr>
-        <w:spacing w:line="360" w:lineRule="auto"/>
-        <w:rPr>
-          <w:rFonts w:ascii="Arial" w:hAnsi="Arial" w:cs="Arial"/>
-          <w:sz w:val="24"/>
-          <w:szCs w:val="24"/>
-          <w:lang w:val="en-US"/>
-        </w:rPr>
-      </w:pPr>
-    </w:p>
-    <w:p>
-      <w:pPr>
-        <w:spacing w:line="360" w:lineRule="auto"/>
-        <w:rPr>
-          <w:rFonts w:ascii="Arial" w:hAnsi="Arial" w:cs="Arial"/>
-          <w:sz w:val="24"/>
-          <w:szCs w:val="24"/>
-          <w:lang w:val="en-US"/>
-        </w:rPr>
-      </w:pPr>
-      <w:r>
-        <w:rPr>
-          <w:rFonts w:ascii="Arial" w:hAnsi="Arial" w:cs="Arial"/>
-          <w:sz w:val="24"/>
-          <w:szCs w:val="24"/>
-          <w:lang w:val="en-US"/>
-        </w:rPr>
-        <w:t xml:space="preserve">   </w:t>
-      </w:r>
-      <w:r>
-        <w:rPr>
-          <w:rFonts w:ascii="Arial" w:hAnsi="Arial" w:cs="Arial"/>
-          <w:sz w:val="24"/>
-          <w:szCs w:val="24"/>
-          <w:lang w:val="en-US"/>
-        </w:rPr>
-        <w:t>IF credits are outside the valid range</w:t>
-      </w:r>
-    </w:p>
-    <w:p>
-      <w:pPr>
-        <w:spacing w:line="360" w:lineRule="auto"/>
-        <w:rPr>
-          <w:rFonts w:ascii="Arial" w:hAnsi="Arial" w:cs="Arial"/>
-          <w:sz w:val="24"/>
-          <w:szCs w:val="24"/>
-          <w:lang w:val="en-US"/>
-        </w:rPr>
-      </w:pPr>
-      <w:r>
-        <w:rPr>
-          <w:rFonts w:ascii="Arial" w:hAnsi="Arial" w:cs="Arial"/>
-          <w:sz w:val="24"/>
-          <w:szCs w:val="24"/>
-          <w:lang w:val="en-US"/>
-        </w:rPr>
-        <w:t xml:space="preserve">      </w:t>
-      </w:r>
-      <w:r>
-        <w:rPr>
-          <w:rFonts w:ascii="Arial" w:hAnsi="Arial" w:cs="Arial"/>
-          <w:sz w:val="24"/>
-          <w:szCs w:val="24"/>
-          <w:lang w:val="en-US"/>
-        </w:rPr>
-        <w:t>DISPLAY validation error</w:t>
-      </w:r>
-    </w:p>
-    <w:p>
-      <w:pPr>
-        <w:spacing w:line="360" w:lineRule="auto"/>
-        <w:rPr>
-          <w:rFonts w:ascii="Arial" w:hAnsi="Arial" w:cs="Arial"/>
-          <w:sz w:val="24"/>
-          <w:szCs w:val="24"/>
-          <w:lang w:val="en-US"/>
-        </w:rPr>
-      </w:pPr>
-      <w:r>
-        <w:rPr>
-          <w:rFonts w:ascii="Arial" w:hAnsi="Arial" w:cs="Arial"/>
-          <w:sz w:val="24"/>
-          <w:szCs w:val="24"/>
-          <w:lang w:val="en-US"/>
-        </w:rPr>
-        <w:t xml:space="preserve">      </w:t>
-      </w:r>
-      <w:r>
-        <w:rPr>
-          <w:rFonts w:ascii="Arial" w:hAnsi="Arial" w:cs="Arial"/>
-          <w:sz w:val="24"/>
-          <w:szCs w:val="24"/>
-          <w:lang w:val="en-US"/>
-        </w:rPr>
-        <w:t>STOP</w:t>
-      </w:r>
-    </w:p>
-    <w:p>
-      <w:pPr>
-        <w:spacing w:line="360" w:lineRule="auto"/>
-        <w:rPr>
-          <w:rFonts w:ascii="Arial" w:hAnsi="Arial" w:cs="Arial"/>
-          <w:sz w:val="24"/>
-          <w:szCs w:val="24"/>
-          <w:lang w:val="en-US"/>
-        </w:rPr>
-      </w:pPr>
-      <w:r>
-        <w:rPr>
-          <w:rFonts w:ascii="Arial" w:hAnsi="Arial" w:cs="Arial"/>
-          <w:sz w:val="24"/>
-          <w:szCs w:val="24"/>
-          <w:lang w:val="en-US"/>
-        </w:rPr>
-        <w:t xml:space="preserve">   </w:t>
-      </w:r>
-      <w:r>
-        <w:rPr>
-          <w:rFonts w:ascii="Arial" w:hAnsi="Arial" w:cs="Arial"/>
-          <w:sz w:val="24"/>
-          <w:szCs w:val="24"/>
-          <w:lang w:val="en-US"/>
-        </w:rPr>
-        <w:t>END IF</w:t>
-      </w:r>
-    </w:p>
-    <w:p>
-      <w:pPr>
-        <w:spacing w:line="360" w:lineRule="auto"/>
-        <w:rPr>
-          <w:rFonts w:ascii="Arial" w:hAnsi="Arial" w:cs="Arial"/>
-          <w:sz w:val="24"/>
-          <w:szCs w:val="24"/>
-          <w:lang w:val="en-US"/>
-        </w:rPr>
-      </w:pPr>
-    </w:p>
-    <w:p>
-      <w:pPr>
-        <w:spacing w:line="360" w:lineRule="auto"/>
-        <w:rPr>
-          <w:rFonts w:ascii="Arial" w:hAnsi="Arial" w:cs="Arial"/>
-          <w:sz w:val="24"/>
-          <w:szCs w:val="24"/>
-          <w:lang w:val="en-US"/>
-        </w:rPr>
-      </w:pPr>
-      <w:r>
-        <w:rPr>
-          <w:rFonts w:ascii="Arial" w:hAnsi="Arial" w:cs="Arial"/>
-          <w:sz w:val="24"/>
-          <w:szCs w:val="24"/>
-          <w:lang w:val="en-US"/>
-        </w:rPr>
-        <w:t xml:space="preserve">   </w:t>
-      </w:r>
-      <w:r>
-        <w:rPr>
-          <w:rFonts w:ascii="Arial" w:hAnsi="Arial" w:cs="Arial"/>
-          <w:sz w:val="24"/>
-          <w:szCs w:val="24"/>
-          <w:lang w:val="en-US"/>
-        </w:rPr>
-        <w:t>IF grade is not valid</w:t>
-      </w:r>
-    </w:p>
-    <w:p>
-      <w:pPr>
-        <w:spacing w:line="360" w:lineRule="auto"/>
-        <w:rPr>
-          <w:rFonts w:ascii="Arial" w:hAnsi="Arial" w:cs="Arial"/>
-          <w:sz w:val="24"/>
-          <w:szCs w:val="24"/>
-          <w:lang w:val="en-US"/>
-        </w:rPr>
-      </w:pPr>
-      <w:r>
-        <w:rPr>
-          <w:rFonts w:ascii="Arial" w:hAnsi="Arial" w:cs="Arial"/>
-          <w:sz w:val="24"/>
-          <w:szCs w:val="24"/>
-          <w:lang w:val="en-US"/>
-        </w:rPr>
-        <w:t xml:space="preserve">      </w:t>
-      </w:r>
-      <w:r>
-        <w:rPr>
-          <w:rFonts w:ascii="Arial" w:hAnsi="Arial" w:cs="Arial"/>
-          <w:sz w:val="24"/>
-          <w:szCs w:val="24"/>
-          <w:lang w:val="en-US"/>
-        </w:rPr>
-        <w:t>DISPLAY validation error</w:t>
-      </w:r>
-    </w:p>
-    <w:p>
-      <w:pPr>
-        <w:spacing w:line="360" w:lineRule="auto"/>
-        <w:rPr>
-          <w:rFonts w:ascii="Arial" w:hAnsi="Arial" w:cs="Arial"/>
-          <w:sz w:val="24"/>
-          <w:szCs w:val="24"/>
-          <w:lang w:val="en-US"/>
-        </w:rPr>
-      </w:pPr>
-      <w:r>
-        <w:rPr>
-          <w:rFonts w:ascii="Arial" w:hAnsi="Arial" w:cs="Arial"/>
-          <w:sz w:val="24"/>
-          <w:szCs w:val="24"/>
-          <w:lang w:val="en-US"/>
-        </w:rPr>
-        <w:t xml:space="preserve">      </w:t>
-      </w:r>
-      <w:r>
-        <w:rPr>
-          <w:rFonts w:ascii="Arial" w:hAnsi="Arial" w:cs="Arial"/>
-          <w:sz w:val="24"/>
-          <w:szCs w:val="24"/>
-          <w:lang w:val="en-US"/>
-        </w:rPr>
-        <w:t>STOP</w:t>
-      </w:r>
-    </w:p>
-    <w:p>
-      <w:pPr>
-        <w:spacing w:line="360" w:lineRule="auto"/>
-        <w:rPr>
-          <w:rFonts w:ascii="Arial" w:hAnsi="Arial" w:cs="Arial"/>
-          <w:sz w:val="24"/>
-          <w:szCs w:val="24"/>
-          <w:lang w:val="en-US"/>
-        </w:rPr>
-      </w:pPr>
-      <w:r>
-        <w:rPr>
-          <w:rFonts w:ascii="Arial" w:hAnsi="Arial" w:cs="Arial"/>
-          <w:sz w:val="24"/>
-          <w:szCs w:val="24"/>
-          <w:lang w:val="en-US"/>
-        </w:rPr>
-        <w:t xml:space="preserve">   </w:t>
-      </w:r>
-      <w:r>
-        <w:rPr>
-          <w:rFonts w:ascii="Arial" w:hAnsi="Arial" w:cs="Arial"/>
-          <w:sz w:val="24"/>
-          <w:szCs w:val="24"/>
-          <w:lang w:val="en-US"/>
-        </w:rPr>
-        <w:t>END IF</w:t>
-      </w:r>
-    </w:p>
-    <w:p>
-      <w:pPr>
-        <w:spacing w:line="360" w:lineRule="auto"/>
-        <w:rPr>
-          <w:rFonts w:ascii="Arial" w:hAnsi="Arial" w:cs="Arial"/>
-          <w:sz w:val="24"/>
-          <w:szCs w:val="24"/>
-          <w:lang w:val="en-US"/>
-        </w:rPr>
-      </w:pPr>
-    </w:p>
-    <w:p>
-      <w:pPr>
-        <w:spacing w:line="360" w:lineRule="auto"/>
-        <w:rPr>
-          <w:rFonts w:ascii="Arial" w:hAnsi="Arial" w:cs="Arial"/>
-          <w:sz w:val="24"/>
-          <w:szCs w:val="24"/>
-          <w:lang w:val="en-US"/>
-        </w:rPr>
-      </w:pPr>
-      <w:r>
-        <w:rPr>
-          <w:rFonts w:ascii="Arial" w:hAnsi="Arial" w:cs="Arial"/>
-          <w:sz w:val="24"/>
-          <w:szCs w:val="24"/>
-          <w:lang w:val="en-US"/>
-        </w:rPr>
-        <w:t xml:space="preserve">   </w:t>
-      </w:r>
-      <w:r>
-        <w:rPr>
-          <w:rFonts w:ascii="Arial" w:hAnsi="Arial" w:cs="Arial"/>
-          <w:sz w:val="24"/>
-          <w:szCs w:val="24"/>
-          <w:lang w:val="en-US"/>
-        </w:rPr>
-        <w:t>IF semester is empty</w:t>
-      </w:r>
-    </w:p>
-    <w:p>
-      <w:pPr>
-        <w:spacing w:line="360" w:lineRule="auto"/>
-        <w:rPr>
-          <w:rFonts w:ascii="Arial" w:hAnsi="Arial" w:cs="Arial"/>
-          <w:sz w:val="24"/>
-          <w:szCs w:val="24"/>
-          <w:lang w:val="en-US"/>
-        </w:rPr>
-      </w:pPr>
-      <w:r>
-        <w:rPr>
-          <w:rFonts w:ascii="Arial" w:hAnsi="Arial" w:cs="Arial"/>
-          <w:sz w:val="24"/>
-          <w:szCs w:val="24"/>
-          <w:lang w:val="en-US"/>
-        </w:rPr>
-        <w:t xml:space="preserve">      </w:t>
-      </w:r>
-      <w:r>
-        <w:rPr>
-          <w:rFonts w:ascii="Arial" w:hAnsi="Arial" w:cs="Arial"/>
-          <w:sz w:val="24"/>
-          <w:szCs w:val="24"/>
-          <w:lang w:val="en-US"/>
-        </w:rPr>
-        <w:t>DISPLAY validation error</w:t>
-      </w:r>
-    </w:p>
-    <w:p>
-      <w:pPr>
-        <w:spacing w:line="360" w:lineRule="auto"/>
-        <w:rPr>
-          <w:rFonts w:ascii="Arial" w:hAnsi="Arial" w:cs="Arial"/>
-          <w:sz w:val="24"/>
-          <w:szCs w:val="24"/>
-          <w:lang w:val="en-US"/>
-        </w:rPr>
-      </w:pPr>
-      <w:r>
-        <w:rPr>
-          <w:rFonts w:ascii="Arial" w:hAnsi="Arial" w:cs="Arial"/>
-          <w:sz w:val="24"/>
-          <w:szCs w:val="24"/>
-          <w:lang w:val="en-US"/>
-        </w:rPr>
-        <w:t xml:space="preserve">      </w:t>
-      </w:r>
-      <w:r>
-        <w:rPr>
-          <w:rFonts w:ascii="Arial" w:hAnsi="Arial" w:cs="Arial"/>
-          <w:sz w:val="24"/>
-          <w:szCs w:val="24"/>
-          <w:lang w:val="en-US"/>
-        </w:rPr>
-        <w:t>STOP</w:t>
-      </w:r>
-    </w:p>
-    <w:p>
-      <w:pPr>
-        <w:spacing w:line="360" w:lineRule="auto"/>
-        <w:rPr>
-          <w:rFonts w:ascii="Arial" w:hAnsi="Arial" w:cs="Arial"/>
-          <w:sz w:val="24"/>
-          <w:szCs w:val="24"/>
-          <w:lang w:val="en-US"/>
-        </w:rPr>
-      </w:pPr>
-      <w:r>
-        <w:rPr>
-          <w:rFonts w:ascii="Arial" w:hAnsi="Arial" w:cs="Arial"/>
-          <w:sz w:val="24"/>
-          <w:szCs w:val="24"/>
-          <w:lang w:val="en-US"/>
-        </w:rPr>
-        <w:t xml:space="preserve">   </w:t>
-      </w:r>
-      <w:r>
-        <w:rPr>
-          <w:rFonts w:ascii="Arial" w:hAnsi="Arial" w:cs="Arial"/>
-          <w:sz w:val="24"/>
-          <w:szCs w:val="24"/>
-          <w:lang w:val="en-US"/>
-        </w:rPr>
-        <w:t>END IF</w:t>
-      </w:r>
-    </w:p>
-    <w:p>
-      <w:pPr>
-        <w:spacing w:line="360" w:lineRule="auto"/>
-        <w:rPr>
-          <w:rFonts w:ascii="Arial" w:hAnsi="Arial" w:cs="Arial"/>
-          <w:sz w:val="24"/>
-          <w:szCs w:val="24"/>
-          <w:lang w:val="en-US"/>
-        </w:rPr>
-      </w:pPr>
-    </w:p>
-    <w:p>
-      <w:pPr>
-        <w:spacing w:line="360" w:lineRule="auto"/>
-        <w:rPr>
-          <w:rFonts w:ascii="Arial" w:hAnsi="Arial" w:cs="Arial"/>
-          <w:sz w:val="24"/>
-          <w:szCs w:val="24"/>
-          <w:lang w:val="en-US"/>
-        </w:rPr>
-      </w:pPr>
-      <w:r>
-        <w:rPr>
-          <w:rFonts w:ascii="Arial" w:hAnsi="Arial" w:cs="Arial"/>
-          <w:sz w:val="24"/>
-          <w:szCs w:val="24"/>
-          <w:lang w:val="en-US"/>
-        </w:rPr>
-        <w:t xml:space="preserve">   </w:t>
-      </w:r>
-      <w:r>
-        <w:rPr>
-          <w:rFonts w:ascii="Arial" w:hAnsi="Arial" w:cs="Arial"/>
-          <w:sz w:val="24"/>
-          <w:szCs w:val="24"/>
-          <w:lang w:val="en-US"/>
-        </w:rPr>
-        <w:t xml:space="preserve">CREATE new </w:t>
-      </w:r>
-      <w:r>
-        <w:rPr>
-          <w:rFonts w:ascii="Arial" w:hAnsi="Arial" w:cs="Arial"/>
-          <w:sz w:val="24"/>
-          <w:szCs w:val="24"/>
-          <w:lang w:val="en-US"/>
-        </w:rPr>
-        <w:t>C</w:t>
-      </w:r>
-      <w:r>
-        <w:rPr>
-          <w:rFonts w:ascii="Arial" w:hAnsi="Arial" w:cs="Arial"/>
-          <w:sz w:val="24"/>
-          <w:szCs w:val="24"/>
-          <w:lang w:val="en-US"/>
-        </w:rPr>
-        <w:t>ourse</w:t>
-      </w:r>
-    </w:p>
-    <w:p>
-      <w:pPr>
-        <w:spacing w:line="360" w:lineRule="auto"/>
-        <w:rPr>
-          <w:rFonts w:ascii="Arial" w:hAnsi="Arial" w:cs="Arial"/>
-          <w:sz w:val="24"/>
-          <w:szCs w:val="24"/>
-          <w:lang w:val="en-US"/>
-        </w:rPr>
-      </w:pPr>
-    </w:p>
-    <w:p>
-      <w:pPr>
-        <w:spacing w:line="360" w:lineRule="auto"/>
-        <w:rPr>
-          <w:rFonts w:ascii="Arial" w:hAnsi="Arial" w:cs="Arial"/>
-          <w:sz w:val="24"/>
-          <w:szCs w:val="24"/>
-          <w:lang w:val="en-US"/>
-        </w:rPr>
-      </w:pPr>
-      <w:r>
-        <w:rPr>
-          <w:rFonts w:ascii="Arial" w:hAnsi="Arial" w:cs="Arial"/>
-          <w:sz w:val="24"/>
-          <w:szCs w:val="24"/>
-          <w:lang w:val="en-US"/>
-        </w:rPr>
-        <w:t xml:space="preserve">   </w:t>
-      </w:r>
-      <w:r>
-        <w:rPr>
-          <w:rFonts w:ascii="Arial" w:hAnsi="Arial" w:cs="Arial"/>
-          <w:sz w:val="24"/>
-          <w:szCs w:val="24"/>
-          <w:lang w:val="en-US"/>
-        </w:rPr>
-        <w:t>STORE Course</w:t>
-      </w:r>
-    </w:p>
-    <w:p>
-      <w:pPr>
-        <w:spacing w:line="360" w:lineRule="auto"/>
-        <w:rPr>
-          <w:rFonts w:ascii="Arial" w:hAnsi="Arial" w:cs="Arial"/>
-          <w:sz w:val="24"/>
-          <w:szCs w:val="24"/>
-          <w:lang w:val="en-US"/>
-        </w:rPr>
-      </w:pPr>
-    </w:p>
-    <w:p>
-      <w:pPr>
-        <w:spacing w:line="360" w:lineRule="auto"/>
-        <w:rPr>
-          <w:rFonts w:ascii="Arial" w:hAnsi="Arial" w:cs="Arial"/>
-          <w:sz w:val="24"/>
-          <w:szCs w:val="24"/>
-          <w:lang w:val="en-US"/>
-        </w:rPr>
-      </w:pPr>
-      <w:r>
-        <w:rPr>
-          <w:rFonts w:ascii="Arial" w:hAnsi="Arial" w:cs="Arial"/>
-          <w:sz w:val="24"/>
-          <w:szCs w:val="24"/>
-          <w:lang w:val="en-US"/>
-        </w:rPr>
-        <w:t xml:space="preserve">   </w:t>
-      </w:r>
-      <w:r>
-        <w:rPr>
-          <w:rFonts w:ascii="Arial" w:hAnsi="Arial" w:cs="Arial"/>
-          <w:sz w:val="24"/>
-          <w:szCs w:val="24"/>
-          <w:lang w:val="en-US"/>
-        </w:rPr>
-        <w:t>REDIRECT user to Courses page</w:t>
-      </w:r>
-    </w:p>
-    <w:p>
-      <w:pPr>
-        <w:spacing w:line="360" w:lineRule="auto"/>
-        <w:rPr>
-          <w:rFonts w:ascii="Arial" w:hAnsi="Arial" w:cs="Arial"/>
-          <w:sz w:val="24"/>
-          <w:szCs w:val="24"/>
-          <w:lang w:val="en-US"/>
-        </w:rPr>
-      </w:pPr>
-    </w:p>
-    <w:p>
-      <w:pPr>
-        <w:spacing w:line="360" w:lineRule="auto"/>
-        <w:rPr>
-          <w:rFonts w:ascii="Arial" w:hAnsi="Arial" w:cs="Arial"/>
-          <w:sz w:val="24"/>
-          <w:szCs w:val="24"/>
-          <w:lang w:val="en-US"/>
-        </w:rPr>
-      </w:pPr>
-      <w:r>
-        <w:rPr>
-          <w:rFonts w:ascii="Arial" w:hAnsi="Arial" w:cs="Arial"/>
-          <w:sz w:val="24"/>
-          <w:szCs w:val="24"/>
-          <w:lang w:val="en-US"/>
-        </w:rPr>
-        <w:t>END FUNCTION</w:t>
-      </w:r>
-    </w:p>
-    <w:p>
-      <w:pPr>
-        <w:spacing w:line="360" w:lineRule="auto"/>
-        <w:rPr>
-          <w:rFonts w:ascii="Arial" w:hAnsi="Arial" w:cs="Arial"/>
-          <w:sz w:val="24"/>
-          <w:szCs w:val="24"/>
-          <w:lang w:val="en-US"/>
-        </w:rPr>
-      </w:pPr>
-    </w:p>
-    <w:p>
-      <w:pPr>
-        <w:spacing w:line="360" w:lineRule="auto"/>
-        <w:rPr>
-          <w:rFonts w:ascii="Arial" w:hAnsi="Arial" w:cs="Arial"/>
-          <w:sz w:val="24"/>
-          <w:szCs w:val="24"/>
-          <w:lang w:val="en-US"/>
-        </w:rPr>
-      </w:pPr>
-    </w:p>
-    <w:p>
-      <w:pPr>
-        <w:spacing w:line="360" w:lineRule="auto"/>
-        <w:rPr>
-          <w:rFonts w:ascii="Arial" w:hAnsi="Arial" w:cs="Arial"/>
-          <w:sz w:val="24"/>
-          <w:szCs w:val="24"/>
-          <w:lang w:val="en-US"/>
-        </w:rPr>
-      </w:pPr>
-    </w:p>
-    <w:p>
-      <w:pPr>
-        <w:spacing w:line="360" w:lineRule="auto"/>
-        <w:rPr>
-          <w:rFonts w:ascii="Arial" w:hAnsi="Arial" w:cs="Arial"/>
-          <w:sz w:val="24"/>
-          <w:szCs w:val="24"/>
-          <w:lang w:val="en-US"/>
-        </w:rPr>
-      </w:pPr>
-      <w:r>
-        <w:rPr>
-          <w:rFonts w:ascii="Arial" w:hAnsi="Arial" w:cs="Arial"/>
-          <w:sz w:val="24"/>
-          <w:szCs w:val="24"/>
-          <w:lang w:val="en-US"/>
-        </w:rPr>
-        <w:t xml:space="preserve">FUNCTION </w:t>
-      </w:r>
-      <w:proofErr w:type="spellStart"/>
-      <w:r>
-        <w:rPr>
-          <w:rFonts w:ascii="Arial" w:hAnsi="Arial" w:cs="Arial"/>
-          <w:sz w:val="24"/>
-          <w:szCs w:val="24"/>
-          <w:lang w:val="en-US"/>
-        </w:rPr>
-        <w:t>CalculateGPA</w:t>
-      </w:r>
-      <w:proofErr w:type="spellEnd"/>
-      <w:r>
-        <w:rPr>
-          <w:rFonts w:ascii="Arial" w:hAnsi="Arial" w:cs="Arial"/>
-          <w:sz w:val="24"/>
-          <w:szCs w:val="24"/>
-          <w:lang w:val="en-US"/>
-        </w:rPr>
-        <w:t>(courses)</w:t>
-      </w:r>
-    </w:p>
-    <w:p>
-      <w:pPr>
-        <w:spacing w:line="360" w:lineRule="auto"/>
-        <w:rPr>
-          <w:rFonts w:ascii="Arial" w:hAnsi="Arial" w:cs="Arial"/>
-          <w:sz w:val="24"/>
-          <w:szCs w:val="24"/>
-          <w:lang w:val="en-US"/>
-        </w:rPr>
-      </w:pPr>
-    </w:p>
-    <w:p>
-      <w:pPr>
-        <w:spacing w:line="360" w:lineRule="auto"/>
-        <w:rPr>
-          <w:rFonts w:ascii="Arial" w:hAnsi="Arial" w:cs="Arial"/>
-          <w:sz w:val="24"/>
-          <w:szCs w:val="24"/>
-          <w:lang w:val="en-US"/>
-        </w:rPr>
-      </w:pPr>
-      <w:r>
-        <w:rPr>
-          <w:rFonts w:ascii="Arial" w:hAnsi="Arial" w:cs="Arial"/>
-          <w:sz w:val="24"/>
-          <w:szCs w:val="24"/>
-          <w:lang w:val="en-US"/>
-        </w:rPr>
-        <w:t xml:space="preserve">   </w:t>
-      </w:r>
-      <w:proofErr w:type="spellStart"/>
-      <w:r>
-        <w:rPr>
-          <w:rFonts w:ascii="Arial" w:hAnsi="Arial" w:cs="Arial"/>
-          <w:sz w:val="24"/>
-          <w:szCs w:val="24"/>
-          <w:lang w:val="en-US"/>
-        </w:rPr>
-        <w:t>totalQualityPoints</w:t>
-      </w:r>
-      <w:proofErr w:type="spellEnd"/>
-      <w:r>
-        <w:rPr>
-          <w:rFonts w:ascii="Arial" w:hAnsi="Arial" w:cs="Arial"/>
-          <w:sz w:val="24"/>
-          <w:szCs w:val="24"/>
-          <w:lang w:val="en-US"/>
-        </w:rPr>
-        <w:t xml:space="preserve"> = 0</w:t>
+        <w:t>totalQualityPoints = 0</w:t>
       </w:r>
     </w:p>
     <w:p>
@@ -7219,17 +7186,336 @@
         <w:lastRenderedPageBreak/>
         <w:t xml:space="preserve">   </w:t>
       </w:r>
-      <w:proofErr w:type="spellStart"/>
-      <w:r>
-        <w:rPr>
-          <w:rFonts w:ascii="Arial" w:hAnsi="Arial" w:cs="Arial"/>
-          <w:sz w:val="24"/>
-          <w:szCs w:val="24"/>
-          <w:lang w:val="en-US"/>
-        </w:rPr>
-        <w:t>attemptedCredits</w:t>
-      </w:r>
-      <w:proofErr w:type="spellEnd"/>
+      <w:r>
+        <w:rPr>
+          <w:rFonts w:ascii="Arial" w:hAnsi="Arial" w:cs="Arial"/>
+          <w:sz w:val="24"/>
+          <w:szCs w:val="24"/>
+          <w:lang w:val="en-US"/>
+        </w:rPr>
+        <w:t>attemptedCredits = 0</w:t>
+      </w:r>
+    </w:p>
+    <w:p>
+      <w:pPr>
+        <w:spacing w:line="360" w:lineRule="auto"/>
+        <w:rPr>
+          <w:rFonts w:ascii="Arial" w:hAnsi="Arial" w:cs="Arial"/>
+          <w:sz w:val="24"/>
+          <w:szCs w:val="24"/>
+          <w:lang w:val="en-US"/>
+        </w:rPr>
+      </w:pPr>
+    </w:p>
+    <w:p>
+      <w:pPr>
+        <w:spacing w:line="360" w:lineRule="auto"/>
+        <w:rPr>
+          <w:rFonts w:ascii="Arial" w:hAnsi="Arial" w:cs="Arial"/>
+          <w:sz w:val="24"/>
+          <w:szCs w:val="24"/>
+          <w:lang w:val="en-US"/>
+        </w:rPr>
+      </w:pPr>
+      <w:r>
+        <w:rPr>
+          <w:rFonts w:ascii="Arial" w:hAnsi="Arial" w:cs="Arial"/>
+          <w:sz w:val="24"/>
+          <w:szCs w:val="24"/>
+          <w:lang w:val="en-US"/>
+        </w:rPr>
+        <w:t xml:space="preserve">   </w:t>
+      </w:r>
+      <w:r>
+        <w:rPr>
+          <w:rFonts w:ascii="Arial" w:hAnsi="Arial" w:cs="Arial"/>
+          <w:sz w:val="24"/>
+          <w:szCs w:val="24"/>
+          <w:lang w:val="en-US"/>
+        </w:rPr>
+        <w:t>FOR EACH</w:t>
+      </w:r>
+      <w:r>
+        <w:rPr>
+          <w:rFonts w:ascii="Arial" w:hAnsi="Arial" w:cs="Arial"/>
+          <w:sz w:val="24"/>
+          <w:szCs w:val="24"/>
+          <w:lang w:val="en-US"/>
+        </w:rPr>
+        <w:t xml:space="preserve"> </w:t>
+      </w:r>
+      <w:r>
+        <w:rPr>
+          <w:rFonts w:ascii="Arial" w:hAnsi="Arial" w:cs="Arial"/>
+          <w:sz w:val="24"/>
+          <w:szCs w:val="24"/>
+          <w:lang w:val="en-US"/>
+        </w:rPr>
+        <w:t>course IN courses</w:t>
+      </w:r>
+    </w:p>
+    <w:p>
+      <w:pPr>
+        <w:spacing w:line="360" w:lineRule="auto"/>
+        <w:rPr>
+          <w:rFonts w:ascii="Arial" w:hAnsi="Arial" w:cs="Arial"/>
+          <w:sz w:val="24"/>
+          <w:szCs w:val="24"/>
+          <w:lang w:val="en-US"/>
+        </w:rPr>
+      </w:pPr>
+    </w:p>
+    <w:p>
+      <w:pPr>
+        <w:spacing w:line="360" w:lineRule="auto"/>
+        <w:rPr>
+          <w:rFonts w:ascii="Arial" w:hAnsi="Arial" w:cs="Arial"/>
+          <w:sz w:val="24"/>
+          <w:szCs w:val="24"/>
+          <w:lang w:val="en-US"/>
+        </w:rPr>
+      </w:pPr>
+      <w:r>
+        <w:rPr>
+          <w:rFonts w:ascii="Arial" w:hAnsi="Arial" w:cs="Arial"/>
+          <w:sz w:val="24"/>
+          <w:szCs w:val="24"/>
+          <w:lang w:val="en-US"/>
+        </w:rPr>
+        <w:t xml:space="preserve">      </w:t>
+      </w:r>
+      <w:r>
+        <w:rPr>
+          <w:rFonts w:ascii="Arial" w:hAnsi="Arial" w:cs="Arial"/>
+          <w:sz w:val="24"/>
+          <w:szCs w:val="24"/>
+          <w:lang w:val="en-US"/>
+        </w:rPr>
+        <w:t>gradePoints</w:t>
+      </w:r>
+      <w:r>
+        <w:rPr>
+          <w:rFonts w:ascii="Arial" w:hAnsi="Arial" w:cs="Arial"/>
+          <w:sz w:val="24"/>
+          <w:szCs w:val="24"/>
+          <w:lang w:val="en-US"/>
+        </w:rPr>
+        <w:t xml:space="preserve"> = ConvertGradeToPoints(</w:t>
+      </w:r>
+      <w:r>
+        <w:rPr>
+          <w:rFonts w:ascii="Arial" w:hAnsi="Arial" w:cs="Arial"/>
+          <w:sz w:val="24"/>
+          <w:szCs w:val="24"/>
+          <w:lang w:val="en-US"/>
+        </w:rPr>
+        <w:t>course.grade</w:t>
+      </w:r>
+      <w:r>
+        <w:rPr>
+          <w:rFonts w:ascii="Arial" w:hAnsi="Arial" w:cs="Arial"/>
+          <w:sz w:val="24"/>
+          <w:szCs w:val="24"/>
+          <w:lang w:val="en-US"/>
+        </w:rPr>
+        <w:t>)</w:t>
+      </w:r>
+    </w:p>
+    <w:p>
+      <w:pPr>
+        <w:spacing w:line="360" w:lineRule="auto"/>
+        <w:rPr>
+          <w:rFonts w:ascii="Arial" w:hAnsi="Arial" w:cs="Arial"/>
+          <w:sz w:val="24"/>
+          <w:szCs w:val="24"/>
+          <w:lang w:val="en-US"/>
+        </w:rPr>
+      </w:pPr>
+    </w:p>
+    <w:p>
+      <w:pPr>
+        <w:spacing w:line="360" w:lineRule="auto"/>
+        <w:rPr>
+          <w:rFonts w:ascii="Arial" w:hAnsi="Arial" w:cs="Arial"/>
+          <w:sz w:val="24"/>
+          <w:szCs w:val="24"/>
+          <w:lang w:val="en-US"/>
+        </w:rPr>
+      </w:pPr>
+      <w:r>
+        <w:rPr>
+          <w:rFonts w:ascii="Arial" w:hAnsi="Arial" w:cs="Arial"/>
+          <w:sz w:val="24"/>
+          <w:szCs w:val="24"/>
+          <w:lang w:val="en-US"/>
+        </w:rPr>
+        <w:t xml:space="preserve">      totalQualityPoints</w:t>
+      </w:r>
+      <w:r>
+        <w:rPr>
+          <w:rFonts w:ascii="Arial" w:hAnsi="Arial" w:cs="Arial"/>
+          <w:sz w:val="24"/>
+          <w:szCs w:val="24"/>
+          <w:lang w:val="en-US"/>
+        </w:rPr>
+        <w:t xml:space="preserve"> = totalQualityPoints</w:t>
+      </w:r>
+      <w:r>
+        <w:rPr>
+          <w:rFonts w:ascii="Arial" w:hAnsi="Arial" w:cs="Arial"/>
+          <w:sz w:val="24"/>
+          <w:szCs w:val="24"/>
+          <w:lang w:val="en-US"/>
+        </w:rPr>
+        <w:t xml:space="preserve"> + gradePoints</w:t>
+      </w:r>
+      <w:r>
+        <w:rPr>
+          <w:rFonts w:ascii="Arial" w:hAnsi="Arial" w:cs="Arial"/>
+          <w:sz w:val="24"/>
+          <w:szCs w:val="24"/>
+          <w:lang w:val="en-US"/>
+        </w:rPr>
+        <w:t xml:space="preserve"> * </w:t>
+      </w:r>
+      <w:r>
+        <w:rPr>
+          <w:rFonts w:ascii="Arial" w:hAnsi="Arial" w:cs="Arial"/>
+          <w:sz w:val="24"/>
+          <w:szCs w:val="24"/>
+          <w:lang w:val="en-US"/>
+        </w:rPr>
+        <w:t>course.credits</w:t>
+      </w:r>
+    </w:p>
+    <w:p>
+      <w:pPr>
+        <w:spacing w:line="360" w:lineRule="auto"/>
+        <w:rPr>
+          <w:rFonts w:ascii="Arial" w:hAnsi="Arial" w:cs="Arial"/>
+          <w:sz w:val="24"/>
+          <w:szCs w:val="24"/>
+          <w:lang w:val="en-US"/>
+        </w:rPr>
+      </w:pPr>
+    </w:p>
+    <w:p>
+      <w:pPr>
+        <w:spacing w:line="360" w:lineRule="auto"/>
+        <w:rPr>
+          <w:rFonts w:ascii="Arial" w:hAnsi="Arial" w:cs="Arial"/>
+          <w:sz w:val="24"/>
+          <w:szCs w:val="24"/>
+          <w:lang w:val="en-US"/>
+        </w:rPr>
+      </w:pPr>
+      <w:r>
+        <w:rPr>
+          <w:rFonts w:ascii="Arial" w:hAnsi="Arial" w:cs="Arial"/>
+          <w:sz w:val="24"/>
+          <w:szCs w:val="24"/>
+          <w:lang w:val="en-US"/>
+        </w:rPr>
+        <w:t xml:space="preserve">      attemptedCredits</w:t>
+      </w:r>
+      <w:r>
+        <w:rPr>
+          <w:rFonts w:ascii="Arial" w:hAnsi="Arial" w:cs="Arial"/>
+          <w:sz w:val="24"/>
+          <w:szCs w:val="24"/>
+          <w:lang w:val="en-US"/>
+        </w:rPr>
+        <w:t xml:space="preserve"> = attemptedCredits</w:t>
+      </w:r>
+      <w:r>
+        <w:rPr>
+          <w:rFonts w:ascii="Arial" w:hAnsi="Arial" w:cs="Arial"/>
+          <w:sz w:val="24"/>
+          <w:szCs w:val="24"/>
+          <w:lang w:val="en-US"/>
+        </w:rPr>
+        <w:t xml:space="preserve"> + course.credits</w:t>
+      </w:r>
+    </w:p>
+    <w:p>
+      <w:pPr>
+        <w:spacing w:line="360" w:lineRule="auto"/>
+        <w:rPr>
+          <w:rFonts w:ascii="Arial" w:hAnsi="Arial" w:cs="Arial"/>
+          <w:sz w:val="24"/>
+          <w:szCs w:val="24"/>
+          <w:lang w:val="en-US"/>
+        </w:rPr>
+      </w:pPr>
+    </w:p>
+    <w:p>
+      <w:pPr>
+        <w:spacing w:line="360" w:lineRule="auto"/>
+        <w:rPr>
+          <w:rFonts w:ascii="Arial" w:hAnsi="Arial" w:cs="Arial"/>
+          <w:sz w:val="24"/>
+          <w:szCs w:val="24"/>
+          <w:lang w:val="en-US"/>
+        </w:rPr>
+      </w:pPr>
+      <w:r>
+        <w:rPr>
+          <w:rFonts w:ascii="Arial" w:hAnsi="Arial" w:cs="Arial"/>
+          <w:sz w:val="24"/>
+          <w:szCs w:val="24"/>
+          <w:lang w:val="en-US"/>
+        </w:rPr>
+        <w:t xml:space="preserve">   </w:t>
+      </w:r>
+      <w:r>
+        <w:rPr>
+          <w:rFonts w:ascii="Arial" w:hAnsi="Arial" w:cs="Arial"/>
+          <w:sz w:val="24"/>
+          <w:szCs w:val="24"/>
+          <w:lang w:val="en-US"/>
+        </w:rPr>
+        <w:t>END FOR</w:t>
+      </w:r>
+    </w:p>
+    <w:p>
+      <w:pPr>
+        <w:spacing w:line="360" w:lineRule="auto"/>
+        <w:rPr>
+          <w:rFonts w:ascii="Arial" w:hAnsi="Arial" w:cs="Arial"/>
+          <w:sz w:val="24"/>
+          <w:szCs w:val="24"/>
+          <w:lang w:val="en-US"/>
+        </w:rPr>
+      </w:pPr>
+    </w:p>
+    <w:p>
+      <w:pPr>
+        <w:spacing w:line="360" w:lineRule="auto"/>
+        <w:rPr>
+          <w:rFonts w:ascii="Arial" w:hAnsi="Arial" w:cs="Arial"/>
+          <w:sz w:val="24"/>
+          <w:szCs w:val="24"/>
+          <w:lang w:val="en-US"/>
+        </w:rPr>
+      </w:pPr>
+      <w:r>
+        <w:rPr>
+          <w:rFonts w:ascii="Arial" w:hAnsi="Arial" w:cs="Arial"/>
+          <w:sz w:val="24"/>
+          <w:szCs w:val="24"/>
+          <w:lang w:val="en-US"/>
+        </w:rPr>
+        <w:t xml:space="preserve">   </w:t>
+      </w:r>
+      <w:r>
+        <w:rPr>
+          <w:rFonts w:ascii="Arial" w:hAnsi="Arial" w:cs="Arial"/>
+          <w:sz w:val="24"/>
+          <w:szCs w:val="24"/>
+          <w:lang w:val="en-US"/>
+        </w:rPr>
+        <w:t>IF attemptedCredits</w:t>
+      </w:r>
       <w:r>
         <w:rPr>
           <w:rFonts w:ascii="Arial" w:hAnsi="Arial" w:cs="Arial"/>
@@ -7250,6 +7536,46 @@
           <w:lang w:val="en-US"/>
         </w:rPr>
       </w:pPr>
+      <w:r>
+        <w:rPr>
+          <w:rFonts w:ascii="Arial" w:hAnsi="Arial" w:cs="Arial"/>
+          <w:sz w:val="24"/>
+          <w:szCs w:val="24"/>
+          <w:lang w:val="en-US"/>
+        </w:rPr>
+        <w:t xml:space="preserve">      RETURN 0</w:t>
+      </w:r>
+    </w:p>
+    <w:p>
+      <w:pPr>
+        <w:spacing w:line="360" w:lineRule="auto"/>
+        <w:rPr>
+          <w:rFonts w:ascii="Arial" w:hAnsi="Arial" w:cs="Arial"/>
+          <w:sz w:val="24"/>
+          <w:szCs w:val="24"/>
+          <w:lang w:val="en-US"/>
+        </w:rPr>
+      </w:pPr>
+      <w:r>
+        <w:rPr>
+          <w:rFonts w:ascii="Arial" w:hAnsi="Arial" w:cs="Arial"/>
+          <w:sz w:val="24"/>
+          <w:szCs w:val="24"/>
+          <w:lang w:val="en-US"/>
+        </w:rPr>
+        <w:t xml:space="preserve">   END IF</w:t>
+      </w:r>
+    </w:p>
+    <w:p>
+      <w:pPr>
+        <w:spacing w:line="360" w:lineRule="auto"/>
+        <w:rPr>
+          <w:rFonts w:ascii="Arial" w:hAnsi="Arial" w:cs="Arial"/>
+          <w:sz w:val="24"/>
+          <w:szCs w:val="24"/>
+          <w:lang w:val="en-US"/>
+        </w:rPr>
+      </w:pPr>
     </w:p>
     <w:p>
       <w:pPr>
@@ -7277,7 +7603,7 @@
           <w:szCs w:val="24"/>
           <w:lang w:val="en-US"/>
         </w:rPr>
-        <w:t>FOR EACH</w:t>
+        <w:t>RETURN</w:t>
       </w:r>
       <w:r>
         <w:rPr>
@@ -7295,509 +7621,8 @@
           <w:szCs w:val="24"/>
           <w:lang w:val="en-US"/>
         </w:rPr>
-        <w:t>course IN courses</w:t>
-      </w:r>
-    </w:p>
-    <w:p>
-      <w:pPr>
-        <w:spacing w:line="360" w:lineRule="auto"/>
-        <w:rPr>
-          <w:rFonts w:ascii="Arial" w:hAnsi="Arial" w:cs="Arial"/>
-          <w:sz w:val="24"/>
-          <w:szCs w:val="24"/>
-          <w:lang w:val="en-US"/>
-        </w:rPr>
-      </w:pPr>
-    </w:p>
-    <w:p>
-      <w:pPr>
-        <w:spacing w:line="360" w:lineRule="auto"/>
-        <w:rPr>
-          <w:rFonts w:ascii="Arial" w:hAnsi="Arial" w:cs="Arial"/>
-          <w:sz w:val="24"/>
-          <w:szCs w:val="24"/>
-          <w:lang w:val="en-US"/>
-        </w:rPr>
-      </w:pPr>
-      <w:r>
-        <w:rPr>
-          <w:rFonts w:ascii="Arial" w:hAnsi="Arial" w:cs="Arial"/>
-          <w:sz w:val="24"/>
-          <w:szCs w:val="24"/>
-          <w:lang w:val="en-US"/>
-        </w:rPr>
-        <w:t xml:space="preserve">      </w:t>
-      </w:r>
-      <w:proofErr w:type="spellStart"/>
-      <w:r>
-        <w:rPr>
-          <w:rFonts w:ascii="Arial" w:hAnsi="Arial" w:cs="Arial"/>
-          <w:sz w:val="24"/>
-          <w:szCs w:val="24"/>
-          <w:lang w:val="en-US"/>
-        </w:rPr>
-        <w:t>gradePoints</w:t>
-      </w:r>
-      <w:proofErr w:type="spellEnd"/>
-      <w:r>
-        <w:rPr>
-          <w:rFonts w:ascii="Arial" w:hAnsi="Arial" w:cs="Arial"/>
-          <w:sz w:val="24"/>
-          <w:szCs w:val="24"/>
-          <w:lang w:val="en-US"/>
-        </w:rPr>
-        <w:t xml:space="preserve"> = </w:t>
-      </w:r>
-      <w:proofErr w:type="spellStart"/>
-      <w:r>
-        <w:rPr>
-          <w:rFonts w:ascii="Arial" w:hAnsi="Arial" w:cs="Arial"/>
-          <w:sz w:val="24"/>
-          <w:szCs w:val="24"/>
-          <w:lang w:val="en-US"/>
-        </w:rPr>
-        <w:t>ConvertGradeToPoints</w:t>
-      </w:r>
-      <w:proofErr w:type="spellEnd"/>
-      <w:r>
-        <w:rPr>
-          <w:rFonts w:ascii="Arial" w:hAnsi="Arial" w:cs="Arial"/>
-          <w:sz w:val="24"/>
-          <w:szCs w:val="24"/>
-          <w:lang w:val="en-US"/>
-        </w:rPr>
-        <w:t>(</w:t>
-      </w:r>
-      <w:proofErr w:type="spellStart"/>
-      <w:proofErr w:type="gramStart"/>
-      <w:r>
-        <w:rPr>
-          <w:rFonts w:ascii="Arial" w:hAnsi="Arial" w:cs="Arial"/>
-          <w:sz w:val="24"/>
-          <w:szCs w:val="24"/>
-          <w:lang w:val="en-US"/>
-        </w:rPr>
-        <w:t>course.grade</w:t>
-      </w:r>
-      <w:proofErr w:type="spellEnd"/>
-      <w:proofErr w:type="gramEnd"/>
-      <w:r>
-        <w:rPr>
-          <w:rFonts w:ascii="Arial" w:hAnsi="Arial" w:cs="Arial"/>
-          <w:sz w:val="24"/>
-          <w:szCs w:val="24"/>
-          <w:lang w:val="en-US"/>
-        </w:rPr>
-        <w:t>)</w:t>
-      </w:r>
-    </w:p>
-    <w:p>
-      <w:pPr>
-        <w:spacing w:line="360" w:lineRule="auto"/>
-        <w:rPr>
-          <w:rFonts w:ascii="Arial" w:hAnsi="Arial" w:cs="Arial"/>
-          <w:sz w:val="24"/>
-          <w:szCs w:val="24"/>
-          <w:lang w:val="en-US"/>
-        </w:rPr>
-      </w:pPr>
-    </w:p>
-    <w:p>
-      <w:pPr>
-        <w:spacing w:line="360" w:lineRule="auto"/>
-        <w:rPr>
-          <w:rFonts w:ascii="Arial" w:hAnsi="Arial" w:cs="Arial"/>
-          <w:sz w:val="24"/>
-          <w:szCs w:val="24"/>
-          <w:lang w:val="en-US"/>
-        </w:rPr>
-      </w:pPr>
-      <w:r>
-        <w:rPr>
-          <w:rFonts w:ascii="Arial" w:hAnsi="Arial" w:cs="Arial"/>
-          <w:sz w:val="24"/>
-          <w:szCs w:val="24"/>
-          <w:lang w:val="en-US"/>
-        </w:rPr>
-        <w:t xml:space="preserve">      </w:t>
-      </w:r>
-      <w:proofErr w:type="spellStart"/>
-      <w:r>
-        <w:rPr>
-          <w:rFonts w:ascii="Arial" w:hAnsi="Arial" w:cs="Arial"/>
-          <w:sz w:val="24"/>
-          <w:szCs w:val="24"/>
-          <w:lang w:val="en-US"/>
-        </w:rPr>
-        <w:t>totalQualityPoints</w:t>
-      </w:r>
-      <w:proofErr w:type="spellEnd"/>
-      <w:r>
-        <w:rPr>
-          <w:rFonts w:ascii="Arial" w:hAnsi="Arial" w:cs="Arial"/>
-          <w:sz w:val="24"/>
-          <w:szCs w:val="24"/>
-          <w:lang w:val="en-US"/>
-        </w:rPr>
-        <w:t xml:space="preserve"> = </w:t>
-      </w:r>
-      <w:proofErr w:type="spellStart"/>
-      <w:r>
-        <w:rPr>
-          <w:rFonts w:ascii="Arial" w:hAnsi="Arial" w:cs="Arial"/>
-          <w:sz w:val="24"/>
-          <w:szCs w:val="24"/>
-          <w:lang w:val="en-US"/>
-        </w:rPr>
-        <w:t>totalQualityPoints</w:t>
-      </w:r>
-      <w:proofErr w:type="spellEnd"/>
-      <w:r>
-        <w:rPr>
-          <w:rFonts w:ascii="Arial" w:hAnsi="Arial" w:cs="Arial"/>
-          <w:sz w:val="24"/>
-          <w:szCs w:val="24"/>
-          <w:lang w:val="en-US"/>
-        </w:rPr>
-        <w:t xml:space="preserve"> + </w:t>
-      </w:r>
-      <w:proofErr w:type="spellStart"/>
-      <w:r>
-        <w:rPr>
-          <w:rFonts w:ascii="Arial" w:hAnsi="Arial" w:cs="Arial"/>
-          <w:sz w:val="24"/>
-          <w:szCs w:val="24"/>
-          <w:lang w:val="en-US"/>
-        </w:rPr>
-        <w:t>gradePoints</w:t>
-      </w:r>
-      <w:proofErr w:type="spellEnd"/>
-      <w:r>
-        <w:rPr>
-          <w:rFonts w:ascii="Arial" w:hAnsi="Arial" w:cs="Arial"/>
-          <w:sz w:val="24"/>
-          <w:szCs w:val="24"/>
-          <w:lang w:val="en-US"/>
-        </w:rPr>
-        <w:t xml:space="preserve"> * </w:t>
-      </w:r>
-      <w:proofErr w:type="spellStart"/>
-      <w:proofErr w:type="gramStart"/>
-      <w:r>
-        <w:rPr>
-          <w:rFonts w:ascii="Arial" w:hAnsi="Arial" w:cs="Arial"/>
-          <w:sz w:val="24"/>
-          <w:szCs w:val="24"/>
-          <w:lang w:val="en-US"/>
-        </w:rPr>
-        <w:t>course.credits</w:t>
-      </w:r>
-      <w:proofErr w:type="spellEnd"/>
-      <w:proofErr w:type="gramEnd"/>
-    </w:p>
-    <w:p>
-      <w:pPr>
-        <w:spacing w:line="360" w:lineRule="auto"/>
-        <w:rPr>
-          <w:rFonts w:ascii="Arial" w:hAnsi="Arial" w:cs="Arial"/>
-          <w:sz w:val="24"/>
-          <w:szCs w:val="24"/>
-          <w:lang w:val="en-US"/>
-        </w:rPr>
-      </w:pPr>
-    </w:p>
-    <w:p>
-      <w:pPr>
-        <w:spacing w:line="360" w:lineRule="auto"/>
-        <w:rPr>
-          <w:rFonts w:ascii="Arial" w:hAnsi="Arial" w:cs="Arial"/>
-          <w:sz w:val="24"/>
-          <w:szCs w:val="24"/>
-          <w:lang w:val="en-US"/>
-        </w:rPr>
-      </w:pPr>
-      <w:r>
-        <w:rPr>
-          <w:rFonts w:ascii="Arial" w:hAnsi="Arial" w:cs="Arial"/>
-          <w:sz w:val="24"/>
-          <w:szCs w:val="24"/>
-          <w:lang w:val="en-US"/>
-        </w:rPr>
-        <w:t xml:space="preserve">      </w:t>
-      </w:r>
-      <w:proofErr w:type="spellStart"/>
-      <w:r>
-        <w:rPr>
-          <w:rFonts w:ascii="Arial" w:hAnsi="Arial" w:cs="Arial"/>
-          <w:sz w:val="24"/>
-          <w:szCs w:val="24"/>
-          <w:lang w:val="en-US"/>
-        </w:rPr>
-        <w:t>attemptedCredits</w:t>
-      </w:r>
-      <w:proofErr w:type="spellEnd"/>
-      <w:r>
-        <w:rPr>
-          <w:rFonts w:ascii="Arial" w:hAnsi="Arial" w:cs="Arial"/>
-          <w:sz w:val="24"/>
-          <w:szCs w:val="24"/>
-          <w:lang w:val="en-US"/>
-        </w:rPr>
-        <w:t xml:space="preserve"> = </w:t>
-      </w:r>
-      <w:proofErr w:type="spellStart"/>
-      <w:r>
-        <w:rPr>
-          <w:rFonts w:ascii="Arial" w:hAnsi="Arial" w:cs="Arial"/>
-          <w:sz w:val="24"/>
-          <w:szCs w:val="24"/>
-          <w:lang w:val="en-US"/>
-        </w:rPr>
-        <w:t>attemptedCredits</w:t>
-      </w:r>
-      <w:proofErr w:type="spellEnd"/>
-      <w:r>
-        <w:rPr>
-          <w:rFonts w:ascii="Arial" w:hAnsi="Arial" w:cs="Arial"/>
-          <w:sz w:val="24"/>
-          <w:szCs w:val="24"/>
-          <w:lang w:val="en-US"/>
-        </w:rPr>
-        <w:t xml:space="preserve"> + </w:t>
-      </w:r>
-      <w:proofErr w:type="spellStart"/>
-      <w:proofErr w:type="gramStart"/>
-      <w:r>
-        <w:rPr>
-          <w:rFonts w:ascii="Arial" w:hAnsi="Arial" w:cs="Arial"/>
-          <w:sz w:val="24"/>
-          <w:szCs w:val="24"/>
-          <w:lang w:val="en-US"/>
-        </w:rPr>
-        <w:t>course.credits</w:t>
-      </w:r>
-      <w:proofErr w:type="spellEnd"/>
-      <w:proofErr w:type="gramEnd"/>
-    </w:p>
-    <w:p>
-      <w:pPr>
-        <w:spacing w:line="360" w:lineRule="auto"/>
-        <w:rPr>
-          <w:rFonts w:ascii="Arial" w:hAnsi="Arial" w:cs="Arial"/>
-          <w:sz w:val="24"/>
-          <w:szCs w:val="24"/>
-          <w:lang w:val="en-US"/>
-        </w:rPr>
-      </w:pPr>
-    </w:p>
-    <w:p>
-      <w:pPr>
-        <w:spacing w:line="360" w:lineRule="auto"/>
-        <w:rPr>
-          <w:rFonts w:ascii="Arial" w:hAnsi="Arial" w:cs="Arial"/>
-          <w:sz w:val="24"/>
-          <w:szCs w:val="24"/>
-          <w:lang w:val="en-US"/>
-        </w:rPr>
-      </w:pPr>
-      <w:r>
-        <w:rPr>
-          <w:rFonts w:ascii="Arial" w:hAnsi="Arial" w:cs="Arial"/>
-          <w:sz w:val="24"/>
-          <w:szCs w:val="24"/>
-          <w:lang w:val="en-US"/>
-        </w:rPr>
-        <w:t xml:space="preserve">   </w:t>
-      </w:r>
-      <w:r>
-        <w:rPr>
-          <w:rFonts w:ascii="Arial" w:hAnsi="Arial" w:cs="Arial"/>
-          <w:sz w:val="24"/>
-          <w:szCs w:val="24"/>
-          <w:lang w:val="en-US"/>
-        </w:rPr>
-        <w:t>END FOR</w:t>
-      </w:r>
-    </w:p>
-    <w:p>
-      <w:pPr>
-        <w:spacing w:line="360" w:lineRule="auto"/>
-        <w:rPr>
-          <w:rFonts w:ascii="Arial" w:hAnsi="Arial" w:cs="Arial"/>
-          <w:sz w:val="24"/>
-          <w:szCs w:val="24"/>
-          <w:lang w:val="en-US"/>
-        </w:rPr>
-      </w:pPr>
-    </w:p>
-    <w:p>
-      <w:pPr>
-        <w:spacing w:line="360" w:lineRule="auto"/>
-        <w:rPr>
-          <w:rFonts w:ascii="Arial" w:hAnsi="Arial" w:cs="Arial"/>
-          <w:sz w:val="24"/>
-          <w:szCs w:val="24"/>
-          <w:lang w:val="en-US"/>
-        </w:rPr>
-      </w:pPr>
-      <w:r>
-        <w:rPr>
-          <w:rFonts w:ascii="Arial" w:hAnsi="Arial" w:cs="Arial"/>
-          <w:sz w:val="24"/>
-          <w:szCs w:val="24"/>
-          <w:lang w:val="en-US"/>
-        </w:rPr>
-        <w:t xml:space="preserve">   </w:t>
-      </w:r>
-      <w:r>
-        <w:rPr>
-          <w:rFonts w:ascii="Arial" w:hAnsi="Arial" w:cs="Arial"/>
-          <w:sz w:val="24"/>
-          <w:szCs w:val="24"/>
-          <w:lang w:val="en-US"/>
-        </w:rPr>
-        <w:t xml:space="preserve">IF </w:t>
-      </w:r>
-      <w:proofErr w:type="spellStart"/>
-      <w:r>
-        <w:rPr>
-          <w:rFonts w:ascii="Arial" w:hAnsi="Arial" w:cs="Arial"/>
-          <w:sz w:val="24"/>
-          <w:szCs w:val="24"/>
-          <w:lang w:val="en-US"/>
-        </w:rPr>
-        <w:t>attemptedCredits</w:t>
-      </w:r>
-      <w:proofErr w:type="spellEnd"/>
-      <w:r>
-        <w:rPr>
-          <w:rFonts w:ascii="Arial" w:hAnsi="Arial" w:cs="Arial"/>
-          <w:sz w:val="24"/>
-          <w:szCs w:val="24"/>
-          <w:lang w:val="en-US"/>
-        </w:rPr>
-        <w:t xml:space="preserve"> = 0</w:t>
-      </w:r>
-    </w:p>
-    <w:p>
-      <w:pPr>
-        <w:spacing w:line="360" w:lineRule="auto"/>
-        <w:rPr>
-          <w:rFonts w:ascii="Arial" w:hAnsi="Arial" w:cs="Arial"/>
-          <w:sz w:val="24"/>
-          <w:szCs w:val="24"/>
-          <w:lang w:val="en-US"/>
-        </w:rPr>
-      </w:pPr>
-      <w:r>
-        <w:rPr>
-          <w:rFonts w:ascii="Arial" w:hAnsi="Arial" w:cs="Arial"/>
-          <w:sz w:val="24"/>
-          <w:szCs w:val="24"/>
-          <w:lang w:val="en-US"/>
-        </w:rPr>
-        <w:t xml:space="preserve">      RETURN 0</w:t>
-      </w:r>
-    </w:p>
-    <w:p>
-      <w:pPr>
-        <w:spacing w:line="360" w:lineRule="auto"/>
-        <w:rPr>
-          <w:rFonts w:ascii="Arial" w:hAnsi="Arial" w:cs="Arial"/>
-          <w:sz w:val="24"/>
-          <w:szCs w:val="24"/>
-          <w:lang w:val="en-US"/>
-        </w:rPr>
-      </w:pPr>
-      <w:r>
-        <w:rPr>
-          <w:rFonts w:ascii="Arial" w:hAnsi="Arial" w:cs="Arial"/>
-          <w:sz w:val="24"/>
-          <w:szCs w:val="24"/>
-          <w:lang w:val="en-US"/>
-        </w:rPr>
-        <w:t xml:space="preserve">   END IF</w:t>
-      </w:r>
-    </w:p>
-    <w:p>
-      <w:pPr>
-        <w:spacing w:line="360" w:lineRule="auto"/>
-        <w:rPr>
-          <w:rFonts w:ascii="Arial" w:hAnsi="Arial" w:cs="Arial"/>
-          <w:sz w:val="24"/>
-          <w:szCs w:val="24"/>
-          <w:lang w:val="en-US"/>
-        </w:rPr>
-      </w:pPr>
-    </w:p>
-    <w:p>
-      <w:pPr>
-        <w:spacing w:line="360" w:lineRule="auto"/>
-        <w:rPr>
-          <w:rFonts w:ascii="Arial" w:hAnsi="Arial" w:cs="Arial"/>
-          <w:sz w:val="24"/>
-          <w:szCs w:val="24"/>
-          <w:lang w:val="en-US"/>
-        </w:rPr>
-      </w:pPr>
-      <w:r>
-        <w:rPr>
-          <w:rFonts w:ascii="Arial" w:hAnsi="Arial" w:cs="Arial"/>
-          <w:sz w:val="24"/>
-          <w:szCs w:val="24"/>
-          <w:lang w:val="en-US"/>
-        </w:rPr>
-        <w:t xml:space="preserve">   </w:t>
-      </w:r>
-      <w:r>
-        <w:rPr>
-          <w:rFonts w:ascii="Arial" w:hAnsi="Arial" w:cs="Arial"/>
-          <w:sz w:val="24"/>
-          <w:szCs w:val="24"/>
-          <w:lang w:val="en-US"/>
-        </w:rPr>
-        <w:t>RETURN</w:t>
-      </w:r>
-      <w:r>
-        <w:rPr>
-          <w:rFonts w:ascii="Arial" w:hAnsi="Arial" w:cs="Arial"/>
-          <w:sz w:val="24"/>
-          <w:szCs w:val="24"/>
-          <w:lang w:val="en-US"/>
-        </w:rPr>
-        <w:t xml:space="preserve"> </w:t>
-      </w:r>
-      <w:proofErr w:type="spellStart"/>
-      <w:r>
-        <w:rPr>
-          <w:rFonts w:ascii="Arial" w:hAnsi="Arial" w:cs="Arial"/>
-          <w:sz w:val="24"/>
-          <w:szCs w:val="24"/>
-          <w:lang w:val="en-US"/>
-        </w:rPr>
-        <w:t>totalQualityPoints</w:t>
-      </w:r>
-      <w:proofErr w:type="spellEnd"/>
-      <w:r>
-        <w:rPr>
-          <w:rFonts w:ascii="Arial" w:hAnsi="Arial" w:cs="Arial"/>
-          <w:sz w:val="24"/>
-          <w:szCs w:val="24"/>
-          <w:lang w:val="en-US"/>
-        </w:rPr>
-        <w:t xml:space="preserve"> / </w:t>
-      </w:r>
-      <w:proofErr w:type="spellStart"/>
-      <w:r>
-        <w:rPr>
-          <w:rFonts w:ascii="Arial" w:hAnsi="Arial" w:cs="Arial"/>
-          <w:sz w:val="24"/>
-          <w:szCs w:val="24"/>
-          <w:lang w:val="en-US"/>
-        </w:rPr>
-        <w:t>attemptedCredits</w:t>
-      </w:r>
-      <w:proofErr w:type="spellEnd"/>
+        <w:t>totalQualityPoints / attemptedCredits</w:t>
+      </w:r>
     </w:p>
     <w:p>
       <w:pPr>
@@ -7880,27 +7705,7 @@
           <w:szCs w:val="24"/>
           <w:lang w:val="en-US"/>
         </w:rPr>
-        <w:t xml:space="preserve">FUNCTION </w:t>
-      </w:r>
-      <w:proofErr w:type="spellStart"/>
-      <w:r>
-        <w:rPr>
-          <w:rFonts w:ascii="Arial" w:hAnsi="Arial" w:cs="Arial"/>
-          <w:sz w:val="24"/>
-          <w:szCs w:val="24"/>
-          <w:lang w:val="en-US"/>
-        </w:rPr>
-        <w:t>ConvertGradeToPoints</w:t>
-      </w:r>
-      <w:proofErr w:type="spellEnd"/>
-      <w:r>
-        <w:rPr>
-          <w:rFonts w:ascii="Arial" w:hAnsi="Arial" w:cs="Arial"/>
-          <w:sz w:val="24"/>
-          <w:szCs w:val="24"/>
-          <w:lang w:val="en-US"/>
-        </w:rPr>
-        <w:t>(grade)</w:t>
+        <w:t>FUNCTION ConvertGradeToPoints(grade)</w:t>
       </w:r>
     </w:p>
     <w:p>
@@ -7990,36 +7795,16 @@
           <w:szCs w:val="24"/>
           <w:lang w:val="en-US"/>
         </w:rPr>
-        <w:t xml:space="preserve">   ELSE IF grade </w:t>
-      </w:r>
-      <w:proofErr w:type="gramStart"/>
-      <w:r>
-        <w:rPr>
-          <w:rFonts w:ascii="Arial" w:hAnsi="Arial" w:cs="Arial"/>
-          <w:sz w:val="24"/>
-          <w:szCs w:val="24"/>
-          <w:lang w:val="en-US"/>
-        </w:rPr>
-        <w:t>= ”</w:t>
-      </w:r>
-      <w:r>
-        <w:rPr>
-          <w:rFonts w:ascii="Arial" w:hAnsi="Arial" w:cs="Arial"/>
-          <w:sz w:val="24"/>
-          <w:szCs w:val="24"/>
-          <w:lang w:val="en-US"/>
-        </w:rPr>
-        <w:t>A</w:t>
-      </w:r>
-      <w:proofErr w:type="gramEnd"/>
-      <w:r>
-        <w:rPr>
-          <w:rFonts w:ascii="Arial" w:hAnsi="Arial" w:cs="Arial"/>
-          <w:sz w:val="24"/>
-          <w:szCs w:val="24"/>
-          <w:lang w:val="en-US"/>
-        </w:rPr>
-        <w:t>-</w:t>
+        <w:t xml:space="preserve">   ELSE IF grade = ”</w:t>
+      </w:r>
+      <w:r>
+        <w:rPr>
+          <w:rFonts w:ascii="Arial" w:hAnsi="Arial" w:cs="Arial"/>
+          <w:sz w:val="24"/>
+          <w:szCs w:val="24"/>
+          <w:lang w:val="en-US"/>
+        </w:rPr>
+        <w:t>A-</w:t>
       </w:r>
       <w:r>
         <w:rPr>
@@ -8576,79 +8361,353 @@
           <w:szCs w:val="24"/>
           <w:lang w:val="en-US"/>
         </w:rPr>
+        <w:t xml:space="preserve"> CalculateProjectedGPA(</w:t>
+      </w:r>
+      <w:r>
+        <w:rPr>
+          <w:rFonts w:ascii="Arial" w:hAnsi="Arial" w:cs="Arial"/>
+          <w:sz w:val="24"/>
+          <w:szCs w:val="24"/>
+          <w:lang w:val="en-US"/>
+        </w:rPr>
+        <w:t>currentCourses,</w:t>
+      </w:r>
+      <w:r>
+        <w:rPr>
+          <w:rFonts w:ascii="Arial" w:hAnsi="Arial" w:cs="Arial"/>
+          <w:sz w:val="24"/>
+          <w:szCs w:val="24"/>
+          <w:lang w:val="en-US"/>
+        </w:rPr>
+        <w:t xml:space="preserve"> hypothetical</w:t>
+      </w:r>
+      <w:r>
+        <w:rPr>
+          <w:rFonts w:ascii="Arial" w:hAnsi="Arial" w:cs="Arial"/>
+          <w:sz w:val="24"/>
+          <w:szCs w:val="24"/>
+          <w:lang w:val="en-US"/>
+        </w:rPr>
+        <w:t>Courses</w:t>
+      </w:r>
+      <w:r>
+        <w:rPr>
+          <w:rFonts w:ascii="Arial" w:hAnsi="Arial" w:cs="Arial"/>
+          <w:sz w:val="24"/>
+          <w:szCs w:val="24"/>
+          <w:lang w:val="en-US"/>
+        </w:rPr>
+        <w:t>)</w:t>
+      </w:r>
+    </w:p>
+    <w:p>
+      <w:pPr>
+        <w:spacing w:line="360" w:lineRule="auto"/>
+        <w:rPr>
+          <w:rFonts w:ascii="Arial" w:hAnsi="Arial" w:cs="Arial"/>
+          <w:sz w:val="24"/>
+          <w:szCs w:val="24"/>
+          <w:lang w:val="en-US"/>
+        </w:rPr>
+      </w:pPr>
+    </w:p>
+    <w:p>
+      <w:pPr>
+        <w:spacing w:line="360" w:lineRule="auto"/>
+        <w:rPr>
+          <w:rFonts w:ascii="Arial" w:hAnsi="Arial" w:cs="Arial"/>
+          <w:sz w:val="24"/>
+          <w:szCs w:val="24"/>
+          <w:lang w:val="en-US"/>
+        </w:rPr>
+      </w:pPr>
+      <w:r>
+        <w:rPr>
+          <w:rFonts w:ascii="Arial" w:hAnsi="Arial" w:cs="Arial"/>
+          <w:sz w:val="24"/>
+          <w:szCs w:val="24"/>
+          <w:lang w:val="en-US"/>
+        </w:rPr>
+        <w:t xml:space="preserve">   currentQualityPoints = </w:t>
+      </w:r>
+      <w:r>
+        <w:rPr>
+          <w:rFonts w:ascii="Arial" w:hAnsi="Arial" w:cs="Arial"/>
+          <w:sz w:val="24"/>
+          <w:szCs w:val="24"/>
+          <w:lang w:val="en-US"/>
+        </w:rPr>
+        <w:t>CalculateQualityPoints</w:t>
+      </w:r>
+      <w:r>
+        <w:rPr>
+          <w:rFonts w:ascii="Arial" w:hAnsi="Arial" w:cs="Arial"/>
+          <w:sz w:val="24"/>
+          <w:szCs w:val="24"/>
+          <w:lang w:val="en-US"/>
+        </w:rPr>
+        <w:t>(</w:t>
+      </w:r>
+      <w:r>
+        <w:rPr>
+          <w:rFonts w:ascii="Arial" w:hAnsi="Arial" w:cs="Arial"/>
+          <w:sz w:val="24"/>
+          <w:szCs w:val="24"/>
+          <w:lang w:val="en-US"/>
+        </w:rPr>
+        <w:t>currentCourses</w:t>
+      </w:r>
+      <w:r>
+        <w:rPr>
+          <w:rFonts w:ascii="Arial" w:hAnsi="Arial" w:cs="Arial"/>
+          <w:sz w:val="24"/>
+          <w:szCs w:val="24"/>
+          <w:lang w:val="en-US"/>
+        </w:rPr>
+        <w:t>)</w:t>
+      </w:r>
+    </w:p>
+    <w:p>
+      <w:pPr>
+        <w:spacing w:line="360" w:lineRule="auto"/>
+        <w:rPr>
+          <w:rFonts w:ascii="Arial" w:hAnsi="Arial" w:cs="Arial"/>
+          <w:sz w:val="24"/>
+          <w:szCs w:val="24"/>
+          <w:lang w:val="en-US"/>
+        </w:rPr>
+      </w:pPr>
+    </w:p>
+    <w:p>
+      <w:pPr>
+        <w:spacing w:line="360" w:lineRule="auto"/>
+        <w:rPr>
+          <w:rFonts w:ascii="Arial" w:hAnsi="Arial" w:cs="Arial"/>
+          <w:sz w:val="24"/>
+          <w:szCs w:val="24"/>
+          <w:lang w:val="en-US"/>
+        </w:rPr>
+      </w:pPr>
+      <w:r>
+        <w:rPr>
+          <w:rFonts w:ascii="Arial" w:hAnsi="Arial" w:cs="Arial"/>
+          <w:sz w:val="24"/>
+          <w:szCs w:val="24"/>
+          <w:lang w:val="en-US"/>
+        </w:rPr>
+        <w:t xml:space="preserve">   futureQualityPoints = CalculateQualityPoints(hypotheticalCourses)</w:t>
+      </w:r>
+    </w:p>
+    <w:p>
+      <w:pPr>
+        <w:spacing w:line="360" w:lineRule="auto"/>
+        <w:rPr>
+          <w:rFonts w:ascii="Arial" w:hAnsi="Arial" w:cs="Arial"/>
+          <w:sz w:val="24"/>
+          <w:szCs w:val="24"/>
+          <w:lang w:val="en-US"/>
+        </w:rPr>
+      </w:pPr>
+    </w:p>
+    <w:p>
+      <w:pPr>
+        <w:spacing w:line="360" w:lineRule="auto"/>
+        <w:rPr>
+          <w:rFonts w:ascii="Arial" w:hAnsi="Arial" w:cs="Arial"/>
+          <w:sz w:val="24"/>
+          <w:szCs w:val="24"/>
+          <w:lang w:val="en-US"/>
+        </w:rPr>
+      </w:pPr>
+      <w:r>
+        <w:rPr>
+          <w:rFonts w:ascii="Arial" w:hAnsi="Arial" w:cs="Arial"/>
+          <w:sz w:val="24"/>
+          <w:szCs w:val="24"/>
+          <w:lang w:val="en-US"/>
+        </w:rPr>
+        <w:t xml:space="preserve">   </w:t>
+      </w:r>
+      <w:r>
+        <w:rPr>
+          <w:rFonts w:ascii="Arial" w:hAnsi="Arial" w:cs="Arial"/>
+          <w:sz w:val="24"/>
+          <w:szCs w:val="24"/>
+          <w:lang w:val="en-US"/>
+        </w:rPr>
+        <w:t>currentCredits</w:t>
+      </w:r>
+      <w:r>
+        <w:rPr>
+          <w:rFonts w:ascii="Arial" w:hAnsi="Arial" w:cs="Arial"/>
+          <w:sz w:val="24"/>
+          <w:szCs w:val="24"/>
+          <w:lang w:val="en-US"/>
+        </w:rPr>
+        <w:t xml:space="preserve"> = CalculateAttemptedCredits</w:t>
+      </w:r>
+      <w:r>
+        <w:rPr>
+          <w:rFonts w:ascii="Arial" w:hAnsi="Arial" w:cs="Arial"/>
+          <w:sz w:val="24"/>
+          <w:szCs w:val="24"/>
+          <w:lang w:val="en-US"/>
+        </w:rPr>
+        <w:t>(</w:t>
+      </w:r>
+      <w:r>
+        <w:rPr>
+          <w:rFonts w:ascii="Arial" w:hAnsi="Arial" w:cs="Arial"/>
+          <w:sz w:val="24"/>
+          <w:szCs w:val="24"/>
+          <w:lang w:val="en-US"/>
+        </w:rPr>
+        <w:t>currentCourses</w:t>
+      </w:r>
+      <w:r>
+        <w:rPr>
+          <w:rFonts w:ascii="Arial" w:hAnsi="Arial" w:cs="Arial"/>
+          <w:sz w:val="24"/>
+          <w:szCs w:val="24"/>
+          <w:lang w:val="en-US"/>
+        </w:rPr>
+        <w:t>)</w:t>
+      </w:r>
+    </w:p>
+    <w:p>
+      <w:pPr>
+        <w:spacing w:line="360" w:lineRule="auto"/>
+        <w:rPr>
+          <w:rFonts w:ascii="Arial" w:hAnsi="Arial" w:cs="Arial"/>
+          <w:sz w:val="24"/>
+          <w:szCs w:val="24"/>
+          <w:lang w:val="en-US"/>
+        </w:rPr>
+      </w:pPr>
+    </w:p>
+    <w:p>
+      <w:pPr>
+        <w:spacing w:line="360" w:lineRule="auto"/>
+        <w:rPr>
+          <w:rFonts w:ascii="Arial" w:hAnsi="Arial" w:cs="Arial"/>
+          <w:sz w:val="24"/>
+          <w:szCs w:val="24"/>
+          <w:lang w:val="en-US"/>
+        </w:rPr>
+      </w:pPr>
+      <w:r>
+        <w:rPr>
+          <w:rFonts w:ascii="Arial" w:hAnsi="Arial" w:cs="Arial"/>
+          <w:sz w:val="24"/>
+          <w:szCs w:val="24"/>
+          <w:lang w:val="en-US"/>
+        </w:rPr>
+        <w:t xml:space="preserve">   futureCredits</w:t>
+      </w:r>
+      <w:r>
+        <w:rPr>
+          <w:rFonts w:ascii="Arial" w:hAnsi="Arial" w:cs="Arial"/>
+          <w:sz w:val="24"/>
+          <w:szCs w:val="24"/>
+          <w:lang w:val="en-US"/>
+        </w:rPr>
+        <w:t xml:space="preserve"> = CalculateAttemptedCredits(hypotheticalCourses)</w:t>
+      </w:r>
+    </w:p>
+    <w:p>
+      <w:pPr>
+        <w:spacing w:line="360" w:lineRule="auto"/>
+        <w:rPr>
+          <w:rFonts w:ascii="Arial" w:hAnsi="Arial" w:cs="Arial"/>
+          <w:sz w:val="24"/>
+          <w:szCs w:val="24"/>
+          <w:lang w:val="en-US"/>
+        </w:rPr>
+      </w:pPr>
+    </w:p>
+    <w:p>
+      <w:pPr>
+        <w:spacing w:line="360" w:lineRule="auto"/>
+        <w:ind w:left="204"/>
+        <w:rPr>
+          <w:rFonts w:ascii="Arial" w:hAnsi="Arial" w:cs="Arial"/>
+          <w:sz w:val="24"/>
+          <w:szCs w:val="24"/>
+          <w:lang w:val="en-US"/>
+        </w:rPr>
+      </w:pPr>
+      <w:r>
+        <w:rPr>
+          <w:rFonts w:ascii="Arial" w:hAnsi="Arial" w:cs="Arial"/>
+          <w:sz w:val="24"/>
+          <w:szCs w:val="24"/>
+          <w:lang w:val="en-US"/>
+        </w:rPr>
+        <w:t>projectedGPA</w:t>
+      </w:r>
+      <w:r>
+        <w:rPr>
+          <w:rFonts w:ascii="Arial" w:hAnsi="Arial" w:cs="Arial"/>
+          <w:sz w:val="24"/>
+          <w:szCs w:val="24"/>
+          <w:lang w:val="en-US"/>
+        </w:rPr>
+        <w:t xml:space="preserve"> = (</w:t>
+      </w:r>
+      <w:r>
+        <w:rPr>
+          <w:rFonts w:ascii="Arial" w:hAnsi="Arial" w:cs="Arial"/>
+          <w:sz w:val="24"/>
+          <w:szCs w:val="24"/>
+          <w:lang w:val="en-US"/>
+        </w:rPr>
+        <w:t>currentQualityPoints</w:t>
+      </w:r>
+      <w:r>
+        <w:rPr>
+          <w:rFonts w:ascii="Arial" w:hAnsi="Arial" w:cs="Arial"/>
+          <w:sz w:val="24"/>
+          <w:szCs w:val="24"/>
+          <w:lang w:val="en-US"/>
+        </w:rPr>
+        <w:t xml:space="preserve"> + futureQualityPoints</w:t>
+      </w:r>
+      <w:r>
+        <w:rPr>
+          <w:rFonts w:ascii="Arial" w:hAnsi="Arial" w:cs="Arial"/>
+          <w:sz w:val="24"/>
+          <w:szCs w:val="24"/>
+          <w:lang w:val="en-US"/>
+        </w:rPr>
+        <w:t>) / (</w:t>
+      </w:r>
+      <w:r>
+        <w:rPr>
+          <w:rFonts w:ascii="Arial" w:hAnsi="Arial" w:cs="Arial"/>
+          <w:sz w:val="24"/>
+          <w:szCs w:val="24"/>
+          <w:lang w:val="en-US"/>
+        </w:rPr>
+        <w:t>currentCredits +</w:t>
+      </w:r>
+      <w:r>
+        <w:rPr>
+          <w:rFonts w:ascii="Arial" w:hAnsi="Arial" w:cs="Arial"/>
+          <w:sz w:val="24"/>
+          <w:szCs w:val="24"/>
+          <w:lang w:val="en-US"/>
+        </w:rPr>
         <w:t xml:space="preserve"> </w:t>
       </w:r>
-      <w:proofErr w:type="spellStart"/>
-      <w:proofErr w:type="gramStart"/>
-      <w:r>
-        <w:rPr>
-          <w:rFonts w:ascii="Arial" w:hAnsi="Arial" w:cs="Arial"/>
-          <w:sz w:val="24"/>
-          <w:szCs w:val="24"/>
-          <w:lang w:val="en-US"/>
-        </w:rPr>
-        <w:t>CalculateProjectedGPA</w:t>
-      </w:r>
-      <w:proofErr w:type="spellEnd"/>
-      <w:r>
-        <w:rPr>
-          <w:rFonts w:ascii="Arial" w:hAnsi="Arial" w:cs="Arial"/>
-          <w:sz w:val="24"/>
-          <w:szCs w:val="24"/>
-          <w:lang w:val="en-US"/>
-        </w:rPr>
-        <w:t>(</w:t>
-      </w:r>
-      <w:proofErr w:type="spellStart"/>
-      <w:proofErr w:type="gramEnd"/>
-      <w:r>
-        <w:rPr>
-          <w:rFonts w:ascii="Arial" w:hAnsi="Arial" w:cs="Arial"/>
-          <w:sz w:val="24"/>
-          <w:szCs w:val="24"/>
-          <w:lang w:val="en-US"/>
-        </w:rPr>
-        <w:t>currentCourses</w:t>
-      </w:r>
-      <w:proofErr w:type="spellEnd"/>
-      <w:r>
-        <w:rPr>
-          <w:rFonts w:ascii="Arial" w:hAnsi="Arial" w:cs="Arial"/>
-          <w:sz w:val="24"/>
-          <w:szCs w:val="24"/>
-          <w:lang w:val="en-US"/>
-        </w:rPr>
-        <w:t>,</w:t>
-      </w:r>
-      <w:r>
-        <w:rPr>
-          <w:rFonts w:ascii="Arial" w:hAnsi="Arial" w:cs="Arial"/>
-          <w:sz w:val="24"/>
-          <w:szCs w:val="24"/>
-          <w:lang w:val="en-US"/>
-        </w:rPr>
-        <w:t xml:space="preserve"> </w:t>
-      </w:r>
-      <w:proofErr w:type="spellStart"/>
-      <w:r>
-        <w:rPr>
-          <w:rFonts w:ascii="Arial" w:hAnsi="Arial" w:cs="Arial"/>
-          <w:sz w:val="24"/>
-          <w:szCs w:val="24"/>
-          <w:lang w:val="en-US"/>
-        </w:rPr>
-        <w:t>hypothetical</w:t>
-      </w:r>
-      <w:r>
-        <w:rPr>
-          <w:rFonts w:ascii="Arial" w:hAnsi="Arial" w:cs="Arial"/>
-          <w:sz w:val="24"/>
-          <w:szCs w:val="24"/>
-          <w:lang w:val="en-US"/>
-        </w:rPr>
-        <w:t>Courses</w:t>
-      </w:r>
-      <w:proofErr w:type="spellEnd"/>
+      <w:r>
+        <w:rPr>
+          <w:rFonts w:ascii="Arial" w:hAnsi="Arial" w:cs="Arial"/>
+          <w:sz w:val="24"/>
+          <w:szCs w:val="24"/>
+          <w:lang w:val="en-US"/>
+        </w:rPr>
+        <w:t>futureCredits</w:t>
+      </w:r>
       <w:r>
         <w:rPr>
           <w:rFonts w:ascii="Arial" w:hAnsi="Arial" w:cs="Arial"/>
@@ -8662,381 +8721,6 @@
     <w:p>
       <w:pPr>
         <w:spacing w:line="360" w:lineRule="auto"/>
-        <w:rPr>
-          <w:rFonts w:ascii="Arial" w:hAnsi="Arial" w:cs="Arial"/>
-          <w:sz w:val="24"/>
-          <w:szCs w:val="24"/>
-          <w:lang w:val="en-US"/>
-        </w:rPr>
-      </w:pPr>
-    </w:p>
-    <w:p>
-      <w:pPr>
-        <w:spacing w:line="360" w:lineRule="auto"/>
-        <w:rPr>
-          <w:rFonts w:ascii="Arial" w:hAnsi="Arial" w:cs="Arial"/>
-          <w:sz w:val="24"/>
-          <w:szCs w:val="24"/>
-          <w:lang w:val="en-US"/>
-        </w:rPr>
-      </w:pPr>
-      <w:r>
-        <w:rPr>
-          <w:rFonts w:ascii="Arial" w:hAnsi="Arial" w:cs="Arial"/>
-          <w:sz w:val="24"/>
-          <w:szCs w:val="24"/>
-          <w:lang w:val="en-US"/>
-        </w:rPr>
-        <w:t xml:space="preserve">   </w:t>
-      </w:r>
-      <w:proofErr w:type="spellStart"/>
-      <w:r>
-        <w:rPr>
-          <w:rFonts w:ascii="Arial" w:hAnsi="Arial" w:cs="Arial"/>
-          <w:sz w:val="24"/>
-          <w:szCs w:val="24"/>
-          <w:lang w:val="en-US"/>
-        </w:rPr>
-        <w:t>currentQualityPoints</w:t>
-      </w:r>
-      <w:proofErr w:type="spellEnd"/>
-      <w:r>
-        <w:rPr>
-          <w:rFonts w:ascii="Arial" w:hAnsi="Arial" w:cs="Arial"/>
-          <w:sz w:val="24"/>
-          <w:szCs w:val="24"/>
-          <w:lang w:val="en-US"/>
-        </w:rPr>
-        <w:t xml:space="preserve"> = </w:t>
-      </w:r>
-      <w:proofErr w:type="spellStart"/>
-      <w:r>
-        <w:rPr>
-          <w:rFonts w:ascii="Arial" w:hAnsi="Arial" w:cs="Arial"/>
-          <w:sz w:val="24"/>
-          <w:szCs w:val="24"/>
-          <w:lang w:val="en-US"/>
-        </w:rPr>
-        <w:t>CalculateQualityPoints</w:t>
-      </w:r>
-      <w:proofErr w:type="spellEnd"/>
-      <w:r>
-        <w:rPr>
-          <w:rFonts w:ascii="Arial" w:hAnsi="Arial" w:cs="Arial"/>
-          <w:sz w:val="24"/>
-          <w:szCs w:val="24"/>
-          <w:lang w:val="en-US"/>
-        </w:rPr>
-        <w:t>(</w:t>
-      </w:r>
-      <w:proofErr w:type="spellStart"/>
-      <w:r>
-        <w:rPr>
-          <w:rFonts w:ascii="Arial" w:hAnsi="Arial" w:cs="Arial"/>
-          <w:sz w:val="24"/>
-          <w:szCs w:val="24"/>
-          <w:lang w:val="en-US"/>
-        </w:rPr>
-        <w:t>currentCourses</w:t>
-      </w:r>
-      <w:proofErr w:type="spellEnd"/>
-      <w:r>
-        <w:rPr>
-          <w:rFonts w:ascii="Arial" w:hAnsi="Arial" w:cs="Arial"/>
-          <w:sz w:val="24"/>
-          <w:szCs w:val="24"/>
-          <w:lang w:val="en-US"/>
-        </w:rPr>
-        <w:t>)</w:t>
-      </w:r>
-    </w:p>
-    <w:p>
-      <w:pPr>
-        <w:spacing w:line="360" w:lineRule="auto"/>
-        <w:rPr>
-          <w:rFonts w:ascii="Arial" w:hAnsi="Arial" w:cs="Arial"/>
-          <w:sz w:val="24"/>
-          <w:szCs w:val="24"/>
-          <w:lang w:val="en-US"/>
-        </w:rPr>
-      </w:pPr>
-    </w:p>
-    <w:p>
-      <w:pPr>
-        <w:spacing w:line="360" w:lineRule="auto"/>
-        <w:rPr>
-          <w:rFonts w:ascii="Arial" w:hAnsi="Arial" w:cs="Arial"/>
-          <w:sz w:val="24"/>
-          <w:szCs w:val="24"/>
-          <w:lang w:val="en-US"/>
-        </w:rPr>
-      </w:pPr>
-      <w:r>
-        <w:rPr>
-          <w:rFonts w:ascii="Arial" w:hAnsi="Arial" w:cs="Arial"/>
-          <w:sz w:val="24"/>
-          <w:szCs w:val="24"/>
-          <w:lang w:val="en-US"/>
-        </w:rPr>
-        <w:t xml:space="preserve">   </w:t>
-      </w:r>
-      <w:proofErr w:type="spellStart"/>
-      <w:r>
-        <w:rPr>
-          <w:rFonts w:ascii="Arial" w:hAnsi="Arial" w:cs="Arial"/>
-          <w:sz w:val="24"/>
-          <w:szCs w:val="24"/>
-          <w:lang w:val="en-US"/>
-        </w:rPr>
-        <w:t>futureQualityPoints</w:t>
-      </w:r>
-      <w:proofErr w:type="spellEnd"/>
-      <w:r>
-        <w:rPr>
-          <w:rFonts w:ascii="Arial" w:hAnsi="Arial" w:cs="Arial"/>
-          <w:sz w:val="24"/>
-          <w:szCs w:val="24"/>
-          <w:lang w:val="en-US"/>
-        </w:rPr>
-        <w:t xml:space="preserve"> = </w:t>
-      </w:r>
-      <w:proofErr w:type="spellStart"/>
-      <w:r>
-        <w:rPr>
-          <w:rFonts w:ascii="Arial" w:hAnsi="Arial" w:cs="Arial"/>
-          <w:sz w:val="24"/>
-          <w:szCs w:val="24"/>
-          <w:lang w:val="en-US"/>
-        </w:rPr>
-        <w:t>CalculateQualityPoints</w:t>
-      </w:r>
-      <w:proofErr w:type="spellEnd"/>
-      <w:r>
-        <w:rPr>
-          <w:rFonts w:ascii="Arial" w:hAnsi="Arial" w:cs="Arial"/>
-          <w:sz w:val="24"/>
-          <w:szCs w:val="24"/>
-          <w:lang w:val="en-US"/>
-        </w:rPr>
-        <w:t>(</w:t>
-      </w:r>
-      <w:proofErr w:type="spellStart"/>
-      <w:r>
-        <w:rPr>
-          <w:rFonts w:ascii="Arial" w:hAnsi="Arial" w:cs="Arial"/>
-          <w:sz w:val="24"/>
-          <w:szCs w:val="24"/>
-          <w:lang w:val="en-US"/>
-        </w:rPr>
-        <w:t>hypotheticalCourses</w:t>
-      </w:r>
-      <w:proofErr w:type="spellEnd"/>
-      <w:r>
-        <w:rPr>
-          <w:rFonts w:ascii="Arial" w:hAnsi="Arial" w:cs="Arial"/>
-          <w:sz w:val="24"/>
-          <w:szCs w:val="24"/>
-          <w:lang w:val="en-US"/>
-        </w:rPr>
-        <w:t>)</w:t>
-      </w:r>
-    </w:p>
-    <w:p>
-      <w:pPr>
-        <w:spacing w:line="360" w:lineRule="auto"/>
-        <w:rPr>
-          <w:rFonts w:ascii="Arial" w:hAnsi="Arial" w:cs="Arial"/>
-          <w:sz w:val="24"/>
-          <w:szCs w:val="24"/>
-          <w:lang w:val="en-US"/>
-        </w:rPr>
-      </w:pPr>
-    </w:p>
-    <w:p>
-      <w:pPr>
-        <w:spacing w:line="360" w:lineRule="auto"/>
-        <w:rPr>
-          <w:rFonts w:ascii="Arial" w:hAnsi="Arial" w:cs="Arial"/>
-          <w:sz w:val="24"/>
-          <w:szCs w:val="24"/>
-          <w:lang w:val="en-US"/>
-        </w:rPr>
-      </w:pPr>
-      <w:r>
-        <w:rPr>
-          <w:rFonts w:ascii="Arial" w:hAnsi="Arial" w:cs="Arial"/>
-          <w:sz w:val="24"/>
-          <w:szCs w:val="24"/>
-          <w:lang w:val="en-US"/>
-        </w:rPr>
-        <w:t xml:space="preserve">   </w:t>
-      </w:r>
-      <w:proofErr w:type="spellStart"/>
-      <w:r>
-        <w:rPr>
-          <w:rFonts w:ascii="Arial" w:hAnsi="Arial" w:cs="Arial"/>
-          <w:sz w:val="24"/>
-          <w:szCs w:val="24"/>
-          <w:lang w:val="en-US"/>
-        </w:rPr>
-        <w:t>currentCredits</w:t>
-      </w:r>
-      <w:proofErr w:type="spellEnd"/>
-      <w:r>
-        <w:rPr>
-          <w:rFonts w:ascii="Arial" w:hAnsi="Arial" w:cs="Arial"/>
-          <w:sz w:val="24"/>
-          <w:szCs w:val="24"/>
-          <w:lang w:val="en-US"/>
-        </w:rPr>
-        <w:t xml:space="preserve"> = </w:t>
-      </w:r>
-      <w:proofErr w:type="spellStart"/>
-      <w:r>
-        <w:rPr>
-          <w:rFonts w:ascii="Arial" w:hAnsi="Arial" w:cs="Arial"/>
-          <w:sz w:val="24"/>
-          <w:szCs w:val="24"/>
-          <w:lang w:val="en-US"/>
-        </w:rPr>
-        <w:t>CalculateAttemptedCredits</w:t>
-      </w:r>
-      <w:proofErr w:type="spellEnd"/>
-      <w:r>
-        <w:rPr>
-          <w:rFonts w:ascii="Arial" w:hAnsi="Arial" w:cs="Arial"/>
-          <w:sz w:val="24"/>
-          <w:szCs w:val="24"/>
-          <w:lang w:val="en-US"/>
-        </w:rPr>
-        <w:t>(</w:t>
-      </w:r>
-      <w:proofErr w:type="spellStart"/>
-      <w:r>
-        <w:rPr>
-          <w:rFonts w:ascii="Arial" w:hAnsi="Arial" w:cs="Arial"/>
-          <w:sz w:val="24"/>
-          <w:szCs w:val="24"/>
-          <w:lang w:val="en-US"/>
-        </w:rPr>
-        <w:t>currentCourses</w:t>
-      </w:r>
-      <w:proofErr w:type="spellEnd"/>
-      <w:r>
-        <w:rPr>
-          <w:rFonts w:ascii="Arial" w:hAnsi="Arial" w:cs="Arial"/>
-          <w:sz w:val="24"/>
-          <w:szCs w:val="24"/>
-          <w:lang w:val="en-US"/>
-        </w:rPr>
-        <w:t>)</w:t>
-      </w:r>
-    </w:p>
-    <w:p>
-      <w:pPr>
-        <w:spacing w:line="360" w:lineRule="auto"/>
-        <w:rPr>
-          <w:rFonts w:ascii="Arial" w:hAnsi="Arial" w:cs="Arial"/>
-          <w:sz w:val="24"/>
-          <w:szCs w:val="24"/>
-          <w:lang w:val="en-US"/>
-        </w:rPr>
-      </w:pPr>
-    </w:p>
-    <w:p>
-      <w:pPr>
-        <w:spacing w:line="360" w:lineRule="auto"/>
-        <w:rPr>
-          <w:rFonts w:ascii="Arial" w:hAnsi="Arial" w:cs="Arial"/>
-          <w:sz w:val="24"/>
-          <w:szCs w:val="24"/>
-          <w:lang w:val="en-US"/>
-        </w:rPr>
-      </w:pPr>
-      <w:r>
-        <w:rPr>
-          <w:rFonts w:ascii="Arial" w:hAnsi="Arial" w:cs="Arial"/>
-          <w:sz w:val="24"/>
-          <w:szCs w:val="24"/>
-          <w:lang w:val="en-US"/>
-        </w:rPr>
-        <w:t xml:space="preserve">   </w:t>
-      </w:r>
-      <w:proofErr w:type="spellStart"/>
-      <w:r>
-        <w:rPr>
-          <w:rFonts w:ascii="Arial" w:hAnsi="Arial" w:cs="Arial"/>
-          <w:sz w:val="24"/>
-          <w:szCs w:val="24"/>
-          <w:lang w:val="en-US"/>
-        </w:rPr>
-        <w:t>futureCredits</w:t>
-      </w:r>
-      <w:proofErr w:type="spellEnd"/>
-      <w:r>
-        <w:rPr>
-          <w:rFonts w:ascii="Arial" w:hAnsi="Arial" w:cs="Arial"/>
-          <w:sz w:val="24"/>
-          <w:szCs w:val="24"/>
-          <w:lang w:val="en-US"/>
-        </w:rPr>
-        <w:t xml:space="preserve"> = </w:t>
-      </w:r>
-      <w:proofErr w:type="spellStart"/>
-      <w:r>
-        <w:rPr>
-          <w:rFonts w:ascii="Arial" w:hAnsi="Arial" w:cs="Arial"/>
-          <w:sz w:val="24"/>
-          <w:szCs w:val="24"/>
-          <w:lang w:val="en-US"/>
-        </w:rPr>
-        <w:t>CalculateAttemptedCredits</w:t>
-      </w:r>
-      <w:proofErr w:type="spellEnd"/>
-      <w:r>
-        <w:rPr>
-          <w:rFonts w:ascii="Arial" w:hAnsi="Arial" w:cs="Arial"/>
-          <w:sz w:val="24"/>
-          <w:szCs w:val="24"/>
-          <w:lang w:val="en-US"/>
-        </w:rPr>
-        <w:t>(</w:t>
-      </w:r>
-      <w:proofErr w:type="spellStart"/>
-      <w:r>
-        <w:rPr>
-          <w:rFonts w:ascii="Arial" w:hAnsi="Arial" w:cs="Arial"/>
-          <w:sz w:val="24"/>
-          <w:szCs w:val="24"/>
-          <w:lang w:val="en-US"/>
-        </w:rPr>
-        <w:t>hypotheticalCourses</w:t>
-      </w:r>
-      <w:proofErr w:type="spellEnd"/>
-      <w:r>
-        <w:rPr>
-          <w:rFonts w:ascii="Arial" w:hAnsi="Arial" w:cs="Arial"/>
-          <w:sz w:val="24"/>
-          <w:szCs w:val="24"/>
-          <w:lang w:val="en-US"/>
-        </w:rPr>
-        <w:t>)</w:t>
-      </w:r>
-    </w:p>
-    <w:p>
-      <w:pPr>
-        <w:spacing w:line="360" w:lineRule="auto"/>
-        <w:rPr>
-          <w:rFonts w:ascii="Arial" w:hAnsi="Arial" w:cs="Arial"/>
-          <w:sz w:val="24"/>
-          <w:szCs w:val="24"/>
-          <w:lang w:val="en-US"/>
-        </w:rPr>
-      </w:pPr>
-    </w:p>
-    <w:p>
-      <w:pPr>
-        <w:spacing w:line="360" w:lineRule="auto"/>
         <w:ind w:left="204"/>
         <w:rPr>
           <w:rFonts w:ascii="Arial" w:hAnsi="Arial" w:cs="Arial"/>
@@ -9045,115 +8729,6 @@
           <w:lang w:val="en-US"/>
         </w:rPr>
       </w:pPr>
-      <w:proofErr w:type="spellStart"/>
-      <w:r>
-        <w:rPr>
-          <w:rFonts w:ascii="Arial" w:hAnsi="Arial" w:cs="Arial"/>
-          <w:sz w:val="24"/>
-          <w:szCs w:val="24"/>
-          <w:lang w:val="en-US"/>
-        </w:rPr>
-        <w:t>projectedGPA</w:t>
-      </w:r>
-      <w:proofErr w:type="spellEnd"/>
-      <w:r>
-        <w:rPr>
-          <w:rFonts w:ascii="Arial" w:hAnsi="Arial" w:cs="Arial"/>
-          <w:sz w:val="24"/>
-          <w:szCs w:val="24"/>
-          <w:lang w:val="en-US"/>
-        </w:rPr>
-        <w:t xml:space="preserve"> = (</w:t>
-      </w:r>
-      <w:proofErr w:type="spellStart"/>
-      <w:r>
-        <w:rPr>
-          <w:rFonts w:ascii="Arial" w:hAnsi="Arial" w:cs="Arial"/>
-          <w:sz w:val="24"/>
-          <w:szCs w:val="24"/>
-          <w:lang w:val="en-US"/>
-        </w:rPr>
-        <w:t>currentQualityPoints</w:t>
-      </w:r>
-      <w:proofErr w:type="spellEnd"/>
-      <w:r>
-        <w:rPr>
-          <w:rFonts w:ascii="Arial" w:hAnsi="Arial" w:cs="Arial"/>
-          <w:sz w:val="24"/>
-          <w:szCs w:val="24"/>
-          <w:lang w:val="en-US"/>
-        </w:rPr>
-        <w:t xml:space="preserve"> + </w:t>
-      </w:r>
-      <w:proofErr w:type="spellStart"/>
-      <w:r>
-        <w:rPr>
-          <w:rFonts w:ascii="Arial" w:hAnsi="Arial" w:cs="Arial"/>
-          <w:sz w:val="24"/>
-          <w:szCs w:val="24"/>
-          <w:lang w:val="en-US"/>
-        </w:rPr>
-        <w:t>futureQualityPoints</w:t>
-      </w:r>
-      <w:proofErr w:type="spellEnd"/>
-      <w:r>
-        <w:rPr>
-          <w:rFonts w:ascii="Arial" w:hAnsi="Arial" w:cs="Arial"/>
-          <w:sz w:val="24"/>
-          <w:szCs w:val="24"/>
-          <w:lang w:val="en-US"/>
-        </w:rPr>
-        <w:t>) / (</w:t>
-      </w:r>
-      <w:proofErr w:type="spellStart"/>
-      <w:r>
-        <w:rPr>
-          <w:rFonts w:ascii="Arial" w:hAnsi="Arial" w:cs="Arial"/>
-          <w:sz w:val="24"/>
-          <w:szCs w:val="24"/>
-          <w:lang w:val="en-US"/>
-        </w:rPr>
-        <w:t>currentCredits</w:t>
-      </w:r>
-      <w:proofErr w:type="spellEnd"/>
-      <w:r>
-        <w:rPr>
-          <w:rFonts w:ascii="Arial" w:hAnsi="Arial" w:cs="Arial"/>
-          <w:sz w:val="24"/>
-          <w:szCs w:val="24"/>
-          <w:lang w:val="en-US"/>
-        </w:rPr>
-        <w:t xml:space="preserve"> +</w:t>
-      </w:r>
-      <w:r>
-        <w:rPr>
-          <w:rFonts w:ascii="Arial" w:hAnsi="Arial" w:cs="Arial"/>
-          <w:sz w:val="24"/>
-          <w:szCs w:val="24"/>
-          <w:lang w:val="en-US"/>
-        </w:rPr>
-        <w:t xml:space="preserve"> </w:t>
-      </w:r>
-      <w:proofErr w:type="spellStart"/>
-      <w:r>
-        <w:rPr>
-          <w:rFonts w:ascii="Arial" w:hAnsi="Arial" w:cs="Arial"/>
-          <w:sz w:val="24"/>
-          <w:szCs w:val="24"/>
-          <w:lang w:val="en-US"/>
-        </w:rPr>
-        <w:t>futureCredits</w:t>
-      </w:r>
-      <w:proofErr w:type="spellEnd"/>
-      <w:r>
-        <w:rPr>
-          <w:rFonts w:ascii="Arial" w:hAnsi="Arial" w:cs="Arial"/>
-          <w:sz w:val="24"/>
-          <w:szCs w:val="24"/>
-          <w:lang w:val="en-US"/>
-        </w:rPr>
-        <w:t>)</w:t>
-      </w:r>
     </w:p>
     <w:p>
       <w:pPr>
@@ -9166,38 +8741,15 @@
           <w:lang w:val="en-US"/>
         </w:rPr>
       </w:pPr>
-    </w:p>
-    <w:p>
-      <w:pPr>
-        <w:spacing w:line="360" w:lineRule="auto"/>
-        <w:ind w:left="204"/>
-        <w:rPr>
-          <w:rFonts w:ascii="Arial" w:hAnsi="Arial" w:cs="Arial"/>
-          <w:sz w:val="24"/>
-          <w:szCs w:val="24"/>
-          <w:lang w:val="en-US"/>
-        </w:rPr>
-      </w:pPr>
-      <w:r>
-        <w:rPr>
-          <w:rFonts w:ascii="Arial" w:hAnsi="Arial" w:cs="Arial"/>
-          <w:sz w:val="24"/>
-          <w:szCs w:val="24"/>
-          <w:lang w:val="en-US"/>
-        </w:rPr>
-        <w:t xml:space="preserve">RETURN </w:t>
-      </w:r>
-      <w:proofErr w:type="spellStart"/>
-      <w:r>
-        <w:rPr>
-          <w:rFonts w:ascii="Arial" w:hAnsi="Arial" w:cs="Arial"/>
-          <w:sz w:val="24"/>
-          <w:szCs w:val="24"/>
-          <w:lang w:val="en-US"/>
-        </w:rPr>
-        <w:t>projectedGPA</w:t>
-      </w:r>
-      <w:proofErr w:type="spellEnd"/>
+      <w:r>
+        <w:rPr>
+          <w:rFonts w:ascii="Arial" w:hAnsi="Arial" w:cs="Arial"/>
+          <w:sz w:val="24"/>
+          <w:szCs w:val="24"/>
+          <w:lang w:val="en-US"/>
+        </w:rPr>
+        <w:t>RETURN projectedGPA</w:t>
+      </w:r>
     </w:p>
     <w:p>
       <w:pPr>
@@ -9280,51 +8832,17 @@
           <w:szCs w:val="24"/>
           <w:lang w:val="en-US"/>
         </w:rPr>
-        <w:t xml:space="preserve">FUNCTION </w:t>
-      </w:r>
-      <w:proofErr w:type="spellStart"/>
-      <w:proofErr w:type="gramStart"/>
-      <w:r>
-        <w:rPr>
-          <w:rFonts w:ascii="Arial" w:hAnsi="Arial" w:cs="Arial"/>
-          <w:sz w:val="24"/>
-          <w:szCs w:val="24"/>
-          <w:lang w:val="en-US"/>
-        </w:rPr>
-        <w:t>CalculateDegreeProgress</w:t>
-      </w:r>
-      <w:proofErr w:type="spellEnd"/>
-      <w:r>
-        <w:rPr>
-          <w:rFonts w:ascii="Arial" w:hAnsi="Arial" w:cs="Arial"/>
-          <w:sz w:val="24"/>
-          <w:szCs w:val="24"/>
-          <w:lang w:val="en-US"/>
-        </w:rPr>
-        <w:t>(</w:t>
-      </w:r>
-      <w:proofErr w:type="spellStart"/>
-      <w:proofErr w:type="gramEnd"/>
-      <w:r>
-        <w:rPr>
-          <w:rFonts w:ascii="Arial" w:hAnsi="Arial" w:cs="Arial"/>
-          <w:sz w:val="24"/>
-          <w:szCs w:val="24"/>
-          <w:lang w:val="en-US"/>
-        </w:rPr>
-        <w:t>earnedCredits</w:t>
-      </w:r>
-      <w:proofErr w:type="spellEnd"/>
-      <w:r>
-        <w:rPr>
-          <w:rFonts w:ascii="Arial" w:hAnsi="Arial" w:cs="Arial"/>
-          <w:sz w:val="24"/>
-          <w:szCs w:val="24"/>
-          <w:lang w:val="en-US"/>
-        </w:rPr>
-        <w:t xml:space="preserve">, </w:t>
-      </w:r>
-      <w:proofErr w:type="spellStart"/>
+        <w:t>FUNCTION CalculateDegreeProgress(</w:t>
+      </w:r>
+      <w:r>
+        <w:rPr>
+          <w:rFonts w:ascii="Arial" w:hAnsi="Arial" w:cs="Arial"/>
+          <w:sz w:val="24"/>
+          <w:szCs w:val="24"/>
+          <w:lang w:val="en-US"/>
+        </w:rPr>
+        <w:t xml:space="preserve">earnedCredits, </w:t>
+      </w:r>
       <w:r>
         <w:rPr>
           <w:rFonts w:ascii="Arial" w:hAnsi="Arial" w:cs="Arial"/>
@@ -9334,7 +8852,6 @@
         </w:rPr>
         <w:t>requiredCredits</w:t>
       </w:r>
-      <w:proofErr w:type="spellEnd"/>
       <w:r>
         <w:rPr>
           <w:rFonts w:ascii="Arial" w:hAnsi="Arial" w:cs="Arial"/>
@@ -9383,27 +8900,7 @@
           <w:szCs w:val="24"/>
           <w:lang w:val="en-US"/>
         </w:rPr>
-        <w:t xml:space="preserve">IF </w:t>
-      </w:r>
-      <w:proofErr w:type="spellStart"/>
-      <w:r>
-        <w:rPr>
-          <w:rFonts w:ascii="Arial" w:hAnsi="Arial" w:cs="Arial"/>
-          <w:sz w:val="24"/>
-          <w:szCs w:val="24"/>
-          <w:lang w:val="en-US"/>
-        </w:rPr>
-        <w:t>requiredCredits</w:t>
-      </w:r>
-      <w:proofErr w:type="spellEnd"/>
-      <w:r>
-        <w:rPr>
-          <w:rFonts w:ascii="Arial" w:hAnsi="Arial" w:cs="Arial"/>
-          <w:sz w:val="24"/>
-          <w:szCs w:val="24"/>
-          <w:lang w:val="en-US"/>
-        </w:rPr>
-        <w:t xml:space="preserve"> &lt;= 0</w:t>
+        <w:t>IF requiredCredits &lt;= 0</w:t>
       </w:r>
     </w:p>
     <w:p>
@@ -9512,7 +9009,6 @@
         </w:rPr>
         <w:t xml:space="preserve">ercentage = </w:t>
       </w:r>
-      <w:proofErr w:type="spellStart"/>
       <w:r>
         <w:rPr>
           <w:rFonts w:ascii="Arial" w:hAnsi="Arial" w:cs="Arial"/>
@@ -9522,35 +9018,14 @@
         </w:rPr>
         <w:t>earnedCredits</w:t>
       </w:r>
-      <w:proofErr w:type="spellEnd"/>
-      <w:r>
-        <w:rPr>
-          <w:rFonts w:ascii="Arial" w:hAnsi="Arial" w:cs="Arial"/>
-          <w:sz w:val="24"/>
-          <w:szCs w:val="24"/>
-          <w:lang w:val="en-US"/>
-        </w:rPr>
-        <w:t xml:space="preserve"> / </w:t>
-      </w:r>
-      <w:proofErr w:type="spellStart"/>
-      <w:r>
-        <w:rPr>
-          <w:rFonts w:ascii="Arial" w:hAnsi="Arial" w:cs="Arial"/>
-          <w:sz w:val="24"/>
-          <w:szCs w:val="24"/>
-          <w:lang w:val="en-US"/>
-        </w:rPr>
-        <w:t>requiredCredits</w:t>
-      </w:r>
-      <w:proofErr w:type="spellEnd"/>
-      <w:r>
-        <w:rPr>
-          <w:rFonts w:ascii="Arial" w:hAnsi="Arial" w:cs="Arial"/>
-          <w:sz w:val="24"/>
-          <w:szCs w:val="24"/>
-          <w:lang w:val="en-US"/>
-        </w:rPr>
-        <w:t xml:space="preserve"> * 100</w:t>
+      <w:r>
+        <w:rPr>
+          <w:rFonts w:ascii="Arial" w:hAnsi="Arial" w:cs="Arial"/>
+          <w:sz w:val="24"/>
+          <w:szCs w:val="24"/>
+          <w:lang w:val="en-US"/>
+        </w:rPr>
+        <w:t xml:space="preserve"> / requiredCredits * 100</w:t>
       </w:r>
     </w:p>
     <w:p>
@@ -9756,27 +9231,15 @@
         </w:rPr>
         <w:t xml:space="preserve">FUNCTION </w:t>
       </w:r>
-      <w:proofErr w:type="spellStart"/>
-      <w:r>
-        <w:rPr>
-          <w:rFonts w:ascii="Arial" w:hAnsi="Arial" w:cs="Arial"/>
-          <w:sz w:val="24"/>
-          <w:szCs w:val="24"/>
-          <w:lang w:val="en-US"/>
-        </w:rPr>
-        <w:t>DeleteCourse</w:t>
-      </w:r>
-      <w:proofErr w:type="spellEnd"/>
-      <w:r>
-        <w:rPr>
-          <w:rFonts w:ascii="Arial" w:hAnsi="Arial" w:cs="Arial"/>
-          <w:sz w:val="24"/>
-          <w:szCs w:val="24"/>
-          <w:lang w:val="en-US"/>
-        </w:rPr>
-        <w:t>(</w:t>
-      </w:r>
-      <w:proofErr w:type="spellStart"/>
+      <w:r>
+        <w:rPr>
+          <w:rFonts w:ascii="Arial" w:hAnsi="Arial" w:cs="Arial"/>
+          <w:sz w:val="24"/>
+          <w:szCs w:val="24"/>
+          <w:lang w:val="en-US"/>
+        </w:rPr>
+        <w:t>DeleteCourse(</w:t>
+      </w:r>
       <w:r>
         <w:rPr>
           <w:rFonts w:ascii="Arial" w:hAnsi="Arial" w:cs="Arial"/>
@@ -9786,7 +9249,6 @@
         </w:rPr>
         <w:t>courseId</w:t>
       </w:r>
-      <w:proofErr w:type="spellEnd"/>
       <w:r>
         <w:rPr>
           <w:rFonts w:ascii="Arial" w:hAnsi="Arial" w:cs="Arial"/>
@@ -9836,7 +9298,6 @@
         </w:rPr>
         <w:t xml:space="preserve">FIND course by </w:t>
       </w:r>
-      <w:proofErr w:type="spellStart"/>
       <w:r>
         <w:rPr>
           <w:rFonts w:ascii="Arial" w:hAnsi="Arial" w:cs="Arial"/>
@@ -9864,7 +9325,6 @@
         </w:rPr>
         <w:t>d</w:t>
       </w:r>
-      <w:proofErr w:type="spellEnd"/>
     </w:p>
     <w:p>
       <w:pPr>
@@ -11566,27 +11026,7 @@
           <w:szCs w:val="24"/>
           <w:lang w:val="en-US"/>
         </w:rPr>
-        <w:t xml:space="preserve"> the </w:t>
-      </w:r>
-      <w:proofErr w:type="spellStart"/>
-      <w:r>
-        <w:rPr>
-          <w:rFonts w:ascii="Arial" w:hAnsi="Arial" w:cs="Arial"/>
-          <w:sz w:val="24"/>
-          <w:szCs w:val="24"/>
-          <w:lang w:val="en-US"/>
-        </w:rPr>
-        <w:t>CourseService</w:t>
-      </w:r>
-      <w:proofErr w:type="spellEnd"/>
-      <w:r>
-        <w:rPr>
-          <w:rFonts w:ascii="Arial" w:hAnsi="Arial" w:cs="Arial"/>
-          <w:sz w:val="24"/>
-          <w:szCs w:val="24"/>
-          <w:lang w:val="en-US"/>
-        </w:rPr>
-        <w:t xml:space="preserve"> is responsible for</w:t>
+        <w:t xml:space="preserve"> the CourseService is responsible for</w:t>
       </w:r>
       <w:r>
         <w:rPr>
@@ -11640,19 +11080,8 @@
           <w:szCs w:val="24"/>
           <w:lang w:val="en-US"/>
         </w:rPr>
-        <w:t xml:space="preserve"> the Courses and </w:t>
-      </w:r>
-      <w:proofErr w:type="spellStart"/>
-      <w:r>
-        <w:rPr>
-          <w:rFonts w:ascii="Arial" w:hAnsi="Arial" w:cs="Arial"/>
-          <w:sz w:val="24"/>
-          <w:szCs w:val="24"/>
-          <w:lang w:val="en-US"/>
-        </w:rPr>
-        <w:t>AddCourse</w:t>
-      </w:r>
-      <w:proofErr w:type="spellEnd"/>
+        <w:t xml:space="preserve"> the Courses and AddCourse</w:t>
+      </w:r>
       <w:r>
         <w:rPr>
           <w:rFonts w:ascii="Arial" w:hAnsi="Arial" w:cs="Arial"/>
@@ -12046,27 +11475,7 @@
           <w:szCs w:val="24"/>
           <w:lang w:val="en-US"/>
         </w:rPr>
-        <w:t xml:space="preserve">The </w:t>
-      </w:r>
-      <w:proofErr w:type="spellStart"/>
-      <w:r>
-        <w:rPr>
-          <w:rFonts w:ascii="Arial" w:hAnsi="Arial" w:cs="Arial"/>
-          <w:sz w:val="24"/>
-          <w:szCs w:val="24"/>
-          <w:lang w:val="en-US"/>
-        </w:rPr>
-        <w:t>AcademicDbContext</w:t>
-      </w:r>
-      <w:proofErr w:type="spellEnd"/>
-      <w:r>
-        <w:rPr>
-          <w:rFonts w:ascii="Arial" w:hAnsi="Arial" w:cs="Arial"/>
-          <w:sz w:val="24"/>
-          <w:szCs w:val="24"/>
-          <w:lang w:val="en-US"/>
-        </w:rPr>
-        <w:t xml:space="preserve"> class</w:t>
+        <w:t>The AcademicDbContext class</w:t>
       </w:r>
       <w:r>
         <w:rPr>
@@ -12450,13 +11859,8 @@
           <w:lang w:val="en-US"/>
         </w:rPr>
       </w:pPr>
-      <w:proofErr w:type="spellStart"/>
-      <w:r>
-        <w:t>Figure</w:t>
-      </w:r>
-      <w:proofErr w:type="spellEnd"/>
-      <w:r>
-        <w:t xml:space="preserve"> </w:t>
+      <w:r>
+        <w:t xml:space="preserve">Figure </w:t>
       </w:r>
       <w:fldSimple w:instr=" SEQ Figure \* ARABIC ">
         <w:r>
@@ -12645,27 +12049,7 @@
           <w:szCs w:val="24"/>
           <w:lang w:val="en-US"/>
         </w:rPr>
-        <w:t xml:space="preserve"> the </w:t>
-      </w:r>
-      <w:proofErr w:type="spellStart"/>
-      <w:r>
-        <w:rPr>
-          <w:rFonts w:ascii="Arial" w:hAnsi="Arial" w:cs="Arial"/>
-          <w:sz w:val="24"/>
-          <w:szCs w:val="24"/>
-          <w:lang w:val="en-US"/>
-        </w:rPr>
-        <w:t>SemesterId</w:t>
-      </w:r>
-      <w:proofErr w:type="spellEnd"/>
-      <w:r>
-        <w:rPr>
-          <w:rFonts w:ascii="Arial" w:hAnsi="Arial" w:cs="Arial"/>
-          <w:sz w:val="24"/>
-          <w:szCs w:val="24"/>
-          <w:lang w:val="en-US"/>
-        </w:rPr>
-        <w:t xml:space="preserve"> foreign key</w:t>
+        <w:t xml:space="preserve"> the SemesterId foreign key</w:t>
       </w:r>
       <w:r>
         <w:rPr>
@@ -13442,16 +12826,8 @@
                               <w:rPr>
                                 <w:lang w:val="en-US"/>
                               </w:rPr>
-                              <w:t xml:space="preserve">   </w:t>
+                              <w:t xml:space="preserve">   SemesterId</w:t>
                             </w:r>
-                            <w:proofErr w:type="spellStart"/>
-                            <w:r>
-                              <w:rPr>
-                                <w:lang w:val="en-US"/>
-                              </w:rPr>
-                              <w:t>SemesterId</w:t>
-                            </w:r>
-                            <w:proofErr w:type="spellEnd"/>
                           </w:p>
                         </w:txbxContent>
                       </wps:txbx>
@@ -13761,13 +13137,8 @@
       <w:pPr>
         <w:pStyle w:val="Caption"/>
       </w:pPr>
-      <w:proofErr w:type="spellStart"/>
-      <w:r>
-        <w:t>Figure</w:t>
-      </w:r>
-      <w:proofErr w:type="spellEnd"/>
-      <w:r>
-        <w:t xml:space="preserve"> </w:t>
+      <w:r>
+        <w:t xml:space="preserve">Figure </w:t>
       </w:r>
       <w:fldSimple w:instr=" SEQ Figure \* ARABIC ">
         <w:r>
@@ -13861,21 +13232,7 @@
         <w:rPr>
           <w:lang w:val="en-US"/>
         </w:rPr>
-        <w:t xml:space="preserve"> The </w:t>
-      </w:r>
-      <w:proofErr w:type="spellStart"/>
-      <w:r>
-        <w:rPr>
-          <w:lang w:val="en-US"/>
-        </w:rPr>
-        <w:t>SemesterId</w:t>
-      </w:r>
-      <w:proofErr w:type="spellEnd"/>
-      <w:r>
-        <w:rPr>
-          <w:lang w:val="en-US"/>
-        </w:rPr>
-        <w:t xml:space="preserve"> property</w:t>
+        <w:t xml:space="preserve"> The SemesterId property</w:t>
       </w:r>
       <w:r>
         <w:rPr>
@@ -14009,21 +13366,7 @@
         <w:rPr>
           <w:lang w:val="en-US"/>
         </w:rPr>
-        <w:t xml:space="preserve"> </w:t>
-      </w:r>
-      <w:proofErr w:type="spellStart"/>
-      <w:r>
-        <w:rPr>
-          <w:lang w:val="en-US"/>
-        </w:rPr>
-        <w:t>AcademicDbContext</w:t>
-      </w:r>
-      <w:proofErr w:type="spellEnd"/>
-      <w:r>
-        <w:rPr>
-          <w:lang w:val="en-US"/>
-        </w:rPr>
-        <w:t>.</w:t>
+        <w:t xml:space="preserve"> AcademicDbContext.</w:t>
       </w:r>
       <w:r>
         <w:rPr>
@@ -14383,21 +13726,7 @@
         <w:rPr>
           <w:lang w:val="en-US"/>
         </w:rPr>
-        <w:t xml:space="preserve"> </w:t>
-      </w:r>
-      <w:proofErr w:type="gramStart"/>
-      <w:r>
-        <w:rPr>
-          <w:lang w:val="en-US"/>
-        </w:rPr>
-        <w:t>the GPA</w:t>
-      </w:r>
-      <w:proofErr w:type="gramEnd"/>
-      <w:r>
-        <w:rPr>
-          <w:lang w:val="en-US"/>
-        </w:rPr>
-        <w:t xml:space="preserve"> calculation</w:t>
+        <w:t xml:space="preserve"> the GPA calculation</w:t>
       </w:r>
       <w:r>
         <w:rPr>
@@ -14505,41 +13834,13 @@
         <w:rPr>
           <w:lang w:val="en-US"/>
         </w:rPr>
-        <w:t xml:space="preserve"> </w:t>
-      </w:r>
-      <w:proofErr w:type="gramStart"/>
-      <w:r>
-        <w:rPr>
-          <w:lang w:val="en-US"/>
-        </w:rPr>
-        <w:t>of</w:t>
-      </w:r>
-      <w:proofErr w:type="gramEnd"/>
-      <w:r>
-        <w:rPr>
-          <w:lang w:val="en-US"/>
-        </w:rPr>
-        <w:t xml:space="preserve"> the corresponding course</w:t>
-      </w:r>
-      <w:r>
-        <w:rPr>
-          <w:lang w:val="en-US"/>
-        </w:rPr>
-        <w:t xml:space="preserve"> </w:t>
-      </w:r>
-      <w:proofErr w:type="gramStart"/>
-      <w:r>
-        <w:rPr>
-          <w:lang w:val="en-US"/>
-        </w:rPr>
-        <w:t>in order to</w:t>
-      </w:r>
-      <w:proofErr w:type="gramEnd"/>
-      <w:r>
-        <w:rPr>
-          <w:lang w:val="en-US"/>
-        </w:rPr>
-        <w:t xml:space="preserve"> obtain</w:t>
+        <w:t xml:space="preserve"> of the corresponding course</w:t>
+      </w:r>
+      <w:r>
+        <w:rPr>
+          <w:lang w:val="en-US"/>
+        </w:rPr>
+        <w:t xml:space="preserve"> in order to obtain</w:t>
       </w:r>
       <w:r>
         <w:rPr>
@@ -14915,21 +14216,7 @@
         <w:rPr>
           <w:lang w:val="en-US"/>
         </w:rPr>
-        <w:t xml:space="preserve"> </w:t>
-      </w:r>
-      <w:proofErr w:type="spellStart"/>
-      <w:r>
-        <w:rPr>
-          <w:lang w:val="en-US"/>
-        </w:rPr>
-        <w:t>GpaCalculator</w:t>
-      </w:r>
-      <w:proofErr w:type="spellEnd"/>
-      <w:r>
-        <w:rPr>
-          <w:lang w:val="en-US"/>
-        </w:rPr>
-        <w:t xml:space="preserve"> service.</w:t>
+        <w:t xml:space="preserve"> GpaCalculator service.</w:t>
       </w:r>
       <w:r>
         <w:rPr>
@@ -15154,21 +14441,7 @@
         <w:rPr>
           <w:lang w:val="en-US"/>
         </w:rPr>
-        <w:t xml:space="preserve">, the method </w:t>
-      </w:r>
-      <w:proofErr w:type="gramStart"/>
-      <w:r>
-        <w:rPr>
-          <w:lang w:val="en-US"/>
-        </w:rPr>
-        <w:t>returns</w:t>
-      </w:r>
-      <w:proofErr w:type="gramEnd"/>
-      <w:r>
-        <w:rPr>
-          <w:lang w:val="en-US"/>
-        </w:rPr>
-        <w:t xml:space="preserve"> a GPA</w:t>
+        <w:t>, the method returns a GPA</w:t>
       </w:r>
       <w:r>
         <w:rPr>
@@ -15296,21 +14569,7 @@
         <w:rPr>
           <w:lang w:val="en-US"/>
         </w:rPr>
-        <w:t xml:space="preserve">, or </w:t>
-      </w:r>
-      <w:proofErr w:type="gramStart"/>
-      <w:r>
-        <w:rPr>
-          <w:lang w:val="en-US"/>
-        </w:rPr>
-        <w:t>O(</w:t>
-      </w:r>
-      <w:proofErr w:type="gramEnd"/>
-      <w:r>
-        <w:rPr>
-          <w:lang w:val="en-US"/>
-        </w:rPr>
-        <w:t>1)</w:t>
+        <w:t>, or O(1)</w:t>
       </w:r>
       <w:r>
         <w:rPr>
@@ -15784,21 +15043,7 @@
         <w:rPr>
           <w:lang w:val="en-US"/>
         </w:rPr>
-        <w:t xml:space="preserve"> Because </w:t>
-      </w:r>
-      <w:proofErr w:type="gramStart"/>
-      <w:r>
-        <w:rPr>
-          <w:lang w:val="en-US"/>
-        </w:rPr>
-        <w:t>the hypothetical</w:t>
-      </w:r>
-      <w:proofErr w:type="gramEnd"/>
-      <w:r>
-        <w:rPr>
-          <w:lang w:val="en-US"/>
-        </w:rPr>
-        <w:t xml:space="preserve"> courses</w:t>
+        <w:t xml:space="preserve"> Because the hypothetical courses</w:t>
       </w:r>
       <w:r>
         <w:rPr>
@@ -16574,21 +15819,7 @@
         <w:rPr>
           <w:lang w:val="en-US"/>
         </w:rPr>
-        <w:t xml:space="preserve"> </w:t>
-      </w:r>
-      <w:proofErr w:type="gramStart"/>
-      <w:r>
-        <w:rPr>
-          <w:lang w:val="en-US"/>
-        </w:rPr>
-        <w:t>is</w:t>
-      </w:r>
-      <w:proofErr w:type="gramEnd"/>
-      <w:r>
-        <w:rPr>
-          <w:lang w:val="en-US"/>
-        </w:rPr>
-        <w:t xml:space="preserve"> performed through</w:t>
+        <w:t xml:space="preserve"> is performed through</w:t>
       </w:r>
       <w:r>
         <w:rPr>
@@ -17307,16 +16538,8 @@
         <w:rPr>
           <w:lang w:val="en-US"/>
         </w:rPr>
-        <w:t xml:space="preserve"> a course </w:t>
-      </w:r>
-      <w:proofErr w:type="gramStart"/>
-      <w:r>
-        <w:rPr>
-          <w:lang w:val="en-US"/>
-        </w:rPr>
-        <w:t>in order to</w:t>
-      </w:r>
-      <w:proofErr w:type="gramEnd"/>
+        <w:t xml:space="preserve"> a course in order to</w:t>
+      </w:r>
       <w:r>
         <w:rPr>
           <w:lang w:val="en-US"/>
@@ -17750,21 +16973,7 @@
         <w:rPr>
           <w:lang w:val="en-US"/>
         </w:rPr>
-        <w:t xml:space="preserve"> executes </w:t>
-      </w:r>
-      <w:proofErr w:type="gramStart"/>
-      <w:r>
-        <w:rPr>
-          <w:lang w:val="en-US"/>
-        </w:rPr>
-        <w:t>the business</w:t>
-      </w:r>
-      <w:proofErr w:type="gramEnd"/>
-      <w:r>
-        <w:rPr>
-          <w:lang w:val="en-US"/>
-        </w:rPr>
-        <w:t xml:space="preserve"> logic</w:t>
+        <w:t xml:space="preserve"> executes the business logic</w:t>
       </w:r>
       <w:r>
         <w:rPr>
@@ -19361,13 +18570,8 @@
           <w:lang w:val="en-US"/>
         </w:rPr>
       </w:pPr>
-      <w:proofErr w:type="spellStart"/>
-      <w:r>
-        <w:t>Figure</w:t>
-      </w:r>
-      <w:proofErr w:type="spellEnd"/>
-      <w:r>
-        <w:t xml:space="preserve"> </w:t>
+      <w:r>
+        <w:t xml:space="preserve">Figure </w:t>
       </w:r>
       <w:fldSimple w:instr=" SEQ Figure \* ARABIC ">
         <w:r>
@@ -20132,16 +19336,8 @@
         <w:rPr>
           <w:lang w:val="en-US"/>
         </w:rPr>
-        <w:t xml:space="preserve"> These restrictions prevent </w:t>
-      </w:r>
-      <w:proofErr w:type="gramStart"/>
-      <w:r>
-        <w:rPr>
-          <w:lang w:val="en-US"/>
-        </w:rPr>
-        <w:t>a number of</w:t>
-      </w:r>
-      <w:proofErr w:type="gramEnd"/>
+        <w:t xml:space="preserve"> These restrictions prevent a number of</w:t>
+      </w:r>
       <w:r>
         <w:rPr>
           <w:lang w:val="en-US"/>
@@ -20506,16 +19702,8 @@
         <w:rPr>
           <w:lang w:val="en-US"/>
         </w:rPr>
-        <w:t xml:space="preserve"> distributed </w:t>
-      </w:r>
-      <w:proofErr w:type="gramStart"/>
-      <w:r>
-        <w:rPr>
-          <w:lang w:val="en-US"/>
-        </w:rPr>
-        <w:t>throughout</w:t>
-      </w:r>
-      <w:proofErr w:type="gramEnd"/>
+        <w:t xml:space="preserve"> distributed throughout</w:t>
+      </w:r>
       <w:r>
         <w:rPr>
           <w:lang w:val="en-US"/>
@@ -21152,21 +20340,7 @@
         <w:rPr>
           <w:lang w:val="en-US"/>
         </w:rPr>
-        <w:t xml:space="preserve"> is </w:t>
-      </w:r>
-      <w:proofErr w:type="gramStart"/>
-      <w:r>
-        <w:rPr>
-          <w:lang w:val="en-US"/>
-        </w:rPr>
-        <w:t>entered</w:t>
-      </w:r>
-      <w:proofErr w:type="gramEnd"/>
-      <w:r>
-        <w:rPr>
-          <w:lang w:val="en-US"/>
-        </w:rPr>
-        <w:t xml:space="preserve"> and</w:t>
+        <w:t xml:space="preserve"> is entered and</w:t>
       </w:r>
       <w:r>
         <w:rPr>
@@ -21245,6 +20419,116 @@
           <w:lang w:val="en-US"/>
         </w:rPr>
         <w:t xml:space="preserve"> and policies.</w:t>
+      </w:r>
+    </w:p>
+    <w:p>
+      <w:pPr>
+        <w:rPr>
+          <w:lang w:val="en-US"/>
+        </w:rPr>
+      </w:pPr>
+    </w:p>
+    <w:p>
+      <w:pPr>
+        <w:rPr>
+          <w:lang w:val="en-US"/>
+        </w:rPr>
+      </w:pPr>
+      <w:r>
+        <w:rPr>
+          <w:lang w:val="en-US"/>
+        </w:rPr>
+        <w:t>Overall,</w:t>
+      </w:r>
+      <w:r>
+        <w:rPr>
+          <w:lang w:val="en-US"/>
+        </w:rPr>
+        <w:t xml:space="preserve"> the reliability</w:t>
+      </w:r>
+      <w:r>
+        <w:rPr>
+          <w:lang w:val="en-US"/>
+        </w:rPr>
+        <w:t xml:space="preserve"> and security design</w:t>
+      </w:r>
+      <w:r>
+        <w:rPr>
+          <w:lang w:val="en-US"/>
+        </w:rPr>
+        <w:t xml:space="preserve"> is proportional</w:t>
+      </w:r>
+      <w:r>
+        <w:rPr>
+          <w:lang w:val="en-US"/>
+        </w:rPr>
+        <w:t xml:space="preserve"> to the intended</w:t>
+      </w:r>
+      <w:r>
+        <w:rPr>
+          <w:lang w:val="en-US"/>
+        </w:rPr>
+        <w:t xml:space="preserve"> scope of the program</w:t>
+      </w:r>
+      <w:r>
+        <w:rPr>
+          <w:lang w:val="en-US"/>
+        </w:rPr>
+        <w:t>.</w:t>
+      </w:r>
+      <w:r>
+        <w:rPr>
+          <w:lang w:val="en-US"/>
+        </w:rPr>
+        <w:t xml:space="preserve"> The primary objectives</w:t>
+      </w:r>
+      <w:r>
+        <w:rPr>
+          <w:lang w:val="en-US"/>
+        </w:rPr>
+        <w:t xml:space="preserve"> are to maintain</w:t>
+      </w:r>
+      <w:r>
+        <w:rPr>
+          <w:lang w:val="en-US"/>
+        </w:rPr>
+        <w:t xml:space="preserve"> consistent academic records</w:t>
+      </w:r>
+      <w:r>
+        <w:rPr>
+          <w:lang w:val="en-US"/>
+        </w:rPr>
+        <w:t>, prevent invalid input</w:t>
+      </w:r>
+      <w:r>
+        <w:rPr>
+          <w:lang w:val="en-US"/>
+        </w:rPr>
+        <w:t>, preserve data between</w:t>
+      </w:r>
+      <w:r>
+        <w:rPr>
+          <w:lang w:val="en-US"/>
+        </w:rPr>
+        <w:t xml:space="preserve"> sessions</w:t>
+      </w:r>
+      <w:r>
+        <w:rPr>
+          <w:lang w:val="en-US"/>
+        </w:rPr>
+        <w:t>, and separate critical</w:t>
+      </w:r>
+      <w:r>
+        <w:rPr>
+          <w:lang w:val="en-US"/>
+        </w:rPr>
+        <w:t xml:space="preserve"> calculations from</w:t>
+      </w:r>
+      <w:r>
+        <w:rPr>
+          <w:lang w:val="en-US"/>
+        </w:rPr>
+        <w:t xml:space="preserve"> the presentation layer.</w:t>
       </w:r>
     </w:p>
     <w:p>

</xml_diff>

<commit_message>
Finished with my thesis for now.
</commit_message>
<xml_diff>
--- a/Project Thesis.docx
+++ b/Project Thesis.docx
@@ -20325,6 +20325,48 @@
         </w:rPr>
         <w:t>, pruned branches, and reused states.</w:t>
       </w:r>
+      <w:r>
+        <w:rPr>
+          <w:lang w:val="en-US"/>
+        </w:rPr>
+        <w:t xml:space="preserve"> These measurements will also</w:t>
+      </w:r>
+      <w:r>
+        <w:rPr>
+          <w:lang w:val="en-US"/>
+        </w:rPr>
+        <w:t xml:space="preserve"> be used during</w:t>
+      </w:r>
+      <w:r>
+        <w:rPr>
+          <w:lang w:val="en-US"/>
+        </w:rPr>
+        <w:t xml:space="preserve"> testing to compare</w:t>
+      </w:r>
+      <w:r>
+        <w:rPr>
+          <w:lang w:val="en-US"/>
+        </w:rPr>
+        <w:t xml:space="preserve"> the behavior</w:t>
+      </w:r>
+      <w:r>
+        <w:rPr>
+          <w:lang w:val="en-US"/>
+        </w:rPr>
+        <w:t xml:space="preserve"> and efficiency</w:t>
+      </w:r>
+      <w:r>
+        <w:rPr>
+          <w:lang w:val="en-US"/>
+        </w:rPr>
+        <w:t xml:space="preserve"> of the different solver</w:t>
+      </w:r>
+      <w:r>
+        <w:rPr>
+          <w:lang w:val="en-US"/>
+        </w:rPr>
+        <w:t xml:space="preserve"> versions.</w:t>
+      </w:r>
     </w:p>
     <w:p>
       <w:pPr>
@@ -20348,6 +20390,7 @@
         <w:rPr>
           <w:lang w:val="en-US"/>
         </w:rPr>
+        <w:lastRenderedPageBreak/>
         <w:t>User Interface Design</w:t>
       </w:r>
     </w:p>
@@ -21722,6 +21765,328 @@
           <w:lang w:val="en-US"/>
         </w:rPr>
         <w:t xml:space="preserve"> elements.</w:t>
+      </w:r>
+    </w:p>
+    <w:p>
+      <w:pPr>
+        <w:rPr>
+          <w:lang w:val="en-US"/>
+        </w:rPr>
+      </w:pPr>
+    </w:p>
+    <w:p>
+      <w:pPr>
+        <w:rPr>
+          <w:lang w:val="en-US"/>
+        </w:rPr>
+      </w:pPr>
+      <w:r>
+        <w:rPr>
+          <w:lang w:val="en-US"/>
+        </w:rPr>
+        <w:t>The Target GPA Solver has a separate interface</w:t>
+      </w:r>
+      <w:r>
+        <w:rPr>
+          <w:lang w:val="en-US"/>
+        </w:rPr>
+        <w:t xml:space="preserve"> because</w:t>
+      </w:r>
+      <w:r>
+        <w:rPr>
+          <w:lang w:val="en-US"/>
+        </w:rPr>
+        <w:t xml:space="preserve"> its input differs from</w:t>
+      </w:r>
+      <w:r>
+        <w:rPr>
+          <w:lang w:val="en-US"/>
+        </w:rPr>
+        <w:t xml:space="preserve"> the standard What-if</w:t>
+      </w:r>
+      <w:r>
+        <w:rPr>
+          <w:lang w:val="en-US"/>
+        </w:rPr>
+        <w:t xml:space="preserve"> Calculator.</w:t>
+      </w:r>
+      <w:r>
+        <w:rPr>
+          <w:lang w:val="en-US"/>
+        </w:rPr>
+        <w:t xml:space="preserve"> The user enters a</w:t>
+      </w:r>
+      <w:r>
+        <w:rPr>
+          <w:lang w:val="en-US"/>
+        </w:rPr>
+        <w:t xml:space="preserve"> desired target GPA</w:t>
+      </w:r>
+      <w:r>
+        <w:rPr>
+          <w:lang w:val="en-US"/>
+        </w:rPr>
+        <w:t xml:space="preserve"> and then creates a list</w:t>
+      </w:r>
+      <w:r>
+        <w:rPr>
+          <w:lang w:val="en-US"/>
+        </w:rPr>
+        <w:t xml:space="preserve"> of remaining courses by</w:t>
+      </w:r>
+      <w:r>
+        <w:rPr>
+          <w:lang w:val="en-US"/>
+        </w:rPr>
+        <w:t xml:space="preserve"> providing</w:t>
+      </w:r>
+      <w:r>
+        <w:rPr>
+          <w:lang w:val="en-US"/>
+        </w:rPr>
+        <w:t xml:space="preserve"> a course name and</w:t>
+      </w:r>
+      <w:r>
+        <w:rPr>
+          <w:lang w:val="en-US"/>
+        </w:rPr>
+        <w:t xml:space="preserve"> number of credits.</w:t>
+      </w:r>
+      <w:r>
+        <w:rPr>
+          <w:lang w:val="en-US"/>
+        </w:rPr>
+        <w:t xml:space="preserve"> Grades are not entered</w:t>
+      </w:r>
+      <w:r>
+        <w:rPr>
+          <w:lang w:val="en-US"/>
+        </w:rPr>
+        <w:t xml:space="preserve"> by the user because</w:t>
+      </w:r>
+      <w:r>
+        <w:rPr>
+          <w:lang w:val="en-US"/>
+        </w:rPr>
+        <w:t xml:space="preserve"> determining the</w:t>
+      </w:r>
+      <w:r>
+        <w:rPr>
+          <w:lang w:val="en-US"/>
+        </w:rPr>
+        <w:t xml:space="preserve"> required grades is the purpose</w:t>
+      </w:r>
+      <w:r>
+        <w:rPr>
+          <w:lang w:val="en-US"/>
+        </w:rPr>
+        <w:t xml:space="preserve"> of the solver.</w:t>
+      </w:r>
+    </w:p>
+    <w:p>
+      <w:pPr>
+        <w:rPr>
+          <w:lang w:val="en-US"/>
+        </w:rPr>
+      </w:pPr>
+    </w:p>
+    <w:p>
+      <w:pPr>
+        <w:rPr>
+          <w:lang w:val="en-US"/>
+        </w:rPr>
+      </w:pPr>
+      <w:r>
+        <w:rPr>
+          <w:lang w:val="en-US"/>
+        </w:rPr>
+        <w:t>When the calculation is started</w:t>
+      </w:r>
+      <w:r>
+        <w:rPr>
+          <w:lang w:val="en-US"/>
+        </w:rPr>
+        <w:t>, the page displays a</w:t>
+      </w:r>
+      <w:r>
+        <w:rPr>
+          <w:lang w:val="en-US"/>
+        </w:rPr>
+        <w:t xml:space="preserve"> calculating state</w:t>
+      </w:r>
+      <w:r>
+        <w:rPr>
+          <w:lang w:val="en-US"/>
+        </w:rPr>
+        <w:t xml:space="preserve"> while the algorithm is running.</w:t>
+      </w:r>
+      <w:r>
+        <w:rPr>
+          <w:lang w:val="en-US"/>
+        </w:rPr>
+        <w:t xml:space="preserve"> Once the search is complete</w:t>
+      </w:r>
+      <w:r>
+        <w:rPr>
+          <w:lang w:val="en-US"/>
+        </w:rPr>
+        <w:t>, the interface displays</w:t>
+      </w:r>
+      <w:r>
+        <w:rPr>
+          <w:lang w:val="en-US"/>
+        </w:rPr>
+        <w:t xml:space="preserve"> either a recommended grade</w:t>
+      </w:r>
+      <w:r>
+        <w:rPr>
+          <w:lang w:val="en-US"/>
+        </w:rPr>
+        <w:t xml:space="preserve"> for each remaining course</w:t>
+      </w:r>
+      <w:r>
+        <w:rPr>
+          <w:lang w:val="en-US"/>
+        </w:rPr>
+        <w:t xml:space="preserve"> and the projected cumulative GPA</w:t>
+      </w:r>
+      <w:r>
+        <w:rPr>
+          <w:lang w:val="en-US"/>
+        </w:rPr>
+        <w:t xml:space="preserve"> or a message indicating</w:t>
+      </w:r>
+      <w:r>
+        <w:rPr>
+          <w:lang w:val="en-US"/>
+        </w:rPr>
+        <w:t xml:space="preserve"> that the requested</w:t>
+      </w:r>
+      <w:r>
+        <w:rPr>
+          <w:lang w:val="en-US"/>
+        </w:rPr>
+        <w:t xml:space="preserve"> target cannot be achieved</w:t>
+      </w:r>
+      <w:r>
+        <w:rPr>
+          <w:lang w:val="en-US"/>
+        </w:rPr>
+        <w:t>.</w:t>
+      </w:r>
+      <w:r>
+        <w:rPr>
+          <w:lang w:val="en-US"/>
+        </w:rPr>
+        <w:t xml:space="preserve"> The page also displays</w:t>
+      </w:r>
+      <w:r>
+        <w:rPr>
+          <w:lang w:val="en-US"/>
+        </w:rPr>
+        <w:t xml:space="preserve"> algorithm-related</w:t>
+      </w:r>
+      <w:r>
+        <w:rPr>
+          <w:lang w:val="en-US"/>
+        </w:rPr>
+        <w:t xml:space="preserve"> information such as</w:t>
+      </w:r>
+      <w:r>
+        <w:rPr>
+          <w:lang w:val="en-US"/>
+        </w:rPr>
+        <w:t xml:space="preserve"> the number of</w:t>
+      </w:r>
+      <w:r>
+        <w:rPr>
+          <w:lang w:val="en-US"/>
+        </w:rPr>
+        <w:t xml:space="preserve"> search nodes visited</w:t>
+      </w:r>
+      <w:r>
+        <w:rPr>
+          <w:lang w:val="en-US"/>
+        </w:rPr>
+        <w:t>, the number of branches pruned</w:t>
+      </w:r>
+      <w:r>
+        <w:rPr>
+          <w:lang w:val="en-US"/>
+        </w:rPr>
+        <w:t>, and the number of</w:t>
+      </w:r>
+      <w:r>
+        <w:rPr>
+          <w:lang w:val="en-US"/>
+        </w:rPr>
+        <w:t xml:space="preserve"> previously solved</w:t>
+      </w:r>
+      <w:r>
+        <w:rPr>
+          <w:lang w:val="en-US"/>
+        </w:rPr>
+        <w:t xml:space="preserve"> states reused</w:t>
+      </w:r>
+      <w:r>
+        <w:rPr>
+          <w:lang w:val="en-US"/>
+        </w:rPr>
+        <w:t xml:space="preserve"> through memoization.</w:t>
+      </w:r>
+      <w:r>
+        <w:rPr>
+          <w:lang w:val="en-US"/>
+        </w:rPr>
+        <w:t xml:space="preserve"> These values provide</w:t>
+      </w:r>
+      <w:r>
+        <w:rPr>
+          <w:lang w:val="en-US"/>
+        </w:rPr>
+        <w:t xml:space="preserve"> additional transparency</w:t>
+      </w:r>
+      <w:r>
+        <w:rPr>
+          <w:lang w:val="en-US"/>
+        </w:rPr>
+        <w:t xml:space="preserve"> about how the solver</w:t>
+      </w:r>
+      <w:r>
+        <w:rPr>
+          <w:lang w:val="en-US"/>
+        </w:rPr>
+        <w:t xml:space="preserve"> reached</w:t>
+      </w:r>
+      <w:r>
+        <w:rPr>
+          <w:lang w:val="en-US"/>
+        </w:rPr>
+        <w:t xml:space="preserve"> its result</w:t>
+      </w:r>
+      <w:r>
+        <w:rPr>
+          <w:lang w:val="en-US"/>
+        </w:rPr>
+        <w:t xml:space="preserve"> and are useful for</w:t>
+      </w:r>
+      <w:r>
+        <w:rPr>
+          <w:lang w:val="en-US"/>
+        </w:rPr>
+        <w:t xml:space="preserve"> evaluating the</w:t>
+      </w:r>
+      <w:r>
+        <w:rPr>
+          <w:lang w:val="en-US"/>
+        </w:rPr>
+        <w:t xml:space="preserve"> performance</w:t>
+      </w:r>
+      <w:r>
+        <w:rPr>
+          <w:lang w:val="en-US"/>
+        </w:rPr>
+        <w:t xml:space="preserve"> of the algorithm.</w:t>
       </w:r>
     </w:p>
     <w:p>
@@ -21980,6 +22345,7 @@
         <w:rPr>
           <w:lang w:val="en-US"/>
         </w:rPr>
+        <w:lastRenderedPageBreak/>
         <w:t>The program is intended to operate on</w:t>
       </w:r>
       <w:r>
@@ -24319,6 +24685,7 @@
         <w:rPr>
           <w:lang w:val="en-US"/>
         </w:rPr>
+        <w:lastRenderedPageBreak/>
         <w:t>Database constraints</w:t>
       </w:r>
       <w:r>
@@ -25364,6 +25731,215 @@
           <w:lang w:val="en-US"/>
         </w:rPr>
         <w:t xml:space="preserve"> and policies.</w:t>
+      </w:r>
+    </w:p>
+    <w:p>
+      <w:pPr>
+        <w:rPr>
+          <w:lang w:val="en-US"/>
+        </w:rPr>
+      </w:pPr>
+    </w:p>
+    <w:p>
+      <w:pPr>
+        <w:rPr>
+          <w:lang w:val="en-US"/>
+        </w:rPr>
+      </w:pPr>
+      <w:r>
+        <w:rPr>
+          <w:lang w:val="en-US"/>
+        </w:rPr>
+        <w:lastRenderedPageBreak/>
+        <w:t>The Target GPA Solver</w:t>
+      </w:r>
+      <w:r>
+        <w:rPr>
+          <w:lang w:val="en-US"/>
+        </w:rPr>
+        <w:t xml:space="preserve"> also validates</w:t>
+      </w:r>
+      <w:r>
+        <w:rPr>
+          <w:lang w:val="en-US"/>
+        </w:rPr>
+        <w:t xml:space="preserve"> that the requested GPA</w:t>
+      </w:r>
+      <w:r>
+        <w:rPr>
+          <w:lang w:val="en-US"/>
+        </w:rPr>
+        <w:t xml:space="preserve"> is within the valid GPA range.</w:t>
+      </w:r>
+      <w:r>
+        <w:rPr>
+          <w:lang w:val="en-US"/>
+        </w:rPr>
+        <w:t xml:space="preserve"> The search algorithm</w:t>
+      </w:r>
+      <w:r>
+        <w:rPr>
+          <w:lang w:val="en-US"/>
+        </w:rPr>
+        <w:t xml:space="preserve"> uses integer-scaled</w:t>
+      </w:r>
+      <w:r>
+        <w:rPr>
+          <w:lang w:val="en-US"/>
+        </w:rPr>
+        <w:t xml:space="preserve"> grade-point values</w:t>
+      </w:r>
+      <w:r>
+        <w:rPr>
+          <w:lang w:val="en-US"/>
+        </w:rPr>
+        <w:t xml:space="preserve"> internally in order</w:t>
+      </w:r>
+      <w:r>
+        <w:rPr>
+          <w:lang w:val="en-US"/>
+        </w:rPr>
+        <w:t xml:space="preserve"> to avoid floating-point</w:t>
+      </w:r>
+      <w:r>
+        <w:rPr>
+          <w:lang w:val="en-US"/>
+        </w:rPr>
+        <w:t xml:space="preserve"> precision</w:t>
+      </w:r>
+      <w:r>
+        <w:rPr>
+          <w:lang w:val="en-US"/>
+        </w:rPr>
+        <w:t xml:space="preserve"> inconsistencies when</w:t>
+      </w:r>
+      <w:r>
+        <w:rPr>
+          <w:lang w:val="en-US"/>
+        </w:rPr>
+        <w:t xml:space="preserve"> memoized states are</w:t>
+      </w:r>
+      <w:r>
+        <w:rPr>
+          <w:lang w:val="en-US"/>
+        </w:rPr>
+        <w:t xml:space="preserve"> compared and stored.</w:t>
+      </w:r>
+    </w:p>
+    <w:p>
+      <w:pPr>
+        <w:rPr>
+          <w:lang w:val="en-US"/>
+        </w:rPr>
+      </w:pPr>
+    </w:p>
+    <w:p>
+      <w:pPr>
+        <w:rPr>
+          <w:lang w:val="en-US"/>
+        </w:rPr>
+      </w:pPr>
+      <w:r>
+        <w:rPr>
+          <w:lang w:val="en-US"/>
+        </w:rPr>
+        <w:t>Performance also contributes</w:t>
+      </w:r>
+      <w:r>
+        <w:rPr>
+          <w:lang w:val="en-US"/>
+        </w:rPr>
+        <w:t xml:space="preserve"> to the practical reliability of the program</w:t>
+      </w:r>
+      <w:r>
+        <w:rPr>
+          <w:lang w:val="en-US"/>
+        </w:rPr>
+        <w:t>.</w:t>
+      </w:r>
+      <w:r>
+        <w:rPr>
+          <w:lang w:val="en-US"/>
+        </w:rPr>
+        <w:t xml:space="preserve"> The original backtracking</w:t>
+      </w:r>
+      <w:r>
+        <w:rPr>
+          <w:lang w:val="en-US"/>
+        </w:rPr>
+        <w:t xml:space="preserve"> implementation could</w:t>
+      </w:r>
+      <w:r>
+        <w:rPr>
+          <w:lang w:val="en-US"/>
+        </w:rPr>
+        <w:t xml:space="preserve"> require a very long</w:t>
+      </w:r>
+      <w:r>
+        <w:rPr>
+          <w:lang w:val="en-US"/>
+        </w:rPr>
+        <w:t xml:space="preserve"> calculation time</w:t>
+      </w:r>
+      <w:r>
+        <w:rPr>
+          <w:lang w:val="en-US"/>
+        </w:rPr>
+        <w:t xml:space="preserve"> when a large number of</w:t>
+      </w:r>
+      <w:r>
+        <w:rPr>
+          <w:lang w:val="en-US"/>
+        </w:rPr>
+        <w:t xml:space="preserve"> remaining courses</w:t>
+      </w:r>
+      <w:r>
+        <w:rPr>
+          <w:lang w:val="en-US"/>
+        </w:rPr>
+        <w:t xml:space="preserve"> was provided.</w:t>
+      </w:r>
+      <w:r>
+        <w:rPr>
+          <w:lang w:val="en-US"/>
+        </w:rPr>
+        <w:t xml:space="preserve"> Pruning and </w:t>
+      </w:r>
+      <w:r>
+        <w:rPr>
+          <w:lang w:val="en-US"/>
+        </w:rPr>
+        <w:t>memoization were introduced to</w:t>
+      </w:r>
+      <w:r>
+        <w:rPr>
+          <w:lang w:val="en-US"/>
+        </w:rPr>
+        <w:t xml:space="preserve"> reduce unnecessary</w:t>
+      </w:r>
+      <w:r>
+        <w:rPr>
+          <w:lang w:val="en-US"/>
+        </w:rPr>
+        <w:t xml:space="preserve"> computation and</w:t>
+      </w:r>
+      <w:r>
+        <w:rPr>
+          <w:lang w:val="en-US"/>
+        </w:rPr>
+        <w:t xml:space="preserve"> keep the solver usable</w:t>
+      </w:r>
+      <w:r>
+        <w:rPr>
+          <w:lang w:val="en-US"/>
+        </w:rPr>
+        <w:t xml:space="preserve"> for realistic academic</w:t>
+      </w:r>
+      <w:r>
+        <w:rPr>
+          <w:lang w:val="en-US"/>
+        </w:rPr>
+        <w:t xml:space="preserve"> planning scenarios.</w:t>
       </w:r>
     </w:p>
     <w:p>

</xml_diff>